<commit_message>
feat(analysis): selesaikan bagian hasil analisis
Bagian hasil analisis sudah selesai. Pada commit ini, bagian hasil analisis telah diselesaikan sepenuhnya, mencakup seluruh data dan interpretasi yang dibutuhkan. Langkah selanjutnya akan fokus pada pengembangan bagian diskusi.
</commit_message>
<xml_diff>
--- a/Kajian Pustaka Draft 2025 Rafli.docx
+++ b/Kajian Pustaka Draft 2025 Rafli.docx
@@ -778,6 +778,7 @@
       <w:r>
         <w:rPr>
           <w:rFonts w:ascii="Times New Roman" w:eastAsia="Times New Roman" w:hAnsi="Times New Roman" w:cs="Times New Roman"/>
+          <w:noProof/>
           <w:sz w:val="20"/>
           <w:szCs w:val="20"/>
           <w:lang w:val="en-US"/>
@@ -2366,10 +2367,46 @@
       <w:pPr>
         <w:rPr>
           <w:rFonts w:ascii="Times New Roman" w:eastAsia="Times New Roman" w:hAnsi="Times New Roman" w:cs="Times New Roman"/>
+          <w:sz w:val="20"/>
+          <w:szCs w:val="20"/>
+        </w:rPr>
+      </w:pPr>
+      <w:r>
+        <w:rPr>
+          <w:rFonts w:ascii="Times New Roman" w:eastAsia="Times New Roman" w:hAnsi="Times New Roman" w:cs="Times New Roman"/>
+          <w:sz w:val="20"/>
+          <w:szCs w:val="20"/>
+        </w:rPr>
+        <w:br/>
+      </w:r>
+      <w:r>
+        <w:rPr>
+          <w:rFonts w:ascii="Times New Roman" w:eastAsia="Times New Roman" w:hAnsi="Times New Roman" w:cs="Times New Roman"/>
           <w:b/>
           <w:sz w:val="20"/>
           <w:szCs w:val="20"/>
         </w:rPr>
+        <w:t>4.2 Berdasarkan Teknologi</w:t>
+      </w:r>
+      <w:r>
+        <w:rPr>
+          <w:rFonts w:ascii="Times New Roman" w:eastAsia="Times New Roman" w:hAnsi="Times New Roman" w:cs="Times New Roman"/>
+          <w:b/>
+          <w:sz w:val="20"/>
+          <w:szCs w:val="20"/>
+        </w:rPr>
+        <w:br/>
+      </w:r>
+    </w:p>
+    <w:p>
+      <w:pPr>
+        <w:ind w:firstLine="720"/>
+        <w:rPr>
+          <w:rFonts w:ascii="Times New Roman" w:eastAsia="Times New Roman" w:hAnsi="Times New Roman" w:cs="Times New Roman"/>
+          <w:b/>
+          <w:sz w:val="20"/>
+          <w:szCs w:val="20"/>
+        </w:rPr>
       </w:pPr>
       <w:r>
         <w:rPr>
@@ -2377,33 +2414,7 @@
           <w:sz w:val="20"/>
           <w:szCs w:val="20"/>
         </w:rPr>
-        <w:br/>
-      </w:r>
-      <w:r>
-        <w:rPr>
-          <w:rFonts w:ascii="Times New Roman" w:eastAsia="Times New Roman" w:hAnsi="Times New Roman" w:cs="Times New Roman"/>
-          <w:b/>
-          <w:sz w:val="20"/>
-          <w:szCs w:val="20"/>
-        </w:rPr>
-        <w:t>4.2 Berdasarkan Teknologi</w:t>
-      </w:r>
-      <w:r>
-        <w:rPr>
-          <w:rFonts w:ascii="Times New Roman" w:eastAsia="Times New Roman" w:hAnsi="Times New Roman" w:cs="Times New Roman"/>
-          <w:b/>
-          <w:sz w:val="20"/>
-          <w:szCs w:val="20"/>
-        </w:rPr>
-        <w:br/>
-      </w:r>
-      <w:r>
-        <w:rPr>
-          <w:rFonts w:ascii="Times New Roman" w:eastAsia="Times New Roman" w:hAnsi="Times New Roman" w:cs="Times New Roman"/>
-          <w:sz w:val="20"/>
-          <w:szCs w:val="20"/>
-        </w:rPr>
-        <w:t>Literatur yang terkumpul juga dikaji berdasarkan jenis platform teknologi yang diimplementasikan dalam intervensi. Dalam pengembangan game edukatif tentang depresi, teknologi berfungsi sebagai saluran utama untuk menyajikan materi pembelajaran dan dukungan emosional secara lebih luas di ranah digital. Berbagai platform—mulai dari aplikasi, portal web, hingga game interaktif—mempunyai kelebihan masing‑masing, baik dalam hal kemudahan akses bagi pengguna maupun dalam menciptakan keterlibatan emosional yang mendalam. Pemilihan media teknologi yang tepat akan sangat mempengaruhi efektivitas penyampaian konten dan pengalaman belajar pemain.</w:t>
+        <w:t>Berdasarkan kajian terhadap 255 literatur yang dianalisis, ditemukan bahwa platform teknologi yang paling banyak digunakan dalam intervensi edukatif terkait depresi adalah aplikasi mobile, dengan jumlah 109 studi. Di sisi lain, platform game interaktif hanya ditemukan dalam 40 studi, menjadikannya yang paling sedikit digunakan. Website berada di posisi tengah dengan 76 studi. Temuan ini menunjukkan bahwa aplikasi mobile menjadi pilihan utama dalam pengembangan intervensi digital untuk kesehatan mental, sementara game interaktif masih kurang dimanfaatkan dalam konteks ini.</w:t>
       </w:r>
     </w:p>
     <w:p>
@@ -2882,6 +2893,7 @@
     </w:p>
     <w:p>
       <w:pPr>
+        <w:ind w:firstLine="720"/>
         <w:rPr>
           <w:rFonts w:ascii="Times New Roman" w:eastAsia="Times New Roman" w:hAnsi="Times New Roman" w:cs="Times New Roman"/>
           <w:sz w:val="20"/>
@@ -2894,19 +2906,121 @@
           <w:sz w:val="20"/>
           <w:szCs w:val="20"/>
         </w:rPr>
-        <w:t>Pendekatan ini sejalan dengan alasan dikembangkannya game edukasi mengenai depresi, yang ditujukan untuk remaja sebagai kelompok usia yang rentan mengalami gangguan psikologis. Pada tahap pencarian jati diri, remaja cenderung menerima informasi dari lingkungan sekitar tanpa proses penyaringan yang memadai, sehingga lebih mudah terpengaruh oleh tekanan sosial dan emosional. Kurangnya pemahaman terkait gejala dan penanganan depresi memperburuk situasi tersebut. Game edukatif ini menyajikan informasi secara visual dan interaktif, serta dilengkapi dengan kuis dan skenario yang dirancang untuk meningkatkan kesadaran, pemahaman, dan empati remaja terhadap isu-isu psikologis, khususnya depresi. Melalui pendekatan ini, game diharapkan menjadi media pembelajaran yang menarik dan efektif sebagai alternatif dari metode konvensional.[3]</w:t>
-      </w:r>
-      <w:r>
-        <w:rPr>
-          <w:rFonts w:ascii="Times New Roman" w:eastAsia="Times New Roman" w:hAnsi="Times New Roman" w:cs="Times New Roman"/>
-          <w:sz w:val="20"/>
-          <w:szCs w:val="20"/>
-        </w:rPr>
-        <w:br/>
+        <w:t>Dominasi aplikasi mobile sebagai platform intervensi kesehatan mental dapat dijelaskan oleh beberapa faktor. Aplikasi mobile menawarkan aksesibilitas tinggi, memungkinkan pengguna untuk mengakses dukungan kapan saja dan di mana saja melalui perangkat pribadi mereka. Selain itu, aplikasi ini sering kali dirancang dengan pendekatan berbasis bukti, seperti terapi perilaku kognitif (CBT), yang telah terbukti efektif dalam mengurangi gejala depresi dan kecemasan. Sebuah tinjauan sistematis menunjukkan bahwa aplikasi mobile dapat memberikan intervensi yang efektif untuk populasi umum, dengan berbagai fitur yang mendukung manajemen kesehatan mental secara mandiri</w:t>
+      </w:r>
+      <w:r>
+        <w:rPr>
+          <w:rFonts w:ascii="Times New Roman" w:eastAsia="Times New Roman" w:hAnsi="Times New Roman" w:cs="Times New Roman"/>
+          <w:sz w:val="20"/>
+          <w:szCs w:val="20"/>
+        </w:rPr>
+        <w:t xml:space="preserve"> </w:t>
+      </w:r>
+      <w:sdt>
+        <w:sdtPr>
+          <w:rPr>
+            <w:rFonts w:ascii="Times New Roman" w:eastAsia="Times New Roman" w:hAnsi="Times New Roman" w:cs="Times New Roman"/>
+            <w:color w:val="000000"/>
+            <w:sz w:val="20"/>
+            <w:szCs w:val="20"/>
+          </w:rPr>
+          <w:tag w:val="MENDELEY_CITATION_v3_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"/>
+          <w:id w:val="571938721"/>
+          <w:placeholder>
+            <w:docPart w:val="DefaultPlaceholder_-1854013440"/>
+          </w:placeholder>
+        </w:sdtPr>
+        <w:sdtContent>
+          <w:r>
+            <w:rPr>
+              <w:rFonts w:ascii="Times New Roman" w:eastAsia="Times New Roman" w:hAnsi="Times New Roman" w:cs="Times New Roman"/>
+              <w:color w:val="000000"/>
+              <w:sz w:val="20"/>
+              <w:szCs w:val="20"/>
+            </w:rPr>
+            <w:t>[97]</w:t>
+          </w:r>
+        </w:sdtContent>
+      </w:sdt>
+      <w:r>
+        <w:rPr>
+          <w:rFonts w:ascii="Times New Roman" w:eastAsia="Times New Roman" w:hAnsi="Times New Roman" w:cs="Times New Roman"/>
+          <w:sz w:val="20"/>
+          <w:szCs w:val="20"/>
+        </w:rPr>
+        <w:t>.</w:t>
       </w:r>
     </w:p>
     <w:p>
       <w:pPr>
+        <w:ind w:firstLine="720"/>
+        <w:rPr>
+          <w:rFonts w:ascii="Times New Roman" w:eastAsia="Times New Roman" w:hAnsi="Times New Roman" w:cs="Times New Roman"/>
+          <w:sz w:val="20"/>
+          <w:szCs w:val="20"/>
+        </w:rPr>
+      </w:pPr>
+      <w:r>
+        <w:rPr>
+          <w:rFonts w:ascii="Times New Roman" w:eastAsia="Times New Roman" w:hAnsi="Times New Roman" w:cs="Times New Roman"/>
+          <w:sz w:val="20"/>
+          <w:szCs w:val="20"/>
+        </w:rPr>
+        <w:t>Rendahnya jumlah studi yang menggunakan game interaktif sebagai media intervensi kesehatan mental dapat disebabkan oleh tantangan dalam pengembangan dan implementasinya. Pengembangan game edukatif yang efektif memerlukan sumber daya yang signifikan, termasuk waktu, biaya, dan keahlian multidisipliner. Meskipun game memiliki potensi untuk meningkatkan keterlibatan pengguna, efektivitasnya dalam konteks intervensi kesehatan mental masih memerlukan lebih banyak bukti empiris. Sebuah tinjauan sistematis menyimpulkan bahwa meskipun serious games memiliki potensi untuk mengurangi gejala depresi, bukti yang ada saat ini belum cukup kuat untuk menarik kesimpulan definitif mengenai efektivitasnya, karena tingginya risiko bias dan kualitas bukti yang rendah dalam studi-studi yang dianalisis</w:t>
+      </w:r>
+      <w:r>
+        <w:rPr>
+          <w:rFonts w:ascii="Times New Roman" w:eastAsia="Times New Roman" w:hAnsi="Times New Roman" w:cs="Times New Roman"/>
+          <w:sz w:val="20"/>
+          <w:szCs w:val="20"/>
+        </w:rPr>
+        <w:t xml:space="preserve"> </w:t>
+      </w:r>
+      <w:sdt>
+        <w:sdtPr>
+          <w:rPr>
+            <w:rFonts w:ascii="Times New Roman" w:eastAsia="Times New Roman" w:hAnsi="Times New Roman" w:cs="Times New Roman"/>
+            <w:color w:val="000000"/>
+            <w:sz w:val="20"/>
+            <w:szCs w:val="20"/>
+          </w:rPr>
+          <w:tag w:val="MENDELEY_CITATION_v3_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"/>
+          <w:id w:val="-191851391"/>
+          <w:placeholder>
+            <w:docPart w:val="DefaultPlaceholder_-1854013440"/>
+          </w:placeholder>
+        </w:sdtPr>
+        <w:sdtContent>
+          <w:r>
+            <w:rPr>
+              <w:rFonts w:ascii="Times New Roman" w:eastAsia="Times New Roman" w:hAnsi="Times New Roman" w:cs="Times New Roman"/>
+              <w:color w:val="000000"/>
+              <w:sz w:val="20"/>
+              <w:szCs w:val="20"/>
+            </w:rPr>
+            <w:t>[98]</w:t>
+          </w:r>
+        </w:sdtContent>
+      </w:sdt>
+      <w:r>
+        <w:rPr>
+          <w:rFonts w:ascii="Times New Roman" w:eastAsia="Times New Roman" w:hAnsi="Times New Roman" w:cs="Times New Roman"/>
+          <w:sz w:val="20"/>
+          <w:szCs w:val="20"/>
+        </w:rPr>
+        <w:t>.</w:t>
+      </w:r>
+      <w:r>
+        <w:rPr>
+          <w:rFonts w:ascii="Times New Roman" w:eastAsia="Times New Roman" w:hAnsi="Times New Roman" w:cs="Times New Roman"/>
+          <w:sz w:val="20"/>
+          <w:szCs w:val="20"/>
+        </w:rPr>
+        <w:br/>
+      </w:r>
+    </w:p>
+    <w:p>
+      <w:pPr>
         <w:rPr>
           <w:rFonts w:ascii="Times New Roman" w:eastAsia="Times New Roman" w:hAnsi="Times New Roman" w:cs="Times New Roman"/>
           <w:b/>
@@ -2966,7 +3080,7 @@
           <w:sz w:val="20"/>
           <w:szCs w:val="20"/>
         </w:rPr>
-        <w:t>Berdasarkan hasil kajian terhadap jenis tujuan penelitian pada pengelolaan depresi yang tercantum dalam tabel—yakni Terapi Digital (73), Skrining (46), Diagnosa Penyakit (40), dan Edukasi (49)—penelitian ini memfokuskan diri pada Edukasi sebagai tujuan utama. Kolom “Jenis Intervensi” merepresentasikan cakupan sasaran intervensi, sedangkan kolom “Jumlah Studi” menggambarkan frekuensi penggunaan tiap kategori dalam literatur yang ada. Dari data tersebut terlihat bahwa meski Terapi Digital (73) menempati peringkat tertinggi, dan Skrining (46) serta Diagnosa Penyakit (40) juga banyak diangkat, intervensi Edukasi dengan 49 studi menunjukkan kebutuhan yang signifikan untuk memperkuat aspek pengetahuan dan pemahaman publik mengenai depresi. Dengan demikian, pilihan tujuan penelitian ditetapkan pada Edukasi untuk mengisi celah pengetahuan dan memberikan pendekatan preventif yang lebih holistik.</w:t>
+        <w:t>Berdasarkan data yang diperoleh dari kajian literatur, kategori Terapi Digital menempati posisi tertinggi dengan jumlah 73 studi, diikuti oleh Edukasi (49), Skrining (46), dan Diagnosa Penyakit (40). Hal ini menunjukkan bahwa intervensi berbasis digital menjadi fokus utama dalam penelitian pengelolaan depresi dalam beberapa tahun terakhir. Dominasi Terapi Digital mencerminkan pergeseran paradigma dalam pendekatan penanganan depresi, yang semakin mengandalkan teknologi untuk meningkatkan aksesibilitas dan efektivitas layanan kesehatan mental.</w:t>
       </w:r>
     </w:p>
     <w:p>
@@ -2985,6 +3099,7 @@
           <w:sz w:val="20"/>
           <w:szCs w:val="20"/>
         </w:rPr>
+        <w:lastRenderedPageBreak/>
         <w:br/>
         <w:t xml:space="preserve">Tabel </w:t>
       </w:r>
@@ -3275,7 +3390,6 @@
                 <w:sz w:val="20"/>
                 <w:szCs w:val="20"/>
               </w:rPr>
-              <w:lastRenderedPageBreak/>
               <w:t>2</w:t>
             </w:r>
           </w:p>
@@ -3568,7 +3682,66 @@
           <w:sz w:val="20"/>
           <w:szCs w:val="20"/>
         </w:rPr>
-        <w:t>Alasan pemilihan tujuan “Edukasi” dalam penelitian Game Edukasi Pengenalan Gangguan Psikologis Remaja Menggunakan Metode DGBL-ID dilandasi oleh kenyataan bahwa remaja masih minim pemahaman tentang tanda dan gejala depresi, yang berpotensi menyebabkan stigma dan keterlambatan penanganan. Game berbasis DGBL-ID dipilih karena mampu menyajikan materi edukasi secara interaktif dan imersif, sehingga meningkatkan retensi informasi dan mendorong kesadaran lebih dini tentang gangguan psikologis.[3] Dengan merujuk pada tingginya jumlah studi Edukasi (49), penelitian ini berharap memaksimalkan potensi game edukatif untuk mengubah pengetahuan menjadi sikap proaktif dalam mendeteksi dan menangani depresi pada remaja.</w:t>
+        <w:t>Jumlah studi mengenai Terapi Digital meningkat seiring dengan percepatan adopsi teknologi kesehatan mental selama pandemi COVID-19. Sebuah meta-review sistematis menunjukkan bahwa intervensi kesehatan digital, termasuk terapi berbasis komputer, aplikasi seluler, dan komunikasi daring, telah menjadi alternatif yang efektif dan aman dibandingkan terapi tatap muka</w:t>
+      </w:r>
+      <w:r>
+        <w:rPr>
+          <w:rFonts w:ascii="Times New Roman" w:eastAsia="Times New Roman" w:hAnsi="Times New Roman" w:cs="Times New Roman"/>
+          <w:sz w:val="20"/>
+          <w:szCs w:val="20"/>
+        </w:rPr>
+        <w:t xml:space="preserve"> </w:t>
+      </w:r>
+      <w:sdt>
+        <w:sdtPr>
+          <w:rPr>
+            <w:rFonts w:ascii="Times New Roman" w:eastAsia="Times New Roman" w:hAnsi="Times New Roman" w:cs="Times New Roman"/>
+            <w:color w:val="000000"/>
+            <w:sz w:val="20"/>
+            <w:szCs w:val="20"/>
+          </w:rPr>
+          <w:tag w:val="MENDELEY_CITATION_v3_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"/>
+          <w:id w:val="-1283725461"/>
+          <w:placeholder>
+            <w:docPart w:val="DefaultPlaceholder_-1854013440"/>
+          </w:placeholder>
+        </w:sdtPr>
+        <w:sdtContent>
+          <w:r>
+            <w:rPr>
+              <w:rFonts w:ascii="Times New Roman" w:eastAsia="Times New Roman" w:hAnsi="Times New Roman" w:cs="Times New Roman"/>
+              <w:color w:val="000000"/>
+              <w:sz w:val="20"/>
+              <w:szCs w:val="20"/>
+            </w:rPr>
+            <w:t>[99]</w:t>
+          </w:r>
+        </w:sdtContent>
+      </w:sdt>
+      <w:r>
+        <w:rPr>
+          <w:rFonts w:ascii="Times New Roman" w:eastAsia="Times New Roman" w:hAnsi="Times New Roman" w:cs="Times New Roman"/>
+          <w:color w:val="000000"/>
+          <w:sz w:val="20"/>
+          <w:szCs w:val="20"/>
+        </w:rPr>
+        <w:t xml:space="preserve"> </w:t>
+      </w:r>
+      <w:r>
+        <w:rPr>
+          <w:rFonts w:ascii="Times New Roman" w:eastAsia="Times New Roman" w:hAnsi="Times New Roman" w:cs="Times New Roman"/>
+          <w:sz w:val="20"/>
+          <w:szCs w:val="20"/>
+        </w:rPr>
+        <w:t>. Studi ini juga mencatat bahwa intervensi digital memiliki potensi besar dalam menjangkau populasi yang sebelumnya sulit diakses serta mengurangi hambatan seperti stigma dan keterbatasan sumber daya. Dengan demikian, lonjakan penelitian pada Terapi Digital mencerminkan respons ilmiah terhadap kebutuhan mendesak akan solusi kesehatan mental yang fleksibel dan skalabel di era digital</w:t>
+      </w:r>
+      <w:r>
+        <w:rPr>
+          <w:rFonts w:ascii="Times New Roman" w:eastAsia="Times New Roman" w:hAnsi="Times New Roman" w:cs="Times New Roman"/>
+          <w:sz w:val="20"/>
+          <w:szCs w:val="20"/>
+        </w:rPr>
+        <w:t>.</w:t>
       </w:r>
     </w:p>
     <w:p>
@@ -3584,10 +3757,54 @@
       <w:pPr>
         <w:rPr>
           <w:rFonts w:ascii="Times New Roman" w:eastAsia="Times New Roman" w:hAnsi="Times New Roman" w:cs="Times New Roman"/>
+          <w:b/>
           <w:sz w:val="20"/>
           <w:szCs w:val="20"/>
         </w:rPr>
       </w:pPr>
+      <w:r>
+        <w:rPr>
+          <w:rFonts w:ascii="Times New Roman" w:eastAsia="Times New Roman" w:hAnsi="Times New Roman" w:cs="Times New Roman"/>
+          <w:sz w:val="20"/>
+          <w:szCs w:val="20"/>
+        </w:rPr>
+        <w:br/>
+      </w:r>
+      <w:r>
+        <w:rPr>
+          <w:rFonts w:ascii="Times New Roman" w:eastAsia="Times New Roman" w:hAnsi="Times New Roman" w:cs="Times New Roman"/>
+          <w:b/>
+          <w:sz w:val="20"/>
+          <w:szCs w:val="20"/>
+        </w:rPr>
+        <w:t>4.</w:t>
+      </w:r>
+      <w:r>
+        <w:rPr>
+          <w:rFonts w:ascii="Times New Roman" w:eastAsia="Times New Roman" w:hAnsi="Times New Roman" w:cs="Times New Roman"/>
+          <w:b/>
+          <w:sz w:val="20"/>
+          <w:szCs w:val="20"/>
+        </w:rPr>
+        <w:t>4</w:t>
+      </w:r>
+      <w:r>
+        <w:rPr>
+          <w:rFonts w:ascii="Times New Roman" w:eastAsia="Times New Roman" w:hAnsi="Times New Roman" w:cs="Times New Roman"/>
+          <w:sz w:val="20"/>
+          <w:szCs w:val="20"/>
+        </w:rPr>
+        <w:t xml:space="preserve"> </w:t>
+      </w:r>
+      <w:r>
+        <w:rPr>
+          <w:rFonts w:ascii="Times New Roman" w:eastAsia="Times New Roman" w:hAnsi="Times New Roman" w:cs="Times New Roman"/>
+          <w:b/>
+          <w:sz w:val="20"/>
+          <w:szCs w:val="20"/>
+        </w:rPr>
+        <w:t>Berdasarkan Target Pengguna</w:t>
+      </w:r>
     </w:p>
     <w:p>
       <w:pPr>
@@ -3597,18 +3814,10 @@
           <w:szCs w:val="20"/>
         </w:rPr>
       </w:pPr>
-    </w:p>
-    <w:p>
-      <w:pPr>
-        <w:rPr>
-          <w:rFonts w:ascii="Times New Roman" w:eastAsia="Times New Roman" w:hAnsi="Times New Roman" w:cs="Times New Roman"/>
-          <w:sz w:val="20"/>
-          <w:szCs w:val="20"/>
-        </w:rPr>
-      </w:pPr>
-      <w:r>
-        <w:rPr>
-          <w:rFonts w:ascii="Times New Roman" w:eastAsia="Times New Roman" w:hAnsi="Times New Roman" w:cs="Times New Roman"/>
+      <w:r>
+        <w:rPr>
+          <w:rFonts w:ascii="Times New Roman" w:eastAsia="Times New Roman" w:hAnsi="Times New Roman" w:cs="Times New Roman"/>
+          <w:b/>
           <w:sz w:val="20"/>
           <w:szCs w:val="20"/>
         </w:rPr>
@@ -3617,54 +3826,10 @@
       <w:r>
         <w:rPr>
           <w:rFonts w:ascii="Times New Roman" w:eastAsia="Times New Roman" w:hAnsi="Times New Roman" w:cs="Times New Roman"/>
-          <w:b/>
-          <w:sz w:val="20"/>
-          <w:szCs w:val="20"/>
-        </w:rPr>
-        <w:t>4.</w:t>
-      </w:r>
-      <w:r>
-        <w:rPr>
-          <w:rFonts w:ascii="Times New Roman" w:eastAsia="Times New Roman" w:hAnsi="Times New Roman" w:cs="Times New Roman"/>
-          <w:b/>
-          <w:sz w:val="20"/>
-          <w:szCs w:val="20"/>
-        </w:rPr>
-        <w:t>4</w:t>
-      </w:r>
-      <w:r>
-        <w:rPr>
-          <w:rFonts w:ascii="Times New Roman" w:eastAsia="Times New Roman" w:hAnsi="Times New Roman" w:cs="Times New Roman"/>
-          <w:sz w:val="20"/>
-          <w:szCs w:val="20"/>
-        </w:rPr>
-        <w:t xml:space="preserve"> </w:t>
-      </w:r>
-      <w:r>
-        <w:rPr>
-          <w:rFonts w:ascii="Times New Roman" w:eastAsia="Times New Roman" w:hAnsi="Times New Roman" w:cs="Times New Roman"/>
-          <w:b/>
-          <w:sz w:val="20"/>
-          <w:szCs w:val="20"/>
-        </w:rPr>
-        <w:t>Berdasarkan Target Pengguna</w:t>
-      </w:r>
-      <w:r>
-        <w:rPr>
-          <w:rFonts w:ascii="Times New Roman" w:eastAsia="Times New Roman" w:hAnsi="Times New Roman" w:cs="Times New Roman"/>
-          <w:b/>
-          <w:sz w:val="20"/>
-          <w:szCs w:val="20"/>
-        </w:rPr>
-        <w:br/>
-      </w:r>
-      <w:r>
-        <w:rPr>
-          <w:rFonts w:ascii="Times New Roman" w:eastAsia="Times New Roman" w:hAnsi="Times New Roman" w:cs="Times New Roman"/>
-          <w:sz w:val="20"/>
-          <w:szCs w:val="20"/>
-        </w:rPr>
-        <w:t>Berdasarkan hasil identifikasi dari 20 literasi yang membahas edukasi depresi, target pengguna dalam pengembangan media ini terdiri dari beberapa kelompok, yaitu remaja, orang tua atau wali, penyintas depresi, pengidap depresi, dan tenaga kesehatan non-spesialis. Dari total data yang diperoleh, remaja mendominasi sebagai kelompok terbanyak dengan jumlah 14 orang. Selanjutnya, terdapat 4 orang tua atau wali, 2 tenaga kesehatan non-spesialis, serta masing-masing 1 orang penyintas dan pengidap depresi. Data ini menunjukkan bahwa remaja merupakan fokus utama dalam perancangan media edukasi yang dikembangkan. Dominasi jumlah remaja juga mencerminkan pentingnya penyampaian informasi yang relevan dan mudah dipahami oleh kelompok usia tersebut. Oleh karena itu, pendekatan desain, konten, dan penyajian media perlu disesuaikan dengan karakteristik serta kebutuhan informasi remaja sebagai pengguna utama.</w:t>
+          <w:sz w:val="20"/>
+          <w:szCs w:val="20"/>
+        </w:rPr>
+        <w:t>Berdasarkan data identifikasi dari 20 literasi yang membahas edukasi depresi, kelompok remaja merupakan target pengguna terbanyak dalam pengembangan media edukasi ini, dengan jumlah 14 orang. Jumlah ini jauh lebih tinggi dibandingkan dengan kelompok lainnya, seperti orang tua atau wali (4 orang), tenaga kesehatan non-spesialis (2 orang), serta masing-masing 1 orang untuk penyintas dan pengidap depresi. Dominasi jumlah remaja ini menegaskan bahwa kelompok usia tersebut menjadi fokus utama dalam perancangan media edukasi yang dikembangkan. Hal ini mencerminkan pentingnya penyampaian informasi yang relevan dan mudah dipahami oleh remaja sebagai pengguna utama.</w:t>
       </w:r>
     </w:p>
     <w:p>
@@ -4369,7 +4534,50 @@
           <w:sz w:val="20"/>
           <w:szCs w:val="20"/>
         </w:rPr>
-        <w:t>Berdasarkan data jumlah responden, kelompok remaja merupakan yang paling dominan dibandingkan kelompok lainnya. Hal ini menunjukkan bahwa remaja adalah kelompok yang paling relevan dan membutuhkan perhatian lebih dalam edukasi mengenai depresi. Oleh karena itu, remaja dipilih sebagai target utama pengguna dalam pengembangan media edukasi ini karena jumlah mereka yang paling banyak dan potensial untuk mendapatkan manfaat langsung dari informasi yang disampaikan.</w:t>
+        <w:t xml:space="preserve">Tingginya proporsi remaja sebagai target pengguna dapat dijelaskan oleh meningkatnya prevalensi gejala depresi di kalangan remaja dalam beberapa tahun terakhir. Salah satu faktor yang berkontribusi adalah penggunaan media sosial yang intensif. Sebuah tinjauan pustaka menunjukkan bahwa penggunaan media sosial berkaitan dengan peningkatan gejala depresi pada remaja, terutama akibat perbandingan sosial, gangguan tidur, dan penurunan harga diri </w:t>
+      </w:r>
+      <w:sdt>
+        <w:sdtPr>
+          <w:rPr>
+            <w:rFonts w:ascii="Times New Roman" w:eastAsia="Times New Roman" w:hAnsi="Times New Roman" w:cs="Times New Roman"/>
+            <w:color w:val="000000"/>
+            <w:sz w:val="20"/>
+            <w:szCs w:val="20"/>
+          </w:rPr>
+          <w:tag w:val="MENDELEY_CITATION_v3_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"/>
+          <w:id w:val="-140495435"/>
+          <w:placeholder>
+            <w:docPart w:val="DefaultPlaceholder_-1854013440"/>
+          </w:placeholder>
+        </w:sdtPr>
+        <w:sdtContent>
+          <w:r>
+            <w:rPr>
+              <w:rFonts w:ascii="Times New Roman" w:eastAsia="Times New Roman" w:hAnsi="Times New Roman" w:cs="Times New Roman"/>
+              <w:color w:val="000000"/>
+              <w:sz w:val="20"/>
+              <w:szCs w:val="20"/>
+            </w:rPr>
+            <w:t>[100]</w:t>
+          </w:r>
+        </w:sdtContent>
+      </w:sdt>
+      <w:r>
+        <w:rPr>
+          <w:rFonts w:ascii="Times New Roman" w:eastAsia="Times New Roman" w:hAnsi="Times New Roman" w:cs="Times New Roman"/>
+          <w:color w:val="000000"/>
+          <w:sz w:val="20"/>
+          <w:szCs w:val="20"/>
+        </w:rPr>
+        <w:t xml:space="preserve"> </w:t>
+      </w:r>
+      <w:r>
+        <w:rPr>
+          <w:rFonts w:ascii="Times New Roman" w:eastAsia="Times New Roman" w:hAnsi="Times New Roman" w:cs="Times New Roman"/>
+          <w:sz w:val="20"/>
+          <w:szCs w:val="20"/>
+        </w:rPr>
+        <w:t>. Fenomena ini menyoroti pentingnya intervensi edukatif yang dirancang khusus untuk remaja, guna membantu mereka memahami dan mengelola risiko kesehatan mental yang mereka hadapi.</w:t>
       </w:r>
       <w:r>
         <w:rPr>
@@ -4499,7 +4707,7 @@
           <w:sz w:val="20"/>
           <w:szCs w:val="20"/>
         </w:rPr>
-        <w:t xml:space="preserve"> mencapai jutaan kasus tiap tahunnya [1]. Data Kementerian Kesehatan Republik Indonesia juga menunjukkan bahwa gangguan kesehatan mental, termasuk depresi, semakin mengemuka sebagai masalah publik dengan kebutuhan penanganan yang mendesak [2]. Dengan menggunakan media interaktif seperti game, diharapkan pesan-pesan edukatif tentang gejala, penyebab, dan strategi coping depresi dapat tersampaikan secara lebih menarik dan mudah diingat oleh audiens muda [3]. Game dengan alur cerita yang desainnya menggambarkan perjalanan tokoh menghadapi gejala depresi </w:t>
+        <w:t xml:space="preserve"> mencapai jutaan kasus tiap tahunnya [1]. Data Kementerian Kesehatan Republik Indonesia juga menunjukkan bahwa gangguan kesehatan mental, termasuk depresi, semakin mengemuka sebagai masalah publik dengan kebutuhan penanganan yang mendesak [2]. Dengan menggunakan media interaktif seperti game, diharapkan pesan-pesan edukatif tentang gejala, penyebab, dan </w:t>
       </w:r>
       <w:r>
         <w:rPr>
@@ -4508,7 +4716,7 @@
           <w:szCs w:val="20"/>
         </w:rPr>
         <w:lastRenderedPageBreak/>
-        <w:t>memungkinkan pemain merasakan pengalaman empatik, sekaligus memperoleh pengetahuan praktis tentang cara mengenali tanda-tanda awal depresi. Selain itu, format digital game memfasilitasi penyebaran yang lebih luas, karena remaja cenderung menggunakan smartphone dan perangkat digital secara aktif dalam kehidupan sehari-hari.</w:t>
+        <w:t>strategi coping depresi dapat tersampaikan secara lebih menarik dan mudah diingat oleh audiens muda [3]. Game dengan alur cerita yang desainnya menggambarkan perjalanan tokoh menghadapi gejala depresi memungkinkan pemain merasakan pengalaman empatik, sekaligus memperoleh pengetahuan praktis tentang cara mengenali tanda-tanda awal depresi. Selain itu, format digital game memfasilitasi penyebaran yang lebih luas, karena remaja cenderung menggunakan smartphone dan perangkat digital secara aktif dalam kehidupan sehari-hari.</w:t>
       </w:r>
     </w:p>
     <w:p>
@@ -4950,7 +5158,7 @@
             <w:autoSpaceDE w:val="0"/>
             <w:autoSpaceDN w:val="0"/>
             <w:ind w:hanging="640"/>
-            <w:divId w:val="2012684389"/>
+            <w:divId w:val="1734892743"/>
             <w:rPr>
               <w:rFonts w:eastAsia="Times New Roman"/>
               <w:sz w:val="24"/>
@@ -4976,7 +5184,7 @@
             <w:autoSpaceDE w:val="0"/>
             <w:autoSpaceDN w:val="0"/>
             <w:ind w:hanging="640"/>
-            <w:divId w:val="2104180971"/>
+            <w:divId w:val="1828594500"/>
             <w:rPr>
               <w:rFonts w:eastAsia="Times New Roman"/>
             </w:rPr>
@@ -5000,7 +5208,7 @@
             <w:autoSpaceDE w:val="0"/>
             <w:autoSpaceDN w:val="0"/>
             <w:ind w:hanging="640"/>
-            <w:divId w:val="1966038968"/>
+            <w:divId w:val="258368828"/>
             <w:rPr>
               <w:rFonts w:eastAsia="Times New Roman"/>
             </w:rPr>
@@ -5038,7 +5246,7 @@
             <w:autoSpaceDE w:val="0"/>
             <w:autoSpaceDN w:val="0"/>
             <w:ind w:hanging="640"/>
-            <w:divId w:val="1558206238"/>
+            <w:divId w:val="1224214319"/>
             <w:rPr>
               <w:rFonts w:eastAsia="Times New Roman"/>
             </w:rPr>
@@ -5076,7 +5284,7 @@
             <w:autoSpaceDE w:val="0"/>
             <w:autoSpaceDN w:val="0"/>
             <w:ind w:hanging="640"/>
-            <w:divId w:val="1558934055"/>
+            <w:divId w:val="1743747037"/>
             <w:rPr>
               <w:rFonts w:eastAsia="Times New Roman"/>
             </w:rPr>
@@ -5114,7 +5322,7 @@
             <w:autoSpaceDE w:val="0"/>
             <w:autoSpaceDN w:val="0"/>
             <w:ind w:hanging="640"/>
-            <w:divId w:val="1387026075"/>
+            <w:divId w:val="168568206"/>
             <w:rPr>
               <w:rFonts w:eastAsia="Times New Roman"/>
             </w:rPr>
@@ -5152,7 +5360,7 @@
             <w:autoSpaceDE w:val="0"/>
             <w:autoSpaceDN w:val="0"/>
             <w:ind w:hanging="640"/>
-            <w:divId w:val="952442647"/>
+            <w:divId w:val="1179393070"/>
             <w:rPr>
               <w:rFonts w:eastAsia="Times New Roman"/>
             </w:rPr>
@@ -5190,7 +5398,7 @@
             <w:autoSpaceDE w:val="0"/>
             <w:autoSpaceDN w:val="0"/>
             <w:ind w:hanging="640"/>
-            <w:divId w:val="1893887971"/>
+            <w:divId w:val="1324043843"/>
             <w:rPr>
               <w:rFonts w:eastAsia="Times New Roman"/>
             </w:rPr>
@@ -5228,7 +5436,7 @@
             <w:autoSpaceDE w:val="0"/>
             <w:autoSpaceDN w:val="0"/>
             <w:ind w:hanging="640"/>
-            <w:divId w:val="370112580"/>
+            <w:divId w:val="1876238232"/>
             <w:rPr>
               <w:rFonts w:eastAsia="Times New Roman"/>
             </w:rPr>
@@ -5266,7 +5474,7 @@
             <w:autoSpaceDE w:val="0"/>
             <w:autoSpaceDN w:val="0"/>
             <w:ind w:hanging="640"/>
-            <w:divId w:val="1400595925"/>
+            <w:divId w:val="1619141593"/>
             <w:rPr>
               <w:rFonts w:eastAsia="Times New Roman"/>
             </w:rPr>
@@ -5304,7 +5512,7 @@
             <w:autoSpaceDE w:val="0"/>
             <w:autoSpaceDN w:val="0"/>
             <w:ind w:hanging="640"/>
-            <w:divId w:val="987055670"/>
+            <w:divId w:val="1782531871"/>
             <w:rPr>
               <w:rFonts w:eastAsia="Times New Roman"/>
             </w:rPr>
@@ -5342,7 +5550,7 @@
             <w:autoSpaceDE w:val="0"/>
             <w:autoSpaceDN w:val="0"/>
             <w:ind w:hanging="640"/>
-            <w:divId w:val="914818825"/>
+            <w:divId w:val="1011221001"/>
             <w:rPr>
               <w:rFonts w:eastAsia="Times New Roman"/>
             </w:rPr>
@@ -5381,7 +5589,7 @@
             <w:autoSpaceDE w:val="0"/>
             <w:autoSpaceDN w:val="0"/>
             <w:ind w:hanging="640"/>
-            <w:divId w:val="1725907590"/>
+            <w:divId w:val="1446583391"/>
             <w:rPr>
               <w:rFonts w:eastAsia="Times New Roman"/>
             </w:rPr>
@@ -5419,7 +5627,7 @@
             <w:autoSpaceDE w:val="0"/>
             <w:autoSpaceDN w:val="0"/>
             <w:ind w:hanging="640"/>
-            <w:divId w:val="784540997"/>
+            <w:divId w:val="1309088071"/>
             <w:rPr>
               <w:rFonts w:eastAsia="Times New Roman"/>
             </w:rPr>
@@ -5457,7 +5665,7 @@
             <w:autoSpaceDE w:val="0"/>
             <w:autoSpaceDN w:val="0"/>
             <w:ind w:hanging="640"/>
-            <w:divId w:val="1396129085"/>
+            <w:divId w:val="1300768045"/>
             <w:rPr>
               <w:rFonts w:eastAsia="Times New Roman"/>
             </w:rPr>
@@ -5495,7 +5703,7 @@
             <w:autoSpaceDE w:val="0"/>
             <w:autoSpaceDN w:val="0"/>
             <w:ind w:hanging="640"/>
-            <w:divId w:val="149836332"/>
+            <w:divId w:val="324089361"/>
             <w:rPr>
               <w:rFonts w:eastAsia="Times New Roman"/>
             </w:rPr>
@@ -5533,7 +5741,7 @@
             <w:autoSpaceDE w:val="0"/>
             <w:autoSpaceDN w:val="0"/>
             <w:ind w:hanging="640"/>
-            <w:divId w:val="355423010"/>
+            <w:divId w:val="254678375"/>
             <w:rPr>
               <w:rFonts w:eastAsia="Times New Roman"/>
             </w:rPr>
@@ -5571,7 +5779,7 @@
             <w:autoSpaceDE w:val="0"/>
             <w:autoSpaceDN w:val="0"/>
             <w:ind w:hanging="640"/>
-            <w:divId w:val="1403412405"/>
+            <w:divId w:val="579867908"/>
             <w:rPr>
               <w:rFonts w:eastAsia="Times New Roman"/>
             </w:rPr>
@@ -5609,7 +5817,7 @@
             <w:autoSpaceDE w:val="0"/>
             <w:autoSpaceDN w:val="0"/>
             <w:ind w:hanging="640"/>
-            <w:divId w:val="714309305"/>
+            <w:divId w:val="658849826"/>
             <w:rPr>
               <w:rFonts w:eastAsia="Times New Roman"/>
             </w:rPr>
@@ -5647,7 +5855,7 @@
             <w:autoSpaceDE w:val="0"/>
             <w:autoSpaceDN w:val="0"/>
             <w:ind w:hanging="640"/>
-            <w:divId w:val="987393013"/>
+            <w:divId w:val="1238907447"/>
             <w:rPr>
               <w:rFonts w:eastAsia="Times New Roman"/>
             </w:rPr>
@@ -5685,7 +5893,7 @@
             <w:autoSpaceDE w:val="0"/>
             <w:autoSpaceDN w:val="0"/>
             <w:ind w:hanging="640"/>
-            <w:divId w:val="105858019"/>
+            <w:divId w:val="1174030735"/>
             <w:rPr>
               <w:rFonts w:eastAsia="Times New Roman"/>
             </w:rPr>
@@ -5723,7 +5931,7 @@
             <w:autoSpaceDE w:val="0"/>
             <w:autoSpaceDN w:val="0"/>
             <w:ind w:hanging="640"/>
-            <w:divId w:val="1771702475"/>
+            <w:divId w:val="1218472216"/>
             <w:rPr>
               <w:rFonts w:eastAsia="Times New Roman"/>
             </w:rPr>
@@ -5761,7 +5969,7 @@
             <w:autoSpaceDE w:val="0"/>
             <w:autoSpaceDN w:val="0"/>
             <w:ind w:hanging="640"/>
-            <w:divId w:val="633683416"/>
+            <w:divId w:val="588463868"/>
             <w:rPr>
               <w:rFonts w:eastAsia="Times New Roman"/>
             </w:rPr>
@@ -5799,7 +6007,7 @@
             <w:autoSpaceDE w:val="0"/>
             <w:autoSpaceDN w:val="0"/>
             <w:ind w:hanging="640"/>
-            <w:divId w:val="1384670772"/>
+            <w:divId w:val="1163159314"/>
             <w:rPr>
               <w:rFonts w:eastAsia="Times New Roman"/>
             </w:rPr>
@@ -5837,7 +6045,7 @@
             <w:autoSpaceDE w:val="0"/>
             <w:autoSpaceDN w:val="0"/>
             <w:ind w:hanging="640"/>
-            <w:divId w:val="1459028224"/>
+            <w:divId w:val="1394424550"/>
             <w:rPr>
               <w:rFonts w:eastAsia="Times New Roman"/>
             </w:rPr>
@@ -5876,7 +6084,7 @@
             <w:autoSpaceDE w:val="0"/>
             <w:autoSpaceDN w:val="0"/>
             <w:ind w:hanging="640"/>
-            <w:divId w:val="924876020"/>
+            <w:divId w:val="266011655"/>
             <w:rPr>
               <w:rFonts w:eastAsia="Times New Roman"/>
             </w:rPr>
@@ -5900,7 +6108,7 @@
             <w:autoSpaceDE w:val="0"/>
             <w:autoSpaceDN w:val="0"/>
             <w:ind w:hanging="640"/>
-            <w:divId w:val="1693872989"/>
+            <w:divId w:val="1767727363"/>
             <w:rPr>
               <w:rFonts w:eastAsia="Times New Roman"/>
             </w:rPr>
@@ -5938,7 +6146,7 @@
             <w:autoSpaceDE w:val="0"/>
             <w:autoSpaceDN w:val="0"/>
             <w:ind w:hanging="640"/>
-            <w:divId w:val="1230767939"/>
+            <w:divId w:val="270557581"/>
             <w:rPr>
               <w:rFonts w:eastAsia="Times New Roman"/>
             </w:rPr>
@@ -5962,7 +6170,7 @@
             <w:autoSpaceDE w:val="0"/>
             <w:autoSpaceDN w:val="0"/>
             <w:ind w:hanging="640"/>
-            <w:divId w:val="1961917011"/>
+            <w:divId w:val="1679385936"/>
             <w:rPr>
               <w:rFonts w:eastAsia="Times New Roman"/>
             </w:rPr>
@@ -5986,7 +6194,7 @@
             <w:autoSpaceDE w:val="0"/>
             <w:autoSpaceDN w:val="0"/>
             <w:ind w:hanging="640"/>
-            <w:divId w:val="1070075906"/>
+            <w:divId w:val="986978615"/>
             <w:rPr>
               <w:rFonts w:eastAsia="Times New Roman"/>
             </w:rPr>
@@ -6024,7 +6232,7 @@
             <w:autoSpaceDE w:val="0"/>
             <w:autoSpaceDN w:val="0"/>
             <w:ind w:hanging="640"/>
-            <w:divId w:val="1991788187"/>
+            <w:divId w:val="763455148"/>
             <w:rPr>
               <w:rFonts w:eastAsia="Times New Roman"/>
             </w:rPr>
@@ -6048,7 +6256,7 @@
             <w:autoSpaceDE w:val="0"/>
             <w:autoSpaceDN w:val="0"/>
             <w:ind w:hanging="640"/>
-            <w:divId w:val="541795089"/>
+            <w:divId w:val="1369329277"/>
             <w:rPr>
               <w:rFonts w:eastAsia="Times New Roman"/>
             </w:rPr>
@@ -6086,7 +6294,7 @@
             <w:autoSpaceDE w:val="0"/>
             <w:autoSpaceDN w:val="0"/>
             <w:ind w:hanging="640"/>
-            <w:divId w:val="684524430"/>
+            <w:divId w:val="11884343"/>
             <w:rPr>
               <w:rFonts w:eastAsia="Times New Roman"/>
             </w:rPr>
@@ -6124,7 +6332,7 @@
             <w:autoSpaceDE w:val="0"/>
             <w:autoSpaceDN w:val="0"/>
             <w:ind w:hanging="640"/>
-            <w:divId w:val="2046952271"/>
+            <w:divId w:val="444663492"/>
             <w:rPr>
               <w:rFonts w:eastAsia="Times New Roman"/>
             </w:rPr>
@@ -6162,7 +6370,7 @@
             <w:autoSpaceDE w:val="0"/>
             <w:autoSpaceDN w:val="0"/>
             <w:ind w:hanging="640"/>
-            <w:divId w:val="683940376"/>
+            <w:divId w:val="1061635943"/>
             <w:rPr>
               <w:rFonts w:eastAsia="Times New Roman"/>
             </w:rPr>
@@ -6186,7 +6394,7 @@
             <w:autoSpaceDE w:val="0"/>
             <w:autoSpaceDN w:val="0"/>
             <w:ind w:hanging="640"/>
-            <w:divId w:val="597061284"/>
+            <w:divId w:val="995570485"/>
             <w:rPr>
               <w:rFonts w:eastAsia="Times New Roman"/>
             </w:rPr>
@@ -6224,7 +6432,7 @@
             <w:autoSpaceDE w:val="0"/>
             <w:autoSpaceDN w:val="0"/>
             <w:ind w:hanging="640"/>
-            <w:divId w:val="922950719"/>
+            <w:divId w:val="554202287"/>
             <w:rPr>
               <w:rFonts w:eastAsia="Times New Roman"/>
             </w:rPr>
@@ -6262,7 +6470,7 @@
             <w:autoSpaceDE w:val="0"/>
             <w:autoSpaceDN w:val="0"/>
             <w:ind w:hanging="640"/>
-            <w:divId w:val="1507868516"/>
+            <w:divId w:val="398480593"/>
             <w:rPr>
               <w:rFonts w:eastAsia="Times New Roman"/>
             </w:rPr>
@@ -6314,7 +6522,7 @@
             <w:autoSpaceDE w:val="0"/>
             <w:autoSpaceDN w:val="0"/>
             <w:ind w:hanging="640"/>
-            <w:divId w:val="1204825494"/>
+            <w:divId w:val="705255521"/>
             <w:rPr>
               <w:rFonts w:eastAsia="Times New Roman"/>
             </w:rPr>
@@ -6338,7 +6546,7 @@
             <w:autoSpaceDE w:val="0"/>
             <w:autoSpaceDN w:val="0"/>
             <w:ind w:hanging="640"/>
-            <w:divId w:val="64763039"/>
+            <w:divId w:val="389695401"/>
             <w:rPr>
               <w:rFonts w:eastAsia="Times New Roman"/>
             </w:rPr>
@@ -6362,7 +6570,7 @@
             <w:autoSpaceDE w:val="0"/>
             <w:autoSpaceDN w:val="0"/>
             <w:ind w:hanging="640"/>
-            <w:divId w:val="877812862"/>
+            <w:divId w:val="1561791150"/>
             <w:rPr>
               <w:rFonts w:eastAsia="Times New Roman"/>
             </w:rPr>
@@ -6387,7 +6595,7 @@
             <w:autoSpaceDE w:val="0"/>
             <w:autoSpaceDN w:val="0"/>
             <w:ind w:hanging="640"/>
-            <w:divId w:val="1111976505"/>
+            <w:divId w:val="1070537084"/>
             <w:rPr>
               <w:rFonts w:eastAsia="Times New Roman"/>
             </w:rPr>
@@ -6411,7 +6619,7 @@
             <w:autoSpaceDE w:val="0"/>
             <w:autoSpaceDN w:val="0"/>
             <w:ind w:hanging="640"/>
-            <w:divId w:val="908728875"/>
+            <w:divId w:val="1704868498"/>
             <w:rPr>
               <w:rFonts w:eastAsia="Times New Roman"/>
             </w:rPr>
@@ -6449,7 +6657,7 @@
             <w:autoSpaceDE w:val="0"/>
             <w:autoSpaceDN w:val="0"/>
             <w:ind w:hanging="640"/>
-            <w:divId w:val="1333987512"/>
+            <w:divId w:val="2128113848"/>
             <w:rPr>
               <w:rFonts w:eastAsia="Times New Roman"/>
             </w:rPr>
@@ -6473,7 +6681,7 @@
             <w:autoSpaceDE w:val="0"/>
             <w:autoSpaceDN w:val="0"/>
             <w:ind w:hanging="640"/>
-            <w:divId w:val="1181436129"/>
+            <w:divId w:val="603541784"/>
             <w:rPr>
               <w:rFonts w:eastAsia="Times New Roman"/>
             </w:rPr>
@@ -6497,7 +6705,7 @@
             <w:autoSpaceDE w:val="0"/>
             <w:autoSpaceDN w:val="0"/>
             <w:ind w:hanging="640"/>
-            <w:divId w:val="1367370426"/>
+            <w:divId w:val="1452017493"/>
             <w:rPr>
               <w:rFonts w:eastAsia="Times New Roman"/>
             </w:rPr>
@@ -6521,7 +6729,7 @@
             <w:autoSpaceDE w:val="0"/>
             <w:autoSpaceDN w:val="0"/>
             <w:ind w:hanging="640"/>
-            <w:divId w:val="242227741"/>
+            <w:divId w:val="1197156934"/>
             <w:rPr>
               <w:rFonts w:eastAsia="Times New Roman"/>
             </w:rPr>
@@ -6545,7 +6753,7 @@
             <w:autoSpaceDE w:val="0"/>
             <w:autoSpaceDN w:val="0"/>
             <w:ind w:hanging="640"/>
-            <w:divId w:val="1902324028"/>
+            <w:divId w:val="729499821"/>
             <w:rPr>
               <w:rFonts w:eastAsia="Times New Roman"/>
             </w:rPr>
@@ -6569,7 +6777,7 @@
             <w:autoSpaceDE w:val="0"/>
             <w:autoSpaceDN w:val="0"/>
             <w:ind w:hanging="640"/>
-            <w:divId w:val="1657301888"/>
+            <w:divId w:val="186137134"/>
             <w:rPr>
               <w:rFonts w:eastAsia="Times New Roman"/>
             </w:rPr>
@@ -6593,7 +6801,7 @@
             <w:autoSpaceDE w:val="0"/>
             <w:autoSpaceDN w:val="0"/>
             <w:ind w:hanging="640"/>
-            <w:divId w:val="1935505917"/>
+            <w:divId w:val="1903366617"/>
             <w:rPr>
               <w:rFonts w:eastAsia="Times New Roman"/>
             </w:rPr>
@@ -6631,7 +6839,7 @@
             <w:autoSpaceDE w:val="0"/>
             <w:autoSpaceDN w:val="0"/>
             <w:ind w:hanging="640"/>
-            <w:divId w:val="2053652967"/>
+            <w:divId w:val="1505394680"/>
             <w:rPr>
               <w:rFonts w:eastAsia="Times New Roman"/>
             </w:rPr>
@@ -6669,7 +6877,7 @@
             <w:autoSpaceDE w:val="0"/>
             <w:autoSpaceDN w:val="0"/>
             <w:ind w:hanging="640"/>
-            <w:divId w:val="277226562"/>
+            <w:divId w:val="1928689008"/>
             <w:rPr>
               <w:rFonts w:eastAsia="Times New Roman"/>
             </w:rPr>
@@ -6693,7 +6901,7 @@
             <w:autoSpaceDE w:val="0"/>
             <w:autoSpaceDN w:val="0"/>
             <w:ind w:hanging="640"/>
-            <w:divId w:val="2112971224"/>
+            <w:divId w:val="1415470003"/>
             <w:rPr>
               <w:rFonts w:eastAsia="Times New Roman"/>
             </w:rPr>
@@ -6731,7 +6939,7 @@
             <w:autoSpaceDE w:val="0"/>
             <w:autoSpaceDN w:val="0"/>
             <w:ind w:hanging="640"/>
-            <w:divId w:val="733041654"/>
+            <w:divId w:val="1111439570"/>
             <w:rPr>
               <w:rFonts w:eastAsia="Times New Roman"/>
             </w:rPr>
@@ -6769,7 +6977,7 @@
             <w:autoSpaceDE w:val="0"/>
             <w:autoSpaceDN w:val="0"/>
             <w:ind w:hanging="640"/>
-            <w:divId w:val="833178408"/>
+            <w:divId w:val="1597056009"/>
             <w:rPr>
               <w:rFonts w:eastAsia="Times New Roman"/>
             </w:rPr>
@@ -6816,7 +7024,7 @@
             <w:autoSpaceDE w:val="0"/>
             <w:autoSpaceDN w:val="0"/>
             <w:ind w:hanging="640"/>
-            <w:divId w:val="965546397"/>
+            <w:divId w:val="416363754"/>
             <w:rPr>
               <w:rFonts w:eastAsia="Times New Roman"/>
             </w:rPr>
@@ -6854,7 +7062,7 @@
             <w:autoSpaceDE w:val="0"/>
             <w:autoSpaceDN w:val="0"/>
             <w:ind w:hanging="640"/>
-            <w:divId w:val="1152260791"/>
+            <w:divId w:val="696857520"/>
             <w:rPr>
               <w:rFonts w:eastAsia="Times New Roman"/>
             </w:rPr>
@@ -6878,7 +7086,7 @@
             <w:autoSpaceDE w:val="0"/>
             <w:autoSpaceDN w:val="0"/>
             <w:ind w:hanging="640"/>
-            <w:divId w:val="235434205"/>
+            <w:divId w:val="888107528"/>
             <w:rPr>
               <w:rFonts w:eastAsia="Times New Roman"/>
             </w:rPr>
@@ -6902,7 +7110,7 @@
             <w:autoSpaceDE w:val="0"/>
             <w:autoSpaceDN w:val="0"/>
             <w:ind w:hanging="640"/>
-            <w:divId w:val="1206915887"/>
+            <w:divId w:val="831986653"/>
             <w:rPr>
               <w:rFonts w:eastAsia="Times New Roman"/>
             </w:rPr>
@@ -6926,7 +7134,7 @@
             <w:autoSpaceDE w:val="0"/>
             <w:autoSpaceDN w:val="0"/>
             <w:ind w:hanging="640"/>
-            <w:divId w:val="472347"/>
+            <w:divId w:val="1616713169"/>
             <w:rPr>
               <w:rFonts w:eastAsia="Times New Roman"/>
             </w:rPr>
@@ -6964,7 +7172,7 @@
             <w:autoSpaceDE w:val="0"/>
             <w:autoSpaceDN w:val="0"/>
             <w:ind w:hanging="640"/>
-            <w:divId w:val="22706998"/>
+            <w:divId w:val="143593423"/>
             <w:rPr>
               <w:rFonts w:eastAsia="Times New Roman"/>
             </w:rPr>
@@ -6988,7 +7196,7 @@
             <w:autoSpaceDE w:val="0"/>
             <w:autoSpaceDN w:val="0"/>
             <w:ind w:hanging="640"/>
-            <w:divId w:val="679937555"/>
+            <w:divId w:val="913467694"/>
             <w:rPr>
               <w:rFonts w:eastAsia="Times New Roman"/>
             </w:rPr>
@@ -7012,7 +7220,7 @@
             <w:autoSpaceDE w:val="0"/>
             <w:autoSpaceDN w:val="0"/>
             <w:ind w:hanging="640"/>
-            <w:divId w:val="1249772256"/>
+            <w:divId w:val="1318731668"/>
             <w:rPr>
               <w:rFonts w:eastAsia="Times New Roman"/>
             </w:rPr>
@@ -7050,7 +7258,7 @@
             <w:autoSpaceDE w:val="0"/>
             <w:autoSpaceDN w:val="0"/>
             <w:ind w:hanging="640"/>
-            <w:divId w:val="36205636"/>
+            <w:divId w:val="1867595810"/>
             <w:rPr>
               <w:rFonts w:eastAsia="Times New Roman"/>
             </w:rPr>
@@ -7088,7 +7296,7 @@
             <w:autoSpaceDE w:val="0"/>
             <w:autoSpaceDN w:val="0"/>
             <w:ind w:hanging="640"/>
-            <w:divId w:val="1681010326"/>
+            <w:divId w:val="329063667"/>
             <w:rPr>
               <w:rFonts w:eastAsia="Times New Roman"/>
             </w:rPr>
@@ -7112,7 +7320,7 @@
             <w:autoSpaceDE w:val="0"/>
             <w:autoSpaceDN w:val="0"/>
             <w:ind w:hanging="640"/>
-            <w:divId w:val="1297104736"/>
+            <w:divId w:val="412901451"/>
             <w:rPr>
               <w:rFonts w:eastAsia="Times New Roman"/>
             </w:rPr>
@@ -7143,7 +7351,7 @@
             <w:autoSpaceDE w:val="0"/>
             <w:autoSpaceDN w:val="0"/>
             <w:ind w:hanging="640"/>
-            <w:divId w:val="791291063"/>
+            <w:divId w:val="804667245"/>
             <w:rPr>
               <w:rFonts w:eastAsia="Times New Roman"/>
             </w:rPr>
@@ -7181,7 +7389,7 @@
             <w:autoSpaceDE w:val="0"/>
             <w:autoSpaceDN w:val="0"/>
             <w:ind w:hanging="640"/>
-            <w:divId w:val="1227645100"/>
+            <w:divId w:val="146827685"/>
             <w:rPr>
               <w:rFonts w:eastAsia="Times New Roman"/>
             </w:rPr>
@@ -7219,7 +7427,7 @@
             <w:autoSpaceDE w:val="0"/>
             <w:autoSpaceDN w:val="0"/>
             <w:ind w:hanging="640"/>
-            <w:divId w:val="1893231846"/>
+            <w:divId w:val="1182934744"/>
             <w:rPr>
               <w:rFonts w:eastAsia="Times New Roman"/>
             </w:rPr>
@@ -7257,7 +7465,7 @@
             <w:autoSpaceDE w:val="0"/>
             <w:autoSpaceDN w:val="0"/>
             <w:ind w:hanging="640"/>
-            <w:divId w:val="333146899"/>
+            <w:divId w:val="1706177101"/>
             <w:rPr>
               <w:rFonts w:eastAsia="Times New Roman"/>
             </w:rPr>
@@ -7295,7 +7503,7 @@
             <w:autoSpaceDE w:val="0"/>
             <w:autoSpaceDN w:val="0"/>
             <w:ind w:hanging="640"/>
-            <w:divId w:val="1407874733"/>
+            <w:divId w:val="417333825"/>
             <w:rPr>
               <w:rFonts w:eastAsia="Times New Roman"/>
             </w:rPr>
@@ -7319,7 +7527,7 @@
             <w:autoSpaceDE w:val="0"/>
             <w:autoSpaceDN w:val="0"/>
             <w:ind w:hanging="640"/>
-            <w:divId w:val="682512282"/>
+            <w:divId w:val="314070379"/>
             <w:rPr>
               <w:rFonts w:eastAsia="Times New Roman"/>
             </w:rPr>
@@ -7357,7 +7565,7 @@
             <w:autoSpaceDE w:val="0"/>
             <w:autoSpaceDN w:val="0"/>
             <w:ind w:hanging="640"/>
-            <w:divId w:val="208689111"/>
+            <w:divId w:val="554852437"/>
             <w:rPr>
               <w:rFonts w:eastAsia="Times New Roman"/>
             </w:rPr>
@@ -7381,7 +7589,7 @@
             <w:autoSpaceDE w:val="0"/>
             <w:autoSpaceDN w:val="0"/>
             <w:ind w:hanging="640"/>
-            <w:divId w:val="1174997496"/>
+            <w:divId w:val="1251112964"/>
             <w:rPr>
               <w:rFonts w:eastAsia="Times New Roman"/>
             </w:rPr>
@@ -7419,7 +7627,7 @@
             <w:autoSpaceDE w:val="0"/>
             <w:autoSpaceDN w:val="0"/>
             <w:ind w:hanging="640"/>
-            <w:divId w:val="58986475"/>
+            <w:divId w:val="824737097"/>
             <w:rPr>
               <w:rFonts w:eastAsia="Times New Roman"/>
             </w:rPr>
@@ -7457,7 +7665,7 @@
             <w:autoSpaceDE w:val="0"/>
             <w:autoSpaceDN w:val="0"/>
             <w:ind w:hanging="640"/>
-            <w:divId w:val="1750417796"/>
+            <w:divId w:val="1017150135"/>
             <w:rPr>
               <w:rFonts w:eastAsia="Times New Roman"/>
             </w:rPr>
@@ -7495,7 +7703,7 @@
             <w:autoSpaceDE w:val="0"/>
             <w:autoSpaceDN w:val="0"/>
             <w:ind w:hanging="640"/>
-            <w:divId w:val="2091150422"/>
+            <w:divId w:val="1287001420"/>
             <w:rPr>
               <w:rFonts w:eastAsia="Times New Roman"/>
             </w:rPr>
@@ -7519,7 +7727,7 @@
             <w:autoSpaceDE w:val="0"/>
             <w:autoSpaceDN w:val="0"/>
             <w:ind w:hanging="640"/>
-            <w:divId w:val="1169638721"/>
+            <w:divId w:val="403917033"/>
             <w:rPr>
               <w:rFonts w:eastAsia="Times New Roman"/>
             </w:rPr>
@@ -7558,7 +7766,7 @@
             <w:autoSpaceDE w:val="0"/>
             <w:autoSpaceDN w:val="0"/>
             <w:ind w:hanging="640"/>
-            <w:divId w:val="916790460"/>
+            <w:divId w:val="1856111334"/>
             <w:rPr>
               <w:rFonts w:eastAsia="Times New Roman"/>
             </w:rPr>
@@ -7582,7 +7790,7 @@
             <w:autoSpaceDE w:val="0"/>
             <w:autoSpaceDN w:val="0"/>
             <w:ind w:hanging="640"/>
-            <w:divId w:val="52046094"/>
+            <w:divId w:val="936792235"/>
             <w:rPr>
               <w:rFonts w:eastAsia="Times New Roman"/>
             </w:rPr>
@@ -7620,7 +7828,7 @@
             <w:autoSpaceDE w:val="0"/>
             <w:autoSpaceDN w:val="0"/>
             <w:ind w:hanging="640"/>
-            <w:divId w:val="2001233955"/>
+            <w:divId w:val="1047952002"/>
             <w:rPr>
               <w:rFonts w:eastAsia="Times New Roman"/>
             </w:rPr>
@@ -7658,7 +7866,7 @@
             <w:autoSpaceDE w:val="0"/>
             <w:autoSpaceDN w:val="0"/>
             <w:ind w:hanging="640"/>
-            <w:divId w:val="197669511"/>
+            <w:divId w:val="1943413423"/>
             <w:rPr>
               <w:rFonts w:eastAsia="Times New Roman"/>
             </w:rPr>
@@ -7682,7 +7890,7 @@
             <w:autoSpaceDE w:val="0"/>
             <w:autoSpaceDN w:val="0"/>
             <w:ind w:hanging="640"/>
-            <w:divId w:val="708527662"/>
+            <w:divId w:val="7755105"/>
             <w:rPr>
               <w:rFonts w:eastAsia="Times New Roman"/>
             </w:rPr>
@@ -7706,7 +7914,7 @@
             <w:autoSpaceDE w:val="0"/>
             <w:autoSpaceDN w:val="0"/>
             <w:ind w:hanging="640"/>
-            <w:divId w:val="1236207848"/>
+            <w:divId w:val="2042169149"/>
             <w:rPr>
               <w:rFonts w:eastAsia="Times New Roman"/>
             </w:rPr>
@@ -7744,7 +7952,7 @@
             <w:autoSpaceDE w:val="0"/>
             <w:autoSpaceDN w:val="0"/>
             <w:ind w:hanging="640"/>
-            <w:divId w:val="1275208531"/>
+            <w:divId w:val="2140760746"/>
             <w:rPr>
               <w:rFonts w:eastAsia="Times New Roman"/>
             </w:rPr>
@@ -7782,7 +7990,7 @@
             <w:autoSpaceDE w:val="0"/>
             <w:autoSpaceDN w:val="0"/>
             <w:ind w:hanging="640"/>
-            <w:divId w:val="1582792656"/>
+            <w:divId w:val="996768894"/>
             <w:rPr>
               <w:rFonts w:eastAsia="Times New Roman"/>
             </w:rPr>
@@ -7806,7 +8014,7 @@
             <w:autoSpaceDE w:val="0"/>
             <w:autoSpaceDN w:val="0"/>
             <w:ind w:hanging="640"/>
-            <w:divId w:val="921261305"/>
+            <w:divId w:val="509297140"/>
             <w:rPr>
               <w:rFonts w:eastAsia="Times New Roman"/>
             </w:rPr>
@@ -7844,7 +8052,7 @@
             <w:autoSpaceDE w:val="0"/>
             <w:autoSpaceDN w:val="0"/>
             <w:ind w:hanging="640"/>
-            <w:divId w:val="141239949"/>
+            <w:divId w:val="1976063888"/>
             <w:rPr>
               <w:rFonts w:eastAsia="Times New Roman"/>
             </w:rPr>
@@ -7882,7 +8090,7 @@
             <w:autoSpaceDE w:val="0"/>
             <w:autoSpaceDN w:val="0"/>
             <w:ind w:hanging="640"/>
-            <w:divId w:val="1869836058"/>
+            <w:divId w:val="828134673"/>
             <w:rPr>
               <w:rFonts w:eastAsia="Times New Roman"/>
             </w:rPr>
@@ -7920,7 +8128,7 @@
             <w:autoSpaceDE w:val="0"/>
             <w:autoSpaceDN w:val="0"/>
             <w:ind w:hanging="640"/>
-            <w:divId w:val="60717930"/>
+            <w:divId w:val="1061824620"/>
             <w:rPr>
               <w:rFonts w:eastAsia="Times New Roman"/>
             </w:rPr>
@@ -7959,7 +8167,7 @@
             <w:autoSpaceDE w:val="0"/>
             <w:autoSpaceDN w:val="0"/>
             <w:ind w:hanging="640"/>
-            <w:divId w:val="2060933758"/>
+            <w:divId w:val="899245330"/>
             <w:rPr>
               <w:rFonts w:eastAsia="Times New Roman"/>
             </w:rPr>
@@ -7997,7 +8205,7 @@
             <w:autoSpaceDE w:val="0"/>
             <w:autoSpaceDN w:val="0"/>
             <w:ind w:hanging="640"/>
-            <w:divId w:val="328363810"/>
+            <w:divId w:val="1861431926"/>
             <w:rPr>
               <w:rFonts w:eastAsia="Times New Roman"/>
             </w:rPr>
@@ -8035,7 +8243,7 @@
             <w:autoSpaceDE w:val="0"/>
             <w:autoSpaceDN w:val="0"/>
             <w:ind w:hanging="640"/>
-            <w:divId w:val="1487281130"/>
+            <w:divId w:val="48849463"/>
             <w:rPr>
               <w:rFonts w:eastAsia="Times New Roman"/>
             </w:rPr>
@@ -8073,7 +8281,7 @@
             <w:autoSpaceDE w:val="0"/>
             <w:autoSpaceDN w:val="0"/>
             <w:ind w:hanging="640"/>
-            <w:divId w:val="1922567937"/>
+            <w:divId w:val="283853120"/>
             <w:rPr>
               <w:rFonts w:eastAsia="Times New Roman"/>
             </w:rPr>
@@ -8125,7 +8333,7 @@
             <w:autoSpaceDE w:val="0"/>
             <w:autoSpaceDN w:val="0"/>
             <w:ind w:hanging="640"/>
-            <w:divId w:val="1372807757"/>
+            <w:divId w:val="1826122697"/>
             <w:rPr>
               <w:rFonts w:eastAsia="Times New Roman"/>
             </w:rPr>
@@ -8163,7 +8371,7 @@
             <w:autoSpaceDE w:val="0"/>
             <w:autoSpaceDN w:val="0"/>
             <w:ind w:hanging="640"/>
-            <w:divId w:val="1775783013"/>
+            <w:divId w:val="698437394"/>
             <w:rPr>
               <w:rFonts w:eastAsia="Times New Roman"/>
             </w:rPr>
@@ -8208,6 +8416,214 @@
               <w:rFonts w:eastAsia="Times New Roman"/>
             </w:rPr>
             <w:t>, vol. 15, no. 5, p. e101, May 2013, doi: 10.2196/jmir.2639.</w:t>
+          </w:r>
+        </w:p>
+        <w:p>
+          <w:pPr>
+            <w:autoSpaceDE w:val="0"/>
+            <w:autoSpaceDN w:val="0"/>
+            <w:ind w:hanging="640"/>
+            <w:divId w:val="170025640"/>
+            <w:rPr>
+              <w:rFonts w:eastAsia="Times New Roman"/>
+            </w:rPr>
+          </w:pPr>
+          <w:r>
+            <w:rPr>
+              <w:rFonts w:eastAsia="Times New Roman"/>
+            </w:rPr>
+            <w:t>[97]</w:t>
+          </w:r>
+          <w:r>
+            <w:rPr>
+              <w:rFonts w:eastAsia="Times New Roman"/>
+            </w:rPr>
+            <w:tab/>
+            <w:t xml:space="preserve">S.-C. Lu </w:t>
+          </w:r>
+          <w:r>
+            <w:rPr>
+              <w:rFonts w:eastAsia="Times New Roman"/>
+              <w:i/>
+              <w:iCs/>
+            </w:rPr>
+            <w:t>et al.</w:t>
+          </w:r>
+          <w:r>
+            <w:rPr>
+              <w:rFonts w:eastAsia="Times New Roman"/>
+            </w:rPr>
+            <w:t xml:space="preserve">, “Effectiveness and Minimum Effective Dose of App-Based Mobile Health Interventions for Anxiety and Depression Symptom Reduction: Systematic Review and Meta-Analysis,” </w:t>
+          </w:r>
+          <w:r>
+            <w:rPr>
+              <w:rFonts w:eastAsia="Times New Roman"/>
+              <w:i/>
+              <w:iCs/>
+            </w:rPr>
+            <w:t>JMIR Ment Health</w:t>
+          </w:r>
+          <w:r>
+            <w:rPr>
+              <w:rFonts w:eastAsia="Times New Roman"/>
+            </w:rPr>
+            <w:t>, vol. 9, no. 9, p. e39454, Sep. 2022, doi: 10.2196/39454.</w:t>
+          </w:r>
+        </w:p>
+        <w:p>
+          <w:pPr>
+            <w:autoSpaceDE w:val="0"/>
+            <w:autoSpaceDN w:val="0"/>
+            <w:ind w:hanging="640"/>
+            <w:divId w:val="207769671"/>
+            <w:rPr>
+              <w:rFonts w:eastAsia="Times New Roman"/>
+            </w:rPr>
+          </w:pPr>
+          <w:r>
+            <w:rPr>
+              <w:rFonts w:eastAsia="Times New Roman"/>
+            </w:rPr>
+            <w:t>[98]</w:t>
+          </w:r>
+          <w:r>
+            <w:rPr>
+              <w:rFonts w:eastAsia="Times New Roman"/>
+            </w:rPr>
+            <w:tab/>
+            <w:t xml:space="preserve">A. Abd-Alrazaq </w:t>
+          </w:r>
+          <w:r>
+            <w:rPr>
+              <w:rFonts w:eastAsia="Times New Roman"/>
+              <w:i/>
+              <w:iCs/>
+            </w:rPr>
+            <w:t>et al.</w:t>
+          </w:r>
+          <w:r>
+            <w:rPr>
+              <w:rFonts w:eastAsia="Times New Roman"/>
+            </w:rPr>
+            <w:t xml:space="preserve">, “The Effectiveness of Serious Games for Alleviating Depression: Systematic Review and Meta-analysis,” </w:t>
+          </w:r>
+          <w:r>
+            <w:rPr>
+              <w:rFonts w:eastAsia="Times New Roman"/>
+              <w:i/>
+              <w:iCs/>
+            </w:rPr>
+            <w:t>JMIR Serious Games</w:t>
+          </w:r>
+          <w:r>
+            <w:rPr>
+              <w:rFonts w:eastAsia="Times New Roman"/>
+            </w:rPr>
+            <w:t>, vol. 10, no. 1, p. e32331, Jan. 2022, doi: 10.2196/32331.</w:t>
+          </w:r>
+        </w:p>
+        <w:p>
+          <w:pPr>
+            <w:autoSpaceDE w:val="0"/>
+            <w:autoSpaceDN w:val="0"/>
+            <w:ind w:hanging="640"/>
+            <w:divId w:val="875193017"/>
+            <w:rPr>
+              <w:rFonts w:eastAsia="Times New Roman"/>
+            </w:rPr>
+          </w:pPr>
+          <w:r>
+            <w:rPr>
+              <w:rFonts w:eastAsia="Times New Roman"/>
+            </w:rPr>
+            <w:t>[99]</w:t>
+          </w:r>
+          <w:r>
+            <w:rPr>
+              <w:rFonts w:eastAsia="Times New Roman"/>
+            </w:rPr>
+            <w:tab/>
+            <w:t xml:space="preserve">A. Diel </w:t>
+          </w:r>
+          <w:r>
+            <w:rPr>
+              <w:rFonts w:eastAsia="Times New Roman"/>
+              <w:i/>
+              <w:iCs/>
+            </w:rPr>
+            <w:t>et al.</w:t>
+          </w:r>
+          <w:r>
+            <w:rPr>
+              <w:rFonts w:eastAsia="Times New Roman"/>
+            </w:rPr>
+            <w:t xml:space="preserve">, “A systematic review and meta analysis on digital mental health interventions in inpatient settings,” </w:t>
+          </w:r>
+          <w:r>
+            <w:rPr>
+              <w:rFonts w:eastAsia="Times New Roman"/>
+              <w:i/>
+              <w:iCs/>
+            </w:rPr>
+            <w:t>NPJ Digit Med</w:t>
+          </w:r>
+          <w:r>
+            <w:rPr>
+              <w:rFonts w:eastAsia="Times New Roman"/>
+            </w:rPr>
+            <w:t>, vol. 7, no. 1, p. 253, Sep. 2024, doi: 10.1038/s41746-024-01252-z.</w:t>
+          </w:r>
+        </w:p>
+        <w:p>
+          <w:pPr>
+            <w:autoSpaceDE w:val="0"/>
+            <w:autoSpaceDN w:val="0"/>
+            <w:ind w:hanging="640"/>
+            <w:divId w:val="190270694"/>
+            <w:rPr>
+              <w:rFonts w:eastAsia="Times New Roman"/>
+            </w:rPr>
+          </w:pPr>
+          <w:r>
+            <w:rPr>
+              <w:rFonts w:eastAsia="Times New Roman"/>
+            </w:rPr>
+            <w:t>[100]</w:t>
+          </w:r>
+          <w:r>
+            <w:rPr>
+              <w:rFonts w:eastAsia="Times New Roman"/>
+            </w:rPr>
+            <w:tab/>
+            <w:t xml:space="preserve">L. Azem </w:t>
+          </w:r>
+          <w:r>
+            <w:rPr>
+              <w:rFonts w:eastAsia="Times New Roman"/>
+              <w:i/>
+              <w:iCs/>
+            </w:rPr>
+            <w:t>et al.</w:t>
+          </w:r>
+          <w:r>
+            <w:rPr>
+              <w:rFonts w:eastAsia="Times New Roman"/>
+            </w:rPr>
+            <w:t xml:space="preserve">, “Social Media Use and Depression in Adolescents: A Scoping Review,” </w:t>
+          </w:r>
+          <w:r>
+            <w:rPr>
+              <w:rFonts w:eastAsia="Times New Roman"/>
+              <w:i/>
+              <w:iCs/>
+            </w:rPr>
+            <w:t>Behavioral Sciences</w:t>
+          </w:r>
+          <w:r>
+            <w:rPr>
+              <w:rFonts w:eastAsia="Times New Roman"/>
+            </w:rPr>
+            <w:t>, vol. 13, no. 6, p. 475, Jun. 2023, doi: 10.3390/bs13060475.</w:t>
           </w:r>
         </w:p>
         <w:p>
@@ -8800,6 +9216,7 @@
   <w:style w:type="character" w:default="1" w:styleId="DefaultParagraphFont">
     <w:name w:val="Default Paragraph Font"/>
     <w:uiPriority w:val="1"/>
+    <w:semiHidden/>
     <w:unhideWhenUsed/>
   </w:style>
   <w:style w:type="table" w:default="1" w:styleId="TableNormal">
@@ -9115,6 +9532,7 @@
   <w:rsids>
     <w:rsidRoot w:val="002821C7"/>
     <w:rsid w:val="000106B7"/>
+    <w:rsid w:val="000432E5"/>
     <w:rsid w:val="001F761D"/>
     <w:rsid w:val="00215627"/>
     <w:rsid w:val="002821C7"/>
@@ -9123,13 +9541,16 @@
     <w:rsid w:val="0048772F"/>
     <w:rsid w:val="005509CE"/>
     <w:rsid w:val="006E217B"/>
+    <w:rsid w:val="00831ABC"/>
+    <w:rsid w:val="008E28DA"/>
+    <w:rsid w:val="00974949"/>
     <w:rsid w:val="00A12F21"/>
     <w:rsid w:val="00A27C20"/>
     <w:rsid w:val="00CC0467"/>
     <w:rsid w:val="00CD17DB"/>
     <w:rsid w:val="00D16F26"/>
+    <w:rsid w:val="00EF2006"/>
     <w:rsid w:val="00FB7ABD"/>
-    <w:rsid w:val="00FF2290"/>
   </w:rsids>
   <m:mathPr>
     <m:mathFont m:val="Cambria Math"/>
@@ -9594,22 +10015,6 @@
     <w:name w:val="C94D7A5153164D62AC0BA8D3C3B26F7D"/>
     <w:rsid w:val="005509CE"/>
   </w:style>
-  <w:style w:type="paragraph" w:customStyle="1" w:styleId="1CD7C4C6D4564E21A1119B78B39248F0">
-    <w:name w:val="1CD7C4C6D4564E21A1119B78B39248F0"/>
-    <w:rsid w:val="006E217B"/>
-  </w:style>
-  <w:style w:type="paragraph" w:customStyle="1" w:styleId="6EE6715FC5354C06BC279C0B4CEBCC07">
-    <w:name w:val="6EE6715FC5354C06BC279C0B4CEBCC07"/>
-    <w:rsid w:val="006E217B"/>
-  </w:style>
-  <w:style w:type="paragraph" w:customStyle="1" w:styleId="C10DF783DC264DF196EAE0DC8A8B8AB5">
-    <w:name w:val="C10DF783DC264DF196EAE0DC8A8B8AB5"/>
-    <w:rsid w:val="00A12F21"/>
-  </w:style>
-  <w:style w:type="paragraph" w:customStyle="1" w:styleId="97CDA821ED1D4809BE3DE12AE6666434">
-    <w:name w:val="97CDA821ED1D4809BE3DE12AE6666434"/>
-    <w:rsid w:val="00A12F21"/>
-  </w:style>
 </w:styles>
 </file>
 
@@ -9955,7 +10360,7 @@
     <we:reference id="WA104382081" version="1.55.1.0" store="" storeType="OMEX"/>
   </we:alternateReferences>
   <we:properties>
-    <we:property name="MENDELEY_CITATIONS" value="[{&quot;citationID&quot;:&quot;MENDELEY_CITATION_a63b4e43-6d21-47c4-923b-eb265e8fcc55&quot;,&quot;properties&quot;:{&quot;noteIndex&quot;:0},&quot;isEdited&quot;:false,&quot;manualOverride&quot;:{&quot;isManuallyOverridden&quot;:false,&quot;citeprocText&quot;:&quot;[1]&quot;,&quot;manualOverrideText&quot;:&quot;&quot;},&quot;citationTag&quot;:&quot;MENDELEY_CITATION_v3_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&quot;,&quot;citationItems&quot;:[{&quot;id&quot;:&quot;0127be9b-6f64-3583-bedc-1584e6f25756&quot;,&quot;itemData&quot;:{&quot;type&quot;:&quot;webpage&quot;,&quot;id&quot;:&quot;0127be9b-6f64-3583-bedc-1584e6f25756&quot;,&quot;title&quot;:&quot;Depressive disorder (depression)&quot;,&quot;author&quot;:[{&quot;family&quot;:&quot;World Health Organization&quot;,&quot;given&quot;:&quot;&quot;,&quot;parse-names&quot;:false,&quot;dropping-particle&quot;:&quot;&quot;,&quot;non-dropping-particle&quot;:&quot;&quot;}],&quot;container-title&quot;:&quot;World Health Organization&quot;,&quot;accessed&quot;:{&quot;date-parts&quot;:[[2025,5,13]]},&quot;URL&quot;:&quot;https://www.who.int/news-room/fact-sheets/detail/depression&quot;,&quot;issued&quot;:{&quot;date-parts&quot;:[[2023,3,31]]},&quot;container-title-short&quot;:&quot;&quot;},&quot;isTemporary&quot;:false,&quot;suppress-author&quot;:false,&quot;composite&quot;:false,&quot;author-only&quot;:false}]},{&quot;citationID&quot;:&quot;MENDELEY_CITATION_31d87ed0-72b0-4cc6-b958-281c24e21ac0&quot;,&quot;properties&quot;:{&quot;noteIndex&quot;:0},&quot;isEdited&quot;:false,&quot;manualOverride&quot;:{&quot;isManuallyOverridden&quot;:false,&quot;citeprocText&quot;:&quot;[2]&quot;,&quot;manualOverrideText&quot;:&quot;&quot;},&quot;citationTag&quot;:&quot;MENDELEY_CITATION_v3_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&quot;,&quot;citationItems&quot;:[{&quot;id&quot;:&quot;9ea95bea-4350-36b7-974c-4a2b72259b46&quot;,&quot;itemData&quot;:{&quot;type&quot;:&quot;webpage&quot;,&quot;id&quot;:&quot;9ea95bea-4350-36b7-974c-4a2b72259b46&quot;,&quot;title&quot;:&quot;Factsheet Kesehatan Jiwa (Keswa)&quot;,&quot;author&quot;:[{&quot;family&quot;:&quot;Kementerian Kesehatan Republik Indonesia&quot;,&quot;given&quot;:&quot;&quot;,&quot;parse-names&quot;:false,&quot;dropping-particle&quot;:&quot;&quot;,&quot;non-dropping-particle&quot;:&quot;&quot;}],&quot;container-title&quot;:&quot;Kementerian Kesehatan RI&quot;,&quot;accessed&quot;:{&quot;date-parts&quot;:[[2025,5,13]]},&quot;URL&quot;:&quot;https://repository.badankebijakan.kemkes.go.id/id/eprint/5532/1/03%20factsheet%20Keswa_bahasa.pdf&quot;,&quot;issued&quot;:{&quot;date-parts&quot;:[[2023,7,15]]},&quot;container-title-short&quot;:&quot;&quot;},&quot;isTemporary&quot;:false,&quot;suppress-author&quot;:false,&quot;composite&quot;:false,&quot;author-only&quot;:false}]},{&quot;citationID&quot;:&quot;MENDELEY_CITATION_bbd8ea5e-2fcd-451f-ad0d-7a991a35b3cf&quot;,&quot;properties&quot;:{&quot;noteIndex&quot;:0},&quot;isEdited&quot;:false,&quot;manualOverride&quot;:{&quot;isManuallyOverridden&quot;:false,&quot;citeprocText&quot;:&quot;[2]&quot;,&quot;manualOverrideText&quot;:&quot;&quot;},&quot;citationTag&quot;:&quot;MENDELEY_CITATION_v3_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&quot;,&quot;citationItems&quot;:[{&quot;id&quot;:&quot;9ea95bea-4350-36b7-974c-4a2b72259b46&quot;,&quot;itemData&quot;:{&quot;type&quot;:&quot;webpage&quot;,&quot;id&quot;:&quot;9ea95bea-4350-36b7-974c-4a2b72259b46&quot;,&quot;title&quot;:&quot;Factsheet Kesehatan Jiwa (Keswa)&quot;,&quot;author&quot;:[{&quot;family&quot;:&quot;Kementerian Kesehatan Republik Indonesia&quot;,&quot;given&quot;:&quot;&quot;,&quot;parse-names&quot;:false,&quot;dropping-particle&quot;:&quot;&quot;,&quot;non-dropping-particle&quot;:&quot;&quot;}],&quot;container-title&quot;:&quot;Kementerian Kesehatan RI&quot;,&quot;accessed&quot;:{&quot;date-parts&quot;:[[2025,5,13]]},&quot;URL&quot;:&quot;https://repository.badankebijakan.kemkes.go.id/id/eprint/5532/1/03%20factsheet%20Keswa_bahasa.pdf&quot;,&quot;issued&quot;:{&quot;date-parts&quot;:[[2023,7,15]]},&quot;container-title-short&quot;:&quot;&quot;},&quot;isTemporary&quot;:false,&quot;suppress-author&quot;:false,&quot;composite&quot;:false,&quot;author-only&quot;:false}]},{&quot;citationID&quot;:&quot;MENDELEY_CITATION_795448d4-496e-489a-ba94-04d2850ee384&quot;,&quot;properties&quot;:{&quot;noteIndex&quot;:0},&quot;isEdited&quot;:false,&quot;manualOverride&quot;:{&quot;isManuallyOverridden&quot;:false,&quot;citeprocText&quot;:&quot;[3], [4], [5], [6], [7], [8], [9], [10], [11], [12], [13], [14], [15], [16], [17], [18], [19], [20], [21], [22], [23], [24], [25], [26], [27], [28], [29], [30], [31], [32], [33], [34], [35], [36], [37], [38], [39], [40], [41], [42], [43], [44], [45], [46], [47], [48], [49], [50], [51], [52], [53], [54], [55], [56], [57], [58], [59], [60], [61], [62], [63], [64], [65], [66], [67], [68], [69], [70], [71], [72], [73], [74], [75], [76], [77], [78], [79], [80], [81], [82], [83], [84], [85], [86], [87], [88], [89], [90], [91], [92]&quot;,&quot;manualOverrideText&quot;:&quot;&quot;},&quot;citationTag&quot;:&quot;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&quot;,&quot;citationItems&quot;:[{&quot;id&quot;:&quot;e7d809c7-a158-3562-8cc8-c5c517a2af49&quot;,&quot;itemData&quot;:{&quot;type&quot;:&quot;article-journal&quot;,&quot;id&quot;:&quot;e7d809c7-a158-3562-8cc8-c5c517a2af49&quot;,&quot;title&quot;:&quot;Implementasi Model ADDIE dalam Media Edukasi sebagai Pemahaman Kesehatan Mental&quot;,&quot;groupId&quot;:&quot;5d3d1151-c3fb-3f7b-bcf0-db626a6f9f8b&quot;,&quot;author&quot;:[{&quot;family&quot;:&quot;An-Nisa&quot;,&quot;given&quot;:&quot;Lhulu&quot;,&quot;parse-names&quot;:false,&quot;dropping-particle&quot;:&quot;&quot;,&quot;non-dropping-particle&quot;:&quot;&quot;},{&quot;family&quot;:&quot;Farida&quot;,&quot;given&quot;:&quot;Ika Andrini&quot;,&quot;parse-names&quot;:false,&quot;dropping-particle&quot;:&quot;&quot;,&quot;non-dropping-particle&quot;:&quot;&quot;},{&quot;family&quot;:&quot;Eva&quot;,&quot;given&quot;:&quot;Nur&quot;,&quot;parse-names&quot;:false,&quot;dropping-particle&quot;:&quot;&quot;,&quot;non-dropping-particle&quot;:&quot;&quot;},{&quot;family&quot;:&quot;Apsari&quot;,&quot;given&quot;:&quot;Diani Akmalia&quot;,&quot;parse-names&quot;:false,&quot;dropping-particle&quot;:&quot;&quot;,&quot;non-dropping-particle&quot;:&quot;&quot;},{&quot;family&quot;:&quot;Utomo&quot;,&quot;given&quot;:&quot;Hanggara Budi&quot;,&quot;parse-names&quot;:false,&quot;dropping-particle&quot;:&quot;&quot;,&quot;non-dropping-particle&quot;:&quot;&quot;}],&quot;container-title&quot;:&quot;Psyche 165 Journal&quot;,&quot;DOI&quot;:&quot;10.35134/jpsy165.v18i1.466&quot;,&quot;ISSN&quot;:&quot;2502-8766&quot;,&quot;issued&quot;:{&quot;date-parts&quot;:[[2025,2,10]]},&quot;page&quot;:&quot;41-46&quot;,&quot;abstract&quot;:&quot;&lt;p&gt;Era digitalisasi membawa manusia pada peradaban hidup bersama teknologi. Berbagai macam platform media menjadi wadah informasi tercepat untuk bisa memperoleh ilmu atau berita kekinian. Namun, tidak semua platform dapat bermanfaat untuk manusia sehingga dibutuhkan kesadaran diri yang baik dalam pemilihan media informasi. Dampak dari kesalahan pemilihan adalah munculnya stressor baru serta ketegangan otot karena ketidaksanggupan individu dalam mengelola kognitif dan perasaan ketika menerima informasi. Berbagai permasalahan kesehatan mental saat ini khususnya di Indonesia menjadi fokus perhatikan untuk tetap menjaga stabilitas keadaan masyarakat. Kabar baiknya, telah banyak tenaga ahli di bidang psikologi yang mendirikan platform sebagai wadah informasi preventif kepada masayarakat umum. Apabila terdapat permasalahan klinis atau kronis dari hasil asesmen psikolog maka disarankan untuk melakukan konseling atau terapi psikologis. Saat ini wadah tersebut dapat berupa aplikasi curhat, konseling dengan psikolog, atau berbagai informasi dari postingan di media sosial. Mengamati fenomena tersebut, peneliti mengembangkan sebuah aplikasi permainan digital yang berguna sebagai media informasi preventif bagi masyarakat umum dengan desain sederhana dan penuh warna. Permainan KESMO Games yang dikembangkan oleh peneliti menggunakan metode RnD dengan model ADDIE. Hasil uji validasi ahli media dan materi menyatakan bahwa KESMO Games layak untuk diimplementasikan. Setelah diimplementasikan kepada 30 partisipan, ditemukan bahwa responden mudah menerima knowledge kesehatan mental menggunakan KESMO Games karena keterbacaan media yang sangat baik dan membawa kesan fun dalam bermain. Berdasarkan hasil dari kegiatan penelitian ini, metode ADDIE efektif digunakan pada KESMO Games yang memuat pengetahuan kesehatan mental dan berhasil menambahkan pemahaman kepada player atau partisipan.&lt;/p&gt;&quot;,&quot;issue&quot;:&quot;1&quot;,&quot;volume&quot;:&quot;18&quot;,&quot;container-title-short&quot;:&quot;&quot;},&quot;isTemporary&quot;:false},{&quot;id&quot;:&quot;7664f879-22d2-3297-af0c-e2ecb057427f&quot;,&quot;itemData&quot;:{&quot;type&quot;:&quot;article-journal&quot;,&quot;id&quot;:&quot;7664f879-22d2-3297-af0c-e2ecb057427f&quot;,&quot;title&quot;:&quot;Edukasi dan Skrining Kesehatan Jiwa Remaja dengan Aplikasi&quot;,&quot;groupId&quot;:&quot;5d3d1151-c3fb-3f7b-bcf0-db626a6f9f8b&quot;,&quot;author&quot;:[{&quot;family&quot;:&quot;Endriyani&quot;,&quot;given&quot;:&quot;Sri&quot;,&quot;parse-names&quot;:false,&quot;dropping-particle&quot;:&quot;&quot;,&quot;non-dropping-particle&quot;:&quot;&quot;},{&quot;family&quot;:&quot;Martini&quot;,&quot;given&quot;:&quot;Sri&quot;,&quot;parse-names&quot;:false,&quot;dropping-particle&quot;:&quot;&quot;,&quot;non-dropping-particle&quot;:&quot;&quot;},{&quot;family&quot;:&quot;Pastari&quot;,&quot;given&quot;:&quot;Marta&quot;,&quot;parse-names&quot;:false,&quot;dropping-particle&quot;:&quot;&quot;,&quot;non-dropping-particle&quot;:&quot;&quot;}],&quot;container-title&quot;:&quot;Madaniya&quot;,&quot;DOI&quot;:&quot;10.53696/27214834.687&quot;,&quot;ISSN&quot;:&quot;2721-4834&quot;,&quot;issued&quot;:{&quot;date-parts&quot;:[[2024,2,26]]},&quot;page&quot;:&quot;192-198&quot;,&quot;abstract&quot;:&quot;&lt;p&gt;Kesehatan jiwa merupakan aspek penting bagi remaja dalam mencapai perkembangan yang optimal di masa remaja. Kegiatan edukasi dan skiring kesehatan jiwa bagi remaja dilaksanakan dengan tujuan meningkatkan pengetahuan remaja tentang kesehatan jiwa dan mengurangi risiko gangguan jiwa dengan mendeteksi masalah kesehatan mental dan emosional sejak dini. Program pengabdian masyarakat ini dilakukan melalui penyuluhan dan pemeriksaan kesehatan jiwa dengan menggunakan aplikasi skrining kesehtan jiwa DeAS Care. Kegiatan diikuti oleh 20 remaja di kota Palembang. Setelah diberikan penyuluhan remaja mengetahui tentang sehat jiwa dan tehnik yang dapat dilakukan bagi remaja yang beresiko mengalami masalah gangguan mental emosinal. Setelah dilakukan skrining kesehatan jiwa diketahui bahwa sebagian remaja sebanyak 9 orang (45%) mengalami depresi, 15 orang (75%) mengalami ansietas dan 6 orang (30%) mengalami stress dari tingkat ringan hingga parah. Hendaknya pihak terkait dapat melakukan pendampingan sebagai menjaga kesehatan jiwa dalam kelompok remaja sehat jiwa atau kader remaja sehat jiwa di lingkungan sekolah dan masyarakat.&lt;/p&gt;&quot;,&quot;issue&quot;:&quot;1&quot;,&quot;volume&quot;:&quot;5&quot;,&quot;container-title-short&quot;:&quot;&quot;},&quot;isTemporary&quot;:false},{&quot;id&quot;:&quot;66b548fb-5e3c-314a-97dc-72fd37a83720&quot;,&quot;itemData&quot;:{&quot;type&quot;:&quot;article-journal&quot;,&quot;id&quot;:&quot;66b548fb-5e3c-314a-97dc-72fd37a83720&quot;,&quot;title&quot;:&quot;SISTEM PAKAR GANGGUAN DEPRESI PADA ANAK&quot;,&quot;groupId&quot;:&quot;5d3d1151-c3fb-3f7b-bcf0-db626a6f9f8b&quot;,&quot;author&quot;:[{&quot;family&quot;:&quot;Maharani&quot;,&quot;given&quot;:&quot;Aldila&quot;,&quot;parse-names&quot;:false,&quot;dropping-particle&quot;:&quot;&quot;,&quot;non-dropping-particle&quot;:&quot;&quot;},{&quot;family&quot;:&quot;Nilma&quot;,&quot;given&quot;:&quot;Nilma&quot;,&quot;parse-names&quot;:false,&quot;dropping-particle&quot;:&quot;&quot;,&quot;non-dropping-particle&quot;:&quot;&quot;},{&quot;family&quot;:&quot;Irawan&quot;,&quot;given&quot;:&quot;Ari&quot;,&quot;parse-names&quot;:false,&quot;dropping-particle&quot;:&quot;&quot;,&quot;non-dropping-particle&quot;:&quot;&quot;}],&quot;container-title&quot;:&quot;NUANSA INFORMATIKA&quot;,&quot;DOI&quot;:&quot;10.25134/nuansa.v15i1.3418&quot;,&quot;ISSN&quot;:&quot;2614-5405&quot;,&quot;issued&quot;:{&quot;date-parts&quot;:[[2021,1,18]]},&quot;page&quot;:&quot;1&quot;,&quot;abstract&quot;:&quot;&lt;p&gt;Sistem pakar merupakan salah satu aplikasi dari kecerdasan buatan (Artificial Intelegence). Tujuan dari sistem pakar bukan untuk menggantikan posisi seorang pakar tetapi lebih menginformasikan dan memasyaraktkan pengetahuan dari seorang pakar. Gangguan psikologi pada anak banyak yang kurang disadari oleh orang tua dan pengajar yang menyebabkan terlambatnya penanganan pada anak. Tujuan dari penelitian dan dibuatnya aplikasi ini untuk membantu pengguna mendapatkan informasi mengenai gejala-gejala awal pada gangguan psikologis dan membantu mendiagnosa gangguan psikologi anak lebih awal. Aplikasi sistem pakar ini menggunakan Java sebagai Bahasa pemrograman dan menggunakan metode forward chaining. Sistem pakar ini mampu membantu dan mempermudah pengguna dalam memperoleh informasi gangguan psikologi pada anak khususnya mengenai depresi (depresi mayor, depresi persisten, gangguan bipolar dan depresi psikotis).&lt;/p&gt;&quot;,&quot;issue&quot;:&quot;1&quot;,&quot;volume&quot;:&quot;15&quot;,&quot;container-title-short&quot;:&quot;&quot;},&quot;isTemporary&quot;:false},{&quot;id&quot;:&quot;0fe8ada7-b2dc-3126-9066-f5df67100062&quot;,&quot;itemData&quot;:{&quot;type&quot;:&quot;article-journal&quot;,&quot;id&quot;:&quot;0fe8ada7-b2dc-3126-9066-f5df67100062&quot;,&quot;title&quot;:&quot;APLIKASI SCREENING DEPRESI PASCA MELAHIRKAN MENGGUNAKAN METODE CERTAINTY FACTOR BERBASIS MOBILE&quot;,&quot;groupId&quot;:&quot;5d3d1151-c3fb-3f7b-bcf0-db626a6f9f8b&quot;,&quot;author&quot;:[{&quot;family&quot;:&quot;Amalia&quot;,&quot;given&quot;:&quot;Fenny Restu&quot;,&quot;parse-names&quot;:false,&quot;dropping-particle&quot;:&quot;&quot;,&quot;non-dropping-particle&quot;:&quot;&quot;},{&quot;family&quot;:&quot;Akbar&quot;,&quot;given&quot;:&quot;Ronny Makhfuddin&quot;,&quot;parse-names&quot;:false,&quot;dropping-particle&quot;:&quot;&quot;,&quot;non-dropping-particle&quot;:&quot;&quot;},{&quot;family&quot;:&quot;Zahara&quot;,&quot;given&quot;:&quot;Soffa&quot;,&quot;parse-names&quot;:false,&quot;dropping-particle&quot;:&quot;&quot;,&quot;non-dropping-particle&quot;:&quot;&quot;}],&quot;container-title&quot;:&quot;SEMINAR NASIONAL FAKULTAS TEKNIK&quot;,&quot;DOI&quot;:&quot;10.36815/semastek.v1i1.6&quot;,&quot;ISSN&quot;:&quot;2963-8526&quot;,&quot;issued&quot;:{&quot;date-parts&quot;:[[2022,9,30]]},&quot;page&quot;:&quot;378-384&quot;,&quot;abstract&quot;:&quot;&lt;p&gt;Bagi sebuah keluarga, kelahiran seorang anak merupakan acara yang menyenangkan. Banyak yang menggambarkan kelahiran sebagai lingkungan yang ceria, jadi tidak ada penjelasan yang benar-benar jelas bagi seorang ibu atau keluarga untuk menjadi sengsara atau terganggu. Tetapi, kenyataannya rasa bahagia ini umumnya tidak dirasakan oleh ibu-ibu yang melahirkan anak, karena proses menjadi orang tua merupakan peristiwa luar biasa dalam hidup yang dapat dianggap sebagai keadaan darurat dengan tekanan berat. Bagi beberapa individu, efek samping depresi ini dianggap remeh sehingga dengan keterbatasan informasi tidak segera membutuhkan penanganan. Jika ini dibiarkan berlanjut dan memburuk, itu akan sangat mempengaruhi keadaan ibu dan anak. Tujuan penelitian ini adalah merancang dan mengembangkan aplikasi android yang dapat mendiagnosis dan mengobati depresi postpartum  pada ibu dengan menghitung nilai gejala dan menghasilkan nilai CF menggunakan metode certainty factor. Pembuatan aplikasi ini dibantu dengan Android Studio, database MySQL, dan software Ngrok. Hasil pengujian dapat diketahui bahwa diagnosis 3 jenis depresi pasca melahirkan yang dialami ibu dengan persentase kesesuaian mencapai 100% serta hasil dari uji coba MOS (Mean Opinion Score) yang diperoleh dari 21 responden, nilai MOS sebesar 4,502 menunjukkan bahwa aplikasi screening depresi pasca melahirkan telah berjalan dengan tampilan yang layak dan mudah digunakan.&lt;/p&gt;&quot;,&quot;issue&quot;:&quot;1&quot;,&quot;volume&quot;:&quot;1&quot;,&quot;container-title-short&quot;:&quot;&quot;},&quot;isTemporary&quot;:false},{&quot;id&quot;:&quot;34f71bb3-3667-38db-b426-d54398e8fa3e&quot;,&quot;itemData&quot;:{&quot;type&quot;:&quot;article-journal&quot;,&quot;id&quot;:&quot;34f71bb3-3667-38db-b426-d54398e8fa3e&quot;,&quot;title&quot;:&quot;Perancangan Aplikasi Kesehatan Mental Online Menggunakan Metode Rapid Application Development(Rad)&quot;,&quot;groupId&quot;:&quot;5d3d1151-c3fb-3f7b-bcf0-db626a6f9f8b&quot;,&quot;author&quot;:[{&quot;family&quot;:&quot;Khoiri&quot;,&quot;given&quot;:&quot;M imron&quot;,&quot;parse-names&quot;:false,&quot;dropping-particle&quot;:&quot;&quot;,&quot;non-dropping-particle&quot;:&quot;&quot;}],&quot;container-title&quot;:&quot;JEKIN - Jurnal Teknik Informatika&quot;,&quot;DOI&quot;:&quot;10.58794/jekin.v1i3.206&quot;,&quot;ISSN&quot;:&quot;2809-1353&quot;,&quot;issued&quot;:{&quot;date-parts&quot;:[[2023,6,4]]},&quot;page&quot;:&quot;26-32&quot;,&quot;abstract&quot;:&quot;&lt;p&gt;Abstrak - Sebagian daerah kurangnya ahli psikiater sehingga masyarakat lebih suka memendam masalah tanpa adanya tempat untuk konsultasi.Tulisan ini menjelaskan tentang perancangan aplikasi untuk memudahkan masyarakat dalam mengatasi kesehatan mental secara online bersama psikiater terpercaya. Bedasarkan hasil uji coba mengunakan metode RAD aplikasi ini mempudahkan penguna dalam mengunakan aplikasi  dan memudahkan mencari infomasi tentang kesehatan mental ,membantu masyarakat dalam mencari solusi yang dialami.&lt;/p&gt;&quot;,&quot;issue&quot;:&quot;3&quot;,&quot;volume&quot;:&quot;1&quot;,&quot;container-title-short&quot;:&quot;&quot;},&quot;isTemporary&quot;:false},{&quot;id&quot;:&quot;e8aad0b2-6c35-3e85-b7a5-892a99028b29&quot;,&quot;itemData&quot;:{&quot;type&quot;:&quot;article-journal&quot;,&quot;id&quot;:&quot;e8aad0b2-6c35-3e85-b7a5-892a99028b29&quot;,&quot;title&quot;:&quot;Sistem Pakar Kombinasi Metode Certainty Factor dan Dempster Shafer&quot;,&quot;groupId&quot;:&quot;5d3d1151-c3fb-3f7b-bcf0-db626a6f9f8b&quot;,&quot;author&quot;:[{&quot;family&quot;:&quot;Hasibuan&quot;,&quot;given&quot;:&quot;Nelly Astuti&quot;,&quot;parse-names&quot;:false,&quot;dropping-particle&quot;:&quot;&quot;,&quot;non-dropping-particle&quot;:&quot;&quot;},{&quot;family&quot;:&quot;Fau&quot;,&quot;given&quot;:&quot;Alwin&quot;,&quot;parse-names&quot;:false,&quot;dropping-particle&quot;:&quot;&quot;,&quot;non-dropping-particle&quot;:&quot;&quot;}],&quot;container-title&quot;:&quot;Journal of Information System Research (JOSH)&quot;,&quot;DOI&quot;:&quot;10.47065/josh.v3i2.1252&quot;,&quot;ISSN&quot;:&quot;2686-228X&quot;,&quot;issued&quot;:{&quot;date-parts&quot;:[[2022,1,31]]},&quot;page&quot;:&quot;85-90&quot;,&quot;abstract&quot;:&quot;&lt;p&gt;An expert system is a technique of artificial intelligence that uses certainty techniques to solve problems. There are several techniques that can be used to solve the problem of uncertainty, including the certainty factor method and the mathematical theory of Dempster Shafer. Both methods and techniques can be applied to solve expert system problems. However, each method has advantages and disadvantages in determining the diagnosis. In the expert system, there are 2 values ​​used for the diagnosis process, including the expert value taken from the expert hypothesis and the user value or evidence which is the value obtained based on the facts of an event. Dempster Shafer theory can only use the evidence value in determining the density value, while the certainty factor method can use evidence and hypothesis values. Thus, the combination made to overcome the weakness of one method by using the advantages of the other method is expected to produce a better certainty value.&lt;/p&gt;&quot;,&quot;issue&quot;:&quot;2&quot;,&quot;volume&quot;:&quot;3&quot;,&quot;container-title-short&quot;:&quot;&quot;},&quot;isTemporary&quot;:false},{&quot;id&quot;:&quot;c1210e83-258c-3547-85b3-3da863122a5b&quot;,&quot;itemData&quot;:{&quot;type&quot;:&quot;article-journal&quot;,&quot;id&quot;:&quot;c1210e83-258c-3547-85b3-3da863122a5b&quot;,&quot;title&quot;:&quot;EDUKASI PREVENTIF KEKERASAN SEKSUAL PADA ANAK MELALUI PENGGUNAAN MEDIA BERBASIS DIGITAL “ProUdy EDUKASI GAMES (PEG)&quot;,&quot;groupId&quot;:&quot;5d3d1151-c3fb-3f7b-bcf0-db626a6f9f8b&quot;,&quot;author&quot;:[{&quot;family&quot;:&quot;Patimah&quot;,&quot;given&quot;:&quot;Siti&quot;,&quot;parse-names&quot;:false,&quot;dropping-particle&quot;:&quot;&quot;,&quot;non-dropping-particle&quot;:&quot;&quot;},{&quot;family&quot;:&quot;Mulyani&quot;,&quot;given&quot;:&quot;Nunung&quot;,&quot;parse-names&quot;:false,&quot;dropping-particle&quot;:&quot;&quot;,&quot;non-dropping-particle&quot;:&quot;&quot;}],&quot;container-title&quot;:&quot;Edukasi Masyarakat Sehat Sejahtera (EMaSS) : Jurnal Pengabdian kepada Masyarakat&quot;,&quot;DOI&quot;:&quot;10.37160/emass.v6i1.313&quot;,&quot;ISSN&quot;:&quot;2656-0364&quot;,&quot;issued&quot;:{&quot;date-parts&quot;:[[2024,1,31]]},&quot;page&quot;:&quot;100-106&quot;,&quot;abstract&quot;:&quot;&lt;p&gt;Kekerasan seksual pada anak adalah keterlibatan seorang anak dalam segala bentuk aktivitas seksual yang terjadi sebelum anak mencapai batas usia tertentu di mana orang dewasa, anak lain yang usianya lebih tua, atau orang yang dianggap memiliki pengetahuan lebih memanfaatkan anak tersebut untuk kesenangan seksual atau aktivitas seksual.5 Dampak pelecehan seksual pada anak bisa menyebabkan kerusakan fisik dan emosional yang serius baik dalam jangka pendek maupun jangka panjang. Dalam jangka pendek, anak-anak dapat mengalami masalah kesehatan, seperti cedera fisik, infeksi menular seksual, dan kehamilan yang tak diinginkan. Efek jangka panjang, lebih mungkin terkena depresi, kecemasan, gangguan makan, gangguan stress pasca trauma (PTSD), fobia pada hubungan seks atau terbiasa dengan kekerasan sebelum melakukan hubungan seks.&amp;#13; Menurut Unit PPA Polresta Kota Tasikmalaya data Kekerasan seksual pada anak pada tahun 2020 hingga bulan November mencapai 28 kasus. Jumlah ini lebih tinggi ketimbang tahun 2019 mencapai 25 kasus. Berdasarkan study pendahuluan ke Kecamatan Mangkubumi Kota Tasikmalaya terdapat 6 kasus yang dilaporkan pada tahun 2021 yang mengalami kekerasan seksual pada anak.&amp;#13; Metode pengabdian Masyarakat ini adalah memberikan edukasi kekerasan seksual dan sosialisasi, pelatihan serta penerapan aplikasi ProUdy Edukasi Games (PEG) kepada anak dan pendamping anak sebagai upaya pencegahan kekerasan seksual pada anak. Dilakukan pengukuran sebelum  dan sesudah pemberian intervensi untuk melihat pengaruh edukasi.&amp;#13; Hasil kegiatan pengabdian Masyarakat ini diukur secara kuantitatif pada pemahaman dan sikap anak dan orangtua/pendamping. Hasil analisis deskriptif menunjukkan perubahan mean pengetahuan anak dan orang tua yang significant, juga terdapat perubahan mean sikap yang significant sebelum dan sesudah pelaksanaan pengabdian Masyarakat&lt;/p&gt;&quot;,&quot;issue&quot;:&quot;1&quot;,&quot;volume&quot;:&quot;6&quot;,&quot;container-title-short&quot;:&quot;&quot;},&quot;isTemporary&quot;:false},{&quot;id&quot;:&quot;47e0db35-15d5-3ca7-a21a-9abf1b9eb33a&quot;,&quot;itemData&quot;:{&quot;type&quot;:&quot;article-journal&quot;,&quot;id&quot;:&quot;47e0db35-15d5-3ca7-a21a-9abf1b9eb33a&quot;,&quot;title&quot;:&quot;Sosialisasi Aplikasi MHS (Mental Health Solution) Dalam Mengatasi Kesehatan Mental&quot;,&quot;groupId&quot;:&quot;5d3d1151-c3fb-3f7b-bcf0-db626a6f9f8b&quot;,&quot;author&quot;:[{&quot;family&quot;:&quot;Surya&quot;,&quot;given&quot;:&quot;Nella Tri&quot;,&quot;parse-names&quot;:false,&quot;dropping-particle&quot;:&quot;&quot;,&quot;non-dropping-particle&quot;:&quot;&quot;},{&quot;family&quot;:&quot;Gita&quot;,&quot;given&quot;:&quot;Anggi Putri Aria&quot;,&quot;parse-names&quot;:false,&quot;dropping-particle&quot;:&quot;&quot;,&quot;non-dropping-particle&quot;:&quot;&quot;},{&quot;family&quot;:&quot;Kur’aini&quot;,&quot;given&quot;:&quot;Sri Nurul&quot;,&quot;parse-names&quot;:false,&quot;dropping-particle&quot;:&quot;&quot;,&quot;non-dropping-particle&quot;:&quot;&quot;}],&quot;container-title&quot;:&quot;SENTRA DEDIKASI: Jurnal Pengabdian Masyarakat&quot;,&quot;DOI&quot;:&quot;10.59823/dedikasi.v1i3.31&quot;,&quot;ISSN&quot;:&quot;2964-3686&quot;,&quot;issued&quot;:{&quot;date-parts&quot;:[[2023,9,16]]},&quot;page&quot;:&quot;72-77&quot;,&quot;abstract&quot;:&quot;&lt;p&gt;Masalah kesehatan jiwa telah menjadi masalah kesehatan yang belum terselesaikan di tengah-tengah masyarakat, baik di tingkat global maupun nasional. Terlebih di masa pandemi COVID-19, permasalahan kesehatan jiwa akan semakin berat untuk diselesaikan. Mental Health adalah terhindarnya seseorang dari gejala-gejala gangguan dan penyakit jiwa, dapat menyesuaikan diri, dapat memanfaatkan segala potensi dan bakat yang ada semaksimal mungkin dan membawa kepada kebahagiaan bersama serta tercapainya keharmonisan jiwa dalam hidup. tujuan sosialisasi ini adalah memberikan informasi dan pemahaman kepada seluruh tenaga kesehatan tentang Aplikasi Mental Health Solution dalam mengatasi kesehatan mental dan memberikan pemahaman tentang cara penggunaannya. Manfaat kegiatan ini diharapkan mampu menambah pengetahuan dan pemahaman masayarakat tentang penggunaan Aplikasi Mental Health Solution dalam mengatasi kesehatan mental.&lt;/p&gt;&quot;,&quot;issue&quot;:&quot;3&quot;,&quot;volume&quot;:&quot;1&quot;,&quot;container-title-short&quot;:&quot;&quot;},&quot;isTemporary&quot;:false},{&quot;id&quot;:&quot;08b19303-7fa8-31ee-9f3f-3fbd844bafcb&quot;,&quot;itemData&quot;:{&quot;type&quot;:&quot;article-journal&quot;,&quot;id&quot;:&quot;08b19303-7fa8-31ee-9f3f-3fbd844bafcb&quot;,&quot;title&quot;:&quot;Peran Komunikasi Media Sosial Dalam Meningkatkan Kesehatan Mental&quot;,&quot;groupId&quot;:&quot;5d3d1151-c3fb-3f7b-bcf0-db626a6f9f8b&quot;,&quot;author&quot;:[{&quot;family&quot;:&quot;Efendi&quot;,&quot;given&quot;:&quot;Erwan&quot;,&quot;parse-names&quot;:false,&quot;dropping-particle&quot;:&quot;&quot;,&quot;non-dropping-particle&quot;:&quot;&quot;},{&quot;family&quot;:&quot;Salam&quot;,&quot;given&quot;:&quot;Muhammad Abrar Haq&quot;,&quot;parse-names&quot;:false,&quot;dropping-particle&quot;:&quot;&quot;,&quot;non-dropping-particle&quot;:&quot;&quot;},{&quot;family&quot;:&quot;Daffa&quot;,&quot;given&quot;:&quot;Muhammad&quot;,&quot;parse-names&quot;:false,&quot;dropping-particle&quot;:&quot;&quot;,&quot;non-dropping-particle&quot;:&quot;&quot;},{&quot;family&quot;:&quot;Sanjaya&quot;,&quot;given&quot;:&quot;Shendy&quot;,&quot;parse-names&quot;:false,&quot;dropping-particle&quot;:&quot;&quot;,&quot;non-dropping-particle&quot;:&quot;&quot;},{&quot;family&quot;:&quot;Azmi&quot;,&quot;given&quot;:&quot;Rifka Nur&quot;,&quot;parse-names&quot;:false,&quot;dropping-particle&quot;:&quot;&quot;,&quot;non-dropping-particle&quot;:&quot;&quot;}],&quot;container-title&quot;:&quot;Al-Hikmah Media Dakwah, Komunikasi, Sosial dan Kebudayaan&quot;,&quot;DOI&quot;:&quot;10.32505/hikmah.v14i2.7639&quot;,&quot;ISSN&quot;:&quot;2655-0539&quot;,&quot;issued&quot;:{&quot;date-parts&quot;:[[2023,12,25]]},&quot;page&quot;:&quot;175-188&quot;,&quot;abstract&quot;:&quot;&lt;p&gt;Mental health is a person's state of life, namely a state of self-evaluation of one's feelings, including aspects such as self-esteem, physical strength, self-control ability, etc. Mental health is a person's ability to deal with stress or depression. On this occasion, according to mental health, it is an optimal combination or harmony between various mental activities and the ability to deal with simple mental problems that a person faces, as well as the ability to feel feelings of happiness and good strength. But many people are now unable to maintain mental health due to increasing depression. The researcher's research method uses a qualitative approach. This qualitative approach was taken to obtain more accurate and meaningful data. Research using a qualitative approach method used by researchers is library research, namely a series of activities relating to library data collection methods starting from books, scientific works, and national journals. The conclusion from this research is that social media is very important in the spread of mental health. It can be seen from the data above that almost all people in the modern era now use social media, from children and teenagers to the elderly. Various social media content that talks about mental health can get a lot of followers and can help them recover from the depression they are experiencing.&lt;/p&gt;&quot;,&quot;issue&quot;:&quot;2&quot;,&quot;volume&quot;:&quot;14&quot;,&quot;container-title-short&quot;:&quot;&quot;},&quot;isTemporary&quot;:false},{&quot;id&quot;:&quot;4fa1b8e2-a476-3fcf-8d91-9026c5453e06&quot;,&quot;itemData&quot;:{&quot;type&quot;:&quot;article-journal&quot;,&quot;id&quot;:&quot;4fa1b8e2-a476-3fcf-8d91-9026c5453e06&quot;,&quot;title&quot;:&quot;Perancangan Desain Ui Aplikasi Be Me Dengan Menggunakan Metode User Centered Design&quot;,&quot;groupId&quot;:&quot;5d3d1151-c3fb-3f7b-bcf0-db626a6f9f8b&quot;,&quot;author&quot;:[{&quot;family&quot;:&quot;Zahra&quot;,&quot;given&quot;:&quot;Divka&quot;,&quot;parse-names&quot;:false,&quot;dropping-particle&quot;:&quot;&quot;,&quot;non-dropping-particle&quot;:&quot;&quot;}],&quot;container-title&quot;:&quot;VISUALIDEAS&quot;,&quot;DOI&quot;:&quot;10.33197/visualideas.vol4.iss1.2024.1297&quot;,&quot;ISSN&quot;:&quot;2776-0359&quot;,&quot;issued&quot;:{&quot;date-parts&quot;:[[2024,3,31]]},&quot;page&quot;:&quot;31-41&quot;,&quot;abstract&quot;:&quot;&lt;p&gt;Kesehatan mental merupakan aspek penting yang perlu diperhatikan karena semakin meningkatnya kasus bunuh diri di dunia. Maraknya kasus ini tentu menjadi permasalahan global yang perlu diatasi. Aplikasi mental health Be Me merupakan aplikasi yang menyediakan fitur yang dapat pembantu penggunanya dalam mengatasi permasalahan kesehatan mental. Aplikasi Be Me memiliki beberapa fitur diantaranya adalah mood tracker, to do list, user progress history, calming music, hingga bantuan profesional. Metode yang digunakan dalam perancangan aplikasi Be Me adalah metode User Centred Design, yaitu metode yang menjadikan pengguna sebagai fokus utama dalam proses perancangan. Perancangan aplikasi mental health Be Me ini akan dibahas dengan menggunakan metode studi kasus deskriptif yang kemudian hasilnya akan diuraikan dalam bentuk prototype aplikasi beserta deskripsinya.&lt;/p&gt;&quot;,&quot;issue&quot;:&quot;1&quot;,&quot;volume&quot;:&quot;4&quot;,&quot;container-title-short&quot;:&quot;&quot;},&quot;isTemporary&quot;:false},{&quot;id&quot;:&quot;6b45a640-0a4b-3244-b413-438bacefbd72&quot;,&quot;itemData&quot;:{&quot;type&quot;:&quot;article-journal&quot;,&quot;id&quot;:&quot;6b45a640-0a4b-3244-b413-438bacefbd72&quot;,&quot;title&quot;:&quot;Aplikasi Manajemen Diri COPD sebagai Inovasi untuk Meningkatkan Kualitas Hidup Pasien Paru Obstruktif Kronis&quot;,&quot;groupId&quot;:&quot;5d3d1151-c3fb-3f7b-bcf0-db626a6f9f8b&quot;,&quot;author&quot;:[{&quot;family&quot;:&quot;Aulia Rahmah&quot;,&quot;given&quot;:&quot;Syafira&quot;,&quot;parse-names&quot;:false,&quot;dropping-particle&quot;:&quot;&quot;,&quot;non-dropping-particle&quot;:&quot;&quot;}],&quot;container-title&quot;:&quot;Jurnal Studi Inovasi&quot;,&quot;DOI&quot;:&quot;10.52000/jsi.v2i1.83&quot;,&quot;ISSN&quot;:&quot;2775-0922&quot;,&quot;issued&quot;:{&quot;date-parts&quot;:[[2022,1,29]]},&quot;page&quot;:&quot;70-77&quot;,&quot;abstract&quot;:&quot;&lt;p&gt;Penyakit paru obstruktif kronis merupakan pemicu utama morbiditas dan mortalitas yang berdampak pada masalah kesehatan masyarakat. Hal ini akan mempengaruhi kualitas hidup pasien PPOK. Prevalensi penderita PPOK di dunia pada tahun 2016 dilaporkan sebanyak 251 juta kasus, dari jumlah tersebut terdapat 3,17 juta meninggal dunia. Beberapa gejala yang di alami pasien PPOK adalah sesak nafas, batuk kronis (&amp;gt;2 minggu), batuk berdahak, nafas disertai mengi, dan beberapa gejala non spesifik adalah lesu, lemas, susah tidur, dan depresi. Kualitas hidup berhubungan dengan status kesehatan yang mencerminkan dampak kesehatan individu pada kesejahteraan fungsional. Mengidentifikasi prediktor untuk kualitas hidup yang berhubungan dengan kesehatan dapat memberikan wawasan yang mendalam tentang pengobatan dan strategi perawatan. Penelitian ini menggunakan metode literature review yang berasal dari literatur-literatur dimana berkaitan dengan persoalan yang dibahas. Intervensi pulmonary rehabilitation dikenal baik dalam pengobatan pasien dengan PPOK dan merupakan upaya dalam meningkatkan kapasitas beraktivitas  dan kualitas hidup pasien PPOK. TRAINER COPD merupakan rancangan mHealth (mobile health) yang terintegrasi dalam ponsel pintar yang berisi perawatan medis bagi pasien. Aplikasi mHealth yang paling umum digunakan adalah penggunaan ponsel pintar untuk memberikan edukasi tentang masalah kesehatan dan cara pencegahannya bagi pengguna.&lt;/p&gt;&quot;,&quot;issue&quot;:&quot;1&quot;,&quot;volume&quot;:&quot;2&quot;,&quot;container-title-short&quot;:&quot;&quot;},&quot;isTemporary&quot;:false},{&quot;id&quot;:&quot;f60b3a01-b20e-3a74-a5dd-86bf042fe085&quot;,&quot;itemData&quot;:{&quot;type&quot;:&quot;article-journal&quot;,&quot;id&quot;:&quot;f60b3a01-b20e-3a74-a5dd-86bf042fe085&quot;,&quot;title&quot;:&quot;Pengaruh Penggunaan Aplikasi Mobile Health (Health) dan Fitur Pemantauan Kesehatan Terhadap Gaya Hidup Sehat&quot;,&quot;groupId&quot;:&quot;5d3d1151-c3fb-3f7b-bcf0-db626a6f9f8b&quot;,&quot;author&quot;:[{&quot;family&quot;:&quot;Rully Fildansyah&quot;,&quot;given&quot;:&quot;&quot;,&quot;parse-names&quot;:false,&quot;dropping-particle&quot;:&quot;&quot;,&quot;non-dropping-particle&quot;:&quot;&quot;}],&quot;container-title&quot;:&quot;Jurnal Multidisiplin West Science&quot;,&quot;DOI&quot;:&quot;10.58812/jmws.v2i6.431&quot;,&quot;ISSN&quot;:&quot;2964-206X&quot;,&quot;issued&quot;:{&quot;date-parts&quot;:[[2023,6,28]]},&quot;page&quot;:&quot;473-482&quot;,&quot;abstract&quot;:&quot;&lt;p&gt;Studi penelitian ini menyelidiki pengaruh penggunaan aplikasi kesehatan seluler dan fitur pemantauan kesehatan terhadap gaya hidup sehat individu Generasi Z di Jakarta. Dengan meningkatnya popularitas dan aksesibilitas ponsel pintar di kalangan generasi ini, aplikasi kesehatan seluler telah muncul sebagai alat yang potensial untuk mempromosikan dan mendukung perilaku sehat. Penelitian ini mengadopsi pendekatan metode campuran, menggabungkan survei kuantitatif dan wawancara kualitatif, untuk mengumpulkan wawasan yang komprehensif tentang keterlibatan, dampak, pengalaman, dan persepsi individu Generasi Z terhadap teknologi ini. Desain penelitian ini melibatkan teknik pengambilan sampel multi-tahap untuk memilih partisipan dari berbagai wilayah dan institusi pendidikan di Jakarta. Temuan yang diharapkan akan menjelaskan tingkat keterlibatan individu Generasi Z di Jakarta dengan aplikasi kesehatan seluler dan fitur pemantauan kesehatan. Dampak dari teknologi ini terhadap perilaku kesehatan dan pilihan gaya hidup akan dieksplorasi, bersama dengan pemahaman tentang pengalaman, persepsi, dan sikap partisipan dalam menggunakan aplikasi kesehatan seluler. Penelitian ini juga bertujuan untuk mengidentifikasi hambatan dan fasilitator yang mempengaruhi adopsi dan penggunaan aplikasi-aplikasi ini secara berkelanjutan di kalangan Generasi Z di Jakarta. Dengan memahami efektivitas dan pengalaman pengguna aplikasi kesehatan mobile, penyedia layanan kesehatan, pembuat kebijakan, dan pengembang dapat meningkatkan desain dan penyampaian teknologi ini untuk memenuhi kebutuhan dan preferensi spesifik generasi ini. Temuan ini juga menginformasikan komunitas ilmiah yang lebih luas tentang peran aplikasi kesehatan seluler dalam mempromosikan gaya hidup sehat di kalangan Generasi Z.&lt;/p&gt;&quot;,&quot;issue&quot;:&quot;06&quot;,&quot;volume&quot;:&quot;2&quot;,&quot;container-title-short&quot;:&quot;&quot;},&quot;isTemporary&quot;:false},{&quot;id&quot;:&quot;4a01ff65-9f5c-3579-a798-cd38e0b6b6f7&quot;,&quot;itemData&quot;:{&quot;type&quot;:&quot;article-journal&quot;,&quot;id&quot;:&quot;4a01ff65-9f5c-3579-a798-cd38e0b6b6f7&quot;,&quot;title&quot;:&quot;Peningkatan Pemberdayaan UPTD Puskesmas Kertasemaya Dalam Hal Asesmen Kejiwaan Melalui Aplikasi Asesmen Kejiwaan Berbasis Mobile&quot;,&quot;groupId&quot;:&quot;5d3d1151-c3fb-3f7b-bcf0-db626a6f9f8b&quot;,&quot;author&quot;:[{&quot;family&quot;:&quot;Farkhan&quot;,&quot;given&quot;:&quot;Farkhan&quot;,&quot;parse-names&quot;:false,&quot;dropping-particle&quot;:&quot;&quot;,&quot;non-dropping-particle&quot;:&quot;&quot;},{&quot;family&quot;:&quot;Yani&quot;,&quot;given&quot;:&quot;Mohammad&quot;,&quot;parse-names&quot;:false,&quot;dropping-particle&quot;:&quot;&quot;,&quot;non-dropping-particle&quot;:&quot;&quot;},{&quot;family&quot;:&quot;Nur Himawan&quot;,&quot;given&quot;:&quot;Salamet&quot;,&quot;parse-names&quot;:false,&quot;dropping-particle&quot;:&quot;&quot;,&quot;non-dropping-particle&quot;:&quot;&quot;},{&quot;family&quot;:&quot;Sohiburoyyan&quot;,&quot;given&quot;:&quot;Robieth&quot;,&quot;parse-names&quot;:false,&quot;dropping-particle&quot;:&quot;&quot;,&quot;non-dropping-particle&quot;:&quot;&quot;}],&quot;container-title&quot;:&quot;Jurnal Pengabdian Masyarakat Indonesia&quot;,&quot;DOI&quot;:&quot;10.52436/1.jpmi.1967&quot;,&quot;ISSN&quot;:&quot;2775-3026&quot;,&quot;issued&quot;:{&quot;date-parts&quot;:[[2023,12,6]]},&quot;page&quot;:&quot;885-902&quot;,&quot;abstract&quot;:&quot;&lt;p&gt;Sebagai satu-satunya Pusat Kesehatan Masyarakat (Puskesmas) di kabupten Indramayu yang memiliki Poli Jiwa, Puskesmas Kertasemaya menjadi percontohan bagi Puskesmas lain di Indramayu untuk bisa menjadi fasilitas kesehatan (Faskes) tingkat pertama yang dapat memberikan pelayanan yang baik kepada masyarakat. Saat ini poli jiwa di Puskesmas Kertasemaya memberikan pelayanan asesmen dini kesehatan jiwa bagi masyarakat yang membutuhkan. Layanan asesmen dilakukan dengan cara mewawancarai pasien menggunakan instrumen kuisioner Strength Difficulties Questionaire (SDQ) dan Self Reporting Questionaire (SRQ) secara langsung. Akan tetapi pertemuan fisik secara langsung ini dapat membuat pasien merasa tidak nyaman karena ada kesan bahwa orang dengan gangguan jiwa (ODGJ) memiliki stigma yang kurang baik bagi personalitinya apalagi dapat diketahui oleh orang lain dalam hal ini pewawancara. Oleh karena itu, sebuah pendekatan asesmen secara tidak langsung (non-tatap muka) perlu dibuat untuk mengatasi masalah ketidaknyamanan tersebut. Pada kegiatan pengabdian kepada masyarakat (PKM) ini, kami mengusulkan sebuah aplikasi asesmen gangguan kejiwaan berbasis mobile menggunakan Android. Algoritma dibuat dengan cara mengimplementasikan konsep struktur keputusan untuk menentukan hasil diagnosis asesmen sesuai dengan instrumen yang digunakan baik SDQ maupun SRQ. Secara teknis, pertanyaan-pertanyaan SDQ dan SRQ disimpan dalam sebuah List/Array dan diberikan nilai bobot untuk setiap pilihan jawaban yang ada atas pertanyaan-pertanyaan tersebut. Nilai bobot kemudian dikumulasikan untuk mendapatkan skor akhir atas jawaban yang diisi oleh pengguna/pasien. Skor akhir tersebut kemudian digunakan untuk mengklasifikasikan hasil diagnosis atas asesmen yang dilakukan oleh pengguna/pasien. Tujuan dari pengembangan aplikasi ini adalah untuk menjaga privasi pasien dan mempermudah dan mempercepat petugas poli jiwa dalam melakukan asesmen kejiwaan. Hasil dari kegiatan PKM ini adalah kemudahan petugas poli jiwa dalam melakukan asesmen kejiwaan dan merekap hasil asesmen ke dalam database.&lt;/p&gt;&quot;,&quot;issue&quot;:&quot;6&quot;,&quot;volume&quot;:&quot;3&quot;,&quot;container-title-short&quot;:&quot;&quot;},&quot;isTemporary&quot;:false},{&quot;id&quot;:&quot;d1b666d2-7fe1-306b-a77f-17c0ce568cae&quot;,&quot;itemData&quot;:{&quot;type&quot;:&quot;article-journal&quot;,&quot;id&quot;:&quot;d1b666d2-7fe1-306b-a77f-17c0ce568cae&quot;,&quot;title&quot;:&quot;Perancangan User Interface Aplikasi “Impruv” Sebagai Akses Digital Layanan Kesehatan Mental&quot;,&quot;groupId&quot;:&quot;5d3d1151-c3fb-3f7b-bcf0-db626a6f9f8b&quot;,&quot;author&quot;:[{&quot;family&quot;:&quot;Septianingrum&quot;,&quot;given&quot;:&quot;Zachrani&quot;,&quot;parse-names&quot;:false,&quot;dropping-particle&quot;:&quot;&quot;,&quot;non-dropping-particle&quot;:&quot;&quot;},{&quot;family&quot;:&quot;Nadia&quot;,&quot;given&quot;:&quot;Zita&quot;,&quot;parse-names&quot;:false,&quot;dropping-particle&quot;:&quot;&quot;,&quot;non-dropping-particle&quot;:&quot;&quot;}],&quot;container-title&quot;:&quot;Desainpedia Journal of Urban Design, Lifestyle &amp; Behaviour&quot;,&quot;DOI&quot;:&quot;10.36262/dpj.v1i2.637&quot;,&quot;ISSN&quot;:&quot;2830-2966&quot;,&quot;issued&quot;:{&quot;date-parts&quot;:[[2022,11,30]]},&quot;page&quot;:&quot;60&quot;,&quot;abstract&quot;:&quot;&lt;p&gt;In Indonesia, the prevalence rate of mental emotional disorders is quite high. The Indonesian Ministry of Health stated that the number of people with mental disorders had increased by 6.5% during the 2020-2021 period. However, there are still many individuals who do not seek help for their mental health. Some of them do not know how to get access to adequate services. In addition, the rapid development of digital technology can be an important means of providing mental health services that are in line with the needs of the younger generation. The method used in this study is qualitative method. The purpose of this study is to design a mental health consultation application user interface that is in accordance with user needs so as to improve mental health services to be more effective and efficient. It is hoped that this application design can make it easier for the public to get access to mental health services.&lt;/p&gt;&quot;,&quot;issue&quot;:&quot;2&quot;,&quot;volume&quot;:&quot;1&quot;,&quot;container-title-short&quot;:&quot;&quot;},&quot;isTemporary&quot;:false},{&quot;id&quot;:&quot;6d20510b-c9bc-3ca0-9826-55a8bd928378&quot;,&quot;itemData&quot;:{&quot;type&quot;:&quot;article-journal&quot;,&quot;id&quot;:&quot;6d20510b-c9bc-3ca0-9826-55a8bd928378&quot;,&quot;title&quot;:&quot;Game Edukasi Pengenalan Gangguan Psikologis Remaja Menggunakan Metode DGBL-ID&quot;,&quot;groupId&quot;:&quot;5d3d1151-c3fb-3f7b-bcf0-db626a6f9f8b&quot;,&quot;author&quot;:[{&quot;family&quot;:&quot;Prasetyo&quot;,&quot;given&quot;:&quot;Tri Ferga&quot;,&quot;parse-names&quot;:false,&quot;dropping-particle&quot;:&quot;&quot;,&quot;non-dropping-particle&quot;:&quot;&quot;},{&quot;family&quot;:&quot;Bastian&quot;,&quot;given&quot;:&quot;Ade&quot;,&quot;parse-names&quot;:false,&quot;dropping-particle&quot;:&quot;&quot;,&quot;non-dropping-particle&quot;:&quot;&quot;},{&quot;family&quot;:&quot;Sifana&quot;,&quot;given&quot;:&quot;Tika&quot;,&quot;parse-names&quot;:false,&quot;dropping-particle&quot;:&quot;&quot;,&quot;non-dropping-particle&quot;:&quot;&quot;}],&quot;container-title&quot;:&quot;Jurnal Nasional Komputasi dan Teknologi Informasi (JNKTI)&quot;,&quot;DOI&quot;:&quot;10.32672/jnkti.v3i2.2030&quot;,&quot;ISSN&quot;:&quot;2621-3052&quot;,&quot;issued&quot;:{&quot;date-parts&quot;:[[2020,10,10]]},&quot;page&quot;:&quot;121-131&quot;,&quot;abstract&quot;:&quot;&lt;p&gt;Salah satu dampak dari meningkatnya penggunaan smartphone adalah meningkatnya interaksi antara pengguna dan gadget. Sebagian besar pengguna merupakan anak remaja, dengan tujuan penggunaan untuk memainkan permainan. Namun, sebagian besar permainan yang tersedia di Playstore adalah jenis permainan yang belum memiliki efek positif bagi penggunanya terutama remaja. Masa remaja dianggap sebagai waktu di mana individu berusaha untuk membuat identitas mereka sendiri dan menerima informasi dari luar diri mereka sendiri tanpa berpikir lebih lanjut. Akibatnya, beberapa remaja rentan terhadap gangguan psikologis. Gangguan psikologis remaja adalah salah satu gangguan kesehatan mental yang paling mungkin dialami oleh kebanyakan remaja. Ada beberapa penyebab gangguan psikologis pada remaja termasuk depresi, kecemasan, dan sosial diri yang menarik. Kurangnya pengetahuan publik tentang tanda, gejala gangguan psikologis remaja, memiliki perlakuan yang salah kepada penderita. Penelitian ini bertujuan untuk mendidik beberapa gangguan psikologis pada remaja dalam bentuk desktop dan game kuis berbasis android di mana ada informasi dan visualisasi tentang gangguan psikologis pada remaja. Metode pengembangan sistem yang digunakan dalam pembuatan game edukasi ini adalah DGBL-ID (digital game based learning intructional design).&lt;/p&gt;&quot;,&quot;issue&quot;:&quot;2&quot;,&quot;volume&quot;:&quot;3&quot;,&quot;container-title-short&quot;:&quot;&quot;},&quot;isTemporary&quot;:false},{&quot;id&quot;:&quot;1f7dbe19-2041-363c-bf0c-55ca2101c0c5&quot;,&quot;itemData&quot;:{&quot;type&quot;:&quot;article-journal&quot;,&quot;id&quot;:&quot;1f7dbe19-2041-363c-bf0c-55ca2101c0c5&quot;,&quot;title&quot;:&quot;Peran Chatbot dalam Menangani Masalah Kesehatan Mental selama Pandemi COVID-19: Tinjauan Mini&quot;,&quot;groupId&quot;:&quot;5d3d1151-c3fb-3f7b-bcf0-db626a6f9f8b&quot;,&quot;author&quot;:[{&quot;family&quot;:&quot;Urfa Khairatun Hisan&quot;,&quot;given&quot;:&quot;&quot;,&quot;parse-names&quot;:false,&quot;dropping-particle&quot;:&quot;&quot;,&quot;non-dropping-particle&quot;:&quot;&quot;},{&quot;family&quot;:&quot;Miftahul Amri&quot;,&quot;given&quot;:&quot;Muhammad&quot;,&quot;parse-names&quot;:false,&quot;dropping-particle&quot;:&quot;&quot;,&quot;non-dropping-particle&quot;:&quot;&quot;}],&quot;container-title&quot;:&quot;Bincang Sains dan Teknologi&quot;,&quot;DOI&quot;:&quot;10.56741/bst.v1i01.33&quot;,&quot;ISSN&quot;:&quot;2961-8746&quot;,&quot;issued&quot;:{&quot;date-parts&quot;:[[2022,8,3]]},&quot;page&quot;:&quot;1-11&quot;,&quot;abstract&quot;:&quot;&lt;p&gt;Pada artikel ini, kami menyajikan ulasan mini tentang potensi chatbot untuk memerangi masalah kesehatan mental selama pandemi COVID-19. Kami menyajikan perbandingan studi terdahulu terkait COVID-19 dan pengembangan chatbot. Kami juga melakukan survei mini untuk memberikan wawasan tentang bagaimana orang memandang chatbot sebagai bantuan kesehatan mental mereka. Naskah ini bertujuan untuk memberikan gambaran tentang kemungkinan pengembangan chatbot untuk mengurangi penyakit mental. Ada beberapa hal yang perlu diperhatikan secara serius dalam mengembangkan chatbot untuk dukungan emosional, antara lain masalah keamanan, perhatian privasi, dan paradigma etika. Namun, di antara referensi yang menarik, sebagian besar menunjukkan bahwa chatbot adalah alternatif yang baik untuk memerangi masalah kesehatan mental, terutama selama pandemi COVID-19.&lt;/p&gt;&quot;,&quot;issue&quot;:&quot;01&quot;,&quot;volume&quot;:&quot;1&quot;,&quot;container-title-short&quot;:&quot;&quot;},&quot;isTemporary&quot;:false},{&quot;id&quot;:&quot;c91b19e0-93fd-30e0-beb9-29107c49cbbb&quot;,&quot;itemData&quot;:{&quot;type&quot;:&quot;article-journal&quot;,&quot;id&quot;:&quot;c91b19e0-93fd-30e0-beb9-29107c49cbbb&quot;,&quot;title&quot;:&quot;RANCANG BANGUN APLIKASI SKRINING KESEHATAN MENTAL REMAJA BERBASIS WEB DI RSUD DR.DRADJAT PRAWIRANEGARA DENGAN MENGGUNAKAN METODE ANALYTIC HIERARCHY PROCESS (AHP)&quot;,&quot;groupId&quot;:&quot;5d3d1151-c3fb-3f7b-bcf0-db626a6f9f8b&quot;,&quot;author&quot;:[{&quot;family&quot;:&quot;Sutanto&quot;,&quot;given&quot;:&quot;Sutanto&quot;,&quot;parse-names&quot;:false,&quot;dropping-particle&quot;:&quot;&quot;,&quot;non-dropping-particle&quot;:&quot;&quot;},{&quot;family&quot;:&quot;Amiruddin&quot;,&quot;given&quot;:&quot;Dadang&quot;,&quot;parse-names&quot;:false,&quot;dropping-particle&quot;:&quot;&quot;,&quot;non-dropping-particle&quot;:&quot;&quot;},{&quot;family&quot;:&quot;Nugraha&quot;,&quot;given&quot;:&quot;Gagan&quot;,&quot;parse-names&quot;:false,&quot;dropping-particle&quot;:&quot;&quot;,&quot;non-dropping-particle&quot;:&quot;&quot;}],&quot;container-title&quot;:&quot;Journal of Innovation And Future Technology (IFTECH)&quot;,&quot;DOI&quot;:&quot;10.47080/iftech.v4i1.1813&quot;,&quot;ISSN&quot;:&quot;2656-2774&quot;,&quot;issued&quot;:{&quot;date-parts&quot;:[[2022,3,3]]},&quot;page&quot;:&quot;29-38&quot;,&quot;abstract&quot;:&quot;&lt;p&gt;The development of information systems is now very fast and rapid, one form of information system that is easy to develop is web-based. The use of information systems in the medical world is very much, but there are still some who have not utilized the information system to help the work of a medical worker, especially in helping the development of mental health. The system used to help improve mental health in dr.Dradjat Prawiranegara Hospital is now still conventional, namely face to face between medical personnel and patients, this is what makes teenagers who have problems with their mental health have a variety of reasons not to visit a psychiatrist. The web-based adolescent mental health screening application is designed using php programming language, MySQL database and decision making system using Analytic Hierarchy Process (AHP) method. By implementing Web- Based Adolescent Mental Health Screening Application Using Analytic Hierarchy Process (AHP) method is expected to help teenagers know their mental health independently and provide information and education about mental health disorders.&lt;/p&gt;&quot;,&quot;issue&quot;:&quot;1&quot;,&quot;volume&quot;:&quot;4&quot;,&quot;container-title-short&quot;:&quot;&quot;},&quot;isTemporary&quot;:false},{&quot;id&quot;:&quot;221f8cbe-d21a-3655-acc9-9dfddbc91900&quot;,&quot;itemData&quot;:{&quot;type&quot;:&quot;article-journal&quot;,&quot;id&quot;:&quot;221f8cbe-d21a-3655-acc9-9dfddbc91900&quot;,&quot;title&quot;:&quot;Depresion Diagnosis Application Using Beck Depression Inventory Method with Visual Novel Game&quot;,&quot;groupId&quot;:&quot;5d3d1151-c3fb-3f7b-bcf0-db626a6f9f8b&quot;,&quot;author&quot;:[{&quot;family&quot;:&quot;Ihsanuddin&quot;,&quot;given&quot;:&quot;Moh Rizal&quot;,&quot;parse-names&quot;:false,&quot;dropping-particle&quot;:&quot;&quot;,&quot;non-dropping-particle&quot;:&quot;&quot;},{&quot;family&quot;:&quot;Taurusta&quot;,&quot;given&quot;:&quot;Cindy&quot;,&quot;parse-names&quot;:false,&quot;dropping-particle&quot;:&quot;&quot;,&quot;non-dropping-particle&quot;:&quot;&quot;}],&quot;container-title&quot;:&quot;Procedia of Engineering and Life Science&quot;,&quot;DOI&quot;:&quot;10.21070/pels.v2i0.1135&quot;,&quot;ISSN&quot;:&quot;2807-2243&quot;,&quot;issued&quot;:{&quot;date-parts&quot;:[[2021,11,26]]},&quot;abstract&quot;:&quot;&lt;p&gt;Disturbance of feelings with sadness that continues in the long term is an explanation of depression, which can interfere with the social life of the person who experiences it (Pieter and Namora, 2012). As many as 86.94 (27%) in 322 billion individuals in the Southeast Asia region, making it the area with the highest Depression Rate. Because of this, it is necessary to have a Depression Diagnosis Application with the beck depression inventory method with a Visual Novel game approach to give a general idea of ​​whether the person has depression or not. The purpose of this study is to provide another alternative for users to find out whether they have depression or not with visual novel game media. This research method uses the Beck Depression Inventory where users are given 21 questions that must be answered to determine the level of depression they have. The test results on this game succeeded in detecting a person's level of depression which was proven by testing on 5 people with the results that 60% did not experience depression, 20% experienced mood changes and 20% experienced moderate depression. The result of this research is to produce a visual novel game with the application of depression diagnosis in it. This study is intended for people aged 15 years and over who feel they have symptoms of depression to find out their current condition.&lt;/p&gt;&quot;,&quot;volume&quot;:&quot;2&quot;,&quot;container-title-short&quot;:&quot;&quot;},&quot;isTemporary&quot;:false},{&quot;id&quot;:&quot;cd23ebdb-6b4b-3b85-bd6d-1ea355f28509&quot;,&quot;itemData&quot;:{&quot;type&quot;:&quot;article-journal&quot;,&quot;id&quot;:&quot;cd23ebdb-6b4b-3b85-bd6d-1ea355f28509&quot;,&quot;title&quot;:&quot;Perancangan Game Digital Mobile dengan Teknik Dynamic untuk Mengubah Distorsi Kognitif Penderita Depresi Mayor pada Remaja&quot;,&quot;groupId&quot;:&quot;5d3d1151-c3fb-3f7b-bcf0-db626a6f9f8b&quot;,&quot;author&quot;:[{&quot;family&quot;:&quot;Amam&quot;,&quot;given&quot;:&quot;Muchammad Rizhamu&quot;,&quot;parse-names&quot;:false,&quot;dropping-particle&quot;:&quot;&quot;,&quot;non-dropping-particle&quot;:&quot;&quot;},{&quot;family&quot;:&quot;P&quot;,&quot;given&quot;:&quot;T. Arie Setiawan&quot;,&quot;parse-names&quot;:false,&quot;dropping-particle&quot;:&quot;&quot;,&quot;non-dropping-particle&quot;:&quot;&quot;},{&quot;family&quot;:&quot;Prestilliano&quot;,&quot;given&quot;:&quot;Jasson&quot;,&quot;parse-names&quot;:false,&quot;dropping-particle&quot;:&quot;&quot;,&quot;non-dropping-particle&quot;:&quot;&quot;}],&quot;container-title&quot;:&quot;Citradirga : Jurnal Desain Komunikasi Visual dan Intermedia&quot;,&quot;DOI&quot;:&quot;10.33479/cd.v6i01.929&quot;,&quot;ISSN&quot;:&quot;2686-567X&quot;,&quot;issued&quot;:{&quot;date-parts&quot;:[[2024,5,10]]},&quot;page&quot;:&quot;32-49&quot;,&quot;abstract&quot;:&quot;&lt;p&gt;Penelitian ini menginvestigasi potensi game digital \&quot;Isamu\&quot; dengan penerapan Teknik Dynamic Difficulty Scaling sebagai media terapi untuk penderita depresi mayor tingkat rendah pada kelompok usia 18-24 tahun. Dengan fokus pada peningkatan pemikiran kognitif, game ini dirancang untuk memberikan kontribusi positif dalam mengembangkan pola pikir adaptif dan positif pada pemain. Hasil penelitian menunjukkan bahwa penggunaan Teknik Dynamic Difficulty Scaling menghasilkan hasil yang positif sesuai dengan harapan, dengan tantangan yang disesuaikan sesuai kemampuan individu. Penelitian ini tidak hanya mendukung penggunaan game sebagai alat terapi depresi mayor, tetapi juga menunjukkan potensi pengembangan lebih lanjut dalam bidang ini.&lt;/p&gt;&quot;,&quot;issue&quot;:&quot;01&quot;,&quot;volume&quot;:&quot;6&quot;,&quot;container-title-short&quot;:&quot;&quot;},&quot;isTemporary&quot;:false},{&quot;id&quot;:&quot;3bc5cfd4-6496-338c-b601-4220685a453b&quot;,&quot;itemData&quot;:{&quot;type&quot;:&quot;article-journal&quot;,&quot;id&quot;:&quot;3bc5cfd4-6496-338c-b601-4220685a453b&quot;,&quot;title&quot;:&quot;Platfrom Video Game sebagai Media Terapeutik&quot;,&quot;groupId&quot;:&quot;5d3d1151-c3fb-3f7b-bcf0-db626a6f9f8b&quot;,&quot;author&quot;:[{&quot;family&quot;:&quot;Yunike&quot;,&quot;given&quot;:&quot;Yunike&quot;,&quot;parse-names&quot;:false,&quot;dropping-particle&quot;:&quot;&quot;,&quot;non-dropping-particle&quot;:&quot;&quot;},{&quot;family&quot;:&quot;Kusumawaty&quot;,&quot;given&quot;:&quot;Ira&quot;,&quot;parse-names&quot;:false,&quot;dropping-particle&quot;:&quot;&quot;,&quot;non-dropping-particle&quot;:&quot;&quot;}],&quot;container-title&quot;:&quot;Journal of Telenursing (JOTING)&quot;,&quot;DOI&quot;:&quot;10.31539/joting.v5i1.5888&quot;,&quot;ISSN&quot;:&quot;2684-8988&quot;,&quot;issued&quot;:{&quot;date-parts&quot;:[[2023,5,4]]},&quot;page&quot;:&quot;560-576&quot;,&quot;abstract&quot;:&quot;&lt;p&gt;This study attempts to use video games therapeutically, which can be used as a rationale for developing and utilizing video games as a therapeutic medium. This research method uses the PRISMA approach using the keywords \&quot;video game\&quot; and \&quot;teenagers,\&quot; \&quot;mental health,\&quot; and \&quot;intervention\&quot; in the Scopus electronic database, google scholar, Science Direct and Pubmed with a range of years 2018 to 2022. Based on the research results, they have identified the definition of video games along with their platforms and the use of video games to improve mental health for humans of all ages, especially adolescents. It is proven that improving the physical condition of older adults can involve the role of video games as a medium in them. In conclusion, thus, the study of the development and use of video games is urgent to help improve human health status.&amp;#13; Keywords: Adolescent Mental Health, Therapeutic Media, Video Games&lt;/p&gt;&quot;,&quot;issue&quot;:&quot;1&quot;,&quot;volume&quot;:&quot;5&quot;,&quot;container-title-short&quot;:&quot;&quot;},&quot;isTemporary&quot;:false},{&quot;id&quot;:&quot;3928dbd9-696e-37ab-9954-b2979d471b4a&quot;,&quot;itemData&quot;:{&quot;type&quot;:&quot;article-journal&quot;,&quot;id&quot;:&quot;3928dbd9-696e-37ab-9954-b2979d471b4a&quot;,&quot;title&quot;:&quot;A novel ACT-based video game to support mental health through embedded learning: a mixed-methods feasibility study protocol&quot;,&quot;groupId&quot;:&quot;5d3d1151-c3fb-3f7b-bcf0-db626a6f9f8b&quot;,&quot;author&quot;:[{&quot;family&quot;:&quot;Edwards&quot;,&quot;given&quot;:&quot;Darren J&quot;,&quot;parse-names&quot;:false,&quot;dropping-particle&quot;:&quot;&quot;,&quot;non-dropping-particle&quot;:&quot;&quot;},{&quot;family&quot;:&quot;Kemp&quot;,&quot;given&quot;:&quot;Andrew H&quot;,&quot;parse-names&quot;:false,&quot;dropping-particle&quot;:&quot;&quot;,&quot;non-dropping-particle&quot;:&quot;&quot;}],&quot;container-title&quot;:&quot;BMJ Open&quot;,&quot;DOI&quot;:&quot;10.1136/bmjopen-2020-041667&quot;,&quot;ISSN&quot;:&quot;2044-6055&quot;,&quot;issued&quot;:{&quot;date-parts&quot;:[[2020,11,16]]},&quot;page&quot;:&quot;e041667&quot;,&quot;issue&quot;:&quot;11&quot;,&quot;volume&quot;:&quot;10&quot;,&quot;container-title-short&quot;:&quot;BMJ Open&quot;},&quot;isTemporary&quot;:false},{&quot;id&quot;:&quot;9fd96b1a-13a8-32d7-8cd2-190688105856&quot;,&quot;itemData&quot;:{&quot;type&quot;:&quot;article-journal&quot;,&quot;id&quot;:&quot;9fd96b1a-13a8-32d7-8cd2-190688105856&quot;,&quot;title&quot;:&quot;CBT4Depression: A Cognitive Behaviour Therapy (CBT) Therapeutic Game to Reduce Depression Level among Adolescents&quot;,&quot;groupId&quot;:&quot;5d3d1151-c3fb-3f7b-bcf0-db626a6f9f8b&quot;,&quot;author&quot;:[{&quot;family&quot;:&quot;Yusof&quot;,&quot;given&quot;:&quot;Norhana&quot;,&quot;parse-names&quot;:false,&quot;dropping-particle&quot;:&quot;&quot;,&quot;non-dropping-particle&quot;:&quot;&quot;},{&quot;family&quot;:&quot;Shaari&quot;,&quot;given&quot;:&quot;Nazrul Azha Mohamed&quot;,&quot;parse-names&quot;:false,&quot;dropping-particle&quot;:&quot;&quot;,&quot;non-dropping-particle&quot;:&quot;&quot;},{&quot;family&quot;:&quot;Yusoff&quot;,&quot;given&quot;:&quot;Eizwan Hamdie&quot;,&quot;parse-names&quot;:false,&quot;dropping-particle&quot;:&quot;&quot;,&quot;non-dropping-particle&quot;:&quot;&quot;}],&quot;container-title&quot;:&quot;International Journal of Advanced Computer Science and Applications&quot;,&quot;DOI&quot;:&quot;10.14569/IJACSA.2022.0130930&quot;,&quot;ISSN&quot;:&quot;21565570&quot;,&quot;issued&quot;:{&quot;date-parts&quot;:[[2022]]},&quot;issue&quot;:&quot;9&quot;,&quot;volume&quot;:&quot;13&quot;,&quot;container-title-short&quot;:&quot;&quot;},&quot;isTemporary&quot;:false},{&quot;id&quot;:&quot;954640fc-6ac1-3d4b-80a1-96f75a2870e8&quot;,&quot;itemData&quot;:{&quot;type&quot;:&quot;article-journal&quot;,&quot;id&quot;:&quot;954640fc-6ac1-3d4b-80a1-96f75a2870e8&quot;,&quot;title&quot;:&quot;Perancangan UI/UX pada Aplikasi Hello Life dengan Metode Design Thinking&quot;,&quot;groupId&quot;:&quot;5d3d1151-c3fb-3f7b-bcf0-db626a6f9f8b&quot;,&quot;author&quot;:[{&quot;family&quot;:&quot;Renaldo&quot;,&quot;given&quot;:&quot;Florence&quot;,&quot;parse-names&quot;:false,&quot;dropping-particle&quot;:&quot;&quot;,&quot;non-dropping-particle&quot;:&quot;&quot;},{&quot;family&quot;:&quot;Cahyati&quot;,&quot;given&quot;:&quot;Imelia Dwinora&quot;,&quot;parse-names&quot;:false,&quot;dropping-particle&quot;:&quot;&quot;,&quot;non-dropping-particle&quot;:&quot;&quot;},{&quot;family&quot;:&quot;Dody&quot;,&quot;given&quot;:&quot;Muhammad&quot;,&quot;parse-names&quot;:false,&quot;dropping-particle&quot;:&quot;&quot;,&quot;non-dropping-particle&quot;:&quot;&quot;},{&quot;family&quot;:&quot;Pribadi&quot;,&quot;given&quot;:&quot;Muhammad Rizky&quot;,&quot;parse-names&quot;:false,&quot;dropping-particle&quot;:&quot;&quot;,&quot;non-dropping-particle&quot;:&quot;&quot;},{&quot;family&quot;:&quot;Fajriati&quot;,&quot;given&quot;:&quot;Riska&quot;,&quot;parse-names&quot;:false,&quot;dropping-particle&quot;:&quot;&quot;,&quot;non-dropping-particle&quot;:&quot;&quot;},{&quot;family&quot;:&quot;Kurniawan&quot;,&quot;given&quot;:&quot;Rizky&quot;,&quot;parse-names&quot;:false,&quot;dropping-particle&quot;:&quot;&quot;,&quot;non-dropping-particle&quot;:&quot;&quot;}],&quot;container-title&quot;:&quot;The 1st MDP Student Conference 2022&quot;,&quot;issued&quot;:{&quot;date-parts&quot;:[[2022,1,29]]},&quot;page&quot;:&quot;273-278&quot;,&quot;abstract&quot;:&quot;Tingginya  angka  depresi  menimbulkan  banyak  kasus  bunuh  diri  di Indonesia  terutama  di  kalangan  Mahasiswa.  Hal  ini  membantu  munculnya beberapa fitur konsultasipsikologi online. Mereka akan melayani orang -orang yang   membutuhkan   psikologi   untuk   mengobati   rasa   depresinya.   Namun terkadang menyembuhkan orang depresi itu tidak mudah karena membutuhkan waktu untuk menyatukan pikiran. Makalah ini menjabarkan proses prototyping sebuah platform   online berbentuk   aplikasi   bernama Hello   Lfieuntuk mempermudah orang mencari dan melakukan konsultasi online dengan beberapa psikolog berpengalaman. Platform ini dibuat menggunakan pendekatan Design Thinking berdasarkan  kebutuhan  dan  pengalaman  pengguna.  Tahap Design Thinking meliputi empathize, define, ideate, prototype, dan testing. Tidak hanya itu, platform ini juga memiliki fitur forum untuk berkomunikasi antar pengguna sehingga bisa berbagi pegalaman dan solusi yang dihadapi&quot;,&quot;issue&quot;:&quot;1&quot;,&quot;volume&quot;:&quot;1&quot;,&quot;container-title-short&quot;:&quot;&quot;},&quot;isTemporary&quot;:false},{&quot;id&quot;:&quot;7cff6e4f-585e-3432-b31e-41fd4b470bad&quot;,&quot;itemData&quot;:{&quot;type&quot;:&quot;article-journal&quot;,&quot;id&quot;:&quot;7cff6e4f-585e-3432-b31e-41fd4b470bad&quot;,&quot;title&quot;:&quot;Pengenalan Obat-obatan untuk Orang dengan Gangguan Jiwa Berdasarkan Gejalanya Menggunakan Augmented Reality&quot;,&quot;groupId&quot;:&quot;5d3d1151-c3fb-3f7b-bcf0-db626a6f9f8b&quot;,&quot;author&quot;:[{&quot;family&quot;:&quot;Zulfirman&quot;,&quot;given&quot;:&quot;Muhammad&quot;,&quot;parse-names&quot;:false,&quot;dropping-particle&quot;:&quot;&quot;,&quot;non-dropping-particle&quot;:&quot;&quot;}],&quot;issued&quot;:{&quot;date-parts&quot;:[[2023,3,21]]},&quot;abstract&quot;:&quot;Obat Psikotropika adalah zat atau obat, baik alamiah atau sintetis bukan narkotika yang berkhasiat psikoaktif melalui selektif pada susunan saraf pusat yang menyebabkan perubahan khas pada aktifitas mental dan perilaku. Bagi mahasiswa terutama mahasiswa keperawatan sangat penting untuk mengetahui jenis obat apa saja yang akan diberikan kepada pasien karena perawat merupakan tenaga kesehatan yang selalu berada disekitar pasien dan mengetahui kondisi pasien. Kurangnya tingkat pengetahuan tentang jenis obat-obatan orang dalam gangguan jiwa dikarenakan terbatasnya media untuk mendukung proses belajar pengenalan tentang obat obatan orang dalam gangguan jiwa, mahasiswa keperawatan hanya dapat informasi tentang obat-obatan dari buku dan penjelasan tenaga kesehatan lainnya yang kurang. Atas dasar tersebut, penulis bermaksud untuk merancang sebuah aplikasi “Pengenalan Obat Obatan Orang Dalam Gangguan Jiwa Berdasarkan Gejalanya Menggunakan Augmented Reality”, untuk membantu proses belajar mengenali obat-obatan orang dalam gangguan jiwa pada mahasiswa perawat bidang tenaga kesehatan yang sedang melakukan dinas praktek di Rumah Sakit Jiwa Tampan dengan menggunakan teknik markerless serta menggunakan library ARCoreSDK. Berdasarkan pengujian pada jarak 15 cm sampai 200 cm objek 3D dapat ditampilkan dengan baik, serta objek dapat ditampilkan diluar ruangan maupun didalam ruangan dan bisa melakukan tracking (penandaan) lokasi dimana saja dengan syarat memiliki intesitas cahaya menimal\n12 lux. Berdasarkan hasil pengujian user didapatkan presentase 87% dengan responden sebanyak 35 mahasiswa keperawatan sehingga aplikasi ini dapat diimplementasikan sebagai media pembelajaran pengenalan obat khusus gangguan jiwa.\n&quot;,&quot;container-title-short&quot;:&quot;&quot;},&quot;isTemporary&quot;:false},{&quot;id&quot;:&quot;2a16fa9c-4e4c-3d79-9408-acb5555e12c0&quot;,&quot;itemData&quot;:{&quot;type&quot;:&quot;article-journal&quot;,&quot;id&quot;:&quot;2a16fa9c-4e4c-3d79-9408-acb5555e12c0&quot;,&quot;title&quot;:&quot;Analisis Prediksi Tingkat Depresi pada Siswa dengan Pendekatan Regresi Linier&quot;,&quot;groupId&quot;:&quot;5d3d1151-c3fb-3f7b-bcf0-db626a6f9f8b&quot;,&quot;author&quot;:[{&quot;family&quot;:&quot;Widyanti&quot;,&quot;given&quot;:&quot;Maya&quot;,&quot;parse-names&quot;:false,&quot;dropping-particle&quot;:&quot;&quot;,&quot;non-dropping-particle&quot;:&quot;&quot;}],&quot;container-title&quot;:&quot;Journal of Artificial Intelligence Application (JAIA)&quot;,&quot;issued&quot;:{&quot;date-parts&quot;:[[2024,2,2]]},&quot;page&quot;:&quot;10-18&quot;,&quot;abstract&quot;:&quot;Depresi pada siswa telah menjadi isu kesehatan mental yang semakin penting di kalangan populasi pelajar. Peningkatan tekanan akademis, perubahan sosial, dan tantangan perkembangan individu menjadi faktor-faktor utama yang berkontribusi pada prevalensi depresi yang meningkat di kalangan siswa. Dampaknya meluas dari aspek kesejahteraan mental hingga mempengaruhi prestasi akademis dan pengembangan pribadi. Pemahaman mendalam terhadap faktor risiko, gejala, serta dampak depresi pada siswa menjadi kunci dalam upaya pencegahan dan intervensi dini. Sekolah, orang tua, dan profesional kesehatan mental memegang peran penting dalam menciptakan lingkungan pendidikan yang mendukung, serta mengurangi stigma seputar masalah kesehatan mental. Pemanfaatan teknologi juga menjadi aspek penting dalam deteksi dini dan manajemen depresi pada siswa. Lingkungan pendidikan yang mendukung, program kesejahteraan mental di sekolah, dan peningkatan kesadaran terhadap masalah kesehatan mental dapat membantu mengurangi stigma seputar depresi di kalangan siswa. Teknologi juga berperan signifikan, dengan adanya aplikasi kesehatan mental dan sumber daya daring yang dapat memberikan bantuan dan dukungan kepada siswa yang membutuhkannya. Prediksi yang dilakukan ini menggunakan metode regresi dimana dalam metode regresi terdapat 7 metode lagi meliputi (1) Linear Regression, (2) Support Vector Regression – Linear, (3) Support Vector Regression – RBF, (4) Decision Tree Regression, (5) Random Forest Regressor, (6) Gradient Boosting Regression, (7) NLP Regressor yang diterapkan dalam penelitian ini. Berdasarkan 7 metode regresi tersebut akan dilakukan seleksi dalam memilih metode terbaik dengan nilai akurasi paling bagus yang digunakan dalam proses pengolahan deploy untukprediksi tingkat depresi pada siswa. Dari hasil akurasi 90:10, 80:20, 70:30, dan 60:40 bahwa metode yang bagus digunakan adalah metode Decision Tree Regression.&quot;,&quot;issue&quot;:&quot;1&quot;,&quot;volume&quot;:&quot;1&quot;,&quot;container-title-short&quot;:&quot;&quot;},&quot;isTemporary&quot;:false},{&quot;id&quot;:&quot;526c2f11-587b-35f5-aa50-3616e5f094ee&quot;,&quot;itemData&quot;:{&quot;type&quot;:&quot;article-journal&quot;,&quot;id&quot;:&quot;526c2f11-587b-35f5-aa50-3616e5f094ee&quot;,&quot;title&quot;:&quot;Sistem Pakar Diagnosa Tingkat Depresi pada Mahasiswa Semester Akhir Menggunakan Metode Certainty Factor Berbasis Web (Studi Kasus: Mahasiswa Semester Akhir Teknik Informatika Universitas Islam Lamongan)&quot;,&quot;groupId&quot;:&quot;5d3d1151-c3fb-3f7b-bcf0-db626a6f9f8b&quot;,&quot;author&quot;:[{&quot;family&quot;:&quot;Sulaiman&quot;,&quot;given&quot;:&quot;Akhmad Nurali&quot;,&quot;parse-names&quot;:false,&quot;dropping-particle&quot;:&quot;&quot;,&quot;non-dropping-particle&quot;:&quot;&quot;}],&quot;issued&quot;:{&quot;date-parts&quot;:[[2023]]},&quot;abstract&quot;:&quot;Depresi merupakan hal yang dialami oleh setiap orang, mahasiswa rentan\nterhadap depresi dan kecemasan. Salah satu faktor penyebab depresi di kalangan\nmahasiswa adalah perubahan lingkungan belajar. Banyak mahasiswa akhir yang\nmengalami depresi dikarenakan banyak tuntutan dan beberapa faktor, dibutuhkan\nsebuah aplikasi yang bisa mendiagnosa tingkat depresi pada mahasiswa semester\nakhir untuk mengurangi resiko depresi berkelanjutan. Dengan adanya permasalahan\ntersebut mendorong penulis untuk membuat sistem pakar diagnosa tingkat depresi\npada mahasiswa semester akhir menggunakan metode certainty factor yang\ndimaksud dapat mendiagnosa tingkat depresi pada mahasiswa semester akhir\ndengan akurat dan dapat membantu seorang pakar lebih cepat dalam proses\nidentifikasi penyakit, sistem pakar juga disertai dengan informasi dan langsung\ndikelola oleh pakar, sistem pakar ini menggunakan pemrograman web php dan\ndatabase mysql. Dengan tujuan dapat membangun website sistem pakar\nmenggunakan metode certainty factor untuk mendiagnosa tingkat depresi pada\nmahasiswa semester akhir, dan mengetahui tingkat akurasi metode certainty factor\nuntuk mendiagnosa tingkat depresi pada mahasiswa semester akhir beserta solusi\npenanganannya. Metode yang digunakan yaitu metode certainty factor, metode\ncertainty factor dipilih karena metode ini cocok dipakai dalam sistem pakar yang\nmengandung ketidak pastian, dalam sekali proses perhitungan hanya dapat\nmengolah dua data saja sehingga keakuratan data tetap terjaga. Data ini diperoleh\ndari pakar yang bernama Setyani Alfinuha M.Psi., melalui proses wawancara dan\nmendapatkan hasil berupa 3 data penyakit dan 21 data gejala. Uji coba sistem\nmenggunakan data sebanyak 25 mahasiswa yang mengalami depresi. Dari hasil\npercobaan presentase kesesuaian diagnosa sebesar 88%.&quot;,&quot;container-title-short&quot;:&quot;&quot;},&quot;isTemporary&quot;:false},{&quot;id&quot;:&quot;8941ab6a-1c2c-362f-826a-7ab03a8a8c9a&quot;,&quot;itemData&quot;:{&quot;type&quot;:&quot;article-journal&quot;,&quot;id&quot;:&quot;8941ab6a-1c2c-362f-826a-7ab03a8a8c9a&quot;,&quot;title&quot;:&quot;Aplikasi Terapi Kognitif Perilaku Religius terhadap Penurunan Skor Depresi di Kampung Tipar, Karangtengah, Kabupaten Cianjur&quot;,&quot;groupId&quot;:&quot;5d3d1151-c3fb-3f7b-bcf0-db626a6f9f8b&quot;,&quot;author&quot;:[{&quot;family&quot;:&quot;Febrianti&quot;,&quot;given&quot;:&quot;Vera&quot;,&quot;parse-names&quot;:false,&quot;dropping-particle&quot;:&quot;&quot;,&quot;non-dropping-particle&quot;:&quot;&quot;}],&quot;issued&quot;:{&quot;date-parts&quot;:[[2021]]},&quot;abstract&quot;:&quot;Depression is a mood disorder that appears dominantly when the stress experienced by a person does not go away, in general the feelings that arise are helplessness, disappointment and loss of hope. The purpose of this case study is to apply cognitive therapy to religious behavior to decrease depression scores. The method in this scientific paper is a case study with the provision of cognitive therapy for religious behavior. Data collection techniques were carried out by interviews, observation and literature/documentation studies. The results of the religious cognitive therapy intervention showed a decrease in depression scores after religious behavior cognitive therapy was carried out with a score of 26 to 18 as measured using BDI-II (Back Depression Inventory II). from these results it can be concluded that religious cognitive therapy has an effect on decreasing depression scores. The conclusion of this paper is that the provision of cognitive therapy for religious behavior is effective in reducing depression scores and this therapy can be an alternative for someone who is depressed because cognitive therapy for religious behavior changes the mindset and behavior based on the patient's personal values that have been previously held so that it can improve spiritual awareness and religious beliefs believed by the patient.&quot;,&quot;container-title-short&quot;:&quot;&quot;},&quot;isTemporary&quot;:false},{&quot;id&quot;:&quot;a12243af-0550-3046-8d4e-63eb0b96e8c1&quot;,&quot;itemData&quot;:{&quot;type&quot;:&quot;article-journal&quot;,&quot;id&quot;:&quot;a12243af-0550-3046-8d4e-63eb0b96e8c1&quot;,&quot;title&quot;:&quot;Pengembangan Hypermedia Learning Environment (HLE) untuk Meningkatkan Self-Regulated Learning Berdasarkan Kemampuan Self-Monitoring&quot;,&quot;groupId&quot;:&quot;5d3d1151-c3fb-3f7b-bcf0-db626a6f9f8b&quot;,&quot;author&quot;:[{&quot;family&quot;:&quot;Sakkinah&quot;,&quot;given&quot;:&quot;Intan Sulistyaningrum&quot;,&quot;parse-names&quot;:false,&quot;dropping-particle&quot;:&quot;&quot;,&quot;non-dropping-particle&quot;:&quot;&quot;},{&quot;family&quot;:&quot;Hartanto&quot;,&quot;given&quot;:&quot;Rudy&quot;,&quot;parse-names&quot;:false,&quot;dropping-particle&quot;:&quot;&quot;,&quot;non-dropping-particle&quot;:&quot;&quot;},{&quot;family&quot;:&quot;Erna Permanasari&quot;,&quot;given&quot;:&quot;Adhistya&quot;,&quot;parse-names&quot;:false,&quot;dropping-particle&quot;:&quot;&quot;,&quot;non-dropping-particle&quot;:&quot;&quot;}],&quot;container-title&quot;:&quot;Jurnal Nasional Teknik Elektro dan Teknologi Informasi&quot;,&quot;issued&quot;:{&quot;date-parts&quot;:[[2022,5,2]]},&quot;page&quot;:&quot;97-104&quot;,&quot;abstract&quot;:&quot;Penggunaan media pembelajaran saat ini telah\nberkembang pesat. Dewasa ini banyak penelitian yang\nmenggunakan komputer sebagai media pembelajaran yang\nadaptif bagi mahasiswa; salah satu contohnya adalah hypermedia\nlearning environment (HLE). Media HLE dikembangkan untuk\nmembantu mahasiswa dalam belajar, misalnya pada situasi\npandemi COVID-19 saat ini, yang mengharuskan semua aktivitas\npembelajaran dilakukan secara daring (online). Salah satu bidang\nyang terkena dampak pandemi ini adalah bidang pendidikan,\nyaitu semua kegiatan pembelajaran dialihkan menjadi daring.\nOleh karena itu, pembelajaran berbasis web HLE dapat\nmembantu mahasiswa untuk tetap belajar dari rumah. HLE saat\nini sedang dikembangkan untuk meningkatkan kemampuan\nmahasiswa dalam proses self-regulated learning (SRL). Ada\nkomponen penting di dalam SRL, yakni self-monitoring. Namun,\ndalam perkembangannya, HLE yang dikembangkan tidak\nberbasis self-monitoring. Dalam penelitian ini, HLE adaptif\ndikembangkan berdasarkan kemampuan self-monitoring\nmahasiswa. Dalam pengembangannya, sistem HLE menggunakan\nmetode pengembangan agile, yaitu Scrum. Pengumpulan data\nawal untuk klasifikasi mahasiswa dilakukan menggunakan selfregulatory inventory (SRI). SRI merupakan instrumen yang\ndigunakan untuk mengukur kemampuan self-monitoring\nmahasiswa. Data kemudian diolah hingga dapat\nmengklasifikasikan siswa menjadi tiga kelas, yaitu high, medium,\ndan low. Hasil klasifikasi kemampuan siswa kemudian digunakan\nuntuk mengembangkan bantuan pembelajaran pada HLE.\nPengembangan bantuan yang disediakan adalah dalam bentuk\nteks dan video yang disesuaikan dengan tingkat self-monitoring\nmahasiswa. Dari hasil pengembangan, didapatkan bahwa semua\nfungsi HLE dapat berjalan dengan baik. Sistem diuji coba kepada\ndua belas mahasiswa untuk mengetahui tingkat usability dengan\nmenggunakan system usability scale (SUS). Hasil menunjukkan\nkategori good, dengan skor 72,92. Untuk penelitian selanjutnya,\ndapat dilakukan implementasi pada mahasiswa dan mengukur\nkeefektifan sistem yang telah dikembangkan.&quot;,&quot;issue&quot;:&quot;2&quot;,&quot;volume&quot;:&quot; 11&quot;,&quot;container-title-short&quot;:&quot;&quot;},&quot;isTemporary&quot;:false},{&quot;id&quot;:&quot;adb24d31-898e-3aa3-852c-035cb291f048&quot;,&quot;itemData&quot;:{&quot;type&quot;:&quot;article-journal&quot;,&quot;id&quot;:&quot;adb24d31-898e-3aa3-852c-035cb291f048&quot;,&quot;title&quot;:&quot;Expert System Mendiagnosa Tingkat Depresi Siswa Menggunakan Metode Certainly Factor&quot;,&quot;groupId&quot;:&quot;5d3d1151-c3fb-3f7b-bcf0-db626a6f9f8b&quot;,&quot;author&quot;:[{&quot;family&quot;:&quot;Yulianti&quot;,&quot;given&quot;:&quot;Nadia&quot;,&quot;parse-names&quot;:false,&quot;dropping-particle&quot;:&quot;&quot;,&quot;non-dropping-particle&quot;:&quot;&quot;}],&quot;issued&quot;:{&quot;date-parts&quot;:[[2023]]},&quot;abstract&quot;:&quot;Depresi adalah gangguan suasana hati yang ditandai dengan gejala seperti kemurungan, lesu, kurangnya gairah, perasaan tidak berharga, frustasi yang mendalam, keputusasaan, pikiran tentang kematian dan pikiran untuk bunuh diri, depresi merupakan salah satu kondisi kesehatan mental, banyak Siswa masih kesulitan untuk menentukan sudah sampai ditahap mana dan separah apa depresi yang mereka alami, Mengidentifikasi faktor yang mempengaruhi tingkat depresi yang dialami siswa dengan Menerapkan metode Certainly Factor (CF) pada sistem pakar untuk mendiagnosa tingkat depresi siswa, Certainly Factor adalah metode untuk menghadapi ketidakpastian dalam sistem berbasis aturan dengan melakukan perhitungan, setelah sistem berjalan dengan baik maka dilakukan implementasi terhadap siswa dengan cara mendaftar terlebih dulu kemudian login setelah itu menjawab pertanyaan dari data gejala-gejala yang menjadi penyebab depresi berdasarkan tingkatanya masing-masing&quot;,&quot;container-title-short&quot;:&quot;&quot;},&quot;isTemporary&quot;:false},{&quot;id&quot;:&quot;e238423e-ca06-337e-bf87-dd79ee66305a&quot;,&quot;itemData&quot;:{&quot;type&quot;:&quot;article-journal&quot;,&quot;id&quot;:&quot;e238423e-ca06-337e-bf87-dd79ee66305a&quot;,&quot;title&quot;:&quot;SISTEM PAKAR DIAGNOSA DINI MENTAL HEALTH MENGGUNAKAN METODE CERTAINTY FACTOR BERBASIS WEB&quot;,&quot;groupId&quot;:&quot;5d3d1151-c3fb-3f7b-bcf0-db626a6f9f8b&quot;,&quot;author&quot;:[{&quot;family&quot;:&quot;Riskiani&quot;,&quot;given&quot;:&quot;Dwi&quot;,&quot;parse-names&quot;:false,&quot;dropping-particle&quot;:&quot;&quot;,&quot;non-dropping-particle&quot;:&quot;&quot;}],&quot;container-title&quot;:&quot;Jurnal Informatika MULTI &quot;,&quot;issued&quot;:{&quot;date-parts&quot;:[[2023,12,15]]},&quot;page&quot;:&quot;594-600&quot;,&quot;abstract&quot;:&quot;Pandemi Covid-19 telah mengubah begitu banyak aspek dalam kehidupan. Dampak dari Pandemi Covid-19 ini tidak hanya berdampak pada segi fisik, namun juga kesehatan psikis atau mental yang disebabkan oleh berbagai masalah dan kecemasan. Namun masih banyak masyarakat yang belum mengenali dan mengindikasi adanya penyakit kejiwaan. Hal ini disebabkan oleh penyakit kejiwaan adalah penyakit yang tidak dapat dilihat tapi dapat diketahui dari gejala-gejala yang nampak secara fisik ataupun perilaku yang dialami pasien. Seringkali masyarakat mengabaikan gejala-gejala yang dialami pasien karena sifatnya yang samar. Penelitian ini bertujuan untuk mengembangkan sistem pakar dalam mendiagnosa dini kesehatan mental berbasis website dengan metode certainty factor. Penelitian ini diharapkan mampu mengatasi masalah masyarakat yang merasa mengalami gangguan kesehatan mental. agar bisa mendeteksi lebih dini, Sehingga bisa segera mendapatkan pertolongan, bisa lebih mengantisipasi agar dapat segera mengatasi masalahnya dan bisa segera berkonsultasi lebih lanjut dengan seorang dokter atau psikolog apabila kondisinya memerlukan pendampingan dari seorang ahli. Pengmbilan keputusan sistem pakar ini didasarkan pada data-data mengenai tanda dan gejala awal, gejala ringan hingga berat yang diperoleh dari jurnal ilmiah maupun buku-buku yang ditulis oleh para ahli dibidangnya. Metode yang digunakan untuk menentukan hasil pengujian adalah Certainly Factor. Penelitian ini menghasilkan sistem pakar untuk mendiagnosis lebih dini secara mandiri gangguan kesehatan mental yang dialami dengan tanda dan gejala yang diinput, serta dapat menampilkan solusi dari gangguan kesehatan mental yang dialami. Sistem ini akan dikembangkan dan diimplementasikan dengan UML (Undefinned Modeling Languange), PHP dan MySQL.&quot;,&quot;issue&quot;:&quot;6&quot;,&quot;volume&quot;:&quot;1&quot;,&quot;container-title-short&quot;:&quot;&quot;},&quot;isTemporary&quot;:false},{&quot;id&quot;:&quot;20756113-2ab5-3e7f-87fc-fcf13fad8279&quot;,&quot;itemData&quot;:{&quot;type&quot;:&quot;article-journal&quot;,&quot;id&quot;:&quot;20756113-2ab5-3e7f-87fc-fcf13fad8279&quot;,&quot;title&quot;:&quot;Perancangan Aplikasi Kesehatan Mental “NAFS” (Islamic Psycho Spiritual Therapy) Berbasis Android Menggunakan Metode PDCA (Plan-Do -CheckAction)&quot;,&quot;groupId&quot;:&quot;5d3d1151-c3fb-3f7b-bcf0-db626a6f9f8b&quot;,&quot;author&quot;:[{&quot;family&quot;:&quot;Ross&quot;,&quot;given&quot;:&quot;Hanna Oktasya&quot;,&quot;parse-names&quot;:false,&quot;dropping-particle&quot;:&quot;&quot;,&quot;non-dropping-particle&quot;:&quot;&quot;},{&quot;family&quot;:&quot;Arrohmah&quot;,&quot;given&quot;:&quot;Aulia Syifa&quot;,&quot;parse-names&quot;:false,&quot;dropping-particle&quot;:&quot;&quot;,&quot;non-dropping-particle&quot;:&quot;&quot;},{&quot;family&quot;:&quot;Hasanah&quot;,&quot;given&quot;:&quot;Megawatul&quot;,&quot;parse-names&quot;:false,&quot;dropping-particle&quot;:&quot;&quot;,&quot;non-dropping-particle&quot;:&quot;&quot;},{&quot;family&quot;:&quot;Yusran&quot;,&quot;given&quot;:&quot;Naufal&quot;,&quot;parse-names&quot;:false,&quot;dropping-particle&quot;:&quot;&quot;,&quot;non-dropping-particle&quot;:&quot;&quot;},{&quot;family&quot;:&quot;Wijareni&quot;,&quot;given&quot;:&quot;Nurastuti&quot;,&quot;parse-names&quot;:false,&quot;dropping-particle&quot;:&quot;&quot;,&quot;non-dropping-particle&quot;:&quot;&quot;}],&quot;container-title&quot;:&quot;Jurnal Informatika Universitas Pamulang &quot;,&quot;issued&quot;:{&quot;date-parts&quot;:[[2021,12]]},&quot;page&quot;:&quot;849-856&quot;,&quot;abstract&quot;:&quot;Selama pandemi Covid-19, persentase gangguan mental mengalami peningkatan yang signifikan.\nPeningkatan tersebut tidak sebanding dengan pelayanan ataupun media penanganan yang tersedia, terlebih\nmasyarakat Indonesia yang mayoritas muslim. Padahal, kesehatan mental menjadi salah satu aspek penting\ndalam kehidupan manusia. Maka dari itu dilakukan perancangan Aplikasi NAFS berdasarkan keilmuan\npsikologi Islam (Islamic psycho-spiritual therapy) yang dapat menjadi inovasi layanan kesehatan mental\nberbasis android. Perancangan Aplikasi NAFS dilakukan menggunakan metode PDCA dengan desain\npartisipatori. Hasil dari keseluruhan tahapan perancangan menunjukkan bahwa Aplikasi NAFS berdasarkan\npengujian alpha (black box method) dan beta menunjukkan fungsionalitas dan performansinya sesuai\ndengan kebutuhan dan rancangan yang sudah ditentukan. Dengan demikian dapat disimpulkan bahwa\nAplikasi NAFS bisa digunakan terutama bagi individu dengan mental illness, sebagai bentuk pertolongan\npertama kesehatan mental (mental health first aid) dan media edukasi kesehatan mental. &quot;,&quot;issue&quot;:&quot;4&quot;,&quot;volume&quot;:&quot;6&quot;,&quot;container-title-short&quot;:&quot;&quot;},&quot;isTemporary&quot;:false},{&quot;id&quot;:&quot;780d1ffb-d478-3e6d-b627-a44d97aa1843&quot;,&quot;itemData&quot;:{&quot;type&quot;:&quot;article-journal&quot;,&quot;id&quot;:&quot;780d1ffb-d478-3e6d-b627-a44d97aa1843&quot;,&quot;title&quot;:&quot;SISTEM PAKAR DIAGNOSA TINGKAT DEPRESI PASCA MELAHIRKAN DENGAN MENGGUNAKAN METODE CERTAINTY FACTOR BERBASIS ANDROID&quot;,&quot;groupId&quot;:&quot;5d3d1151-c3fb-3f7b-bcf0-db626a6f9f8b&quot;,&quot;author&quot;:[{&quot;family&quot;:&quot;Asshidiqie&quot;,&quot;given&quot;:&quot;Muhammad&quot;,&quot;parse-names&quot;:false,&quot;dropping-particle&quot;:&quot;&quot;,&quot;non-dropping-particle&quot;:&quot;&quot;},{&quot;family&quot;:&quot;Sitio&quot;,&quot;given&quot;:&quot;Sartika Lina Mulani&quot;,&quot;parse-names&quot;:false,&quot;dropping-particle&quot;:&quot;&quot;,&quot;non-dropping-particle&quot;:&quot;&quot;}],&quot;container-title&quot;:&quot;Buletin Ilmiah Ilmu Komputer dan Multimedia &quot;,&quot;issued&quot;:{&quot;date-parts&quot;:[[2023,7]]},&quot;page&quot;:&quot;296-304&quot;,&quot;abstract&quot;:&quot;Aplikasi Sistem Pakar Diagnosa Tingkat Depresi Pasca Melahirkan berbasis Android menggunakan metode  Certainty  Factor  untuk  mendiagnosis  tingkat  depresi  pasca  melahirkan  pada  ibu.  Dengan  fitur  input gejala interaktif dan perhitungan tingkat keyakinan otomatis, aplikasi ini memberikan solusi praktis dan mudah diakses bagi pengguna Android dalam mendiagnosa serta memberikan rekomendasi tindakan yang tepat.&quot;,&quot;issue&quot;:&quot;2&quot;,&quot;volume&quot;:&quot;1&quot;,&quot;container-title-short&quot;:&quot;&quot;},&quot;isTemporary&quot;:false},{&quot;id&quot;:&quot;b9d56044-fc1f-3f1b-8ad6-7bd439519443&quot;,&quot;itemData&quot;:{&quot;type&quot;:&quot;article-journal&quot;,&quot;id&quot;:&quot;b9d56044-fc1f-3f1b-8ad6-7bd439519443&quot;,&quot;title&quot;:&quot;EFEKTIVITAS HIPNOTERAPI MENGGUNAKAN MOBILE APLIKASI (HIMO) DAN HIPNOTERAPI MANUAL (HIMA) PADA DEPRESI LANJUT USIA DI KOTA TASIKMALAYA&quot;,&quot;groupId&quot;:&quot;5d3d1151-c3fb-3f7b-bcf0-db626a6f9f8b&quot;,&quot;author&quot;:[{&quot;family&quot;:&quot;Rismawan&quot;,&quot;given&quot;:&quot;Wawan&quot;,&quot;parse-names&quot;:false,&quot;dropping-particle&quot;:&quot;&quot;,&quot;non-dropping-particle&quot;:&quot;&quot;},{&quot;family&quot;:&quot;Rahmat&quot;,&quot;given&quot;:&quot;Ibrahim&quot;,&quot;parse-names&quot;:false,&quot;dropping-particle&quot;:&quot;&quot;,&quot;non-dropping-particle&quot;:&quot;&quot;},{&quot;family&quot;:&quot;M&quot;,&quot;given&quot;:&quot;Carla Raymondalexas&quot;,&quot;parse-names&quot;:false,&quot;dropping-particle&quot;:&quot;&quot;,&quot;non-dropping-particle&quot;:&quot;&quot;}],&quot;issued&quot;:{&quot;date-parts&quot;:[[2022]]},&quot;abstract&quot;:&quot;Lansia sering mengalami gangguan mental seperti insomnia, stres psikososial, kecemasan, gangguan perilaku : agresif, agitasi, dan depresi. Perasaan kesepian, tidak berguna, putus asa, tidak berdaya, merupakan pernyataan yang sering disampaikan lanjut usia yang bunuh diri. Upaya penyembuhan depresi dapat dilakukan dengan farmakoterapi, farmakogenomik didukung oleh psikoterapi. Hipnoterapi merupakan salah satu dari psikoterapi dapat digunakan untuk mencegah dan mengatasi depresi. Hasil meta-analisis bahwa internet, mobile based intervention, eHealth dapat mencegah depresi berat. Penelitian bertujuan untuk mengetahui efektivitas intervensi hipnoterapi menggunakan mobile aplikasi (HIMO) dan hipnoterapi manual (HIMA) dalam menurunkan depresi pada lansia di Kota Tasikmalaya. Metode : kuantitatif eksperimen, aksidental sampling, sampel 2 kelompok secara randomisasi manual (concealment) intervensi HIMO dan HIMA. Dua kali intervensi, Empat kali pengukuran skor depresi dengan aplikasi GDS-15, CI=95%, ÃŽÂ±=5%, ÃŽÂ²=20%, analisis univariat, bivariat (uji repeated anova/ uji friedman), multivariat (GLM-RM). Hasil : Hasil penelitian ini menunjukan bahwa sampel penelitian berjumlah 94 orang (nHIMO=47, nHIMA=47), nilai depresi baseline (HIMO Ã‚Â¯x10,30-HIMA Ã‚Â¯x9,13), nilai depresi post intervensi ke-1 (HIMO Ã‚Â¯x8,57-HIMA Ã‚Â¯x4,96), nilai depresi post intervensi ke-2 (HIMO Ã‚Â¯x4,51-HIMA Ã‚Â¯x4,15), nilai depresi pada evaluasi (HIMO Ã‚Â¯x5,34-HIMA Ã‚Â¯x4,28), nilai p pada uji GLM-RM p&lt;0,001 sehingga terdapat perbedaan yang bermakna antara HIMO dan HIMA, perbandingan efektivitas menurunkan depresi (HIMO ke-1= Ã‚Â¯x67,73 - HIMA ke-1= Ã‚Â¯x27,27, HIMO ke-2= Ã‚Â¯x51,40 - HIMA ke-2= Ã‚Â¯x43,60, HIMO ke-3= Ã‚Â¯x56.02 - HIMA= Ã‚Â¯x39,98). Variabel confounders yang berpengaruh secara bermakna terhadap depresi adalah ketaatan ibadah, support system, penyakit kronis, kepercayaan diri dan kesepian. Simpulan : HIMO lebih efektif menurunkan depresi daripada HIMA. Saran : aplikasi skrining dan hipnoterapi dapat digunakan untuk mendeteksi dan terapi depresi pada lansia.&quot;,&quot;container-title-short&quot;:&quot;&quot;},&quot;isTemporary&quot;:false},{&quot;id&quot;:&quot;0c17040a-7275-3107-91cc-f5bceb52251a&quot;,&quot;itemData&quot;:{&quot;type&quot;:&quot;article-journal&quot;,&quot;id&quot;:&quot;0c17040a-7275-3107-91cc-f5bceb52251a&quot;,&quot;title&quot;:&quot;INOVASI PENANGANAN BULLYING DI SEKOLAHBERBASIS APLIKASI DIGITAL DI ERA SOCIETY 5.0&quot;,&quot;groupId&quot;:&quot;5d3d1151-c3fb-3f7b-bcf0-db626a6f9f8b&quot;,&quot;author&quot;:[{&quot;family&quot;:&quot;Ertinawati&quot;,&quot;given&quot;:&quot;Yuni&quot;,&quot;parse-names&quot;:false,&quot;dropping-particle&quot;:&quot;&quot;,&quot;non-dropping-particle&quot;:&quot;&quot;},{&quot;family&quot;:&quot;Nurjamilah&quot;,&quot;given&quot;:&quot;Ai Siti&quot;,&quot;parse-names&quot;:false,&quot;dropping-particle&quot;:&quot;&quot;,&quot;non-dropping-particle&quot;:&quot;&quot;},{&quot;family&quot;:&quot;Rachman&quot;,&quot;given&quot;:&quot;Ichsan Fauzi&quot;,&quot;parse-names&quot;:false,&quot;dropping-particle&quot;:&quot;&quot;,&quot;non-dropping-particle&quot;:&quot;&quot;}],&quot;container-title&quot;:&quot;Jurnal PEDAMAS (Pengabdian Kepada Masyarakat)&quot;,&quot;issued&quot;:{&quot;date-parts&quot;:[[2023,11]]},&quot;page&quot;:&quot;693-701&quot;,&quot;abstract&quot;:&quot;Bullying merupakan  sebuah  hasrat  untuk  menyakiti  dalam  berbagai  bentuk tindakan,   seperti   penganiayaan   fisik,   pencemaran   nama   baik,   intimidasi,   ejekan, pengucilan sosial, dan tindakan kekerasan lainnya. KPAI mencatat, terdapat total 26.954 laporan yang masuk sepanjang September 2011 sampai dengan September 2021 kasus yang  berkaitan  dengan  bullying.  Banyak  faktor  yang  dapat  menyebabkan  terjadinya bullying  di  sekolah,  termasuk  tekanan  sosial,  ketidaksepahaman  terhadap  perbedaan, ketidakmampuan untuk mengatasi konflik,kurangnya pengawasan dari orang dewasa, dan adanya  faktor  lingkungan  yang  tidak  kondusif.  Melalui  program  Pengabdian  Masyarakat Skema Program Kemitraan Masyarakat (PbM-PKM) Universitas Siliwangi Tasikmalaya, tim pengusul bermaksud untuk mengadakan sebuah pengabdian  berupa  penyuluhan terkait penggunaan aplikasi berbasis digital yang dapat digunakan oleh peserta didik ataupun wali muird  dalam  mengatasi  kasus  bullying  yang  terjadi  di  SDN  4  Gunungsari,  Kabupaten Tasikmalaya.  Berdasarkan  data  diatas  dapat  disimpulkan  bahwa  terjadi  peningkatan pengetahuan  para  wali  murid  siswa  SDN  4  Gunungsari  tentang  pengertian,  penyebab, bentuk,   dampak,   tanda,   penanganan,   pencegahan   setelah   diberikan   penyuluhan. Peningkatan pengetahuan ini karena adanya paparan informasi melalui penyuluhan atau edukasi  kesehatan  sehingga  ada  pengetahuan  dan  pelajaran  yang  diterima  oleh  para walimurid siswa SDN 4 Gunungsari tentang bullying&quot;,&quot;issue&quot;:&quot;4&quot;,&quot;volume&quot;:&quot;1&quot;,&quot;container-title-short&quot;:&quot;&quot;},&quot;isTemporary&quot;:false},{&quot;id&quot;:&quot;a17423b4-e9a2-3607-97a3-b36069027bbd&quot;,&quot;itemData&quot;:{&quot;type&quot;:&quot;article-journal&quot;,&quot;id&quot;:&quot;a17423b4-e9a2-3607-97a3-b36069027bbd&quot;,&quot;title&quot;:&quot;Pembangunan Aplikasi Perangkat Bergerak menggunakan Autonomous Sensory Meridian Response (ASMR) untuk Terapi Penderita Insomnia (Susah Tidur)&quot;,&quot;groupId&quot;:&quot;5d3d1151-c3fb-3f7b-bcf0-db626a6f9f8b&quot;,&quot;author&quot;:[{&quot;family&quot;:&quot;Darmawan&quot;,&quot;given&quot;:&quot;Alfin Hidayat&quot;,&quot;parse-names&quot;:false,&quot;dropping-particle&quot;:&quot;&quot;,&quot;non-dropping-particle&quot;:&quot;&quot;},{&quot;family&quot;:&quot;Brata&quot;,&quot;given&quot;:&quot;Komang Candra&quot;,&quot;parse-names&quot;:false,&quot;dropping-particle&quot;:&quot;&quot;,&quot;non-dropping-particle&quot;:&quot;&quot;},{&quot;family&quot;:&quot;Brata&quot;,&quot;given&quot;:&quot;Adam Hendra&quot;,&quot;parse-names&quot;:false,&quot;dropping-particle&quot;:&quot;&quot;,&quot;non-dropping-particle&quot;:&quot;&quot;}],&quot;container-title&quot;:&quot;Jurnal Pengembangan Teknologi Informasi dan Ilmu Komputer&quot;,&quot;issued&quot;:{&quot;date-parts&quot;:[[2021,8]]},&quot;abstract&quot;:&quot;Insomnia adalah sebuah penyakityang dialami oleh penderita gangguan tidur, penyakit tersebut dapat dialami oleh setiap orang diantara umur 15 tahun hingga 64 tahun. Adapun faktor yang menyebabkan gangguan  tidur  yang  meliputi  stress,  depresi,  gaya  hidup  tidak  sehat  dan  pengaruh obat-obatan  yang dapat mengganggu kualitas hidup penderita. Penelitian ini memiliki rumusan masalah bagaimana cara untuk membantu penderita insomnia agar dapat meningkatkan kualitas hidup. Penelitian yang berjudul “Pembangunan Aplikasi Perangkat Bergerak Menggunakan Autonomous Sensory Meridian Response (ASMR) untuk Terapi Penderita Insomnia (Susah Tidur)” dilakukan dengan bertujuan untuk membantu mengatasi   masalah   insomnia   yang   dialami   penderita.   Dalam   pengembangannya   penelitian   ini menggunakan metode Personal Extreme Programming. Pada proses analisis dihasilkan satu aktor yaitu aktor  user,  untuk  kebutuhan  fungsional  didapatkan  9  kebutuhan  dan  kebutuhan  non-fungsional didapatkan  2  kebutuhan.  Tahap  perancangan  dihasilkan  9sequence  diagram.  Perancangan  algoritme didapatkan 3 algoritme dan dalam perancang antarmuka menghasilkan 8 rancangan. Aplikasi spesifik diterapkan pada bidang pemrograman Android berbasis Kotlin, untuk basis data menggunakan Room Database. Berdasarkan dari hasil pengujian, pertama diperolehdari pengujian validasi berhasil mencapai 100%  valid  karena  telah  sesuai  dengan  expected  result  yang  sudah  ditetapkan  sebelumnya.  Keduapengujian kompatibilitas mendapatkan hasil aplikasi dapat berjalan pada 6 perangkat dan tingkat API yang  berbeda.  Ketiga  pengujian  usabilitas  didapatkan  hasil  sebesar  77%  yang  menunjukkan  bahwa aplikasi yang telah dibuat mudah digunakan oleh pengguna.&quot;,&quot;issue&quot;:&quot;8&quot;,&quot;volume&quot;:&quot;5&quot;,&quot;container-title-short&quot;:&quot;&quot;},&quot;isTemporary&quot;:false},{&quot;id&quot;:&quot;3963678c-0f18-36f2-9bfb-eafcad5cacfc&quot;,&quot;itemData&quot;:{&quot;type&quot;:&quot;article-journal&quot;,&quot;id&quot;:&quot;3963678c-0f18-36f2-9bfb-eafcad5cacfc&quot;,&quot;title&quot;:&quot;Inovasi Hipnoterapi Berbasis Aplikasi&quot;,&quot;groupId&quot;:&quot;5d3d1151-c3fb-3f7b-bcf0-db626a6f9f8b&quot;,&quot;author&quot;:[{&quot;family&quot;:&quot;Wulandari&quot;,&quot;given&quot;:&quot;Sholihah Ayu&quot;,&quot;parse-names&quot;:false,&quot;dropping-particle&quot;:&quot;&quot;,&quot;non-dropping-particle&quot;:&quot;&quot;},{&quot;family&quot;:&quot;Sucipto&quot;,&quot;given&quot;:&quot;Adi&quot;,&quot;parse-names&quot;:false,&quot;dropping-particle&quot;:&quot;&quot;,&quot;non-dropping-particle&quot;:&quot;&quot;},{&quot;family&quot;:&quot;R&quot;,&quot;given&quot;:&quot;Moch. Enrique Lazuardi&quot;,&quot;parse-names&quot;:false,&quot;dropping-particle&quot;:&quot;&quot;,&quot;non-dropping-particle&quot;:&quot;&quot;},{&quot;family&quot;:&quot;Imelda&quot;,&quot;given&quot;:&quot;Jessica Desi&quot;,&quot;parse-names&quot;:false,&quot;dropping-particle&quot;:&quot;&quot;,&quot;non-dropping-particle&quot;:&quot;&quot;},{&quot;family&quot;:&quot;Rozak&quot;,&quot;given&quot;:&quot;Fatkhur&quot;,&quot;parse-names&quot;:false,&quot;dropping-particle&quot;:&quot;&quot;,&quot;non-dropping-particle&quot;:&quot;&quot;},{&quot;family&quot;:&quot;Fauzi&quot;,&quot;given&quot;:&quot;Kholid&quot;,&quot;parse-names&quot;:false,&quot;dropping-particle&quot;:&quot;&quot;,&quot;non-dropping-particle&quot;:&quot;&quot;},{&quot;family&quot;:&quot;T&quot;,&quot;given&quot;:&quot;Nabila Rahma Yusrilfa&quot;,&quot;parse-names&quot;:false,&quot;dropping-particle&quot;:&quot;&quot;,&quot;non-dropping-particle&quot;:&quot;&quot;}],&quot;container-title&quot;:&quot;Journal of Electrical Engineering and Computer&quot;,&quot;issued&quot;:{&quot;date-parts&quot;:[[2022,10]]},&quot;abstract&quot;:&quot;Dampak dari pandemi covid-19 tidak hanya mengarah pada Kesehatan fisik saja, namun juga berdampak pada kesehatan mental dari jutaan orang. Hal ini dapat berupa orang yang terpapar langsung oleh virus maupun pada orang yang tidak terpapar. Berdasarkan survei WHO (World Health Organization) di beberapa negara, permintaan akan layanan kesehatan mental meningkat selama pandemi. Mental yang terganggu dapat menyebabkan stres dan menurunnya imunitas tubuh sehingga memudahkan virus untuk menyerang. Efek ini dapat membuat kesehatan mental yang buruk, mengganggu konsentrasi, berkurangnya rasa percaya diri, kemampuan berfikir, serta kendali emosi yang pada akhirnya bisa mengarah pada perilaku buruk. Mayoritas orang dengan gangguan mental sulit menjalani aktivitas sehari-hari secara normal. Perkembangan teknologi dimanfaatkan untuk membantu masyarakat dalam memudahkan masyarakat sebagai sarana pemulihan diri dari gangguan kesehatan mental. Hasil akhir dari penelitian berupa aplikasi hipnoterapi Talk Therapy Clinic. Aplikasi ini diharapkan dapat membantu masyarakat yang memiliki gangguan kesehatan mental akibat pandemi Covid-19 dengan cara melakukan terapi mandiri tanpa dibantu oleh orang lain.&quot;,&quot;issue&quot;:&quot;2&quot;,&quot;volume&quot;:&quot;4&quot;,&quot;container-title-short&quot;:&quot;&quot;},&quot;isTemporary&quot;:false},{&quot;id&quot;:&quot;8def603c-467c-39d8-a0fb-a7aaa183d477&quot;,&quot;itemData&quot;:{&quot;type&quot;:&quot;article-journal&quot;,&quot;id&quot;:&quot;8def603c-467c-39d8-a0fb-a7aaa183d477&quot;,&quot;title&quot;:&quot;Perancangan Board Game Edukasi Menggunakan Mekanik Memory Mengenai Gejala-Gejala Depresi&quot;,&quot;groupId&quot;:&quot;5d3d1151-c3fb-3f7b-bcf0-db626a6f9f8b&quot;,&quot;author&quot;:[{&quot;family&quot;:&quot;Zuriel&quot;,&quot;given&quot;:&quot;Ivan Valiant&quot;,&quot;parse-names&quot;:false,&quot;dropping-particle&quot;:&quot;&quot;,&quot;non-dropping-particle&quot;:&quot;&quot;}],&quot;issued&quot;:{&quot;date-parts&quot;:[[2022]]},&quot;abstract&quot;:&quot;Depresi merupakan salah satu penyakit mental yang sudah lama ada di dalam masyarakat. Namun masyarakat Indonesia masih menganggap bahwa depresi merupakan masalah yang tidak nyata dan cenderung disepelekan. Edukasi mengenai depresi sendiri masih minim di Indonesia. Penelitian ini membahas tentang gejala-gejala depresi untuk mengedukasi masyarakat khususnya para remaja berumur 15 tahun ke atas dengan media board game. Tujuan dari penelitian ini adalah merancang board game sebagai media edukasi gejala-gejala depresi sehingga masyarakat bisa mengetahui depresi lebih dalam dan diharapkan mampu membantu sesama yang menderita depresi. Metode deskriptif dan strategi linear digunakan dalam penelitian ini. Dari hasil penelitian ini, didapatkan remaja lebih mengerti mengenai gejala-gejala depresi menggunakan board game D Symptoms dan dapat digunakan dalam tujuan pendidikan.&quot;,&quot;container-title-short&quot;:&quot;&quot;},&quot;isTemporary&quot;:false},{&quot;id&quot;:&quot;fe3a32d4-504f-3ac4-bc40-62c3c0c81b8e&quot;,&quot;itemData&quot;:{&quot;type&quot;:&quot;article-journal&quot;,&quot;id&quot;:&quot;fe3a32d4-504f-3ac4-bc40-62c3c0c81b8e&quot;,&quot;title&quot;:&quot;Gim Edukasi Mengenai Gangguan Mental Dengan Metodologi Putaran Permainan Dan Pembangkitan Konten Prosedural.&quot;,&quot;groupId&quot;:&quot;5d3d1151-c3fb-3f7b-bcf0-db626a6f9f8b&quot;,&quot;author&quot;:[{&quot;family&quot;:&quot;Bahtiar&quot;,&quot;given&quot;:&quot;Muhammad Ardi&quot;,&quot;parse-names&quot;:false,&quot;dropping-particle&quot;:&quot;&quot;,&quot;non-dropping-particle&quot;:&quot;&quot;}],&quot;issued&quot;:{&quot;date-parts&quot;:[[2022]]},&quot;abstract&quot;:&quot;Mental health disorders are a serious problem to be handled and complicated to understand. The symptoms are unique between individuals making the disorder difficult to diagnose in general, The cause of this disorder can come from physical or psychological events as well as the element of birth. Outreach and education to the community are essential to increase the awareness of this problem. Based on several studies showing that education and socialization through educational games has better effectiveness than seminars or conventional education. The methods and theories contained in educational games are Dynamic Difficulty Adjustment (DDA) and Procedal Content Generation (PCG). Making Procedural Content will be more effective for education about characteristic mental disorders due to which are similar to mental disorders viz, random but still limited by the available limit variables. Good game education with the Procedural Content Generation method can have effectiveness which is good for increasing public awareness of mental health problems.&quot;,&quot;container-title-short&quot;:&quot;&quot;},&quot;isTemporary&quot;:false},{&quot;id&quot;:&quot;62ecfe36-7773-3696-93d6-711e90e8f621&quot;,&quot;itemData&quot;:{&quot;type&quot;:&quot;article-journal&quot;,&quot;id&quot;:&quot;62ecfe36-7773-3696-93d6-711e90e8f621&quot;,&quot;title&quot;:&quot;Perancangan Board Game sebagai Media Pendeteksi Suicidal Thought&quot;,&quot;groupId&quot;:&quot;5d3d1151-c3fb-3f7b-bcf0-db626a6f9f8b&quot;,&quot;author&quot;:[{&quot;family&quot;:&quot;Anissa&quot;,&quot;given&quot;:&quot;Khairina Inggar&quot;,&quot;parse-names&quot;:false,&quot;dropping-particle&quot;:&quot;&quot;,&quot;non-dropping-particle&quot;:&quot;&quot;}],&quot;issued&quot;:{&quot;date-parts&quot;:[[2022,12]]},&quot;abstract&quot;:&quot;\tKasus bunuh diri meningkat dan dinyatakan sebagai salah satu penyebab utama kematian di seluruh belahan dunia, jumlah kematian akibat bunuh diri di dunia hampir mendekati 800.000 kasus, yang artinya terdapat 1 kasus kematian akibat bunuh diri dalam 40 detik. Suicidal thought adalah faktor pendorong yang tinggi terhadap terjadinya tindakan bunuh diri terutama ditemukan di kalangan dewasa muda Indonesia. Sebagian besar disebabkan oleh depresi yang berlarut sehingga dapat meningkatkan risiko seseorang ingin melakukan bunuh diri. Penelitian ini membahas tentang mendeteksi dini suicidal thought untuk dewasa muda usia 20-24 tahun menggunakan media board game. Tujuan penelitian ini adalah merancang board game sebagai media pendeteksi dini suicidal thought. Metode yang digunakan mix method pendekatan menggunakan metode deskriptif dengan strategi linear dalam penelitian ini. Hasil yang diperoleh adalah board game dan prototype sebagai media pendeteksi suicidal thought.&quot;,&quot;container-title-short&quot;:&quot;&quot;},&quot;isTemporary&quot;:false},{&quot;id&quot;:&quot;f47db0fc-df6e-370a-9aa5-054039445b6b&quot;,&quot;itemData&quot;:{&quot;type&quot;:&quot;article-journal&quot;,&quot;id&quot;:&quot;f47db0fc-df6e-370a-9aa5-054039445b6b&quot;,&quot;title&quot;:&quot;APLIKASI PENERAPAN CARA MENGHARDIK PADA NY. E DENGAN GANGGUAN PERSEPSI SENSORI : HALUSINASI PENDENGARAN DI KAMPUNG CIBITUNGKABUPATEN SUKABUMI&quot;,&quot;groupId&quot;:&quot;5d3d1151-c3fb-3f7b-bcf0-db626a6f9f8b&quot;,&quot;author&quot;:[{&quot;family&quot;:&quot;Sadiyah&quot;,&quot;given&quot;:&quot;Halimah&quot;,&quot;parse-names&quot;:false,&quot;dropping-particle&quot;:&quot;&quot;,&quot;non-dropping-particle&quot;:&quot;&quot;}],&quot;issued&quot;:{&quot;date-parts&quot;:[[2022]]},&quot;abstract&quot;:&quot;Auditory hallucinations are one of the mental disorders that occur due to the loss of an individual's ability to distinguish between what is real and what is not. This condition if left unchecked can lead to social isolation. The purpose of writing this paper is the application of how to rebuke so that patients are expected to be able to apply and carry out the planned way of controlling hallucinations. The method used in writing this paper is a case study. Data collection techniques used consisted of observation, interviews, and literature study. The client of the case of sensory perception disorder: this auditory hallucination is Mrs. E. How to rebuke done for three days in a row. When implementing how to rebuke, the author uses a question sheet, observation sheet, and activity unit. The results obtained are that the application of how to rebuke hallucinations has been successfully applied to patients with three meetings within three days because of the patient's condition which can sometimes be communicated with and sometimes seems to focus more on hallucinations such as listening to other voices that invite him to speak.&quot;,&quot;container-title-short&quot;:&quot;&quot;},&quot;isTemporary&quot;:false},{&quot;id&quot;:&quot;c617dc25-c793-3f5f-837e-b790dfb421d2&quot;,&quot;itemData&quot;:{&quot;type&quot;:&quot;article-journal&quot;,&quot;id&quot;:&quot;c617dc25-c793-3f5f-837e-b790dfb421d2&quot;,&quot;title&quot;:&quot;A Study on the Development of Meditation App for Youth Using Mindfulness Game&quot;,&quot;groupId&quot;:&quot;5d3d1151-c3fb-3f7b-bcf0-db626a6f9f8b&quot;,&quot;author&quot;:[{&quot;family&quot;:&quot;Cha Myeong-hee&quot;,&quot;given&quot;:&quot;&quot;,&quot;parse-names&quot;:false,&quot;dropping-particle&quot;:&quot;&quot;,&quot;non-dropping-particle&quot;:&quot;&quot;},{&quot;family&quot;:&quot;Lee Woo-kyung&quot;,&quot;given&quot;:&quot;&quot;,&quot;parse-names&quot;:false,&quot;dropping-particle&quot;:&quot;&quot;,&quot;non-dropping-particle&quot;:&quot;&quot;}],&quot;container-title&quot;:&quot;Jurnal Asosiasi Game Komputer Korea&quot;,&quot;issued&quot;:{&quot;date-parts&quot;:[[2023,3]]},&quot;page&quot;:&quot;9-21&quot;,&quot;abstract&quot;:&quot;Belakangan ini, remaja semakin banyak menghadapi situasi penuh stres karena berbagai faktor, yang menyebabkan meningkatnya indeks stres dan menjadikannya masalah sosial yang signifikan. Masalah kesehatan mental pada masa remaja tidak hanya terbatas pada masa itu saja, tetapi juga berdampak pada kesehatan mental saat dewasa, sehingga pentingnya isu ini semakin diakui. Khususnya, depresi pada masa remaja sangat berkaitan dengan ketidakmampuan beradaptasi dalam kehidupan keluarga dan sekolah, risiko bunuh diri, serta gangguan emosional ketika dewasa, sehingga dianggap sangat serius.\n\nDalam konteks ini, perhatian terhadap mindfulness (kesadaran penuh) meningkat tajam karena dianggap sebagai alat yang dapat digunakan secara berulang dan dapat diandalkan untuk meningkatkan kualitas hidup. Penelitian ini bertujuan untuk mengkaji penerapan konsep mindfulness dalam game komersial dan menyajikan metode penerapannya ke dalam aplikasi meditasi untuk remaja yang bernama Koala. Aplikasi meditasi ini dapat digunakan untuk mengelola rasa sakit fisik, menghadapi situasi penuh stres dengan respons yang tenang secara pribadi, dan juga sebagai kebiasaan harian yang berkelanjutan.\n\nTujuan dari penelitian ini adalah untuk menerapkan teori permainan berbasis mindfulness ke dalam aplikasi meditasi yang cenderung statis dan membosankan, agar dapat menarik minat remaja dan mendorong mereka untuk menggunakan aplikasi tersebut secara konsisten.&quot;,&quot;issue&quot;:&quot;1&quot;,&quot;volume&quot;:&quot;36&quot;,&quot;container-title-short&quot;:&quot;&quot;},&quot;isTemporary&quot;:false},{&quot;id&quot;:&quot;9c0fe9e8-9210-38ee-9ad1-2eeaa099f839&quot;,&quot;itemData&quot;:{&quot;type&quot;:&quot;article-journal&quot;,&quot;id&quot;:&quot;9c0fe9e8-9210-38ee-9ad1-2eeaa099f839&quot;,&quot;title&quot;:&quot;Interactive game for depression individual&quot;,&quot;groupId&quot;:&quot;5d3d1151-c3fb-3f7b-bcf0-db626a6f9f8b&quot;,&quot;author&quot;:[{&quot;family&quot;:&quot;Ling&quot;,&quot;given&quot;:&quot;Kelven Kian Hau&quot;,&quot;parse-names&quot;:false,&quot;dropping-particle&quot;:&quot;&quot;,&quot;non-dropping-particle&quot;:&quot;&quot;}],&quot;issued&quot;:{&quot;date-parts&quot;:[[2022,1]]},&quot;abstract&quot;:&quot;This project is an interactive game for depression individual project for entertainment purposes. This project aims to enhance social acknowledgement and help depression individuals with depression through a game. Game is widely known for a large population of people. It can help spread the concept and knowledge about depression faster than any other media and in a fun way. In this project, agile methodology has been used in the process. As the game development process will have high uncertainty, agile methodology can play its role nicely during the development process in changing some of the design and requirements. Games with similar functionality and background have been reviewed in strengthen and improve the development and design of the game. This project will be developed using Unity 3D, a free license game engine. The game is a story-based game that delivers information and emotion through storytelling and helps depressed individuals face negative emotions more easily.&quot;,&quot;container-title-short&quot;:&quot;&quot;},&quot;isTemporary&quot;:false},{&quot;id&quot;:&quot;512b50a0-c060-3704-994e-d42395d31cbf&quot;,&quot;itemData&quot;:{&quot;type&quot;:&quot;thesis&quot;,&quot;id&quot;:&quot;512b50a0-c060-3704-994e-d42395d31cbf&quot;,&quot;title&quot;:&quot;Edukasi dan Skrining Kesehatan Jiwa Remaja dengan Aplikasi&quot;,&quot;groupId&quot;:&quot;5d3d1151-c3fb-3f7b-bcf0-db626a6f9f8b&quot;,&quot;author&quot;:[{&quot;family&quot;:&quot;Endriyani&quot;,&quot;given&quot;:&quot;Sri&quot;,&quot;parse-names&quot;:false,&quot;dropping-particle&quot;:&quot;&quot;,&quot;non-dropping-particle&quot;:&quot;&quot;},{&quot;family&quot;:&quot;Martini&quot;,&quot;given&quot;:&quot;Sri&quot;,&quot;parse-names&quot;:false,&quot;dropping-particle&quot;:&quot;&quot;,&quot;non-dropping-particle&quot;:&quot;&quot;},{&quot;family&quot;:&quot;Pastari&quot;,&quot;given&quot;:&quot;Marta&quot;,&quot;parse-names&quot;:false,&quot;dropping-particle&quot;:&quot;&quot;,&quot;non-dropping-particle&quot;:&quot;&quot;}],&quot;container-title&quot;:&quot;Madaniya&quot;,&quot;accessed&quot;:{&quot;date-parts&quot;:[[2025,5,14]]},&quot;DOI&quot;:&quot;10.53696/27214834.687&quot;,&quot;ISSN&quot;:&quot;2721-4834&quot;,&quot;URL&quot;:&quot;https://www.madaniya.biz.id/journals/contents/article/view/687/505&quot;,&quot;issued&quot;:{&quot;date-parts&quot;:[[2024,2,26]]},&quot;number-of-pages&quot;:&quot;192-198&quot;,&quot;abstract&quot;:&quot;&lt;p&gt;Kesehatan jiwa merupakan aspek penting bagi remaja dalam mencapai perkembangan yang optimal di masa remaja. Kegiatan edukasi dan skiring kesehatan jiwa bagi remaja dilaksanakan dengan tujuan meningkatkan pengetahuan remaja tentang kesehatan jiwa dan mengurangi risiko gangguan jiwa dengan mendeteksi masalah kesehatan mental dan emosional sejak dini. Program pengabdian masyarakat ini dilakukan melalui penyuluhan dan pemeriksaan kesehatan jiwa dengan menggunakan aplikasi skrining kesehtan jiwa DeAS Care. Kegiatan diikuti oleh 20 remaja di kota Palembang. Setelah diberikan penyuluhan remaja mengetahui tentang sehat jiwa dan tehnik yang dapat dilakukan bagi remaja yang beresiko mengalami masalah gangguan mental emosinal. Setelah dilakukan skrining kesehatan jiwa diketahui bahwa sebagian remaja sebanyak 9 orang (45%) mengalami depresi, 15 orang (75%) mengalami ansietas dan 6 orang (30%) mengalami stress dari tingkat ringan hingga parah. Hendaknya pihak terkait dapat melakukan pendampingan sebagai menjaga kesehatan jiwa dalam kelompok remaja sehat jiwa atau kader remaja sehat jiwa di lingkungan sekolah dan masyarakat.&lt;/p&gt;&quot;,&quot;issue&quot;:&quot;1&quot;,&quot;volume&quot;:&quot;5&quot;,&quot;container-title-short&quot;:&quot;&quot;},&quot;isTemporary&quot;:false},{&quot;id&quot;:&quot;3d1729d9-48c3-3d92-8b78-2e700b6e7555&quot;,&quot;itemData&quot;:{&quot;type&quot;:&quot;thesis&quot;,&quot;id&quot;:&quot;3d1729d9-48c3-3d92-8b78-2e700b6e7555&quot;,&quot;title&quot;:&quot;Pengembangan Aplikasi Edukasi Kesehatan Mental Berbasis Progressive Web App&quot;,&quot;groupId&quot;:&quot;5d3d1151-c3fb-3f7b-bcf0-db626a6f9f8b&quot;,&quot;author&quot;:[{&quot;family&quot;:&quot;Hafidz&quot;,&quot;given&quot;:&quot;Hafidz&quot;,&quot;parse-names&quot;:false,&quot;dropping-particle&quot;:&quot;&quot;,&quot;non-dropping-particle&quot;:&quot;&quot;},{&quot;family&quot;:&quot;Fais Al Huda&quot;,&quot;given&quot;:&quot;&quot;,&quot;parse-names&quot;:false,&quot;dropping-particle&quot;:&quot;&quot;,&quot;non-dropping-particle&quot;:&quot;&quot;},{&quot;family&quot;:&quot;Agi Putra Kharisma&quot;,&quot;given&quot;:&quot;&quot;,&quot;parse-names&quot;:false,&quot;dropping-particle&quot;:&quot;&quot;,&quot;non-dropping-particle&quot;:&quot;&quot;}],&quot;container-title&quot;:&quot;Jurnal Pengembangan Teknologi Informasi dan Ilmu Komputer&quot;,&quot;URL&quot;:&quot;https://j-ptiik.ub.ac.id/index.php/j-ptiik/article/view/14034&quot;,&quot;issued&quot;:{&quot;date-parts&quot;:[[2024,8,5]]},&quot;abstract&quot;:&quot;&amp;lt;p&amp;gt;Kesehatan mental mengacu pada keadaan jiwa dan psikologis seseorang yang menunjukkan kemampuan mereka untuk beradaptasi dan menyelesaikan masalah, baik yang berasal dari dalam diri maupun dari lingkungan eksternal. Pada kisaran usia remaja, yaitu antara 15 hingga 24 tahun, terdapat sekitar 6,2% individu yang mengalami depresi. Depresi yang berat dapat meningkatkan risiko perilaku menyakiti diri sendiri, termasuk bunuh diri, dengan sekitar 80 hingga 90% kasus bunuh diri terkait dengan depresi dan kecemasan. Penting untuk memberikan edukasi tentang kesehatan mental sebagai langkah preventif untuk mencegah masalah kesehatan mental dan dampak yang mungkin timbul. Salah satu penyebab masalah kesehatan mental yang banyak terjadi adalah kurangnya pemahaman dan pengetahuan mengenai hal tersebut. Berdasarkan survei yang peneliti lakukan sekitar 95.7% responden merasa perlu lebih banyak informasi atau pendidikan tentang kesehatan mental. Edukasi memiliki peran penting karena membantu kita mengetahui cara mengatasi dan mencegah masalah kesehatan mental. Untuk mencapai hal tersebut, diperlukan keinginan untuk belajar dan mencari informasi yang luas tentang kesehatan mental. Aplikasi edukasi kesehatan mental yang dinamakan &amp;quot;MentalCare&amp;quot; dikembangkan dalam penelitian ini menggunakan metode &amp;lt;em&amp;gt;SDLC Prototype&amp;lt;/em&amp;gt;. Aplikasi ini menawarkan materi pembelajaran dan kuis untuk membantu mahasiswa dan remaja memahami materi kesehatan mental. Selain itu, tersedia fitur konsultasi pribadi dengan psikolog terkait edukasi kesehatan mental. Aplikasi ini berupa &amp;lt;em&amp;gt;progressive web app&amp;lt;/em&amp;gt; yang memungkinkan pengguna mengaksesnya seperti aplikasi &amp;lt;em&amp;gt;native&amp;lt;/em&amp;gt;. Ada tiga jenis pengujian yang dilakukan pengujian &amp;lt;em&amp;gt;blackbox&amp;lt;/em&amp;gt;, usabilitas, dan dampak penggunaan aplikasi terhadap pengetahuan pengguna. Pada pengujian &amp;lt;em&amp;gt;blackbox&amp;lt;/em&amp;gt;, hasilnya menunjukkan 100% valid untuk semua kebutuhan fungsional. Hasil pengujian SUS untuk psikolog menunjukkan skor 87.5 dan pengguna mendapatkan skor 85.75 yang masing-masing termasuk dalam kategori yang sangat baik. Berdasarkan pengujian dampak penggunaan aplikasi terhadap pengetahuan pengguna, aplikasi MentalCare terbukti meningkatkan pengetahuan kesehatan mental para pengguna.&amp;lt;/p&amp;gt;&quot;,&quot;issue&quot;:&quot;8&quot;,&quot;volume&quot;:&quot;8&quot;,&quot;container-title-short&quot;:&quot;&quot;},&quot;isTemporary&quot;:false},{&quot;id&quot;:&quot;f5763792-8f0c-39c9-b2e0-cf0efaa4f14f&quot;,&quot;itemData&quot;:{&quot;type&quot;:&quot;thesis&quot;,&quot;id&quot;:&quot;f5763792-8f0c-39c9-b2e0-cf0efaa4f14f&quot;,&quot;title&quot;:&quot;KEJADIAN DEPRESI PADA REMAJA MENURUT DUKUNGAN SOSIAL DI KABUPATEN JEMBER&quot;,&quot;groupId&quot;:&quot;5d3d1151-c3fb-3f7b-bcf0-db626a6f9f8b&quot;,&quot;author&quot;:[{&quot;family&quot;:&quot;Bintang&quot;,&quot;given&quot;:&quot;Adi Zayd&quot;,&quot;parse-names&quot;:false,&quot;dropping-particle&quot;:&quot;&quot;,&quot;non-dropping-particle&quot;:&quot;&quot;},{&quot;family&quot;:&quot;Mandagi&quot;,&quot;given&quot;:&quot;Ayik Mirayanti&quot;,&quot;parse-names&quot;:false,&quot;dropping-particle&quot;:&quot;&quot;,&quot;non-dropping-particle&quot;:&quot;&quot;}],&quot;container-title&quot;:&quot;Journal of Community Mental Health and Public Policy&quot;,&quot;accessed&quot;:{&quot;date-parts&quot;:[[2025,5,14]]},&quot;DOI&quot;:&quot;10.51602/cmhp.v3i2.55&quot;,&quot;ISSN&quot;:&quot;2622-2655&quot;,&quot;URL&quot;:&quot;https://cmhp.lenterakaji.org/index.php/cmhp/article/view/55&quot;,&quot;issued&quot;:{&quot;date-parts&quot;:[[2021,4,28]]},&quot;number-of-pages&quot;:&quot;92-101&quot;,&quot;abstract&quot;:&quot;&lt;p&gt;ABSTRACTDepression is a mental health problem that mostly occurs during adolescence. Physical, cognitive and emotional changes experienced during adolescence can cause stress. The prevalence of depression in adolescence has a very high increase compared to the age of children and adults. The main factor in being able to cure depression in adolescents is social support (Depkes, 2007). This study aims to identify depressive symptoms in adolescents and to find out the relationship between social support factors and depression incidence. This research is a quantitative research, with the type of observational analytic research with a cross sectional approach involving students at SMA XY in Jember Regency in May 2020. The analytical method uses the Chi Square test to see the relationship between independent and dependent variables with a significance level of α ≤ 0, 05. Data collection tool using google form. Determination of respondents by random sampling with a total of 158 respondents. The results of this study indicate that the distribution of women is 76.58% more than that of men. Based on the distribution of social support, 56.96% received good social support, while based on the incidence of depression, 54.43% did not experience depression. From the statistical test, the significance value of &amp;lt;0.05 indicates that there is a relationship between social support factors and the incidence of depression. Social support plays an effective role in overcoming depression experienced by adolescents.Keywords: Depression, Teens, social support.&amp;#13; ABSTRAKDepresi merupakan salah satu masalah kesehatan mental yang sebagian besar terjadi pada masa remaja. Perubahan fisik, kognitif dan emosional yang dialami pada masa remaja dapat menimbulkan stress. Prevalensi depresi pada usia remaja memiliki peningkatan yang sangat tinggi dibandingkan dengan usia anak-anak dan usia dewasa. Faktor utama untuk dapat menyembuhkan depresi pada remaja yaitu dukungan sosial (Depkes, 2007). Penelitian bertujuan untuk mengidentifikasi gejala depresi pada remaja dan mengetahui mengenai Hubungan Faktor Dukungan Sosial dengan Kejadian Depresi. Penelitian ini adalah penelitian kuantitatif, dengan jenis penelitian analitik observasional dengan pendekatan cross sectional yang melibatkan siswa di SMA XY di Kabupaten Jember pada Bulan Mei tahun 2020. Metode analisis menggunakan uji Chi Square untuk melihat hubungan variabel independen dan dependen dengan tingkat kemaknaan α ≤ 0,05. Alat pengumpulan data menggunakan google form. Penentuan responden secara random sampling dengan jumlah 158 reponden. Hasil penelitian ini menunjukan distribusi perempuan 76,58% lebih banyak daripada laki-laki, berdasarkan distribusi dukungan sosial sebesar 56,96% mendapatkan dukungan sosial yang baik, sedangkan berdasarkan kejadian depresi sebesar 54,43% tidak mengalami depresi. Dari uji statistik nilai signifikansi sebesar &amp;lt; 0,05 menunjukkan bahwa ada hubungan antara faktor dukungan sosial dengan kejadian depresi. Dukungan sosial berperan efektif dalam mengatasi depresi yang dialami remaja.Kata Kunci: Depresi, Remaja, Dukungan Sosial.&lt;/p&gt;&quot;,&quot;issue&quot;:&quot;2&quot;,&quot;volume&quot;:&quot;3&quot;,&quot;container-title-short&quot;:&quot;&quot;},&quot;isTemporary&quot;:false},{&quot;id&quot;:&quot;9d30ec19-a798-37b7-b5a7-c2aaa94e848f&quot;,&quot;itemData&quot;:{&quot;type&quot;:&quot;thesis&quot;,&quot;id&quot;:&quot;9d30ec19-a798-37b7-b5a7-c2aaa94e848f&quot;,&quot;title&quot;:&quot;Perancangan User Experience Aplikasi MobileOnline Therapy untuk Mengatasi Depresi bagi Remaja menggunakan Metode Human-Centered Design&quot;,&quot;groupId&quot;:&quot;5d3d1151-c3fb-3f7b-bcf0-db626a6f9f8b&quot;,&quot;author&quot;:[{&quot;family&quot;:&quot;Gandhi&quot;,&quot;given&quot;:&quot;Lalu&quot;,&quot;parse-names&quot;:false,&quot;dropping-particle&quot;:&quot;&quot;,&quot;non-dropping-particle&quot;:&quot;&quot;},{&quot;family&quot;:&quot;Sianturi&quot;,&quot;given&quot;:&quot;Riswan&quot;,&quot;parse-names&quot;:false,&quot;dropping-particle&quot;:&quot;&quot;,&quot;non-dropping-particle&quot;:&quot;&quot;},{&quot;family&quot;:&quot;Kharisma&quot;,&quot;given&quot;:&quot;Agi&quot;,&quot;parse-names&quot;:false,&quot;dropping-particle&quot;:&quot;&quot;,&quot;non-dropping-particle&quot;:&quot;&quot;}],&quot;container-title&quot;:&quot;Jurnal Pengembangan Teknologi Informasi dan Ilmu Komputer&quot;,&quot;accessed&quot;:{&quot;date-parts&quot;:[[2025,5,14]]},&quot;URL&quot;:&quot;https://j-ptiik.ub.ac.id/index.php/j-ptiik/article/view/11297/4987&quot;,&quot;issued&quot;:{&quot;date-parts&quot;:[[2022,7]]},&quot;number-of-pages&quot;:&quot;3161-3171&quot;,&quot;abstract&quot;:&quot;Setiap individu pasti memiliki masalah yang harus dihadapi, baik secara fisik maupun mental. Data dari WorldHealthOrganizationpada  tahun  2014,  menunjukkan  bahwa  depresi  adalah  penyebabglobal utama  penyakit  dan  kecacatan  bagi  remaja,  dengan  bunuh  diri  sebagai  penyebab  kematian  terbesar ketiga dibelakang cedera lalu lintas jalan, dan HIV/AIDS. Dari data Riset Kesehatan Dasar (Riskesdas) pada  tahun  2018,  didapatkan  prevalensi  gangguan  kesehatan  mental  dengan  usia  15  tahun  ke  atas mencapai  sekitar  6,1%  dari  jumlah  penduduk  Indonesia  atau  setara  dengan  11  juta  orang.  Dari  suatu penelitian yang dilakukan dengan remaja dengan rentang usia 15-24 tahun memiliki persentase depresi sebesar  6,2%,  dan  depresi  berat  akan  mengalami  kecenderungan  untuk  menyakiti  diri  sendiri  hingga bunuh diri. Dari permasalahan tersebut, terdapat sebuah solusi yang ditawarkan, yaitu melakukan onlinetherapy. OnlineTherapybertujuan untuk membantu para penderita depresiagar dapat menyembuhkan depresi mereka dengan penanganan yang tepat melalui layanan onlinetherapy. Metode ini dikhususkan untuk  penyembuhan  kesehatan  mental,  di  mana  seorang  terapis  memberikan  saran  dan  dukungan psikologis  melalui  internet.  Pada perancangan  ini, peneliti  menggunakan  metode pendekatan Human-CenteredDesignagar dapat menciptakan rancangan aplikasi sesuai dengan kebutuhan pengguna. Hasil akhir dari penelitian ini berupa high-fidelityprototypedengan nilai usabilityyang baik. Tiga aspek nilai usabilityyang  didapatkan  diantaranya  adalah  aspek  efektivitas  dari  sisi  pengguna  mendapatkan  nilai sebesar 88%, dan dari sisi psikolog mendapatkan nilai sebesar 84%. Aspek efisiensi menggunakan timebasedefficiencydari  sisi  pengguna  medapatkan  nilaisebesar  0,103 goals/sec,  dan  dari  sisi  psikolog mendapatkan nilai sebesar 0,077 goals/sec. Dan aspek kepuasan dengan menggunakan kuesioner SUS dari sisi pengguna dan sisi psikolog mendapatkan nilai sebesar 80,5 dengan gradeA-, adjectivegood, dan acceptable.&quot;,&quot;issue&quot;:&quot;1&quot;,&quot;volume&quot;:&quot;3&quot;,&quot;container-title-short&quot;:&quot;&quot;},&quot;isTemporary&quot;:false},{&quot;id&quot;:&quot;44d66467-f4a6-3b56-bb38-df24f21ffaed&quot;,&quot;itemData&quot;:{&quot;type&quot;:&quot;thesis&quot;,&quot;id&quot;:&quot;44d66467-f4a6-3b56-bb38-df24f21ffaed&quot;,&quot;title&quot;:&quot;PERANCANGAN PROTOTYPE GAME INTERAKTIF ADVENTURE PENGETAHUAN UMUM ANAK USIA 16-18 TAHUN SEBAGAI UPAYA MENJAGA KESEHATAN MENTAL&quot;,&quot;groupId&quot;:&quot;5d3d1151-c3fb-3f7b-bcf0-db626a6f9f8b&quot;,&quot;author&quot;:[{&quot;family&quot;:&quot;Wicaksono&quot;,&quot;given&quot;:&quot;Satrio&quot;,&quot;parse-names&quot;:false,&quot;dropping-particle&quot;:&quot;&quot;,&quot;non-dropping-particle&quot;:&quot;&quot;}],&quot;accessed&quot;:{&quot;date-parts&quot;:[[2025,5,14]]},&quot;URL&quot;:&quot;https://repository.dinamika.ac.id/id/eprint/7019/&quot;,&quot;issued&quot;:{&quot;date-parts&quot;:[[2023,2,17]]},&quot;abstract&quot;:&quot;Pandemi membawa perubahan pada tatanan pendidikan di Indonesia. Perubahan dengan sistem pembelajaran menjadi online akibat berdampak stres pada anak sekolah dasar. Hal ini berdampak menurunnya kualitas anak dalam belajar, harapan yang dituju dalam pembuatan game edukasi bisa memberikan dampak pada anak meningkatkan integritas dalam belajar agar peningkatan pendidikan di indonesia bisa memenuhi tingkat kepintaran anak bangsa Indonesia dengan melakukan metode observasi, wawancara, literature yang dilakukan didaerah Kota Surabaya disalah satu sekolah menengah atas sebagai data yang diperlukan, dan membuahkan hasil yakni analisa data yang akan membantu dalam pembuatan game edukasi agar mencapai target yang ditentukan susuai dengan hasil penelitian ini. tidak luput juga adanya makna yang diberikan kepada pelajar dari cara bermainnya maupun alur cerita yang didapat agar para pemain bisa mendapat hikmat dan merenungkan dalam kejadian permainan tersebut. Dan harapan yang dapat dituju remaja Indonesia tidak tertinggal pembelajaran sekolah dengan adanya game ini yang membuat meningkatnya akademik remaja dalam belaja dan menghilangkan rasa malas terhadap materi materi pembelajaran disekolah.&quot;,&quot;publisher&quot;:&quot;Universitas Dinamika&quot;,&quot;container-title-short&quot;:&quot;&quot;},&quot;isTemporary&quot;:false},{&quot;id&quot;:&quot;37347569-70a5-3b06-841a-db6d409b23df&quot;,&quot;itemData&quot;:{&quot;type&quot;:&quot;article-journal&quot;,&quot;id&quot;:&quot;37347569-70a5-3b06-841a-db6d409b23df&quot;,&quot;title&quot;:&quot;Deteksi Gangguan Depresi Menggunakan Machine Learning: Tinjauan Pustaka&quot;,&quot;groupId&quot;:&quot;5d3d1151-c3fb-3f7b-bcf0-db626a6f9f8b&quot;,&quot;author&quot;:[{&quot;family&quot;:&quot;Dina&quot;,&quot;given&quot;:&quot;Dinda&quot;,&quot;parse-names&quot;:false,&quot;dropping-particle&quot;:&quot;&quot;,&quot;non-dropping-particle&quot;:&quot;&quot;},{&quot;family&quot;:&quot;Haryanti&quot;,&quot;given&quot;:&quot;Tining&quot;,&quot;parse-names&quot;:false,&quot;dropping-particle&quot;:&quot;&quot;,&quot;non-dropping-particle&quot;:&quot;&quot;},{&quot;family&quot;:&quot;Haq&quot;,&quot;given&quot;:&quot;Muhammad&quot;,&quot;parse-names&quot;:false,&quot;dropping-particle&quot;:&quot;&quot;,&quot;non-dropping-particle&quot;:&quot;&quot;}],&quot;container-title&quot;:&quot;Seminar Nasional Teknik Elektro, Sistem Informasi, dan Teknik Informatika&quot;,&quot;accessed&quot;:{&quot;date-parts&quot;:[[2025,5,14]]},&quot;URL&quot;:&quot;https://ejournal.itats.ac.id/snestik/article/view/5876&quot;,&quot;issued&quot;:{&quot;date-parts&quot;:[[2024,4,27]]},&quot;abstract&quot;:&quot;Gangguan depresi adalah suatu kondisi seseorang merasa sedih, kecewa saat mengalami suatu perubahan, kehilangan ketika terjadi patologis tidak dapat beradaptasi dengan sekitar. Menurut World Health Organization depresi merupakan penyakit yang dialami oleh sekitar 264 juta orang. Mahasiswa adalah kelompok yang  sangat rentan terhadap berbagai gangguan mental yang dipengaruhi berbagi lingkup kehidupan. Gangguan depresi akhir-akhir ini sangat menjadi perhatian khusus karena memiliki kecenderungan menyakiti diri sendiri ( self harm ). Metode yang digunakan dalam penelitian ini adalah menggunakan studi literature review dengan menggunakan 3 database yaitu Google Scholar, PubMed dan Neliti yang dipublikasi dalam rentang tahun 2021 sampai 2024 dan di dapatkan hasil 19.696 artikel. Dari 19.696 artikel kemudia di lakukan alanisa lebih dalam dengan menghasilkan 573 artikel, dimana seluruh metode memiliki nilai keakurasian 80%, namun ada satu metode yaitu certainly factor banyak digunakan dan memiliki keakurasian diatas 90% dengan menggunakan random sample.\n&quot;,&quot;container-title-short&quot;:&quot;&quot;},&quot;isTemporary&quot;:false},{&quot;id&quot;:&quot;d2420370-842e-30d3-8157-4c970f003751&quot;,&quot;itemData&quot;:{&quot;type&quot;:&quot;article-journal&quot;,&quot;id&quot;:&quot;d2420370-842e-30d3-8157-4c970f003751&quot;,&quot;title&quot;:&quot;Perancangan Aplikasi Sistem Pakar Diagnosa Depresi Pada Mahasiswa Menggunakan Metode Certainty Factor Berbasis Web&quot;,&quot;groupId&quot;:&quot;5d3d1151-c3fb-3f7b-bcf0-db626a6f9f8b&quot;,&quot;author&quot;:[{&quot;family&quot;:&quot;Lutfiah&quot;,&quot;given&quot;:&quot;Ratri Nanda&quot;,&quot;parse-names&quot;:false,&quot;dropping-particle&quot;:&quot;&quot;,&quot;non-dropping-particle&quot;:&quot;&quot;},{&quot;family&quot;:&quot;Widaningsih&quot;,&quot;given&quot;:&quot;Sri&quot;,&quot;parse-names&quot;:false,&quot;dropping-particle&quot;:&quot;&quot;,&quot;non-dropping-particle&quot;:&quot;&quot;},{&quot;family&quot;:&quot;Suheri&quot;,&quot;given&quot;:&quot;Agus&quot;,&quot;parse-names&quot;:false,&quot;dropping-particle&quot;:&quot;&quot;,&quot;non-dropping-particle&quot;:&quot;&quot;}],&quot;container-title&quot;:&quot;PROSIDING SEMINAR NASIONAL TEKNIK UNIVERSITAS SURYAKANCANA&quot;,&quot;accessed&quot;:{&quot;date-parts&quot;:[[2025,5,14]]},&quot;URL&quot;:&quot;https://jurnal.unsur.ac.id/semnastekunsur/article/view/3432&quot;,&quot;issued&quot;:{&quot;date-parts&quot;:[[2023]]},&quot;page&quot;:&quot;42-50&quot;,&quot;abstract&quot;:&quot;Depresi merupakan salah satu gangguan mental yang dapat mempengaruhi kesehatan fisik serta mengakibatkakan perubahan perilaku dan mengurangi produktivitas. Depresi pada mahasiswa dapat mempengaruhi nilai akademik. Banyak penderita depresi yang enggan konsultasi ke psikolog karena biaya yang tidak murah. Untuk mengatasi permasalahan tersebut, pada penelitian ini dibuat suatu sistem pakar untuk mendiagnosa depresi pada mahasiswa. Sistem pakar yang dibuat menggunakan metode certainty factor (CF) untuk mengatasi ketidakpastian yang timbul dari aturan maupun jawaban yang diberikan pengguna pada saat menggunakan sistem untuk berkonsultasi. Sistem pakar ini dibuat menggunakan tahapan rekayasa perangkat lunak waterfall. Sistem pakar ini berbasis web dengan Bahasa pemrograman PHP dan framework Laravel untuk mempermudah sesi konsultasi sehingga tidak terbatas oleh waktu dan tempat. Menu utama dari sistem pakar ini terdiri dari halaman jenis depresi, gejala-gejala depresi, aturan-aturan yang terbentuk, sesi konsultasi dan halaman hasil konsultasi. Selain itu ditampilkan juga tips dan maupun informasi seputar depresi. Sistem ini mampu membantu memberikan alternatif pengambilan keputusan yang memiliki tingkat performa sebanding dengan seorang psikolog dengan menggunakan metode certainty factor yaitu mengumpulkan seluruh data agar mendapatkan hasil diagnosa.&quot;,&quot;volume&quot;:&quot;1&quot;,&quot;container-title-short&quot;:&quot;&quot;},&quot;isTemporary&quot;:false},{&quot;id&quot;:&quot;4fb08514-59bd-37e6-a167-f94f15150c72&quot;,&quot;itemData&quot;:{&quot;type&quot;:&quot;thesis&quot;,&quot;id&quot;:&quot;4fb08514-59bd-37e6-a167-f94f15150c72&quot;,&quot;title&quot;:&quot;Efektivitas Aplikasi Web \&quot;Kancani\&quot; Berbasis Rational-Emotive Behavior Therapy terhadap Tingkat Depresi dan Kecemasan Remaja SMP&quot;,&quot;groupId&quot;:&quot;5d3d1151-c3fb-3f7b-bcf0-db626a6f9f8b&quot;,&quot;author&quot;:[{&quot;family&quot;:&quot;Faiha&quot;,&quot;given&quot;:&quot;Khansa Zaizafun&quot;,&quot;parse-names&quot;:false,&quot;dropping-particle&quot;:&quot;&quot;,&quot;non-dropping-particle&quot;:&quot;&quot;}],&quot;accessed&quot;:{&quot;date-parts&quot;:[[2025,5,14]]},&quot;URL&quot;:&quot;https://digilib.uns.ac.id/dokumen/detail/112189/&quot;,&quot;issued&quot;:{&quot;date-parts&quot;:[[2024]]},&quot;abstract&quot;:&quot;Masa remaja menjadi salah satu periode perkembangan yang mendorong banyaknya perubahan pada sisi internal maupun eksternal sehingga menjadikan remaja rentan mengalami gangguan mental. Kecemasan dan depresi menjadi gangguan mental yang banyak dialami oleh remaja Indonesia. Banyak kasus kesehatan mental remaja bersumber dari kepercayaan salah dan irasional yang diyakininya, sehingga peningkatan kemampuan menghadapi pikiran irasional menjadi penting. Aplikasi web “Kancani” yang berbasis REBT menjadi salah satu sarana untuk memberikan pemahaman mengenai kemampuan sosial emosional yang dibutuhkan. Oleh karena itu, penelitian ini bertujuan untuk menguji efektivitas aplikasi web “Kancani” yang berbasis REBT terhadap tingkat depresi dan kecemasan pada remaja. Penelitian ini menggunakan desain eksperimen quasi one group pretest-posttest dengan 22 subjek remaja SMP berusia 12-15 tahun yang menerima intervensi selama 2 minggu. Depression Anxiety Stress Scale (DASS) 42 dipilih untuk mengukur tingkat depresi dan kecemasan remaja. Paired sample t-test dilakukan untuk membandingkan tingkat depresi dan kecemasan remaja SMP sebelum dan setelah mendapatkan intervensi berbasis REBT melalui aplikasi web “Kancani”. Terdapat perbedaan signifikan dalam skor tingkat depresi sebelum (M=11.18, SD=6.4) dan setelah diberikan intervensi (M=9.41, SD=5.5); t(21)=3.16, p=0.005. Pada variabel kecemasan, tidak ditemukan perbedaan signifikan dalam skor sebelum (M=14.41, SD=7.7) dan setelah diberikan intervensi (M=13.18, SD=7.6); t(21)=1.9, p=0.071. Hasil ini menunjukkan bahwa pemberian intervensi berbasis REBT dalam aplikasi web “Kancani” terbukti signifikan dalam mengurangi tingkat depresi remaja SMP, namun tidak secara signifikan dalam mengurangi tingkat kecemasannya.&quot;,&quot;publisher&quot;:&quot;Universitas Sebelas Maret&quot;,&quot;container-title-short&quot;:&quot;&quot;},&quot;isTemporary&quot;:false},{&quot;id&quot;:&quot;d52e4ce5-b5ab-3f52-8b9f-4ecbaa28ae2b&quot;,&quot;itemData&quot;:{&quot;type&quot;:&quot;article-journal&quot;,&quot;id&quot;:&quot;d52e4ce5-b5ab-3f52-8b9f-4ecbaa28ae2b&quot;,&quot;title&quot;:&quot;Sistem Pakar Diagnosa Tingkat Depresi pada Remaja Di Kota Kupang menggunakan Metode Forward Chaining Authors&quot;,&quot;groupId&quot;:&quot;5d3d1151-c3fb-3f7b-bcf0-db626a6f9f8b&quot;,&quot;author&quot;:[{&quot;family&quot;:&quot;Lao&quot;,&quot;given&quot;:&quot;Juliet Reinita Angelia&quot;,&quot;parse-names&quot;:false,&quot;dropping-particle&quot;:&quot;&quot;,&quot;non-dropping-particle&quot;:&quot;&quot;},{&quot;family&quot;:&quot;Mola&quot;,&quot;given&quot;:&quot;Sebastianus Adi Santoso&quot;,&quot;parse-names&quot;:false,&quot;dropping-particle&quot;:&quot;&quot;,&quot;non-dropping-particle&quot;:&quot;&quot;},{&quot;family&quot;:&quot;Prasetyo&quot;,&quot;given&quot;:&quot;Dwi&quot;,&quot;parse-names&quot;:false,&quot;dropping-particle&quot;:&quot;&quot;,&quot;non-dropping-particle&quot;:&quot;&quot;}],&quot;container-title&quot;:&quot;Inovatif Wira Wacana&quot;,&quot;accessed&quot;:{&quot;date-parts&quot;:[[2025,5,14]]},&quot;URL&quot;:&quot;https://www.ojs.unkriswina.ac.id/index.php/inovatif/article/view/290&quot;,&quot;issued&quot;:{&quot;date-parts&quot;:[[2023]]},&quot;page&quot;:&quot;29-36&quot;,&quot;abstract&quot;:&quot;Depresi merupakan sebuah gangguan mental yang saat ini menjadi salah satu penyakit yang menduduki peringkat ketiga beban penyakit dalam skala global. Depresi dapat berdampak pada produktivitas penderitanya karena gejala-gejala yang dialami. Namun seringkali orang-orang dengan gangguan depresi ini tidak menyadari bahwa dirinya mengalami depresi. Untuk mengetahui seseorang mengalami gangguan depresi biasanya dilakukan konsultasi dengan psikolog atau psikiater yang sudah pakar pada bidangnya, namun sayangnya saat ini di Indonesia jumlah para profesional tidak sebanding dengan jumlah orang orang penderita depresi. Maka dari itu perlu dibuatnya sebuah sistem pakar yang dapat bertindak layaknya pakar dan dapat membantu orang-orang untuk mengetahui tingkat depresi mereka serta solusi yang harus mereka lakukan. Sistem berbasis web ini menggunakan metode Forward Chaining dengan 21 pertanyaan, 84 gejala berdasarkan Instrumen Beck Depression Inventory, 4 tingkat depresi dan data penelitian dari hasil pengisian form oleh 398 remaja yang tersebar di wilayah kota Kupang. Hasil pengujian akurasi sistem dari 398 data adalah 100% dengan hasil menyatakan bahwa 156 orang (39,2 %) berada pada kondisi normal, 85 orang (21,4 %) berada pada kondisi depresi tingkat ringan, 108 orang (27,1 %) berada pada kondisi depresi tingkat sedang, dan 49 orang (12,3 %) berada dalam kondisi depresi tingkat berat. &quot;,&quot;volume&quot;:&quot;2&quot;,&quot;container-title-short&quot;:&quot;&quot;},&quot;isTemporary&quot;:false},{&quot;id&quot;:&quot;844bf00a-bcaf-33c1-bdb1-0edfbb65b73c&quot;,&quot;itemData&quot;:{&quot;type&quot;:&quot;article-journal&quot;,&quot;id&quot;:&quot;844bf00a-bcaf-33c1-bdb1-0edfbb65b73c&quot;,&quot;title&quot;:&quot;Pengembangan Aplikasi Perangkat Bergerak Pemeriksaan Awal Depresi Dengan Menerapkan Metode PrototypingBerbasis Android&quot;,&quot;groupId&quot;:&quot;5d3d1151-c3fb-3f7b-bcf0-db626a6f9f8b&quot;,&quot;author&quot;:[{&quot;family&quot;:&quot;Giofran&quot;,&quot;given&quot;:&quot;Alexander Rama&quot;,&quot;parse-names&quot;:false,&quot;dropping-particle&quot;:&quot;&quot;,&quot;non-dropping-particle&quot;:&quot;&quot;},{&quot;family&quot;:&quot;Fanani&quot;,&quot;given&quot;:&quot;Lutfi&quot;,&quot;parse-names&quot;:false,&quot;dropping-particle&quot;:&quot;&quot;,&quot;non-dropping-particle&quot;:&quot;&quot;},{&quot;family&quot;:&quot;Ananta&quot;,&quot;given&quot;:&quot;Mahardeka Tri&quot;,&quot;parse-names&quot;:false,&quot;dropping-particle&quot;:&quot;&quot;,&quot;non-dropping-particle&quot;:&quot;&quot;}],&quot;container-title&quot;:&quot;Jurnal Pengembangan Teknologi Informasi dan Ilmu Komputer&quot;,&quot;accessed&quot;:{&quot;date-parts&quot;:[[2025,5,14]]},&quot;URL&quot;:&quot;https://j-ptiik.ub.ac.id/index.php/j-ptiik/article/view/13775&quot;,&quot;issued&quot;:{&quot;date-parts&quot;:[[2024,5]]},&quot;abstract&quot;:&quot;Kesehatan merupakan dambaan setiap manusia, tidak memandang usia dan tidak memandang profesi apa. Salah satu aspek dari “sehat” itu sendiri adalah sehat secara emosional atau mental. Salah satu tindakan yang mudah dan solutif untuk menangani masalah kesehatan mental adalah dengan melaksanakan skrining kesehatan mental. Berdasarkan survei yang dilakukan kepada 30 masyarakat Indonesia dengan latar belakang mahasiswa aktif Fakultas Ilmu Komputer Universitas Brawijaya, didapat 80.8% merasa skrining untuk kesehatan mental merupakan tindakan yang penting dengan 92.3% merasa aplikasi skrining kesehatan mental untuk mahasiswa merupakan hal yang penting. Oleh karena itu, dikembangkan sebuah aplikasi pemeriksaan awal depresi untuk mahasiswa supaya dapat berjalan secara optimal dengan menggapai responden sebanyak mungkin. Aplikasi dikembangkan menggunakan SDLC Prototyping dan arsitektur aplikasi MVVM. Penerapan arsitektur didukung oleh bahasa pemrograman Kotlin dan Firebase sebagai penyimpanan data. Aplikasi diuji menggunakan black box testing dan usability testing. Black box testing dilakukan kepada pengembang dan menguji fungsionalitas aplikasi. Usability testing kepada calon pengguna dan akan diukur tingkat efektivitasnya, efisiensi, dan kepuasan pengguna. Pada black box testing, didapatkan tingkat keberhasilan 100%. Pada usability testing didapatkan tingkat efektivitas 100%, overall relative efficiency 100%, dan tingkat kepuasan dengan nilai SUS didapatkan nilai 81,5.&quot;,&quot;issue&quot;:&quot;5&quot;,&quot;volume&quot;:&quot;8&quot;,&quot;container-title-short&quot;:&quot;&quot;},&quot;isTemporary&quot;:false},{&quot;id&quot;:&quot;4d2d78d0-7f97-32bb-adc8-a307373c820b&quot;,&quot;itemData&quot;:{&quot;type&quot;:&quot;article-journal&quot;,&quot;id&quot;:&quot;4d2d78d0-7f97-32bb-adc8-a307373c820b&quot;,&quot;title&quot;:&quot;Implementasi Sistem Pakar Diagnosa Depresi Anak Dalam Pembelajaran Daring Metode Forward Chaining&quot;,&quot;groupId&quot;:&quot;5d3d1151-c3fb-3f7b-bcf0-db626a6f9f8b&quot;,&quot;author&quot;:[{&quot;family&quot;:&quot;Krisnanda&quot;,&quot;given&quot;:&quot;Dimas&quot;,&quot;parse-names&quot;:false,&quot;dropping-particle&quot;:&quot;&quot;,&quot;non-dropping-particle&quot;:&quot;&quot;}],&quot;container-title&quot;:&quot;“Optimalisasi Digital Marketing Menyongsong Marketing 5.0:Technology For Humanity”&quot;,&quot;accessed&quot;:{&quot;date-parts&quot;:[[2025,5,14]]},&quot;ISSN&quot;:&quot;2685-5615&quot;,&quot;URL&quot;:&quot;https://prosiding.unipma.ac.id/index.php/SENATIK/article/view/1969&quot;,&quot;issued&quot;:{&quot;date-parts&quot;:[[2021]]},&quot;abstract&quot;:&quot;Web based learning for understudies is right now the greatest supporter of misery in youngsters. The web based learning measure that the public authority has started to execute in schools expects to supplant eye to eye learning, in light of the fact that up to this point Coronavirus is as yet a plague that has not finished. The job of guardians is vital in overseeing and helping youngsters in the learning system on the grounds that the learning system in kids is currently situated at home. In any case, there are as yet many guardians who feel that the indications of despondency in their youngsters are only something ordinary. Fundamentally, the manifestations of melancholy in kids have their own particular manner of taking care of which can be taken care of appropriately and rapidly by talking with the specialists. In this examination utilizing the forward tying technique to decide the consequences of the master framework. The forward chaining strategy is a technique that utilizations Assuming and, thinking, beginning with gathering realities and afterward estimating to discover ends. On the site, this master framework will actually want to recognize gloom, signs of misery, intense melancholy and not despondency. Programming language for building frameworks utilizing PHP and MySQL data set.&quot;,&quot;issue&quot;:&quot;1&quot;,&quot;volume&quot;:&quot;4&quot;,&quot;container-title-short&quot;:&quot;&quot;},&quot;isTemporary&quot;:false},{&quot;id&quot;:&quot;de8bef66-97d0-3ca9-bee7-d45c3c81aeee&quot;,&quot;itemData&quot;:{&quot;type&quot;:&quot;article-journal&quot;,&quot;id&quot;:&quot;de8bef66-97d0-3ca9-bee7-d45c3c81aeee&quot;,&quot;title&quot;:&quot;Penggunaan Algoritma random forest dan Agile scrum dalam Pengembangan Aplikasi Kesehatan mental Berbasis Web 'MentalWell'&quot;,&quot;groupId&quot;:&quot;5d3d1151-c3fb-3f7b-bcf0-db626a6f9f8b&quot;,&quot;author&quot;:[{&quot;family&quot;:&quot;Masbahah&quot;,&quot;given&quot;:&quot;M&quot;,&quot;parse-names&quot;:false,&quot;dropping-particle&quot;:&quot;&quot;,&quot;non-dropping-particle&quot;:&quot;&quot;},{&quot;family&quot;:&quot;Putri&quot;,&quot;given&quot;:&quot;Azzahra Kareena Rendri&quot;,&quot;parse-names&quot;:false,&quot;dropping-particle&quot;:&quot;&quot;,&quot;non-dropping-particle&quot;:&quot;&quot;},{&quot;family&quot;:&quot;Lathifa&quot;,&quot;given&quot;:&quot;Diana&quot;,&quot;parse-names&quot;:false,&quot;dropping-particle&quot;:&quot;&quot;,&quot;non-dropping-particle&quot;:&quot;&quot;},{&quot;family&quot;:&quot;Nawang&quot;,&quot;given&quot;:&quot;Diah Munica&quot;,&quot;parse-names&quot;:false,&quot;dropping-particle&quot;:&quot;&quot;,&quot;non-dropping-particle&quot;:&quot;&quot;},{&quot;family&quot;:&quot;Anshori&quot;,&quot;given&quot;:&quot;Fauzi Ihsan&quot;,&quot;parse-names&quot;:false,&quot;dropping-particle&quot;:&quot;&quot;,&quot;non-dropping-particle&quot;:&quot;&quot;},{&quot;family&quot;:&quot;Kusnadi&quot;,&quot;given&quot;:&quot;Bimo Adji&quot;,&quot;parse-names&quot;:false,&quot;dropping-particle&quot;:&quot;&quot;,&quot;non-dropping-particle&quot;:&quot;&quot;}],&quot;container-title&quot;:&quot;KESATRIA: Jurnal Penerapan Sistem Informasi (Komputer &amp; Manajemen)&quot;,&quot;accessed&quot;:{&quot;date-parts&quot;:[[2025,5,14]]},&quot;URL&quot;:&quot;https://pkm.tunasbangsa.ac.id/index.php/kesatria/article/view/455&quot;,&quot;issued&quot;:{&quot;date-parts&quot;:[[2024,7]]},&quot;page&quot;:&quot;1369-1380&quot;,&quot;abstract&quot;:&quot;Teenage mental health is a major concern today. Teenagers often suffer from various mental health problems such as depression, anxiety, and stress, which can have a negative impact on their development and lives. The aim of this research was to develop a mental health website that helps adolescents identify and overcome mental health problems. The \&quot;MentalWell\&quot; website uses a random forest algorithm to classify youth mental health questionnaires and provide appropriate intervention recommendations. This website was created using the System Development Life Cycle (SDLC) method with an Agile Scrum approach, based on a design that was carried out using the React.js framework for the front-end and CodeIgniter 4 (CI4) for the back-end. In the Agile scrum model, software development is divided into short iterations called sprints. Each sprint involves sprint planning, daily scrum, sprint review, and sprint retrospective. The main steps in the process of classifying mental health disorders using the random forest algorithm, starting from data collection to testing and final results. Testing uses the black box method, with valid results for all features developed.&quot;,&quot;issue&quot;:&quot;3&quot;,&quot;volume&quot;:&quot;5&quot;,&quot;container-title-short&quot;:&quot;&quot;},&quot;isTemporary&quot;:false},{&quot;id&quot;:&quot;bc2044d5-0d6b-3fe1-bc24-5ceee8dd7163&quot;,&quot;itemData&quot;:{&quot;type&quot;:&quot;thesis&quot;,&quot;id&quot;:&quot;bc2044d5-0d6b-3fe1-bc24-5ceee8dd7163&quot;,&quot;title&quot;:&quot;Expert System Mendiagnosa Tingkat Depresi Siswa Menggunakan Metode Certainly Factor&quot;,&quot;groupId&quot;:&quot;5d3d1151-c3fb-3f7b-bcf0-db626a6f9f8b&quot;,&quot;author&quot;:[{&quot;family&quot;:&quot;Yulianti&quot;,&quot;given&quot;:&quot;Nadia&quot;,&quot;parse-names&quot;:false,&quot;dropping-particle&quot;:&quot;&quot;,&quot;non-dropping-particle&quot;:&quot;&quot;}],&quot;accessed&quot;:{&quot;date-parts&quot;:[[2025,5,14]]},&quot;URL&quot;:&quot;http://repository.upbatam.ac.id/5843/&quot;,&quot;issued&quot;:{&quot;date-parts&quot;:[[2023,11]]},&quot;abstract&quot;:&quot;Depresi adalah gangguan suasana hati yang ditandai dengan gejala seperti kemurungan, lesu, kurangnya gairah, perasaan tidak berharga, frustasi yang mendalam, keputusasaan, pikiran tentang kematian dan pikiran untuk bunuh diri, depresi merupakan salah satu kondisi kesehatan mental, banyak Siswa masih kesulitan untuk menentukan sudah sampai ditahap mana dan separah apa depresi yang mereka alami, Mengidentifikasi faktor yang mempengaruhi tingkat depresi yang dialami siswa dengan Menerapkan metode Certainly Factor (CF) pada sistem pakar untuk mendiagnosa tingkat depresi siswa, Certainly Factor adalah metode untuk menghadapi ketidakpastian dalam sistem berbasis aturan dengan melakukan perhitungan, setelah sistem berjalan dengan baik maka dilakukan implementasi terhadap siswa dengan cara mendaftar terlebih dulu kemudian login setelah itu menjawab pertanyaan dari data gejala-gejala yang menjadi penyebab depresi berdasarkan tingkatanya masing-masing&quot;,&quot;publisher&quot;:&quot;Universitas Putera Batam&quot;,&quot;container-title-short&quot;:&quot;&quot;},&quot;isTemporary&quot;:false},{&quot;id&quot;:&quot;cedabb00-5ba8-346e-9755-b91fc578f3e8&quot;,&quot;itemData&quot;:{&quot;type&quot;:&quot;thesis&quot;,&quot;id&quot;:&quot;cedabb00-5ba8-346e-9755-b91fc578f3e8&quot;,&quot;title&quot;:&quot;Perancangan Aplikasi Mobile Apps Konsultasi Online Pusat Inovasi Psikologi Unpad&quot;,&quot;groupId&quot;:&quot;5d3d1151-c3fb-3f7b-bcf0-db626a6f9f8b&quot;,&quot;author&quot;:[{&quot;family&quot;:&quot;Krisantyo&quot;,&quot;given&quot;:&quot;Dimas Adrinura&quot;,&quot;parse-names&quot;:false,&quot;dropping-particle&quot;:&quot;&quot;,&quot;non-dropping-particle&quot;:&quot;&quot;},{&quot;family&quot;:&quot;Hidayat&quot;,&quot;given&quot;:&quot;Dicky&quot;,&quot;parse-names&quot;:false,&quot;dropping-particle&quot;:&quot;&quot;,&quot;non-dropping-particle&quot;:&quot;&quot;}],&quot;accessed&quot;:{&quot;date-parts&quot;:[[2025,5,14]]},&quot;URL&quot;:&quot;https://openlibrarypublications.telkomuniversity.ac.id/index.php/artdesign/article/view/14431&quot;,&quot;issued&quot;:{&quot;date-parts&quot;:[[2020,4]]},&quot;number-of-pages&quot;:&quot;48-59&quot;,&quot;abstract&quot;:&quot;Depresi merupakan salah satu penyakit mental yang tidak bisa dipandang sebelah mata, yang biasanya diderita oleh remaja dan dewasa dengan umur sekitar 18-30 tahun. Depresi biasanya ditandai dengan kesedihan, kehilangan gairah hidup, merasa putus asa. Saat ini telah banyak tempat yang dapat membantu penderita depresi salah satu contohnya adalah Pelayanan dan Inovasi Psikologi Universitas Padjajaran yang berlokasi di Jl. Ir. H. Juanda, Bandung. Sayangnya, masih banyak para penderita depresi tidak mencari pengobatan ke profesional, seperti yang dikatakan oleh Dr. Eka Viora, SpKj selaku Ketua Perhimpunan Dokter Spesialis Kedokteran Jiwa Indonesia (PSDKJI), bahwa sekitar 15,6 juta penduduk Indonesia mengalami depresi dan hanya sekitar 8% yang mencari pengobatan ke profesional. Hal ini diakibatkan oleh adanya stigma negatif dari masyarakat terhadap orang yang melakukan konsultasi ke psikolog. Namun dengan pesatnya perkembangan teknologi sekarang, sebuah aplikasi untuk melakukan konsultasi secara online dapat dirancang untuk dapat membantu para penderita depresi yang ingin melakukan konsultasi dengan psikolog profesional. Hasil yang diharapkan dari penelitian ini adalah untuk membuat sebuah aplikasi yang nantinya dapat membantu untuk Pelayanan dan Inovasi Psikologi Universitas Padjajaran serta memudahkan masyarakat Bandung yang ingin melakukan konsultasi dengan profesional.&quot;,&quot;publisher&quot;:&quot;Telkom University&quot;,&quot;container-title-short&quot;:&quot;&quot;},&quot;isTemporary&quot;:false},{&quot;id&quot;:&quot;b6107ae8-a432-3875-8c9d-0a1d14aeb26e&quot;,&quot;itemData&quot;:{&quot;type&quot;:&quot;thesis&quot;,&quot;id&quot;:&quot;b6107ae8-a432-3875-8c9d-0a1d14aeb26e&quot;,&quot;title&quot;:&quot;PERANCANGAN GAME SEBAGAI ALTERNATIF TERAPI PADA PENYANDANG DEPRESI&quot;,&quot;groupId&quot;:&quot;5d3d1151-c3fb-3f7b-bcf0-db626a6f9f8b&quot;,&quot;author&quot;:[{&quot;family&quot;:&quot;Nawir&quot;,&quot;given&quot;:&quot;Fhadli A&quot;,&quot;parse-names&quot;:false,&quot;dropping-particle&quot;:&quot;&quot;,&quot;non-dropping-particle&quot;:&quot;&quot;},{&quot;family&quot;:&quot;B Kafiar&quot;,&quot;given&quot;:&quot;Matheus E&quot;,&quot;parse-names&quot;:false,&quot;dropping-particle&quot;:&quot;&quot;,&quot;non-dropping-particle&quot;:&quot;&quot;},{&quot;family&quot;:&quot;Oton Kadang&quot;,&quot;given&quot;:&quot;Marsellus&quot;,&quot;parse-names&quot;:false,&quot;dropping-particle&quot;:&quot;&quot;,&quot;non-dropping-particle&quot;:&quot;&quot;}],&quot;container-title&quot;:&quot;JURNAL DIPANEGARA KOMPUTER TEKNIK INFORMATIKA&quot;,&quot;accessed&quot;:{&quot;date-parts&quot;:[[2025,5,14]]},&quot;ISSN&quot;:&quot;2963-2854&quot;,&quot;URL&quot;:&quot;https://ejurnal.undipa.ac.id/index.php/dipakomti/article/view/1238&quot;,&quot;issued&quot;:{&quot;date-parts&quot;:[[2023,4]]},&quot;number-of-pages&quot;:&quot;254-264&quot;,&quot;abstract&quot;:&quot;Depresi bukanlah suatu hal yang tidak mungkin dialami setiap orang, baik usia anak-anak, remaja, dewasa bahkan lansia. Salah satu terapi perilaku kognitif (CBT) yang  dilakukan adalah terapi musik. Namun, pada proses terapi musik yang terjadi saat ini, adalah beberapa pasien tidak tahu menggunakan alat musik sehingga kebanyakan dari pasien hanya bisa mendengarkan. Penelitian ini mencoba mencari alternatif lain dalam proses terapi penyandang Depresi yaitu melalui game. Penelitian ini dirancang menggunakan metode Pre Post Test di mana pasien akan diuji menggunakan alat peraga terlebih dahulu, setelah itu menggunakan aplikasi game. Pengujian dilakukan menggunakan metode Mann-Withney yang menunjukkan hasil bahwa menggunakan aplikasi alternatif terapi pada pasien membuat pasien merasa lebih mudah melakukan terapi dan pasien merasa lebih senang menjalani terapi&quot;,&quot;publisher&quot;:&quot;UNIVERSITAS DIPA MAKASSAR&quot;,&quot;issue&quot;:&quot;2&quot;,&quot;volume&quot;:&quot;15&quot;,&quot;container-title-short&quot;:&quot;&quot;},&quot;isTemporary&quot;:false},{&quot;id&quot;:&quot;583bc29f-1306-36cb-8911-50b048089240&quot;,&quot;itemData&quot;:{&quot;type&quot;:&quot;article-journal&quot;,&quot;id&quot;:&quot;583bc29f-1306-36cb-8911-50b048089240&quot;,&quot;title&quot;:&quot;Expert system berbasis website dengan inisiasi mental health awareness sebagai edukasi pentingnya kesehatan mental dan mengatasi mental illness&quot;,&quot;groupId&quot;:&quot;5d3d1151-c3fb-3f7b-bcf0-db626a6f9f8b&quot;,&quot;author&quot;:[{&quot;family&quot;:&quot;Adama&quot;,&quot;given&quot;:&quot;Bintang Ahmada Farhan&quot;,&quot;parse-names&quot;:false,&quot;dropping-particle&quot;:&quot;&quot;,&quot;non-dropping-particle&quot;:&quot;&quot;},{&quot;family&quot;:&quot;Alda&quot;,&quot;given&quot;:&quot;Rosalina&quot;,&quot;parse-names&quot;:false,&quot;dropping-particle&quot;:&quot;&quot;,&quot;non-dropping-particle&quot;:&quot;&quot;},{&quot;family&quot;:&quot;Prakash&quot;,&quot;given&quot;:&quot;Satya&quot;,&quot;parse-names&quot;:false,&quot;dropping-particle&quot;:&quot;&quot;,&quot;non-dropping-particle&quot;:&quot;&quot;},{&quot;family&quot;:&quot;Janah&quot;,&quot;given&quot;:&quot;Mivtakhul&quot;,&quot;parse-names&quot;:false,&quot;dropping-particle&quot;:&quot;&quot;,&quot;non-dropping-particle&quot;:&quot;&quot;},{&quot;family&quot;:&quot;Robbani&quot;,&quot;given&quot;:&quot;Musyaffa Ahmad&quot;,&quot;parse-names&quot;:false,&quot;dropping-particle&quot;:&quot;&quot;,&quot;non-dropping-particle&quot;:&quot;&quot;}],&quot;container-title&quot;:&quot;Proceedings of the National Conference on Electrical Engineering, Informatics, Industrial Technology, and Creative Media&quot;,&quot;accessed&quot;:{&quot;date-parts&quot;:[[2025,5,14]]},&quot;URL&quot;:&quot;https://centive.ittelkom-pwt.ac.id/index.php/centive/article/view/159&quot;,&quot;issued&quot;:{&quot;date-parts&quot;:[[2023]]},&quot;page&quot;:&quot;168-179&quot;,&quot;abstract&quot;:&quot;Tantangan serius terkait kesehatan mental di Indonesia, khususnya dalam meningkatnya gangguan mental seperti kecemasan dan depresi. Tingkat gangguan mental mencapai 55% dan 58%, sementara stigma dan diskriminasi terhadap gangguan mental menjadi hambatan signifikan. Sebagai respons terhadap masalah ini, dikembangkanlah website \&quot;Mentality.id\&quot; dengan pendekatan inovatif, membahas desain website, mekanisme kerja, dan evaluasi. Penelitian ini bertujuan untuk menghadirkan wadah bagi individu yang mengalami gangguan mental, sehingga pengguna dapat berbagi pengalaman dan cerita dengan orang-orang yang memiliki pengalaman serupa. Sementara itu, memberikan solusi kesehatan mental, berkontribusi pada kebijakan pemerintah, dan menjadi referensi bagi kalangan akademisi. Hasil survei pada saat menyebarkan kuesioner sebanyak 60% sangat setuju tentang dibuatnya website ini.  Penggunaan sistem pakar dengan metode forward chaining dalam Mentality.id melalui penilaian awal kesehatan mental pada fitur kuesioner SRQ-20. Kuesioner digunakan untuk mengukur tingkat kesadaran dan dukungan terhadap penanggulangan masalah kesehatan mental melalui platform online. Pengujian usability menggunakan System Usability Scale (SUS) dengan 30 responden mendapatkan rata-rata skor 83, menempatkan Mentality.id sebagai \&quot;Excellent\&quot; dan dapat diterima. Skor ini memberikan gambaran positif tentang kegunaan dan pengalaman pengguna website ini, khususnya dengan penerapan metode forward chaining dalam membantu pengambilan keputusan pada saat tes kesehatan mental.&quot;,&quot;issue&quot;:&quot;1&quot;,&quot;volume&quot;:&quot;3&quot;,&quot;container-title-short&quot;:&quot;&quot;},&quot;isTemporary&quot;:false},{&quot;id&quot;:&quot;abce3ee9-b921-30e0-9eb6-3c45c49894d6&quot;,&quot;itemData&quot;:{&quot;type&quot;:&quot;thesis&quot;,&quot;id&quot;:&quot;abce3ee9-b921-30e0-9eb6-3c45c49894d6&quot;,&quot;title&quot;:&quot;Rancang Bagun (Less Depression) dengan Penerapan Sistem Pakar untuk Mengetahui Tingkat Depresi Dini Mahasiswa Tingkat Akhir Menggunakan Metode Dempster Shafer&quot;,&quot;groupId&quot;:&quot;5d3d1151-c3fb-3f7b-bcf0-db626a6f9f8b&quot;,&quot;author&quot;:[{&quot;family&quot;:&quot;Widyatna&quot;,&quot;given&quot;:&quot;Dwi Kumara&quot;,&quot;parse-names&quot;:false,&quot;dropping-particle&quot;:&quot;&quot;,&quot;non-dropping-particle&quot;:&quot;&quot;}],&quot;accessed&quot;:{&quot;date-parts&quot;:[[2025,5,14]]},&quot;URL&quot;:&quot;https://repository.dinamika.ac.id/id/eprint/6789/&quot;,&quot;issued&quot;:{&quot;date-parts&quot;:[[2022]]},&quot;abstract&quot;:&quot;Depresi merupakan gangguan jiwa yang ditandai dengan munculnya gangguan mood dan kehilangan minat. Penyebaran kuisioner telah dilakukan kepada 58 mahasiswa akhir di beberapa universitas di Surabaya didapatkan data gejala depresi yang dialami selama 2 minggu antara lain sering mengalami perubahan pola tidur, sering mengalami perubahan nafsu makan, mengalami pesimis, mengalami kehilangan energi, mengalami kehilangan ketertarikan, dan berfikir untuk tidak melanjutkan tugas akhir. Penelitihan ini berfokus pada membangun sistem pakar untuk pendeteksi dini tingkat stress pada mahasiswa tingkat akhir di Universitas yang berada di Surabaya menggunakan metode Dempster Shafer. Metode ini digunakan karena metode kemudahannya menggunakan nilai pembobotan dan pemberian nilai kepercayaan terhadap suatu gejala. Metode Dempster Shafer merupakan cara yang tepat dalam mendeteksi suatu penyakit. Sistem pakar yang dibangun ini memiliki dampak bagi mahasiswa dan dokter psikiater. Bagi mahasiswa dapat meningkatkan rasio mahasiswa dalam penyelesaian tugas akhir dan bagi dokter psikiater aplikasi ini dapat digunakan sebagai layanan tambahan dan kemudahan dalam melakukan konsultasi bagi pengguna. Kemudian untuk uji testing menggunakan metode system usability scale (SUS) dengan menghasilkan rata-rata skor nilai 71, dimana menurut Kurniawan (2022) nilai 71 sudah termasuk hasil yang dianggap Good karena bernilai lebih dari 70,4. Selain itu pada perhitungan akurasi yang dilakukan dengan confusion matrix, sistem ini memberikan nilai accuracy sebesar 87,5% dan pada precision memiliki nilai 93,3% dan juga recall mempunyai nilai 93,3%. Kemudian pada aplikasi (Less Depression) ini dapat mendeteksi depresi mahasiswa tingkat akhir dan memberikan fitur chat untuk menghubungkan antara Psikiater dengan mahasiswa tingkat akhir yang mengalami depresi untuk treatment atau intervensi sehingga dapat mengurangi depresi yang dialami.&quot;,&quot;publisher&quot;:&quot;Universitas Dinamika&quot;,&quot;container-title-short&quot;:&quot;&quot;},&quot;isTemporary&quot;:false},{&quot;id&quot;:&quot;0f28ec3c-2745-3276-9d91-703cad2d3be9&quot;,&quot;itemData&quot;:{&quot;type&quot;:&quot;thesis&quot;,&quot;id&quot;:&quot;0f28ec3c-2745-3276-9d91-703cad2d3be9&quot;,&quot;title&quot;:&quot;Deteksi Dini Mental Illness Dengan Metode Case Base Reasoning Laporan Akhir&quot;,&quot;groupId&quot;:&quot;5d3d1151-c3fb-3f7b-bcf0-db626a6f9f8b&quot;,&quot;author&quot;:[{&quot;family&quot;:&quot;Azizah&quot;,&quot;given&quot;:&quot;Miftah Rizqi&quot;,&quot;parse-names&quot;:false,&quot;dropping-particle&quot;:&quot;&quot;,&quot;non-dropping-particle&quot;:&quot;&quot;}],&quot;accessed&quot;:{&quot;date-parts&quot;:[[2025,5,14]]},&quot;URL&quot;:&quot;https://sipora.polije.ac.id/5966/&quot;,&quot;issued&quot;:{&quot;date-parts&quot;:[[2021]]},&quot;abstract&quot;:&quot;Teknologi informasi saat ini menjadi pokok utama dalam kehidupan. Dimana segala hal dapat dikerjakan dengan bantuan teknologi informasi. Dalam perkembangannya teknologi informasi dapat dimanfaatkan dibanyak bidang seperti pada bidang pendidikan, ekonomi, politik, lingkungan bahkan kesehatan. Pada saat ini banyak beredar aplikasi kesehatan guna membantu masyarakat untuk mengkontrol kesehatannya melalui jarak jauh,baik untuk kesehatan psikis ataupun kesehatan mental. Namun pada kasus tertentu masih banyak masyarakat yang belum memahami kegunaan aplikasi kesehatan khususnya kesehatan mental karena masih menganggap sepele dan remeh kesehatan mental. Berdasarkan penjabaran diatas maka diambilah judul “Deteksi Dini Mental Illness Dengan Metode Case Based Reasoning” yang menggunakan metode Case Based Reasoning untuk pengambilan keputusan data dari basis kasus yang kemudian diolah berdasarkan rumus algoritma similarity dimana menampilkan hasil analisis Similarity pada tiap kasus terbaru yang diinput. Pemanfaatan teknik similarity ini berguna untuk membandingkan data gejala yang baru diinputkan dengan gejala yang telah ada pada basis kasus dan pemanfaatan teknik Bubble Sort untuk mencari hasil persentase yang terbesar dijadikan acuan dalam pengambilan keputusan sehingga dapat membantu para remaja untuk mendeteksi dini adanya gangguan bipolar disorder. Aplikasi ini berbasis Website yang dapat memudahkan pengguna untuk mengaksesnya kapan dan dimana saja menggunakan jaringan internet. Setelah melalui tahap pengujian, aplikasi berjalan dengan baik sesuai dengan yang diharapkan. Pengujian dilakukan langsung kepada user yang telah berusia 18-25 tahun dengan pengujian User Acceptances Test dan dihitung rata-rata persentase dengan skala likert kemudian didapatkan hasil pengujian aplikasi sebesar 85,49%.&quot;,&quot;publisher&quot;:&quot;Politeknik Negeri Jember&quot;,&quot;container-title-short&quot;:&quot;&quot;},&quot;isTemporary&quot;:false},{&quot;id&quot;:&quot;0c39259c-a278-3284-8b7f-1693a30017d0&quot;,&quot;itemData&quot;:{&quot;type&quot;:&quot;article-journal&quot;,&quot;id&quot;:&quot;0c39259c-a278-3284-8b7f-1693a30017d0&quot;,&quot;title&quot;:&quot;Sistem Diagnosa Gejala Penyakit Kesehatan Mental Pada Remaja Menggunakan Metode Naïve Bayes&quot;,&quot;groupId&quot;:&quot;5d3d1151-c3fb-3f7b-bcf0-db626a6f9f8b&quot;,&quot;author&quot;:[{&quot;family&quot;:&quot;Salsabila&quot;,&quot;given&quot;:&quot;Putri Hana&quot;,&quot;parse-names&quot;:false,&quot;dropping-particle&quot;:&quot;&quot;,&quot;non-dropping-particle&quot;:&quot;&quot;},{&quot;family&quot;:&quot;Samsoni&quot;,&quot;given&quot;:&quot;&quot;,&quot;parse-names&quot;:false,&quot;dropping-particle&quot;:&quot;&quot;,&quot;non-dropping-particle&quot;:&quot;&quot;}],&quot;container-title&quot;:&quot;OKTAL : Jurnal Ilmu Komputer Dan Sains&quot;,&quot;accessed&quot;:{&quot;date-parts&quot;:[[2025,5,14]]},&quot;URL&quot;:&quot;https://journal.mediapublikasi.id/index.php/oktal/article/view/1836&quot;,&quot;issued&quot;:{&quot;date-parts&quot;:[[2023]]},&quot;page&quot;:&quot;2795-2805&quot;,&quot;abstract&quot;:&quot;With the existence of an information technology application program this can help and play a very important role in human life, one of these applications is an application of artificial intelligence carried out by experts, this application is used to solve a problem that is usually only done by an expert in the field of direct knowledge . This application is a website-based application that can help diagnose a mental health disease that often occurs in adolescents. The purpose of this application is to diagnose a mental health disease in adolescents and help adolescents to find out whether they are experiencing symptoms of mental health disease or not. This data collection method is carried out in several ways, namely by the method of Observation, Interview and Literature Study, the results of the data collection are then collected and calculated using the Naïve Bayes calculation method, from these data will then be inputted into a website-based application that previously created, this application is made using the PHP programming language and uses the MySQL database. The results and benefits expected in making this thesis are to increase knowledge about mental health so that everyone can be more aware in responding to this, besides that this application is also expected to be able to help a teenager who wants to know about his mental health condition, and is expected to help in alleviating the work of an expert in diagnosing the disease so that the settlement process will be faster and more accurate.&quot;,&quot;issue&quot;:&quot;10&quot;,&quot;volume&quot;:&quot;2&quot;,&quot;container-title-short&quot;:&quot;&quot;},&quot;isTemporary&quot;:false},{&quot;id&quot;:&quot;7dfbdf1c-752f-380b-9a43-3204a2c00690&quot;,&quot;itemData&quot;:{&quot;type&quot;:&quot;article-journal&quot;,&quot;id&quot;:&quot;7dfbdf1c-752f-380b-9a43-3204a2c00690&quot;,&quot;title&quot;:&quot;Sistem Pakar dalam Menganalisis Gangguan Jiwa Menggunakan Metode Certainty Factor&quot;,&quot;groupId&quot;:&quot;5d3d1151-c3fb-3f7b-bcf0-db626a6f9f8b&quot;,&quot;author&quot;:[{&quot;family&quot;:&quot;Putra&quot;,&quot;given&quot;:&quot;Rafi Septiawan&quot;,&quot;parse-names&quot;:false,&quot;dropping-particle&quot;:&quot;&quot;,&quot;non-dropping-particle&quot;:&quot;&quot;},{&quot;family&quot;:&quot;Yuhandri&quot;,&quot;given&quot;:&quot;Y&quot;,&quot;parse-names&quot;:false,&quot;dropping-particle&quot;:&quot;&quot;,&quot;non-dropping-particle&quot;:&quot;&quot;}],&quot;container-title&quot;:&quot;Jurnal Sistim Informasi dan Teknologi&quot;,&quot;accessed&quot;:{&quot;date-parts&quot;:[[2025,5,14]]},&quot;DOI&quot;:&quot;10.37034/jsisfotek.v3i4.70&quot;,&quot;ISSN&quot;:&quot;2686-3154&quot;,&quot;URL&quot;:&quot;http://jsisfotek.org/index.php/JSisfotek/article/view/70&quot;,&quot;issued&quot;:{&quot;date-parts&quot;:[[2021,8,29]]},&quot;page&quot;:&quot;227-232&quot;,&quot;abstract&quot;:&quot;&lt;p&gt;People with Mental Disorders (ODGJ) as a trigger for people who suffer from disorders of thought, feeling and behavior cause changes in attitudes and behavior that hinder normal human functioning. Mental disorders as a syndrome characterized by a change in a person's behavior that will be associated with symptoms such as difficulties or disorders, as well as psychological functions and behavior that are not confident in dealing with people but can also be with that person. An expert system is an intelligent computer technology that is based on solving problems using inferential knowledge and procedures. As a problem solver, expert systems will also find it easier to make decisions or policies like humans do. This study aims to produce an expert system that is used to analyze mental disorders who can make similar decisions, as well as psychiatric specialists. The data processed in this study is scientific data on mental disorders ranging from types of mental illness, early symptoms of disease and patient diagnosis data by mental health specialists, then the data is processed using the Certainty Factor method and displayed in the form of a web-based application using the PHP programming language. and MySQL databases. The results obtained from testing the expert system using the Certainty Factor method show that there is a match between the results of an expert diagnosis of depression with a certainty level of 73%. An expert system for analyzing mental disorders using the Certainty Factor method can make it easier for sufferers to understand the type of mental disorder they are experiencing.&lt;/p&gt;&quot;,&quot;container-title-short&quot;:&quot;&quot;},&quot;isTemporary&quot;:false},{&quot;id&quot;:&quot;5b368bd5-eb90-3bfb-b923-33399390298d&quot;,&quot;itemData&quot;:{&quot;type&quot;:&quot;thesis&quot;,&quot;id&quot;:&quot;5b368bd5-eb90-3bfb-b923-33399390298d&quot;,&quot;title&quot;:&quot;Perancangan aplikasi personal mental health dengan pendekatan user centered design&quot;,&quot;groupId&quot;:&quot;5d3d1151-c3fb-3f7b-bcf0-db626a6f9f8b&quot;,&quot;author&quot;:[{&quot;family&quot;:&quot;Leslie&quot;,&quot;given&quot;:&quot;Jonathan&quot;,&quot;parse-names&quot;:false,&quot;dropping-particle&quot;:&quot;&quot;,&quot;non-dropping-particle&quot;:&quot;&quot;}],&quot;accessed&quot;:{&quot;date-parts&quot;:[[2025,5,14]]},&quot;URL&quot;:&quot;https://repository.unpar.ac.id/handle/123456789/18321&quot;,&quot;issued&quot;:{&quot;date-parts&quot;:[[2023]]},&quot;abstract&quot;:&quot;Di Indonesia, rentang usia 16-24 tahun rentan untuk terkena masalah kesehatan mental dimana sebanyak 95,4% remaja pernah mengalami gejala kecemasan dan 88% pernah mengalami gejala depresi pada tahun 2021. Selain itu terdapat sejumlah permasalahan seperti keterbatasan rumah sakit, puskesmas, dan psikiater yang sedikit, kasus bunuh diri yang tinggi dan stigma masyarakat yang menghakimi sehingga menghambat proses pertolongan kesehatan mental. Penelitian ini bertujuan untuk merancang dan mengevaluasi aplikasi personal mental health. Oleh karena itu, perlu dilakukan intervensi dengan aplikasi agar dapat memudahkan akses dalam menjaga kesehatan mental. Perancangan aplikasi dilakukan untuk upaya promotif dan preventif dengan pendekatan user-centered design. Identifikasi kebutuhan dilakukan dengan wawancara melibatkan 6 responden berusia 16-24 tahun yang terdiri dari orang dengan masalah kesehatan mental (ODMK) di depresi dan gangguan kecemasan, orang dengan minimal mental distress dan 1 psikiater yang menghasilkan kebutuhan. Selanjutnya dilakukan penentuan konsep alternatif dengan design workshop dengan melibatkan 3 desainer yang menghasilkan 3 konsep alternatif. Terdapat satu konsep terpilih yaitu konsep pertama berdasarkan hasil design workshop dengan menggunakan weighted concept scoring. Konsep pertama dapat terpilih dikarenakan mampu mengakomodasi kebutuhan user seperti memberikan kemudahan dan kenyamanan seperti menu navigasi aplikasi yang familiar, tampilan yang menarik, kelengkapan fitur-fitur utama seperti meditasi, konseling, journaling, artikel dan kebutuhan lainnya. Berdasarkan hasil konsep terpilih kemudian dirancang high-fidelity prototype menggunakan Figma. Selanjutnya dilakukan evaluasi dengan usability testing yang melibatkan tiga aspek yaitu effectiveness, efficiency, dan persepsi subjektif dengan menggunakan kuesioner System Usability Scale (SUS). Berdasarkan hasil evaluasi, didapatkan hasil aspek effectiveness sebesar 85,2%, aspek efficiency sebesar 85% dan aspek persepsi subjektif sebesar 65,83. Dari hasil evaluasi, aspek persepsi subjektif masih belum memenuhi standar minimum sehingga perlu dilakukan perbaikan. Selanjutnya dilakukan evaluasi kualitatif melalui komentar dari user. Berdasarkan hasil evaluasi diperoleh permasalahan terkait ukuran keterangan di halaman konselor, artikel dan komunitas yang kecil serta sejumlah permasalahan lainnya. Rekomendasi perbaikan dilakukan dengan memperbesar ukuran rating konselor, keterangan di bagian bawah judul artikel dan komunitas serta sejumlah perbaikan lainnya.&quot;,&quot;publisher&quot;:&quot;Universitas Katolik Parahyangan&quot;,&quot;container-title-short&quot;:&quot;&quot;},&quot;isTemporary&quot;:false},{&quot;id&quot;:&quot;b1dbd357-0862-3e70-bdd2-ae593acb6102&quot;,&quot;itemData&quot;:{&quot;type&quot;:&quot;thesis&quot;,&quot;id&quot;:&quot;b1dbd357-0862-3e70-bdd2-ae593acb6102&quot;,&quot;title&quot;:&quot;Pengembangan Panduan Model Konseling Solution Focused Brief Counseling Teknik Imagery and Visualitation Berbasis Website SI-Konseling Untuk Mengatasi Depresi Pada Remaja Korban Kekerasan&quot;,&quot;groupId&quot;:&quot;5d3d1151-c3fb-3f7b-bcf0-db626a6f9f8b&quot;,&quot;author&quot;:[{&quot;family&quot;:&quot;Fitri&quot;,&quot;given&quot;:&quot;Inda Ramadani&quot;,&quot;parse-names&quot;:false,&quot;dropping-particle&quot;:&quot;&quot;,&quot;non-dropping-particle&quot;:&quot;&quot;}],&quot;accessed&quot;:{&quot;date-parts&quot;:[[2025,5,14]]},&quot;URL&quot;:&quot;https://repo.undiksha.ac.id/16400/&quot;,&quot;issued&quot;:{&quot;date-parts&quot;:[[2023]]},&quot;abstract&quot;:&quot;Penelitian ini memiliki tujuan dalam mengembangkan serta melakukan uji validitas isi dan efektivitas panduan model konseling Solution Focused Brief Counseling teknik Imagery and Visualitation berbasis website SI-Konseling untuk mengatasi Depresi pada remaja korban kekerasan. Jenis penelitian ini termasuk dalam penelitian pengembangan dengan menggunakan prosedur 4D (Define, Design, Develop, dan Disseminate). Penelitian ini melibatkan 2 orang dosen bimbingan konseling serta 1 orang dosen teknologi pendidikan sebagai ahli dan 1 orang guru BK SMK Negeri 2 Singaraja serta 1 orang konselor Dinas Pengendalian Penduduk, Keluarga Berencana, Pemberdayaan Perempuan dan Perlindungan Anak Kabupaten Buleleng sebagai praktisi yang memiliki tugas dalam melakukan uji kegunaan, ketepatan, serta kelayakan panduan. Pengumpulan data dilakukan dengan menggunakan instrument validitas pakar yang kemudian dianalisis dengan formula CVR (Content Validity Ratio), CVI (Content Validity Indeks), dan t-test. Hasil analisis CVR menunjukkan seluruh pernyataan instrument diterima serta mendapatkan hasil CVI sebesar 1 dengan kategori sangat sesuai, maka dari itu panduan model konseling Solution Focused Brief Counseling teknik Imagery and Visualitation telah memenuhi ketentuan untuk digunakan. Uji efektivitas panduan melibatkan 30 remaja korban kekerasan dengan menggunakan eksperimen one group pre-test dan post-test design. Hasil uji-t didapatkan harga sebesar 9,146 Koefisien tersebut kemudian dibandingkan menggunakan dengan df = 29 pada taraf signifikansi 0.05. Berdasarkan hal tersebut, maka diperoleh sebesar 2,048 hal ini berarti &gt; sehingga Ho ditolak. Hasil ini menyatakan bahwasannya pengembangan panduan model konseling Solution Focused Brief Counseling teknik Imagery and Visualitation berbasis website SI-Konseling efektif untuk mengatasi Depresi pada remaja korban kekerasan.&quot;,&quot;publisher&quot;:&quot;Universitas Pendidikan Ganesha&quot;,&quot;container-title-short&quot;:&quot;&quot;},&quot;isTemporary&quot;:false},{&quot;id&quot;:&quot;cd179222-7784-3654-93fd-3d27b7b73cec&quot;,&quot;itemData&quot;:{&quot;type&quot;:&quot;article-journal&quot;,&quot;id&quot;:&quot;cd179222-7784-3654-93fd-3d27b7b73cec&quot;,&quot;title&quot;:&quot;Aplikasi Mobile Pendeteksi Gangguan Mental Mahasiswa dengan Menggunakan Metode Forward Chaining&quot;,&quot;groupId&quot;:&quot;5d3d1151-c3fb-3f7b-bcf0-db626a6f9f8b&quot;,&quot;author&quot;:[{&quot;family&quot;:&quot;Pambudi&quot;,&quot;given&quot;:&quot;Arunseto&quot;,&quot;parse-names&quot;:false,&quot;dropping-particle&quot;:&quot;&quot;,&quot;non-dropping-particle&quot;:&quot;&quot;},{&quot;family&quot;:&quot;Aminah&quot;,&quot;given&quot;:&quot;Siti&quot;,&quot;parse-names&quot;:false,&quot;dropping-particle&quot;:&quot;&quot;,&quot;non-dropping-particle&quot;:&quot;&quot;},{&quot;family&quot;:&quot;Kristanto&quot;,&quot;given&quot;:&quot;Bagus Kristomoyo&quot;,&quot;parse-names&quot;:false,&quot;dropping-particle&quot;:&quot;&quot;,&quot;non-dropping-particle&quot;:&quot;&quot;}],&quot;container-title&quot;:&quot;Prosiding Seminar Nasional Sisfotek (Sistem Informasi dan Teknologi Informasi)&quot;,&quot;accessed&quot;:{&quot;date-parts&quot;:[[2025,5,14]]},&quot;URL&quot;:&quot;https://garuda.kemdikbud.go.id/documents/detail/2915834&quot;,&quot;issued&quot;:{&quot;date-parts&quot;:[[2021]]},&quot;abstract&quot;:&quot;Mobile device technology (mobile) is one of the most widely used communication and information devices in March 2020 as many as 55.43% of mobile device users and the number of mobile device users will continue to rise leaving the desktop over time. Mental disorders in modern times are increasingly becoming a serious problem in society. Most of the incidents of suicide are related to mental-emotional disorders. Decision Support System (DSS) or Decision Support System (DSS) is a system capable of providing problem solving capabilities. Forward chaining is a method of DSS that uses an inference engine and can be described logically as an iterative application of the modus ponens. The purpose of this study is to build a student mental disorder detector mobile application using the forward chaining method. This research discusses from system design, application implementation to application testing. The results of this study are a trial result and an informative mobile application and of course able to detect mental disorders of students.&quot;,&quot;issue&quot;:&quot;1&quot;,&quot;volume&quot;:&quot;5&quot;,&quot;container-title-short&quot;:&quot;&quot;},&quot;isTemporary&quot;:false},{&quot;id&quot;:&quot;78e5ab39-c37b-38c3-aa0b-2f3f590be445&quot;,&quot;itemData&quot;:{&quot;type&quot;:&quot;article-journal&quot;,&quot;id&quot;:&quot;78e5ab39-c37b-38c3-aa0b-2f3f590be445&quot;,&quot;title&quot;:&quot;Penerapan metode forward chaining dan certainty factor untuk mengetahui gangguan mental pada remaja&quot;,&quot;groupId&quot;:&quot;5d3d1151-c3fb-3f7b-bcf0-db626a6f9f8b&quot;,&quot;author&quot;:[{&quot;family&quot;:&quot;Mardivta&quot;,&quot;given&quot;:&quot;Hafizhah&quot;,&quot;parse-names&quot;:false,&quot;dropping-particle&quot;:&quot;&quot;,&quot;non-dropping-particle&quot;:&quot;&quot;}],&quot;container-title&quot;:&quot;Jurnal CoSciTech (Computer Science and Information Technology)&quot;,&quot;accessed&quot;:{&quot;date-parts&quot;:[[2025,5,14]]},&quot;DOI&quot;:&quot;10.37859/coscitech.v5i1.6716&quot;,&quot;ISSN&quot;:&quot;2723-5661&quot;,&quot;URL&quot;:&quot;https://doi.org/10.37859/coscitech.v5i1.6716&quot;,&quot;issued&quot;:{&quot;date-parts&quot;:[[2024,5,21]]},&quot;page&quot;:&quot;215-224&quot;,&quot;abstract&quot;:&quot;&lt;p&gt;Gangguan jiwa adalah suatu kondisi dimana orang yang mempunyai masalah atau gangguan mental, sosial pertumbuhan dan perkembangan sehingga menghambat dalam proses kehidupan dan berinteraksi dengan orang lain. Kesehatan mental dapat dipengaruhi oleh beberapa faktor, contohnya pertemanan, keluarga, gaya hidup, dan banyak faktor lainnya. Banyaknya masyarakat yang tidak ingin melakukan pemeriksaan mental pada psikolog dikarenakan beberapa faktor, yaitu masyarakat merasa malu dan takut menceritakan masalahnya, kurangnya pengetahuan terhadap gejala dan jenis gangguan kejiwaan tersebut, serta ketakutan dengan lingkungan sekitar. Salah satu cara untuk membantu dalam mengatasi masalah tersebut adalah menggunakan sistem pakar. Sistem pakar ini dibangun untuk mengetahui gangguan mental pada remaja dengan menggunakan metode Forward Chaining dan Certainty Factor. Metode Forward Chaining akan di kolaborasikan dengan metode Certainty Factor untuk meghitung tingkat akurasi jenis gangguan mental yang dialami. Pengunaan dua metode ini bertujuan untuk memberikan hasil lebih baik dalam mengetahui gangguan mental pada remaja. Data yang diambil pada penelitian ini adalah data gangguan mental pada Lembaga Psikologi UPI YPTK, data yang digunakan terdiri dari 50 data gejala dan 7 data penyakit. Hasil penelitian ini berupa aplikasi Sistem Pakar dengan menggunakan bahasa pemrograman PHP yang digunakan untuk mengetahui gangguan mental pada remaja. Dari pengujian yang telah dilakukan diperoleh hasil dengan tingkat akurasi sebesar 0.9998%. Aplikasi sistem pakar dapat digunakan untuk tindakan dini dalam mencegah gangguan mental pada remaja.&lt;/p&gt;&quot;,&quot;issue&quot;:&quot;1&quot;,&quot;volume&quot;:&quot;5&quot;,&quot;container-title-short&quot;:&quot;&quot;},&quot;isTemporary&quot;:false},{&quot;id&quot;:&quot;01f74660-2d97-3463-863e-3df852644ff6&quot;,&quot;itemData&quot;:{&quot;type&quot;:&quot;article-journal&quot;,&quot;id&quot;:&quot;01f74660-2d97-3463-863e-3df852644ff6&quot;,&quot;title&quot;:&quot;Implementasi Metode Dempster-Shafer Untuk Deteksi Kesehatan Mental Pada Mahasiswa Berbasis Web&quot;,&quot;groupId&quot;:&quot;5d3d1151-c3fb-3f7b-bcf0-db626a6f9f8b&quot;,&quot;author&quot;:[{&quot;family&quot;:&quot;Jalaluddin&quot;,&quot;given&quot;:&quot;Alif&quot;,&quot;parse-names&quot;:false,&quot;dropping-particle&quot;:&quot;&quot;,&quot;non-dropping-particle&quot;:&quot;&quot;},{&quot;family&quot;:&quot;Arumi&quot;,&quot;given&quot;:&quot;Endah Ratna&quot;,&quot;parse-names&quot;:false,&quot;dropping-particle&quot;:&quot;&quot;,&quot;non-dropping-particle&quot;:&quot;&quot;},{&quot;family&quot;:&quot;Sasongko&quot;,&quot;given&quot;:&quot;Dimas&quot;,&quot;parse-names&quot;:false,&quot;dropping-particle&quot;:&quot;&quot;,&quot;non-dropping-particle&quot;:&quot;&quot;},{&quot;family&quot;:&quot;Pinilih&quot;,&quot;given&quot;:&quot;Sambodo Sriadi&quot;,&quot;parse-names&quot;:false,&quot;dropping-particle&quot;:&quot;&quot;,&quot;non-dropping-particle&quot;:&quot;&quot;},{&quot;family&quot;:&quot;Yudatama&quot;,&quot;given&quot;:&quot;Uky&quot;,&quot;parse-names&quot;:false,&quot;dropping-particle&quot;:&quot;&quot;,&quot;non-dropping-particle&quot;:&quot;&quot;},{&quot;family&quot;:&quot;Arif Yudianto&quot;,&quot;given&quot;:&quot;Muhammad Resa&quot;,&quot;parse-names&quot;:false,&quot;dropping-particle&quot;:&quot;&quot;,&quot;non-dropping-particle&quot;:&quot;&quot;}],&quot;container-title&quot;:&quot;Journal of Computer System and Informatics (JoSYC)&quot;,&quot;accessed&quot;:{&quot;date-parts&quot;:[[2025,5,14]]},&quot;DOI&quot;:&quot;10.47065/josyc.v5i2.4830&quot;,&quot;ISSN&quot;:&quot;2714-8912&quot;,&quot;URL&quot;:&quot;https://doi.org/10.47065/josyc.v5i2.4830&quot;,&quot;issued&quot;:{&quot;date-parts&quot;:[[2024,2,28]]},&quot;page&quot;:&quot;416-429&quot;,&quot;abstract&quot;:&quot;&lt;p&gt;Mental health is a person's soul condition to budaptasi in its environment to feel happy or get the comfort of life, so as not to experience mental disorders. Often mental health is ignored by most people because it is different from physical health that can be seen directly with the eyes and can be identified easily. Lack of awareness of mental health in the life of the people of Indonesia and the assumption that a person who goes to psychologists is a person inseasonable, often the individual who actually undergoes mental health problems reluctant to get help from experts or deny that he does not have mental health problems. Limitations of time and costs are also one of the constraints of a student reluctant to get help from experts like psychologists. Therefore, a web-based expert system is built with a dempster-shafer method to use as detection on the student and allows the user to know whether the user has a tendency of the problem on its mental health or not before the official consultation is required from the expert. Testing Accuracy Comparison System between the results of the system and experts by using 100 correspondents from students at Muhammadiyah Magelang University (UNIMMA) 89% know mental health and 65% have experienced mental disorders. The results of the SRQ29 data used and were spread among campus students, this study has used 20 sample data and produces 70% expert suit compliance. From the results of expert suitability obtained from the calculation of the system by selecting symptoms and automatically the system will calculate the accuracy of the existing Belief Valident in every symptom. Then the system will take decisions based on the results of the largest calculation value.&lt;/p&gt;&quot;,&quot;issue&quot;:&quot;2&quot;,&quot;volume&quot;:&quot;5&quot;,&quot;container-title-short&quot;:&quot;&quot;},&quot;isTemporary&quot;:false},{&quot;id&quot;:&quot;ee44a731-5c3a-30b8-8521-f907e4f3762b&quot;,&quot;itemData&quot;:{&quot;type&quot;:&quot;article-journal&quot;,&quot;id&quot;:&quot;ee44a731-5c3a-30b8-8521-f907e4f3762b&quot;,&quot;title&quot;:&quot;PERANCANGAN USER INTERFACE DAN USER EXPERIENCE APLIKASI SAY.CO&quot;,&quot;groupId&quot;:&quot;5d3d1151-c3fb-3f7b-bcf0-db626a6f9f8b&quot;,&quot;author&quot;:[{&quot;family&quot;:&quot;Jamilah&quot;,&quot;given&quot;:&quot;Yulianti Siti&quot;,&quot;parse-names&quot;:false,&quot;dropping-particle&quot;:&quot;&quot;,&quot;non-dropping-particle&quot;:&quot;&quot;},{&quot;family&quot;:&quot;Padmasari&quot;,&quot;given&quot;:&quot;Ayung Candra&quot;,&quot;parse-names&quot;:false,&quot;dropping-particle&quot;:&quot;&quot;,&quot;non-dropping-particle&quot;:&quot;&quot;}],&quot;container-title&quot;:&quot;Tanra : Jurnal Desain Komunikasi Visual Fakultas Seni dan Desain Universitas Negeri Makassar&quot;,&quot;accessed&quot;:{&quot;date-parts&quot;:[[2025,5,14]]},&quot;URL&quot;:&quot;https://garuda.kemdikbud.go.id/documents/detail/2727291&quot;,&quot;issued&quot;:{&quot;date-parts&quot;:[[2022]]},&quot;page&quot;:&quot;73-78&quot;,&quot;abstract&quot;:&quot;Kesehatan mental memiliki pengaruh yang sangat penting dalam kehidupan manusia. Jika seseorang mengalami gangguan kesehatan mental, maka kehidupannya akan ikut terganggu. Maraknya kasus kesehatan mental yang terjadi saat ini menjadi permasalahan yang harus diatasi. Say.co merupakan aplikasi kesehatan mental yang dapat membantu para penderita gangguan kesehatan mental agar mendapatkan penanganan langsung dari ahlinya. Pada aplikasi ini terdapat beberapa fitur yang dapat berguna bagi penderita kesehatan mental, diantaranya adalah konsultasi, chat bot, rekomendasi kegiatan, rekomendasi lagu, rekomendasi makanan, mood board, dan informasi seputar kesehatan mental. Metode yang digunakan dalam perancangan aplikasi ini adalah studi literatur dan memperhatikan aspek penting yang harus ada dalam user interface dan user experience. Perancangan ini berguna untuk memberikan informasi mengenai fitur dan tampilan aplikasi say.co.&quot;,&quot;issue&quot;:&quot;1&quot;,&quot;volume&quot;:&quot;9&quot;,&quot;container-title-short&quot;:&quot;&quot;},&quot;isTemporary&quot;:false},{&quot;id&quot;:&quot;cd8c9f45-2a3b-3765-88c8-316da9a5b5a3&quot;,&quot;itemData&quot;:{&quot;type&quot;:&quot;thesis&quot;,&quot;id&quot;:&quot;cd8c9f45-2a3b-3765-88c8-316da9a5b5a3&quot;,&quot;title&quot;:&quot;Implementasi Algoritma RNN pada Pengembangan Aplikasi Web-Based Mental Illness Chatbox di Orbit Future Academy&quot;,&quot;groupId&quot;:&quot;5d3d1151-c3fb-3f7b-bcf0-db626a6f9f8b&quot;,&quot;author&quot;:[{&quot;family&quot;:&quot;Ismoyo&quot;,&quot;given&quot;:&quot;Maret&quot;,&quot;parse-names&quot;:false,&quot;dropping-particle&quot;:&quot;&quot;,&quot;non-dropping-particle&quot;:&quot;&quot;}],&quot;accessed&quot;:{&quot;date-parts&quot;:[[2025,5,14]]},&quot;URL&quot;:&quot;https://dirdosen.budiluhur.ac.id/0322038603/BKDGasal2022_2023/Bidang_A/Maret%20Ismoyo_LaporanKKP.pdf&quot;,&quot;abstract&quot;:&quot;Pemahaman masyarakat tentang kesehatan mental dan cara penanganannya\nmasih rendah karena kurangnya sosialisasi sehingga menimbulkan banyak mitos,\nstigma negatif, anggapan remeh dan kesalahpahaman. Memahami pengetahuan\nmanajemen kesehatan mental menjadi penting karena menurut informasi dari\nKementerian Kesehatan RI, masyarakat dan generasi muda saat ini lebih rentan\nterhadap gangguan kesehatan mental.\nAkhir-akhir ini kehadiran chatbot dapat menjadi salah satu solusi untuk\nmengatasi masalah tersebut. Pengembangan chatbot dapat digunakan sebagai\nsumber edukasi yang bertujuan untuk mensosialisasikan kesehatan mental di\nmasyarakat dan membantu masyarakat mendapatkan informasi tentang konselor\nsecara daring.\nRecurrrent Neural Network (RNN) merupakan suatu jaringan saraf berulang\nyang berguna untuk memproses data sekuensial, contohnya teks. RNN dianggap\nsuatu algoritma Artificial Intelligence (AI) yang cukup bagus untuk pengembangan\naplikasi chatbot. Pada penelitian ini, penulis mengembangkan aplikasi chatbot yang\ndapat berkomunikasi dengan masyarakat mengenai informasi kesehatan mental,\nsehingga edukasi mengenai kesehatan mental dapat diperoleh dengan mudah, cepat,\ntepat waktu dan praktis.&quot;,&quot;publisher&quot;:&quot;Universitas Budi Luhur&quot;,&quot;container-title-short&quot;:&quot;&quot;},&quot;isTemporary&quot;:false},{&quot;id&quot;:&quot;6db2726f-05bf-382e-abb1-80641fd4ff5f&quot;,&quot;itemData&quot;:{&quot;type&quot;:&quot;article-journal&quot;,&quot;id&quot;:&quot;6db2726f-05bf-382e-abb1-80641fd4ff5f&quot;,&quot;title&quot;:&quot;Rancang Bangun Sistem Pakar Psikologi Umum menggunakan Metode Forward Chaining&quot;,&quot;groupId&quot;:&quot;5d3d1151-c3fb-3f7b-bcf0-db626a6f9f8b&quot;,&quot;author&quot;:[{&quot;family&quot;:&quot;Fadlillah&quot;,&quot;given&quot;:&quot;Fahmi&quot;,&quot;parse-names&quot;:false,&quot;dropping-particle&quot;:&quot;&quot;,&quot;non-dropping-particle&quot;:&quot;&quot;},{&quot;family&quot;:&quot;Sutedi&quot;,&quot;given&quot;:&quot;Ade&quot;,&quot;parse-names&quot;:false,&quot;dropping-particle&quot;:&quot;&quot;,&quot;non-dropping-particle&quot;:&quot;&quot;},{&quot;family&quot;:&quot;Agustin&quot;,&quot;given&quot;:&quot;Yoga Handoko&quot;,&quot;parse-names&quot;:false,&quot;dropping-particle&quot;:&quot;&quot;,&quot;non-dropping-particle&quot;:&quot;&quot;}],&quot;container-title&quot;:&quot;Jurnal Algoritma&quot;,&quot;accessed&quot;:{&quot;date-parts&quot;:[[2025,5,14]]},&quot;DOI&quot;:&quot;10.33364/algoritma/v.19-2.1130&quot;,&quot;ISSN&quot;:&quot;2302-7339&quot;,&quot;URL&quot;:&quot;https://jurnal.itg.ac.id/index.php/algoritma/article/view/1130&quot;,&quot;issued&quot;:{&quot;date-parts&quot;:[[2022,11,30]]},&quot;page&quot;:&quot;493-504&quot;,&quot;abstract&quot;:&quot;&lt;p&gt;Gangguan psikologis adalah kondisi pikiran yang ditandai dengan perilaku yang tidak dapat diprediksi, suasana hati yang tidak stabil, dan masalah mental yang tidak dianggap sebagai bagian normal dari perkembangan manusia. Tujuan dari penelitian ini adalah untuk mengembangkan sistem pakar yang dapat digunakan oleh masyarakat umum di bawah bimbingan psikolog untuk mendiagnosis masalah kejiwaan dan membuat keputusan yang sesuai dengan aturan. Mesin inferensi yang digunakan yaitu metode Forward Chaining dan metodologi yang digunakan dalam pengembangan aplikasi ini adalah Ratinoal Unified Process (RUP) dengan tahapan Inception, Elaboration, Contruction, dan Transition. Model dan perancangan dalam penelitian ini menggunakan Unified Modeling Languange (UML). Hasil dari penelitian ini berupa Sistem Pakar Psikologi Umum Berbasis Web yang dapat mendiagnosa penyakit berdasarkan gejala yang didiagnosis menggunakan Metode Forward Chaining.&lt;/p&gt;&quot;,&quot;issue&quot;:&quot;2&quot;,&quot;volume&quot;:&quot;19&quot;,&quot;container-title-short&quot;:&quot;&quot;},&quot;isTemporary&quot;:false},{&quot;id&quot;:&quot;3bb48609-2274-3990-a0bc-81429a7aa212&quot;,&quot;itemData&quot;:{&quot;type&quot;:&quot;thesis&quot;,&quot;id&quot;:&quot;3bb48609-2274-3990-a0bc-81429a7aa212&quot;,&quot;title&quot;:&quot;Pengembangan Panduan Konseling Cognitive Behavior Teknik Desensitisasi Sistematis Berbasis Website Untuk Mengatasi Stress Pada Remaja Korban Kekerasan&quot;,&quot;groupId&quot;:&quot;5d3d1151-c3fb-3f7b-bcf0-db626a6f9f8b&quot;,&quot;author&quot;:[{&quot;family&quot;:&quot;Pebriyanti&quot;,&quot;given&quot;:&quot;Ni Putu Diah&quot;,&quot;parse-names&quot;:false,&quot;dropping-particle&quot;:&quot;&quot;,&quot;non-dropping-particle&quot;:&quot;&quot;}],&quot;accessed&quot;:{&quot;date-parts&quot;:[[2025,5,14]]},&quot;URL&quot;:&quot;https://repo.undiksha.ac.id/14291/&quot;,&quot;issued&quot;:{&quot;date-parts&quot;:[[2023]]},&quot;abstract&quot;:&quot;Penelitian ini bertujuan untuk mengembangkan dan menguji validitas buku panduan konseling cognitive behavior dan efektivitas teknik konseling desensitisasi sistematis untuk mengatasi stress pada remaja korban kekerasan. Penelitian ini termasuk pengembangan 4D yang dikemukakan oleh Thiagarajan (1974) (define, design, develop, disseminate). Lima orang ahli yang menjadi pakar dan praktisi bimbingan konseling dilibatkan dalam menguji validitas buku panduan. Instrumen penilaian yang dipakai terdiri dari 14 poin pernyataan yang mengacu pada validitas buku panduan. Analisis validitas memakai formula perhitungan Content Validity Ratio (CVR) dari Lawshe (1975). Perolehan menampakkan validitas isi (CVI) sebesar 1 yang berarti sangat baik. Hal ini menampakkan bahwasanya panduan konseling cognitive behavior teknik desensitisasi sistematis berbasis website yang dikembangkan telah memenuhi kriteria kelayakan. Uji efektvitas melibatkan 30 korban keekrasan dalam penelitian ini memakai desain penilitian one group pre-test and post-test design. Uji efektivitas ini dilakukan dengan menggunakn uji t, perolehan yang didapatkan yaitu thitung = 17,105 dan ttabel = 2,048 yang artinya poin thitung &gt; ttabel, perolehan ini menguraikan bahwasanya pengembangan panduan konseling cognitive behavior teknik desensitisasi sistematis berbasis website efektif untuk mengatasi stress pada remaja korban kekerasan.&quot;,&quot;publisher&quot;:&quot;Universitas Pendidikan Ganesha&quot;,&quot;container-title-short&quot;:&quot;&quot;},&quot;isTemporary&quot;:false},{&quot;id&quot;:&quot;9ff34c1e-57ef-3dcd-b1cc-1c1749b3a713&quot;,&quot;itemData&quot;:{&quot;type&quot;:&quot;article-journal&quot;,&quot;id&quot;:&quot;9ff34c1e-57ef-3dcd-b1cc-1c1749b3a713&quot;,&quot;title&quot;:&quot;K-Means Clustering untuk Visualisasi Informasi Pemanfaatan Aplikasi Deteksi Dini Depresi&quot;,&quot;groupId&quot;:&quot;5d3d1151-c3fb-3f7b-bcf0-db626a6f9f8b&quot;,&quot;author&quot;:[{&quot;family&quot;:&quot;Liliana&quot;,&quot;given&quot;:&quot;Dewi Yanti&quot;,&quot;parse-names&quot;:false,&quot;dropping-particle&quot;:&quot;&quot;,&quot;non-dropping-particle&quot;:&quot;&quot;},{&quot;family&quot;:&quot;Ermis&quot;,&quot;given&quot;:&quot;Iklima&quot;,&quot;parse-names&quot;:false,&quot;dropping-particle&quot;:&quot;&quot;,&quot;non-dropping-particle&quot;:&quot;&quot;},{&quot;family&quot;:&quot;Zain&quot;,&quot;given&quot;:&quot;Ayu Rosyida&quot;,&quot;parse-names&quot;:false,&quot;dropping-particle&quot;:&quot;&quot;,&quot;non-dropping-particle&quot;:&quot;&quot;},{&quot;family&quot;:&quot;Azza&quot;,&quot;given&quot;:&quot;Nurul Amala&quot;,&quot;parse-names&quot;:false,&quot;dropping-particle&quot;:&quot;&quot;,&quot;non-dropping-particle&quot;:&quot;&quot;}],&quot;container-title&quot;:&quot;Seminar Nasional Inovasi Vokasi&quot;,&quot;accessed&quot;:{&quot;date-parts&quot;:[[2025,5,14]]},&quot;URL&quot;:&quot;https://prosiding.pnj.ac.id/sniv/article/view/283&quot;,&quot;issued&quot;:{&quot;date-parts&quot;:[[2022]]},&quot;page&quot;:&quot;116-123&quot;,&quot;abstract&quot;:&quot;Perkembangan Teknologi Informasi dan kemajuan Kecerdasan Buatan dapat membantu manusia dalam mendapatkan akses layanan pakar psikolog dalam menyelesaikan permasalahan depresi dan dan gangguan kesehatan mental. Penelitian ini bertujuan menyajikan informasi visual berupa hasil pemanfaatan aplikasi sistem cerdas untuk deteksi dini depresi yang dapat menggambarkan kesehatan mental para pengguna aplikasi. Melalui aplikasi cerdas tersebut, pengguna mendapat hasil diagnosis dini gangguan kesehatan mental terkait depresi. Data dari para pengguna aplikasi ini kemudian diolah dengan metode K-Means clustering untuk menghasilkan informasi klaster depresi. Penyajian informasi divisualisasikan dengan diagram scatter untuk menggambarkan pengelompokan data depresi. K-Means clustering bekerja dengan mengelompokkan data pengguna berdasarkan kemiripan atribut yaitu umur, jenis kelamin, status pekerjaan, dan tingkat depresi yang diperoleh dari aplikasi berbasis Android yang diberi judul “Are you ok?”. Hasil eksperimen lalu dihitung menggunakan perhitungan indeks DBI serta metode Elbow dan Sillhoute untuk penentuan jumlah klaster optimal. Perhitungan menunjukkan klaster depresi dengan indeks DBI menghasilkan 6 klaster, sedangkan metode Elbow dan Silhouete menghasilkan 4 klaster. Klaster depresi yang terbentuk mengelompok secara natural berdasarkan kemiripan atributnya.&quot;,&quot;volume&quot;:&quot;1&quot;,&quot;container-title-short&quot;:&quot;&quot;},&quot;isTemporary&quot;:false},{&quot;id&quot;:&quot;1b9e0d51-09e2-3ffb-92b2-376781ee6fb0&quot;,&quot;itemData&quot;:{&quot;type&quot;:&quot;article-journal&quot;,&quot;id&quot;:&quot;1b9e0d51-09e2-3ffb-92b2-376781ee6fb0&quot;,&quot;title&quot;:&quot;Penerapan Metode Certainty Factor Dalam Diagnosis Gangguan Depresi&quot;,&quot;groupId&quot;:&quot;5d3d1151-c3fb-3f7b-bcf0-db626a6f9f8b&quot;,&quot;author&quot;:[{&quot;family&quot;:&quot;Hernawan&quot;,&quot;given&quot;:&quot;Septian Rico&quot;,&quot;parse-names&quot;:false,&quot;dropping-particle&quot;:&quot;&quot;,&quot;non-dropping-particle&quot;:&quot;&quot;},{&quot;family&quot;:&quot;Nugroho&quot;,&quot;given&quot;:&quot;Hanung Adi&quot;,&quot;parse-names&quot;:false,&quot;dropping-particle&quot;:&quot;&quot;,&quot;non-dropping-particle&quot;:&quot;&quot;},{&quot;family&quot;:&quot;Hidayah&quot;,&quot;given&quot;:&quot;Indriana&quot;,&quot;parse-names&quot;:false,&quot;dropping-particle&quot;:&quot;&quot;,&quot;non-dropping-particle&quot;:&quot;&quot;}],&quot;container-title&quot;:&quot;Journal of Computer System and Informatics (JoSYC)&quot;,&quot;accessed&quot;:{&quot;date-parts&quot;:[[2025,5,14]]},&quot;DOI&quot;:&quot;10.47065/josyc.v3i2.643&quot;,&quot;ISSN&quot;:&quot;2714-8912&quot;,&quot;URL&quot;:&quot;https://doi.org/10.47065/josyc.v3i2.643&quot;,&quot;issued&quot;:{&quot;date-parts&quot;:[[2022,2,28]]},&quot;page&quot;:&quot;65-72&quot;,&quot;abstract&quot;:&quot;&lt;p&gt;Globalization can cause several problems and pressures of mind for both individuals and groups. Various kinds of problems can certainly lead to psychological disorders, one of which is depression. Indonesia itself is one of the countries with a high number of people with depressive disorders. Depressive disorder itself can have many consequences ranging from lack of enthusiasm to even death. Facing these serious problems, the government should be able to address the mental disorder that is currently happening. However, the reality is still far from this. Inadequate infrastructure, equality problems for each region, and shortages of experts are the main problems at this time. The expert system is considered to be a solution in solving these problems. Web-based expert systems can replace the role of experts in the process of initial diagnosis of depressive disorders, patients can also access them easily. The calculation method implemented is the Certainty Factor method. This method is considered suitable in the diagnosis of depression. The implementation of the CF method in the diagnosis of depression can provide a confidence level of up to 94.9%. The expert system is expected to be able to eliminate human errors, speed up the diagnostic process, make it easier for health workers, and provide standards for related parties in handling mental disorders&lt;/p&gt;&quot;,&quot;issue&quot;:&quot;2&quot;,&quot;volume&quot;:&quot;3&quot;,&quot;container-title-short&quot;:&quot;&quot;},&quot;isTemporary&quot;:false},{&quot;id&quot;:&quot;727c1297-5451-3016-99e7-5d58105344e7&quot;,&quot;itemData&quot;:{&quot;type&quot;:&quot;article-journal&quot;,&quot;id&quot;:&quot;727c1297-5451-3016-99e7-5d58105344e7&quot;,&quot;title&quot;:&quot;Perancangan dan Pengembangan Video Game sebagai Media Terapi Depresi&quot;,&quot;groupId&quot;:&quot;5d3d1151-c3fb-3f7b-bcf0-db626a6f9f8b&quot;,&quot;author&quot;:[{&quot;family&quot;:&quot;Rachmawan&quot;,&quot;given&quot;:&quot;Rachmawan&quot;,&quot;parse-names&quot;:false,&quot;dropping-particle&quot;:&quot;&quot;,&quot;non-dropping-particle&quot;:&quot;&quot;},{&quot;family&quot;:&quot;Adnas&quot;,&quot;given&quot;:&quot;Diny Anggriani&quot;,&quot;parse-names&quot;:false,&quot;dropping-particle&quot;:&quot;&quot;,&quot;non-dropping-particle&quot;:&quot;&quot;}],&quot;container-title&quot;:&quot;Computer Based Information System Journal&quot;,&quot;accessed&quot;:{&quot;date-parts&quot;:[[2025,5,14]]},&quot;DOI&quot;:&quot;10.33884/cbis.v10i1.5443&quot;,&quot;ISSN&quot;:&quot;2621-5292&quot;,&quot;URL&quot;:&quot;https://doi.org/10.33884/cbis.v10i1.5443&quot;,&quot;issued&quot;:{&quot;date-parts&quot;:[[2022,3,27]]},&quot;page&quot;:&quot;62-71&quot;,&quot;abstract&quot;:&quot;&lt;p&gt;Depresi merupakan salah satu penyakit mental yang paling umum terjadi saat ini, penderita depresi biasanya memiliki gangguan emosional besar yang disebabkan oleh stress dan ketegangan yang dapat menimbulkan munculnya keinginan untuk bunuh diri seiring waktu. Teknologi telah berkembang pesat, terutama dalam bidang multimedia, multimedia membuat pengiriman seperti informasi dan pesan menjadi sangat cepat dan praktis di dalam waktu yang singkat. Video game termasuk ke dalam salah satu bidang di multimedia yang paling populer, video game memiliki popularitas yang besar khususnya generasi muda, video game dapat membantu mengurangi stress dan kecemasan pemainnya. Di penelitian ini, peniliti akan mengembangkan video game menggunakan salah satu game engine yang terkemuka yaitu Unity dengan metode Research and Development yang menggunakan model ADDIE (Analyze, Design, Develop, Implement, Evaluate). Video game yang dikembangkan merupakan game berbasis cerita tentang depresi dan perasaan dikucilkan. Hasil dari penelitian ini berupa game platformer 2D berbasis cerita pendek yang dibentuk dan disusun di Unity. Pengembangan ini diharapkan dapat membantu penderita depresi untuk melawan depresi dan meningkatkan kesadaran mengenai penyakit depresi di masyarakat luas.&lt;/p&gt;&quot;,&quot;issue&quot;:&quot;1&quot;,&quot;volume&quot;:&quot;10&quot;,&quot;container-title-short&quot;:&quot;&quot;},&quot;isTemporary&quot;:false},{&quot;id&quot;:&quot;a053e008-3354-3249-a6d4-394ba7bdadd8&quot;,&quot;itemData&quot;:{&quot;type&quot;:&quot;thesis&quot;,&quot;id&quot;:&quot;a053e008-3354-3249-a6d4-394ba7bdadd8&quot;,&quot;title&quot;:&quot;Rancang Bangun Platform Konsultasi Mental Online Berbasis Website dengan Implementasi Frontend Menggunakan ReactJS&quot;,&quot;groupId&quot;:&quot;5d3d1151-c3fb-3f7b-bcf0-db626a6f9f8b&quot;,&quot;author&quot;:[{&quot;family&quot;:&quot;Saputra&quot;,&quot;given&quot;:&quot;Muhammad Nur Rizqi&quot;,&quot;parse-names&quot;:false,&quot;dropping-particle&quot;:&quot;&quot;,&quot;non-dropping-particle&quot;:&quot;&quot;}],&quot;accessed&quot;:{&quot;date-parts&quot;:[[2025,5,14]]},&quot;URL&quot;:&quot;https://repository.nurulfikri.ac.id/id/eprint/491/&quot;,&quot;issued&quot;:{&quot;date-parts&quot;:[[2024]]},&quot;abstract&quot;:&quot;Penelitian ini merancang dan mengembangkan sebuah platform konsultasi mental online berbasis website dengan implementasi frontend menggunakan ReactJS. Latar belakang penelitian ini didasarkan pada meningkatnya kasus gangguan kesehatan mental di kalangan mahasiswa dan masyarakat umum, serta kebutuhan akan sarana konsultasi yang mudah diakses. Tujuan penelitian ini adalah untuk mengidentifikasi fitur-fitur yang diperlukan, merancang dan mengimplementasikan frontend yang responsif, serta melakukan pengujian untuk mengevaluasi kualitas platform. Metode pengembangan yang digunakan adalah Extreme Programming (XP), dengan penggunaan ReactJS sebagai library frontend. Hasil pengujian black box menunjukkan bahwa platform ini berfungsi sesuai dengan spesifikasi yang ditetapkan, dengan semua fitur utama beroperasi dengan baik dan tanpa kendala teknis yang berarti. Hasil pengujian beta testing menunjukkan nilai rata-rata keseluruhan 91.88%, yang menunjukkan bahwa platform ini menerima penilaian yang sangat baik dari pengguna, memenuhi atau melebihi harapan mereka dalam aspek responsif, interaktif, adaptif, dan kesesuaian kebutuhan pengguna. Kesimpulan dari penelitian ini adalah bahwa platform konsultasi mental online ini berhasil memenuhi kebutuhan pengguna dan siap digunakan secara efektif dalam memberikan layanan konsultasi mental.&quot;,&quot;publisher&quot;:&quot;Sekolah Tinggi Teknologi Terpadu Nurul Fikri&quot;,&quot;container-title-short&quot;:&quot;&quot;},&quot;isTemporary&quot;:false},{&quot;id&quot;:&quot;edc84815-40f3-3545-86fe-ba592d53ffa8&quot;,&quot;itemData&quot;:{&quot;type&quot;:&quot;article-journal&quot;,&quot;id&quot;:&quot;edc84815-40f3-3545-86fe-ba592d53ffa8&quot;,&quot;title&quot;:&quot;SISTEM PAKAR DIAGNOSA DEPRESI MAHASISWA TINGKAT AKHIR DENGAN METODE CERTAINTY FACTOR DAN FORWARD CHAINING&quot;,&quot;groupId&quot;:&quot;5d3d1151-c3fb-3f7b-bcf0-db626a6f9f8b&quot;,&quot;author&quot;:[{&quot;family&quot;:&quot;As Siddieq&quot;,&quot;given&quot;:&quot;Muhammad Fikrotul Ulya&quot;,&quot;parse-names&quot;:false,&quot;dropping-particle&quot;:&quot;&quot;,&quot;non-dropping-particle&quot;:&quot;&quot;}],&quot;container-title&quot;:&quot;Kohesi: Jurnal Sains dan Teknologi&quot;,&quot;accessed&quot;:{&quot;date-parts&quot;:[[2025,5,14]]},&quot;URL&quot;:&quot;https://ejournal.warunayama.org/index.php/kohesi/article/view/3715&quot;,&quot;issued&quot;:{&quot;date-parts&quot;:[[2024]]},&quot;page&quot;:&quot;1-10&quot;,&quot;abstract&quot;:&quot;Depresi adalah masalah kesehatan mental yang penting dan kompleks yang sering terjadi pada mahasiswa tingkat akhir. Penelitian ini bertujuan untuk merancang sistem pakar untuk mendiagnosis tingkat depresi pada mahasiswa menggunakan metode Certainty Factor dan Forward Chaining. Dengan menggabungkan kedua metode ini, sistem dapat memberikan diagnosis yang lebih akurat dan efisien berdasarkan gejala yang diamati. Hasil dari penelitian ini menunjukkan bahwa sistem pakar yang dikembangkan dapat memberikan diagnosis dengan tingkat kepastian yang tinggi, mendukung identifikasi depresi, dan memberikan rekomendasi penanganan yang sesuai. Sistem ini diharapkan dapat meningkatkan kesejahteraan mental mahasiswa tingkat akhir.&quot;,&quot;issue&quot;:&quot;7&quot;,&quot;volume&quot;:&quot;3&quot;,&quot;container-title-short&quot;:&quot;&quot;},&quot;isTemporary&quot;:false},{&quot;id&quot;:&quot;7f924eb7-6b2b-3917-9975-903531f933b0&quot;,&quot;itemData&quot;:{&quot;type&quot;:&quot;thesis&quot;,&quot;id&quot;:&quot;7f924eb7-6b2b-3917-9975-903531f933b0&quot;,&quot;title&quot;:&quot;Implementasi Machine Learning Untuk Mendeteksi Unsur Depresi Pada Tweet Menggunakan Metode NaÏve Bayes&quot;,&quot;groupId&quot;:&quot;5d3d1151-c3fb-3f7b-bcf0-db626a6f9f8b&quot;,&quot;author&quot;:[{&quot;family&quot;:&quot;Nurrochman&quot;,&quot;given&quot;:&quot;Miftah Meinaldi&quot;,&quot;parse-names&quot;:false,&quot;dropping-particle&quot;:&quot;&quot;,&quot;non-dropping-particle&quot;:&quot;&quot;},{&quot;family&quot;:&quot;Prasasti&quot;,&quot;given&quot;:&quot;Anggunmeka Luhur&quot;,&quot;parse-names&quot;:false,&quot;dropping-particle&quot;:&quot;&quot;,&quot;non-dropping-particle&quot;:&quot;&quot;},{&quot;family&quot;:&quot;Nugrahaeni&quot;,&quot;given&quot;:&quot;Ratna Astuti&quot;,&quot;parse-names&quot;:false,&quot;dropping-particle&quot;:&quot;&quot;,&quot;non-dropping-particle&quot;:&quot;&quot;}],&quot;accessed&quot;:{&quot;date-parts&quot;:[[2025,5,14]]},&quot;URL&quot;:&quot;https://openlibrarypublications.telkomuniversity.ac.id/index.php/engineering/article/view/16310&quot;,&quot;issued&quot;:{&quot;date-parts&quot;:[[2021]]},&quot;number-of-pages&quot;:&quot;6250-6257&quot;,&quot;abstract&quot;:&quot;Saat ini media sosial telah menjadi bagian hidup baru dalam masyarakat modern. Twitter adalah salah satu media sosial terpopuler. Batasan karakter saat melakukan tweet di Twitter membuat pesan yang disampaikan oleh pengguna menjadi sangat ringkas. Penggguna Twitter cenderung mengungkapkan perasaannya melalui unggahan tweet. Namun unggahan tweet belum tentu dapat dijadikan acuan secara nyata apakah unggahan tweet tersebut sesuai dengan perasaannya. Dalam penelitian ini menghasilkan sistem untuk mendeteksi unggahan tweet pada twitter terdapat unsur depresi atau tidak dengan metode Naïve Bayes. Metode klasifikasi yang digunakan untuk memberikan label kelas pada penelitian ini yaitu metode Naïve Bayes. Metode Naïve Bayes adalah metode klasifikasi penggolongan berdasarkan nilai probabilitas yang mudah untuk diimplementasikan pada tweet berupa teks. Dengan demikian, sistem dektesi unsur depresi pada tweet dengan Metode Naïve Bayes dapat mendeteksi sebuah postingan tweet mengandung unsur depresi atau tidak dengan nilai akurasi sebesar 74% pada pengujian rasio data, dan 73% pada pengujian validasi. Kata kunci: Twitter, tweet, Machine Learning, Depresi, Naïve Bayes.&quot;,&quot;publisher&quot;:&quot;Universitas Telkom&quot;,&quot;container-title-short&quot;:&quot;&quot;},&quot;isTemporary&quot;:false},{&quot;id&quot;:&quot;7fa96c96-d04a-3d18-8fc8-0e84a35ef0f6&quot;,&quot;itemData&quot;:{&quot;type&quot;:&quot;article-journal&quot;,&quot;id&quot;:&quot;7fa96c96-d04a-3d18-8fc8-0e84a35ef0f6&quot;,&quot;title&quot;:&quot;Analisis Efektivitas Aplikasi Luminds Dalam Mendukung Kesehatan Mental Generasi Z Menggunakan Analisis SWOT&quot;,&quot;groupId&quot;:&quot;5d3d1151-c3fb-3f7b-bcf0-db626a6f9f8b&quot;,&quot;author&quot;:[{&quot;family&quot;:&quot;Ariyanto&quot;,&quot;given&quot;:&quot;Steve&quot;,&quot;parse-names&quot;:false,&quot;dropping-particle&quot;:&quot;&quot;,&quot;non-dropping-particle&quot;:&quot;&quot;},{&quot;family&quot;:&quot;Eduardo&quot;,&quot;given&quot;:&quot;Farrell Ionwyn&quot;,&quot;parse-names&quot;:false,&quot;dropping-particle&quot;:&quot;&quot;,&quot;non-dropping-particle&quot;:&quot;&quot;},{&quot;family&quot;:&quot;Valentivo&quot;,&quot;given&quot;:&quot;Timothy&quot;,&quot;parse-names&quot;:false,&quot;dropping-particle&quot;:&quot;&quot;,&quot;non-dropping-particle&quot;:&quot;&quot;},{&quot;family&quot;:&quot;Stanislaw&quot;,&quot;given&quot;:&quot;William&quot;,&quot;parse-names&quot;:false,&quot;dropping-particle&quot;:&quot;&quot;,&quot;non-dropping-particle&quot;:&quot;&quot;},{&quot;family&quot;:&quot;Delisia&quot;,&quot;given&quot;:&quot;Julisen&quot;,&quot;parse-names&quot;:false,&quot;dropping-particle&quot;:&quot;&quot;,&quot;non-dropping-particle&quot;:&quot;&quot;}],&quot;container-title&quot;:&quot;TECHBUS (Technology, Business and Entrepreneurship)&quot;,&quot;accessed&quot;:{&quot;date-parts&quot;:[[2025,5,14]]},&quot;DOI&quot;:&quot;10.61245/techbus.v2i1.19&quot;,&quot;ISSN&quot;:&quot;2988-6635&quot;,&quot;URL&quot;:&quot;https://doi.org/10.61245/techbus.v2i1.19&quot;,&quot;issued&quot;:{&quot;date-parts&quot;:[[2024,7,8]]},&quot;page&quot;:&quot;10-25&quot;,&quot;abstract&quot;:&quot;&lt;p&gt;Depresi dan kecemasan merupakan gangguan mental yang sering dialami oleh Generasi Z. Penelitian dari University College London pada tahun 2021 menemukan bahwa tingkat depresi di kalangan Generasi Z dua pertiga lebih tinggi dibandingkan dengan milenial, menunjukkan perlunya intervensi yang efektif. Penelitian ini bertujuan untuk menganalisis efektivitas Luminds dalam mendukung kesehatan mental Generasi Z. Metode penelitian yang digunakan adalah kualitatif dengan pendekatan deskriptif, menggunakan tinjauan literatur dan kuesioner yang dianalisis melalui analisis SWOT. Hasil penelitian berdasarkan data kuesioner dari 77 responden Generasi Z yang merupakan pengguna awal yang telah menggunakan prototype aplikasi Luminds menunjukkan bahwa Luminds berada pada kuadran 1 dengan koordinat (2.46, 2.458) pada diagram SWOT, mengindikasikan penerapan strategi agresif. Ini menunjukkan bahwa Luminds efektif dalam meningkatkan kesehatan mental Generasi Z. Kontribusi penting dari penelitian ini adalah menunjukkan bagaimana teknologi, khususnya platform konsultasi online seperti Luminds, dapat berfungsi sebagai alat yang efektif dalam mendukung dan meningkatkan kesejahteraan mental Generasi Z. Penelitian ini juga menyoroti urgensi pemanfaatan teknologi digital dalam penanganan kesehatan mental, mengingat tingginya prevalensi gangguan mental di kalangan Generasi Z. Dampak signifikan dari studi ini adalah memberikan dasar ilmiah bagi pengembangan lebih lanjut dan implementasi teknologi kesehatan mental, serta menawarkan solusi yang dapat diakses secara luas untuk mengatasi krisis kesehatan mental pada Generasi Z. Temuan ini membuka peluang baru untuk inovasi dalam layanan kesehatan mental digital dan dapat menjadi referensi penting bagi pembuat kebijakan, penyedia layanan kesehatan, dan peneliti di bidang kesehatan mental.&lt;/p&gt;&quot;,&quot;issue&quot;:&quot;1&quot;,&quot;volume&quot;:&quot;2&quot;,&quot;container-title-short&quot;:&quot;&quot;},&quot;isTemporary&quot;:false},{&quot;id&quot;:&quot;317c40c4-9a6a-3d16-93ba-c61290492720&quot;,&quot;itemData&quot;:{&quot;type&quot;:&quot;article-journal&quot;,&quot;id&quot;:&quot;317c40c4-9a6a-3d16-93ba-c61290492720&quot;,&quot;title&quot;:&quot;SISTEM PAKAR DIAGNOSIS KESEHATAN MENTAL PADA MAHASISWA UNIVERSITAS AMIKOM PURWOKERTO&quot;,&quot;groupId&quot;:&quot;5d3d1151-c3fb-3f7b-bcf0-db626a6f9f8b&quot;,&quot;author&quot;:[{&quot;family&quot;:&quot;Nurhafiyah&quot;,&quot;given&quot;:&quot;Isti&quot;,&quot;parse-names&quot;:false,&quot;dropping-particle&quot;:&quot;&quot;,&quot;non-dropping-particle&quot;:&quot;&quot;},{&quot;family&quot;:&quot;Marcos&quot;,&quot;given&quot;:&quot;Hendra&quot;,&quot;parse-names&quot;:false,&quot;dropping-particle&quot;:&quot;&quot;,&quot;non-dropping-particle&quot;:&quot;&quot;}],&quot;container-title&quot;:&quot;Komputa : Jurnal Ilmiah Komputer dan Informatika&quot;,&quot;accessed&quot;:{&quot;date-parts&quot;:[[2025,5,14]]},&quot;DOI&quot;:&quot;10.34010/komputa.v12i1.8978&quot;,&quot;ISSN&quot;:&quot;2715-7849&quot;,&quot;URL&quot;:&quot;https://doi.org/10.34010/komputa.v12i1.8978&quot;,&quot;issued&quot;:{&quot;date-parts&quot;:[[2023,5,18]]},&quot;page&quot;:&quot;49-56&quot;,&quot;abstract&quot;:&quot;&lt;p&gt;Kesehatan mental sangatlah penting bagi kehidupan seseorang, terutama dalam bidang pendidikan khususnya dikalangan mahasiswa agar dapat belajar dengan lancar, maka semua mahasiswa harus dalam kondisi fisik dan mental yang baik. Mahasiswa Amikom Purwokerto menghadapi kendala, contohnya tidak adanya layanan konseling, tidak adanya waktu untuk konseling dikesibukan perkuliahan, dan biaya konseling di luaran cukup mahal. Penelitian ini dapat membantu permasalahan yaitu pembuatan sistem untuk mendiagnosa tingkat gangguan kesehatan mental mahasiswa Universitas Amikom Purwokerto. Pada penelitian ini, terdapat 3 jenis gangguan kesehatan mental yang akan diteliti  yaitu depresi, stress, dan gangguan kecemasan. Metode yang digunakan untuk analisa data yaitu menggunakan metode Certainty Factor, karena sesuai untuk pencarian fakta / hasil dalam proses diagnosa dalam menemukan nilai kebenaran. Dalam tahap pengujian UAT (User Acceptance Test)  dengan responden 15 orang mahasiswa dan pakar membuktikan kategori rata-rata yang baik hingga mencapai 91,55%, ini menunjukkan bahwa kinerja sistem yang dibuat telah memunuhi tujuan awal pembuatan.&lt;/p&gt;&quot;,&quot;issue&quot;:&quot;1&quot;,&quot;volume&quot;:&quot;12&quot;,&quot;container-title-short&quot;:&quot;&quot;},&quot;isTemporary&quot;:false},{&quot;id&quot;:&quot;0f1b8369-765c-3821-8e6f-de43543bd7d4&quot;,&quot;itemData&quot;:{&quot;type&quot;:&quot;thesis&quot;,&quot;id&quot;:&quot;0f1b8369-765c-3821-8e6f-de43543bd7d4&quot;,&quot;title&quot;:&quot;Sistem Pakar Diagnosa Mandiri Mental Illness (Gangguan Jiwa) Menggunakan Metode Kombinasi Certainty Factor Dan Forward Chaining Pada Remaja Berbasis Android&quot;,&quot;groupId&quot;:&quot;5d3d1151-c3fb-3f7b-bcf0-db626a6f9f8b&quot;,&quot;author&quot;:[{&quot;family&quot;:&quot;Dwi Rahmadani Ivan&quot;,&quot;given&quot;:&quot;Diana&quot;,&quot;parse-names&quot;:false,&quot;dropping-particle&quot;:&quot;&quot;,&quot;non-dropping-particle&quot;:&quot;&quot;}],&quot;accessed&quot;:{&quot;date-parts&quot;:[[2025,5,14]]},&quot;URL&quot;:&quot;http://repository.uinsu.ac.id/15556/&quot;,&quot;issued&quot;:{&quot;date-parts&quot;:[[2022]]},&quot;abstract&quot;:&quot;Mental Illness atau Gangguan jiwa merupakan suatu sindrom yang menggangu pola pikir atau psikologik yang mengganggu kegiatan disfungsi kesehariannya. Berdasarkan data yang terkumpul dalam profil kesehatan indonesia berhasil menunjukkan betapa tingginya orang yang menderita gangguan jiwa di Indonesia yang belum tertangani dengan baik. Sangat berbanding terbalik dengan jumlah psikolog dan psikater yang ada di Indonesia saat ini. Masyarakat seringkali bersetigma bahwa mental illness merupakan gangguan yang berada di luar nalar atau biasa disebut dengan hal mistis hingga masyarakat menanggap tabu untuk memeriksakan diri ke psikolog atau psikiater. Dalam penelitian ini menggunakan metode certainty factor dan forward chaining yaitu metode yang bekerja dalam ketidak pastian pakar yang sering kali seorang pakar menganalisa informasi yang ada dengan ketidak pastian. Pengkomputasian diagnosa gangguan mentall illness dapat membantu masyarakat dalam memahami kondisi jiwanya tanpa harus bertemu dengan psikolog dan psikater terlebih dahulu yang didalamnya mencakup 62 gejala dan 10 penyakit.&quot;,&quot;publisher&quot;:&quot;Universitas Islam Negeri Sumatera Utara Medan&quot;,&quot;container-title-short&quot;:&quot;&quot;},&quot;isTemporary&quot;:false},{&quot;id&quot;:&quot;fb7dcb8d-ab71-3345-b13b-60331209663d&quot;,&quot;itemData&quot;:{&quot;type&quot;:&quot;thesis&quot;,&quot;id&quot;:&quot;fb7dcb8d-ab71-3345-b13b-60331209663d&quot;,&quot;title&quot;:&quot;Pengembangan aplikasi skrining kesehatan mental&quot;,&quot;groupId&quot;:&quot;5d3d1151-c3fb-3f7b-bcf0-db626a6f9f8b&quot;,&quot;author&quot;:[{&quot;family&quot;:&quot;Khoirot&quot;,&quot;given&quot;:&quot;Umdatul&quot;,&quot;parse-names&quot;:false,&quot;dropping-particle&quot;:&quot;&quot;,&quot;non-dropping-particle&quot;:&quot;&quot;},{&quot;family&quot;:&quot;Astutik&quot;,&quot;given&quot;:&quot;Fuji&quot;,&quot;parse-names&quot;:false,&quot;dropping-particle&quot;:&quot;&quot;,&quot;non-dropping-particle&quot;:&quot;&quot;},{&quot;family&quot;:&quot;Furqon&quot;,&quot;given&quot;:&quot;M Arif&quot;,&quot;parse-names&quot;:false,&quot;dropping-particle&quot;:&quot;&quot;,&quot;non-dropping-particle&quot;:&quot;&quot;},{&quot;family&quot;:&quot;Suseno&quot;,&quot;given&quot;:&quot;Achsan&quot;,&quot;parse-names&quot;:false,&quot;dropping-particle&quot;:&quot;&quot;,&quot;non-dropping-particle&quot;:&quot;&quot;},{&quot;family&quot;:&quot;Alvasa&quot;,&quot;given&quot;:&quot;Bia&quot;,&quot;parse-names&quot;:false,&quot;dropping-particle&quot;:&quot;&quot;,&quot;non-dropping-particle&quot;:&quot;&quot;},{&quot;family&quot;:&quot;Nurdiansyah&quot;,&quot;given&quot;:&quot;&quot;,&quot;parse-names&quot;:false,&quot;dropping-particle&quot;:&quot;&quot;,&quot;non-dropping-particle&quot;:&quot;&quot;}],&quot;accessed&quot;:{&quot;date-parts&quot;:[[2025,5,14]]},&quot;URL&quot;:&quot;http://repository.uin-malang.ac.id/12963/&quot;,&quot;issued&quot;:{&quot;date-parts&quot;:[[2022]]},&quot;abstract&quot;:&quot;Penelitian ini bertujuan untuk mengembangkan aplikasi skrining kesehatan mental yang dapat membantu individu untuk mengenali gejala yang dialami dan mengurangi risiko gangguan kesehatan mental masyarakat. Metode yang digunakan adalah penelitian pengembangan menggunakan pendekatan ADDIE. Instrumen yang digunakan sebagai skiring adalah DASS 42. Hasil menunjukkan bahwa setelah melalui tahap pengembangan dan uji coba, aplikasi skrining kesehatan mental efektif untuk mengenali gejala-gejala awal gangguan kesehatan mental dan memungkinkan pengguna untuk mencatat gejala yang dialami secara berkala. Penelitian ini diharapkan dapat memberikan kontribusi dalam upaya pencegahan dan penanganan gangguan kesehatan mental dengan memanfaatkan teknologi informasi yang semakin canggih sehingga dapat di jangkau oleh masyarakat luas.&quot;,&quot;publisher&quot;:&quot;Universitas Islam Negeri Maulana Malik Ibrahim Malang&quot;,&quot;container-title-short&quot;:&quot;&quot;},&quot;isTemporary&quot;:false},{&quot;id&quot;:&quot;4e7e2fba-28ad-3217-8783-a7e03eba27ec&quot;,&quot;itemData&quot;:{&quot;type&quot;:&quot;article-journal&quot;,&quot;id&quot;:&quot;4e7e2fba-28ad-3217-8783-a7e03eba27ec&quot;,&quot;title&quot;:&quot;PENGARUH PSIKOEDUKASI DENGAN APLIKASI SDASI BERBASIS LAYANAN ANDROID TERHADAP TINGKAT DEPRESI, ANSIETAS DAN STRES PADA REMAJA&quot;,&quot;groupId&quot;:&quot;5d3d1151-c3fb-3f7b-bcf0-db626a6f9f8b&quot;,&quot;author&quot;:[{&quot;family&quot;:&quot;Effendi&quot;,&quot;given&quot;:&quot;Zulian&quot;,&quot;parse-names&quot;:false,&quot;dropping-particle&quot;:&quot;&quot;,&quot;non-dropping-particle&quot;:&quot;&quot;},{&quot;family&quot;:&quot;Maryatun&quot;,&quot;given&quot;:&quot;Sri&quot;,&quot;parse-names&quot;:false,&quot;dropping-particle&quot;:&quot;&quot;,&quot;non-dropping-particle&quot;:&quot;&quot;},{&quot;family&quot;:&quot;Herliawati&quot;,&quot;given&quot;:&quot;&quot;,&quot;parse-names&quot;:false,&quot;dropping-particle&quot;:&quot;&quot;,&quot;non-dropping-particle&quot;:&quot;&quot;}],&quot;container-title&quot;:&quot;Jurnal Keperawatan Sriwijaya&quot;,&quot;accessed&quot;:{&quot;date-parts&quot;:[[2025,5,14]]},&quot;DOI&quot;:&quot;10.32539/jks.v9i1.142&quot;,&quot;ISSN&quot;:&quot;2684-9712&quot;,&quot;URL&quot;:&quot;https://doi.org/10.32539/jks.v9i1.142&quot;,&quot;issued&quot;:{&quot;date-parts&quot;:[[2022,7,13]]},&quot;page&quot;:&quot;7-12&quot;,&quot;abstract&quot;:&quot;&lt;p&gt;Tujuan: Penelitian ini bertujuan untuk mengetahui untuk mengetahui pengaruh psikoedukasi melalui aplikasi SDASI terhadap tingkat depresi, ansietas dan stres pada remaja korban bullying. Metode: Penelitian ini menggunakan pendekatan quasi experiment dengan rancangan one grup pre-post test design. Jumlah responden sebanyak 30 remaja. Pengambilan sampel menggunakan purposive sampling. Pemberian edukasi diberikan secara berkelompok menggunakan media aplikasi android SDASI sebanyak dua kali pertemuan. Data dikumpulkan dengan menggunakan kuesioner pada pre test dan post test. Hasil: Hasil uji statistik dengan uji dependent t-Test menunjukkan bahwa terjadi penurunan skor sebelum dan sesudah dilakukan psikoedukasi melalui aplikasi SDASI dengan nilai p=0,001. Simpulan: Psikoedukasi melalui aplikasi SDASI secara signifikan dapat menurunkan tingkat depresi, ansietas dan stress pada remaja korban bullying.&lt;/p&gt;&quot;,&quot;issue&quot;:&quot;1&quot;,&quot;volume&quot;:&quot;9&quot;,&quot;container-title-short&quot;:&quot;&quot;},&quot;isTemporary&quot;:false},{&quot;id&quot;:&quot;f7442ae9-8f9b-3095-bf04-adbc974793bb&quot;,&quot;itemData&quot;:{&quot;type&quot;:&quot;article-journal&quot;,&quot;id&quot;:&quot;f7442ae9-8f9b-3095-bf04-adbc974793bb&quot;,&quot;title&quot;:&quot;Implementation of User Centered Design on Interface Design for Mental Health Selfcare Services&quot;,&quot;groupId&quot;:&quot;5d3d1151-c3fb-3f7b-bcf0-db626a6f9f8b&quot;,&quot;author&quot;:[{&quot;family&quot;:&quot;Pranata&quot;,&quot;given&quot;:&quot;Rizky Wira&quot;,&quot;parse-names&quot;:false,&quot;dropping-particle&quot;:&quot;&quot;,&quot;non-dropping-particle&quot;:&quot;&quot;},{&quot;family&quot;:&quot;Herdiani&quot;,&quot;given&quot;:&quot;Anisa&quot;,&quot;parse-names&quot;:false,&quot;dropping-particle&quot;:&quot;&quot;,&quot;non-dropping-particle&quot;:&quot;&quot;},{&quot;family&quot;:&quot;Hadikusuma&quot;,&quot;given&quot;:&quot;Aristyo&quot;,&quot;parse-names&quot;:false,&quot;dropping-particle&quot;:&quot;&quot;,&quot;non-dropping-particle&quot;:&quot;&quot;}],&quot;container-title&quot;:&quot;JURNAL MEDIA INFORMATIKA BUDIDARMA&quot;,&quot;accessed&quot;:{&quot;date-parts&quot;:[[2025,5,14]]},&quot;DOI&quot;:&quot;10.30865/mib.v6i4.4540&quot;,&quot;ISSN&quot;:&quot;2548-8368&quot;,&quot;URL&quot;:&quot;https://doi.org/10.30865/mib.v6i4.4540&quot;,&quot;issued&quot;:{&quot;date-parts&quot;:[[2022,10,25]]},&quot;page&quot;:&quot;1891&quot;,&quot;abstract&quot;:&quot;&lt;p&gt;Mental health is essential in performing maximum activities. During the COVID-19 pandemic that is spreading all over the world. Some activities are transformed into a new activity called \&quot;New Normal\&quot;. With these new activities, the level of mental health in Indonesia has deteriorated. WHO as a world health organization made a mental health pyramid that handling of every level of mental health. There are 4 levels, which are promotive, preventive, monitoring and identifying psychosocial services, and specialist services. In the results of observations and analysis, digital-based services in Indonesia prioritize levels 3 and 4, while levels 1 and 2 are still infrequent, and the application is still not perfectly weighted. This study will design a mental health application by emphasizing level 1 and 2 treatment, namely self-care and storytelling sessions using the User Centered Design method, and the results of the evaluation used the usability testing method and the usability scale system. With this research, potential users obtain an interface resolution with a mood tracker, self-care, and storytelling features that users desire. By helping the user to perceive the history of the condition, getting self-care and storytelling rooms according to the user's condition, and helping the user's condition to bolster up and not add to the burden of the user's condition. The outcome of the evaluation that has been done, results that the average user completed each task for 16.59 seconds, the average result is 0 miss click and 0 miss click page, and the results from the System Usability Scale are 81.51 with the \&quot;Excellent\&quot; category, with the composition of solutions provided to answer user problems.&lt;/p&gt;&quot;,&quot;issue&quot;:&quot;4&quot;,&quot;volume&quot;:&quot;6&quot;,&quot;container-title-short&quot;:&quot;&quot;},&quot;isTemporary&quot;:false},{&quot;id&quot;:&quot;6bccae5a-9820-3637-8bbc-3b3a9d92158b&quot;,&quot;itemData&quot;:{&quot;type&quot;:&quot;thesis&quot;,&quot;id&quot;:&quot;6bccae5a-9820-3637-8bbc-3b3a9d92158b&quot;,&quot;title&quot;:&quot;Aplikasi Relaxation (Yurelax) Untuk Menjaga Kesehatan Mental Pada Remaja Berbasis Android&quot;,&quot;groupId&quot;:&quot;5d3d1151-c3fb-3f7b-bcf0-db626a6f9f8b&quot;,&quot;author&quot;:[{&quot;family&quot;:&quot;Sari&quot;,&quot;given&quot;:&quot;Shindi Fatika&quot;,&quot;parse-names&quot;:false,&quot;dropping-particle&quot;:&quot;&quot;,&quot;non-dropping-particle&quot;:&quot;&quot;}],&quot;accessed&quot;:{&quot;date-parts&quot;:[[2025,5,14]]},&quot;URL&quot;:&quot;https://sipora.polije.ac.id/13081/&quot;,&quot;issued&quot;:{&quot;date-parts&quot;:[[2022]]},&quot;abstract&quot;:&quot;Berdasarkan data Riskesdas (Riset Kesehatan Dasar) 2018 menunjukkan bahwa, gangguan mental yang ditunjukkan dengan gejala depresi atau kecemasan pada remaja di usia 15 keatas mencapai sekitar 6,1% dari jumlah penduduk Indonesia, atau setara dengan 11 juta orang. Salah satu cara dalam menjaga kesehatan mental adalah dengan relaksasi. Relaksasi merupakan proses merilekskan otot-otot tubuh dan pikiran yang mengalami ketegangan agar tercapai kondisi yang nyaman (Akbar, 2019). Salah satu Teknik relaksasi adalah dengan meditasi. Dengan menggunakan meditasi dapat membuat tubuh dan pikiran menjadi segar, rileks dan berfikir positif yang pada akhirnya dapat menurunkan tingkat kecemasan, depresi dan stress (Tristaningrat, 2020). Selain meditasi, yoga juga dapat merelaksasi tubuh dan pikiran sehingga terasa lebih sehat, segar, rileks dan kesehatan mental tetap terjaga. Begitu juga dengan musik relaksasi, musik untuk relaksasi umumnya merupakan musik dengan tempo yang lambat dan instrumen melodik, sehingga membuat pendengar merasa lebih rileks, dan tenang. Maka solusi untuk mengatasi permasalahan tersebut dengan membuat aplikasi Relaksasi (YuRelax) sebagai media untuk menjaga kesehatan mental pada remaja. Pengembangan aplikasi ini menggunakan metode Waterfall. Dengan adanya aplikasi YuRelax pengguna mendapat berbagai panduan meditasi dan edukasi seputar kesehatan mental dengan berbagai tema, terdapat juga kumpulan musik relaksasi, serta panduan yoga yang disertai gambar animasi pada aplikasi ini, hal ini dapat membuat pengguna merasa lebih nyaman, rileks, tenang, berfikir positif, dapat mengontrol emosi dan sehat sehingga Kesehatan mental tetap terjaga. Selain itu pengguna juga dapat memantau mood atau suasana hati, dengan mencatatnya setiap hari, sehingga dapat melihat perubahan moodnya dari hari ke hari.&quot;,&quot;container-title-short&quot;:&quot;&quot;},&quot;isTemporary&quot;:false},{&quot;id&quot;:&quot;d3dcbe63-8844-3f04-93d9-08dc448c847e&quot;,&quot;itemData&quot;:{&quot;type&quot;:&quot;article-journal&quot;,&quot;id&quot;:&quot;d3dcbe63-8844-3f04-93d9-08dc448c847e&quot;,&quot;title&quot;:&quot;ANALISA UI/UX APLIKASI DIAGNOSA GANGGUAN DEPRESI MAYOR DAN GANGGUAN DEPRESI DISMITIK BERBASIS ANDROID&quot;,&quot;groupId&quot;:&quot;5d3d1151-c3fb-3f7b-bcf0-db626a6f9f8b&quot;,&quot;author&quot;:[{&quot;family&quot;:&quot;Pasifik&quot;,&quot;given&quot;:&quot;Rico Bagus&quot;,&quot;parse-names&quot;:false,&quot;dropping-particle&quot;:&quot;&quot;,&quot;non-dropping-particle&quot;:&quot;&quot;},{&quot;family&quot;:&quot;Basuki&quot;,&quot;given&quot;:&quot;Bambang Minto&quot;,&quot;parse-names&quot;:false,&quot;dropping-particle&quot;:&quot;&quot;,&quot;non-dropping-particle&quot;:&quot;&quot;},{&quot;family&quot;:&quot;Badri&quot;,&quot;given&quot;:&quot;Fawaidul&quot;,&quot;parse-names&quot;:false,&quot;dropping-particle&quot;:&quot;&quot;,&quot;non-dropping-particle&quot;:&quot;&quot;}],&quot;container-title&quot;:&quot;Science World Electro&quot;,&quot;accessed&quot;:{&quot;date-parts&quot;:[[2025,5,14]]},&quot;URL&quot;:&quot;https://jim.unisma.ac.id/index.php/jte/article/view/25333&quot;,&quot;issued&quot;:{&quot;date-parts&quot;:[[2024]]},&quot;abstract&quot;:&quot;Dalam era digital yang semakin maju, kehadiran aplikasi kesehatan mental menjadi semakin penting, terutama dalam mendiagnosa kondisi seperti depresi. Meskipun demikian, terdapat risiko besar terhadap fenomena diagnosa sendiri atau self-diagnose yang dapat mengakibatkan penanganan yang tidak tepat dan berbahaya bagi individu. Penelitian ini bertujuan untuk merancang dan mengembangkan sebuah aplikasi diagnostik depresi yang dapat mengurangi risiko self-diagnose melalui pendekatan berbasis teknologi yang akurat dan terintegrasi dengan profesional kesehatan mental. Aplikasi ini dirancang dengan beberapa fitur utama, termasuk kuesioner berbasis bukti yang divalidasi oleh psikolog klinis, dan rujukan langsung ke professional atau membuat janji temu dengan psikiater, aplikasi ini juga menyediakan edukasi tentang depresi dan artikel tentang depresi dan penangananya. Hasil pengujian awal menunjukkan bahwa aplikasi ini mampu memberikan penilaian yang lebih akurat dan mendorong pengguna untuk mencari bantuan profesional. Diharapkan dengan adanya aplikasi ini, dapat membantu mengurangi insiden self-diagnose yang salah dan memberikan dukungan yang lebih baik bagi individu yang mungkin menderita depresi. Penelitian ini berkontribusi dalam pengembangan solusi digital yang bertanggung jawab dan berbasis bukti untuk masalah kesehatan mental, sekaligus mempromosikan kolaborasi antara teknologi dan tenaga profesional kesehatan dalam memberikan perawatan yang optimal.&quot;,&quot;issue&quot;:&quot;5&quot;,&quot;volume&quot;:&quot;17&quot;,&quot;container-title-short&quot;:&quot;&quot;},&quot;isTemporary&quot;:false},{&quot;id&quot;:&quot;6b66b61a-bb24-378c-9463-ee1b1545fa83&quot;,&quot;itemData&quot;:{&quot;type&quot;:&quot;article-journal&quot;,&quot;id&quot;:&quot;6b66b61a-bb24-378c-9463-ee1b1545fa83&quot;,&quot;title&quot;:&quot;Analisis Kebutuhan dan Desain Berbasis Metode UX Journey untuk Pengembangan Aplikasi Terapi Mandiri bagi Individu dengan Gangguan Depresi&quot;,&quot;groupId&quot;:&quot;5d3d1151-c3fb-3f7b-bcf0-db626a6f9f8b&quot;,&quot;author&quot;:[{&quot;family&quot;:&quot;Gathayu&quot;,&quot;given&quot;:&quot;Muhammad&quot;,&quot;parse-names&quot;:false,&quot;dropping-particle&quot;:&quot;&quot;,&quot;non-dropping-particle&quot;:&quot;&quot;},{&quot;family&quot;:&quot;Kusuma&quot;,&quot;given&quot;:&quot;Wahyu Andhyka&quot;,&quot;parse-names&quot;:false,&quot;dropping-particle&quot;:&quot;&quot;,&quot;non-dropping-particle&quot;:&quot;&quot;},{&quot;family&quot;:&quot;Wiyono&quot;,&quot;given&quot;:&quot;Briansyah Setio&quot;,&quot;parse-names&quot;:false,&quot;dropping-particle&quot;:&quot;&quot;,&quot;non-dropping-particle&quot;:&quot;&quot;}],&quot;container-title&quot;:&quot;Jurnal Repositor&quot;,&quot;accessed&quot;:{&quot;date-parts&quot;:[[2025,5,14]]},&quot;DOI&quot;:&quot;10.22219/repositor.v6i3.32453&quot;,&quot;ISSN&quot;:&quot;2716-1382&quot;,&quot;URL&quot;:&quot;https://doi.org/10.22219/repositor.v6i3.32453&quot;,&quot;issued&quot;:{&quot;date-parts&quot;:[[2024,7,22]]},&quot;abstract&quot;:&quot;&lt;p&gt;Prevalensi depresi di Indonesia, pada dewasa muda melaporkan prevalensi nasional sebesar 29,3% untuk depresi sedang dan 8% untuk depresi berat. Sedangkan, pada penelitian lain, pada orang dewasa yang lebih tua melaporkan prevalensi depresi sebesar 16,3%. Pada survei lain, pada saat Indonesia mengalami covid menunjukkan angka depresi meningkat 12 juta orang berusia di atas 15 tahun mengalami depresi. Namun Tingkat pengobatan depresi hanya mencapai 9% dan ketersediaan aplikasi terapi mandiri yang sesuai dengan kebutuhan individu depresi mungkin masih terbatas. Metode penelitian yang digunakan adalah UX Journey, untuk menemukan kebutuhan dan harapan pengguna dengan fokus mengembangkan fitur-fitur yang sesuai dengan kebutuhan pengguna. Hasil penelitian menunjukkan peningkatan signifikan dalam tiga variabel variable behaviour dengan variabel pertama meningkat dari 55% menjadi 70%, variabel kedua meningkat dari 56% menjadi 77% dan variabel ketiga meningkat dari 73% menjadi 76% penelitian ini memberikan kontribusi positif dalam meningkatkan pengalaman pengguna. selain itu, dilakukan validitas dengan menggunakan acceptance criteria yang menghasilkan tervalidasi dan memenuhi kebutuhan pengguna dan verifikasi dengan menggunakan daftar periksa dan metrik persyaratan yang menghasilkan terverifikasi dari dua perspektif yaitu peneliti dan empat rekan sejawat. Dari analisa kebutuhan dan solusi desain yang dihasilkan pada penelitian ini, kedua hal tersebut dapat memberikan variabel apa saja yang dapat meningkatkan pengalaman pengguna.&lt;/p&gt;&quot;,&quot;issue&quot;:&quot;3&quot;,&quot;volume&quot;:&quot;6&quot;,&quot;container-title-short&quot;:&quot;&quot;},&quot;isTemporary&quot;:false},{&quot;id&quot;:&quot;f06a716e-ebef-3efd-a4cc-a7aa3ca002dc&quot;,&quot;itemData&quot;:{&quot;type&quot;:&quot;article-journal&quot;,&quot;id&quot;:&quot;f06a716e-ebef-3efd-a4cc-a7aa3ca002dc&quot;,&quot;title&quot;:&quot;RANCANG BANGUN APLIKASI PENDETEKSI WAJAH TERHADAP KESEHATAN MENTAL PADA REMAJA&quot;,&quot;groupId&quot;:&quot;5d3d1151-c3fb-3f7b-bcf0-db626a6f9f8b&quot;,&quot;author&quot;:[{&quot;family&quot;:&quot;Marsujitullah&quot;,&quot;given&quot;:&quot;&quot;,&quot;parse-names&quot;:false,&quot;dropping-particle&quot;:&quot;&quot;,&quot;non-dropping-particle&quot;:&quot;&quot;},{&quot;family&quot;:&quot;Sariman&quot;,&quot;given&quot;:&quot;Farid&quot;,&quot;parse-names&quot;:false,&quot;dropping-particle&quot;:&quot;&quot;,&quot;non-dropping-particle&quot;:&quot;&quot;},{&quot;family&quot;:&quot;Rahangmetan&quot;,&quot;given&quot;:&quot;Klemens A&quot;,&quot;parse-names&quot;:false,&quot;dropping-particle&quot;:&quot;&quot;,&quot;non-dropping-particle&quot;:&quot;&quot;},{&quot;family&quot;:&quot;Akbar&quot;,&quot;given&quot;:&quot;Muh.&quot;,&quot;parse-names&quot;:false,&quot;dropping-particle&quot;:&quot;&quot;,&quot;non-dropping-particle&quot;:&quot;&quot;},{&quot;family&quot;:&quot;Kakerissa&quot;,&quot;given&quot;:&quot;Yance&quot;,&quot;parse-names&quot;:false,&quot;dropping-particle&quot;:&quot;&quot;,&quot;non-dropping-particle&quot;:&quot;&quot;}],&quot;container-title&quot;:&quot;Musamus Journal of Research Information and Communication Technology&quot;,&quot;accessed&quot;:{&quot;date-parts&quot;:[[2025,5,14]]},&quot;URL&quot;:&quot;https://ejournal.unmus.ac.id/index.php/mjrict/article/view/4598&quot;,&quot;issued&quot;:{&quot;date-parts&quot;:[[2022]]},&quot;abstract&quot;:&quot;Pengenalan ekspresi wajah sangat penting sebelum pengguna melakukan konsultasi kesehatan\nmental. Pengenalan wajah didasarkan pada identifikasi dan pengenalan citra manusia pada gambar\nterlepas dari posisi, ukuran dan kondisi. Pengenalan wajah menjadi faktor penting dalam\npembuatan rancang bangun aplikasi pendeteksi wajah terhadap kesehatan mental pada remaja.\nMenjaga kesehatan mental remaja menjadi hal yang perlu diperhatikan, karna gangguan mental\ndapat memepengaruhi seseorang dalam beraktivitas dan dapat menurunkan kondisi fisik.\nPenelitian yang berjudul â€œPerancangan Aplikasi Pendeteksi Wajah Terhadap Kesehatan Mental\nPada Remajaâ€ nantinya akan dibuat sebuah aplikasi dengan menggunakan metode Viola-Jones.\nMetode ini akan medeteksi pengguna dimana nanti akan diinput kedalam suatu aplikasi yang\nakan membaca ekspresi wajah dan mendiagnosa gangguan kejiwaan dari pengguna aplikasi ini.&quot;,&quot;issue&quot;:&quot;2&quot;,&quot;volume&quot;:&quot;4&quot;,&quot;container-title-short&quot;:&quot;&quot;},&quot;isTemporary&quot;:false},{&quot;id&quot;:&quot;6d5d2480-13ba-3504-ba5c-96c53d77612b&quot;,&quot;itemData&quot;:{&quot;type&quot;:&quot;article-journal&quot;,&quot;id&quot;:&quot;6d5d2480-13ba-3504-ba5c-96c53d77612b&quot;,&quot;title&quot;:&quot;Android-based Application for Depression, Anxiety, and Stress Screening&quot;,&quot;groupId&quot;:&quot;5d3d1151-c3fb-3f7b-bcf0-db626a6f9f8b&quot;,&quot;author&quot;:[{&quot;family&quot;:&quot;Endriyani&quot;,&quot;given&quot;:&quot;Sri&quot;,&quot;parse-names&quot;:false,&quot;dropping-particle&quot;:&quot;&quot;,&quot;non-dropping-particle&quot;:&quot;&quot;},{&quot;family&quot;:&quot;Susanti&quot;,&quot;given&quot;:&quot;Eva&quot;,&quot;parse-names&quot;:false,&quot;dropping-particle&quot;:&quot;&quot;,&quot;non-dropping-particle&quot;:&quot;&quot;}],&quot;container-title&quot;:&quot;Poltekita: Jurnal Ilmu Kesehatan&quot;,&quot;accessed&quot;:{&quot;date-parts&quot;:[[2025,5,14]]},&quot;URL&quot;:&quot;https://jurnal.poltekkespalu.ac.id/index.php/JIK/article/view/3169&quot;,&quot;issued&quot;:{&quot;date-parts&quot;:[[2024,2]]},&quot;page&quot;:&quot;1486-1492&quot;,&quot;abstract&quot;:&quot;The escalating issue of emotional and mental disorders, such as stress, anxiety, and depression, necessitates proactive measures to anticipate adverse effects on individuals experiencing them. One of the ways is by implementing a screening method. An android-based screening application can offer immediate feedback about an individual’s mental health condition. This study employs a research and development approach encompassing the preliminary study, model development, and model validation. The outcome of this study was an initial design for an Android-based screening application, DeAs Care, which aims to measure the levels of depression, anxiety, and stress in individuals. The DeAs Care application underwent evaluation by a group of 15 adolescent participants, all between the ages of 18 and 20. The assessment employed a Likert scale with a range of 1 to 5. The results indicated an overall satisfaction rate of 85%, corresponding to a ‘Very Good’ rating. The application was utilized on 216 adolescent participants to evaluate their levels of depression, anxiety, and stress. The assessment results indicate that the subsequent proportions of participants received a diagnosis of depression: 21% of the participants reported experiencing mild depression, while 20% showed moderate depression. Additionally, 8% had severe depression, and 6% had extremely severe depression. The other 45% of participants indicated they were in normal conditions. As for the participants' anxiety levels, the results of the assessments showed that 15% of them had mild anxiety, 31% had moderate anxiety, 23% had severe anxiety, 16% had extremely severe anxiety, and 15% of them were in a normal state. Furthermore, concerning stress levels, the study found that 20% of individuals had mild stress, 24% experienced moderate stress, 6% experienced severe stress, and 1% experienced extremely high stress levels. In comparison, the remaining 50% reported normal stress levels. The findings indicate that utilizing the DeAs Care Android application for screening adolescent mental health is an effective method for preventing issues related to mental and emotional disorders through self-assessment.&quot;,&quot;issue&quot;:&quot;4&quot;,&quot;volume&quot;:&quot;17&quot;,&quot;container-title-short&quot;:&quot;&quot;},&quot;isTemporary&quot;:false},{&quot;id&quot;:&quot;58a5a550-d3d5-3c63-8893-418695784bff&quot;,&quot;itemData&quot;:{&quot;type&quot;:&quot;article-journal&quot;,&quot;id&quot;:&quot;58a5a550-d3d5-3c63-8893-418695784bff&quot;,&quot;title&quot;:&quot;Kombinasi Metode Certainty Factor dan Forward Chaining Dalam Sistem Pakar Diagnosis Mandiri Mental Illness&quot;,&quot;groupId&quot;:&quot;5d3d1151-c3fb-3f7b-bcf0-db626a6f9f8b&quot;,&quot;author&quot;:[{&quot;family&quot;:&quot;Diana&quot;,&quot;given&quot;:&quot;Dwi Rahmadani Ivan&quot;,&quot;parse-names&quot;:false,&quot;dropping-particle&quot;:&quot;&quot;,&quot;non-dropping-particle&quot;:&quot;&quot;},{&quot;family&quot;:&quot;Samsudin&quot;,&quot;given&quot;:&quot;&quot;,&quot;parse-names&quot;:false,&quot;dropping-particle&quot;:&quot;&quot;,&quot;non-dropping-particle&quot;:&quot;&quot;},{&quot;family&quot;:&quot;Irawan&quot;,&quot;given&quot;:&quot;Muhammad Dedi&quot;,&quot;parse-names&quot;:false,&quot;dropping-particle&quot;:&quot;&quot;,&quot;non-dropping-particle&quot;:&quot;&quot;}],&quot;container-title&quot;:&quot;Jurnal Ilmiah Teknik Informatika dan Sistem Informasi&quot;,&quot;accessed&quot;:{&quot;date-parts&quot;:[[2025,5,14]]},&quot;URL&quot;:&quot;https://ojs.stmik-banjarbaru.ac.id/index.php/jutisi/article/view/1380/891&quot;,&quot;issued&quot;:{&quot;date-parts&quot;:[[2023]]},&quot;page&quot;:&quot;1427-1438&quot;,&quot;abstract&quot;:&quot;Penyakit mental atau gangguan kejiwaan adalah sindrom yang mengganggu pola pikir atau\npsikologi seseorang, menyebabkan disfungsi aktivitas sehari-hari. Data yang dikumpulkan\ndalam profil kesehatan Indonesia menunjukkan tingginya prevalensi gangguan jiwa yang tidak\ndiobati. Ini sangat kontras dengan jumlah psikolog dan psikiater yang tersedia di negara ini.\nStigma masyarakat terhadap gangguan jiwa menyebabkan banyak yang menganggapnya\nsebagai hal mistis dan enggan memeriksakan diri. Penelitian ini menggunakan metode certainty\nfactor dan forward chaining untuk mengatasi ketidakpastian dalam menganalisis informasi dari\npakar. Aplikasi yang dibangun berbasis android yang akan memudahkan pasien dalam\nmengakses dan mendiagnosa penyakit yang diderita. Dengan penghitungan diagnosa mental\nillness yang melibatkan 62 gejala dan 10 penyakit, kombinasi metode certainty factor dan\nforward chaining menghasilkan nilai akurasi sistem dan pakar yang sama. Hal ini menunjukkan\nkeefektifan kedua pendekatan tersebut jika digabungkan.&quot;,&quot;issue&quot;:&quot;3&quot;,&quot;volume&quot;:&quot;12&quot;,&quot;container-title-short&quot;:&quot;&quot;},&quot;isTemporary&quot;:false},{&quot;id&quot;:&quot;be1e9dd6-4df6-38fd-9787-cd73e298f0c7&quot;,&quot;itemData&quot;:{&quot;type&quot;:&quot;article-journal&quot;,&quot;id&quot;:&quot;be1e9dd6-4df6-38fd-9787-cd73e298f0c7&quot;,&quot;title&quot;:&quot;SISTEM PAKAR GANGGUAN DEPRESI PADA ANAK&quot;,&quot;groupId&quot;:&quot;5d3d1151-c3fb-3f7b-bcf0-db626a6f9f8b&quot;,&quot;author&quot;:[{&quot;family&quot;:&quot;Maharani&quot;,&quot;given&quot;:&quot;Aldila&quot;,&quot;parse-names&quot;:false,&quot;dropping-particle&quot;:&quot;&quot;,&quot;non-dropping-particle&quot;:&quot;&quot;},{&quot;family&quot;:&quot;Nilma&quot;,&quot;given&quot;:&quot;Nilma&quot;,&quot;parse-names&quot;:false,&quot;dropping-particle&quot;:&quot;&quot;,&quot;non-dropping-particle&quot;:&quot;&quot;},{&quot;family&quot;:&quot;Irawan&quot;,&quot;given&quot;:&quot;Ari&quot;,&quot;parse-names&quot;:false,&quot;dropping-particle&quot;:&quot;&quot;,&quot;non-dropping-particle&quot;:&quot;&quot;}],&quot;container-title&quot;:&quot;NUANSA INFORMATIKA&quot;,&quot;accessed&quot;:{&quot;date-parts&quot;:[[2025,5,14]]},&quot;DOI&quot;:&quot;10.25134/nuansa.v15i1.3418&quot;,&quot;ISSN&quot;:&quot;2614-5405&quot;,&quot;URL&quot;:&quot;https://journal.uniku.ac.id/index.php/ilkom/article/view/3418&quot;,&quot;issued&quot;:{&quot;date-parts&quot;:[[2021,1,18]]},&quot;page&quot;:&quot;1&quot;,&quot;abstract&quot;:&quot;&lt;p&gt;Sistem pakar merupakan salah satu aplikasi dari kecerdasan buatan (Artificial Intelegence). Tujuan dari sistem pakar bukan untuk menggantikan posisi seorang pakar tetapi lebih menginformasikan dan memasyaraktkan pengetahuan dari seorang pakar. Gangguan psikologi pada anak banyak yang kurang disadari oleh orang tua dan pengajar yang menyebabkan terlambatnya penanganan pada anak. Tujuan dari penelitian dan dibuatnya aplikasi ini untuk membantu pengguna mendapatkan informasi mengenai gejala-gejala awal pada gangguan psikologis dan membantu mendiagnosa gangguan psikologi anak lebih awal. Aplikasi sistem pakar ini menggunakan Java sebagai Bahasa pemrograman dan menggunakan metode forward chaining. Sistem pakar ini mampu membantu dan mempermudah pengguna dalam memperoleh informasi gangguan psikologi pada anak khususnya mengenai depresi (depresi mayor, depresi persisten, gangguan bipolar dan depresi psikotis).&lt;/p&gt;&quot;,&quot;issue&quot;:&quot;1&quot;,&quot;volume&quot;:&quot;15&quot;,&quot;container-title-short&quot;:&quot;&quot;},&quot;isTemporary&quot;:false}]},{&quot;citationID&quot;:&quot;MENDELEY_CITATION_06083ad9-e7e2-4e97-a414-e08df94d089b&quot;,&quot;properties&quot;:{&quot;noteIndex&quot;:0},&quot;isEdited&quot;:false,&quot;manualOverride&quot;:{&quot;isManuallyOverridden&quot;:false,&quot;citeprocText&quot;:&quot;[93]&quot;,&quot;manualOverrideText&quot;:&quot;&quot;},&quot;citationTag&quot;:&quot;MENDELEY_CITATION_v3_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&quot;,&quot;citationItems&quot;:[{&quot;id&quot;:&quot;0858dd0c-a32e-3907-a4db-8fc6bfebdc93&quot;,&quot;itemData&quot;:{&quot;type&quot;:&quot;article-journal&quot;,&quot;id&quot;:&quot;0858dd0c-a32e-3907-a4db-8fc6bfebdc93&quot;,&quot;title&quot;:&quot;Mental health literacy measures evaluating knowledge, attitudes and help-seeking: a scoping review&quot;,&quot;author&quot;:[{&quot;family&quot;:&quot;Wei&quot;,&quot;given&quot;:&quot;Yifeng&quot;,&quot;parse-names&quot;:false,&quot;dropping-particle&quot;:&quot;&quot;,&quot;non-dropping-particle&quot;:&quot;&quot;},{&quot;family&quot;:&quot;McGrath&quot;,&quot;given&quot;:&quot;Patrick J.&quot;,&quot;parse-names&quot;:false,&quot;dropping-particle&quot;:&quot;&quot;,&quot;non-dropping-particle&quot;:&quot;&quot;},{&quot;family&quot;:&quot;Hayden&quot;,&quot;given&quot;:&quot;Jill&quot;,&quot;parse-names&quot;:false,&quot;dropping-particle&quot;:&quot;&quot;,&quot;non-dropping-particle&quot;:&quot;&quot;},{&quot;family&quot;:&quot;Kutcher&quot;,&quot;given&quot;:&quot;Stan&quot;,&quot;parse-names&quot;:false,&quot;dropping-particle&quot;:&quot;&quot;,&quot;non-dropping-particle&quot;:&quot;&quot;}],&quot;container-title&quot;:&quot;BMC Psychiatry&quot;,&quot;container-title-short&quot;:&quot;BMC Psychiatry&quot;,&quot;DOI&quot;:&quot;10.1186/s12888-015-0681-9&quot;,&quot;ISSN&quot;:&quot;1471-244X&quot;,&quot;issued&quot;:{&quot;date-parts&quot;:[[2015,12,17]]},&quot;page&quot;:&quot;291&quot;,&quot;issue&quot;:&quot;1&quot;,&quot;volume&quot;:&quot;15&quot;},&quot;isTemporary&quot;:false,&quot;suppress-author&quot;:false,&quot;composite&quot;:false,&quot;author-only&quot;:false}]},{&quot;citationID&quot;:&quot;MENDELEY_CITATION_3158d268-5d52-4b22-a447-d23714518d4f&quot;,&quot;properties&quot;:{&quot;noteIndex&quot;:0},&quot;isEdited&quot;:false,&quot;manualOverride&quot;:{&quot;isManuallyOverridden&quot;:false,&quot;citeprocText&quot;:&quot;[93]&quot;,&quot;manualOverrideText&quot;:&quot;&quot;},&quot;citationTag&quot;:&quot;MENDELEY_CITATION_v3_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&quot;,&quot;citationItems&quot;:[{&quot;id&quot;:&quot;0858dd0c-a32e-3907-a4db-8fc6bfebdc93&quot;,&quot;itemData&quot;:{&quot;type&quot;:&quot;article-journal&quot;,&quot;id&quot;:&quot;0858dd0c-a32e-3907-a4db-8fc6bfebdc93&quot;,&quot;title&quot;:&quot;Mental health literacy measures evaluating knowledge, attitudes and help-seeking: a scoping review&quot;,&quot;author&quot;:[{&quot;family&quot;:&quot;Wei&quot;,&quot;given&quot;:&quot;Yifeng&quot;,&quot;parse-names&quot;:false,&quot;dropping-particle&quot;:&quot;&quot;,&quot;non-dropping-particle&quot;:&quot;&quot;},{&quot;family&quot;:&quot;McGrath&quot;,&quot;given&quot;:&quot;Patrick J.&quot;,&quot;parse-names&quot;:false,&quot;dropping-particle&quot;:&quot;&quot;,&quot;non-dropping-particle&quot;:&quot;&quot;},{&quot;family&quot;:&quot;Hayden&quot;,&quot;given&quot;:&quot;Jill&quot;,&quot;parse-names&quot;:false,&quot;dropping-particle&quot;:&quot;&quot;,&quot;non-dropping-particle&quot;:&quot;&quot;},{&quot;family&quot;:&quot;Kutcher&quot;,&quot;given&quot;:&quot;Stan&quot;,&quot;parse-names&quot;:false,&quot;dropping-particle&quot;:&quot;&quot;,&quot;non-dropping-particle&quot;:&quot;&quot;}],&quot;container-title&quot;:&quot;BMC Psychiatry&quot;,&quot;container-title-short&quot;:&quot;BMC Psychiatry&quot;,&quot;DOI&quot;:&quot;10.1186/s12888-015-0681-9&quot;,&quot;ISSN&quot;:&quot;1471-244X&quot;,&quot;issued&quot;:{&quot;date-parts&quot;:[[2015,12,17]]},&quot;page&quot;:&quot;291&quot;,&quot;issue&quot;:&quot;1&quot;,&quot;volume&quot;:&quot;15&quot;},&quot;isTemporary&quot;:false,&quot;suppress-author&quot;:false,&quot;composite&quot;:false,&quot;author-only&quot;:false}]},{&quot;citationID&quot;:&quot;MENDELEY_CITATION_4eafc0f6-5f6d-4583-85c7-14ff0d4b657e&quot;,&quot;properties&quot;:{&quot;noteIndex&quot;:0},&quot;isEdited&quot;:false,&quot;manualOverride&quot;:{&quot;isManuallyOverridden&quot;:false,&quot;citeprocText&quot;:&quot;[93]&quot;,&quot;manualOverrideText&quot;:&quot;&quot;},&quot;citationTag&quot;:&quot;MENDELEY_CITATION_v3_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&quot;,&quot;citationItems&quot;:[{&quot;id&quot;:&quot;0858dd0c-a32e-3907-a4db-8fc6bfebdc93&quot;,&quot;itemData&quot;:{&quot;type&quot;:&quot;article-journal&quot;,&quot;id&quot;:&quot;0858dd0c-a32e-3907-a4db-8fc6bfebdc93&quot;,&quot;title&quot;:&quot;Mental health literacy measures evaluating knowledge, attitudes and help-seeking: a scoping review&quot;,&quot;author&quot;:[{&quot;family&quot;:&quot;Wei&quot;,&quot;given&quot;:&quot;Yifeng&quot;,&quot;parse-names&quot;:false,&quot;dropping-particle&quot;:&quot;&quot;,&quot;non-dropping-particle&quot;:&quot;&quot;},{&quot;family&quot;:&quot;McGrath&quot;,&quot;given&quot;:&quot;Patrick J.&quot;,&quot;parse-names&quot;:false,&quot;dropping-particle&quot;:&quot;&quot;,&quot;non-dropping-particle&quot;:&quot;&quot;},{&quot;family&quot;:&quot;Hayden&quot;,&quot;given&quot;:&quot;Jill&quot;,&quot;parse-names&quot;:false,&quot;dropping-particle&quot;:&quot;&quot;,&quot;non-dropping-particle&quot;:&quot;&quot;},{&quot;family&quot;:&quot;Kutcher&quot;,&quot;given&quot;:&quot;Stan&quot;,&quot;parse-names&quot;:false,&quot;dropping-particle&quot;:&quot;&quot;,&quot;non-dropping-particle&quot;:&quot;&quot;}],&quot;container-title&quot;:&quot;BMC Psychiatry&quot;,&quot;container-title-short&quot;:&quot;BMC Psychiatry&quot;,&quot;DOI&quot;:&quot;10.1186/s12888-015-0681-9&quot;,&quot;ISSN&quot;:&quot;1471-244X&quot;,&quot;issued&quot;:{&quot;date-parts&quot;:[[2015,12,17]]},&quot;page&quot;:&quot;291&quot;,&quot;issue&quot;:&quot;1&quot;,&quot;volume&quot;:&quot;15&quot;},&quot;isTemporary&quot;:false,&quot;suppress-author&quot;:false,&quot;composite&quot;:false,&quot;author-only&quot;:false}]},{&quot;citationID&quot;:&quot;MENDELEY_CITATION_c5fc5d25-d883-432b-bc86-9a1b544e6651&quot;,&quot;properties&quot;:{&quot;noteIndex&quot;:0},&quot;isEdited&quot;:false,&quot;manualOverride&quot;:{&quot;isManuallyOverridden&quot;:false,&quot;citeprocText&quot;:&quot;[93]&quot;,&quot;manualOverrideText&quot;:&quot;&quot;},&quot;citationTag&quot;:&quot;MENDELEY_CITATION_v3_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&quot;,&quot;citationItems&quot;:[{&quot;id&quot;:&quot;0858dd0c-a32e-3907-a4db-8fc6bfebdc93&quot;,&quot;itemData&quot;:{&quot;type&quot;:&quot;article-journal&quot;,&quot;id&quot;:&quot;0858dd0c-a32e-3907-a4db-8fc6bfebdc93&quot;,&quot;title&quot;:&quot;Mental health literacy measures evaluating knowledge, attitudes and help-seeking: a scoping review&quot;,&quot;author&quot;:[{&quot;family&quot;:&quot;Wei&quot;,&quot;given&quot;:&quot;Yifeng&quot;,&quot;parse-names&quot;:false,&quot;dropping-particle&quot;:&quot;&quot;,&quot;non-dropping-particle&quot;:&quot;&quot;},{&quot;family&quot;:&quot;McGrath&quot;,&quot;given&quot;:&quot;Patrick J.&quot;,&quot;parse-names&quot;:false,&quot;dropping-particle&quot;:&quot;&quot;,&quot;non-dropping-particle&quot;:&quot;&quot;},{&quot;family&quot;:&quot;Hayden&quot;,&quot;given&quot;:&quot;Jill&quot;,&quot;parse-names&quot;:false,&quot;dropping-particle&quot;:&quot;&quot;,&quot;non-dropping-particle&quot;:&quot;&quot;},{&quot;family&quot;:&quot;Kutcher&quot;,&quot;given&quot;:&quot;Stan&quot;,&quot;parse-names&quot;:false,&quot;dropping-particle&quot;:&quot;&quot;,&quot;non-dropping-particle&quot;:&quot;&quot;}],&quot;container-title&quot;:&quot;BMC Psychiatry&quot;,&quot;container-title-short&quot;:&quot;BMC Psychiatry&quot;,&quot;DOI&quot;:&quot;10.1186/s12888-015-0681-9&quot;,&quot;ISSN&quot;:&quot;1471-244X&quot;,&quot;issued&quot;:{&quot;date-parts&quot;:[[2015,12,17]]},&quot;page&quot;:&quot;291&quot;,&quot;issue&quot;:&quot;1&quot;,&quot;volume&quot;:&quot;15&quot;},&quot;isTemporary&quot;:false,&quot;suppress-author&quot;:false,&quot;composite&quot;:false,&quot;author-only&quot;:false}]},{&quot;citationID&quot;:&quot;MENDELEY_CITATION_4dc94e2a-9180-4d96-a17a-6517b7015b99&quot;,&quot;properties&quot;:{&quot;noteIndex&quot;:0},&quot;isEdited&quot;:false,&quot;manualOverride&quot;:{&quot;isManuallyOverridden&quot;:false,&quot;citeprocText&quot;:&quot;[93]&quot;,&quot;manualOverrideText&quot;:&quot;&quot;},&quot;citationTag&quot;:&quot;MENDELEY_CITATION_v3_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&quot;,&quot;citationItems&quot;:[{&quot;id&quot;:&quot;0858dd0c-a32e-3907-a4db-8fc6bfebdc93&quot;,&quot;itemData&quot;:{&quot;type&quot;:&quot;article-journal&quot;,&quot;id&quot;:&quot;0858dd0c-a32e-3907-a4db-8fc6bfebdc93&quot;,&quot;title&quot;:&quot;Mental health literacy measures evaluating knowledge, attitudes and help-seeking: a scoping review&quot;,&quot;author&quot;:[{&quot;family&quot;:&quot;Wei&quot;,&quot;given&quot;:&quot;Yifeng&quot;,&quot;parse-names&quot;:false,&quot;dropping-particle&quot;:&quot;&quot;,&quot;non-dropping-particle&quot;:&quot;&quot;},{&quot;family&quot;:&quot;McGrath&quot;,&quot;given&quot;:&quot;Patrick J.&quot;,&quot;parse-names&quot;:false,&quot;dropping-particle&quot;:&quot;&quot;,&quot;non-dropping-particle&quot;:&quot;&quot;},{&quot;family&quot;:&quot;Hayden&quot;,&quot;given&quot;:&quot;Jill&quot;,&quot;parse-names&quot;:false,&quot;dropping-particle&quot;:&quot;&quot;,&quot;non-dropping-particle&quot;:&quot;&quot;},{&quot;family&quot;:&quot;Kutcher&quot;,&quot;given&quot;:&quot;Stan&quot;,&quot;parse-names&quot;:false,&quot;dropping-particle&quot;:&quot;&quot;,&quot;non-dropping-particle&quot;:&quot;&quot;}],&quot;container-title&quot;:&quot;BMC Psychiatry&quot;,&quot;container-title-short&quot;:&quot;BMC Psychiatry&quot;,&quot;DOI&quot;:&quot;10.1186/s12888-015-0681-9&quot;,&quot;ISSN&quot;:&quot;1471-244X&quot;,&quot;issued&quot;:{&quot;date-parts&quot;:[[2015,12,17]]},&quot;page&quot;:&quot;291&quot;,&quot;issue&quot;:&quot;1&quot;,&quot;volume&quot;:&quot;15&quot;},&quot;isTemporary&quot;:false,&quot;suppress-author&quot;:false,&quot;composite&quot;:false,&quot;author-only&quot;:false}]},{&quot;citationID&quot;:&quot;MENDELEY_CITATION_8d451afa-26f0-4abb-bf8c-269b39ed7dc7&quot;,&quot;properties&quot;:{&quot;noteIndex&quot;:0},&quot;isEdited&quot;:false,&quot;manualOverride&quot;:{&quot;isManuallyOverridden&quot;:false,&quot;citeprocText&quot;:&quot;[94]&quot;,&quot;manualOverrideText&quot;:&quot;&quot;},&quot;citationTag&quot;:&quot;MENDELEY_CITATION_v3_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&quot;,&quot;citationItems&quot;:[{&quot;id&quot;:&quot;60e31fe7-6168-3e41-b961-1a82b3bd9219&quot;,&quot;itemData&quot;:{&quot;type&quot;:&quot;article-journal&quot;,&quot;id&quot;:&quot;60e31fe7-6168-3e41-b961-1a82b3bd9219&quot;,&quot;title&quot;:&quot;The Importance of User Segmentation for Designing Digital Therapy for Adolescent Mental Health: Findings From Scoping Processes&quot;,&quot;author&quot;:[{&quot;family&quot;:&quot;Fleming&quot;,&quot;given&quot;:&quot;Theresa&quot;,&quot;parse-names&quot;:false,&quot;dropping-particle&quot;:&quot;&quot;,&quot;non-dropping-particle&quot;:&quot;&quot;},{&quot;family&quot;:&quot;Merry&quot;,&quot;given&quot;:&quot;Sally&quot;,&quot;parse-names&quot;:false,&quot;dropping-particle&quot;:&quot;&quot;,&quot;non-dropping-particle&quot;:&quot;&quot;},{&quot;family&quot;:&quot;Stasiak&quot;,&quot;given&quot;:&quot;Karolina&quot;,&quot;parse-names&quot;:false,&quot;dropping-particle&quot;:&quot;&quot;,&quot;non-dropping-particle&quot;:&quot;&quot;},{&quot;family&quot;:&quot;Hopkins&quot;,&quot;given&quot;:&quot;Sarah&quot;,&quot;parse-names&quot;:false,&quot;dropping-particle&quot;:&quot;&quot;,&quot;non-dropping-particle&quot;:&quot;&quot;},{&quot;family&quot;:&quot;Patolo&quot;,&quot;given&quot;:&quot;Tony&quot;,&quot;parse-names&quot;:false,&quot;dropping-particle&quot;:&quot;&quot;,&quot;non-dropping-particle&quot;:&quot;&quot;},{&quot;family&quot;:&quot;Ruru&quot;,&quot;given&quot;:&quot;Stacey&quot;,&quot;parse-names&quot;:false,&quot;dropping-particle&quot;:&quot;&quot;,&quot;non-dropping-particle&quot;:&quot;&quot;},{&quot;family&quot;:&quot;Latu&quot;,&quot;given&quot;:&quot;Manusiu&quot;,&quot;parse-names&quot;:false,&quot;dropping-particle&quot;:&quot;&quot;,&quot;non-dropping-particle&quot;:&quot;&quot;},{&quot;family&quot;:&quot;Shepherd&quot;,&quot;given&quot;:&quot;Matthew&quot;,&quot;parse-names&quot;:false,&quot;dropping-particle&quot;:&quot;&quot;,&quot;non-dropping-particle&quot;:&quot;&quot;},{&quot;family&quot;:&quot;Christie&quot;,&quot;given&quot;:&quot;Grant&quot;,&quot;parse-names&quot;:false,&quot;dropping-particle&quot;:&quot;&quot;,&quot;non-dropping-particle&quot;:&quot;&quot;},{&quot;family&quot;:&quot;Goodyear-Smith&quot;,&quot;given&quot;:&quot;Felicity&quot;,&quot;parse-names&quot;:false,&quot;dropping-particle&quot;:&quot;&quot;,&quot;non-dropping-particle&quot;:&quot;&quot;}],&quot;container-title&quot;:&quot;JMIR Mental Health&quot;,&quot;container-title-short&quot;:&quot;JMIR Ment Health&quot;,&quot;DOI&quot;:&quot;10.2196/12656&quot;,&quot;ISSN&quot;:&quot;2368-7959&quot;,&quot;issued&quot;:{&quot;date-parts&quot;:[[2019,5,8]]},&quot;page&quot;:&quot;e12656&quot;,&quot;issue&quot;:&quot;5&quot;,&quot;volume&quot;:&quot;6&quot;},&quot;isTemporary&quot;:false,&quot;suppress-author&quot;:false,&quot;composite&quot;:false,&quot;author-only&quot;:false}]},{&quot;citationID&quot;:&quot;MENDELEY_CITATION_189e0222-fb33-42f8-8439-54710b1d3293&quot;,&quot;properties&quot;:{&quot;noteIndex&quot;:0},&quot;isEdited&quot;:false,&quot;manualOverride&quot;:{&quot;isManuallyOverridden&quot;:false,&quot;citeprocText&quot;:&quot;[95]&quot;,&quot;manualOverrideText&quot;:&quot;&quot;},&quot;citationTag&quot;:&quot;MENDELEY_CITATION_v3_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&quot;,&quot;citationItems&quot;:[{&quot;id&quot;:&quot;1aeb44eb-a7fb-3e4a-b318-98822e1f8ec3&quot;,&quot;itemData&quot;:{&quot;type&quot;:&quot;article-journal&quot;,&quot;id&quot;:&quot;1aeb44eb-a7fb-3e4a-b318-98822e1f8ec3&quot;,&quot;title&quot;:&quot;The Effect of Digital Mental Health Literacy Interventions on Mental Health: Systematic Review and Meta-Analysis&quot;,&quot;author&quot;:[{&quot;family&quot;:&quot;Yeo&quot;,&quot;given&quot;:&quot;GeckHong&quot;,&quot;parse-names&quot;:false,&quot;dropping-particle&quot;:&quot;&quot;,&quot;non-dropping-particle&quot;:&quot;&quot;},{&quot;family&quot;:&quot;Reich&quot;,&quot;given&quot;:&quot;Stephanie M&quot;,&quot;parse-names&quot;:false,&quot;dropping-particle&quot;:&quot;&quot;,&quot;non-dropping-particle&quot;:&quot;&quot;},{&quot;family&quot;:&quot;Liaw&quot;,&quot;given&quot;:&quot;Nicole A&quot;,&quot;parse-names&quot;:false,&quot;dropping-particle&quot;:&quot;&quot;,&quot;non-dropping-particle&quot;:&quot;&quot;},{&quot;family&quot;:&quot;Chia&quot;,&quot;given&quot;:&quot;Elizabeth Yee Min&quot;,&quot;parse-names&quot;:false,&quot;dropping-particle&quot;:&quot;&quot;,&quot;non-dropping-particle&quot;:&quot;&quot;}],&quot;container-title&quot;:&quot;Journal of Medical Internet Research&quot;,&quot;container-title-short&quot;:&quot;J Med Internet Res&quot;,&quot;DOI&quot;:&quot;10.2196/51268&quot;,&quot;ISSN&quot;:&quot;1438-8871&quot;,&quot;issued&quot;:{&quot;date-parts&quot;:[[2024,2,29]]},&quot;page&quot;:&quot;e51268&quot;,&quot;volume&quot;:&quot;26&quot;},&quot;isTemporary&quot;:false,&quot;suppress-author&quot;:false,&quot;composite&quot;:false,&quot;author-only&quot;:false}]},{&quot;citationID&quot;:&quot;MENDELEY_CITATION_dfb1bbe3-6f9a-4374-9cb0-3254163c396f&quot;,&quot;properties&quot;:{&quot;noteIndex&quot;:0},&quot;isEdited&quot;:false,&quot;manualOverride&quot;:{&quot;isManuallyOverridden&quot;:false,&quot;citeprocText&quot;:&quot;[96]&quot;,&quot;manualOverrideText&quot;:&quot;&quot;},&quot;citationTag&quot;:&quot;MENDELEY_CITATION_v3_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&quot;,&quot;citationItems&quot;:[{&quot;id&quot;:&quot;803046a0-e625-31b1-84ff-d8ad57b1a977&quot;,&quot;itemData&quot;:{&quot;type&quot;:&quot;article-journal&quot;,&quot;id&quot;:&quot;803046a0-e625-31b1-84ff-d8ad57b1a977&quot;,&quot;title&quot;:&quot;Technology-Based Interventions for Mental Health in Tertiary Students: Systematic Review&quot;,&quot;author&quot;:[{&quot;family&quot;:&quot;Farrer&quot;,&quot;given&quot;:&quot;Louise&quot;,&quot;parse-names&quot;:false,&quot;dropping-particle&quot;:&quot;&quot;,&quot;non-dropping-particle&quot;:&quot;&quot;},{&quot;family&quot;:&quot;Gulliver&quot;,&quot;given&quot;:&quot;Amelia&quot;,&quot;parse-names&quot;:false,&quot;dropping-particle&quot;:&quot;&quot;,&quot;non-dropping-particle&quot;:&quot;&quot;},{&quot;family&quot;:&quot;Chan&quot;,&quot;given&quot;:&quot;Jade KY&quot;,&quot;parse-names&quot;:false,&quot;dropping-particle&quot;:&quot;&quot;,&quot;non-dropping-particle&quot;:&quot;&quot;},{&quot;family&quot;:&quot;Batterham&quot;,&quot;given&quot;:&quot;Philip J&quot;,&quot;parse-names&quot;:false,&quot;dropping-particle&quot;:&quot;&quot;,&quot;non-dropping-particle&quot;:&quot;&quot;},{&quot;family&quot;:&quot;Reynolds&quot;,&quot;given&quot;:&quot;Julia&quot;,&quot;parse-names&quot;:false,&quot;dropping-particle&quot;:&quot;&quot;,&quot;non-dropping-particle&quot;:&quot;&quot;},{&quot;family&quot;:&quot;Calear&quot;,&quot;given&quot;:&quot;Alison&quot;,&quot;parse-names&quot;:false,&quot;dropping-particle&quot;:&quot;&quot;,&quot;non-dropping-particle&quot;:&quot;&quot;},{&quot;family&quot;:&quot;Tait&quot;,&quot;given&quot;:&quot;Robert&quot;,&quot;parse-names&quot;:false,&quot;dropping-particle&quot;:&quot;&quot;,&quot;non-dropping-particle&quot;:&quot;&quot;},{&quot;family&quot;:&quot;Bennett&quot;,&quot;given&quot;:&quot;Kylie&quot;,&quot;parse-names&quot;:false,&quot;dropping-particle&quot;:&quot;&quot;,&quot;non-dropping-particle&quot;:&quot;&quot;},{&quot;family&quot;:&quot;Griffiths&quot;,&quot;given&quot;:&quot;Kathleen M&quot;,&quot;parse-names&quot;:false,&quot;dropping-particle&quot;:&quot;&quot;,&quot;non-dropping-particle&quot;:&quot;&quot;}],&quot;container-title&quot;:&quot;Journal of Medical Internet Research&quot;,&quot;container-title-short&quot;:&quot;J Med Internet Res&quot;,&quot;DOI&quot;:&quot;10.2196/jmir.2639&quot;,&quot;ISSN&quot;:&quot;14388871&quot;,&quot;issued&quot;:{&quot;date-parts&quot;:[[2013,5,27]]},&quot;page&quot;:&quot;e101&quot;,&quot;issue&quot;:&quot;5&quot;,&quot;volume&quot;:&quot;15&quot;},&quot;isTemporary&quot;:false,&quot;suppress-author&quot;:false,&quot;composite&quot;:false,&quot;author-only&quot;:false}]},{&quot;citationID&quot;:&quot;MENDELEY_CITATION_a5e270eb-5177-40c3-ab8f-681a6a4851cc&quot;,&quot;properties&quot;:{&quot;noteIndex&quot;:0},&quot;isEdited&quot;:false,&quot;manualOverride&quot;:{&quot;isManuallyOverridden&quot;:false,&quot;citeprocText&quot;:&quot;[1]&quot;,&quot;manualOverrideText&quot;:&quot;&quot;},&quot;citationTag&quot;:&quot;MENDELEY_CITATION_v3_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&quot;,&quot;citationItems&quot;:[{&quot;id&quot;:&quot;0127be9b-6f64-3583-bedc-1584e6f25756&quot;,&quot;itemData&quot;:{&quot;type&quot;:&quot;webpage&quot;,&quot;id&quot;:&quot;0127be9b-6f64-3583-bedc-1584e6f25756&quot;,&quot;title&quot;:&quot;Depressive disorder (depression)&quot;,&quot;author&quot;:[{&quot;family&quot;:&quot;World Health Organization&quot;,&quot;given&quot;:&quot;&quot;,&quot;parse-names&quot;:false,&quot;dropping-particle&quot;:&quot;&quot;,&quot;non-dropping-particle&quot;:&quot;&quot;}],&quot;container-title&quot;:&quot;World Health Organization&quot;,&quot;accessed&quot;:{&quot;date-parts&quot;:[[2025,5,13]]},&quot;URL&quot;:&quot;https://www.who.int/news-room/fact-sheets/detail/depression&quot;,&quot;issued&quot;:{&quot;date-parts&quot;:[[2023,3,31]]},&quot;container-title-short&quot;:&quot;&quot;},&quot;isTemporary&quot;:false,&quot;suppress-author&quot;:false,&quot;composite&quot;:false,&quot;author-only&quot;:false}]},{&quot;citationID&quot;:&quot;MENDELEY_CITATION_d96bc7e0-89a3-4a44-a5f1-ce2324fd0a20&quot;,&quot;properties&quot;:{&quot;noteIndex&quot;:0},&quot;isEdited&quot;:false,&quot;manualOverride&quot;:{&quot;isManuallyOverridden&quot;:false,&quot;citeprocText&quot;:&quot;[1]&quot;,&quot;manualOverrideText&quot;:&quot;&quot;},&quot;citationTag&quot;:&quot;MENDELEY_CITATION_v3_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&quot;,&quot;citationItems&quot;:[{&quot;id&quot;:&quot;0127be9b-6f64-3583-bedc-1584e6f25756&quot;,&quot;itemData&quot;:{&quot;type&quot;:&quot;webpage&quot;,&quot;id&quot;:&quot;0127be9b-6f64-3583-bedc-1584e6f25756&quot;,&quot;title&quot;:&quot;Depressive disorder (depression)&quot;,&quot;author&quot;:[{&quot;family&quot;:&quot;World Health Organization&quot;,&quot;given&quot;:&quot;&quot;,&quot;parse-names&quot;:false,&quot;dropping-particle&quot;:&quot;&quot;,&quot;non-dropping-particle&quot;:&quot;&quot;}],&quot;container-title&quot;:&quot;World Health Organization&quot;,&quot;accessed&quot;:{&quot;date-parts&quot;:[[2025,5,13]]},&quot;URL&quot;:&quot;https://www.who.int/news-room/fact-sheets/detail/depression&quot;,&quot;issued&quot;:{&quot;date-parts&quot;:[[2023,3,31]]},&quot;container-title-short&quot;:&quot;&quot;},&quot;isTemporary&quot;:false,&quot;suppress-author&quot;:false,&quot;composite&quot;:false,&quot;author-only&quot;:false}]}]"/>
+    <we:property name="MENDELEY_CITATIONS" value="[{&quot;citationID&quot;:&quot;MENDELEY_CITATION_a63b4e43-6d21-47c4-923b-eb265e8fcc55&quot;,&quot;properties&quot;:{&quot;noteIndex&quot;:0},&quot;isEdited&quot;:false,&quot;manualOverride&quot;:{&quot;isManuallyOverridden&quot;:false,&quot;citeprocText&quot;:&quot;[1]&quot;,&quot;manualOverrideText&quot;:&quot;&quot;},&quot;citationTag&quot;:&quot;MENDELEY_CITATION_v3_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&quot;,&quot;citationItems&quot;:[{&quot;id&quot;:&quot;0127be9b-6f64-3583-bedc-1584e6f25756&quot;,&quot;itemData&quot;:{&quot;type&quot;:&quot;webpage&quot;,&quot;id&quot;:&quot;0127be9b-6f64-3583-bedc-1584e6f25756&quot;,&quot;title&quot;:&quot;Depressive disorder (depression)&quot;,&quot;author&quot;:[{&quot;family&quot;:&quot;World Health Organization&quot;,&quot;given&quot;:&quot;&quot;,&quot;parse-names&quot;:false,&quot;dropping-particle&quot;:&quot;&quot;,&quot;non-dropping-particle&quot;:&quot;&quot;}],&quot;container-title&quot;:&quot;World Health Organization&quot;,&quot;accessed&quot;:{&quot;date-parts&quot;:[[2025,5,13]]},&quot;URL&quot;:&quot;https://www.who.int/news-room/fact-sheets/detail/depression&quot;,&quot;issued&quot;:{&quot;date-parts&quot;:[[2023,3,31]]},&quot;container-title-short&quot;:&quot;&quot;},&quot;isTemporary&quot;:false,&quot;suppress-author&quot;:false,&quot;composite&quot;:false,&quot;author-only&quot;:false}]},{&quot;citationID&quot;:&quot;MENDELEY_CITATION_31d87ed0-72b0-4cc6-b958-281c24e21ac0&quot;,&quot;properties&quot;:{&quot;noteIndex&quot;:0},&quot;isEdited&quot;:false,&quot;manualOverride&quot;:{&quot;isManuallyOverridden&quot;:false,&quot;citeprocText&quot;:&quot;[2]&quot;,&quot;manualOverrideText&quot;:&quot;&quot;},&quot;citationTag&quot;:&quot;MENDELEY_CITATION_v3_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&quot;,&quot;citationItems&quot;:[{&quot;id&quot;:&quot;9ea95bea-4350-36b7-974c-4a2b72259b46&quot;,&quot;itemData&quot;:{&quot;type&quot;:&quot;webpage&quot;,&quot;id&quot;:&quot;9ea95bea-4350-36b7-974c-4a2b72259b46&quot;,&quot;title&quot;:&quot;Factsheet Kesehatan Jiwa (Keswa)&quot;,&quot;author&quot;:[{&quot;family&quot;:&quot;Kementerian Kesehatan Republik Indonesia&quot;,&quot;given&quot;:&quot;&quot;,&quot;parse-names&quot;:false,&quot;dropping-particle&quot;:&quot;&quot;,&quot;non-dropping-particle&quot;:&quot;&quot;}],&quot;container-title&quot;:&quot;Kementerian Kesehatan RI&quot;,&quot;accessed&quot;:{&quot;date-parts&quot;:[[2025,5,13]]},&quot;URL&quot;:&quot;https://repository.badankebijakan.kemkes.go.id/id/eprint/5532/1/03%20factsheet%20Keswa_bahasa.pdf&quot;,&quot;issued&quot;:{&quot;date-parts&quot;:[[2023,7,15]]},&quot;container-title-short&quot;:&quot;&quot;},&quot;isTemporary&quot;:false,&quot;suppress-author&quot;:false,&quot;composite&quot;:false,&quot;author-only&quot;:false}]},{&quot;citationID&quot;:&quot;MENDELEY_CITATION_bbd8ea5e-2fcd-451f-ad0d-7a991a35b3cf&quot;,&quot;properties&quot;:{&quot;noteIndex&quot;:0},&quot;isEdited&quot;:false,&quot;manualOverride&quot;:{&quot;isManuallyOverridden&quot;:false,&quot;citeprocText&quot;:&quot;[2]&quot;,&quot;manualOverrideText&quot;:&quot;&quot;},&quot;citationTag&quot;:&quot;MENDELEY_CITATION_v3_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&quot;,&quot;citationItems&quot;:[{&quot;id&quot;:&quot;9ea95bea-4350-36b7-974c-4a2b72259b46&quot;,&quot;itemData&quot;:{&quot;type&quot;:&quot;webpage&quot;,&quot;id&quot;:&quot;9ea95bea-4350-36b7-974c-4a2b72259b46&quot;,&quot;title&quot;:&quot;Factsheet Kesehatan Jiwa (Keswa)&quot;,&quot;author&quot;:[{&quot;family&quot;:&quot;Kementerian Kesehatan Republik Indonesia&quot;,&quot;given&quot;:&quot;&quot;,&quot;parse-names&quot;:false,&quot;dropping-particle&quot;:&quot;&quot;,&quot;non-dropping-particle&quot;:&quot;&quot;}],&quot;container-title&quot;:&quot;Kementerian Kesehatan RI&quot;,&quot;accessed&quot;:{&quot;date-parts&quot;:[[2025,5,13]]},&quot;URL&quot;:&quot;https://repository.badankebijakan.kemkes.go.id/id/eprint/5532/1/03%20factsheet%20Keswa_bahasa.pdf&quot;,&quot;issued&quot;:{&quot;date-parts&quot;:[[2023,7,15]]},&quot;container-title-short&quot;:&quot;&quot;},&quot;isTemporary&quot;:false,&quot;suppress-author&quot;:false,&quot;composite&quot;:false,&quot;author-only&quot;:false}]},{&quot;citationID&quot;:&quot;MENDELEY_CITATION_795448d4-496e-489a-ba94-04d2850ee384&quot;,&quot;properties&quot;:{&quot;noteIndex&quot;:0},&quot;isEdited&quot;:false,&quot;manualOverride&quot;:{&quot;isManuallyOverridden&quot;:false,&quot;citeprocText&quot;:&quot;[3], [4], [5], [6], [7], [8], [9], [10], [11], [12], [13], [14], [15], [16], [17], [18], [19], [20], [21], [22], [23], [24], [25], [26], [27], [28], [29], [30], [31], [32], [33], [34], [35], [36], [37], [38], [39], [40], [41], [42], [43], [44], [45], [46], [47], [48], [49], [50], [51], [52], [53], [54], [55], [56], [57], [58], [59], [60], [61], [62], [63], [64], [65], [66], [67], [68], [69], [70], [71], [72], [73], [74], [75], [76], [77], [78], [79], [80], [81], [82], [83], [84], [85], [86], [87], [88], [89], [90], [91], [92]&quot;,&quot;manualOverrideText&quot;:&quot;&quot;},&quot;citationTag&quot;:&quot;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&quot;,&quot;citationItems&quot;:[{&quot;id&quot;:&quot;e7d809c7-a158-3562-8cc8-c5c517a2af49&quot;,&quot;itemData&quot;:{&quot;type&quot;:&quot;article-journal&quot;,&quot;id&quot;:&quot;e7d809c7-a158-3562-8cc8-c5c517a2af49&quot;,&quot;title&quot;:&quot;Implementasi Model ADDIE dalam Media Edukasi sebagai Pemahaman Kesehatan Mental&quot;,&quot;groupId&quot;:&quot;5d3d1151-c3fb-3f7b-bcf0-db626a6f9f8b&quot;,&quot;author&quot;:[{&quot;family&quot;:&quot;An-Nisa&quot;,&quot;given&quot;:&quot;Lhulu&quot;,&quot;parse-names&quot;:false,&quot;dropping-particle&quot;:&quot;&quot;,&quot;non-dropping-particle&quot;:&quot;&quot;},{&quot;family&quot;:&quot;Farida&quot;,&quot;given&quot;:&quot;Ika Andrini&quot;,&quot;parse-names&quot;:false,&quot;dropping-particle&quot;:&quot;&quot;,&quot;non-dropping-particle&quot;:&quot;&quot;},{&quot;family&quot;:&quot;Eva&quot;,&quot;given&quot;:&quot;Nur&quot;,&quot;parse-names&quot;:false,&quot;dropping-particle&quot;:&quot;&quot;,&quot;non-dropping-particle&quot;:&quot;&quot;},{&quot;family&quot;:&quot;Apsari&quot;,&quot;given&quot;:&quot;Diani Akmalia&quot;,&quot;parse-names&quot;:false,&quot;dropping-particle&quot;:&quot;&quot;,&quot;non-dropping-particle&quot;:&quot;&quot;},{&quot;family&quot;:&quot;Utomo&quot;,&quot;given&quot;:&quot;Hanggara Budi&quot;,&quot;parse-names&quot;:false,&quot;dropping-particle&quot;:&quot;&quot;,&quot;non-dropping-particle&quot;:&quot;&quot;}],&quot;container-title&quot;:&quot;Psyche 165 Journal&quot;,&quot;DOI&quot;:&quot;10.35134/jpsy165.v18i1.466&quot;,&quot;ISSN&quot;:&quot;2502-8766&quot;,&quot;issued&quot;:{&quot;date-parts&quot;:[[2025,2,10]]},&quot;page&quot;:&quot;41-46&quot;,&quot;abstract&quot;:&quot;&lt;p&gt;Era digitalisasi membawa manusia pada peradaban hidup bersama teknologi. Berbagai macam platform media menjadi wadah informasi tercepat untuk bisa memperoleh ilmu atau berita kekinian. Namun, tidak semua platform dapat bermanfaat untuk manusia sehingga dibutuhkan kesadaran diri yang baik dalam pemilihan media informasi. Dampak dari kesalahan pemilihan adalah munculnya stressor baru serta ketegangan otot karena ketidaksanggupan individu dalam mengelola kognitif dan perasaan ketika menerima informasi. Berbagai permasalahan kesehatan mental saat ini khususnya di Indonesia menjadi fokus perhatikan untuk tetap menjaga stabilitas keadaan masyarakat. Kabar baiknya, telah banyak tenaga ahli di bidang psikologi yang mendirikan platform sebagai wadah informasi preventif kepada masayarakat umum. Apabila terdapat permasalahan klinis atau kronis dari hasil asesmen psikolog maka disarankan untuk melakukan konseling atau terapi psikologis. Saat ini wadah tersebut dapat berupa aplikasi curhat, konseling dengan psikolog, atau berbagai informasi dari postingan di media sosial. Mengamati fenomena tersebut, peneliti mengembangkan sebuah aplikasi permainan digital yang berguna sebagai media informasi preventif bagi masyarakat umum dengan desain sederhana dan penuh warna. Permainan KESMO Games yang dikembangkan oleh peneliti menggunakan metode RnD dengan model ADDIE. Hasil uji validasi ahli media dan materi menyatakan bahwa KESMO Games layak untuk diimplementasikan. Setelah diimplementasikan kepada 30 partisipan, ditemukan bahwa responden mudah menerima knowledge kesehatan mental menggunakan KESMO Games karena keterbacaan media yang sangat baik dan membawa kesan fun dalam bermain. Berdasarkan hasil dari kegiatan penelitian ini, metode ADDIE efektif digunakan pada KESMO Games yang memuat pengetahuan kesehatan mental dan berhasil menambahkan pemahaman kepada player atau partisipan.&lt;/p&gt;&quot;,&quot;issue&quot;:&quot;1&quot;,&quot;volume&quot;:&quot;18&quot;,&quot;container-title-short&quot;:&quot;&quot;},&quot;isTemporary&quot;:false},{&quot;id&quot;:&quot;7664f879-22d2-3297-af0c-e2ecb057427f&quot;,&quot;itemData&quot;:{&quot;type&quot;:&quot;article-journal&quot;,&quot;id&quot;:&quot;7664f879-22d2-3297-af0c-e2ecb057427f&quot;,&quot;title&quot;:&quot;Edukasi dan Skrining Kesehatan Jiwa Remaja dengan Aplikasi&quot;,&quot;groupId&quot;:&quot;5d3d1151-c3fb-3f7b-bcf0-db626a6f9f8b&quot;,&quot;author&quot;:[{&quot;family&quot;:&quot;Endriyani&quot;,&quot;given&quot;:&quot;Sri&quot;,&quot;parse-names&quot;:false,&quot;dropping-particle&quot;:&quot;&quot;,&quot;non-dropping-particle&quot;:&quot;&quot;},{&quot;family&quot;:&quot;Martini&quot;,&quot;given&quot;:&quot;Sri&quot;,&quot;parse-names&quot;:false,&quot;dropping-particle&quot;:&quot;&quot;,&quot;non-dropping-particle&quot;:&quot;&quot;},{&quot;family&quot;:&quot;Pastari&quot;,&quot;given&quot;:&quot;Marta&quot;,&quot;parse-names&quot;:false,&quot;dropping-particle&quot;:&quot;&quot;,&quot;non-dropping-particle&quot;:&quot;&quot;}],&quot;container-title&quot;:&quot;Madaniya&quot;,&quot;DOI&quot;:&quot;10.53696/27214834.687&quot;,&quot;ISSN&quot;:&quot;2721-4834&quot;,&quot;issued&quot;:{&quot;date-parts&quot;:[[2024,2,26]]},&quot;page&quot;:&quot;192-198&quot;,&quot;abstract&quot;:&quot;&lt;p&gt;Kesehatan jiwa merupakan aspek penting bagi remaja dalam mencapai perkembangan yang optimal di masa remaja. Kegiatan edukasi dan skiring kesehatan jiwa bagi remaja dilaksanakan dengan tujuan meningkatkan pengetahuan remaja tentang kesehatan jiwa dan mengurangi risiko gangguan jiwa dengan mendeteksi masalah kesehatan mental dan emosional sejak dini. Program pengabdian masyarakat ini dilakukan melalui penyuluhan dan pemeriksaan kesehatan jiwa dengan menggunakan aplikasi skrining kesehtan jiwa DeAS Care. Kegiatan diikuti oleh 20 remaja di kota Palembang. Setelah diberikan penyuluhan remaja mengetahui tentang sehat jiwa dan tehnik yang dapat dilakukan bagi remaja yang beresiko mengalami masalah gangguan mental emosinal. Setelah dilakukan skrining kesehatan jiwa diketahui bahwa sebagian remaja sebanyak 9 orang (45%) mengalami depresi, 15 orang (75%) mengalami ansietas dan 6 orang (30%) mengalami stress dari tingkat ringan hingga parah. Hendaknya pihak terkait dapat melakukan pendampingan sebagai menjaga kesehatan jiwa dalam kelompok remaja sehat jiwa atau kader remaja sehat jiwa di lingkungan sekolah dan masyarakat.&lt;/p&gt;&quot;,&quot;issue&quot;:&quot;1&quot;,&quot;volume&quot;:&quot;5&quot;,&quot;container-title-short&quot;:&quot;&quot;},&quot;isTemporary&quot;:false},{&quot;id&quot;:&quot;66b548fb-5e3c-314a-97dc-72fd37a83720&quot;,&quot;itemData&quot;:{&quot;type&quot;:&quot;article-journal&quot;,&quot;id&quot;:&quot;66b548fb-5e3c-314a-97dc-72fd37a83720&quot;,&quot;title&quot;:&quot;SISTEM PAKAR GANGGUAN DEPRESI PADA ANAK&quot;,&quot;groupId&quot;:&quot;5d3d1151-c3fb-3f7b-bcf0-db626a6f9f8b&quot;,&quot;author&quot;:[{&quot;family&quot;:&quot;Maharani&quot;,&quot;given&quot;:&quot;Aldila&quot;,&quot;parse-names&quot;:false,&quot;dropping-particle&quot;:&quot;&quot;,&quot;non-dropping-particle&quot;:&quot;&quot;},{&quot;family&quot;:&quot;Nilma&quot;,&quot;given&quot;:&quot;Nilma&quot;,&quot;parse-names&quot;:false,&quot;dropping-particle&quot;:&quot;&quot;,&quot;non-dropping-particle&quot;:&quot;&quot;},{&quot;family&quot;:&quot;Irawan&quot;,&quot;given&quot;:&quot;Ari&quot;,&quot;parse-names&quot;:false,&quot;dropping-particle&quot;:&quot;&quot;,&quot;non-dropping-particle&quot;:&quot;&quot;}],&quot;container-title&quot;:&quot;NUANSA INFORMATIKA&quot;,&quot;DOI&quot;:&quot;10.25134/nuansa.v15i1.3418&quot;,&quot;ISSN&quot;:&quot;2614-5405&quot;,&quot;issued&quot;:{&quot;date-parts&quot;:[[2021,1,18]]},&quot;page&quot;:&quot;1&quot;,&quot;abstract&quot;:&quot;&lt;p&gt;Sistem pakar merupakan salah satu aplikasi dari kecerdasan buatan (Artificial Intelegence). Tujuan dari sistem pakar bukan untuk menggantikan posisi seorang pakar tetapi lebih menginformasikan dan memasyaraktkan pengetahuan dari seorang pakar. Gangguan psikologi pada anak banyak yang kurang disadari oleh orang tua dan pengajar yang menyebabkan terlambatnya penanganan pada anak. Tujuan dari penelitian dan dibuatnya aplikasi ini untuk membantu pengguna mendapatkan informasi mengenai gejala-gejala awal pada gangguan psikologis dan membantu mendiagnosa gangguan psikologi anak lebih awal. Aplikasi sistem pakar ini menggunakan Java sebagai Bahasa pemrograman dan menggunakan metode forward chaining. Sistem pakar ini mampu membantu dan mempermudah pengguna dalam memperoleh informasi gangguan psikologi pada anak khususnya mengenai depresi (depresi mayor, depresi persisten, gangguan bipolar dan depresi psikotis).&lt;/p&gt;&quot;,&quot;issue&quot;:&quot;1&quot;,&quot;volume&quot;:&quot;15&quot;,&quot;container-title-short&quot;:&quot;&quot;},&quot;isTemporary&quot;:false},{&quot;id&quot;:&quot;0fe8ada7-b2dc-3126-9066-f5df67100062&quot;,&quot;itemData&quot;:{&quot;type&quot;:&quot;article-journal&quot;,&quot;id&quot;:&quot;0fe8ada7-b2dc-3126-9066-f5df67100062&quot;,&quot;title&quot;:&quot;APLIKASI SCREENING DEPRESI PASCA MELAHIRKAN MENGGUNAKAN METODE CERTAINTY FACTOR BERBASIS MOBILE&quot;,&quot;groupId&quot;:&quot;5d3d1151-c3fb-3f7b-bcf0-db626a6f9f8b&quot;,&quot;author&quot;:[{&quot;family&quot;:&quot;Amalia&quot;,&quot;given&quot;:&quot;Fenny Restu&quot;,&quot;parse-names&quot;:false,&quot;dropping-particle&quot;:&quot;&quot;,&quot;non-dropping-particle&quot;:&quot;&quot;},{&quot;family&quot;:&quot;Akbar&quot;,&quot;given&quot;:&quot;Ronny Makhfuddin&quot;,&quot;parse-names&quot;:false,&quot;dropping-particle&quot;:&quot;&quot;,&quot;non-dropping-particle&quot;:&quot;&quot;},{&quot;family&quot;:&quot;Zahara&quot;,&quot;given&quot;:&quot;Soffa&quot;,&quot;parse-names&quot;:false,&quot;dropping-particle&quot;:&quot;&quot;,&quot;non-dropping-particle&quot;:&quot;&quot;}],&quot;container-title&quot;:&quot;SEMINAR NASIONAL FAKULTAS TEKNIK&quot;,&quot;DOI&quot;:&quot;10.36815/semastek.v1i1.6&quot;,&quot;ISSN&quot;:&quot;2963-8526&quot;,&quot;issued&quot;:{&quot;date-parts&quot;:[[2022,9,30]]},&quot;page&quot;:&quot;378-384&quot;,&quot;abstract&quot;:&quot;&lt;p&gt;Bagi sebuah keluarga, kelahiran seorang anak merupakan acara yang menyenangkan. Banyak yang menggambarkan kelahiran sebagai lingkungan yang ceria, jadi tidak ada penjelasan yang benar-benar jelas bagi seorang ibu atau keluarga untuk menjadi sengsara atau terganggu. Tetapi, kenyataannya rasa bahagia ini umumnya tidak dirasakan oleh ibu-ibu yang melahirkan anak, karena proses menjadi orang tua merupakan peristiwa luar biasa dalam hidup yang dapat dianggap sebagai keadaan darurat dengan tekanan berat. Bagi beberapa individu, efek samping depresi ini dianggap remeh sehingga dengan keterbatasan informasi tidak segera membutuhkan penanganan. Jika ini dibiarkan berlanjut dan memburuk, itu akan sangat mempengaruhi keadaan ibu dan anak. Tujuan penelitian ini adalah merancang dan mengembangkan aplikasi android yang dapat mendiagnosis dan mengobati depresi postpartum  pada ibu dengan menghitung nilai gejala dan menghasilkan nilai CF menggunakan metode certainty factor. Pembuatan aplikasi ini dibantu dengan Android Studio, database MySQL, dan software Ngrok. Hasil pengujian dapat diketahui bahwa diagnosis 3 jenis depresi pasca melahirkan yang dialami ibu dengan persentase kesesuaian mencapai 100% serta hasil dari uji coba MOS (Mean Opinion Score) yang diperoleh dari 21 responden, nilai MOS sebesar 4,502 menunjukkan bahwa aplikasi screening depresi pasca melahirkan telah berjalan dengan tampilan yang layak dan mudah digunakan.&lt;/p&gt;&quot;,&quot;issue&quot;:&quot;1&quot;,&quot;volume&quot;:&quot;1&quot;,&quot;container-title-short&quot;:&quot;&quot;},&quot;isTemporary&quot;:false},{&quot;id&quot;:&quot;34f71bb3-3667-38db-b426-d54398e8fa3e&quot;,&quot;itemData&quot;:{&quot;type&quot;:&quot;article-journal&quot;,&quot;id&quot;:&quot;34f71bb3-3667-38db-b426-d54398e8fa3e&quot;,&quot;title&quot;:&quot;Perancangan Aplikasi Kesehatan Mental Online Menggunakan Metode Rapid Application Development(Rad)&quot;,&quot;groupId&quot;:&quot;5d3d1151-c3fb-3f7b-bcf0-db626a6f9f8b&quot;,&quot;author&quot;:[{&quot;family&quot;:&quot;Khoiri&quot;,&quot;given&quot;:&quot;M imron&quot;,&quot;parse-names&quot;:false,&quot;dropping-particle&quot;:&quot;&quot;,&quot;non-dropping-particle&quot;:&quot;&quot;}],&quot;container-title&quot;:&quot;JEKIN - Jurnal Teknik Informatika&quot;,&quot;DOI&quot;:&quot;10.58794/jekin.v1i3.206&quot;,&quot;ISSN&quot;:&quot;2809-1353&quot;,&quot;issued&quot;:{&quot;date-parts&quot;:[[2023,6,4]]},&quot;page&quot;:&quot;26-32&quot;,&quot;abstract&quot;:&quot;&lt;p&gt;Abstrak - Sebagian daerah kurangnya ahli psikiater sehingga masyarakat lebih suka memendam masalah tanpa adanya tempat untuk konsultasi.Tulisan ini menjelaskan tentang perancangan aplikasi untuk memudahkan masyarakat dalam mengatasi kesehatan mental secara online bersama psikiater terpercaya. Bedasarkan hasil uji coba mengunakan metode RAD aplikasi ini mempudahkan penguna dalam mengunakan aplikasi  dan memudahkan mencari infomasi tentang kesehatan mental ,membantu masyarakat dalam mencari solusi yang dialami.&lt;/p&gt;&quot;,&quot;issue&quot;:&quot;3&quot;,&quot;volume&quot;:&quot;1&quot;,&quot;container-title-short&quot;:&quot;&quot;},&quot;isTemporary&quot;:false},{&quot;id&quot;:&quot;e8aad0b2-6c35-3e85-b7a5-892a99028b29&quot;,&quot;itemData&quot;:{&quot;type&quot;:&quot;article-journal&quot;,&quot;id&quot;:&quot;e8aad0b2-6c35-3e85-b7a5-892a99028b29&quot;,&quot;title&quot;:&quot;Sistem Pakar Kombinasi Metode Certainty Factor dan Dempster Shafer&quot;,&quot;groupId&quot;:&quot;5d3d1151-c3fb-3f7b-bcf0-db626a6f9f8b&quot;,&quot;author&quot;:[{&quot;family&quot;:&quot;Hasibuan&quot;,&quot;given&quot;:&quot;Nelly Astuti&quot;,&quot;parse-names&quot;:false,&quot;dropping-particle&quot;:&quot;&quot;,&quot;non-dropping-particle&quot;:&quot;&quot;},{&quot;family&quot;:&quot;Fau&quot;,&quot;given&quot;:&quot;Alwin&quot;,&quot;parse-names&quot;:false,&quot;dropping-particle&quot;:&quot;&quot;,&quot;non-dropping-particle&quot;:&quot;&quot;}],&quot;container-title&quot;:&quot;Journal of Information System Research (JOSH)&quot;,&quot;DOI&quot;:&quot;10.47065/josh.v3i2.1252&quot;,&quot;ISSN&quot;:&quot;2686-228X&quot;,&quot;issued&quot;:{&quot;date-parts&quot;:[[2022,1,31]]},&quot;page&quot;:&quot;85-90&quot;,&quot;abstract&quot;:&quot;&lt;p&gt;An expert system is a technique of artificial intelligence that uses certainty techniques to solve problems. There are several techniques that can be used to solve the problem of uncertainty, including the certainty factor method and the mathematical theory of Dempster Shafer. Both methods and techniques can be applied to solve expert system problems. However, each method has advantages and disadvantages in determining the diagnosis. In the expert system, there are 2 values ​​used for the diagnosis process, including the expert value taken from the expert hypothesis and the user value or evidence which is the value obtained based on the facts of an event. Dempster Shafer theory can only use the evidence value in determining the density value, while the certainty factor method can use evidence and hypothesis values. Thus, the combination made to overcome the weakness of one method by using the advantages of the other method is expected to produce a better certainty value.&lt;/p&gt;&quot;,&quot;issue&quot;:&quot;2&quot;,&quot;volume&quot;:&quot;3&quot;,&quot;container-title-short&quot;:&quot;&quot;},&quot;isTemporary&quot;:false},{&quot;id&quot;:&quot;c1210e83-258c-3547-85b3-3da863122a5b&quot;,&quot;itemData&quot;:{&quot;type&quot;:&quot;article-journal&quot;,&quot;id&quot;:&quot;c1210e83-258c-3547-85b3-3da863122a5b&quot;,&quot;title&quot;:&quot;EDUKASI PREVENTIF KEKERASAN SEKSUAL PADA ANAK MELALUI PENGGUNAAN MEDIA BERBASIS DIGITAL “ProUdy EDUKASI GAMES (PEG)&quot;,&quot;groupId&quot;:&quot;5d3d1151-c3fb-3f7b-bcf0-db626a6f9f8b&quot;,&quot;author&quot;:[{&quot;family&quot;:&quot;Patimah&quot;,&quot;given&quot;:&quot;Siti&quot;,&quot;parse-names&quot;:false,&quot;dropping-particle&quot;:&quot;&quot;,&quot;non-dropping-particle&quot;:&quot;&quot;},{&quot;family&quot;:&quot;Mulyani&quot;,&quot;given&quot;:&quot;Nunung&quot;,&quot;parse-names&quot;:false,&quot;dropping-particle&quot;:&quot;&quot;,&quot;non-dropping-particle&quot;:&quot;&quot;}],&quot;container-title&quot;:&quot;Edukasi Masyarakat Sehat Sejahtera (EMaSS) : Jurnal Pengabdian kepada Masyarakat&quot;,&quot;DOI&quot;:&quot;10.37160/emass.v6i1.313&quot;,&quot;ISSN&quot;:&quot;2656-0364&quot;,&quot;issued&quot;:{&quot;date-parts&quot;:[[2024,1,31]]},&quot;page&quot;:&quot;100-106&quot;,&quot;abstract&quot;:&quot;&lt;p&gt;Kekerasan seksual pada anak adalah keterlibatan seorang anak dalam segala bentuk aktivitas seksual yang terjadi sebelum anak mencapai batas usia tertentu di mana orang dewasa, anak lain yang usianya lebih tua, atau orang yang dianggap memiliki pengetahuan lebih memanfaatkan anak tersebut untuk kesenangan seksual atau aktivitas seksual.5 Dampak pelecehan seksual pada anak bisa menyebabkan kerusakan fisik dan emosional yang serius baik dalam jangka pendek maupun jangka panjang. Dalam jangka pendek, anak-anak dapat mengalami masalah kesehatan, seperti cedera fisik, infeksi menular seksual, dan kehamilan yang tak diinginkan. Efek jangka panjang, lebih mungkin terkena depresi, kecemasan, gangguan makan, gangguan stress pasca trauma (PTSD), fobia pada hubungan seks atau terbiasa dengan kekerasan sebelum melakukan hubungan seks.&amp;#13; Menurut Unit PPA Polresta Kota Tasikmalaya data Kekerasan seksual pada anak pada tahun 2020 hingga bulan November mencapai 28 kasus. Jumlah ini lebih tinggi ketimbang tahun 2019 mencapai 25 kasus. Berdasarkan study pendahuluan ke Kecamatan Mangkubumi Kota Tasikmalaya terdapat 6 kasus yang dilaporkan pada tahun 2021 yang mengalami kekerasan seksual pada anak.&amp;#13; Metode pengabdian Masyarakat ini adalah memberikan edukasi kekerasan seksual dan sosialisasi, pelatihan serta penerapan aplikasi ProUdy Edukasi Games (PEG) kepada anak dan pendamping anak sebagai upaya pencegahan kekerasan seksual pada anak. Dilakukan pengukuran sebelum  dan sesudah pemberian intervensi untuk melihat pengaruh edukasi.&amp;#13; Hasil kegiatan pengabdian Masyarakat ini diukur secara kuantitatif pada pemahaman dan sikap anak dan orangtua/pendamping. Hasil analisis deskriptif menunjukkan perubahan mean pengetahuan anak dan orang tua yang significant, juga terdapat perubahan mean sikap yang significant sebelum dan sesudah pelaksanaan pengabdian Masyarakat&lt;/p&gt;&quot;,&quot;issue&quot;:&quot;1&quot;,&quot;volume&quot;:&quot;6&quot;,&quot;container-title-short&quot;:&quot;&quot;},&quot;isTemporary&quot;:false},{&quot;id&quot;:&quot;47e0db35-15d5-3ca7-a21a-9abf1b9eb33a&quot;,&quot;itemData&quot;:{&quot;type&quot;:&quot;article-journal&quot;,&quot;id&quot;:&quot;47e0db35-15d5-3ca7-a21a-9abf1b9eb33a&quot;,&quot;title&quot;:&quot;Sosialisasi Aplikasi MHS (Mental Health Solution) Dalam Mengatasi Kesehatan Mental&quot;,&quot;groupId&quot;:&quot;5d3d1151-c3fb-3f7b-bcf0-db626a6f9f8b&quot;,&quot;author&quot;:[{&quot;family&quot;:&quot;Surya&quot;,&quot;given&quot;:&quot;Nella Tri&quot;,&quot;parse-names&quot;:false,&quot;dropping-particle&quot;:&quot;&quot;,&quot;non-dropping-particle&quot;:&quot;&quot;},{&quot;family&quot;:&quot;Gita&quot;,&quot;given&quot;:&quot;Anggi Putri Aria&quot;,&quot;parse-names&quot;:false,&quot;dropping-particle&quot;:&quot;&quot;,&quot;non-dropping-particle&quot;:&quot;&quot;},{&quot;family&quot;:&quot;Kur’aini&quot;,&quot;given&quot;:&quot;Sri Nurul&quot;,&quot;parse-names&quot;:false,&quot;dropping-particle&quot;:&quot;&quot;,&quot;non-dropping-particle&quot;:&quot;&quot;}],&quot;container-title&quot;:&quot;SENTRA DEDIKASI: Jurnal Pengabdian Masyarakat&quot;,&quot;DOI&quot;:&quot;10.59823/dedikasi.v1i3.31&quot;,&quot;ISSN&quot;:&quot;2964-3686&quot;,&quot;issued&quot;:{&quot;date-parts&quot;:[[2023,9,16]]},&quot;page&quot;:&quot;72-77&quot;,&quot;abstract&quot;:&quot;&lt;p&gt;Masalah kesehatan jiwa telah menjadi masalah kesehatan yang belum terselesaikan di tengah-tengah masyarakat, baik di tingkat global maupun nasional. Terlebih di masa pandemi COVID-19, permasalahan kesehatan jiwa akan semakin berat untuk diselesaikan. Mental Health adalah terhindarnya seseorang dari gejala-gejala gangguan dan penyakit jiwa, dapat menyesuaikan diri, dapat memanfaatkan segala potensi dan bakat yang ada semaksimal mungkin dan membawa kepada kebahagiaan bersama serta tercapainya keharmonisan jiwa dalam hidup. tujuan sosialisasi ini adalah memberikan informasi dan pemahaman kepada seluruh tenaga kesehatan tentang Aplikasi Mental Health Solution dalam mengatasi kesehatan mental dan memberikan pemahaman tentang cara penggunaannya. Manfaat kegiatan ini diharapkan mampu menambah pengetahuan dan pemahaman masayarakat tentang penggunaan Aplikasi Mental Health Solution dalam mengatasi kesehatan mental.&lt;/p&gt;&quot;,&quot;issue&quot;:&quot;3&quot;,&quot;volume&quot;:&quot;1&quot;,&quot;container-title-short&quot;:&quot;&quot;},&quot;isTemporary&quot;:false},{&quot;id&quot;:&quot;08b19303-7fa8-31ee-9f3f-3fbd844bafcb&quot;,&quot;itemData&quot;:{&quot;type&quot;:&quot;article-journal&quot;,&quot;id&quot;:&quot;08b19303-7fa8-31ee-9f3f-3fbd844bafcb&quot;,&quot;title&quot;:&quot;Peran Komunikasi Media Sosial Dalam Meningkatkan Kesehatan Mental&quot;,&quot;groupId&quot;:&quot;5d3d1151-c3fb-3f7b-bcf0-db626a6f9f8b&quot;,&quot;author&quot;:[{&quot;family&quot;:&quot;Efendi&quot;,&quot;given&quot;:&quot;Erwan&quot;,&quot;parse-names&quot;:false,&quot;dropping-particle&quot;:&quot;&quot;,&quot;non-dropping-particle&quot;:&quot;&quot;},{&quot;family&quot;:&quot;Salam&quot;,&quot;given&quot;:&quot;Muhammad Abrar Haq&quot;,&quot;parse-names&quot;:false,&quot;dropping-particle&quot;:&quot;&quot;,&quot;non-dropping-particle&quot;:&quot;&quot;},{&quot;family&quot;:&quot;Daffa&quot;,&quot;given&quot;:&quot;Muhammad&quot;,&quot;parse-names&quot;:false,&quot;dropping-particle&quot;:&quot;&quot;,&quot;non-dropping-particle&quot;:&quot;&quot;},{&quot;family&quot;:&quot;Sanjaya&quot;,&quot;given&quot;:&quot;Shendy&quot;,&quot;parse-names&quot;:false,&quot;dropping-particle&quot;:&quot;&quot;,&quot;non-dropping-particle&quot;:&quot;&quot;},{&quot;family&quot;:&quot;Azmi&quot;,&quot;given&quot;:&quot;Rifka Nur&quot;,&quot;parse-names&quot;:false,&quot;dropping-particle&quot;:&quot;&quot;,&quot;non-dropping-particle&quot;:&quot;&quot;}],&quot;container-title&quot;:&quot;Al-Hikmah Media Dakwah, Komunikasi, Sosial dan Kebudayaan&quot;,&quot;DOI&quot;:&quot;10.32505/hikmah.v14i2.7639&quot;,&quot;ISSN&quot;:&quot;2655-0539&quot;,&quot;issued&quot;:{&quot;date-parts&quot;:[[2023,12,25]]},&quot;page&quot;:&quot;175-188&quot;,&quot;abstract&quot;:&quot;&lt;p&gt;Mental health is a person's state of life, namely a state of self-evaluation of one's feelings, including aspects such as self-esteem, physical strength, self-control ability, etc. Mental health is a person's ability to deal with stress or depression. On this occasion, according to mental health, it is an optimal combination or harmony between various mental activities and the ability to deal with simple mental problems that a person faces, as well as the ability to feel feelings of happiness and good strength. But many people are now unable to maintain mental health due to increasing depression. The researcher's research method uses a qualitative approach. This qualitative approach was taken to obtain more accurate and meaningful data. Research using a qualitative approach method used by researchers is library research, namely a series of activities relating to library data collection methods starting from books, scientific works, and national journals. The conclusion from this research is that social media is very important in the spread of mental health. It can be seen from the data above that almost all people in the modern era now use social media, from children and teenagers to the elderly. Various social media content that talks about mental health can get a lot of followers and can help them recover from the depression they are experiencing.&lt;/p&gt;&quot;,&quot;issue&quot;:&quot;2&quot;,&quot;volume&quot;:&quot;14&quot;,&quot;container-title-short&quot;:&quot;&quot;},&quot;isTemporary&quot;:false},{&quot;id&quot;:&quot;4fa1b8e2-a476-3fcf-8d91-9026c5453e06&quot;,&quot;itemData&quot;:{&quot;type&quot;:&quot;article-journal&quot;,&quot;id&quot;:&quot;4fa1b8e2-a476-3fcf-8d91-9026c5453e06&quot;,&quot;title&quot;:&quot;Perancangan Desain Ui Aplikasi Be Me Dengan Menggunakan Metode User Centered Design&quot;,&quot;groupId&quot;:&quot;5d3d1151-c3fb-3f7b-bcf0-db626a6f9f8b&quot;,&quot;author&quot;:[{&quot;family&quot;:&quot;Zahra&quot;,&quot;given&quot;:&quot;Divka&quot;,&quot;parse-names&quot;:false,&quot;dropping-particle&quot;:&quot;&quot;,&quot;non-dropping-particle&quot;:&quot;&quot;}],&quot;container-title&quot;:&quot;VISUALIDEAS&quot;,&quot;DOI&quot;:&quot;10.33197/visualideas.vol4.iss1.2024.1297&quot;,&quot;ISSN&quot;:&quot;2776-0359&quot;,&quot;issued&quot;:{&quot;date-parts&quot;:[[2024,3,31]]},&quot;page&quot;:&quot;31-41&quot;,&quot;abstract&quot;:&quot;&lt;p&gt;Kesehatan mental merupakan aspek penting yang perlu diperhatikan karena semakin meningkatnya kasus bunuh diri di dunia. Maraknya kasus ini tentu menjadi permasalahan global yang perlu diatasi. Aplikasi mental health Be Me merupakan aplikasi yang menyediakan fitur yang dapat pembantu penggunanya dalam mengatasi permasalahan kesehatan mental. Aplikasi Be Me memiliki beberapa fitur diantaranya adalah mood tracker, to do list, user progress history, calming music, hingga bantuan profesional. Metode yang digunakan dalam perancangan aplikasi Be Me adalah metode User Centred Design, yaitu metode yang menjadikan pengguna sebagai fokus utama dalam proses perancangan. Perancangan aplikasi mental health Be Me ini akan dibahas dengan menggunakan metode studi kasus deskriptif yang kemudian hasilnya akan diuraikan dalam bentuk prototype aplikasi beserta deskripsinya.&lt;/p&gt;&quot;,&quot;issue&quot;:&quot;1&quot;,&quot;volume&quot;:&quot;4&quot;,&quot;container-title-short&quot;:&quot;&quot;},&quot;isTemporary&quot;:false},{&quot;id&quot;:&quot;6b45a640-0a4b-3244-b413-438bacefbd72&quot;,&quot;itemData&quot;:{&quot;type&quot;:&quot;article-journal&quot;,&quot;id&quot;:&quot;6b45a640-0a4b-3244-b413-438bacefbd72&quot;,&quot;title&quot;:&quot;Aplikasi Manajemen Diri COPD sebagai Inovasi untuk Meningkatkan Kualitas Hidup Pasien Paru Obstruktif Kronis&quot;,&quot;groupId&quot;:&quot;5d3d1151-c3fb-3f7b-bcf0-db626a6f9f8b&quot;,&quot;author&quot;:[{&quot;family&quot;:&quot;Aulia Rahmah&quot;,&quot;given&quot;:&quot;Syafira&quot;,&quot;parse-names&quot;:false,&quot;dropping-particle&quot;:&quot;&quot;,&quot;non-dropping-particle&quot;:&quot;&quot;}],&quot;container-title&quot;:&quot;Jurnal Studi Inovasi&quot;,&quot;DOI&quot;:&quot;10.52000/jsi.v2i1.83&quot;,&quot;ISSN&quot;:&quot;2775-0922&quot;,&quot;issued&quot;:{&quot;date-parts&quot;:[[2022,1,29]]},&quot;page&quot;:&quot;70-77&quot;,&quot;abstract&quot;:&quot;&lt;p&gt;Penyakit paru obstruktif kronis merupakan pemicu utama morbiditas dan mortalitas yang berdampak pada masalah kesehatan masyarakat. Hal ini akan mempengaruhi kualitas hidup pasien PPOK. Prevalensi penderita PPOK di dunia pada tahun 2016 dilaporkan sebanyak 251 juta kasus, dari jumlah tersebut terdapat 3,17 juta meninggal dunia. Beberapa gejala yang di alami pasien PPOK adalah sesak nafas, batuk kronis (&amp;gt;2 minggu), batuk berdahak, nafas disertai mengi, dan beberapa gejala non spesifik adalah lesu, lemas, susah tidur, dan depresi. Kualitas hidup berhubungan dengan status kesehatan yang mencerminkan dampak kesehatan individu pada kesejahteraan fungsional. Mengidentifikasi prediktor untuk kualitas hidup yang berhubungan dengan kesehatan dapat memberikan wawasan yang mendalam tentang pengobatan dan strategi perawatan. Penelitian ini menggunakan metode literature review yang berasal dari literatur-literatur dimana berkaitan dengan persoalan yang dibahas. Intervensi pulmonary rehabilitation dikenal baik dalam pengobatan pasien dengan PPOK dan merupakan upaya dalam meningkatkan kapasitas beraktivitas  dan kualitas hidup pasien PPOK. TRAINER COPD merupakan rancangan mHealth (mobile health) yang terintegrasi dalam ponsel pintar yang berisi perawatan medis bagi pasien. Aplikasi mHealth yang paling umum digunakan adalah penggunaan ponsel pintar untuk memberikan edukasi tentang masalah kesehatan dan cara pencegahannya bagi pengguna.&lt;/p&gt;&quot;,&quot;issue&quot;:&quot;1&quot;,&quot;volume&quot;:&quot;2&quot;,&quot;container-title-short&quot;:&quot;&quot;},&quot;isTemporary&quot;:false},{&quot;id&quot;:&quot;f60b3a01-b20e-3a74-a5dd-86bf042fe085&quot;,&quot;itemData&quot;:{&quot;type&quot;:&quot;article-journal&quot;,&quot;id&quot;:&quot;f60b3a01-b20e-3a74-a5dd-86bf042fe085&quot;,&quot;title&quot;:&quot;Pengaruh Penggunaan Aplikasi Mobile Health (Health) dan Fitur Pemantauan Kesehatan Terhadap Gaya Hidup Sehat&quot;,&quot;groupId&quot;:&quot;5d3d1151-c3fb-3f7b-bcf0-db626a6f9f8b&quot;,&quot;author&quot;:[{&quot;family&quot;:&quot;Rully Fildansyah&quot;,&quot;given&quot;:&quot;&quot;,&quot;parse-names&quot;:false,&quot;dropping-particle&quot;:&quot;&quot;,&quot;non-dropping-particle&quot;:&quot;&quot;}],&quot;container-title&quot;:&quot;Jurnal Multidisiplin West Science&quot;,&quot;DOI&quot;:&quot;10.58812/jmws.v2i6.431&quot;,&quot;ISSN&quot;:&quot;2964-206X&quot;,&quot;issued&quot;:{&quot;date-parts&quot;:[[2023,6,28]]},&quot;page&quot;:&quot;473-482&quot;,&quot;abstract&quot;:&quot;&lt;p&gt;Studi penelitian ini menyelidiki pengaruh penggunaan aplikasi kesehatan seluler dan fitur pemantauan kesehatan terhadap gaya hidup sehat individu Generasi Z di Jakarta. Dengan meningkatnya popularitas dan aksesibilitas ponsel pintar di kalangan generasi ini, aplikasi kesehatan seluler telah muncul sebagai alat yang potensial untuk mempromosikan dan mendukung perilaku sehat. Penelitian ini mengadopsi pendekatan metode campuran, menggabungkan survei kuantitatif dan wawancara kualitatif, untuk mengumpulkan wawasan yang komprehensif tentang keterlibatan, dampak, pengalaman, dan persepsi individu Generasi Z terhadap teknologi ini. Desain penelitian ini melibatkan teknik pengambilan sampel multi-tahap untuk memilih partisipan dari berbagai wilayah dan institusi pendidikan di Jakarta. Temuan yang diharapkan akan menjelaskan tingkat keterlibatan individu Generasi Z di Jakarta dengan aplikasi kesehatan seluler dan fitur pemantauan kesehatan. Dampak dari teknologi ini terhadap perilaku kesehatan dan pilihan gaya hidup akan dieksplorasi, bersama dengan pemahaman tentang pengalaman, persepsi, dan sikap partisipan dalam menggunakan aplikasi kesehatan seluler. Penelitian ini juga bertujuan untuk mengidentifikasi hambatan dan fasilitator yang mempengaruhi adopsi dan penggunaan aplikasi-aplikasi ini secara berkelanjutan di kalangan Generasi Z di Jakarta. Dengan memahami efektivitas dan pengalaman pengguna aplikasi kesehatan mobile, penyedia layanan kesehatan, pembuat kebijakan, dan pengembang dapat meningkatkan desain dan penyampaian teknologi ini untuk memenuhi kebutuhan dan preferensi spesifik generasi ini. Temuan ini juga menginformasikan komunitas ilmiah yang lebih luas tentang peran aplikasi kesehatan seluler dalam mempromosikan gaya hidup sehat di kalangan Generasi Z.&lt;/p&gt;&quot;,&quot;issue&quot;:&quot;06&quot;,&quot;volume&quot;:&quot;2&quot;,&quot;container-title-short&quot;:&quot;&quot;},&quot;isTemporary&quot;:false},{&quot;id&quot;:&quot;4a01ff65-9f5c-3579-a798-cd38e0b6b6f7&quot;,&quot;itemData&quot;:{&quot;type&quot;:&quot;article-journal&quot;,&quot;id&quot;:&quot;4a01ff65-9f5c-3579-a798-cd38e0b6b6f7&quot;,&quot;title&quot;:&quot;Peningkatan Pemberdayaan UPTD Puskesmas Kertasemaya Dalam Hal Asesmen Kejiwaan Melalui Aplikasi Asesmen Kejiwaan Berbasis Mobile&quot;,&quot;groupId&quot;:&quot;5d3d1151-c3fb-3f7b-bcf0-db626a6f9f8b&quot;,&quot;author&quot;:[{&quot;family&quot;:&quot;Farkhan&quot;,&quot;given&quot;:&quot;Farkhan&quot;,&quot;parse-names&quot;:false,&quot;dropping-particle&quot;:&quot;&quot;,&quot;non-dropping-particle&quot;:&quot;&quot;},{&quot;family&quot;:&quot;Yani&quot;,&quot;given&quot;:&quot;Mohammad&quot;,&quot;parse-names&quot;:false,&quot;dropping-particle&quot;:&quot;&quot;,&quot;non-dropping-particle&quot;:&quot;&quot;},{&quot;family&quot;:&quot;Nur Himawan&quot;,&quot;given&quot;:&quot;Salamet&quot;,&quot;parse-names&quot;:false,&quot;dropping-particle&quot;:&quot;&quot;,&quot;non-dropping-particle&quot;:&quot;&quot;},{&quot;family&quot;:&quot;Sohiburoyyan&quot;,&quot;given&quot;:&quot;Robieth&quot;,&quot;parse-names&quot;:false,&quot;dropping-particle&quot;:&quot;&quot;,&quot;non-dropping-particle&quot;:&quot;&quot;}],&quot;container-title&quot;:&quot;Jurnal Pengabdian Masyarakat Indonesia&quot;,&quot;DOI&quot;:&quot;10.52436/1.jpmi.1967&quot;,&quot;ISSN&quot;:&quot;2775-3026&quot;,&quot;issued&quot;:{&quot;date-parts&quot;:[[2023,12,6]]},&quot;page&quot;:&quot;885-902&quot;,&quot;abstract&quot;:&quot;&lt;p&gt;Sebagai satu-satunya Pusat Kesehatan Masyarakat (Puskesmas) di kabupten Indramayu yang memiliki Poli Jiwa, Puskesmas Kertasemaya menjadi percontohan bagi Puskesmas lain di Indramayu untuk bisa menjadi fasilitas kesehatan (Faskes) tingkat pertama yang dapat memberikan pelayanan yang baik kepada masyarakat. Saat ini poli jiwa di Puskesmas Kertasemaya memberikan pelayanan asesmen dini kesehatan jiwa bagi masyarakat yang membutuhkan. Layanan asesmen dilakukan dengan cara mewawancarai pasien menggunakan instrumen kuisioner Strength Difficulties Questionaire (SDQ) dan Self Reporting Questionaire (SRQ) secara langsung. Akan tetapi pertemuan fisik secara langsung ini dapat membuat pasien merasa tidak nyaman karena ada kesan bahwa orang dengan gangguan jiwa (ODGJ) memiliki stigma yang kurang baik bagi personalitinya apalagi dapat diketahui oleh orang lain dalam hal ini pewawancara. Oleh karena itu, sebuah pendekatan asesmen secara tidak langsung (non-tatap muka) perlu dibuat untuk mengatasi masalah ketidaknyamanan tersebut. Pada kegiatan pengabdian kepada masyarakat (PKM) ini, kami mengusulkan sebuah aplikasi asesmen gangguan kejiwaan berbasis mobile menggunakan Android. Algoritma dibuat dengan cara mengimplementasikan konsep struktur keputusan untuk menentukan hasil diagnosis asesmen sesuai dengan instrumen yang digunakan baik SDQ maupun SRQ. Secara teknis, pertanyaan-pertanyaan SDQ dan SRQ disimpan dalam sebuah List/Array dan diberikan nilai bobot untuk setiap pilihan jawaban yang ada atas pertanyaan-pertanyaan tersebut. Nilai bobot kemudian dikumulasikan untuk mendapatkan skor akhir atas jawaban yang diisi oleh pengguna/pasien. Skor akhir tersebut kemudian digunakan untuk mengklasifikasikan hasil diagnosis atas asesmen yang dilakukan oleh pengguna/pasien. Tujuan dari pengembangan aplikasi ini adalah untuk menjaga privasi pasien dan mempermudah dan mempercepat petugas poli jiwa dalam melakukan asesmen kejiwaan. Hasil dari kegiatan PKM ini adalah kemudahan petugas poli jiwa dalam melakukan asesmen kejiwaan dan merekap hasil asesmen ke dalam database.&lt;/p&gt;&quot;,&quot;issue&quot;:&quot;6&quot;,&quot;volume&quot;:&quot;3&quot;,&quot;container-title-short&quot;:&quot;&quot;},&quot;isTemporary&quot;:false},{&quot;id&quot;:&quot;d1b666d2-7fe1-306b-a77f-17c0ce568cae&quot;,&quot;itemData&quot;:{&quot;type&quot;:&quot;article-journal&quot;,&quot;id&quot;:&quot;d1b666d2-7fe1-306b-a77f-17c0ce568cae&quot;,&quot;title&quot;:&quot;Perancangan User Interface Aplikasi “Impruv” Sebagai Akses Digital Layanan Kesehatan Mental&quot;,&quot;groupId&quot;:&quot;5d3d1151-c3fb-3f7b-bcf0-db626a6f9f8b&quot;,&quot;author&quot;:[{&quot;family&quot;:&quot;Septianingrum&quot;,&quot;given&quot;:&quot;Zachrani&quot;,&quot;parse-names&quot;:false,&quot;dropping-particle&quot;:&quot;&quot;,&quot;non-dropping-particle&quot;:&quot;&quot;},{&quot;family&quot;:&quot;Nadia&quot;,&quot;given&quot;:&quot;Zita&quot;,&quot;parse-names&quot;:false,&quot;dropping-particle&quot;:&quot;&quot;,&quot;non-dropping-particle&quot;:&quot;&quot;}],&quot;container-title&quot;:&quot;Desainpedia Journal of Urban Design, Lifestyle &amp; Behaviour&quot;,&quot;DOI&quot;:&quot;10.36262/dpj.v1i2.637&quot;,&quot;ISSN&quot;:&quot;2830-2966&quot;,&quot;issued&quot;:{&quot;date-parts&quot;:[[2022,11,30]]},&quot;page&quot;:&quot;60&quot;,&quot;abstract&quot;:&quot;&lt;p&gt;In Indonesia, the prevalence rate of mental emotional disorders is quite high. The Indonesian Ministry of Health stated that the number of people with mental disorders had increased by 6.5% during the 2020-2021 period. However, there are still many individuals who do not seek help for their mental health. Some of them do not know how to get access to adequate services. In addition, the rapid development of digital technology can be an important means of providing mental health services that are in line with the needs of the younger generation. The method used in this study is qualitative method. The purpose of this study is to design a mental health consultation application user interface that is in accordance with user needs so as to improve mental health services to be more effective and efficient. It is hoped that this application design can make it easier for the public to get access to mental health services.&lt;/p&gt;&quot;,&quot;issue&quot;:&quot;2&quot;,&quot;volume&quot;:&quot;1&quot;,&quot;container-title-short&quot;:&quot;&quot;},&quot;isTemporary&quot;:false},{&quot;id&quot;:&quot;6d20510b-c9bc-3ca0-9826-55a8bd928378&quot;,&quot;itemData&quot;:{&quot;type&quot;:&quot;article-journal&quot;,&quot;id&quot;:&quot;6d20510b-c9bc-3ca0-9826-55a8bd928378&quot;,&quot;title&quot;:&quot;Game Edukasi Pengenalan Gangguan Psikologis Remaja Menggunakan Metode DGBL-ID&quot;,&quot;groupId&quot;:&quot;5d3d1151-c3fb-3f7b-bcf0-db626a6f9f8b&quot;,&quot;author&quot;:[{&quot;family&quot;:&quot;Prasetyo&quot;,&quot;given&quot;:&quot;Tri Ferga&quot;,&quot;parse-names&quot;:false,&quot;dropping-particle&quot;:&quot;&quot;,&quot;non-dropping-particle&quot;:&quot;&quot;},{&quot;family&quot;:&quot;Bastian&quot;,&quot;given&quot;:&quot;Ade&quot;,&quot;parse-names&quot;:false,&quot;dropping-particle&quot;:&quot;&quot;,&quot;non-dropping-particle&quot;:&quot;&quot;},{&quot;family&quot;:&quot;Sifana&quot;,&quot;given&quot;:&quot;Tika&quot;,&quot;parse-names&quot;:false,&quot;dropping-particle&quot;:&quot;&quot;,&quot;non-dropping-particle&quot;:&quot;&quot;}],&quot;container-title&quot;:&quot;Jurnal Nasional Komputasi dan Teknologi Informasi (JNKTI)&quot;,&quot;DOI&quot;:&quot;10.32672/jnkti.v3i2.2030&quot;,&quot;ISSN&quot;:&quot;2621-3052&quot;,&quot;issued&quot;:{&quot;date-parts&quot;:[[2020,10,10]]},&quot;page&quot;:&quot;121-131&quot;,&quot;abstract&quot;:&quot;&lt;p&gt;Salah satu dampak dari meningkatnya penggunaan smartphone adalah meningkatnya interaksi antara pengguna dan gadget. Sebagian besar pengguna merupakan anak remaja, dengan tujuan penggunaan untuk memainkan permainan. Namun, sebagian besar permainan yang tersedia di Playstore adalah jenis permainan yang belum memiliki efek positif bagi penggunanya terutama remaja. Masa remaja dianggap sebagai waktu di mana individu berusaha untuk membuat identitas mereka sendiri dan menerima informasi dari luar diri mereka sendiri tanpa berpikir lebih lanjut. Akibatnya, beberapa remaja rentan terhadap gangguan psikologis. Gangguan psikologis remaja adalah salah satu gangguan kesehatan mental yang paling mungkin dialami oleh kebanyakan remaja. Ada beberapa penyebab gangguan psikologis pada remaja termasuk depresi, kecemasan, dan sosial diri yang menarik. Kurangnya pengetahuan publik tentang tanda, gejala gangguan psikologis remaja, memiliki perlakuan yang salah kepada penderita. Penelitian ini bertujuan untuk mendidik beberapa gangguan psikologis pada remaja dalam bentuk desktop dan game kuis berbasis android di mana ada informasi dan visualisasi tentang gangguan psikologis pada remaja. Metode pengembangan sistem yang digunakan dalam pembuatan game edukasi ini adalah DGBL-ID (digital game based learning intructional design).&lt;/p&gt;&quot;,&quot;issue&quot;:&quot;2&quot;,&quot;volume&quot;:&quot;3&quot;,&quot;container-title-short&quot;:&quot;&quot;},&quot;isTemporary&quot;:false},{&quot;id&quot;:&quot;1f7dbe19-2041-363c-bf0c-55ca2101c0c5&quot;,&quot;itemData&quot;:{&quot;type&quot;:&quot;article-journal&quot;,&quot;id&quot;:&quot;1f7dbe19-2041-363c-bf0c-55ca2101c0c5&quot;,&quot;title&quot;:&quot;Peran Chatbot dalam Menangani Masalah Kesehatan Mental selama Pandemi COVID-19: Tinjauan Mini&quot;,&quot;groupId&quot;:&quot;5d3d1151-c3fb-3f7b-bcf0-db626a6f9f8b&quot;,&quot;author&quot;:[{&quot;family&quot;:&quot;Urfa Khairatun Hisan&quot;,&quot;given&quot;:&quot;&quot;,&quot;parse-names&quot;:false,&quot;dropping-particle&quot;:&quot;&quot;,&quot;non-dropping-particle&quot;:&quot;&quot;},{&quot;family&quot;:&quot;Miftahul Amri&quot;,&quot;given&quot;:&quot;Muhammad&quot;,&quot;parse-names&quot;:false,&quot;dropping-particle&quot;:&quot;&quot;,&quot;non-dropping-particle&quot;:&quot;&quot;}],&quot;container-title&quot;:&quot;Bincang Sains dan Teknologi&quot;,&quot;DOI&quot;:&quot;10.56741/bst.v1i01.33&quot;,&quot;ISSN&quot;:&quot;2961-8746&quot;,&quot;issued&quot;:{&quot;date-parts&quot;:[[2022,8,3]]},&quot;page&quot;:&quot;1-11&quot;,&quot;abstract&quot;:&quot;&lt;p&gt;Pada artikel ini, kami menyajikan ulasan mini tentang potensi chatbot untuk memerangi masalah kesehatan mental selama pandemi COVID-19. Kami menyajikan perbandingan studi terdahulu terkait COVID-19 dan pengembangan chatbot. Kami juga melakukan survei mini untuk memberikan wawasan tentang bagaimana orang memandang chatbot sebagai bantuan kesehatan mental mereka. Naskah ini bertujuan untuk memberikan gambaran tentang kemungkinan pengembangan chatbot untuk mengurangi penyakit mental. Ada beberapa hal yang perlu diperhatikan secara serius dalam mengembangkan chatbot untuk dukungan emosional, antara lain masalah keamanan, perhatian privasi, dan paradigma etika. Namun, di antara referensi yang menarik, sebagian besar menunjukkan bahwa chatbot adalah alternatif yang baik untuk memerangi masalah kesehatan mental, terutama selama pandemi COVID-19.&lt;/p&gt;&quot;,&quot;issue&quot;:&quot;01&quot;,&quot;volume&quot;:&quot;1&quot;,&quot;container-title-short&quot;:&quot;&quot;},&quot;isTemporary&quot;:false},{&quot;id&quot;:&quot;c91b19e0-93fd-30e0-beb9-29107c49cbbb&quot;,&quot;itemData&quot;:{&quot;type&quot;:&quot;article-journal&quot;,&quot;id&quot;:&quot;c91b19e0-93fd-30e0-beb9-29107c49cbbb&quot;,&quot;title&quot;:&quot;RANCANG BANGUN APLIKASI SKRINING KESEHATAN MENTAL REMAJA BERBASIS WEB DI RSUD DR.DRADJAT PRAWIRANEGARA DENGAN MENGGUNAKAN METODE ANALYTIC HIERARCHY PROCESS (AHP)&quot;,&quot;groupId&quot;:&quot;5d3d1151-c3fb-3f7b-bcf0-db626a6f9f8b&quot;,&quot;author&quot;:[{&quot;family&quot;:&quot;Sutanto&quot;,&quot;given&quot;:&quot;Sutanto&quot;,&quot;parse-names&quot;:false,&quot;dropping-particle&quot;:&quot;&quot;,&quot;non-dropping-particle&quot;:&quot;&quot;},{&quot;family&quot;:&quot;Amiruddin&quot;,&quot;given&quot;:&quot;Dadang&quot;,&quot;parse-names&quot;:false,&quot;dropping-particle&quot;:&quot;&quot;,&quot;non-dropping-particle&quot;:&quot;&quot;},{&quot;family&quot;:&quot;Nugraha&quot;,&quot;given&quot;:&quot;Gagan&quot;,&quot;parse-names&quot;:false,&quot;dropping-particle&quot;:&quot;&quot;,&quot;non-dropping-particle&quot;:&quot;&quot;}],&quot;container-title&quot;:&quot;Journal of Innovation And Future Technology (IFTECH)&quot;,&quot;DOI&quot;:&quot;10.47080/iftech.v4i1.1813&quot;,&quot;ISSN&quot;:&quot;2656-2774&quot;,&quot;issued&quot;:{&quot;date-parts&quot;:[[2022,3,3]]},&quot;page&quot;:&quot;29-38&quot;,&quot;abstract&quot;:&quot;&lt;p&gt;The development of information systems is now very fast and rapid, one form of information system that is easy to develop is web-based. The use of information systems in the medical world is very much, but there are still some who have not utilized the information system to help the work of a medical worker, especially in helping the development of mental health. The system used to help improve mental health in dr.Dradjat Prawiranegara Hospital is now still conventional, namely face to face between medical personnel and patients, this is what makes teenagers who have problems with their mental health have a variety of reasons not to visit a psychiatrist. The web-based adolescent mental health screening application is designed using php programming language, MySQL database and decision making system using Analytic Hierarchy Process (AHP) method. By implementing Web- Based Adolescent Mental Health Screening Application Using Analytic Hierarchy Process (AHP) method is expected to help teenagers know their mental health independently and provide information and education about mental health disorders.&lt;/p&gt;&quot;,&quot;issue&quot;:&quot;1&quot;,&quot;volume&quot;:&quot;4&quot;,&quot;container-title-short&quot;:&quot;&quot;},&quot;isTemporary&quot;:false},{&quot;id&quot;:&quot;221f8cbe-d21a-3655-acc9-9dfddbc91900&quot;,&quot;itemData&quot;:{&quot;type&quot;:&quot;article-journal&quot;,&quot;id&quot;:&quot;221f8cbe-d21a-3655-acc9-9dfddbc91900&quot;,&quot;title&quot;:&quot;Depresion Diagnosis Application Using Beck Depression Inventory Method with Visual Novel Game&quot;,&quot;groupId&quot;:&quot;5d3d1151-c3fb-3f7b-bcf0-db626a6f9f8b&quot;,&quot;author&quot;:[{&quot;family&quot;:&quot;Ihsanuddin&quot;,&quot;given&quot;:&quot;Moh Rizal&quot;,&quot;parse-names&quot;:false,&quot;dropping-particle&quot;:&quot;&quot;,&quot;non-dropping-particle&quot;:&quot;&quot;},{&quot;family&quot;:&quot;Taurusta&quot;,&quot;given&quot;:&quot;Cindy&quot;,&quot;parse-names&quot;:false,&quot;dropping-particle&quot;:&quot;&quot;,&quot;non-dropping-particle&quot;:&quot;&quot;}],&quot;container-title&quot;:&quot;Procedia of Engineering and Life Science&quot;,&quot;DOI&quot;:&quot;10.21070/pels.v2i0.1135&quot;,&quot;ISSN&quot;:&quot;2807-2243&quot;,&quot;issued&quot;:{&quot;date-parts&quot;:[[2021,11,26]]},&quot;abstract&quot;:&quot;&lt;p&gt;Disturbance of feelings with sadness that continues in the long term is an explanation of depression, which can interfere with the social life of the person who experiences it (Pieter and Namora, 2012). As many as 86.94 (27%) in 322 billion individuals in the Southeast Asia region, making it the area with the highest Depression Rate. Because of this, it is necessary to have a Depression Diagnosis Application with the beck depression inventory method with a Visual Novel game approach to give a general idea of ​​whether the person has depression or not. The purpose of this study is to provide another alternative for users to find out whether they have depression or not with visual novel game media. This research method uses the Beck Depression Inventory where users are given 21 questions that must be answered to determine the level of depression they have. The test results on this game succeeded in detecting a person's level of depression which was proven by testing on 5 people with the results that 60% did not experience depression, 20% experienced mood changes and 20% experienced moderate depression. The result of this research is to produce a visual novel game with the application of depression diagnosis in it. This study is intended for people aged 15 years and over who feel they have symptoms of depression to find out their current condition.&lt;/p&gt;&quot;,&quot;volume&quot;:&quot;2&quot;,&quot;container-title-short&quot;:&quot;&quot;},&quot;isTemporary&quot;:false},{&quot;id&quot;:&quot;cd23ebdb-6b4b-3b85-bd6d-1ea355f28509&quot;,&quot;itemData&quot;:{&quot;type&quot;:&quot;article-journal&quot;,&quot;id&quot;:&quot;cd23ebdb-6b4b-3b85-bd6d-1ea355f28509&quot;,&quot;title&quot;:&quot;Perancangan Game Digital Mobile dengan Teknik Dynamic untuk Mengubah Distorsi Kognitif Penderita Depresi Mayor pada Remaja&quot;,&quot;groupId&quot;:&quot;5d3d1151-c3fb-3f7b-bcf0-db626a6f9f8b&quot;,&quot;author&quot;:[{&quot;family&quot;:&quot;Amam&quot;,&quot;given&quot;:&quot;Muchammad Rizhamu&quot;,&quot;parse-names&quot;:false,&quot;dropping-particle&quot;:&quot;&quot;,&quot;non-dropping-particle&quot;:&quot;&quot;},{&quot;family&quot;:&quot;P&quot;,&quot;given&quot;:&quot;T. Arie Setiawan&quot;,&quot;parse-names&quot;:false,&quot;dropping-particle&quot;:&quot;&quot;,&quot;non-dropping-particle&quot;:&quot;&quot;},{&quot;family&quot;:&quot;Prestilliano&quot;,&quot;given&quot;:&quot;Jasson&quot;,&quot;parse-names&quot;:false,&quot;dropping-particle&quot;:&quot;&quot;,&quot;non-dropping-particle&quot;:&quot;&quot;}],&quot;container-title&quot;:&quot;Citradirga : Jurnal Desain Komunikasi Visual dan Intermedia&quot;,&quot;DOI&quot;:&quot;10.33479/cd.v6i01.929&quot;,&quot;ISSN&quot;:&quot;2686-567X&quot;,&quot;issued&quot;:{&quot;date-parts&quot;:[[2024,5,10]]},&quot;page&quot;:&quot;32-49&quot;,&quot;abstract&quot;:&quot;&lt;p&gt;Penelitian ini menginvestigasi potensi game digital \&quot;Isamu\&quot; dengan penerapan Teknik Dynamic Difficulty Scaling sebagai media terapi untuk penderita depresi mayor tingkat rendah pada kelompok usia 18-24 tahun. Dengan fokus pada peningkatan pemikiran kognitif, game ini dirancang untuk memberikan kontribusi positif dalam mengembangkan pola pikir adaptif dan positif pada pemain. Hasil penelitian menunjukkan bahwa penggunaan Teknik Dynamic Difficulty Scaling menghasilkan hasil yang positif sesuai dengan harapan, dengan tantangan yang disesuaikan sesuai kemampuan individu. Penelitian ini tidak hanya mendukung penggunaan game sebagai alat terapi depresi mayor, tetapi juga menunjukkan potensi pengembangan lebih lanjut dalam bidang ini.&lt;/p&gt;&quot;,&quot;issue&quot;:&quot;01&quot;,&quot;volume&quot;:&quot;6&quot;,&quot;container-title-short&quot;:&quot;&quot;},&quot;isTemporary&quot;:false},{&quot;id&quot;:&quot;3bc5cfd4-6496-338c-b601-4220685a453b&quot;,&quot;itemData&quot;:{&quot;type&quot;:&quot;article-journal&quot;,&quot;id&quot;:&quot;3bc5cfd4-6496-338c-b601-4220685a453b&quot;,&quot;title&quot;:&quot;Platfrom Video Game sebagai Media Terapeutik&quot;,&quot;groupId&quot;:&quot;5d3d1151-c3fb-3f7b-bcf0-db626a6f9f8b&quot;,&quot;author&quot;:[{&quot;family&quot;:&quot;Yunike&quot;,&quot;given&quot;:&quot;Yunike&quot;,&quot;parse-names&quot;:false,&quot;dropping-particle&quot;:&quot;&quot;,&quot;non-dropping-particle&quot;:&quot;&quot;},{&quot;family&quot;:&quot;Kusumawaty&quot;,&quot;given&quot;:&quot;Ira&quot;,&quot;parse-names&quot;:false,&quot;dropping-particle&quot;:&quot;&quot;,&quot;non-dropping-particle&quot;:&quot;&quot;}],&quot;container-title&quot;:&quot;Journal of Telenursing (JOTING)&quot;,&quot;DOI&quot;:&quot;10.31539/joting.v5i1.5888&quot;,&quot;ISSN&quot;:&quot;2684-8988&quot;,&quot;issued&quot;:{&quot;date-parts&quot;:[[2023,5,4]]},&quot;page&quot;:&quot;560-576&quot;,&quot;abstract&quot;:&quot;&lt;p&gt;This study attempts to use video games therapeutically, which can be used as a rationale for developing and utilizing video games as a therapeutic medium. This research method uses the PRISMA approach using the keywords \&quot;video game\&quot; and \&quot;teenagers,\&quot; \&quot;mental health,\&quot; and \&quot;intervention\&quot; in the Scopus electronic database, google scholar, Science Direct and Pubmed with a range of years 2018 to 2022. Based on the research results, they have identified the definition of video games along with their platforms and the use of video games to improve mental health for humans of all ages, especially adolescents. It is proven that improving the physical condition of older adults can involve the role of video games as a medium in them. In conclusion, thus, the study of the development and use of video games is urgent to help improve human health status.&amp;#13; Keywords: Adolescent Mental Health, Therapeutic Media, Video Games&lt;/p&gt;&quot;,&quot;issue&quot;:&quot;1&quot;,&quot;volume&quot;:&quot;5&quot;,&quot;container-title-short&quot;:&quot;&quot;},&quot;isTemporary&quot;:false},{&quot;id&quot;:&quot;3928dbd9-696e-37ab-9954-b2979d471b4a&quot;,&quot;itemData&quot;:{&quot;type&quot;:&quot;article-journal&quot;,&quot;id&quot;:&quot;3928dbd9-696e-37ab-9954-b2979d471b4a&quot;,&quot;title&quot;:&quot;A novel ACT-based video game to support mental health through embedded learning: a mixed-methods feasibility study protocol&quot;,&quot;groupId&quot;:&quot;5d3d1151-c3fb-3f7b-bcf0-db626a6f9f8b&quot;,&quot;author&quot;:[{&quot;family&quot;:&quot;Edwards&quot;,&quot;given&quot;:&quot;Darren J&quot;,&quot;parse-names&quot;:false,&quot;dropping-particle&quot;:&quot;&quot;,&quot;non-dropping-particle&quot;:&quot;&quot;},{&quot;family&quot;:&quot;Kemp&quot;,&quot;given&quot;:&quot;Andrew H&quot;,&quot;parse-names&quot;:false,&quot;dropping-particle&quot;:&quot;&quot;,&quot;non-dropping-particle&quot;:&quot;&quot;}],&quot;container-title&quot;:&quot;BMJ Open&quot;,&quot;DOI&quot;:&quot;10.1136/bmjopen-2020-041667&quot;,&quot;ISSN&quot;:&quot;2044-6055&quot;,&quot;issued&quot;:{&quot;date-parts&quot;:[[2020,11,16]]},&quot;page&quot;:&quot;e041667&quot;,&quot;issue&quot;:&quot;11&quot;,&quot;volume&quot;:&quot;10&quot;,&quot;container-title-short&quot;:&quot;BMJ Open&quot;},&quot;isTemporary&quot;:false},{&quot;id&quot;:&quot;9fd96b1a-13a8-32d7-8cd2-190688105856&quot;,&quot;itemData&quot;:{&quot;type&quot;:&quot;article-journal&quot;,&quot;id&quot;:&quot;9fd96b1a-13a8-32d7-8cd2-190688105856&quot;,&quot;title&quot;:&quot;CBT4Depression: A Cognitive Behaviour Therapy (CBT) Therapeutic Game to Reduce Depression Level among Adolescents&quot;,&quot;groupId&quot;:&quot;5d3d1151-c3fb-3f7b-bcf0-db626a6f9f8b&quot;,&quot;author&quot;:[{&quot;family&quot;:&quot;Yusof&quot;,&quot;given&quot;:&quot;Norhana&quot;,&quot;parse-names&quot;:false,&quot;dropping-particle&quot;:&quot;&quot;,&quot;non-dropping-particle&quot;:&quot;&quot;},{&quot;family&quot;:&quot;Shaari&quot;,&quot;given&quot;:&quot;Nazrul Azha Mohamed&quot;,&quot;parse-names&quot;:false,&quot;dropping-particle&quot;:&quot;&quot;,&quot;non-dropping-particle&quot;:&quot;&quot;},{&quot;family&quot;:&quot;Yusoff&quot;,&quot;given&quot;:&quot;Eizwan Hamdie&quot;,&quot;parse-names&quot;:false,&quot;dropping-particle&quot;:&quot;&quot;,&quot;non-dropping-particle&quot;:&quot;&quot;}],&quot;container-title&quot;:&quot;International Journal of Advanced Computer Science and Applications&quot;,&quot;DOI&quot;:&quot;10.14569/IJACSA.2022.0130930&quot;,&quot;ISSN&quot;:&quot;21565570&quot;,&quot;issued&quot;:{&quot;date-parts&quot;:[[2022]]},&quot;issue&quot;:&quot;9&quot;,&quot;volume&quot;:&quot;13&quot;,&quot;container-title-short&quot;:&quot;&quot;},&quot;isTemporary&quot;:false},{&quot;id&quot;:&quot;954640fc-6ac1-3d4b-80a1-96f75a2870e8&quot;,&quot;itemData&quot;:{&quot;type&quot;:&quot;article-journal&quot;,&quot;id&quot;:&quot;954640fc-6ac1-3d4b-80a1-96f75a2870e8&quot;,&quot;title&quot;:&quot;Perancangan UI/UX pada Aplikasi Hello Life dengan Metode Design Thinking&quot;,&quot;groupId&quot;:&quot;5d3d1151-c3fb-3f7b-bcf0-db626a6f9f8b&quot;,&quot;author&quot;:[{&quot;family&quot;:&quot;Renaldo&quot;,&quot;given&quot;:&quot;Florence&quot;,&quot;parse-names&quot;:false,&quot;dropping-particle&quot;:&quot;&quot;,&quot;non-dropping-particle&quot;:&quot;&quot;},{&quot;family&quot;:&quot;Cahyati&quot;,&quot;given&quot;:&quot;Imelia Dwinora&quot;,&quot;parse-names&quot;:false,&quot;dropping-particle&quot;:&quot;&quot;,&quot;non-dropping-particle&quot;:&quot;&quot;},{&quot;family&quot;:&quot;Dody&quot;,&quot;given&quot;:&quot;Muhammad&quot;,&quot;parse-names&quot;:false,&quot;dropping-particle&quot;:&quot;&quot;,&quot;non-dropping-particle&quot;:&quot;&quot;},{&quot;family&quot;:&quot;Pribadi&quot;,&quot;given&quot;:&quot;Muhammad Rizky&quot;,&quot;parse-names&quot;:false,&quot;dropping-particle&quot;:&quot;&quot;,&quot;non-dropping-particle&quot;:&quot;&quot;},{&quot;family&quot;:&quot;Fajriati&quot;,&quot;given&quot;:&quot;Riska&quot;,&quot;parse-names&quot;:false,&quot;dropping-particle&quot;:&quot;&quot;,&quot;non-dropping-particle&quot;:&quot;&quot;},{&quot;family&quot;:&quot;Kurniawan&quot;,&quot;given&quot;:&quot;Rizky&quot;,&quot;parse-names&quot;:false,&quot;dropping-particle&quot;:&quot;&quot;,&quot;non-dropping-particle&quot;:&quot;&quot;}],&quot;container-title&quot;:&quot;The 1st MDP Student Conference 2022&quot;,&quot;issued&quot;:{&quot;date-parts&quot;:[[2022,1,29]]},&quot;page&quot;:&quot;273-278&quot;,&quot;abstract&quot;:&quot;Tingginya  angka  depresi  menimbulkan  banyak  kasus  bunuh  diri  di Indonesia  terutama  di  kalangan  Mahasiswa.  Hal  ini  membantu  munculnya beberapa fitur konsultasipsikologi online. Mereka akan melayani orang -orang yang   membutuhkan   psikologi   untuk   mengobati   rasa   depresinya.   Namun terkadang menyembuhkan orang depresi itu tidak mudah karena membutuhkan waktu untuk menyatukan pikiran. Makalah ini menjabarkan proses prototyping sebuah platform   online berbentuk   aplikasi   bernama Hello   Lfieuntuk mempermudah orang mencari dan melakukan konsultasi online dengan beberapa psikolog berpengalaman. Platform ini dibuat menggunakan pendekatan Design Thinking berdasarkan  kebutuhan  dan  pengalaman  pengguna.  Tahap Design Thinking meliputi empathize, define, ideate, prototype, dan testing. Tidak hanya itu, platform ini juga memiliki fitur forum untuk berkomunikasi antar pengguna sehingga bisa berbagi pegalaman dan solusi yang dihadapi&quot;,&quot;issue&quot;:&quot;1&quot;,&quot;volume&quot;:&quot;1&quot;,&quot;container-title-short&quot;:&quot;&quot;},&quot;isTemporary&quot;:false},{&quot;id&quot;:&quot;7cff6e4f-585e-3432-b31e-41fd4b470bad&quot;,&quot;itemData&quot;:{&quot;type&quot;:&quot;article-journal&quot;,&quot;id&quot;:&quot;7cff6e4f-585e-3432-b31e-41fd4b470bad&quot;,&quot;title&quot;:&quot;Pengenalan Obat-obatan untuk Orang dengan Gangguan Jiwa Berdasarkan Gejalanya Menggunakan Augmented Reality&quot;,&quot;groupId&quot;:&quot;5d3d1151-c3fb-3f7b-bcf0-db626a6f9f8b&quot;,&quot;author&quot;:[{&quot;family&quot;:&quot;Zulfirman&quot;,&quot;given&quot;:&quot;Muhammad&quot;,&quot;parse-names&quot;:false,&quot;dropping-particle&quot;:&quot;&quot;,&quot;non-dropping-particle&quot;:&quot;&quot;}],&quot;issued&quot;:{&quot;date-parts&quot;:[[2023,3,21]]},&quot;abstract&quot;:&quot;Obat Psikotropika adalah zat atau obat, baik alamiah atau sintetis bukan narkotika yang berkhasiat psikoaktif melalui selektif pada susunan saraf pusat yang menyebabkan perubahan khas pada aktifitas mental dan perilaku. Bagi mahasiswa terutama mahasiswa keperawatan sangat penting untuk mengetahui jenis obat apa saja yang akan diberikan kepada pasien karena perawat merupakan tenaga kesehatan yang selalu berada disekitar pasien dan mengetahui kondisi pasien. Kurangnya tingkat pengetahuan tentang jenis obat-obatan orang dalam gangguan jiwa dikarenakan terbatasnya media untuk mendukung proses belajar pengenalan tentang obat obatan orang dalam gangguan jiwa, mahasiswa keperawatan hanya dapat informasi tentang obat-obatan dari buku dan penjelasan tenaga kesehatan lainnya yang kurang. Atas dasar tersebut, penulis bermaksud untuk merancang sebuah aplikasi “Pengenalan Obat Obatan Orang Dalam Gangguan Jiwa Berdasarkan Gejalanya Menggunakan Augmented Reality”, untuk membantu proses belajar mengenali obat-obatan orang dalam gangguan jiwa pada mahasiswa perawat bidang tenaga kesehatan yang sedang melakukan dinas praktek di Rumah Sakit Jiwa Tampan dengan menggunakan teknik markerless serta menggunakan library ARCoreSDK. Berdasarkan pengujian pada jarak 15 cm sampai 200 cm objek 3D dapat ditampilkan dengan baik, serta objek dapat ditampilkan diluar ruangan maupun didalam ruangan dan bisa melakukan tracking (penandaan) lokasi dimana saja dengan syarat memiliki intesitas cahaya menimal\n12 lux. Berdasarkan hasil pengujian user didapatkan presentase 87% dengan responden sebanyak 35 mahasiswa keperawatan sehingga aplikasi ini dapat diimplementasikan sebagai media pembelajaran pengenalan obat khusus gangguan jiwa.\n&quot;,&quot;container-title-short&quot;:&quot;&quot;},&quot;isTemporary&quot;:false},{&quot;id&quot;:&quot;2a16fa9c-4e4c-3d79-9408-acb5555e12c0&quot;,&quot;itemData&quot;:{&quot;type&quot;:&quot;article-journal&quot;,&quot;id&quot;:&quot;2a16fa9c-4e4c-3d79-9408-acb5555e12c0&quot;,&quot;title&quot;:&quot;Analisis Prediksi Tingkat Depresi pada Siswa dengan Pendekatan Regresi Linier&quot;,&quot;groupId&quot;:&quot;5d3d1151-c3fb-3f7b-bcf0-db626a6f9f8b&quot;,&quot;author&quot;:[{&quot;family&quot;:&quot;Widyanti&quot;,&quot;given&quot;:&quot;Maya&quot;,&quot;parse-names&quot;:false,&quot;dropping-particle&quot;:&quot;&quot;,&quot;non-dropping-particle&quot;:&quot;&quot;}],&quot;container-title&quot;:&quot;Journal of Artificial Intelligence Application (JAIA)&quot;,&quot;issued&quot;:{&quot;date-parts&quot;:[[2024,2,2]]},&quot;page&quot;:&quot;10-18&quot;,&quot;abstract&quot;:&quot;Depresi pada siswa telah menjadi isu kesehatan mental yang semakin penting di kalangan populasi pelajar. Peningkatan tekanan akademis, perubahan sosial, dan tantangan perkembangan individu menjadi faktor-faktor utama yang berkontribusi pada prevalensi depresi yang meningkat di kalangan siswa. Dampaknya meluas dari aspek kesejahteraan mental hingga mempengaruhi prestasi akademis dan pengembangan pribadi. Pemahaman mendalam terhadap faktor risiko, gejala, serta dampak depresi pada siswa menjadi kunci dalam upaya pencegahan dan intervensi dini. Sekolah, orang tua, dan profesional kesehatan mental memegang peran penting dalam menciptakan lingkungan pendidikan yang mendukung, serta mengurangi stigma seputar masalah kesehatan mental. Pemanfaatan teknologi juga menjadi aspek penting dalam deteksi dini dan manajemen depresi pada siswa. Lingkungan pendidikan yang mendukung, program kesejahteraan mental di sekolah, dan peningkatan kesadaran terhadap masalah kesehatan mental dapat membantu mengurangi stigma seputar depresi di kalangan siswa. Teknologi juga berperan signifikan, dengan adanya aplikasi kesehatan mental dan sumber daya daring yang dapat memberikan bantuan dan dukungan kepada siswa yang membutuhkannya. Prediksi yang dilakukan ini menggunakan metode regresi dimana dalam metode regresi terdapat 7 metode lagi meliputi (1) Linear Regression, (2) Support Vector Regression – Linear, (3) Support Vector Regression – RBF, (4) Decision Tree Regression, (5) Random Forest Regressor, (6) Gradient Boosting Regression, (7) NLP Regressor yang diterapkan dalam penelitian ini. Berdasarkan 7 metode regresi tersebut akan dilakukan seleksi dalam memilih metode terbaik dengan nilai akurasi paling bagus yang digunakan dalam proses pengolahan deploy untukprediksi tingkat depresi pada siswa. Dari hasil akurasi 90:10, 80:20, 70:30, dan 60:40 bahwa metode yang bagus digunakan adalah metode Decision Tree Regression.&quot;,&quot;issue&quot;:&quot;1&quot;,&quot;volume&quot;:&quot;1&quot;,&quot;container-title-short&quot;:&quot;&quot;},&quot;isTemporary&quot;:false},{&quot;id&quot;:&quot;526c2f11-587b-35f5-aa50-3616e5f094ee&quot;,&quot;itemData&quot;:{&quot;type&quot;:&quot;article-journal&quot;,&quot;id&quot;:&quot;526c2f11-587b-35f5-aa50-3616e5f094ee&quot;,&quot;title&quot;:&quot;Sistem Pakar Diagnosa Tingkat Depresi pada Mahasiswa Semester Akhir Menggunakan Metode Certainty Factor Berbasis Web (Studi Kasus: Mahasiswa Semester Akhir Teknik Informatika Universitas Islam Lamongan)&quot;,&quot;groupId&quot;:&quot;5d3d1151-c3fb-3f7b-bcf0-db626a6f9f8b&quot;,&quot;author&quot;:[{&quot;family&quot;:&quot;Sulaiman&quot;,&quot;given&quot;:&quot;Akhmad Nurali&quot;,&quot;parse-names&quot;:false,&quot;dropping-particle&quot;:&quot;&quot;,&quot;non-dropping-particle&quot;:&quot;&quot;}],&quot;issued&quot;:{&quot;date-parts&quot;:[[2023]]},&quot;abstract&quot;:&quot;Depresi merupakan hal yang dialami oleh setiap orang, mahasiswa rentan\nterhadap depresi dan kecemasan. Salah satu faktor penyebab depresi di kalangan\nmahasiswa adalah perubahan lingkungan belajar. Banyak mahasiswa akhir yang\nmengalami depresi dikarenakan banyak tuntutan dan beberapa faktor, dibutuhkan\nsebuah aplikasi yang bisa mendiagnosa tingkat depresi pada mahasiswa semester\nakhir untuk mengurangi resiko depresi berkelanjutan. Dengan adanya permasalahan\ntersebut mendorong penulis untuk membuat sistem pakar diagnosa tingkat depresi\npada mahasiswa semester akhir menggunakan metode certainty factor yang\ndimaksud dapat mendiagnosa tingkat depresi pada mahasiswa semester akhir\ndengan akurat dan dapat membantu seorang pakar lebih cepat dalam proses\nidentifikasi penyakit, sistem pakar juga disertai dengan informasi dan langsung\ndikelola oleh pakar, sistem pakar ini menggunakan pemrograman web php dan\ndatabase mysql. Dengan tujuan dapat membangun website sistem pakar\nmenggunakan metode certainty factor untuk mendiagnosa tingkat depresi pada\nmahasiswa semester akhir, dan mengetahui tingkat akurasi metode certainty factor\nuntuk mendiagnosa tingkat depresi pada mahasiswa semester akhir beserta solusi\npenanganannya. Metode yang digunakan yaitu metode certainty factor, metode\ncertainty factor dipilih karena metode ini cocok dipakai dalam sistem pakar yang\nmengandung ketidak pastian, dalam sekali proses perhitungan hanya dapat\nmengolah dua data saja sehingga keakuratan data tetap terjaga. Data ini diperoleh\ndari pakar yang bernama Setyani Alfinuha M.Psi., melalui proses wawancara dan\nmendapatkan hasil berupa 3 data penyakit dan 21 data gejala. Uji coba sistem\nmenggunakan data sebanyak 25 mahasiswa yang mengalami depresi. Dari hasil\npercobaan presentase kesesuaian diagnosa sebesar 88%.&quot;,&quot;container-title-short&quot;:&quot;&quot;},&quot;isTemporary&quot;:false},{&quot;id&quot;:&quot;8941ab6a-1c2c-362f-826a-7ab03a8a8c9a&quot;,&quot;itemData&quot;:{&quot;type&quot;:&quot;article-journal&quot;,&quot;id&quot;:&quot;8941ab6a-1c2c-362f-826a-7ab03a8a8c9a&quot;,&quot;title&quot;:&quot;Aplikasi Terapi Kognitif Perilaku Religius terhadap Penurunan Skor Depresi di Kampung Tipar, Karangtengah, Kabupaten Cianjur&quot;,&quot;groupId&quot;:&quot;5d3d1151-c3fb-3f7b-bcf0-db626a6f9f8b&quot;,&quot;author&quot;:[{&quot;family&quot;:&quot;Febrianti&quot;,&quot;given&quot;:&quot;Vera&quot;,&quot;parse-names&quot;:false,&quot;dropping-particle&quot;:&quot;&quot;,&quot;non-dropping-particle&quot;:&quot;&quot;}],&quot;issued&quot;:{&quot;date-parts&quot;:[[2021]]},&quot;abstract&quot;:&quot;Depression is a mood disorder that appears dominantly when the stress experienced by a person does not go away, in general the feelings that arise are helplessness, disappointment and loss of hope. The purpose of this case study is to apply cognitive therapy to religious behavior to decrease depression scores. The method in this scientific paper is a case study with the provision of cognitive therapy for religious behavior. Data collection techniques were carried out by interviews, observation and literature/documentation studies. The results of the religious cognitive therapy intervention showed a decrease in depression scores after religious behavior cognitive therapy was carried out with a score of 26 to 18 as measured using BDI-II (Back Depression Inventory II). from these results it can be concluded that religious cognitive therapy has an effect on decreasing depression scores. The conclusion of this paper is that the provision of cognitive therapy for religious behavior is effective in reducing depression scores and this therapy can be an alternative for someone who is depressed because cognitive therapy for religious behavior changes the mindset and behavior based on the patient's personal values that have been previously held so that it can improve spiritual awareness and religious beliefs believed by the patient.&quot;,&quot;container-title-short&quot;:&quot;&quot;},&quot;isTemporary&quot;:false},{&quot;id&quot;:&quot;a12243af-0550-3046-8d4e-63eb0b96e8c1&quot;,&quot;itemData&quot;:{&quot;type&quot;:&quot;article-journal&quot;,&quot;id&quot;:&quot;a12243af-0550-3046-8d4e-63eb0b96e8c1&quot;,&quot;title&quot;:&quot;Pengembangan Hypermedia Learning Environment (HLE) untuk Meningkatkan Self-Regulated Learning Berdasarkan Kemampuan Self-Monitoring&quot;,&quot;groupId&quot;:&quot;5d3d1151-c3fb-3f7b-bcf0-db626a6f9f8b&quot;,&quot;author&quot;:[{&quot;family&quot;:&quot;Sakkinah&quot;,&quot;given&quot;:&quot;Intan Sulistyaningrum&quot;,&quot;parse-names&quot;:false,&quot;dropping-particle&quot;:&quot;&quot;,&quot;non-dropping-particle&quot;:&quot;&quot;},{&quot;family&quot;:&quot;Hartanto&quot;,&quot;given&quot;:&quot;Rudy&quot;,&quot;parse-names&quot;:false,&quot;dropping-particle&quot;:&quot;&quot;,&quot;non-dropping-particle&quot;:&quot;&quot;},{&quot;family&quot;:&quot;Erna Permanasari&quot;,&quot;given&quot;:&quot;Adhistya&quot;,&quot;parse-names&quot;:false,&quot;dropping-particle&quot;:&quot;&quot;,&quot;non-dropping-particle&quot;:&quot;&quot;}],&quot;container-title&quot;:&quot;Jurnal Nasional Teknik Elektro dan Teknologi Informasi&quot;,&quot;issued&quot;:{&quot;date-parts&quot;:[[2022,5,2]]},&quot;page&quot;:&quot;97-104&quot;,&quot;abstract&quot;:&quot;Penggunaan media pembelajaran saat ini telah\nberkembang pesat. Dewasa ini banyak penelitian yang\nmenggunakan komputer sebagai media pembelajaran yang\nadaptif bagi mahasiswa; salah satu contohnya adalah hypermedia\nlearning environment (HLE). Media HLE dikembangkan untuk\nmembantu mahasiswa dalam belajar, misalnya pada situasi\npandemi COVID-19 saat ini, yang mengharuskan semua aktivitas\npembelajaran dilakukan secara daring (online). Salah satu bidang\nyang terkena dampak pandemi ini adalah bidang pendidikan,\nyaitu semua kegiatan pembelajaran dialihkan menjadi daring.\nOleh karena itu, pembelajaran berbasis web HLE dapat\nmembantu mahasiswa untuk tetap belajar dari rumah. HLE saat\nini sedang dikembangkan untuk meningkatkan kemampuan\nmahasiswa dalam proses self-regulated learning (SRL). Ada\nkomponen penting di dalam SRL, yakni self-monitoring. Namun,\ndalam perkembangannya, HLE yang dikembangkan tidak\nberbasis self-monitoring. Dalam penelitian ini, HLE adaptif\ndikembangkan berdasarkan kemampuan self-monitoring\nmahasiswa. Dalam pengembangannya, sistem HLE menggunakan\nmetode pengembangan agile, yaitu Scrum. Pengumpulan data\nawal untuk klasifikasi mahasiswa dilakukan menggunakan selfregulatory inventory (SRI). SRI merupakan instrumen yang\ndigunakan untuk mengukur kemampuan self-monitoring\nmahasiswa. Data kemudian diolah hingga dapat\nmengklasifikasikan siswa menjadi tiga kelas, yaitu high, medium,\ndan low. Hasil klasifikasi kemampuan siswa kemudian digunakan\nuntuk mengembangkan bantuan pembelajaran pada HLE.\nPengembangan bantuan yang disediakan adalah dalam bentuk\nteks dan video yang disesuaikan dengan tingkat self-monitoring\nmahasiswa. Dari hasil pengembangan, didapatkan bahwa semua\nfungsi HLE dapat berjalan dengan baik. Sistem diuji coba kepada\ndua belas mahasiswa untuk mengetahui tingkat usability dengan\nmenggunakan system usability scale (SUS). Hasil menunjukkan\nkategori good, dengan skor 72,92. Untuk penelitian selanjutnya,\ndapat dilakukan implementasi pada mahasiswa dan mengukur\nkeefektifan sistem yang telah dikembangkan.&quot;,&quot;issue&quot;:&quot;2&quot;,&quot;volume&quot;:&quot; 11&quot;,&quot;container-title-short&quot;:&quot;&quot;},&quot;isTemporary&quot;:false},{&quot;id&quot;:&quot;adb24d31-898e-3aa3-852c-035cb291f048&quot;,&quot;itemData&quot;:{&quot;type&quot;:&quot;article-journal&quot;,&quot;id&quot;:&quot;adb24d31-898e-3aa3-852c-035cb291f048&quot;,&quot;title&quot;:&quot;Expert System Mendiagnosa Tingkat Depresi Siswa Menggunakan Metode Certainly Factor&quot;,&quot;groupId&quot;:&quot;5d3d1151-c3fb-3f7b-bcf0-db626a6f9f8b&quot;,&quot;author&quot;:[{&quot;family&quot;:&quot;Yulianti&quot;,&quot;given&quot;:&quot;Nadia&quot;,&quot;parse-names&quot;:false,&quot;dropping-particle&quot;:&quot;&quot;,&quot;non-dropping-particle&quot;:&quot;&quot;}],&quot;issued&quot;:{&quot;date-parts&quot;:[[2023]]},&quot;abstract&quot;:&quot;Depresi adalah gangguan suasana hati yang ditandai dengan gejala seperti kemurungan, lesu, kurangnya gairah, perasaan tidak berharga, frustasi yang mendalam, keputusasaan, pikiran tentang kematian dan pikiran untuk bunuh diri, depresi merupakan salah satu kondisi kesehatan mental, banyak Siswa masih kesulitan untuk menentukan sudah sampai ditahap mana dan separah apa depresi yang mereka alami, Mengidentifikasi faktor yang mempengaruhi tingkat depresi yang dialami siswa dengan Menerapkan metode Certainly Factor (CF) pada sistem pakar untuk mendiagnosa tingkat depresi siswa, Certainly Factor adalah metode untuk menghadapi ketidakpastian dalam sistem berbasis aturan dengan melakukan perhitungan, setelah sistem berjalan dengan baik maka dilakukan implementasi terhadap siswa dengan cara mendaftar terlebih dulu kemudian login setelah itu menjawab pertanyaan dari data gejala-gejala yang menjadi penyebab depresi berdasarkan tingkatanya masing-masing&quot;,&quot;container-title-short&quot;:&quot;&quot;},&quot;isTemporary&quot;:false},{&quot;id&quot;:&quot;e238423e-ca06-337e-bf87-dd79ee66305a&quot;,&quot;itemData&quot;:{&quot;type&quot;:&quot;article-journal&quot;,&quot;id&quot;:&quot;e238423e-ca06-337e-bf87-dd79ee66305a&quot;,&quot;title&quot;:&quot;SISTEM PAKAR DIAGNOSA DINI MENTAL HEALTH MENGGUNAKAN METODE CERTAINTY FACTOR BERBASIS WEB&quot;,&quot;groupId&quot;:&quot;5d3d1151-c3fb-3f7b-bcf0-db626a6f9f8b&quot;,&quot;author&quot;:[{&quot;family&quot;:&quot;Riskiani&quot;,&quot;given&quot;:&quot;Dwi&quot;,&quot;parse-names&quot;:false,&quot;dropping-particle&quot;:&quot;&quot;,&quot;non-dropping-particle&quot;:&quot;&quot;}],&quot;container-title&quot;:&quot;Jurnal Informatika MULTI &quot;,&quot;issued&quot;:{&quot;date-parts&quot;:[[2023,12,15]]},&quot;page&quot;:&quot;594-600&quot;,&quot;abstract&quot;:&quot;Pandemi Covid-19 telah mengubah begitu banyak aspek dalam kehidupan. Dampak dari Pandemi Covid-19 ini tidak hanya berdampak pada segi fisik, namun juga kesehatan psikis atau mental yang disebabkan oleh berbagai masalah dan kecemasan. Namun masih banyak masyarakat yang belum mengenali dan mengindikasi adanya penyakit kejiwaan. Hal ini disebabkan oleh penyakit kejiwaan adalah penyakit yang tidak dapat dilihat tapi dapat diketahui dari gejala-gejala yang nampak secara fisik ataupun perilaku yang dialami pasien. Seringkali masyarakat mengabaikan gejala-gejala yang dialami pasien karena sifatnya yang samar. Penelitian ini bertujuan untuk mengembangkan sistem pakar dalam mendiagnosa dini kesehatan mental berbasis website dengan metode certainty factor. Penelitian ini diharapkan mampu mengatasi masalah masyarakat yang merasa mengalami gangguan kesehatan mental. agar bisa mendeteksi lebih dini, Sehingga bisa segera mendapatkan pertolongan, bisa lebih mengantisipasi agar dapat segera mengatasi masalahnya dan bisa segera berkonsultasi lebih lanjut dengan seorang dokter atau psikolog apabila kondisinya memerlukan pendampingan dari seorang ahli. Pengmbilan keputusan sistem pakar ini didasarkan pada data-data mengenai tanda dan gejala awal, gejala ringan hingga berat yang diperoleh dari jurnal ilmiah maupun buku-buku yang ditulis oleh para ahli dibidangnya. Metode yang digunakan untuk menentukan hasil pengujian adalah Certainly Factor. Penelitian ini menghasilkan sistem pakar untuk mendiagnosis lebih dini secara mandiri gangguan kesehatan mental yang dialami dengan tanda dan gejala yang diinput, serta dapat menampilkan solusi dari gangguan kesehatan mental yang dialami. Sistem ini akan dikembangkan dan diimplementasikan dengan UML (Undefinned Modeling Languange), PHP dan MySQL.&quot;,&quot;issue&quot;:&quot;6&quot;,&quot;volume&quot;:&quot;1&quot;,&quot;container-title-short&quot;:&quot;&quot;},&quot;isTemporary&quot;:false},{&quot;id&quot;:&quot;20756113-2ab5-3e7f-87fc-fcf13fad8279&quot;,&quot;itemData&quot;:{&quot;type&quot;:&quot;article-journal&quot;,&quot;id&quot;:&quot;20756113-2ab5-3e7f-87fc-fcf13fad8279&quot;,&quot;title&quot;:&quot;Perancangan Aplikasi Kesehatan Mental “NAFS” (Islamic Psycho Spiritual Therapy) Berbasis Android Menggunakan Metode PDCA (Plan-Do -CheckAction)&quot;,&quot;groupId&quot;:&quot;5d3d1151-c3fb-3f7b-bcf0-db626a6f9f8b&quot;,&quot;author&quot;:[{&quot;family&quot;:&quot;Ross&quot;,&quot;given&quot;:&quot;Hanna Oktasya&quot;,&quot;parse-names&quot;:false,&quot;dropping-particle&quot;:&quot;&quot;,&quot;non-dropping-particle&quot;:&quot;&quot;},{&quot;family&quot;:&quot;Arrohmah&quot;,&quot;given&quot;:&quot;Aulia Syifa&quot;,&quot;parse-names&quot;:false,&quot;dropping-particle&quot;:&quot;&quot;,&quot;non-dropping-particle&quot;:&quot;&quot;},{&quot;family&quot;:&quot;Hasanah&quot;,&quot;given&quot;:&quot;Megawatul&quot;,&quot;parse-names&quot;:false,&quot;dropping-particle&quot;:&quot;&quot;,&quot;non-dropping-particle&quot;:&quot;&quot;},{&quot;family&quot;:&quot;Yusran&quot;,&quot;given&quot;:&quot;Naufal&quot;,&quot;parse-names&quot;:false,&quot;dropping-particle&quot;:&quot;&quot;,&quot;non-dropping-particle&quot;:&quot;&quot;},{&quot;family&quot;:&quot;Wijareni&quot;,&quot;given&quot;:&quot;Nurastuti&quot;,&quot;parse-names&quot;:false,&quot;dropping-particle&quot;:&quot;&quot;,&quot;non-dropping-particle&quot;:&quot;&quot;}],&quot;container-title&quot;:&quot;Jurnal Informatika Universitas Pamulang &quot;,&quot;issued&quot;:{&quot;date-parts&quot;:[[2021,12]]},&quot;page&quot;:&quot;849-856&quot;,&quot;abstract&quot;:&quot;Selama pandemi Covid-19, persentase gangguan mental mengalami peningkatan yang signifikan.\nPeningkatan tersebut tidak sebanding dengan pelayanan ataupun media penanganan yang tersedia, terlebih\nmasyarakat Indonesia yang mayoritas muslim. Padahal, kesehatan mental menjadi salah satu aspek penting\ndalam kehidupan manusia. Maka dari itu dilakukan perancangan Aplikasi NAFS berdasarkan keilmuan\npsikologi Islam (Islamic psycho-spiritual therapy) yang dapat menjadi inovasi layanan kesehatan mental\nberbasis android. Perancangan Aplikasi NAFS dilakukan menggunakan metode PDCA dengan desain\npartisipatori. Hasil dari keseluruhan tahapan perancangan menunjukkan bahwa Aplikasi NAFS berdasarkan\npengujian alpha (black box method) dan beta menunjukkan fungsionalitas dan performansinya sesuai\ndengan kebutuhan dan rancangan yang sudah ditentukan. Dengan demikian dapat disimpulkan bahwa\nAplikasi NAFS bisa digunakan terutama bagi individu dengan mental illness, sebagai bentuk pertolongan\npertama kesehatan mental (mental health first aid) dan media edukasi kesehatan mental. &quot;,&quot;issue&quot;:&quot;4&quot;,&quot;volume&quot;:&quot;6&quot;,&quot;container-title-short&quot;:&quot;&quot;},&quot;isTemporary&quot;:false},{&quot;id&quot;:&quot;780d1ffb-d478-3e6d-b627-a44d97aa1843&quot;,&quot;itemData&quot;:{&quot;type&quot;:&quot;article-journal&quot;,&quot;id&quot;:&quot;780d1ffb-d478-3e6d-b627-a44d97aa1843&quot;,&quot;title&quot;:&quot;SISTEM PAKAR DIAGNOSA TINGKAT DEPRESI PASCA MELAHIRKAN DENGAN MENGGUNAKAN METODE CERTAINTY FACTOR BERBASIS ANDROID&quot;,&quot;groupId&quot;:&quot;5d3d1151-c3fb-3f7b-bcf0-db626a6f9f8b&quot;,&quot;author&quot;:[{&quot;family&quot;:&quot;Asshidiqie&quot;,&quot;given&quot;:&quot;Muhammad&quot;,&quot;parse-names&quot;:false,&quot;dropping-particle&quot;:&quot;&quot;,&quot;non-dropping-particle&quot;:&quot;&quot;},{&quot;family&quot;:&quot;Sitio&quot;,&quot;given&quot;:&quot;Sartika Lina Mulani&quot;,&quot;parse-names&quot;:false,&quot;dropping-particle&quot;:&quot;&quot;,&quot;non-dropping-particle&quot;:&quot;&quot;}],&quot;container-title&quot;:&quot;Buletin Ilmiah Ilmu Komputer dan Multimedia &quot;,&quot;issued&quot;:{&quot;date-parts&quot;:[[2023,7]]},&quot;page&quot;:&quot;296-304&quot;,&quot;abstract&quot;:&quot;Aplikasi Sistem Pakar Diagnosa Tingkat Depresi Pasca Melahirkan berbasis Android menggunakan metode  Certainty  Factor  untuk  mendiagnosis  tingkat  depresi  pasca  melahirkan  pada  ibu.  Dengan  fitur  input gejala interaktif dan perhitungan tingkat keyakinan otomatis, aplikasi ini memberikan solusi praktis dan mudah diakses bagi pengguna Android dalam mendiagnosa serta memberikan rekomendasi tindakan yang tepat.&quot;,&quot;issue&quot;:&quot;2&quot;,&quot;volume&quot;:&quot;1&quot;,&quot;container-title-short&quot;:&quot;&quot;},&quot;isTemporary&quot;:false},{&quot;id&quot;:&quot;b9d56044-fc1f-3f1b-8ad6-7bd439519443&quot;,&quot;itemData&quot;:{&quot;type&quot;:&quot;article-journal&quot;,&quot;id&quot;:&quot;b9d56044-fc1f-3f1b-8ad6-7bd439519443&quot;,&quot;title&quot;:&quot;EFEKTIVITAS HIPNOTERAPI MENGGUNAKAN MOBILE APLIKASI (HIMO) DAN HIPNOTERAPI MANUAL (HIMA) PADA DEPRESI LANJUT USIA DI KOTA TASIKMALAYA&quot;,&quot;groupId&quot;:&quot;5d3d1151-c3fb-3f7b-bcf0-db626a6f9f8b&quot;,&quot;author&quot;:[{&quot;family&quot;:&quot;Rismawan&quot;,&quot;given&quot;:&quot;Wawan&quot;,&quot;parse-names&quot;:false,&quot;dropping-particle&quot;:&quot;&quot;,&quot;non-dropping-particle&quot;:&quot;&quot;},{&quot;family&quot;:&quot;Rahmat&quot;,&quot;given&quot;:&quot;Ibrahim&quot;,&quot;parse-names&quot;:false,&quot;dropping-particle&quot;:&quot;&quot;,&quot;non-dropping-particle&quot;:&quot;&quot;},{&quot;family&quot;:&quot;M&quot;,&quot;given&quot;:&quot;Carla Raymondalexas&quot;,&quot;parse-names&quot;:false,&quot;dropping-particle&quot;:&quot;&quot;,&quot;non-dropping-particle&quot;:&quot;&quot;}],&quot;issued&quot;:{&quot;date-parts&quot;:[[2022]]},&quot;abstract&quot;:&quot;Lansia sering mengalami gangguan mental seperti insomnia, stres psikososial, kecemasan, gangguan perilaku : agresif, agitasi, dan depresi. Perasaan kesepian, tidak berguna, putus asa, tidak berdaya, merupakan pernyataan yang sering disampaikan lanjut usia yang bunuh diri. Upaya penyembuhan depresi dapat dilakukan dengan farmakoterapi, farmakogenomik didukung oleh psikoterapi. Hipnoterapi merupakan salah satu dari psikoterapi dapat digunakan untuk mencegah dan mengatasi depresi. Hasil meta-analisis bahwa internet, mobile based intervention, eHealth dapat mencegah depresi berat. Penelitian bertujuan untuk mengetahui efektivitas intervensi hipnoterapi menggunakan mobile aplikasi (HIMO) dan hipnoterapi manual (HIMA) dalam menurunkan depresi pada lansia di Kota Tasikmalaya. Metode : kuantitatif eksperimen, aksidental sampling, sampel 2 kelompok secara randomisasi manual (concealment) intervensi HIMO dan HIMA. Dua kali intervensi, Empat kali pengukuran skor depresi dengan aplikasi GDS-15, CI=95%, ÃŽÂ±=5%, ÃŽÂ²=20%, analisis univariat, bivariat (uji repeated anova/ uji friedman), multivariat (GLM-RM). Hasil : Hasil penelitian ini menunjukan bahwa sampel penelitian berjumlah 94 orang (nHIMO=47, nHIMA=47), nilai depresi baseline (HIMO Ã‚Â¯x10,30-HIMA Ã‚Â¯x9,13), nilai depresi post intervensi ke-1 (HIMO Ã‚Â¯x8,57-HIMA Ã‚Â¯x4,96), nilai depresi post intervensi ke-2 (HIMO Ã‚Â¯x4,51-HIMA Ã‚Â¯x4,15), nilai depresi pada evaluasi (HIMO Ã‚Â¯x5,34-HIMA Ã‚Â¯x4,28), nilai p pada uji GLM-RM p&lt;0,001 sehingga terdapat perbedaan yang bermakna antara HIMO dan HIMA, perbandingan efektivitas menurunkan depresi (HIMO ke-1= Ã‚Â¯x67,73 - HIMA ke-1= Ã‚Â¯x27,27, HIMO ke-2= Ã‚Â¯x51,40 - HIMA ke-2= Ã‚Â¯x43,60, HIMO ke-3= Ã‚Â¯x56.02 - HIMA= Ã‚Â¯x39,98). Variabel confounders yang berpengaruh secara bermakna terhadap depresi adalah ketaatan ibadah, support system, penyakit kronis, kepercayaan diri dan kesepian. Simpulan : HIMO lebih efektif menurunkan depresi daripada HIMA. Saran : aplikasi skrining dan hipnoterapi dapat digunakan untuk mendeteksi dan terapi depresi pada lansia.&quot;,&quot;container-title-short&quot;:&quot;&quot;},&quot;isTemporary&quot;:false},{&quot;id&quot;:&quot;0c17040a-7275-3107-91cc-f5bceb52251a&quot;,&quot;itemData&quot;:{&quot;type&quot;:&quot;article-journal&quot;,&quot;id&quot;:&quot;0c17040a-7275-3107-91cc-f5bceb52251a&quot;,&quot;title&quot;:&quot;INOVASI PENANGANAN BULLYING DI SEKOLAHBERBASIS APLIKASI DIGITAL DI ERA SOCIETY 5.0&quot;,&quot;groupId&quot;:&quot;5d3d1151-c3fb-3f7b-bcf0-db626a6f9f8b&quot;,&quot;author&quot;:[{&quot;family&quot;:&quot;Ertinawati&quot;,&quot;given&quot;:&quot;Yuni&quot;,&quot;parse-names&quot;:false,&quot;dropping-particle&quot;:&quot;&quot;,&quot;non-dropping-particle&quot;:&quot;&quot;},{&quot;family&quot;:&quot;Nurjamilah&quot;,&quot;given&quot;:&quot;Ai Siti&quot;,&quot;parse-names&quot;:false,&quot;dropping-particle&quot;:&quot;&quot;,&quot;non-dropping-particle&quot;:&quot;&quot;},{&quot;family&quot;:&quot;Rachman&quot;,&quot;given&quot;:&quot;Ichsan Fauzi&quot;,&quot;parse-names&quot;:false,&quot;dropping-particle&quot;:&quot;&quot;,&quot;non-dropping-particle&quot;:&quot;&quot;}],&quot;container-title&quot;:&quot;Jurnal PEDAMAS (Pengabdian Kepada Masyarakat)&quot;,&quot;issued&quot;:{&quot;date-parts&quot;:[[2023,11]]},&quot;page&quot;:&quot;693-701&quot;,&quot;abstract&quot;:&quot;Bullying merupakan  sebuah  hasrat  untuk  menyakiti  dalam  berbagai  bentuk tindakan,   seperti   penganiayaan   fisik,   pencemaran   nama   baik,   intimidasi,   ejekan, pengucilan sosial, dan tindakan kekerasan lainnya. KPAI mencatat, terdapat total 26.954 laporan yang masuk sepanjang September 2011 sampai dengan September 2021 kasus yang  berkaitan  dengan  bullying.  Banyak  faktor  yang  dapat  menyebabkan  terjadinya bullying  di  sekolah,  termasuk  tekanan  sosial,  ketidaksepahaman  terhadap  perbedaan, ketidakmampuan untuk mengatasi konflik,kurangnya pengawasan dari orang dewasa, dan adanya  faktor  lingkungan  yang  tidak  kondusif.  Melalui  program  Pengabdian  Masyarakat Skema Program Kemitraan Masyarakat (PbM-PKM) Universitas Siliwangi Tasikmalaya, tim pengusul bermaksud untuk mengadakan sebuah pengabdian  berupa  penyuluhan terkait penggunaan aplikasi berbasis digital yang dapat digunakan oleh peserta didik ataupun wali muird  dalam  mengatasi  kasus  bullying  yang  terjadi  di  SDN  4  Gunungsari,  Kabupaten Tasikmalaya.  Berdasarkan  data  diatas  dapat  disimpulkan  bahwa  terjadi  peningkatan pengetahuan  para  wali  murid  siswa  SDN  4  Gunungsari  tentang  pengertian,  penyebab, bentuk,   dampak,   tanda,   penanganan,   pencegahan   setelah   diberikan   penyuluhan. Peningkatan pengetahuan ini karena adanya paparan informasi melalui penyuluhan atau edukasi  kesehatan  sehingga  ada  pengetahuan  dan  pelajaran  yang  diterima  oleh  para walimurid siswa SDN 4 Gunungsari tentang bullying&quot;,&quot;issue&quot;:&quot;4&quot;,&quot;volume&quot;:&quot;1&quot;,&quot;container-title-short&quot;:&quot;&quot;},&quot;isTemporary&quot;:false},{&quot;id&quot;:&quot;a17423b4-e9a2-3607-97a3-b36069027bbd&quot;,&quot;itemData&quot;:{&quot;type&quot;:&quot;article-journal&quot;,&quot;id&quot;:&quot;a17423b4-e9a2-3607-97a3-b36069027bbd&quot;,&quot;title&quot;:&quot;Pembangunan Aplikasi Perangkat Bergerak menggunakan Autonomous Sensory Meridian Response (ASMR) untuk Terapi Penderita Insomnia (Susah Tidur)&quot;,&quot;groupId&quot;:&quot;5d3d1151-c3fb-3f7b-bcf0-db626a6f9f8b&quot;,&quot;author&quot;:[{&quot;family&quot;:&quot;Darmawan&quot;,&quot;given&quot;:&quot;Alfin Hidayat&quot;,&quot;parse-names&quot;:false,&quot;dropping-particle&quot;:&quot;&quot;,&quot;non-dropping-particle&quot;:&quot;&quot;},{&quot;family&quot;:&quot;Brata&quot;,&quot;given&quot;:&quot;Komang Candra&quot;,&quot;parse-names&quot;:false,&quot;dropping-particle&quot;:&quot;&quot;,&quot;non-dropping-particle&quot;:&quot;&quot;},{&quot;family&quot;:&quot;Brata&quot;,&quot;given&quot;:&quot;Adam Hendra&quot;,&quot;parse-names&quot;:false,&quot;dropping-particle&quot;:&quot;&quot;,&quot;non-dropping-particle&quot;:&quot;&quot;}],&quot;container-title&quot;:&quot;Jurnal Pengembangan Teknologi Informasi dan Ilmu Komputer&quot;,&quot;issued&quot;:{&quot;date-parts&quot;:[[2021,8]]},&quot;abstract&quot;:&quot;Insomnia adalah sebuah penyakityang dialami oleh penderita gangguan tidur, penyakit tersebut dapat dialami oleh setiap orang diantara umur 15 tahun hingga 64 tahun. Adapun faktor yang menyebabkan gangguan  tidur  yang  meliputi  stress,  depresi,  gaya  hidup  tidak  sehat  dan  pengaruh obat-obatan  yang dapat mengganggu kualitas hidup penderita. Penelitian ini memiliki rumusan masalah bagaimana cara untuk membantu penderita insomnia agar dapat meningkatkan kualitas hidup. Penelitian yang berjudul “Pembangunan Aplikasi Perangkat Bergerak Menggunakan Autonomous Sensory Meridian Response (ASMR) untuk Terapi Penderita Insomnia (Susah Tidur)” dilakukan dengan bertujuan untuk membantu mengatasi   masalah   insomnia   yang   dialami   penderita.   Dalam   pengembangannya   penelitian   ini menggunakan metode Personal Extreme Programming. Pada proses analisis dihasilkan satu aktor yaitu aktor  user,  untuk  kebutuhan  fungsional  didapatkan  9  kebutuhan  dan  kebutuhan  non-fungsional didapatkan  2  kebutuhan.  Tahap  perancangan  dihasilkan  9sequence  diagram.  Perancangan  algoritme didapatkan 3 algoritme dan dalam perancang antarmuka menghasilkan 8 rancangan. Aplikasi spesifik diterapkan pada bidang pemrograman Android berbasis Kotlin, untuk basis data menggunakan Room Database. Berdasarkan dari hasil pengujian, pertama diperolehdari pengujian validasi berhasil mencapai 100%  valid  karena  telah  sesuai  dengan  expected  result  yang  sudah  ditetapkan  sebelumnya.  Keduapengujian kompatibilitas mendapatkan hasil aplikasi dapat berjalan pada 6 perangkat dan tingkat API yang  berbeda.  Ketiga  pengujian  usabilitas  didapatkan  hasil  sebesar  77%  yang  menunjukkan  bahwa aplikasi yang telah dibuat mudah digunakan oleh pengguna.&quot;,&quot;issue&quot;:&quot;8&quot;,&quot;volume&quot;:&quot;5&quot;,&quot;container-title-short&quot;:&quot;&quot;},&quot;isTemporary&quot;:false},{&quot;id&quot;:&quot;3963678c-0f18-36f2-9bfb-eafcad5cacfc&quot;,&quot;itemData&quot;:{&quot;type&quot;:&quot;article-journal&quot;,&quot;id&quot;:&quot;3963678c-0f18-36f2-9bfb-eafcad5cacfc&quot;,&quot;title&quot;:&quot;Inovasi Hipnoterapi Berbasis Aplikasi&quot;,&quot;groupId&quot;:&quot;5d3d1151-c3fb-3f7b-bcf0-db626a6f9f8b&quot;,&quot;author&quot;:[{&quot;family&quot;:&quot;Wulandari&quot;,&quot;given&quot;:&quot;Sholihah Ayu&quot;,&quot;parse-names&quot;:false,&quot;dropping-particle&quot;:&quot;&quot;,&quot;non-dropping-particle&quot;:&quot;&quot;},{&quot;family&quot;:&quot;Sucipto&quot;,&quot;given&quot;:&quot;Adi&quot;,&quot;parse-names&quot;:false,&quot;dropping-particle&quot;:&quot;&quot;,&quot;non-dropping-particle&quot;:&quot;&quot;},{&quot;family&quot;:&quot;R&quot;,&quot;given&quot;:&quot;Moch. Enrique Lazuardi&quot;,&quot;parse-names&quot;:false,&quot;dropping-particle&quot;:&quot;&quot;,&quot;non-dropping-particle&quot;:&quot;&quot;},{&quot;family&quot;:&quot;Imelda&quot;,&quot;given&quot;:&quot;Jessica Desi&quot;,&quot;parse-names&quot;:false,&quot;dropping-particle&quot;:&quot;&quot;,&quot;non-dropping-particle&quot;:&quot;&quot;},{&quot;family&quot;:&quot;Rozak&quot;,&quot;given&quot;:&quot;Fatkhur&quot;,&quot;parse-names&quot;:false,&quot;dropping-particle&quot;:&quot;&quot;,&quot;non-dropping-particle&quot;:&quot;&quot;},{&quot;family&quot;:&quot;Fauzi&quot;,&quot;given&quot;:&quot;Kholid&quot;,&quot;parse-names&quot;:false,&quot;dropping-particle&quot;:&quot;&quot;,&quot;non-dropping-particle&quot;:&quot;&quot;},{&quot;family&quot;:&quot;T&quot;,&quot;given&quot;:&quot;Nabila Rahma Yusrilfa&quot;,&quot;parse-names&quot;:false,&quot;dropping-particle&quot;:&quot;&quot;,&quot;non-dropping-particle&quot;:&quot;&quot;}],&quot;container-title&quot;:&quot;Journal of Electrical Engineering and Computer&quot;,&quot;issued&quot;:{&quot;date-parts&quot;:[[2022,10]]},&quot;abstract&quot;:&quot;Dampak dari pandemi covid-19 tidak hanya mengarah pada Kesehatan fisik saja, namun juga berdampak pada kesehatan mental dari jutaan orang. Hal ini dapat berupa orang yang terpapar langsung oleh virus maupun pada orang yang tidak terpapar. Berdasarkan survei WHO (World Health Organization) di beberapa negara, permintaan akan layanan kesehatan mental meningkat selama pandemi. Mental yang terganggu dapat menyebabkan stres dan menurunnya imunitas tubuh sehingga memudahkan virus untuk menyerang. Efek ini dapat membuat kesehatan mental yang buruk, mengganggu konsentrasi, berkurangnya rasa percaya diri, kemampuan berfikir, serta kendali emosi yang pada akhirnya bisa mengarah pada perilaku buruk. Mayoritas orang dengan gangguan mental sulit menjalani aktivitas sehari-hari secara normal. Perkembangan teknologi dimanfaatkan untuk membantu masyarakat dalam memudahkan masyarakat sebagai sarana pemulihan diri dari gangguan kesehatan mental. Hasil akhir dari penelitian berupa aplikasi hipnoterapi Talk Therapy Clinic. Aplikasi ini diharapkan dapat membantu masyarakat yang memiliki gangguan kesehatan mental akibat pandemi Covid-19 dengan cara melakukan terapi mandiri tanpa dibantu oleh orang lain.&quot;,&quot;issue&quot;:&quot;2&quot;,&quot;volume&quot;:&quot;4&quot;,&quot;container-title-short&quot;:&quot;&quot;},&quot;isTemporary&quot;:false},{&quot;id&quot;:&quot;8def603c-467c-39d8-a0fb-a7aaa183d477&quot;,&quot;itemData&quot;:{&quot;type&quot;:&quot;article-journal&quot;,&quot;id&quot;:&quot;8def603c-467c-39d8-a0fb-a7aaa183d477&quot;,&quot;title&quot;:&quot;Perancangan Board Game Edukasi Menggunakan Mekanik Memory Mengenai Gejala-Gejala Depresi&quot;,&quot;groupId&quot;:&quot;5d3d1151-c3fb-3f7b-bcf0-db626a6f9f8b&quot;,&quot;author&quot;:[{&quot;family&quot;:&quot;Zuriel&quot;,&quot;given&quot;:&quot;Ivan Valiant&quot;,&quot;parse-names&quot;:false,&quot;dropping-particle&quot;:&quot;&quot;,&quot;non-dropping-particle&quot;:&quot;&quot;}],&quot;issued&quot;:{&quot;date-parts&quot;:[[2022]]},&quot;abstract&quot;:&quot;Depresi merupakan salah satu penyakit mental yang sudah lama ada di dalam masyarakat. Namun masyarakat Indonesia masih menganggap bahwa depresi merupakan masalah yang tidak nyata dan cenderung disepelekan. Edukasi mengenai depresi sendiri masih minim di Indonesia. Penelitian ini membahas tentang gejala-gejala depresi untuk mengedukasi masyarakat khususnya para remaja berumur 15 tahun ke atas dengan media board game. Tujuan dari penelitian ini adalah merancang board game sebagai media edukasi gejala-gejala depresi sehingga masyarakat bisa mengetahui depresi lebih dalam dan diharapkan mampu membantu sesama yang menderita depresi. Metode deskriptif dan strategi linear digunakan dalam penelitian ini. Dari hasil penelitian ini, didapatkan remaja lebih mengerti mengenai gejala-gejala depresi menggunakan board game D Symptoms dan dapat digunakan dalam tujuan pendidikan.&quot;,&quot;container-title-short&quot;:&quot;&quot;},&quot;isTemporary&quot;:false},{&quot;id&quot;:&quot;fe3a32d4-504f-3ac4-bc40-62c3c0c81b8e&quot;,&quot;itemData&quot;:{&quot;type&quot;:&quot;article-journal&quot;,&quot;id&quot;:&quot;fe3a32d4-504f-3ac4-bc40-62c3c0c81b8e&quot;,&quot;title&quot;:&quot;Gim Edukasi Mengenai Gangguan Mental Dengan Metodologi Putaran Permainan Dan Pembangkitan Konten Prosedural.&quot;,&quot;groupId&quot;:&quot;5d3d1151-c3fb-3f7b-bcf0-db626a6f9f8b&quot;,&quot;author&quot;:[{&quot;family&quot;:&quot;Bahtiar&quot;,&quot;given&quot;:&quot;Muhammad Ardi&quot;,&quot;parse-names&quot;:false,&quot;dropping-particle&quot;:&quot;&quot;,&quot;non-dropping-particle&quot;:&quot;&quot;}],&quot;issued&quot;:{&quot;date-parts&quot;:[[2022]]},&quot;abstract&quot;:&quot;Mental health disorders are a serious problem to be handled and complicated to understand. The symptoms are unique between individuals making the disorder difficult to diagnose in general, The cause of this disorder can come from physical or psychological events as well as the element of birth. Outreach and education to the community are essential to increase the awareness of this problem. Based on several studies showing that education and socialization through educational games has better effectiveness than seminars or conventional education. The methods and theories contained in educational games are Dynamic Difficulty Adjustment (DDA) and Procedal Content Generation (PCG). Making Procedural Content will be more effective for education about characteristic mental disorders due to which are similar to mental disorders viz, random but still limited by the available limit variables. Good game education with the Procedural Content Generation method can have effectiveness which is good for increasing public awareness of mental health problems.&quot;,&quot;container-title-short&quot;:&quot;&quot;},&quot;isTemporary&quot;:false},{&quot;id&quot;:&quot;62ecfe36-7773-3696-93d6-711e90e8f621&quot;,&quot;itemData&quot;:{&quot;type&quot;:&quot;article-journal&quot;,&quot;id&quot;:&quot;62ecfe36-7773-3696-93d6-711e90e8f621&quot;,&quot;title&quot;:&quot;Perancangan Board Game sebagai Media Pendeteksi Suicidal Thought&quot;,&quot;groupId&quot;:&quot;5d3d1151-c3fb-3f7b-bcf0-db626a6f9f8b&quot;,&quot;author&quot;:[{&quot;family&quot;:&quot;Anissa&quot;,&quot;given&quot;:&quot;Khairina Inggar&quot;,&quot;parse-names&quot;:false,&quot;dropping-particle&quot;:&quot;&quot;,&quot;non-dropping-particle&quot;:&quot;&quot;}],&quot;issued&quot;:{&quot;date-parts&quot;:[[2022,12]]},&quot;abstract&quot;:&quot;\tKasus bunuh diri meningkat dan dinyatakan sebagai salah satu penyebab utama kematian di seluruh belahan dunia, jumlah kematian akibat bunuh diri di dunia hampir mendekati 800.000 kasus, yang artinya terdapat 1 kasus kematian akibat bunuh diri dalam 40 detik. Suicidal thought adalah faktor pendorong yang tinggi terhadap terjadinya tindakan bunuh diri terutama ditemukan di kalangan dewasa muda Indonesia. Sebagian besar disebabkan oleh depresi yang berlarut sehingga dapat meningkatkan risiko seseorang ingin melakukan bunuh diri. Penelitian ini membahas tentang mendeteksi dini suicidal thought untuk dewasa muda usia 20-24 tahun menggunakan media board game. Tujuan penelitian ini adalah merancang board game sebagai media pendeteksi dini suicidal thought. Metode yang digunakan mix method pendekatan menggunakan metode deskriptif dengan strategi linear dalam penelitian ini. Hasil yang diperoleh adalah board game dan prototype sebagai media pendeteksi suicidal thought.&quot;,&quot;container-title-short&quot;:&quot;&quot;},&quot;isTemporary&quot;:false},{&quot;id&quot;:&quot;f47db0fc-df6e-370a-9aa5-054039445b6b&quot;,&quot;itemData&quot;:{&quot;type&quot;:&quot;article-journal&quot;,&quot;id&quot;:&quot;f47db0fc-df6e-370a-9aa5-054039445b6b&quot;,&quot;title&quot;:&quot;APLIKASI PENERAPAN CARA MENGHARDIK PADA NY. E DENGAN GANGGUAN PERSEPSI SENSORI : HALUSINASI PENDENGARAN DI KAMPUNG CIBITUNGKABUPATEN SUKABUMI&quot;,&quot;groupId&quot;:&quot;5d3d1151-c3fb-3f7b-bcf0-db626a6f9f8b&quot;,&quot;author&quot;:[{&quot;family&quot;:&quot;Sadiyah&quot;,&quot;given&quot;:&quot;Halimah&quot;,&quot;parse-names&quot;:false,&quot;dropping-particle&quot;:&quot;&quot;,&quot;non-dropping-particle&quot;:&quot;&quot;}],&quot;issued&quot;:{&quot;date-parts&quot;:[[2022]]},&quot;abstract&quot;:&quot;Auditory hallucinations are one of the mental disorders that occur due to the loss of an individual's ability to distinguish between what is real and what is not. This condition if left unchecked can lead to social isolation. The purpose of writing this paper is the application of how to rebuke so that patients are expected to be able to apply and carry out the planned way of controlling hallucinations. The method used in writing this paper is a case study. Data collection techniques used consisted of observation, interviews, and literature study. The client of the case of sensory perception disorder: this auditory hallucination is Mrs. E. How to rebuke done for three days in a row. When implementing how to rebuke, the author uses a question sheet, observation sheet, and activity unit. The results obtained are that the application of how to rebuke hallucinations has been successfully applied to patients with three meetings within three days because of the patient's condition which can sometimes be communicated with and sometimes seems to focus more on hallucinations such as listening to other voices that invite him to speak.&quot;,&quot;container-title-short&quot;:&quot;&quot;},&quot;isTemporary&quot;:false},{&quot;id&quot;:&quot;c617dc25-c793-3f5f-837e-b790dfb421d2&quot;,&quot;itemData&quot;:{&quot;type&quot;:&quot;article-journal&quot;,&quot;id&quot;:&quot;c617dc25-c793-3f5f-837e-b790dfb421d2&quot;,&quot;title&quot;:&quot;A Study on the Development of Meditation App for Youth Using Mindfulness Game&quot;,&quot;groupId&quot;:&quot;5d3d1151-c3fb-3f7b-bcf0-db626a6f9f8b&quot;,&quot;author&quot;:[{&quot;family&quot;:&quot;Cha Myeong-hee&quot;,&quot;given&quot;:&quot;&quot;,&quot;parse-names&quot;:false,&quot;dropping-particle&quot;:&quot;&quot;,&quot;non-dropping-particle&quot;:&quot;&quot;},{&quot;family&quot;:&quot;Lee Woo-kyung&quot;,&quot;given&quot;:&quot;&quot;,&quot;parse-names&quot;:false,&quot;dropping-particle&quot;:&quot;&quot;,&quot;non-dropping-particle&quot;:&quot;&quot;}],&quot;container-title&quot;:&quot;Jurnal Asosiasi Game Komputer Korea&quot;,&quot;issued&quot;:{&quot;date-parts&quot;:[[2023,3]]},&quot;page&quot;:&quot;9-21&quot;,&quot;abstract&quot;:&quot;Belakangan ini, remaja semakin banyak menghadapi situasi penuh stres karena berbagai faktor, yang menyebabkan meningkatnya indeks stres dan menjadikannya masalah sosial yang signifikan. Masalah kesehatan mental pada masa remaja tidak hanya terbatas pada masa itu saja, tetapi juga berdampak pada kesehatan mental saat dewasa, sehingga pentingnya isu ini semakin diakui. Khususnya, depresi pada masa remaja sangat berkaitan dengan ketidakmampuan beradaptasi dalam kehidupan keluarga dan sekolah, risiko bunuh diri, serta gangguan emosional ketika dewasa, sehingga dianggap sangat serius.\n\nDalam konteks ini, perhatian terhadap mindfulness (kesadaran penuh) meningkat tajam karena dianggap sebagai alat yang dapat digunakan secara berulang dan dapat diandalkan untuk meningkatkan kualitas hidup. Penelitian ini bertujuan untuk mengkaji penerapan konsep mindfulness dalam game komersial dan menyajikan metode penerapannya ke dalam aplikasi meditasi untuk remaja yang bernama Koala. Aplikasi meditasi ini dapat digunakan untuk mengelola rasa sakit fisik, menghadapi situasi penuh stres dengan respons yang tenang secara pribadi, dan juga sebagai kebiasaan harian yang berkelanjutan.\n\nTujuan dari penelitian ini adalah untuk menerapkan teori permainan berbasis mindfulness ke dalam aplikasi meditasi yang cenderung statis dan membosankan, agar dapat menarik minat remaja dan mendorong mereka untuk menggunakan aplikasi tersebut secara konsisten.&quot;,&quot;issue&quot;:&quot;1&quot;,&quot;volume&quot;:&quot;36&quot;,&quot;container-title-short&quot;:&quot;&quot;},&quot;isTemporary&quot;:false},{&quot;id&quot;:&quot;9c0fe9e8-9210-38ee-9ad1-2eeaa099f839&quot;,&quot;itemData&quot;:{&quot;type&quot;:&quot;article-journal&quot;,&quot;id&quot;:&quot;9c0fe9e8-9210-38ee-9ad1-2eeaa099f839&quot;,&quot;title&quot;:&quot;Interactive game for depression individual&quot;,&quot;groupId&quot;:&quot;5d3d1151-c3fb-3f7b-bcf0-db626a6f9f8b&quot;,&quot;author&quot;:[{&quot;family&quot;:&quot;Ling&quot;,&quot;given&quot;:&quot;Kelven Kian Hau&quot;,&quot;parse-names&quot;:false,&quot;dropping-particle&quot;:&quot;&quot;,&quot;non-dropping-particle&quot;:&quot;&quot;}],&quot;issued&quot;:{&quot;date-parts&quot;:[[2022,1]]},&quot;abstract&quot;:&quot;This project is an interactive game for depression individual project for entertainment purposes. This project aims to enhance social acknowledgement and help depression individuals with depression through a game. Game is widely known for a large population of people. It can help spread the concept and knowledge about depression faster than any other media and in a fun way. In this project, agile methodology has been used in the process. As the game development process will have high uncertainty, agile methodology can play its role nicely during the development process in changing some of the design and requirements. Games with similar functionality and background have been reviewed in strengthen and improve the development and design of the game. This project will be developed using Unity 3D, a free license game engine. The game is a story-based game that delivers information and emotion through storytelling and helps depressed individuals face negative emotions more easily.&quot;,&quot;container-title-short&quot;:&quot;&quot;},&quot;isTemporary&quot;:false},{&quot;id&quot;:&quot;512b50a0-c060-3704-994e-d42395d31cbf&quot;,&quot;itemData&quot;:{&quot;type&quot;:&quot;thesis&quot;,&quot;id&quot;:&quot;512b50a0-c060-3704-994e-d42395d31cbf&quot;,&quot;title&quot;:&quot;Edukasi dan Skrining Kesehatan Jiwa Remaja dengan Aplikasi&quot;,&quot;groupId&quot;:&quot;5d3d1151-c3fb-3f7b-bcf0-db626a6f9f8b&quot;,&quot;author&quot;:[{&quot;family&quot;:&quot;Endriyani&quot;,&quot;given&quot;:&quot;Sri&quot;,&quot;parse-names&quot;:false,&quot;dropping-particle&quot;:&quot;&quot;,&quot;non-dropping-particle&quot;:&quot;&quot;},{&quot;family&quot;:&quot;Martini&quot;,&quot;given&quot;:&quot;Sri&quot;,&quot;parse-names&quot;:false,&quot;dropping-particle&quot;:&quot;&quot;,&quot;non-dropping-particle&quot;:&quot;&quot;},{&quot;family&quot;:&quot;Pastari&quot;,&quot;given&quot;:&quot;Marta&quot;,&quot;parse-names&quot;:false,&quot;dropping-particle&quot;:&quot;&quot;,&quot;non-dropping-particle&quot;:&quot;&quot;}],&quot;container-title&quot;:&quot;Madaniya&quot;,&quot;accessed&quot;:{&quot;date-parts&quot;:[[2025,5,14]]},&quot;DOI&quot;:&quot;10.53696/27214834.687&quot;,&quot;ISSN&quot;:&quot;2721-4834&quot;,&quot;URL&quot;:&quot;https://www.madaniya.biz.id/journals/contents/article/view/687/505&quot;,&quot;issued&quot;:{&quot;date-parts&quot;:[[2024,2,26]]},&quot;number-of-pages&quot;:&quot;192-198&quot;,&quot;abstract&quot;:&quot;&lt;p&gt;Kesehatan jiwa merupakan aspek penting bagi remaja dalam mencapai perkembangan yang optimal di masa remaja. Kegiatan edukasi dan skiring kesehatan jiwa bagi remaja dilaksanakan dengan tujuan meningkatkan pengetahuan remaja tentang kesehatan jiwa dan mengurangi risiko gangguan jiwa dengan mendeteksi masalah kesehatan mental dan emosional sejak dini. Program pengabdian masyarakat ini dilakukan melalui penyuluhan dan pemeriksaan kesehatan jiwa dengan menggunakan aplikasi skrining kesehtan jiwa DeAS Care. Kegiatan diikuti oleh 20 remaja di kota Palembang. Setelah diberikan penyuluhan remaja mengetahui tentang sehat jiwa dan tehnik yang dapat dilakukan bagi remaja yang beresiko mengalami masalah gangguan mental emosinal. Setelah dilakukan skrining kesehatan jiwa diketahui bahwa sebagian remaja sebanyak 9 orang (45%) mengalami depresi, 15 orang (75%) mengalami ansietas dan 6 orang (30%) mengalami stress dari tingkat ringan hingga parah. Hendaknya pihak terkait dapat melakukan pendampingan sebagai menjaga kesehatan jiwa dalam kelompok remaja sehat jiwa atau kader remaja sehat jiwa di lingkungan sekolah dan masyarakat.&lt;/p&gt;&quot;,&quot;issue&quot;:&quot;1&quot;,&quot;volume&quot;:&quot;5&quot;,&quot;container-title-short&quot;:&quot;&quot;},&quot;isTemporary&quot;:false},{&quot;id&quot;:&quot;3d1729d9-48c3-3d92-8b78-2e700b6e7555&quot;,&quot;itemData&quot;:{&quot;type&quot;:&quot;thesis&quot;,&quot;id&quot;:&quot;3d1729d9-48c3-3d92-8b78-2e700b6e7555&quot;,&quot;title&quot;:&quot;Pengembangan Aplikasi Edukasi Kesehatan Mental Berbasis Progressive Web App&quot;,&quot;groupId&quot;:&quot;5d3d1151-c3fb-3f7b-bcf0-db626a6f9f8b&quot;,&quot;author&quot;:[{&quot;family&quot;:&quot;Hafidz&quot;,&quot;given&quot;:&quot;Hafidz&quot;,&quot;parse-names&quot;:false,&quot;dropping-particle&quot;:&quot;&quot;,&quot;non-dropping-particle&quot;:&quot;&quot;},{&quot;family&quot;:&quot;Fais Al Huda&quot;,&quot;given&quot;:&quot;&quot;,&quot;parse-names&quot;:false,&quot;dropping-particle&quot;:&quot;&quot;,&quot;non-dropping-particle&quot;:&quot;&quot;},{&quot;family&quot;:&quot;Agi Putra Kharisma&quot;,&quot;given&quot;:&quot;&quot;,&quot;parse-names&quot;:false,&quot;dropping-particle&quot;:&quot;&quot;,&quot;non-dropping-particle&quot;:&quot;&quot;}],&quot;container-title&quot;:&quot;Jurnal Pengembangan Teknologi Informasi dan Ilmu Komputer&quot;,&quot;URL&quot;:&quot;https://j-ptiik.ub.ac.id/index.php/j-ptiik/article/view/14034&quot;,&quot;issued&quot;:{&quot;date-parts&quot;:[[2024,8,5]]},&quot;abstract&quot;:&quot;&amp;lt;p&amp;gt;Kesehatan mental mengacu pada keadaan jiwa dan psikologis seseorang yang menunjukkan kemampuan mereka untuk beradaptasi dan menyelesaikan masalah, baik yang berasal dari dalam diri maupun dari lingkungan eksternal. Pada kisaran usia remaja, yaitu antara 15 hingga 24 tahun, terdapat sekitar 6,2% individu yang mengalami depresi. Depresi yang berat dapat meningkatkan risiko perilaku menyakiti diri sendiri, termasuk bunuh diri, dengan sekitar 80 hingga 90% kasus bunuh diri terkait dengan depresi dan kecemasan. Penting untuk memberikan edukasi tentang kesehatan mental sebagai langkah preventif untuk mencegah masalah kesehatan mental dan dampak yang mungkin timbul. Salah satu penyebab masalah kesehatan mental yang banyak terjadi adalah kurangnya pemahaman dan pengetahuan mengenai hal tersebut. Berdasarkan survei yang peneliti lakukan sekitar 95.7% responden merasa perlu lebih banyak informasi atau pendidikan tentang kesehatan mental. Edukasi memiliki peran penting karena membantu kita mengetahui cara mengatasi dan mencegah masalah kesehatan mental. Untuk mencapai hal tersebut, diperlukan keinginan untuk belajar dan mencari informasi yang luas tentang kesehatan mental. Aplikasi edukasi kesehatan mental yang dinamakan &amp;quot;MentalCare&amp;quot; dikembangkan dalam penelitian ini menggunakan metode &amp;lt;em&amp;gt;SDLC Prototype&amp;lt;/em&amp;gt;. Aplikasi ini menawarkan materi pembelajaran dan kuis untuk membantu mahasiswa dan remaja memahami materi kesehatan mental. Selain itu, tersedia fitur konsultasi pribadi dengan psikolog terkait edukasi kesehatan mental. Aplikasi ini berupa &amp;lt;em&amp;gt;progressive web app&amp;lt;/em&amp;gt; yang memungkinkan pengguna mengaksesnya seperti aplikasi &amp;lt;em&amp;gt;native&amp;lt;/em&amp;gt;. Ada tiga jenis pengujian yang dilakukan pengujian &amp;lt;em&amp;gt;blackbox&amp;lt;/em&amp;gt;, usabilitas, dan dampak penggunaan aplikasi terhadap pengetahuan pengguna. Pada pengujian &amp;lt;em&amp;gt;blackbox&amp;lt;/em&amp;gt;, hasilnya menunjukkan 100% valid untuk semua kebutuhan fungsional. Hasil pengujian SUS untuk psikolog menunjukkan skor 87.5 dan pengguna mendapatkan skor 85.75 yang masing-masing termasuk dalam kategori yang sangat baik. Berdasarkan pengujian dampak penggunaan aplikasi terhadap pengetahuan pengguna, aplikasi MentalCare terbukti meningkatkan pengetahuan kesehatan mental para pengguna.&amp;lt;/p&amp;gt;&quot;,&quot;issue&quot;:&quot;8&quot;,&quot;volume&quot;:&quot;8&quot;,&quot;container-title-short&quot;:&quot;&quot;},&quot;isTemporary&quot;:false},{&quot;id&quot;:&quot;f5763792-8f0c-39c9-b2e0-cf0efaa4f14f&quot;,&quot;itemData&quot;:{&quot;type&quot;:&quot;thesis&quot;,&quot;id&quot;:&quot;f5763792-8f0c-39c9-b2e0-cf0efaa4f14f&quot;,&quot;title&quot;:&quot;KEJADIAN DEPRESI PADA REMAJA MENURUT DUKUNGAN SOSIAL DI KABUPATEN JEMBER&quot;,&quot;groupId&quot;:&quot;5d3d1151-c3fb-3f7b-bcf0-db626a6f9f8b&quot;,&quot;author&quot;:[{&quot;family&quot;:&quot;Bintang&quot;,&quot;given&quot;:&quot;Adi Zayd&quot;,&quot;parse-names&quot;:false,&quot;dropping-particle&quot;:&quot;&quot;,&quot;non-dropping-particle&quot;:&quot;&quot;},{&quot;family&quot;:&quot;Mandagi&quot;,&quot;given&quot;:&quot;Ayik Mirayanti&quot;,&quot;parse-names&quot;:false,&quot;dropping-particle&quot;:&quot;&quot;,&quot;non-dropping-particle&quot;:&quot;&quot;}],&quot;container-title&quot;:&quot;Journal of Community Mental Health and Public Policy&quot;,&quot;accessed&quot;:{&quot;date-parts&quot;:[[2025,5,14]]},&quot;DOI&quot;:&quot;10.51602/cmhp.v3i2.55&quot;,&quot;ISSN&quot;:&quot;2622-2655&quot;,&quot;URL&quot;:&quot;https://cmhp.lenterakaji.org/index.php/cmhp/article/view/55&quot;,&quot;issued&quot;:{&quot;date-parts&quot;:[[2021,4,28]]},&quot;number-of-pages&quot;:&quot;92-101&quot;,&quot;abstract&quot;:&quot;&lt;p&gt;ABSTRACTDepression is a mental health problem that mostly occurs during adolescence. Physical, cognitive and emotional changes experienced during adolescence can cause stress. The prevalence of depression in adolescence has a very high increase compared to the age of children and adults. The main factor in being able to cure depression in adolescents is social support (Depkes, 2007). This study aims to identify depressive symptoms in adolescents and to find out the relationship between social support factors and depression incidence. This research is a quantitative research, with the type of observational analytic research with a cross sectional approach involving students at SMA XY in Jember Regency in May 2020. The analytical method uses the Chi Square test to see the relationship between independent and dependent variables with a significance level of α ≤ 0, 05. Data collection tool using google form. Determination of respondents by random sampling with a total of 158 respondents. The results of this study indicate that the distribution of women is 76.58% more than that of men. Based on the distribution of social support, 56.96% received good social support, while based on the incidence of depression, 54.43% did not experience depression. From the statistical test, the significance value of &amp;lt;0.05 indicates that there is a relationship between social support factors and the incidence of depression. Social support plays an effective role in overcoming depression experienced by adolescents.Keywords: Depression, Teens, social support.&amp;#13; ABSTRAKDepresi merupakan salah satu masalah kesehatan mental yang sebagian besar terjadi pada masa remaja. Perubahan fisik, kognitif dan emosional yang dialami pada masa remaja dapat menimbulkan stress. Prevalensi depresi pada usia remaja memiliki peningkatan yang sangat tinggi dibandingkan dengan usia anak-anak dan usia dewasa. Faktor utama untuk dapat menyembuhkan depresi pada remaja yaitu dukungan sosial (Depkes, 2007). Penelitian bertujuan untuk mengidentifikasi gejala depresi pada remaja dan mengetahui mengenai Hubungan Faktor Dukungan Sosial dengan Kejadian Depresi. Penelitian ini adalah penelitian kuantitatif, dengan jenis penelitian analitik observasional dengan pendekatan cross sectional yang melibatkan siswa di SMA XY di Kabupaten Jember pada Bulan Mei tahun 2020. Metode analisis menggunakan uji Chi Square untuk melihat hubungan variabel independen dan dependen dengan tingkat kemaknaan α ≤ 0,05. Alat pengumpulan data menggunakan google form. Penentuan responden secara random sampling dengan jumlah 158 reponden. Hasil penelitian ini menunjukan distribusi perempuan 76,58% lebih banyak daripada laki-laki, berdasarkan distribusi dukungan sosial sebesar 56,96% mendapatkan dukungan sosial yang baik, sedangkan berdasarkan kejadian depresi sebesar 54,43% tidak mengalami depresi. Dari uji statistik nilai signifikansi sebesar &amp;lt; 0,05 menunjukkan bahwa ada hubungan antara faktor dukungan sosial dengan kejadian depresi. Dukungan sosial berperan efektif dalam mengatasi depresi yang dialami remaja.Kata Kunci: Depresi, Remaja, Dukungan Sosial.&lt;/p&gt;&quot;,&quot;issue&quot;:&quot;2&quot;,&quot;volume&quot;:&quot;3&quot;,&quot;container-title-short&quot;:&quot;&quot;},&quot;isTemporary&quot;:false},{&quot;id&quot;:&quot;9d30ec19-a798-37b7-b5a7-c2aaa94e848f&quot;,&quot;itemData&quot;:{&quot;type&quot;:&quot;thesis&quot;,&quot;id&quot;:&quot;9d30ec19-a798-37b7-b5a7-c2aaa94e848f&quot;,&quot;title&quot;:&quot;Perancangan User Experience Aplikasi MobileOnline Therapy untuk Mengatasi Depresi bagi Remaja menggunakan Metode Human-Centered Design&quot;,&quot;groupId&quot;:&quot;5d3d1151-c3fb-3f7b-bcf0-db626a6f9f8b&quot;,&quot;author&quot;:[{&quot;family&quot;:&quot;Gandhi&quot;,&quot;given&quot;:&quot;Lalu&quot;,&quot;parse-names&quot;:false,&quot;dropping-particle&quot;:&quot;&quot;,&quot;non-dropping-particle&quot;:&quot;&quot;},{&quot;family&quot;:&quot;Sianturi&quot;,&quot;given&quot;:&quot;Riswan&quot;,&quot;parse-names&quot;:false,&quot;dropping-particle&quot;:&quot;&quot;,&quot;non-dropping-particle&quot;:&quot;&quot;},{&quot;family&quot;:&quot;Kharisma&quot;,&quot;given&quot;:&quot;Agi&quot;,&quot;parse-names&quot;:false,&quot;dropping-particle&quot;:&quot;&quot;,&quot;non-dropping-particle&quot;:&quot;&quot;}],&quot;container-title&quot;:&quot;Jurnal Pengembangan Teknologi Informasi dan Ilmu Komputer&quot;,&quot;accessed&quot;:{&quot;date-parts&quot;:[[2025,5,14]]},&quot;URL&quot;:&quot;https://j-ptiik.ub.ac.id/index.php/j-ptiik/article/view/11297/4987&quot;,&quot;issued&quot;:{&quot;date-parts&quot;:[[2022,7]]},&quot;number-of-pages&quot;:&quot;3161-3171&quot;,&quot;abstract&quot;:&quot;Setiap individu pasti memiliki masalah yang harus dihadapi, baik secara fisik maupun mental. Data dari WorldHealthOrganizationpada  tahun  2014,  menunjukkan  bahwa  depresi  adalah  penyebabglobal utama  penyakit  dan  kecacatan  bagi  remaja,  dengan  bunuh  diri  sebagai  penyebab  kematian  terbesar ketiga dibelakang cedera lalu lintas jalan, dan HIV/AIDS. Dari data Riset Kesehatan Dasar (Riskesdas) pada  tahun  2018,  didapatkan  prevalensi  gangguan  kesehatan  mental  dengan  usia  15  tahun  ke  atas mencapai  sekitar  6,1%  dari  jumlah  penduduk  Indonesia  atau  setara  dengan  11  juta  orang.  Dari  suatu penelitian yang dilakukan dengan remaja dengan rentang usia 15-24 tahun memiliki persentase depresi sebesar  6,2%,  dan  depresi  berat  akan  mengalami  kecenderungan  untuk  menyakiti  diri  sendiri  hingga bunuh diri. Dari permasalahan tersebut, terdapat sebuah solusi yang ditawarkan, yaitu melakukan onlinetherapy. OnlineTherapybertujuan untuk membantu para penderita depresiagar dapat menyembuhkan depresi mereka dengan penanganan yang tepat melalui layanan onlinetherapy. Metode ini dikhususkan untuk  penyembuhan  kesehatan  mental,  di  mana  seorang  terapis  memberikan  saran  dan  dukungan psikologis  melalui  internet.  Pada perancangan  ini, peneliti  menggunakan  metode pendekatan Human-CenteredDesignagar dapat menciptakan rancangan aplikasi sesuai dengan kebutuhan pengguna. Hasil akhir dari penelitian ini berupa high-fidelityprototypedengan nilai usabilityyang baik. Tiga aspek nilai usabilityyang  didapatkan  diantaranya  adalah  aspek  efektivitas  dari  sisi  pengguna  mendapatkan  nilai sebesar 88%, dan dari sisi psikolog mendapatkan nilai sebesar 84%. Aspek efisiensi menggunakan timebasedefficiencydari  sisi  pengguna  medapatkan  nilaisebesar  0,103 goals/sec,  dan  dari  sisi  psikolog mendapatkan nilai sebesar 0,077 goals/sec. Dan aspek kepuasan dengan menggunakan kuesioner SUS dari sisi pengguna dan sisi psikolog mendapatkan nilai sebesar 80,5 dengan gradeA-, adjectivegood, dan acceptable.&quot;,&quot;issue&quot;:&quot;1&quot;,&quot;volume&quot;:&quot;3&quot;,&quot;container-title-short&quot;:&quot;&quot;},&quot;isTemporary&quot;:false},{&quot;id&quot;:&quot;44d66467-f4a6-3b56-bb38-df24f21ffaed&quot;,&quot;itemData&quot;:{&quot;type&quot;:&quot;thesis&quot;,&quot;id&quot;:&quot;44d66467-f4a6-3b56-bb38-df24f21ffaed&quot;,&quot;title&quot;:&quot;PERANCANGAN PROTOTYPE GAME INTERAKTIF ADVENTURE PENGETAHUAN UMUM ANAK USIA 16-18 TAHUN SEBAGAI UPAYA MENJAGA KESEHATAN MENTAL&quot;,&quot;groupId&quot;:&quot;5d3d1151-c3fb-3f7b-bcf0-db626a6f9f8b&quot;,&quot;author&quot;:[{&quot;family&quot;:&quot;Wicaksono&quot;,&quot;given&quot;:&quot;Satrio&quot;,&quot;parse-names&quot;:false,&quot;dropping-particle&quot;:&quot;&quot;,&quot;non-dropping-particle&quot;:&quot;&quot;}],&quot;accessed&quot;:{&quot;date-parts&quot;:[[2025,5,14]]},&quot;URL&quot;:&quot;https://repository.dinamika.ac.id/id/eprint/7019/&quot;,&quot;issued&quot;:{&quot;date-parts&quot;:[[2023,2,17]]},&quot;abstract&quot;:&quot;Pandemi membawa perubahan pada tatanan pendidikan di Indonesia. Perubahan dengan sistem pembelajaran menjadi online akibat berdampak stres pada anak sekolah dasar. Hal ini berdampak menurunnya kualitas anak dalam belajar, harapan yang dituju dalam pembuatan game edukasi bisa memberikan dampak pada anak meningkatkan integritas dalam belajar agar peningkatan pendidikan di indonesia bisa memenuhi tingkat kepintaran anak bangsa Indonesia dengan melakukan metode observasi, wawancara, literature yang dilakukan didaerah Kota Surabaya disalah satu sekolah menengah atas sebagai data yang diperlukan, dan membuahkan hasil yakni analisa data yang akan membantu dalam pembuatan game edukasi agar mencapai target yang ditentukan susuai dengan hasil penelitian ini. tidak luput juga adanya makna yang diberikan kepada pelajar dari cara bermainnya maupun alur cerita yang didapat agar para pemain bisa mendapat hikmat dan merenungkan dalam kejadian permainan tersebut. Dan harapan yang dapat dituju remaja Indonesia tidak tertinggal pembelajaran sekolah dengan adanya game ini yang membuat meningkatnya akademik remaja dalam belaja dan menghilangkan rasa malas terhadap materi materi pembelajaran disekolah.&quot;,&quot;publisher&quot;:&quot;Universitas Dinamika&quot;,&quot;container-title-short&quot;:&quot;&quot;},&quot;isTemporary&quot;:false},{&quot;id&quot;:&quot;37347569-70a5-3b06-841a-db6d409b23df&quot;,&quot;itemData&quot;:{&quot;type&quot;:&quot;article-journal&quot;,&quot;id&quot;:&quot;37347569-70a5-3b06-841a-db6d409b23df&quot;,&quot;title&quot;:&quot;Deteksi Gangguan Depresi Menggunakan Machine Learning: Tinjauan Pustaka&quot;,&quot;groupId&quot;:&quot;5d3d1151-c3fb-3f7b-bcf0-db626a6f9f8b&quot;,&quot;author&quot;:[{&quot;family&quot;:&quot;Dina&quot;,&quot;given&quot;:&quot;Dinda&quot;,&quot;parse-names&quot;:false,&quot;dropping-particle&quot;:&quot;&quot;,&quot;non-dropping-particle&quot;:&quot;&quot;},{&quot;family&quot;:&quot;Haryanti&quot;,&quot;given&quot;:&quot;Tining&quot;,&quot;parse-names&quot;:false,&quot;dropping-particle&quot;:&quot;&quot;,&quot;non-dropping-particle&quot;:&quot;&quot;},{&quot;family&quot;:&quot;Haq&quot;,&quot;given&quot;:&quot;Muhammad&quot;,&quot;parse-names&quot;:false,&quot;dropping-particle&quot;:&quot;&quot;,&quot;non-dropping-particle&quot;:&quot;&quot;}],&quot;container-title&quot;:&quot;Seminar Nasional Teknik Elektro, Sistem Informasi, dan Teknik Informatika&quot;,&quot;accessed&quot;:{&quot;date-parts&quot;:[[2025,5,14]]},&quot;URL&quot;:&quot;https://ejournal.itats.ac.id/snestik/article/view/5876&quot;,&quot;issued&quot;:{&quot;date-parts&quot;:[[2024,4,27]]},&quot;abstract&quot;:&quot;Gangguan depresi adalah suatu kondisi seseorang merasa sedih, kecewa saat mengalami suatu perubahan, kehilangan ketika terjadi patologis tidak dapat beradaptasi dengan sekitar. Menurut World Health Organization depresi merupakan penyakit yang dialami oleh sekitar 264 juta orang. Mahasiswa adalah kelompok yang  sangat rentan terhadap berbagai gangguan mental yang dipengaruhi berbagi lingkup kehidupan. Gangguan depresi akhir-akhir ini sangat menjadi perhatian khusus karena memiliki kecenderungan menyakiti diri sendiri ( self harm ). Metode yang digunakan dalam penelitian ini adalah menggunakan studi literature review dengan menggunakan 3 database yaitu Google Scholar, PubMed dan Neliti yang dipublikasi dalam rentang tahun 2021 sampai 2024 dan di dapatkan hasil 19.696 artikel. Dari 19.696 artikel kemudia di lakukan alanisa lebih dalam dengan menghasilkan 573 artikel, dimana seluruh metode memiliki nilai keakurasian 80%, namun ada satu metode yaitu certainly factor banyak digunakan dan memiliki keakurasian diatas 90% dengan menggunakan random sample.\n&quot;,&quot;container-title-short&quot;:&quot;&quot;},&quot;isTemporary&quot;:false},{&quot;id&quot;:&quot;d2420370-842e-30d3-8157-4c970f003751&quot;,&quot;itemData&quot;:{&quot;type&quot;:&quot;article-journal&quot;,&quot;id&quot;:&quot;d2420370-842e-30d3-8157-4c970f003751&quot;,&quot;title&quot;:&quot;Perancangan Aplikasi Sistem Pakar Diagnosa Depresi Pada Mahasiswa Menggunakan Metode Certainty Factor Berbasis Web&quot;,&quot;groupId&quot;:&quot;5d3d1151-c3fb-3f7b-bcf0-db626a6f9f8b&quot;,&quot;author&quot;:[{&quot;family&quot;:&quot;Lutfiah&quot;,&quot;given&quot;:&quot;Ratri Nanda&quot;,&quot;parse-names&quot;:false,&quot;dropping-particle&quot;:&quot;&quot;,&quot;non-dropping-particle&quot;:&quot;&quot;},{&quot;family&quot;:&quot;Widaningsih&quot;,&quot;given&quot;:&quot;Sri&quot;,&quot;parse-names&quot;:false,&quot;dropping-particle&quot;:&quot;&quot;,&quot;non-dropping-particle&quot;:&quot;&quot;},{&quot;family&quot;:&quot;Suheri&quot;,&quot;given&quot;:&quot;Agus&quot;,&quot;parse-names&quot;:false,&quot;dropping-particle&quot;:&quot;&quot;,&quot;non-dropping-particle&quot;:&quot;&quot;}],&quot;container-title&quot;:&quot;PROSIDING SEMINAR NASIONAL TEKNIK UNIVERSITAS SURYAKANCANA&quot;,&quot;accessed&quot;:{&quot;date-parts&quot;:[[2025,5,14]]},&quot;URL&quot;:&quot;https://jurnal.unsur.ac.id/semnastekunsur/article/view/3432&quot;,&quot;issued&quot;:{&quot;date-parts&quot;:[[2023]]},&quot;page&quot;:&quot;42-50&quot;,&quot;abstract&quot;:&quot;Depresi merupakan salah satu gangguan mental yang dapat mempengaruhi kesehatan fisik serta mengakibatkakan perubahan perilaku dan mengurangi produktivitas. Depresi pada mahasiswa dapat mempengaruhi nilai akademik. Banyak penderita depresi yang enggan konsultasi ke psikolog karena biaya yang tidak murah. Untuk mengatasi permasalahan tersebut, pada penelitian ini dibuat suatu sistem pakar untuk mendiagnosa depresi pada mahasiswa. Sistem pakar yang dibuat menggunakan metode certainty factor (CF) untuk mengatasi ketidakpastian yang timbul dari aturan maupun jawaban yang diberikan pengguna pada saat menggunakan sistem untuk berkonsultasi. Sistem pakar ini dibuat menggunakan tahapan rekayasa perangkat lunak waterfall. Sistem pakar ini berbasis web dengan Bahasa pemrograman PHP dan framework Laravel untuk mempermudah sesi konsultasi sehingga tidak terbatas oleh waktu dan tempat. Menu utama dari sistem pakar ini terdiri dari halaman jenis depresi, gejala-gejala depresi, aturan-aturan yang terbentuk, sesi konsultasi dan halaman hasil konsultasi. Selain itu ditampilkan juga tips dan maupun informasi seputar depresi. Sistem ini mampu membantu memberikan alternatif pengambilan keputusan yang memiliki tingkat performa sebanding dengan seorang psikolog dengan menggunakan metode certainty factor yaitu mengumpulkan seluruh data agar mendapatkan hasil diagnosa.&quot;,&quot;volume&quot;:&quot;1&quot;,&quot;container-title-short&quot;:&quot;&quot;},&quot;isTemporary&quot;:false},{&quot;id&quot;:&quot;4fb08514-59bd-37e6-a167-f94f15150c72&quot;,&quot;itemData&quot;:{&quot;type&quot;:&quot;thesis&quot;,&quot;id&quot;:&quot;4fb08514-59bd-37e6-a167-f94f15150c72&quot;,&quot;title&quot;:&quot;Efektivitas Aplikasi Web \&quot;Kancani\&quot; Berbasis Rational-Emotive Behavior Therapy terhadap Tingkat Depresi dan Kecemasan Remaja SMP&quot;,&quot;groupId&quot;:&quot;5d3d1151-c3fb-3f7b-bcf0-db626a6f9f8b&quot;,&quot;author&quot;:[{&quot;family&quot;:&quot;Faiha&quot;,&quot;given&quot;:&quot;Khansa Zaizafun&quot;,&quot;parse-names&quot;:false,&quot;dropping-particle&quot;:&quot;&quot;,&quot;non-dropping-particle&quot;:&quot;&quot;}],&quot;accessed&quot;:{&quot;date-parts&quot;:[[2025,5,14]]},&quot;URL&quot;:&quot;https://digilib.uns.ac.id/dokumen/detail/112189/&quot;,&quot;issued&quot;:{&quot;date-parts&quot;:[[2024]]},&quot;abstract&quot;:&quot;Masa remaja menjadi salah satu periode perkembangan yang mendorong banyaknya perubahan pada sisi internal maupun eksternal sehingga menjadikan remaja rentan mengalami gangguan mental. Kecemasan dan depresi menjadi gangguan mental yang banyak dialami oleh remaja Indonesia. Banyak kasus kesehatan mental remaja bersumber dari kepercayaan salah dan irasional yang diyakininya, sehingga peningkatan kemampuan menghadapi pikiran irasional menjadi penting. Aplikasi web “Kancani” yang berbasis REBT menjadi salah satu sarana untuk memberikan pemahaman mengenai kemampuan sosial emosional yang dibutuhkan. Oleh karena itu, penelitian ini bertujuan untuk menguji efektivitas aplikasi web “Kancani” yang berbasis REBT terhadap tingkat depresi dan kecemasan pada remaja. Penelitian ini menggunakan desain eksperimen quasi one group pretest-posttest dengan 22 subjek remaja SMP berusia 12-15 tahun yang menerima intervensi selama 2 minggu. Depression Anxiety Stress Scale (DASS) 42 dipilih untuk mengukur tingkat depresi dan kecemasan remaja. Paired sample t-test dilakukan untuk membandingkan tingkat depresi dan kecemasan remaja SMP sebelum dan setelah mendapatkan intervensi berbasis REBT melalui aplikasi web “Kancani”. Terdapat perbedaan signifikan dalam skor tingkat depresi sebelum (M=11.18, SD=6.4) dan setelah diberikan intervensi (M=9.41, SD=5.5); t(21)=3.16, p=0.005. Pada variabel kecemasan, tidak ditemukan perbedaan signifikan dalam skor sebelum (M=14.41, SD=7.7) dan setelah diberikan intervensi (M=13.18, SD=7.6); t(21)=1.9, p=0.071. Hasil ini menunjukkan bahwa pemberian intervensi berbasis REBT dalam aplikasi web “Kancani” terbukti signifikan dalam mengurangi tingkat depresi remaja SMP, namun tidak secara signifikan dalam mengurangi tingkat kecemasannya.&quot;,&quot;publisher&quot;:&quot;Universitas Sebelas Maret&quot;,&quot;container-title-short&quot;:&quot;&quot;},&quot;isTemporary&quot;:false},{&quot;id&quot;:&quot;d52e4ce5-b5ab-3f52-8b9f-4ecbaa28ae2b&quot;,&quot;itemData&quot;:{&quot;type&quot;:&quot;article-journal&quot;,&quot;id&quot;:&quot;d52e4ce5-b5ab-3f52-8b9f-4ecbaa28ae2b&quot;,&quot;title&quot;:&quot;Sistem Pakar Diagnosa Tingkat Depresi pada Remaja Di Kota Kupang menggunakan Metode Forward Chaining Authors&quot;,&quot;groupId&quot;:&quot;5d3d1151-c3fb-3f7b-bcf0-db626a6f9f8b&quot;,&quot;author&quot;:[{&quot;family&quot;:&quot;Lao&quot;,&quot;given&quot;:&quot;Juliet Reinita Angelia&quot;,&quot;parse-names&quot;:false,&quot;dropping-particle&quot;:&quot;&quot;,&quot;non-dropping-particle&quot;:&quot;&quot;},{&quot;family&quot;:&quot;Mola&quot;,&quot;given&quot;:&quot;Sebastianus Adi Santoso&quot;,&quot;parse-names&quot;:false,&quot;dropping-particle&quot;:&quot;&quot;,&quot;non-dropping-particle&quot;:&quot;&quot;},{&quot;family&quot;:&quot;Prasetyo&quot;,&quot;given&quot;:&quot;Dwi&quot;,&quot;parse-names&quot;:false,&quot;dropping-particle&quot;:&quot;&quot;,&quot;non-dropping-particle&quot;:&quot;&quot;}],&quot;container-title&quot;:&quot;Inovatif Wira Wacana&quot;,&quot;accessed&quot;:{&quot;date-parts&quot;:[[2025,5,14]]},&quot;URL&quot;:&quot;https://www.ojs.unkriswina.ac.id/index.php/inovatif/article/view/290&quot;,&quot;issued&quot;:{&quot;date-parts&quot;:[[2023]]},&quot;page&quot;:&quot;29-36&quot;,&quot;abstract&quot;:&quot;Depresi merupakan sebuah gangguan mental yang saat ini menjadi salah satu penyakit yang menduduki peringkat ketiga beban penyakit dalam skala global. Depresi dapat berdampak pada produktivitas penderitanya karena gejala-gejala yang dialami. Namun seringkali orang-orang dengan gangguan depresi ini tidak menyadari bahwa dirinya mengalami depresi. Untuk mengetahui seseorang mengalami gangguan depresi biasanya dilakukan konsultasi dengan psikolog atau psikiater yang sudah pakar pada bidangnya, namun sayangnya saat ini di Indonesia jumlah para profesional tidak sebanding dengan jumlah orang orang penderita depresi. Maka dari itu perlu dibuatnya sebuah sistem pakar yang dapat bertindak layaknya pakar dan dapat membantu orang-orang untuk mengetahui tingkat depresi mereka serta solusi yang harus mereka lakukan. Sistem berbasis web ini menggunakan metode Forward Chaining dengan 21 pertanyaan, 84 gejala berdasarkan Instrumen Beck Depression Inventory, 4 tingkat depresi dan data penelitian dari hasil pengisian form oleh 398 remaja yang tersebar di wilayah kota Kupang. Hasil pengujian akurasi sistem dari 398 data adalah 100% dengan hasil menyatakan bahwa 156 orang (39,2 %) berada pada kondisi normal, 85 orang (21,4 %) berada pada kondisi depresi tingkat ringan, 108 orang (27,1 %) berada pada kondisi depresi tingkat sedang, dan 49 orang (12,3 %) berada dalam kondisi depresi tingkat berat. &quot;,&quot;volume&quot;:&quot;2&quot;,&quot;container-title-short&quot;:&quot;&quot;},&quot;isTemporary&quot;:false},{&quot;id&quot;:&quot;844bf00a-bcaf-33c1-bdb1-0edfbb65b73c&quot;,&quot;itemData&quot;:{&quot;type&quot;:&quot;article-journal&quot;,&quot;id&quot;:&quot;844bf00a-bcaf-33c1-bdb1-0edfbb65b73c&quot;,&quot;title&quot;:&quot;Pengembangan Aplikasi Perangkat Bergerak Pemeriksaan Awal Depresi Dengan Menerapkan Metode PrototypingBerbasis Android&quot;,&quot;groupId&quot;:&quot;5d3d1151-c3fb-3f7b-bcf0-db626a6f9f8b&quot;,&quot;author&quot;:[{&quot;family&quot;:&quot;Giofran&quot;,&quot;given&quot;:&quot;Alexander Rama&quot;,&quot;parse-names&quot;:false,&quot;dropping-particle&quot;:&quot;&quot;,&quot;non-dropping-particle&quot;:&quot;&quot;},{&quot;family&quot;:&quot;Fanani&quot;,&quot;given&quot;:&quot;Lutfi&quot;,&quot;parse-names&quot;:false,&quot;dropping-particle&quot;:&quot;&quot;,&quot;non-dropping-particle&quot;:&quot;&quot;},{&quot;family&quot;:&quot;Ananta&quot;,&quot;given&quot;:&quot;Mahardeka Tri&quot;,&quot;parse-names&quot;:false,&quot;dropping-particle&quot;:&quot;&quot;,&quot;non-dropping-particle&quot;:&quot;&quot;}],&quot;container-title&quot;:&quot;Jurnal Pengembangan Teknologi Informasi dan Ilmu Komputer&quot;,&quot;accessed&quot;:{&quot;date-parts&quot;:[[2025,5,14]]},&quot;URL&quot;:&quot;https://j-ptiik.ub.ac.id/index.php/j-ptiik/article/view/13775&quot;,&quot;issued&quot;:{&quot;date-parts&quot;:[[2024,5]]},&quot;abstract&quot;:&quot;Kesehatan merupakan dambaan setiap manusia, tidak memandang usia dan tidak memandang profesi apa. Salah satu aspek dari “sehat” itu sendiri adalah sehat secara emosional atau mental. Salah satu tindakan yang mudah dan solutif untuk menangani masalah kesehatan mental adalah dengan melaksanakan skrining kesehatan mental. Berdasarkan survei yang dilakukan kepada 30 masyarakat Indonesia dengan latar belakang mahasiswa aktif Fakultas Ilmu Komputer Universitas Brawijaya, didapat 80.8% merasa skrining untuk kesehatan mental merupakan tindakan yang penting dengan 92.3% merasa aplikasi skrining kesehatan mental untuk mahasiswa merupakan hal yang penting. Oleh karena itu, dikembangkan sebuah aplikasi pemeriksaan awal depresi untuk mahasiswa supaya dapat berjalan secara optimal dengan menggapai responden sebanyak mungkin. Aplikasi dikembangkan menggunakan SDLC Prototyping dan arsitektur aplikasi MVVM. Penerapan arsitektur didukung oleh bahasa pemrograman Kotlin dan Firebase sebagai penyimpanan data. Aplikasi diuji menggunakan black box testing dan usability testing. Black box testing dilakukan kepada pengembang dan menguji fungsionalitas aplikasi. Usability testing kepada calon pengguna dan akan diukur tingkat efektivitasnya, efisiensi, dan kepuasan pengguna. Pada black box testing, didapatkan tingkat keberhasilan 100%. Pada usability testing didapatkan tingkat efektivitas 100%, overall relative efficiency 100%, dan tingkat kepuasan dengan nilai SUS didapatkan nilai 81,5.&quot;,&quot;issue&quot;:&quot;5&quot;,&quot;volume&quot;:&quot;8&quot;,&quot;container-title-short&quot;:&quot;&quot;},&quot;isTemporary&quot;:false},{&quot;id&quot;:&quot;4d2d78d0-7f97-32bb-adc8-a307373c820b&quot;,&quot;itemData&quot;:{&quot;type&quot;:&quot;article-journal&quot;,&quot;id&quot;:&quot;4d2d78d0-7f97-32bb-adc8-a307373c820b&quot;,&quot;title&quot;:&quot;Implementasi Sistem Pakar Diagnosa Depresi Anak Dalam Pembelajaran Daring Metode Forward Chaining&quot;,&quot;groupId&quot;:&quot;5d3d1151-c3fb-3f7b-bcf0-db626a6f9f8b&quot;,&quot;author&quot;:[{&quot;family&quot;:&quot;Krisnanda&quot;,&quot;given&quot;:&quot;Dimas&quot;,&quot;parse-names&quot;:false,&quot;dropping-particle&quot;:&quot;&quot;,&quot;non-dropping-particle&quot;:&quot;&quot;}],&quot;container-title&quot;:&quot;“Optimalisasi Digital Marketing Menyongsong Marketing 5.0:Technology For Humanity”&quot;,&quot;accessed&quot;:{&quot;date-parts&quot;:[[2025,5,14]]},&quot;ISSN&quot;:&quot;2685-5615&quot;,&quot;URL&quot;:&quot;https://prosiding.unipma.ac.id/index.php/SENATIK/article/view/1969&quot;,&quot;issued&quot;:{&quot;date-parts&quot;:[[2021]]},&quot;abstract&quot;:&quot;Web based learning for understudies is right now the greatest supporter of misery in youngsters. The web based learning measure that the public authority has started to execute in schools expects to supplant eye to eye learning, in light of the fact that up to this point Coronavirus is as yet a plague that has not finished. The job of guardians is vital in overseeing and helping youngsters in the learning system on the grounds that the learning system in kids is currently situated at home. In any case, there are as yet many guardians who feel that the indications of despondency in their youngsters are only something ordinary. Fundamentally, the manifestations of melancholy in kids have their own particular manner of taking care of which can be taken care of appropriately and rapidly by talking with the specialists. In this examination utilizing the forward tying technique to decide the consequences of the master framework. The forward chaining strategy is a technique that utilizations Assuming and, thinking, beginning with gathering realities and afterward estimating to discover ends. On the site, this master framework will actually want to recognize gloom, signs of misery, intense melancholy and not despondency. Programming language for building frameworks utilizing PHP and MySQL data set.&quot;,&quot;issue&quot;:&quot;1&quot;,&quot;volume&quot;:&quot;4&quot;,&quot;container-title-short&quot;:&quot;&quot;},&quot;isTemporary&quot;:false},{&quot;id&quot;:&quot;de8bef66-97d0-3ca9-bee7-d45c3c81aeee&quot;,&quot;itemData&quot;:{&quot;type&quot;:&quot;article-journal&quot;,&quot;id&quot;:&quot;de8bef66-97d0-3ca9-bee7-d45c3c81aeee&quot;,&quot;title&quot;:&quot;Penggunaan Algoritma random forest dan Agile scrum dalam Pengembangan Aplikasi Kesehatan mental Berbasis Web 'MentalWell'&quot;,&quot;groupId&quot;:&quot;5d3d1151-c3fb-3f7b-bcf0-db626a6f9f8b&quot;,&quot;author&quot;:[{&quot;family&quot;:&quot;Masbahah&quot;,&quot;given&quot;:&quot;M&quot;,&quot;parse-names&quot;:false,&quot;dropping-particle&quot;:&quot;&quot;,&quot;non-dropping-particle&quot;:&quot;&quot;},{&quot;family&quot;:&quot;Putri&quot;,&quot;given&quot;:&quot;Azzahra Kareena Rendri&quot;,&quot;parse-names&quot;:false,&quot;dropping-particle&quot;:&quot;&quot;,&quot;non-dropping-particle&quot;:&quot;&quot;},{&quot;family&quot;:&quot;Lathifa&quot;,&quot;given&quot;:&quot;Diana&quot;,&quot;parse-names&quot;:false,&quot;dropping-particle&quot;:&quot;&quot;,&quot;non-dropping-particle&quot;:&quot;&quot;},{&quot;family&quot;:&quot;Nawang&quot;,&quot;given&quot;:&quot;Diah Munica&quot;,&quot;parse-names&quot;:false,&quot;dropping-particle&quot;:&quot;&quot;,&quot;non-dropping-particle&quot;:&quot;&quot;},{&quot;family&quot;:&quot;Anshori&quot;,&quot;given&quot;:&quot;Fauzi Ihsan&quot;,&quot;parse-names&quot;:false,&quot;dropping-particle&quot;:&quot;&quot;,&quot;non-dropping-particle&quot;:&quot;&quot;},{&quot;family&quot;:&quot;Kusnadi&quot;,&quot;given&quot;:&quot;Bimo Adji&quot;,&quot;parse-names&quot;:false,&quot;dropping-particle&quot;:&quot;&quot;,&quot;non-dropping-particle&quot;:&quot;&quot;}],&quot;container-title&quot;:&quot;KESATRIA: Jurnal Penerapan Sistem Informasi (Komputer &amp; Manajemen)&quot;,&quot;accessed&quot;:{&quot;date-parts&quot;:[[2025,5,14]]},&quot;URL&quot;:&quot;https://pkm.tunasbangsa.ac.id/index.php/kesatria/article/view/455&quot;,&quot;issued&quot;:{&quot;date-parts&quot;:[[2024,7]]},&quot;page&quot;:&quot;1369-1380&quot;,&quot;abstract&quot;:&quot;Teenage mental health is a major concern today. Teenagers often suffer from various mental health problems such as depression, anxiety, and stress, which can have a negative impact on their development and lives. The aim of this research was to develop a mental health website that helps adolescents identify and overcome mental health problems. The \&quot;MentalWell\&quot; website uses a random forest algorithm to classify youth mental health questionnaires and provide appropriate intervention recommendations. This website was created using the System Development Life Cycle (SDLC) method with an Agile Scrum approach, based on a design that was carried out using the React.js framework for the front-end and CodeIgniter 4 (CI4) for the back-end. In the Agile scrum model, software development is divided into short iterations called sprints. Each sprint involves sprint planning, daily scrum, sprint review, and sprint retrospective. The main steps in the process of classifying mental health disorders using the random forest algorithm, starting from data collection to testing and final results. Testing uses the black box method, with valid results for all features developed.&quot;,&quot;issue&quot;:&quot;3&quot;,&quot;volume&quot;:&quot;5&quot;,&quot;container-title-short&quot;:&quot;&quot;},&quot;isTemporary&quot;:false},{&quot;id&quot;:&quot;bc2044d5-0d6b-3fe1-bc24-5ceee8dd7163&quot;,&quot;itemData&quot;:{&quot;type&quot;:&quot;thesis&quot;,&quot;id&quot;:&quot;bc2044d5-0d6b-3fe1-bc24-5ceee8dd7163&quot;,&quot;title&quot;:&quot;Expert System Mendiagnosa Tingkat Depresi Siswa Menggunakan Metode Certainly Factor&quot;,&quot;groupId&quot;:&quot;5d3d1151-c3fb-3f7b-bcf0-db626a6f9f8b&quot;,&quot;author&quot;:[{&quot;family&quot;:&quot;Yulianti&quot;,&quot;given&quot;:&quot;Nadia&quot;,&quot;parse-names&quot;:false,&quot;dropping-particle&quot;:&quot;&quot;,&quot;non-dropping-particle&quot;:&quot;&quot;}],&quot;accessed&quot;:{&quot;date-parts&quot;:[[2025,5,14]]},&quot;URL&quot;:&quot;http://repository.upbatam.ac.id/5843/&quot;,&quot;issued&quot;:{&quot;date-parts&quot;:[[2023,11]]},&quot;abstract&quot;:&quot;Depresi adalah gangguan suasana hati yang ditandai dengan gejala seperti kemurungan, lesu, kurangnya gairah, perasaan tidak berharga, frustasi yang mendalam, keputusasaan, pikiran tentang kematian dan pikiran untuk bunuh diri, depresi merupakan salah satu kondisi kesehatan mental, banyak Siswa masih kesulitan untuk menentukan sudah sampai ditahap mana dan separah apa depresi yang mereka alami, Mengidentifikasi faktor yang mempengaruhi tingkat depresi yang dialami siswa dengan Menerapkan metode Certainly Factor (CF) pada sistem pakar untuk mendiagnosa tingkat depresi siswa, Certainly Factor adalah metode untuk menghadapi ketidakpastian dalam sistem berbasis aturan dengan melakukan perhitungan, setelah sistem berjalan dengan baik maka dilakukan implementasi terhadap siswa dengan cara mendaftar terlebih dulu kemudian login setelah itu menjawab pertanyaan dari data gejala-gejala yang menjadi penyebab depresi berdasarkan tingkatanya masing-masing&quot;,&quot;publisher&quot;:&quot;Universitas Putera Batam&quot;,&quot;container-title-short&quot;:&quot;&quot;},&quot;isTemporary&quot;:false},{&quot;id&quot;:&quot;cedabb00-5ba8-346e-9755-b91fc578f3e8&quot;,&quot;itemData&quot;:{&quot;type&quot;:&quot;thesis&quot;,&quot;id&quot;:&quot;cedabb00-5ba8-346e-9755-b91fc578f3e8&quot;,&quot;title&quot;:&quot;Perancangan Aplikasi Mobile Apps Konsultasi Online Pusat Inovasi Psikologi Unpad&quot;,&quot;groupId&quot;:&quot;5d3d1151-c3fb-3f7b-bcf0-db626a6f9f8b&quot;,&quot;author&quot;:[{&quot;family&quot;:&quot;Krisantyo&quot;,&quot;given&quot;:&quot;Dimas Adrinura&quot;,&quot;parse-names&quot;:false,&quot;dropping-particle&quot;:&quot;&quot;,&quot;non-dropping-particle&quot;:&quot;&quot;},{&quot;family&quot;:&quot;Hidayat&quot;,&quot;given&quot;:&quot;Dicky&quot;,&quot;parse-names&quot;:false,&quot;dropping-particle&quot;:&quot;&quot;,&quot;non-dropping-particle&quot;:&quot;&quot;}],&quot;accessed&quot;:{&quot;date-parts&quot;:[[2025,5,14]]},&quot;URL&quot;:&quot;https://openlibrarypublications.telkomuniversity.ac.id/index.php/artdesign/article/view/14431&quot;,&quot;issued&quot;:{&quot;date-parts&quot;:[[2020,4]]},&quot;number-of-pages&quot;:&quot;48-59&quot;,&quot;abstract&quot;:&quot;Depresi merupakan salah satu penyakit mental yang tidak bisa dipandang sebelah mata, yang biasanya diderita oleh remaja dan dewasa dengan umur sekitar 18-30 tahun. Depresi biasanya ditandai dengan kesedihan, kehilangan gairah hidup, merasa putus asa. Saat ini telah banyak tempat yang dapat membantu penderita depresi salah satu contohnya adalah Pelayanan dan Inovasi Psikologi Universitas Padjajaran yang berlokasi di Jl. Ir. H. Juanda, Bandung. Sayangnya, masih banyak para penderita depresi tidak mencari pengobatan ke profesional, seperti yang dikatakan oleh Dr. Eka Viora, SpKj selaku Ketua Perhimpunan Dokter Spesialis Kedokteran Jiwa Indonesia (PSDKJI), bahwa sekitar 15,6 juta penduduk Indonesia mengalami depresi dan hanya sekitar 8% yang mencari pengobatan ke profesional. Hal ini diakibatkan oleh adanya stigma negatif dari masyarakat terhadap orang yang melakukan konsultasi ke psikolog. Namun dengan pesatnya perkembangan teknologi sekarang, sebuah aplikasi untuk melakukan konsultasi secara online dapat dirancang untuk dapat membantu para penderita depresi yang ingin melakukan konsultasi dengan psikolog profesional. Hasil yang diharapkan dari penelitian ini adalah untuk membuat sebuah aplikasi yang nantinya dapat membantu untuk Pelayanan dan Inovasi Psikologi Universitas Padjajaran serta memudahkan masyarakat Bandung yang ingin melakukan konsultasi dengan profesional.&quot;,&quot;publisher&quot;:&quot;Telkom University&quot;,&quot;container-title-short&quot;:&quot;&quot;},&quot;isTemporary&quot;:false},{&quot;id&quot;:&quot;b6107ae8-a432-3875-8c9d-0a1d14aeb26e&quot;,&quot;itemData&quot;:{&quot;type&quot;:&quot;thesis&quot;,&quot;id&quot;:&quot;b6107ae8-a432-3875-8c9d-0a1d14aeb26e&quot;,&quot;title&quot;:&quot;PERANCANGAN GAME SEBAGAI ALTERNATIF TERAPI PADA PENYANDANG DEPRESI&quot;,&quot;groupId&quot;:&quot;5d3d1151-c3fb-3f7b-bcf0-db626a6f9f8b&quot;,&quot;author&quot;:[{&quot;family&quot;:&quot;Nawir&quot;,&quot;given&quot;:&quot;Fhadli A&quot;,&quot;parse-names&quot;:false,&quot;dropping-particle&quot;:&quot;&quot;,&quot;non-dropping-particle&quot;:&quot;&quot;},{&quot;family&quot;:&quot;B Kafiar&quot;,&quot;given&quot;:&quot;Matheus E&quot;,&quot;parse-names&quot;:false,&quot;dropping-particle&quot;:&quot;&quot;,&quot;non-dropping-particle&quot;:&quot;&quot;},{&quot;family&quot;:&quot;Oton Kadang&quot;,&quot;given&quot;:&quot;Marsellus&quot;,&quot;parse-names&quot;:false,&quot;dropping-particle&quot;:&quot;&quot;,&quot;non-dropping-particle&quot;:&quot;&quot;}],&quot;container-title&quot;:&quot;JURNAL DIPANEGARA KOMPUTER TEKNIK INFORMATIKA&quot;,&quot;accessed&quot;:{&quot;date-parts&quot;:[[2025,5,14]]},&quot;ISSN&quot;:&quot;2963-2854&quot;,&quot;URL&quot;:&quot;https://ejurnal.undipa.ac.id/index.php/dipakomti/article/view/1238&quot;,&quot;issued&quot;:{&quot;date-parts&quot;:[[2023,4]]},&quot;number-of-pages&quot;:&quot;254-264&quot;,&quot;abstract&quot;:&quot;Depresi bukanlah suatu hal yang tidak mungkin dialami setiap orang, baik usia anak-anak, remaja, dewasa bahkan lansia. Salah satu terapi perilaku kognitif (CBT) yang  dilakukan adalah terapi musik. Namun, pada proses terapi musik yang terjadi saat ini, adalah beberapa pasien tidak tahu menggunakan alat musik sehingga kebanyakan dari pasien hanya bisa mendengarkan. Penelitian ini mencoba mencari alternatif lain dalam proses terapi penyandang Depresi yaitu melalui game. Penelitian ini dirancang menggunakan metode Pre Post Test di mana pasien akan diuji menggunakan alat peraga terlebih dahulu, setelah itu menggunakan aplikasi game. Pengujian dilakukan menggunakan metode Mann-Withney yang menunjukkan hasil bahwa menggunakan aplikasi alternatif terapi pada pasien membuat pasien merasa lebih mudah melakukan terapi dan pasien merasa lebih senang menjalani terapi&quot;,&quot;publisher&quot;:&quot;UNIVERSITAS DIPA MAKASSAR&quot;,&quot;issue&quot;:&quot;2&quot;,&quot;volume&quot;:&quot;15&quot;,&quot;container-title-short&quot;:&quot;&quot;},&quot;isTemporary&quot;:false},{&quot;id&quot;:&quot;583bc29f-1306-36cb-8911-50b048089240&quot;,&quot;itemData&quot;:{&quot;type&quot;:&quot;article-journal&quot;,&quot;id&quot;:&quot;583bc29f-1306-36cb-8911-50b048089240&quot;,&quot;title&quot;:&quot;Expert system berbasis website dengan inisiasi mental health awareness sebagai edukasi pentingnya kesehatan mental dan mengatasi mental illness&quot;,&quot;groupId&quot;:&quot;5d3d1151-c3fb-3f7b-bcf0-db626a6f9f8b&quot;,&quot;author&quot;:[{&quot;family&quot;:&quot;Adama&quot;,&quot;given&quot;:&quot;Bintang Ahmada Farhan&quot;,&quot;parse-names&quot;:false,&quot;dropping-particle&quot;:&quot;&quot;,&quot;non-dropping-particle&quot;:&quot;&quot;},{&quot;family&quot;:&quot;Alda&quot;,&quot;given&quot;:&quot;Rosalina&quot;,&quot;parse-names&quot;:false,&quot;dropping-particle&quot;:&quot;&quot;,&quot;non-dropping-particle&quot;:&quot;&quot;},{&quot;family&quot;:&quot;Prakash&quot;,&quot;given&quot;:&quot;Satya&quot;,&quot;parse-names&quot;:false,&quot;dropping-particle&quot;:&quot;&quot;,&quot;non-dropping-particle&quot;:&quot;&quot;},{&quot;family&quot;:&quot;Janah&quot;,&quot;given&quot;:&quot;Mivtakhul&quot;,&quot;parse-names&quot;:false,&quot;dropping-particle&quot;:&quot;&quot;,&quot;non-dropping-particle&quot;:&quot;&quot;},{&quot;family&quot;:&quot;Robbani&quot;,&quot;given&quot;:&quot;Musyaffa Ahmad&quot;,&quot;parse-names&quot;:false,&quot;dropping-particle&quot;:&quot;&quot;,&quot;non-dropping-particle&quot;:&quot;&quot;}],&quot;container-title&quot;:&quot;Proceedings of the National Conference on Electrical Engineering, Informatics, Industrial Technology, and Creative Media&quot;,&quot;accessed&quot;:{&quot;date-parts&quot;:[[2025,5,14]]},&quot;URL&quot;:&quot;https://centive.ittelkom-pwt.ac.id/index.php/centive/article/view/159&quot;,&quot;issued&quot;:{&quot;date-parts&quot;:[[2023]]},&quot;page&quot;:&quot;168-179&quot;,&quot;abstract&quot;:&quot;Tantangan serius terkait kesehatan mental di Indonesia, khususnya dalam meningkatnya gangguan mental seperti kecemasan dan depresi. Tingkat gangguan mental mencapai 55% dan 58%, sementara stigma dan diskriminasi terhadap gangguan mental menjadi hambatan signifikan. Sebagai respons terhadap masalah ini, dikembangkanlah website \&quot;Mentality.id\&quot; dengan pendekatan inovatif, membahas desain website, mekanisme kerja, dan evaluasi. Penelitian ini bertujuan untuk menghadirkan wadah bagi individu yang mengalami gangguan mental, sehingga pengguna dapat berbagi pengalaman dan cerita dengan orang-orang yang memiliki pengalaman serupa. Sementara itu, memberikan solusi kesehatan mental, berkontribusi pada kebijakan pemerintah, dan menjadi referensi bagi kalangan akademisi. Hasil survei pada saat menyebarkan kuesioner sebanyak 60% sangat setuju tentang dibuatnya website ini.  Penggunaan sistem pakar dengan metode forward chaining dalam Mentality.id melalui penilaian awal kesehatan mental pada fitur kuesioner SRQ-20. Kuesioner digunakan untuk mengukur tingkat kesadaran dan dukungan terhadap penanggulangan masalah kesehatan mental melalui platform online. Pengujian usability menggunakan System Usability Scale (SUS) dengan 30 responden mendapatkan rata-rata skor 83, menempatkan Mentality.id sebagai \&quot;Excellent\&quot; dan dapat diterima. Skor ini memberikan gambaran positif tentang kegunaan dan pengalaman pengguna website ini, khususnya dengan penerapan metode forward chaining dalam membantu pengambilan keputusan pada saat tes kesehatan mental.&quot;,&quot;issue&quot;:&quot;1&quot;,&quot;volume&quot;:&quot;3&quot;,&quot;container-title-short&quot;:&quot;&quot;},&quot;isTemporary&quot;:false},{&quot;id&quot;:&quot;abce3ee9-b921-30e0-9eb6-3c45c49894d6&quot;,&quot;itemData&quot;:{&quot;type&quot;:&quot;thesis&quot;,&quot;id&quot;:&quot;abce3ee9-b921-30e0-9eb6-3c45c49894d6&quot;,&quot;title&quot;:&quot;Rancang Bagun (Less Depression) dengan Penerapan Sistem Pakar untuk Mengetahui Tingkat Depresi Dini Mahasiswa Tingkat Akhir Menggunakan Metode Dempster Shafer&quot;,&quot;groupId&quot;:&quot;5d3d1151-c3fb-3f7b-bcf0-db626a6f9f8b&quot;,&quot;author&quot;:[{&quot;family&quot;:&quot;Widyatna&quot;,&quot;given&quot;:&quot;Dwi Kumara&quot;,&quot;parse-names&quot;:false,&quot;dropping-particle&quot;:&quot;&quot;,&quot;non-dropping-particle&quot;:&quot;&quot;}],&quot;accessed&quot;:{&quot;date-parts&quot;:[[2025,5,14]]},&quot;URL&quot;:&quot;https://repository.dinamika.ac.id/id/eprint/6789/&quot;,&quot;issued&quot;:{&quot;date-parts&quot;:[[2022]]},&quot;abstract&quot;:&quot;Depresi merupakan gangguan jiwa yang ditandai dengan munculnya gangguan mood dan kehilangan minat. Penyebaran kuisioner telah dilakukan kepada 58 mahasiswa akhir di beberapa universitas di Surabaya didapatkan data gejala depresi yang dialami selama 2 minggu antara lain sering mengalami perubahan pola tidur, sering mengalami perubahan nafsu makan, mengalami pesimis, mengalami kehilangan energi, mengalami kehilangan ketertarikan, dan berfikir untuk tidak melanjutkan tugas akhir. Penelitihan ini berfokus pada membangun sistem pakar untuk pendeteksi dini tingkat stress pada mahasiswa tingkat akhir di Universitas yang berada di Surabaya menggunakan metode Dempster Shafer. Metode ini digunakan karena metode kemudahannya menggunakan nilai pembobotan dan pemberian nilai kepercayaan terhadap suatu gejala. Metode Dempster Shafer merupakan cara yang tepat dalam mendeteksi suatu penyakit. Sistem pakar yang dibangun ini memiliki dampak bagi mahasiswa dan dokter psikiater. Bagi mahasiswa dapat meningkatkan rasio mahasiswa dalam penyelesaian tugas akhir dan bagi dokter psikiater aplikasi ini dapat digunakan sebagai layanan tambahan dan kemudahan dalam melakukan konsultasi bagi pengguna. Kemudian untuk uji testing menggunakan metode system usability scale (SUS) dengan menghasilkan rata-rata skor nilai 71, dimana menurut Kurniawan (2022) nilai 71 sudah termasuk hasil yang dianggap Good karena bernilai lebih dari 70,4. Selain itu pada perhitungan akurasi yang dilakukan dengan confusion matrix, sistem ini memberikan nilai accuracy sebesar 87,5% dan pada precision memiliki nilai 93,3% dan juga recall mempunyai nilai 93,3%. Kemudian pada aplikasi (Less Depression) ini dapat mendeteksi depresi mahasiswa tingkat akhir dan memberikan fitur chat untuk menghubungkan antara Psikiater dengan mahasiswa tingkat akhir yang mengalami depresi untuk treatment atau intervensi sehingga dapat mengurangi depresi yang dialami.&quot;,&quot;publisher&quot;:&quot;Universitas Dinamika&quot;,&quot;container-title-short&quot;:&quot;&quot;},&quot;isTemporary&quot;:false},{&quot;id&quot;:&quot;0f28ec3c-2745-3276-9d91-703cad2d3be9&quot;,&quot;itemData&quot;:{&quot;type&quot;:&quot;thesis&quot;,&quot;id&quot;:&quot;0f28ec3c-2745-3276-9d91-703cad2d3be9&quot;,&quot;title&quot;:&quot;Deteksi Dini Mental Illness Dengan Metode Case Base Reasoning Laporan Akhir&quot;,&quot;groupId&quot;:&quot;5d3d1151-c3fb-3f7b-bcf0-db626a6f9f8b&quot;,&quot;author&quot;:[{&quot;family&quot;:&quot;Azizah&quot;,&quot;given&quot;:&quot;Miftah Rizqi&quot;,&quot;parse-names&quot;:false,&quot;dropping-particle&quot;:&quot;&quot;,&quot;non-dropping-particle&quot;:&quot;&quot;}],&quot;accessed&quot;:{&quot;date-parts&quot;:[[2025,5,14]]},&quot;URL&quot;:&quot;https://sipora.polije.ac.id/5966/&quot;,&quot;issued&quot;:{&quot;date-parts&quot;:[[2021]]},&quot;abstract&quot;:&quot;Teknologi informasi saat ini menjadi pokok utama dalam kehidupan. Dimana segala hal dapat dikerjakan dengan bantuan teknologi informasi. Dalam perkembangannya teknologi informasi dapat dimanfaatkan dibanyak bidang seperti pada bidang pendidikan, ekonomi, politik, lingkungan bahkan kesehatan. Pada saat ini banyak beredar aplikasi kesehatan guna membantu masyarakat untuk mengkontrol kesehatannya melalui jarak jauh,baik untuk kesehatan psikis ataupun kesehatan mental. Namun pada kasus tertentu masih banyak masyarakat yang belum memahami kegunaan aplikasi kesehatan khususnya kesehatan mental karena masih menganggap sepele dan remeh kesehatan mental. Berdasarkan penjabaran diatas maka diambilah judul “Deteksi Dini Mental Illness Dengan Metode Case Based Reasoning” yang menggunakan metode Case Based Reasoning untuk pengambilan keputusan data dari basis kasus yang kemudian diolah berdasarkan rumus algoritma similarity dimana menampilkan hasil analisis Similarity pada tiap kasus terbaru yang diinput. Pemanfaatan teknik similarity ini berguna untuk membandingkan data gejala yang baru diinputkan dengan gejala yang telah ada pada basis kasus dan pemanfaatan teknik Bubble Sort untuk mencari hasil persentase yang terbesar dijadikan acuan dalam pengambilan keputusan sehingga dapat membantu para remaja untuk mendeteksi dini adanya gangguan bipolar disorder. Aplikasi ini berbasis Website yang dapat memudahkan pengguna untuk mengaksesnya kapan dan dimana saja menggunakan jaringan internet. Setelah melalui tahap pengujian, aplikasi berjalan dengan baik sesuai dengan yang diharapkan. Pengujian dilakukan langsung kepada user yang telah berusia 18-25 tahun dengan pengujian User Acceptances Test dan dihitung rata-rata persentase dengan skala likert kemudian didapatkan hasil pengujian aplikasi sebesar 85,49%.&quot;,&quot;publisher&quot;:&quot;Politeknik Negeri Jember&quot;,&quot;container-title-short&quot;:&quot;&quot;},&quot;isTemporary&quot;:false},{&quot;id&quot;:&quot;0c39259c-a278-3284-8b7f-1693a30017d0&quot;,&quot;itemData&quot;:{&quot;type&quot;:&quot;article-journal&quot;,&quot;id&quot;:&quot;0c39259c-a278-3284-8b7f-1693a30017d0&quot;,&quot;title&quot;:&quot;Sistem Diagnosa Gejala Penyakit Kesehatan Mental Pada Remaja Menggunakan Metode Naïve Bayes&quot;,&quot;groupId&quot;:&quot;5d3d1151-c3fb-3f7b-bcf0-db626a6f9f8b&quot;,&quot;author&quot;:[{&quot;family&quot;:&quot;Salsabila&quot;,&quot;given&quot;:&quot;Putri Hana&quot;,&quot;parse-names&quot;:false,&quot;dropping-particle&quot;:&quot;&quot;,&quot;non-dropping-particle&quot;:&quot;&quot;},{&quot;family&quot;:&quot;Samsoni&quot;,&quot;given&quot;:&quot;&quot;,&quot;parse-names&quot;:false,&quot;dropping-particle&quot;:&quot;&quot;,&quot;non-dropping-particle&quot;:&quot;&quot;}],&quot;container-title&quot;:&quot;OKTAL : Jurnal Ilmu Komputer Dan Sains&quot;,&quot;accessed&quot;:{&quot;date-parts&quot;:[[2025,5,14]]},&quot;URL&quot;:&quot;https://journal.mediapublikasi.id/index.php/oktal/article/view/1836&quot;,&quot;issued&quot;:{&quot;date-parts&quot;:[[2023]]},&quot;page&quot;:&quot;2795-2805&quot;,&quot;abstract&quot;:&quot;With the existence of an information technology application program this can help and play a very important role in human life, one of these applications is an application of artificial intelligence carried out by experts, this application is used to solve a problem that is usually only done by an expert in the field of direct knowledge . This application is a website-based application that can help diagnose a mental health disease that often occurs in adolescents. The purpose of this application is to diagnose a mental health disease in adolescents and help adolescents to find out whether they are experiencing symptoms of mental health disease or not. This data collection method is carried out in several ways, namely by the method of Observation, Interview and Literature Study, the results of the data collection are then collected and calculated using the Naïve Bayes calculation method, from these data will then be inputted into a website-based application that previously created, this application is made using the PHP programming language and uses the MySQL database. The results and benefits expected in making this thesis are to increase knowledge about mental health so that everyone can be more aware in responding to this, besides that this application is also expected to be able to help a teenager who wants to know about his mental health condition, and is expected to help in alleviating the work of an expert in diagnosing the disease so that the settlement process will be faster and more accurate.&quot;,&quot;issue&quot;:&quot;10&quot;,&quot;volume&quot;:&quot;2&quot;,&quot;container-title-short&quot;:&quot;&quot;},&quot;isTemporary&quot;:false},{&quot;id&quot;:&quot;7dfbdf1c-752f-380b-9a43-3204a2c00690&quot;,&quot;itemData&quot;:{&quot;type&quot;:&quot;article-journal&quot;,&quot;id&quot;:&quot;7dfbdf1c-752f-380b-9a43-3204a2c00690&quot;,&quot;title&quot;:&quot;Sistem Pakar dalam Menganalisis Gangguan Jiwa Menggunakan Metode Certainty Factor&quot;,&quot;groupId&quot;:&quot;5d3d1151-c3fb-3f7b-bcf0-db626a6f9f8b&quot;,&quot;author&quot;:[{&quot;family&quot;:&quot;Putra&quot;,&quot;given&quot;:&quot;Rafi Septiawan&quot;,&quot;parse-names&quot;:false,&quot;dropping-particle&quot;:&quot;&quot;,&quot;non-dropping-particle&quot;:&quot;&quot;},{&quot;family&quot;:&quot;Yuhandri&quot;,&quot;given&quot;:&quot;Y&quot;,&quot;parse-names&quot;:false,&quot;dropping-particle&quot;:&quot;&quot;,&quot;non-dropping-particle&quot;:&quot;&quot;}],&quot;container-title&quot;:&quot;Jurnal Sistim Informasi dan Teknologi&quot;,&quot;accessed&quot;:{&quot;date-parts&quot;:[[2025,5,14]]},&quot;DOI&quot;:&quot;10.37034/jsisfotek.v3i4.70&quot;,&quot;ISSN&quot;:&quot;2686-3154&quot;,&quot;URL&quot;:&quot;http://jsisfotek.org/index.php/JSisfotek/article/view/70&quot;,&quot;issued&quot;:{&quot;date-parts&quot;:[[2021,8,29]]},&quot;page&quot;:&quot;227-232&quot;,&quot;abstract&quot;:&quot;&lt;p&gt;People with Mental Disorders (ODGJ) as a trigger for people who suffer from disorders of thought, feeling and behavior cause changes in attitudes and behavior that hinder normal human functioning. Mental disorders as a syndrome characterized by a change in a person's behavior that will be associated with symptoms such as difficulties or disorders, as well as psychological functions and behavior that are not confident in dealing with people but can also be with that person. An expert system is an intelligent computer technology that is based on solving problems using inferential knowledge and procedures. As a problem solver, expert systems will also find it easier to make decisions or policies like humans do. This study aims to produce an expert system that is used to analyze mental disorders who can make similar decisions, as well as psychiatric specialists. The data processed in this study is scientific data on mental disorders ranging from types of mental illness, early symptoms of disease and patient diagnosis data by mental health specialists, then the data is processed using the Certainty Factor method and displayed in the form of a web-based application using the PHP programming language. and MySQL databases. The results obtained from testing the expert system using the Certainty Factor method show that there is a match between the results of an expert diagnosis of depression with a certainty level of 73%. An expert system for analyzing mental disorders using the Certainty Factor method can make it easier for sufferers to understand the type of mental disorder they are experiencing.&lt;/p&gt;&quot;,&quot;container-title-short&quot;:&quot;&quot;},&quot;isTemporary&quot;:false},{&quot;id&quot;:&quot;5b368bd5-eb90-3bfb-b923-33399390298d&quot;,&quot;itemData&quot;:{&quot;type&quot;:&quot;thesis&quot;,&quot;id&quot;:&quot;5b368bd5-eb90-3bfb-b923-33399390298d&quot;,&quot;title&quot;:&quot;Perancangan aplikasi personal mental health dengan pendekatan user centered design&quot;,&quot;groupId&quot;:&quot;5d3d1151-c3fb-3f7b-bcf0-db626a6f9f8b&quot;,&quot;author&quot;:[{&quot;family&quot;:&quot;Leslie&quot;,&quot;given&quot;:&quot;Jonathan&quot;,&quot;parse-names&quot;:false,&quot;dropping-particle&quot;:&quot;&quot;,&quot;non-dropping-particle&quot;:&quot;&quot;}],&quot;accessed&quot;:{&quot;date-parts&quot;:[[2025,5,14]]},&quot;URL&quot;:&quot;https://repository.unpar.ac.id/handle/123456789/18321&quot;,&quot;issued&quot;:{&quot;date-parts&quot;:[[2023]]},&quot;abstract&quot;:&quot;Di Indonesia, rentang usia 16-24 tahun rentan untuk terkena masalah kesehatan mental dimana sebanyak 95,4% remaja pernah mengalami gejala kecemasan dan 88% pernah mengalami gejala depresi pada tahun 2021. Selain itu terdapat sejumlah permasalahan seperti keterbatasan rumah sakit, puskesmas, dan psikiater yang sedikit, kasus bunuh diri yang tinggi dan stigma masyarakat yang menghakimi sehingga menghambat proses pertolongan kesehatan mental. Penelitian ini bertujuan untuk merancang dan mengevaluasi aplikasi personal mental health. Oleh karena itu, perlu dilakukan intervensi dengan aplikasi agar dapat memudahkan akses dalam menjaga kesehatan mental. Perancangan aplikasi dilakukan untuk upaya promotif dan preventif dengan pendekatan user-centered design. Identifikasi kebutuhan dilakukan dengan wawancara melibatkan 6 responden berusia 16-24 tahun yang terdiri dari orang dengan masalah kesehatan mental (ODMK) di depresi dan gangguan kecemasan, orang dengan minimal mental distress dan 1 psikiater yang menghasilkan kebutuhan. Selanjutnya dilakukan penentuan konsep alternatif dengan design workshop dengan melibatkan 3 desainer yang menghasilkan 3 konsep alternatif. Terdapat satu konsep terpilih yaitu konsep pertama berdasarkan hasil design workshop dengan menggunakan weighted concept scoring. Konsep pertama dapat terpilih dikarenakan mampu mengakomodasi kebutuhan user seperti memberikan kemudahan dan kenyamanan seperti menu navigasi aplikasi yang familiar, tampilan yang menarik, kelengkapan fitur-fitur utama seperti meditasi, konseling, journaling, artikel dan kebutuhan lainnya. Berdasarkan hasil konsep terpilih kemudian dirancang high-fidelity prototype menggunakan Figma. Selanjutnya dilakukan evaluasi dengan usability testing yang melibatkan tiga aspek yaitu effectiveness, efficiency, dan persepsi subjektif dengan menggunakan kuesioner System Usability Scale (SUS). Berdasarkan hasil evaluasi, didapatkan hasil aspek effectiveness sebesar 85,2%, aspek efficiency sebesar 85% dan aspek persepsi subjektif sebesar 65,83. Dari hasil evaluasi, aspek persepsi subjektif masih belum memenuhi standar minimum sehingga perlu dilakukan perbaikan. Selanjutnya dilakukan evaluasi kualitatif melalui komentar dari user. Berdasarkan hasil evaluasi diperoleh permasalahan terkait ukuran keterangan di halaman konselor, artikel dan komunitas yang kecil serta sejumlah permasalahan lainnya. Rekomendasi perbaikan dilakukan dengan memperbesar ukuran rating konselor, keterangan di bagian bawah judul artikel dan komunitas serta sejumlah perbaikan lainnya.&quot;,&quot;publisher&quot;:&quot;Universitas Katolik Parahyangan&quot;,&quot;container-title-short&quot;:&quot;&quot;},&quot;isTemporary&quot;:false},{&quot;id&quot;:&quot;b1dbd357-0862-3e70-bdd2-ae593acb6102&quot;,&quot;itemData&quot;:{&quot;type&quot;:&quot;thesis&quot;,&quot;id&quot;:&quot;b1dbd357-0862-3e70-bdd2-ae593acb6102&quot;,&quot;title&quot;:&quot;Pengembangan Panduan Model Konseling Solution Focused Brief Counseling Teknik Imagery and Visualitation Berbasis Website SI-Konseling Untuk Mengatasi Depresi Pada Remaja Korban Kekerasan&quot;,&quot;groupId&quot;:&quot;5d3d1151-c3fb-3f7b-bcf0-db626a6f9f8b&quot;,&quot;author&quot;:[{&quot;family&quot;:&quot;Fitri&quot;,&quot;given&quot;:&quot;Inda Ramadani&quot;,&quot;parse-names&quot;:false,&quot;dropping-particle&quot;:&quot;&quot;,&quot;non-dropping-particle&quot;:&quot;&quot;}],&quot;accessed&quot;:{&quot;date-parts&quot;:[[2025,5,14]]},&quot;URL&quot;:&quot;https://repo.undiksha.ac.id/16400/&quot;,&quot;issued&quot;:{&quot;date-parts&quot;:[[2023]]},&quot;abstract&quot;:&quot;Penelitian ini memiliki tujuan dalam mengembangkan serta melakukan uji validitas isi dan efektivitas panduan model konseling Solution Focused Brief Counseling teknik Imagery and Visualitation berbasis website SI-Konseling untuk mengatasi Depresi pada remaja korban kekerasan. Jenis penelitian ini termasuk dalam penelitian pengembangan dengan menggunakan prosedur 4D (Define, Design, Develop, dan Disseminate). Penelitian ini melibatkan 2 orang dosen bimbingan konseling serta 1 orang dosen teknologi pendidikan sebagai ahli dan 1 orang guru BK SMK Negeri 2 Singaraja serta 1 orang konselor Dinas Pengendalian Penduduk, Keluarga Berencana, Pemberdayaan Perempuan dan Perlindungan Anak Kabupaten Buleleng sebagai praktisi yang memiliki tugas dalam melakukan uji kegunaan, ketepatan, serta kelayakan panduan. Pengumpulan data dilakukan dengan menggunakan instrument validitas pakar yang kemudian dianalisis dengan formula CVR (Content Validity Ratio), CVI (Content Validity Indeks), dan t-test. Hasil analisis CVR menunjukkan seluruh pernyataan instrument diterima serta mendapatkan hasil CVI sebesar 1 dengan kategori sangat sesuai, maka dari itu panduan model konseling Solution Focused Brief Counseling teknik Imagery and Visualitation telah memenuhi ketentuan untuk digunakan. Uji efektivitas panduan melibatkan 30 remaja korban kekerasan dengan menggunakan eksperimen one group pre-test dan post-test design. Hasil uji-t didapatkan harga sebesar 9,146 Koefisien tersebut kemudian dibandingkan menggunakan dengan df = 29 pada taraf signifikansi 0.05. Berdasarkan hal tersebut, maka diperoleh sebesar 2,048 hal ini berarti &gt; sehingga Ho ditolak. Hasil ini menyatakan bahwasannya pengembangan panduan model konseling Solution Focused Brief Counseling teknik Imagery and Visualitation berbasis website SI-Konseling efektif untuk mengatasi Depresi pada remaja korban kekerasan.&quot;,&quot;publisher&quot;:&quot;Universitas Pendidikan Ganesha&quot;,&quot;container-title-short&quot;:&quot;&quot;},&quot;isTemporary&quot;:false},{&quot;id&quot;:&quot;cd179222-7784-3654-93fd-3d27b7b73cec&quot;,&quot;itemData&quot;:{&quot;type&quot;:&quot;article-journal&quot;,&quot;id&quot;:&quot;cd179222-7784-3654-93fd-3d27b7b73cec&quot;,&quot;title&quot;:&quot;Aplikasi Mobile Pendeteksi Gangguan Mental Mahasiswa dengan Menggunakan Metode Forward Chaining&quot;,&quot;groupId&quot;:&quot;5d3d1151-c3fb-3f7b-bcf0-db626a6f9f8b&quot;,&quot;author&quot;:[{&quot;family&quot;:&quot;Pambudi&quot;,&quot;given&quot;:&quot;Arunseto&quot;,&quot;parse-names&quot;:false,&quot;dropping-particle&quot;:&quot;&quot;,&quot;non-dropping-particle&quot;:&quot;&quot;},{&quot;family&quot;:&quot;Aminah&quot;,&quot;given&quot;:&quot;Siti&quot;,&quot;parse-names&quot;:false,&quot;dropping-particle&quot;:&quot;&quot;,&quot;non-dropping-particle&quot;:&quot;&quot;},{&quot;family&quot;:&quot;Kristanto&quot;,&quot;given&quot;:&quot;Bagus Kristomoyo&quot;,&quot;parse-names&quot;:false,&quot;dropping-particle&quot;:&quot;&quot;,&quot;non-dropping-particle&quot;:&quot;&quot;}],&quot;container-title&quot;:&quot;Prosiding Seminar Nasional Sisfotek (Sistem Informasi dan Teknologi Informasi)&quot;,&quot;accessed&quot;:{&quot;date-parts&quot;:[[2025,5,14]]},&quot;URL&quot;:&quot;https://garuda.kemdikbud.go.id/documents/detail/2915834&quot;,&quot;issued&quot;:{&quot;date-parts&quot;:[[2021]]},&quot;abstract&quot;:&quot;Mobile device technology (mobile) is one of the most widely used communication and information devices in March 2020 as many as 55.43% of mobile device users and the number of mobile device users will continue to rise leaving the desktop over time. Mental disorders in modern times are increasingly becoming a serious problem in society. Most of the incidents of suicide are related to mental-emotional disorders. Decision Support System (DSS) or Decision Support System (DSS) is a system capable of providing problem solving capabilities. Forward chaining is a method of DSS that uses an inference engine and can be described logically as an iterative application of the modus ponens. The purpose of this study is to build a student mental disorder detector mobile application using the forward chaining method. This research discusses from system design, application implementation to application testing. The results of this study are a trial result and an informative mobile application and of course able to detect mental disorders of students.&quot;,&quot;issue&quot;:&quot;1&quot;,&quot;volume&quot;:&quot;5&quot;,&quot;container-title-short&quot;:&quot;&quot;},&quot;isTemporary&quot;:false},{&quot;id&quot;:&quot;78e5ab39-c37b-38c3-aa0b-2f3f590be445&quot;,&quot;itemData&quot;:{&quot;type&quot;:&quot;article-journal&quot;,&quot;id&quot;:&quot;78e5ab39-c37b-38c3-aa0b-2f3f590be445&quot;,&quot;title&quot;:&quot;Penerapan metode forward chaining dan certainty factor untuk mengetahui gangguan mental pada remaja&quot;,&quot;groupId&quot;:&quot;5d3d1151-c3fb-3f7b-bcf0-db626a6f9f8b&quot;,&quot;author&quot;:[{&quot;family&quot;:&quot;Mardivta&quot;,&quot;given&quot;:&quot;Hafizhah&quot;,&quot;parse-names&quot;:false,&quot;dropping-particle&quot;:&quot;&quot;,&quot;non-dropping-particle&quot;:&quot;&quot;}],&quot;container-title&quot;:&quot;Jurnal CoSciTech (Computer Science and Information Technology)&quot;,&quot;accessed&quot;:{&quot;date-parts&quot;:[[2025,5,14]]},&quot;DOI&quot;:&quot;10.37859/coscitech.v5i1.6716&quot;,&quot;ISSN&quot;:&quot;2723-5661&quot;,&quot;URL&quot;:&quot;https://doi.org/10.37859/coscitech.v5i1.6716&quot;,&quot;issued&quot;:{&quot;date-parts&quot;:[[2024,5,21]]},&quot;page&quot;:&quot;215-224&quot;,&quot;abstract&quot;:&quot;&lt;p&gt;Gangguan jiwa adalah suatu kondisi dimana orang yang mempunyai masalah atau gangguan mental, sosial pertumbuhan dan perkembangan sehingga menghambat dalam proses kehidupan dan berinteraksi dengan orang lain. Kesehatan mental dapat dipengaruhi oleh beberapa faktor, contohnya pertemanan, keluarga, gaya hidup, dan banyak faktor lainnya. Banyaknya masyarakat yang tidak ingin melakukan pemeriksaan mental pada psikolog dikarenakan beberapa faktor, yaitu masyarakat merasa malu dan takut menceritakan masalahnya, kurangnya pengetahuan terhadap gejala dan jenis gangguan kejiwaan tersebut, serta ketakutan dengan lingkungan sekitar. Salah satu cara untuk membantu dalam mengatasi masalah tersebut adalah menggunakan sistem pakar. Sistem pakar ini dibangun untuk mengetahui gangguan mental pada remaja dengan menggunakan metode Forward Chaining dan Certainty Factor. Metode Forward Chaining akan di kolaborasikan dengan metode Certainty Factor untuk meghitung tingkat akurasi jenis gangguan mental yang dialami. Pengunaan dua metode ini bertujuan untuk memberikan hasil lebih baik dalam mengetahui gangguan mental pada remaja. Data yang diambil pada penelitian ini adalah data gangguan mental pada Lembaga Psikologi UPI YPTK, data yang digunakan terdiri dari 50 data gejala dan 7 data penyakit. Hasil penelitian ini berupa aplikasi Sistem Pakar dengan menggunakan bahasa pemrograman PHP yang digunakan untuk mengetahui gangguan mental pada remaja. Dari pengujian yang telah dilakukan diperoleh hasil dengan tingkat akurasi sebesar 0.9998%. Aplikasi sistem pakar dapat digunakan untuk tindakan dini dalam mencegah gangguan mental pada remaja.&lt;/p&gt;&quot;,&quot;issue&quot;:&quot;1&quot;,&quot;volume&quot;:&quot;5&quot;,&quot;container-title-short&quot;:&quot;&quot;},&quot;isTemporary&quot;:false},{&quot;id&quot;:&quot;01f74660-2d97-3463-863e-3df852644ff6&quot;,&quot;itemData&quot;:{&quot;type&quot;:&quot;article-journal&quot;,&quot;id&quot;:&quot;01f74660-2d97-3463-863e-3df852644ff6&quot;,&quot;title&quot;:&quot;Implementasi Metode Dempster-Shafer Untuk Deteksi Kesehatan Mental Pada Mahasiswa Berbasis Web&quot;,&quot;groupId&quot;:&quot;5d3d1151-c3fb-3f7b-bcf0-db626a6f9f8b&quot;,&quot;author&quot;:[{&quot;family&quot;:&quot;Jalaluddin&quot;,&quot;given&quot;:&quot;Alif&quot;,&quot;parse-names&quot;:false,&quot;dropping-particle&quot;:&quot;&quot;,&quot;non-dropping-particle&quot;:&quot;&quot;},{&quot;family&quot;:&quot;Arumi&quot;,&quot;given&quot;:&quot;Endah Ratna&quot;,&quot;parse-names&quot;:false,&quot;dropping-particle&quot;:&quot;&quot;,&quot;non-dropping-particle&quot;:&quot;&quot;},{&quot;family&quot;:&quot;Sasongko&quot;,&quot;given&quot;:&quot;Dimas&quot;,&quot;parse-names&quot;:false,&quot;dropping-particle&quot;:&quot;&quot;,&quot;non-dropping-particle&quot;:&quot;&quot;},{&quot;family&quot;:&quot;Pinilih&quot;,&quot;given&quot;:&quot;Sambodo Sriadi&quot;,&quot;parse-names&quot;:false,&quot;dropping-particle&quot;:&quot;&quot;,&quot;non-dropping-particle&quot;:&quot;&quot;},{&quot;family&quot;:&quot;Yudatama&quot;,&quot;given&quot;:&quot;Uky&quot;,&quot;parse-names&quot;:false,&quot;dropping-particle&quot;:&quot;&quot;,&quot;non-dropping-particle&quot;:&quot;&quot;},{&quot;family&quot;:&quot;Arif Yudianto&quot;,&quot;given&quot;:&quot;Muhammad Resa&quot;,&quot;parse-names&quot;:false,&quot;dropping-particle&quot;:&quot;&quot;,&quot;non-dropping-particle&quot;:&quot;&quot;}],&quot;container-title&quot;:&quot;Journal of Computer System and Informatics (JoSYC)&quot;,&quot;accessed&quot;:{&quot;date-parts&quot;:[[2025,5,14]]},&quot;DOI&quot;:&quot;10.47065/josyc.v5i2.4830&quot;,&quot;ISSN&quot;:&quot;2714-8912&quot;,&quot;URL&quot;:&quot;https://doi.org/10.47065/josyc.v5i2.4830&quot;,&quot;issued&quot;:{&quot;date-parts&quot;:[[2024,2,28]]},&quot;page&quot;:&quot;416-429&quot;,&quot;abstract&quot;:&quot;&lt;p&gt;Mental health is a person's soul condition to budaptasi in its environment to feel happy or get the comfort of life, so as not to experience mental disorders. Often mental health is ignored by most people because it is different from physical health that can be seen directly with the eyes and can be identified easily. Lack of awareness of mental health in the life of the people of Indonesia and the assumption that a person who goes to psychologists is a person inseasonable, often the individual who actually undergoes mental health problems reluctant to get help from experts or deny that he does not have mental health problems. Limitations of time and costs are also one of the constraints of a student reluctant to get help from experts like psychologists. Therefore, a web-based expert system is built with a dempster-shafer method to use as detection on the student and allows the user to know whether the user has a tendency of the problem on its mental health or not before the official consultation is required from the expert. Testing Accuracy Comparison System between the results of the system and experts by using 100 correspondents from students at Muhammadiyah Magelang University (UNIMMA) 89% know mental health and 65% have experienced mental disorders. The results of the SRQ29 data used and were spread among campus students, this study has used 20 sample data and produces 70% expert suit compliance. From the results of expert suitability obtained from the calculation of the system by selecting symptoms and automatically the system will calculate the accuracy of the existing Belief Valident in every symptom. Then the system will take decisions based on the results of the largest calculation value.&lt;/p&gt;&quot;,&quot;issue&quot;:&quot;2&quot;,&quot;volume&quot;:&quot;5&quot;,&quot;container-title-short&quot;:&quot;&quot;},&quot;isTemporary&quot;:false},{&quot;id&quot;:&quot;ee44a731-5c3a-30b8-8521-f907e4f3762b&quot;,&quot;itemData&quot;:{&quot;type&quot;:&quot;article-journal&quot;,&quot;id&quot;:&quot;ee44a731-5c3a-30b8-8521-f907e4f3762b&quot;,&quot;title&quot;:&quot;PERANCANGAN USER INTERFACE DAN USER EXPERIENCE APLIKASI SAY.CO&quot;,&quot;groupId&quot;:&quot;5d3d1151-c3fb-3f7b-bcf0-db626a6f9f8b&quot;,&quot;author&quot;:[{&quot;family&quot;:&quot;Jamilah&quot;,&quot;given&quot;:&quot;Yulianti Siti&quot;,&quot;parse-names&quot;:false,&quot;dropping-particle&quot;:&quot;&quot;,&quot;non-dropping-particle&quot;:&quot;&quot;},{&quot;family&quot;:&quot;Padmasari&quot;,&quot;given&quot;:&quot;Ayung Candra&quot;,&quot;parse-names&quot;:false,&quot;dropping-particle&quot;:&quot;&quot;,&quot;non-dropping-particle&quot;:&quot;&quot;}],&quot;container-title&quot;:&quot;Tanra : Jurnal Desain Komunikasi Visual Fakultas Seni dan Desain Universitas Negeri Makassar&quot;,&quot;accessed&quot;:{&quot;date-parts&quot;:[[2025,5,14]]},&quot;URL&quot;:&quot;https://garuda.kemdikbud.go.id/documents/detail/2727291&quot;,&quot;issued&quot;:{&quot;date-parts&quot;:[[2022]]},&quot;page&quot;:&quot;73-78&quot;,&quot;abstract&quot;:&quot;Kesehatan mental memiliki pengaruh yang sangat penting dalam kehidupan manusia. Jika seseorang mengalami gangguan kesehatan mental, maka kehidupannya akan ikut terganggu. Maraknya kasus kesehatan mental yang terjadi saat ini menjadi permasalahan yang harus diatasi. Say.co merupakan aplikasi kesehatan mental yang dapat membantu para penderita gangguan kesehatan mental agar mendapatkan penanganan langsung dari ahlinya. Pada aplikasi ini terdapat beberapa fitur yang dapat berguna bagi penderita kesehatan mental, diantaranya adalah konsultasi, chat bot, rekomendasi kegiatan, rekomendasi lagu, rekomendasi makanan, mood board, dan informasi seputar kesehatan mental. Metode yang digunakan dalam perancangan aplikasi ini adalah studi literatur dan memperhatikan aspek penting yang harus ada dalam user interface dan user experience. Perancangan ini berguna untuk memberikan informasi mengenai fitur dan tampilan aplikasi say.co.&quot;,&quot;issue&quot;:&quot;1&quot;,&quot;volume&quot;:&quot;9&quot;,&quot;container-title-short&quot;:&quot;&quot;},&quot;isTemporary&quot;:false},{&quot;id&quot;:&quot;cd8c9f45-2a3b-3765-88c8-316da9a5b5a3&quot;,&quot;itemData&quot;:{&quot;type&quot;:&quot;thesis&quot;,&quot;id&quot;:&quot;cd8c9f45-2a3b-3765-88c8-316da9a5b5a3&quot;,&quot;title&quot;:&quot;Implementasi Algoritma RNN pada Pengembangan Aplikasi Web-Based Mental Illness Chatbox di Orbit Future Academy&quot;,&quot;groupId&quot;:&quot;5d3d1151-c3fb-3f7b-bcf0-db626a6f9f8b&quot;,&quot;author&quot;:[{&quot;family&quot;:&quot;Ismoyo&quot;,&quot;given&quot;:&quot;Maret&quot;,&quot;parse-names&quot;:false,&quot;dropping-particle&quot;:&quot;&quot;,&quot;non-dropping-particle&quot;:&quot;&quot;}],&quot;accessed&quot;:{&quot;date-parts&quot;:[[2025,5,14]]},&quot;URL&quot;:&quot;https://dirdosen.budiluhur.ac.id/0322038603/BKDGasal2022_2023/Bidang_A/Maret%20Ismoyo_LaporanKKP.pdf&quot;,&quot;abstract&quot;:&quot;Pemahaman masyarakat tentang kesehatan mental dan cara penanganannya\nmasih rendah karena kurangnya sosialisasi sehingga menimbulkan banyak mitos,\nstigma negatif, anggapan remeh dan kesalahpahaman. Memahami pengetahuan\nmanajemen kesehatan mental menjadi penting karena menurut informasi dari\nKementerian Kesehatan RI, masyarakat dan generasi muda saat ini lebih rentan\nterhadap gangguan kesehatan mental.\nAkhir-akhir ini kehadiran chatbot dapat menjadi salah satu solusi untuk\nmengatasi masalah tersebut. Pengembangan chatbot dapat digunakan sebagai\nsumber edukasi yang bertujuan untuk mensosialisasikan kesehatan mental di\nmasyarakat dan membantu masyarakat mendapatkan informasi tentang konselor\nsecara daring.\nRecurrrent Neural Network (RNN) merupakan suatu jaringan saraf berulang\nyang berguna untuk memproses data sekuensial, contohnya teks. RNN dianggap\nsuatu algoritma Artificial Intelligence (AI) yang cukup bagus untuk pengembangan\naplikasi chatbot. Pada penelitian ini, penulis mengembangkan aplikasi chatbot yang\ndapat berkomunikasi dengan masyarakat mengenai informasi kesehatan mental,\nsehingga edukasi mengenai kesehatan mental dapat diperoleh dengan mudah, cepat,\ntepat waktu dan praktis.&quot;,&quot;publisher&quot;:&quot;Universitas Budi Luhur&quot;,&quot;container-title-short&quot;:&quot;&quot;},&quot;isTemporary&quot;:false},{&quot;id&quot;:&quot;6db2726f-05bf-382e-abb1-80641fd4ff5f&quot;,&quot;itemData&quot;:{&quot;type&quot;:&quot;article-journal&quot;,&quot;id&quot;:&quot;6db2726f-05bf-382e-abb1-80641fd4ff5f&quot;,&quot;title&quot;:&quot;Rancang Bangun Sistem Pakar Psikologi Umum menggunakan Metode Forward Chaining&quot;,&quot;groupId&quot;:&quot;5d3d1151-c3fb-3f7b-bcf0-db626a6f9f8b&quot;,&quot;author&quot;:[{&quot;family&quot;:&quot;Fadlillah&quot;,&quot;given&quot;:&quot;Fahmi&quot;,&quot;parse-names&quot;:false,&quot;dropping-particle&quot;:&quot;&quot;,&quot;non-dropping-particle&quot;:&quot;&quot;},{&quot;family&quot;:&quot;Sutedi&quot;,&quot;given&quot;:&quot;Ade&quot;,&quot;parse-names&quot;:false,&quot;dropping-particle&quot;:&quot;&quot;,&quot;non-dropping-particle&quot;:&quot;&quot;},{&quot;family&quot;:&quot;Agustin&quot;,&quot;given&quot;:&quot;Yoga Handoko&quot;,&quot;parse-names&quot;:false,&quot;dropping-particle&quot;:&quot;&quot;,&quot;non-dropping-particle&quot;:&quot;&quot;}],&quot;container-title&quot;:&quot;Jurnal Algoritma&quot;,&quot;accessed&quot;:{&quot;date-parts&quot;:[[2025,5,14]]},&quot;DOI&quot;:&quot;10.33364/algoritma/v.19-2.1130&quot;,&quot;ISSN&quot;:&quot;2302-7339&quot;,&quot;URL&quot;:&quot;https://jurnal.itg.ac.id/index.php/algoritma/article/view/1130&quot;,&quot;issued&quot;:{&quot;date-parts&quot;:[[2022,11,30]]},&quot;page&quot;:&quot;493-504&quot;,&quot;abstract&quot;:&quot;&lt;p&gt;Gangguan psikologis adalah kondisi pikiran yang ditandai dengan perilaku yang tidak dapat diprediksi, suasana hati yang tidak stabil, dan masalah mental yang tidak dianggap sebagai bagian normal dari perkembangan manusia. Tujuan dari penelitian ini adalah untuk mengembangkan sistem pakar yang dapat digunakan oleh masyarakat umum di bawah bimbingan psikolog untuk mendiagnosis masalah kejiwaan dan membuat keputusan yang sesuai dengan aturan. Mesin inferensi yang digunakan yaitu metode Forward Chaining dan metodologi yang digunakan dalam pengembangan aplikasi ini adalah Ratinoal Unified Process (RUP) dengan tahapan Inception, Elaboration, Contruction, dan Transition. Model dan perancangan dalam penelitian ini menggunakan Unified Modeling Languange (UML). Hasil dari penelitian ini berupa Sistem Pakar Psikologi Umum Berbasis Web yang dapat mendiagnosa penyakit berdasarkan gejala yang didiagnosis menggunakan Metode Forward Chaining.&lt;/p&gt;&quot;,&quot;issue&quot;:&quot;2&quot;,&quot;volume&quot;:&quot;19&quot;,&quot;container-title-short&quot;:&quot;&quot;},&quot;isTemporary&quot;:false},{&quot;id&quot;:&quot;3bb48609-2274-3990-a0bc-81429a7aa212&quot;,&quot;itemData&quot;:{&quot;type&quot;:&quot;thesis&quot;,&quot;id&quot;:&quot;3bb48609-2274-3990-a0bc-81429a7aa212&quot;,&quot;title&quot;:&quot;Pengembangan Panduan Konseling Cognitive Behavior Teknik Desensitisasi Sistematis Berbasis Website Untuk Mengatasi Stress Pada Remaja Korban Kekerasan&quot;,&quot;groupId&quot;:&quot;5d3d1151-c3fb-3f7b-bcf0-db626a6f9f8b&quot;,&quot;author&quot;:[{&quot;family&quot;:&quot;Pebriyanti&quot;,&quot;given&quot;:&quot;Ni Putu Diah&quot;,&quot;parse-names&quot;:false,&quot;dropping-particle&quot;:&quot;&quot;,&quot;non-dropping-particle&quot;:&quot;&quot;}],&quot;accessed&quot;:{&quot;date-parts&quot;:[[2025,5,14]]},&quot;URL&quot;:&quot;https://repo.undiksha.ac.id/14291/&quot;,&quot;issued&quot;:{&quot;date-parts&quot;:[[2023]]},&quot;abstract&quot;:&quot;Penelitian ini bertujuan untuk mengembangkan dan menguji validitas buku panduan konseling cognitive behavior dan efektivitas teknik konseling desensitisasi sistematis untuk mengatasi stress pada remaja korban kekerasan. Penelitian ini termasuk pengembangan 4D yang dikemukakan oleh Thiagarajan (1974) (define, design, develop, disseminate). Lima orang ahli yang menjadi pakar dan praktisi bimbingan konseling dilibatkan dalam menguji validitas buku panduan. Instrumen penilaian yang dipakai terdiri dari 14 poin pernyataan yang mengacu pada validitas buku panduan. Analisis validitas memakai formula perhitungan Content Validity Ratio (CVR) dari Lawshe (1975). Perolehan menampakkan validitas isi (CVI) sebesar 1 yang berarti sangat baik. Hal ini menampakkan bahwasanya panduan konseling cognitive behavior teknik desensitisasi sistematis berbasis website yang dikembangkan telah memenuhi kriteria kelayakan. Uji efektvitas melibatkan 30 korban keekrasan dalam penelitian ini memakai desain penilitian one group pre-test and post-test design. Uji efektivitas ini dilakukan dengan menggunakn uji t, perolehan yang didapatkan yaitu thitung = 17,105 dan ttabel = 2,048 yang artinya poin thitung &gt; ttabel, perolehan ini menguraikan bahwasanya pengembangan panduan konseling cognitive behavior teknik desensitisasi sistematis berbasis website efektif untuk mengatasi stress pada remaja korban kekerasan.&quot;,&quot;publisher&quot;:&quot;Universitas Pendidikan Ganesha&quot;,&quot;container-title-short&quot;:&quot;&quot;},&quot;isTemporary&quot;:false},{&quot;id&quot;:&quot;9ff34c1e-57ef-3dcd-b1cc-1c1749b3a713&quot;,&quot;itemData&quot;:{&quot;type&quot;:&quot;article-journal&quot;,&quot;id&quot;:&quot;9ff34c1e-57ef-3dcd-b1cc-1c1749b3a713&quot;,&quot;title&quot;:&quot;K-Means Clustering untuk Visualisasi Informasi Pemanfaatan Aplikasi Deteksi Dini Depresi&quot;,&quot;groupId&quot;:&quot;5d3d1151-c3fb-3f7b-bcf0-db626a6f9f8b&quot;,&quot;author&quot;:[{&quot;family&quot;:&quot;Liliana&quot;,&quot;given&quot;:&quot;Dewi Yanti&quot;,&quot;parse-names&quot;:false,&quot;dropping-particle&quot;:&quot;&quot;,&quot;non-dropping-particle&quot;:&quot;&quot;},{&quot;family&quot;:&quot;Ermis&quot;,&quot;given&quot;:&quot;Iklima&quot;,&quot;parse-names&quot;:false,&quot;dropping-particle&quot;:&quot;&quot;,&quot;non-dropping-particle&quot;:&quot;&quot;},{&quot;family&quot;:&quot;Zain&quot;,&quot;given&quot;:&quot;Ayu Rosyida&quot;,&quot;parse-names&quot;:false,&quot;dropping-particle&quot;:&quot;&quot;,&quot;non-dropping-particle&quot;:&quot;&quot;},{&quot;family&quot;:&quot;Azza&quot;,&quot;given&quot;:&quot;Nurul Amala&quot;,&quot;parse-names&quot;:false,&quot;dropping-particle&quot;:&quot;&quot;,&quot;non-dropping-particle&quot;:&quot;&quot;}],&quot;container-title&quot;:&quot;Seminar Nasional Inovasi Vokasi&quot;,&quot;accessed&quot;:{&quot;date-parts&quot;:[[2025,5,14]]},&quot;URL&quot;:&quot;https://prosiding.pnj.ac.id/sniv/article/view/283&quot;,&quot;issued&quot;:{&quot;date-parts&quot;:[[2022]]},&quot;page&quot;:&quot;116-123&quot;,&quot;abstract&quot;:&quot;Perkembangan Teknologi Informasi dan kemajuan Kecerdasan Buatan dapat membantu manusia dalam mendapatkan akses layanan pakar psikolog dalam menyelesaikan permasalahan depresi dan dan gangguan kesehatan mental. Penelitian ini bertujuan menyajikan informasi visual berupa hasil pemanfaatan aplikasi sistem cerdas untuk deteksi dini depresi yang dapat menggambarkan kesehatan mental para pengguna aplikasi. Melalui aplikasi cerdas tersebut, pengguna mendapat hasil diagnosis dini gangguan kesehatan mental terkait depresi. Data dari para pengguna aplikasi ini kemudian diolah dengan metode K-Means clustering untuk menghasilkan informasi klaster depresi. Penyajian informasi divisualisasikan dengan diagram scatter untuk menggambarkan pengelompokan data depresi. K-Means clustering bekerja dengan mengelompokkan data pengguna berdasarkan kemiripan atribut yaitu umur, jenis kelamin, status pekerjaan, dan tingkat depresi yang diperoleh dari aplikasi berbasis Android yang diberi judul “Are you ok?”. Hasil eksperimen lalu dihitung menggunakan perhitungan indeks DBI serta metode Elbow dan Sillhoute untuk penentuan jumlah klaster optimal. Perhitungan menunjukkan klaster depresi dengan indeks DBI menghasilkan 6 klaster, sedangkan metode Elbow dan Silhouete menghasilkan 4 klaster. Klaster depresi yang terbentuk mengelompok secara natural berdasarkan kemiripan atributnya.&quot;,&quot;volume&quot;:&quot;1&quot;,&quot;container-title-short&quot;:&quot;&quot;},&quot;isTemporary&quot;:false},{&quot;id&quot;:&quot;1b9e0d51-09e2-3ffb-92b2-376781ee6fb0&quot;,&quot;itemData&quot;:{&quot;type&quot;:&quot;article-journal&quot;,&quot;id&quot;:&quot;1b9e0d51-09e2-3ffb-92b2-376781ee6fb0&quot;,&quot;title&quot;:&quot;Penerapan Metode Certainty Factor Dalam Diagnosis Gangguan Depresi&quot;,&quot;groupId&quot;:&quot;5d3d1151-c3fb-3f7b-bcf0-db626a6f9f8b&quot;,&quot;author&quot;:[{&quot;family&quot;:&quot;Hernawan&quot;,&quot;given&quot;:&quot;Septian Rico&quot;,&quot;parse-names&quot;:false,&quot;dropping-particle&quot;:&quot;&quot;,&quot;non-dropping-particle&quot;:&quot;&quot;},{&quot;family&quot;:&quot;Nugroho&quot;,&quot;given&quot;:&quot;Hanung Adi&quot;,&quot;parse-names&quot;:false,&quot;dropping-particle&quot;:&quot;&quot;,&quot;non-dropping-particle&quot;:&quot;&quot;},{&quot;family&quot;:&quot;Hidayah&quot;,&quot;given&quot;:&quot;Indriana&quot;,&quot;parse-names&quot;:false,&quot;dropping-particle&quot;:&quot;&quot;,&quot;non-dropping-particle&quot;:&quot;&quot;}],&quot;container-title&quot;:&quot;Journal of Computer System and Informatics (JoSYC)&quot;,&quot;accessed&quot;:{&quot;date-parts&quot;:[[2025,5,14]]},&quot;DOI&quot;:&quot;10.47065/josyc.v3i2.643&quot;,&quot;ISSN&quot;:&quot;2714-8912&quot;,&quot;URL&quot;:&quot;https://doi.org/10.47065/josyc.v3i2.643&quot;,&quot;issued&quot;:{&quot;date-parts&quot;:[[2022,2,28]]},&quot;page&quot;:&quot;65-72&quot;,&quot;abstract&quot;:&quot;&lt;p&gt;Globalization can cause several problems and pressures of mind for both individuals and groups. Various kinds of problems can certainly lead to psychological disorders, one of which is depression. Indonesia itself is one of the countries with a high number of people with depressive disorders. Depressive disorder itself can have many consequences ranging from lack of enthusiasm to even death. Facing these serious problems, the government should be able to address the mental disorder that is currently happening. However, the reality is still far from this. Inadequate infrastructure, equality problems for each region, and shortages of experts are the main problems at this time. The expert system is considered to be a solution in solving these problems. Web-based expert systems can replace the role of experts in the process of initial diagnosis of depressive disorders, patients can also access them easily. The calculation method implemented is the Certainty Factor method. This method is considered suitable in the diagnosis of depression. The implementation of the CF method in the diagnosis of depression can provide a confidence level of up to 94.9%. The expert system is expected to be able to eliminate human errors, speed up the diagnostic process, make it easier for health workers, and provide standards for related parties in handling mental disorders&lt;/p&gt;&quot;,&quot;issue&quot;:&quot;2&quot;,&quot;volume&quot;:&quot;3&quot;,&quot;container-title-short&quot;:&quot;&quot;},&quot;isTemporary&quot;:false},{&quot;id&quot;:&quot;727c1297-5451-3016-99e7-5d58105344e7&quot;,&quot;itemData&quot;:{&quot;type&quot;:&quot;article-journal&quot;,&quot;id&quot;:&quot;727c1297-5451-3016-99e7-5d58105344e7&quot;,&quot;title&quot;:&quot;Perancangan dan Pengembangan Video Game sebagai Media Terapi Depresi&quot;,&quot;groupId&quot;:&quot;5d3d1151-c3fb-3f7b-bcf0-db626a6f9f8b&quot;,&quot;author&quot;:[{&quot;family&quot;:&quot;Rachmawan&quot;,&quot;given&quot;:&quot;Rachmawan&quot;,&quot;parse-names&quot;:false,&quot;dropping-particle&quot;:&quot;&quot;,&quot;non-dropping-particle&quot;:&quot;&quot;},{&quot;family&quot;:&quot;Adnas&quot;,&quot;given&quot;:&quot;Diny Anggriani&quot;,&quot;parse-names&quot;:false,&quot;dropping-particle&quot;:&quot;&quot;,&quot;non-dropping-particle&quot;:&quot;&quot;}],&quot;container-title&quot;:&quot;Computer Based Information System Journal&quot;,&quot;accessed&quot;:{&quot;date-parts&quot;:[[2025,5,14]]},&quot;DOI&quot;:&quot;10.33884/cbis.v10i1.5443&quot;,&quot;ISSN&quot;:&quot;2621-5292&quot;,&quot;URL&quot;:&quot;https://doi.org/10.33884/cbis.v10i1.5443&quot;,&quot;issued&quot;:{&quot;date-parts&quot;:[[2022,3,27]]},&quot;page&quot;:&quot;62-71&quot;,&quot;abstract&quot;:&quot;&lt;p&gt;Depresi merupakan salah satu penyakit mental yang paling umum terjadi saat ini, penderita depresi biasanya memiliki gangguan emosional besar yang disebabkan oleh stress dan ketegangan yang dapat menimbulkan munculnya keinginan untuk bunuh diri seiring waktu. Teknologi telah berkembang pesat, terutama dalam bidang multimedia, multimedia membuat pengiriman seperti informasi dan pesan menjadi sangat cepat dan praktis di dalam waktu yang singkat. Video game termasuk ke dalam salah satu bidang di multimedia yang paling populer, video game memiliki popularitas yang besar khususnya generasi muda, video game dapat membantu mengurangi stress dan kecemasan pemainnya. Di penelitian ini, peniliti akan mengembangkan video game menggunakan salah satu game engine yang terkemuka yaitu Unity dengan metode Research and Development yang menggunakan model ADDIE (Analyze, Design, Develop, Implement, Evaluate). Video game yang dikembangkan merupakan game berbasis cerita tentang depresi dan perasaan dikucilkan. Hasil dari penelitian ini berupa game platformer 2D berbasis cerita pendek yang dibentuk dan disusun di Unity. Pengembangan ini diharapkan dapat membantu penderita depresi untuk melawan depresi dan meningkatkan kesadaran mengenai penyakit depresi di masyarakat luas.&lt;/p&gt;&quot;,&quot;issue&quot;:&quot;1&quot;,&quot;volume&quot;:&quot;10&quot;,&quot;container-title-short&quot;:&quot;&quot;},&quot;isTemporary&quot;:false},{&quot;id&quot;:&quot;a053e008-3354-3249-a6d4-394ba7bdadd8&quot;,&quot;itemData&quot;:{&quot;type&quot;:&quot;thesis&quot;,&quot;id&quot;:&quot;a053e008-3354-3249-a6d4-394ba7bdadd8&quot;,&quot;title&quot;:&quot;Rancang Bangun Platform Konsultasi Mental Online Berbasis Website dengan Implementasi Frontend Menggunakan ReactJS&quot;,&quot;groupId&quot;:&quot;5d3d1151-c3fb-3f7b-bcf0-db626a6f9f8b&quot;,&quot;author&quot;:[{&quot;family&quot;:&quot;Saputra&quot;,&quot;given&quot;:&quot;Muhammad Nur Rizqi&quot;,&quot;parse-names&quot;:false,&quot;dropping-particle&quot;:&quot;&quot;,&quot;non-dropping-particle&quot;:&quot;&quot;}],&quot;accessed&quot;:{&quot;date-parts&quot;:[[2025,5,14]]},&quot;URL&quot;:&quot;https://repository.nurulfikri.ac.id/id/eprint/491/&quot;,&quot;issued&quot;:{&quot;date-parts&quot;:[[2024]]},&quot;abstract&quot;:&quot;Penelitian ini merancang dan mengembangkan sebuah platform konsultasi mental online berbasis website dengan implementasi frontend menggunakan ReactJS. Latar belakang penelitian ini didasarkan pada meningkatnya kasus gangguan kesehatan mental di kalangan mahasiswa dan masyarakat umum, serta kebutuhan akan sarana konsultasi yang mudah diakses. Tujuan penelitian ini adalah untuk mengidentifikasi fitur-fitur yang diperlukan, merancang dan mengimplementasikan frontend yang responsif, serta melakukan pengujian untuk mengevaluasi kualitas platform. Metode pengembangan yang digunakan adalah Extreme Programming (XP), dengan penggunaan ReactJS sebagai library frontend. Hasil pengujian black box menunjukkan bahwa platform ini berfungsi sesuai dengan spesifikasi yang ditetapkan, dengan semua fitur utama beroperasi dengan baik dan tanpa kendala teknis yang berarti. Hasil pengujian beta testing menunjukkan nilai rata-rata keseluruhan 91.88%, yang menunjukkan bahwa platform ini menerima penilaian yang sangat baik dari pengguna, memenuhi atau melebihi harapan mereka dalam aspek responsif, interaktif, adaptif, dan kesesuaian kebutuhan pengguna. Kesimpulan dari penelitian ini adalah bahwa platform konsultasi mental online ini berhasil memenuhi kebutuhan pengguna dan siap digunakan secara efektif dalam memberikan layanan konsultasi mental.&quot;,&quot;publisher&quot;:&quot;Sekolah Tinggi Teknologi Terpadu Nurul Fikri&quot;,&quot;container-title-short&quot;:&quot;&quot;},&quot;isTemporary&quot;:false},{&quot;id&quot;:&quot;edc84815-40f3-3545-86fe-ba592d53ffa8&quot;,&quot;itemData&quot;:{&quot;type&quot;:&quot;article-journal&quot;,&quot;id&quot;:&quot;edc84815-40f3-3545-86fe-ba592d53ffa8&quot;,&quot;title&quot;:&quot;SISTEM PAKAR DIAGNOSA DEPRESI MAHASISWA TINGKAT AKHIR DENGAN METODE CERTAINTY FACTOR DAN FORWARD CHAINING&quot;,&quot;groupId&quot;:&quot;5d3d1151-c3fb-3f7b-bcf0-db626a6f9f8b&quot;,&quot;author&quot;:[{&quot;family&quot;:&quot;As Siddieq&quot;,&quot;given&quot;:&quot;Muhammad Fikrotul Ulya&quot;,&quot;parse-names&quot;:false,&quot;dropping-particle&quot;:&quot;&quot;,&quot;non-dropping-particle&quot;:&quot;&quot;}],&quot;container-title&quot;:&quot;Kohesi: Jurnal Sains dan Teknologi&quot;,&quot;accessed&quot;:{&quot;date-parts&quot;:[[2025,5,14]]},&quot;URL&quot;:&quot;https://ejournal.warunayama.org/index.php/kohesi/article/view/3715&quot;,&quot;issued&quot;:{&quot;date-parts&quot;:[[2024]]},&quot;page&quot;:&quot;1-10&quot;,&quot;abstract&quot;:&quot;Depresi adalah masalah kesehatan mental yang penting dan kompleks yang sering terjadi pada mahasiswa tingkat akhir. Penelitian ini bertujuan untuk merancang sistem pakar untuk mendiagnosis tingkat depresi pada mahasiswa menggunakan metode Certainty Factor dan Forward Chaining. Dengan menggabungkan kedua metode ini, sistem dapat memberikan diagnosis yang lebih akurat dan efisien berdasarkan gejala yang diamati. Hasil dari penelitian ini menunjukkan bahwa sistem pakar yang dikembangkan dapat memberikan diagnosis dengan tingkat kepastian yang tinggi, mendukung identifikasi depresi, dan memberikan rekomendasi penanganan yang sesuai. Sistem ini diharapkan dapat meningkatkan kesejahteraan mental mahasiswa tingkat akhir.&quot;,&quot;issue&quot;:&quot;7&quot;,&quot;volume&quot;:&quot;3&quot;,&quot;container-title-short&quot;:&quot;&quot;},&quot;isTemporary&quot;:false},{&quot;id&quot;:&quot;7f924eb7-6b2b-3917-9975-903531f933b0&quot;,&quot;itemData&quot;:{&quot;type&quot;:&quot;thesis&quot;,&quot;id&quot;:&quot;7f924eb7-6b2b-3917-9975-903531f933b0&quot;,&quot;title&quot;:&quot;Implementasi Machine Learning Untuk Mendeteksi Unsur Depresi Pada Tweet Menggunakan Metode NaÏve Bayes&quot;,&quot;groupId&quot;:&quot;5d3d1151-c3fb-3f7b-bcf0-db626a6f9f8b&quot;,&quot;author&quot;:[{&quot;family&quot;:&quot;Nurrochman&quot;,&quot;given&quot;:&quot;Miftah Meinaldi&quot;,&quot;parse-names&quot;:false,&quot;dropping-particle&quot;:&quot;&quot;,&quot;non-dropping-particle&quot;:&quot;&quot;},{&quot;family&quot;:&quot;Prasasti&quot;,&quot;given&quot;:&quot;Anggunmeka Luhur&quot;,&quot;parse-names&quot;:false,&quot;dropping-particle&quot;:&quot;&quot;,&quot;non-dropping-particle&quot;:&quot;&quot;},{&quot;family&quot;:&quot;Nugrahaeni&quot;,&quot;given&quot;:&quot;Ratna Astuti&quot;,&quot;parse-names&quot;:false,&quot;dropping-particle&quot;:&quot;&quot;,&quot;non-dropping-particle&quot;:&quot;&quot;}],&quot;accessed&quot;:{&quot;date-parts&quot;:[[2025,5,14]]},&quot;URL&quot;:&quot;https://openlibrarypublications.telkomuniversity.ac.id/index.php/engineering/article/view/16310&quot;,&quot;issued&quot;:{&quot;date-parts&quot;:[[2021]]},&quot;number-of-pages&quot;:&quot;6250-6257&quot;,&quot;abstract&quot;:&quot;Saat ini media sosial telah menjadi bagian hidup baru dalam masyarakat modern. Twitter adalah salah satu media sosial terpopuler. Batasan karakter saat melakukan tweet di Twitter membuat pesan yang disampaikan oleh pengguna menjadi sangat ringkas. Penggguna Twitter cenderung mengungkapkan perasaannya melalui unggahan tweet. Namun unggahan tweet belum tentu dapat dijadikan acuan secara nyata apakah unggahan tweet tersebut sesuai dengan perasaannya. Dalam penelitian ini menghasilkan sistem untuk mendeteksi unggahan tweet pada twitter terdapat unsur depresi atau tidak dengan metode Naïve Bayes. Metode klasifikasi yang digunakan untuk memberikan label kelas pada penelitian ini yaitu metode Naïve Bayes. Metode Naïve Bayes adalah metode klasifikasi penggolongan berdasarkan nilai probabilitas yang mudah untuk diimplementasikan pada tweet berupa teks. Dengan demikian, sistem dektesi unsur depresi pada tweet dengan Metode Naïve Bayes dapat mendeteksi sebuah postingan tweet mengandung unsur depresi atau tidak dengan nilai akurasi sebesar 74% pada pengujian rasio data, dan 73% pada pengujian validasi. Kata kunci: Twitter, tweet, Machine Learning, Depresi, Naïve Bayes.&quot;,&quot;publisher&quot;:&quot;Universitas Telkom&quot;,&quot;container-title-short&quot;:&quot;&quot;},&quot;isTemporary&quot;:false},{&quot;id&quot;:&quot;7fa96c96-d04a-3d18-8fc8-0e84a35ef0f6&quot;,&quot;itemData&quot;:{&quot;type&quot;:&quot;article-journal&quot;,&quot;id&quot;:&quot;7fa96c96-d04a-3d18-8fc8-0e84a35ef0f6&quot;,&quot;title&quot;:&quot;Analisis Efektivitas Aplikasi Luminds Dalam Mendukung Kesehatan Mental Generasi Z Menggunakan Analisis SWOT&quot;,&quot;groupId&quot;:&quot;5d3d1151-c3fb-3f7b-bcf0-db626a6f9f8b&quot;,&quot;author&quot;:[{&quot;family&quot;:&quot;Ariyanto&quot;,&quot;given&quot;:&quot;Steve&quot;,&quot;parse-names&quot;:false,&quot;dropping-particle&quot;:&quot;&quot;,&quot;non-dropping-particle&quot;:&quot;&quot;},{&quot;family&quot;:&quot;Eduardo&quot;,&quot;given&quot;:&quot;Farrell Ionwyn&quot;,&quot;parse-names&quot;:false,&quot;dropping-particle&quot;:&quot;&quot;,&quot;non-dropping-particle&quot;:&quot;&quot;},{&quot;family&quot;:&quot;Valentivo&quot;,&quot;given&quot;:&quot;Timothy&quot;,&quot;parse-names&quot;:false,&quot;dropping-particle&quot;:&quot;&quot;,&quot;non-dropping-particle&quot;:&quot;&quot;},{&quot;family&quot;:&quot;Stanislaw&quot;,&quot;given&quot;:&quot;William&quot;,&quot;parse-names&quot;:false,&quot;dropping-particle&quot;:&quot;&quot;,&quot;non-dropping-particle&quot;:&quot;&quot;},{&quot;family&quot;:&quot;Delisia&quot;,&quot;given&quot;:&quot;Julisen&quot;,&quot;parse-names&quot;:false,&quot;dropping-particle&quot;:&quot;&quot;,&quot;non-dropping-particle&quot;:&quot;&quot;}],&quot;container-title&quot;:&quot;TECHBUS (Technology, Business and Entrepreneurship)&quot;,&quot;accessed&quot;:{&quot;date-parts&quot;:[[2025,5,14]]},&quot;DOI&quot;:&quot;10.61245/techbus.v2i1.19&quot;,&quot;ISSN&quot;:&quot;2988-6635&quot;,&quot;URL&quot;:&quot;https://doi.org/10.61245/techbus.v2i1.19&quot;,&quot;issued&quot;:{&quot;date-parts&quot;:[[2024,7,8]]},&quot;page&quot;:&quot;10-25&quot;,&quot;abstract&quot;:&quot;&lt;p&gt;Depresi dan kecemasan merupakan gangguan mental yang sering dialami oleh Generasi Z. Penelitian dari University College London pada tahun 2021 menemukan bahwa tingkat depresi di kalangan Generasi Z dua pertiga lebih tinggi dibandingkan dengan milenial, menunjukkan perlunya intervensi yang efektif. Penelitian ini bertujuan untuk menganalisis efektivitas Luminds dalam mendukung kesehatan mental Generasi Z. Metode penelitian yang digunakan adalah kualitatif dengan pendekatan deskriptif, menggunakan tinjauan literatur dan kuesioner yang dianalisis melalui analisis SWOT. Hasil penelitian berdasarkan data kuesioner dari 77 responden Generasi Z yang merupakan pengguna awal yang telah menggunakan prototype aplikasi Luminds menunjukkan bahwa Luminds berada pada kuadran 1 dengan koordinat (2.46, 2.458) pada diagram SWOT, mengindikasikan penerapan strategi agresif. Ini menunjukkan bahwa Luminds efektif dalam meningkatkan kesehatan mental Generasi Z. Kontribusi penting dari penelitian ini adalah menunjukkan bagaimana teknologi, khususnya platform konsultasi online seperti Luminds, dapat berfungsi sebagai alat yang efektif dalam mendukung dan meningkatkan kesejahteraan mental Generasi Z. Penelitian ini juga menyoroti urgensi pemanfaatan teknologi digital dalam penanganan kesehatan mental, mengingat tingginya prevalensi gangguan mental di kalangan Generasi Z. Dampak signifikan dari studi ini adalah memberikan dasar ilmiah bagi pengembangan lebih lanjut dan implementasi teknologi kesehatan mental, serta menawarkan solusi yang dapat diakses secara luas untuk mengatasi krisis kesehatan mental pada Generasi Z. Temuan ini membuka peluang baru untuk inovasi dalam layanan kesehatan mental digital dan dapat menjadi referensi penting bagi pembuat kebijakan, penyedia layanan kesehatan, dan peneliti di bidang kesehatan mental.&lt;/p&gt;&quot;,&quot;issue&quot;:&quot;1&quot;,&quot;volume&quot;:&quot;2&quot;,&quot;container-title-short&quot;:&quot;&quot;},&quot;isTemporary&quot;:false},{&quot;id&quot;:&quot;317c40c4-9a6a-3d16-93ba-c61290492720&quot;,&quot;itemData&quot;:{&quot;type&quot;:&quot;article-journal&quot;,&quot;id&quot;:&quot;317c40c4-9a6a-3d16-93ba-c61290492720&quot;,&quot;title&quot;:&quot;SISTEM PAKAR DIAGNOSIS KESEHATAN MENTAL PADA MAHASISWA UNIVERSITAS AMIKOM PURWOKERTO&quot;,&quot;groupId&quot;:&quot;5d3d1151-c3fb-3f7b-bcf0-db626a6f9f8b&quot;,&quot;author&quot;:[{&quot;family&quot;:&quot;Nurhafiyah&quot;,&quot;given&quot;:&quot;Isti&quot;,&quot;parse-names&quot;:false,&quot;dropping-particle&quot;:&quot;&quot;,&quot;non-dropping-particle&quot;:&quot;&quot;},{&quot;family&quot;:&quot;Marcos&quot;,&quot;given&quot;:&quot;Hendra&quot;,&quot;parse-names&quot;:false,&quot;dropping-particle&quot;:&quot;&quot;,&quot;non-dropping-particle&quot;:&quot;&quot;}],&quot;container-title&quot;:&quot;Komputa : Jurnal Ilmiah Komputer dan Informatika&quot;,&quot;accessed&quot;:{&quot;date-parts&quot;:[[2025,5,14]]},&quot;DOI&quot;:&quot;10.34010/komputa.v12i1.8978&quot;,&quot;ISSN&quot;:&quot;2715-7849&quot;,&quot;URL&quot;:&quot;https://doi.org/10.34010/komputa.v12i1.8978&quot;,&quot;issued&quot;:{&quot;date-parts&quot;:[[2023,5,18]]},&quot;page&quot;:&quot;49-56&quot;,&quot;abstract&quot;:&quot;&lt;p&gt;Kesehatan mental sangatlah penting bagi kehidupan seseorang, terutama dalam bidang pendidikan khususnya dikalangan mahasiswa agar dapat belajar dengan lancar, maka semua mahasiswa harus dalam kondisi fisik dan mental yang baik. Mahasiswa Amikom Purwokerto menghadapi kendala, contohnya tidak adanya layanan konseling, tidak adanya waktu untuk konseling dikesibukan perkuliahan, dan biaya konseling di luaran cukup mahal. Penelitian ini dapat membantu permasalahan yaitu pembuatan sistem untuk mendiagnosa tingkat gangguan kesehatan mental mahasiswa Universitas Amikom Purwokerto. Pada penelitian ini, terdapat 3 jenis gangguan kesehatan mental yang akan diteliti  yaitu depresi, stress, dan gangguan kecemasan. Metode yang digunakan untuk analisa data yaitu menggunakan metode Certainty Factor, karena sesuai untuk pencarian fakta / hasil dalam proses diagnosa dalam menemukan nilai kebenaran. Dalam tahap pengujian UAT (User Acceptance Test)  dengan responden 15 orang mahasiswa dan pakar membuktikan kategori rata-rata yang baik hingga mencapai 91,55%, ini menunjukkan bahwa kinerja sistem yang dibuat telah memunuhi tujuan awal pembuatan.&lt;/p&gt;&quot;,&quot;issue&quot;:&quot;1&quot;,&quot;volume&quot;:&quot;12&quot;,&quot;container-title-short&quot;:&quot;&quot;},&quot;isTemporary&quot;:false},{&quot;id&quot;:&quot;0f1b8369-765c-3821-8e6f-de43543bd7d4&quot;,&quot;itemData&quot;:{&quot;type&quot;:&quot;thesis&quot;,&quot;id&quot;:&quot;0f1b8369-765c-3821-8e6f-de43543bd7d4&quot;,&quot;title&quot;:&quot;Sistem Pakar Diagnosa Mandiri Mental Illness (Gangguan Jiwa) Menggunakan Metode Kombinasi Certainty Factor Dan Forward Chaining Pada Remaja Berbasis Android&quot;,&quot;groupId&quot;:&quot;5d3d1151-c3fb-3f7b-bcf0-db626a6f9f8b&quot;,&quot;author&quot;:[{&quot;family&quot;:&quot;Dwi Rahmadani Ivan&quot;,&quot;given&quot;:&quot;Diana&quot;,&quot;parse-names&quot;:false,&quot;dropping-particle&quot;:&quot;&quot;,&quot;non-dropping-particle&quot;:&quot;&quot;}],&quot;accessed&quot;:{&quot;date-parts&quot;:[[2025,5,14]]},&quot;URL&quot;:&quot;http://repository.uinsu.ac.id/15556/&quot;,&quot;issued&quot;:{&quot;date-parts&quot;:[[2022]]},&quot;abstract&quot;:&quot;Mental Illness atau Gangguan jiwa merupakan suatu sindrom yang menggangu pola pikir atau psikologik yang mengganggu kegiatan disfungsi kesehariannya. Berdasarkan data yang terkumpul dalam profil kesehatan indonesia berhasil menunjukkan betapa tingginya orang yang menderita gangguan jiwa di Indonesia yang belum tertangani dengan baik. Sangat berbanding terbalik dengan jumlah psikolog dan psikater yang ada di Indonesia saat ini. Masyarakat seringkali bersetigma bahwa mental illness merupakan gangguan yang berada di luar nalar atau biasa disebut dengan hal mistis hingga masyarakat menanggap tabu untuk memeriksakan diri ke psikolog atau psikiater. Dalam penelitian ini menggunakan metode certainty factor dan forward chaining yaitu metode yang bekerja dalam ketidak pastian pakar yang sering kali seorang pakar menganalisa informasi yang ada dengan ketidak pastian. Pengkomputasian diagnosa gangguan mentall illness dapat membantu masyarakat dalam memahami kondisi jiwanya tanpa harus bertemu dengan psikolog dan psikater terlebih dahulu yang didalamnya mencakup 62 gejala dan 10 penyakit.&quot;,&quot;publisher&quot;:&quot;Universitas Islam Negeri Sumatera Utara Medan&quot;,&quot;container-title-short&quot;:&quot;&quot;},&quot;isTemporary&quot;:false},{&quot;id&quot;:&quot;fb7dcb8d-ab71-3345-b13b-60331209663d&quot;,&quot;itemData&quot;:{&quot;type&quot;:&quot;thesis&quot;,&quot;id&quot;:&quot;fb7dcb8d-ab71-3345-b13b-60331209663d&quot;,&quot;title&quot;:&quot;Pengembangan aplikasi skrining kesehatan mental&quot;,&quot;groupId&quot;:&quot;5d3d1151-c3fb-3f7b-bcf0-db626a6f9f8b&quot;,&quot;author&quot;:[{&quot;family&quot;:&quot;Khoirot&quot;,&quot;given&quot;:&quot;Umdatul&quot;,&quot;parse-names&quot;:false,&quot;dropping-particle&quot;:&quot;&quot;,&quot;non-dropping-particle&quot;:&quot;&quot;},{&quot;family&quot;:&quot;Astutik&quot;,&quot;given&quot;:&quot;Fuji&quot;,&quot;parse-names&quot;:false,&quot;dropping-particle&quot;:&quot;&quot;,&quot;non-dropping-particle&quot;:&quot;&quot;},{&quot;family&quot;:&quot;Furqon&quot;,&quot;given&quot;:&quot;M Arif&quot;,&quot;parse-names&quot;:false,&quot;dropping-particle&quot;:&quot;&quot;,&quot;non-dropping-particle&quot;:&quot;&quot;},{&quot;family&quot;:&quot;Suseno&quot;,&quot;given&quot;:&quot;Achsan&quot;,&quot;parse-names&quot;:false,&quot;dropping-particle&quot;:&quot;&quot;,&quot;non-dropping-particle&quot;:&quot;&quot;},{&quot;family&quot;:&quot;Alvasa&quot;,&quot;given&quot;:&quot;Bia&quot;,&quot;parse-names&quot;:false,&quot;dropping-particle&quot;:&quot;&quot;,&quot;non-dropping-particle&quot;:&quot;&quot;},{&quot;family&quot;:&quot;Nurdiansyah&quot;,&quot;given&quot;:&quot;&quot;,&quot;parse-names&quot;:false,&quot;dropping-particle&quot;:&quot;&quot;,&quot;non-dropping-particle&quot;:&quot;&quot;}],&quot;accessed&quot;:{&quot;date-parts&quot;:[[2025,5,14]]},&quot;URL&quot;:&quot;http://repository.uin-malang.ac.id/12963/&quot;,&quot;issued&quot;:{&quot;date-parts&quot;:[[2022]]},&quot;abstract&quot;:&quot;Penelitian ini bertujuan untuk mengembangkan aplikasi skrining kesehatan mental yang dapat membantu individu untuk mengenali gejala yang dialami dan mengurangi risiko gangguan kesehatan mental masyarakat. Metode yang digunakan adalah penelitian pengembangan menggunakan pendekatan ADDIE. Instrumen yang digunakan sebagai skiring adalah DASS 42. Hasil menunjukkan bahwa setelah melalui tahap pengembangan dan uji coba, aplikasi skrining kesehatan mental efektif untuk mengenali gejala-gejala awal gangguan kesehatan mental dan memungkinkan pengguna untuk mencatat gejala yang dialami secara berkala. Penelitian ini diharapkan dapat memberikan kontribusi dalam upaya pencegahan dan penanganan gangguan kesehatan mental dengan memanfaatkan teknologi informasi yang semakin canggih sehingga dapat di jangkau oleh masyarakat luas.&quot;,&quot;publisher&quot;:&quot;Universitas Islam Negeri Maulana Malik Ibrahim Malang&quot;,&quot;container-title-short&quot;:&quot;&quot;},&quot;isTemporary&quot;:false},{&quot;id&quot;:&quot;4e7e2fba-28ad-3217-8783-a7e03eba27ec&quot;,&quot;itemData&quot;:{&quot;type&quot;:&quot;article-journal&quot;,&quot;id&quot;:&quot;4e7e2fba-28ad-3217-8783-a7e03eba27ec&quot;,&quot;title&quot;:&quot;PENGARUH PSIKOEDUKASI DENGAN APLIKASI SDASI BERBASIS LAYANAN ANDROID TERHADAP TINGKAT DEPRESI, ANSIETAS DAN STRES PADA REMAJA&quot;,&quot;groupId&quot;:&quot;5d3d1151-c3fb-3f7b-bcf0-db626a6f9f8b&quot;,&quot;author&quot;:[{&quot;family&quot;:&quot;Effendi&quot;,&quot;given&quot;:&quot;Zulian&quot;,&quot;parse-names&quot;:false,&quot;dropping-particle&quot;:&quot;&quot;,&quot;non-dropping-particle&quot;:&quot;&quot;},{&quot;family&quot;:&quot;Maryatun&quot;,&quot;given&quot;:&quot;Sri&quot;,&quot;parse-names&quot;:false,&quot;dropping-particle&quot;:&quot;&quot;,&quot;non-dropping-particle&quot;:&quot;&quot;},{&quot;family&quot;:&quot;Herliawati&quot;,&quot;given&quot;:&quot;&quot;,&quot;parse-names&quot;:false,&quot;dropping-particle&quot;:&quot;&quot;,&quot;non-dropping-particle&quot;:&quot;&quot;}],&quot;container-title&quot;:&quot;Jurnal Keperawatan Sriwijaya&quot;,&quot;accessed&quot;:{&quot;date-parts&quot;:[[2025,5,14]]},&quot;DOI&quot;:&quot;10.32539/jks.v9i1.142&quot;,&quot;ISSN&quot;:&quot;2684-9712&quot;,&quot;URL&quot;:&quot;https://doi.org/10.32539/jks.v9i1.142&quot;,&quot;issued&quot;:{&quot;date-parts&quot;:[[2022,7,13]]},&quot;page&quot;:&quot;7-12&quot;,&quot;abstract&quot;:&quot;&lt;p&gt;Tujuan: Penelitian ini bertujuan untuk mengetahui untuk mengetahui pengaruh psikoedukasi melalui aplikasi SDASI terhadap tingkat depresi, ansietas dan stres pada remaja korban bullying. Metode: Penelitian ini menggunakan pendekatan quasi experiment dengan rancangan one grup pre-post test design. Jumlah responden sebanyak 30 remaja. Pengambilan sampel menggunakan purposive sampling. Pemberian edukasi diberikan secara berkelompok menggunakan media aplikasi android SDASI sebanyak dua kali pertemuan. Data dikumpulkan dengan menggunakan kuesioner pada pre test dan post test. Hasil: Hasil uji statistik dengan uji dependent t-Test menunjukkan bahwa terjadi penurunan skor sebelum dan sesudah dilakukan psikoedukasi melalui aplikasi SDASI dengan nilai p=0,001. Simpulan: Psikoedukasi melalui aplikasi SDASI secara signifikan dapat menurunkan tingkat depresi, ansietas dan stress pada remaja korban bullying.&lt;/p&gt;&quot;,&quot;issue&quot;:&quot;1&quot;,&quot;volume&quot;:&quot;9&quot;,&quot;container-title-short&quot;:&quot;&quot;},&quot;isTemporary&quot;:false},{&quot;id&quot;:&quot;f7442ae9-8f9b-3095-bf04-adbc974793bb&quot;,&quot;itemData&quot;:{&quot;type&quot;:&quot;article-journal&quot;,&quot;id&quot;:&quot;f7442ae9-8f9b-3095-bf04-adbc974793bb&quot;,&quot;title&quot;:&quot;Implementation of User Centered Design on Interface Design for Mental Health Selfcare Services&quot;,&quot;groupId&quot;:&quot;5d3d1151-c3fb-3f7b-bcf0-db626a6f9f8b&quot;,&quot;author&quot;:[{&quot;family&quot;:&quot;Pranata&quot;,&quot;given&quot;:&quot;Rizky Wira&quot;,&quot;parse-names&quot;:false,&quot;dropping-particle&quot;:&quot;&quot;,&quot;non-dropping-particle&quot;:&quot;&quot;},{&quot;family&quot;:&quot;Herdiani&quot;,&quot;given&quot;:&quot;Anisa&quot;,&quot;parse-names&quot;:false,&quot;dropping-particle&quot;:&quot;&quot;,&quot;non-dropping-particle&quot;:&quot;&quot;},{&quot;family&quot;:&quot;Hadikusuma&quot;,&quot;given&quot;:&quot;Aristyo&quot;,&quot;parse-names&quot;:false,&quot;dropping-particle&quot;:&quot;&quot;,&quot;non-dropping-particle&quot;:&quot;&quot;}],&quot;container-title&quot;:&quot;JURNAL MEDIA INFORMATIKA BUDIDARMA&quot;,&quot;accessed&quot;:{&quot;date-parts&quot;:[[2025,5,14]]},&quot;DOI&quot;:&quot;10.30865/mib.v6i4.4540&quot;,&quot;ISSN&quot;:&quot;2548-8368&quot;,&quot;URL&quot;:&quot;https://doi.org/10.30865/mib.v6i4.4540&quot;,&quot;issued&quot;:{&quot;date-parts&quot;:[[2022,10,25]]},&quot;page&quot;:&quot;1891&quot;,&quot;abstract&quot;:&quot;&lt;p&gt;Mental health is essential in performing maximum activities. During the COVID-19 pandemic that is spreading all over the world. Some activities are transformed into a new activity called \&quot;New Normal\&quot;. With these new activities, the level of mental health in Indonesia has deteriorated. WHO as a world health organization made a mental health pyramid that handling of every level of mental health. There are 4 levels, which are promotive, preventive, monitoring and identifying psychosocial services, and specialist services. In the results of observations and analysis, digital-based services in Indonesia prioritize levels 3 and 4, while levels 1 and 2 are still infrequent, and the application is still not perfectly weighted. This study will design a mental health application by emphasizing level 1 and 2 treatment, namely self-care and storytelling sessions using the User Centered Design method, and the results of the evaluation used the usability testing method and the usability scale system. With this research, potential users obtain an interface resolution with a mood tracker, self-care, and storytelling features that users desire. By helping the user to perceive the history of the condition, getting self-care and storytelling rooms according to the user's condition, and helping the user's condition to bolster up and not add to the burden of the user's condition. The outcome of the evaluation that has been done, results that the average user completed each task for 16.59 seconds, the average result is 0 miss click and 0 miss click page, and the results from the System Usability Scale are 81.51 with the \&quot;Excellent\&quot; category, with the composition of solutions provided to answer user problems.&lt;/p&gt;&quot;,&quot;issue&quot;:&quot;4&quot;,&quot;volume&quot;:&quot;6&quot;,&quot;container-title-short&quot;:&quot;&quot;},&quot;isTemporary&quot;:false},{&quot;id&quot;:&quot;6bccae5a-9820-3637-8bbc-3b3a9d92158b&quot;,&quot;itemData&quot;:{&quot;type&quot;:&quot;thesis&quot;,&quot;id&quot;:&quot;6bccae5a-9820-3637-8bbc-3b3a9d92158b&quot;,&quot;title&quot;:&quot;Aplikasi Relaxation (Yurelax) Untuk Menjaga Kesehatan Mental Pada Remaja Berbasis Android&quot;,&quot;groupId&quot;:&quot;5d3d1151-c3fb-3f7b-bcf0-db626a6f9f8b&quot;,&quot;author&quot;:[{&quot;family&quot;:&quot;Sari&quot;,&quot;given&quot;:&quot;Shindi Fatika&quot;,&quot;parse-names&quot;:false,&quot;dropping-particle&quot;:&quot;&quot;,&quot;non-dropping-particle&quot;:&quot;&quot;}],&quot;accessed&quot;:{&quot;date-parts&quot;:[[2025,5,14]]},&quot;URL&quot;:&quot;https://sipora.polije.ac.id/13081/&quot;,&quot;issued&quot;:{&quot;date-parts&quot;:[[2022]]},&quot;abstract&quot;:&quot;Berdasarkan data Riskesdas (Riset Kesehatan Dasar) 2018 menunjukkan bahwa, gangguan mental yang ditunjukkan dengan gejala depresi atau kecemasan pada remaja di usia 15 keatas mencapai sekitar 6,1% dari jumlah penduduk Indonesia, atau setara dengan 11 juta orang. Salah satu cara dalam menjaga kesehatan mental adalah dengan relaksasi. Relaksasi merupakan proses merilekskan otot-otot tubuh dan pikiran yang mengalami ketegangan agar tercapai kondisi yang nyaman (Akbar, 2019). Salah satu Teknik relaksasi adalah dengan meditasi. Dengan menggunakan meditasi dapat membuat tubuh dan pikiran menjadi segar, rileks dan berfikir positif yang pada akhirnya dapat menurunkan tingkat kecemasan, depresi dan stress (Tristaningrat, 2020). Selain meditasi, yoga juga dapat merelaksasi tubuh dan pikiran sehingga terasa lebih sehat, segar, rileks dan kesehatan mental tetap terjaga. Begitu juga dengan musik relaksasi, musik untuk relaksasi umumnya merupakan musik dengan tempo yang lambat dan instrumen melodik, sehingga membuat pendengar merasa lebih rileks, dan tenang. Maka solusi untuk mengatasi permasalahan tersebut dengan membuat aplikasi Relaksasi (YuRelax) sebagai media untuk menjaga kesehatan mental pada remaja. Pengembangan aplikasi ini menggunakan metode Waterfall. Dengan adanya aplikasi YuRelax pengguna mendapat berbagai panduan meditasi dan edukasi seputar kesehatan mental dengan berbagai tema, terdapat juga kumpulan musik relaksasi, serta panduan yoga yang disertai gambar animasi pada aplikasi ini, hal ini dapat membuat pengguna merasa lebih nyaman, rileks, tenang, berfikir positif, dapat mengontrol emosi dan sehat sehingga Kesehatan mental tetap terjaga. Selain itu pengguna juga dapat memantau mood atau suasana hati, dengan mencatatnya setiap hari, sehingga dapat melihat perubahan moodnya dari hari ke hari.&quot;,&quot;container-title-short&quot;:&quot;&quot;},&quot;isTemporary&quot;:false},{&quot;id&quot;:&quot;d3dcbe63-8844-3f04-93d9-08dc448c847e&quot;,&quot;itemData&quot;:{&quot;type&quot;:&quot;article-journal&quot;,&quot;id&quot;:&quot;d3dcbe63-8844-3f04-93d9-08dc448c847e&quot;,&quot;title&quot;:&quot;ANALISA UI/UX APLIKASI DIAGNOSA GANGGUAN DEPRESI MAYOR DAN GANGGUAN DEPRESI DISMITIK BERBASIS ANDROID&quot;,&quot;groupId&quot;:&quot;5d3d1151-c3fb-3f7b-bcf0-db626a6f9f8b&quot;,&quot;author&quot;:[{&quot;family&quot;:&quot;Pasifik&quot;,&quot;given&quot;:&quot;Rico Bagus&quot;,&quot;parse-names&quot;:false,&quot;dropping-particle&quot;:&quot;&quot;,&quot;non-dropping-particle&quot;:&quot;&quot;},{&quot;family&quot;:&quot;Basuki&quot;,&quot;given&quot;:&quot;Bambang Minto&quot;,&quot;parse-names&quot;:false,&quot;dropping-particle&quot;:&quot;&quot;,&quot;non-dropping-particle&quot;:&quot;&quot;},{&quot;family&quot;:&quot;Badri&quot;,&quot;given&quot;:&quot;Fawaidul&quot;,&quot;parse-names&quot;:false,&quot;dropping-particle&quot;:&quot;&quot;,&quot;non-dropping-particle&quot;:&quot;&quot;}],&quot;container-title&quot;:&quot;Science World Electro&quot;,&quot;accessed&quot;:{&quot;date-parts&quot;:[[2025,5,14]]},&quot;URL&quot;:&quot;https://jim.unisma.ac.id/index.php/jte/article/view/25333&quot;,&quot;issued&quot;:{&quot;date-parts&quot;:[[2024]]},&quot;abstract&quot;:&quot;Dalam era digital yang semakin maju, kehadiran aplikasi kesehatan mental menjadi semakin penting, terutama dalam mendiagnosa kondisi seperti depresi. Meskipun demikian, terdapat risiko besar terhadap fenomena diagnosa sendiri atau self-diagnose yang dapat mengakibatkan penanganan yang tidak tepat dan berbahaya bagi individu. Penelitian ini bertujuan untuk merancang dan mengembangkan sebuah aplikasi diagnostik depresi yang dapat mengurangi risiko self-diagnose melalui pendekatan berbasis teknologi yang akurat dan terintegrasi dengan profesional kesehatan mental. Aplikasi ini dirancang dengan beberapa fitur utama, termasuk kuesioner berbasis bukti yang divalidasi oleh psikolog klinis, dan rujukan langsung ke professional atau membuat janji temu dengan psikiater, aplikasi ini juga menyediakan edukasi tentang depresi dan artikel tentang depresi dan penangananya. Hasil pengujian awal menunjukkan bahwa aplikasi ini mampu memberikan penilaian yang lebih akurat dan mendorong pengguna untuk mencari bantuan profesional. Diharapkan dengan adanya aplikasi ini, dapat membantu mengurangi insiden self-diagnose yang salah dan memberikan dukungan yang lebih baik bagi individu yang mungkin menderita depresi. Penelitian ini berkontribusi dalam pengembangan solusi digital yang bertanggung jawab dan berbasis bukti untuk masalah kesehatan mental, sekaligus mempromosikan kolaborasi antara teknologi dan tenaga profesional kesehatan dalam memberikan perawatan yang optimal.&quot;,&quot;issue&quot;:&quot;5&quot;,&quot;volume&quot;:&quot;17&quot;,&quot;container-title-short&quot;:&quot;&quot;},&quot;isTemporary&quot;:false},{&quot;id&quot;:&quot;6b66b61a-bb24-378c-9463-ee1b1545fa83&quot;,&quot;itemData&quot;:{&quot;type&quot;:&quot;article-journal&quot;,&quot;id&quot;:&quot;6b66b61a-bb24-378c-9463-ee1b1545fa83&quot;,&quot;title&quot;:&quot;Analisis Kebutuhan dan Desain Berbasis Metode UX Journey untuk Pengembangan Aplikasi Terapi Mandiri bagi Individu dengan Gangguan Depresi&quot;,&quot;groupId&quot;:&quot;5d3d1151-c3fb-3f7b-bcf0-db626a6f9f8b&quot;,&quot;author&quot;:[{&quot;family&quot;:&quot;Gathayu&quot;,&quot;given&quot;:&quot;Muhammad&quot;,&quot;parse-names&quot;:false,&quot;dropping-particle&quot;:&quot;&quot;,&quot;non-dropping-particle&quot;:&quot;&quot;},{&quot;family&quot;:&quot;Kusuma&quot;,&quot;given&quot;:&quot;Wahyu Andhyka&quot;,&quot;parse-names&quot;:false,&quot;dropping-particle&quot;:&quot;&quot;,&quot;non-dropping-particle&quot;:&quot;&quot;},{&quot;family&quot;:&quot;Wiyono&quot;,&quot;given&quot;:&quot;Briansyah Setio&quot;,&quot;parse-names&quot;:false,&quot;dropping-particle&quot;:&quot;&quot;,&quot;non-dropping-particle&quot;:&quot;&quot;}],&quot;container-title&quot;:&quot;Jurnal Repositor&quot;,&quot;accessed&quot;:{&quot;date-parts&quot;:[[2025,5,14]]},&quot;DOI&quot;:&quot;10.22219/repositor.v6i3.32453&quot;,&quot;ISSN&quot;:&quot;2716-1382&quot;,&quot;URL&quot;:&quot;https://doi.org/10.22219/repositor.v6i3.32453&quot;,&quot;issued&quot;:{&quot;date-parts&quot;:[[2024,7,22]]},&quot;abstract&quot;:&quot;&lt;p&gt;Prevalensi depresi di Indonesia, pada dewasa muda melaporkan prevalensi nasional sebesar 29,3% untuk depresi sedang dan 8% untuk depresi berat. Sedangkan, pada penelitian lain, pada orang dewasa yang lebih tua melaporkan prevalensi depresi sebesar 16,3%. Pada survei lain, pada saat Indonesia mengalami covid menunjukkan angka depresi meningkat 12 juta orang berusia di atas 15 tahun mengalami depresi. Namun Tingkat pengobatan depresi hanya mencapai 9% dan ketersediaan aplikasi terapi mandiri yang sesuai dengan kebutuhan individu depresi mungkin masih terbatas. Metode penelitian yang digunakan adalah UX Journey, untuk menemukan kebutuhan dan harapan pengguna dengan fokus mengembangkan fitur-fitur yang sesuai dengan kebutuhan pengguna. Hasil penelitian menunjukkan peningkatan signifikan dalam tiga variabel variable behaviour dengan variabel pertama meningkat dari 55% menjadi 70%, variabel kedua meningkat dari 56% menjadi 77% dan variabel ketiga meningkat dari 73% menjadi 76% penelitian ini memberikan kontribusi positif dalam meningkatkan pengalaman pengguna. selain itu, dilakukan validitas dengan menggunakan acceptance criteria yang menghasilkan tervalidasi dan memenuhi kebutuhan pengguna dan verifikasi dengan menggunakan daftar periksa dan metrik persyaratan yang menghasilkan terverifikasi dari dua perspektif yaitu peneliti dan empat rekan sejawat. Dari analisa kebutuhan dan solusi desain yang dihasilkan pada penelitian ini, kedua hal tersebut dapat memberikan variabel apa saja yang dapat meningkatkan pengalaman pengguna.&lt;/p&gt;&quot;,&quot;issue&quot;:&quot;3&quot;,&quot;volume&quot;:&quot;6&quot;,&quot;container-title-short&quot;:&quot;&quot;},&quot;isTemporary&quot;:false},{&quot;id&quot;:&quot;f06a716e-ebef-3efd-a4cc-a7aa3ca002dc&quot;,&quot;itemData&quot;:{&quot;type&quot;:&quot;article-journal&quot;,&quot;id&quot;:&quot;f06a716e-ebef-3efd-a4cc-a7aa3ca002dc&quot;,&quot;title&quot;:&quot;RANCANG BANGUN APLIKASI PENDETEKSI WAJAH TERHADAP KESEHATAN MENTAL PADA REMAJA&quot;,&quot;groupId&quot;:&quot;5d3d1151-c3fb-3f7b-bcf0-db626a6f9f8b&quot;,&quot;author&quot;:[{&quot;family&quot;:&quot;Marsujitullah&quot;,&quot;given&quot;:&quot;&quot;,&quot;parse-names&quot;:false,&quot;dropping-particle&quot;:&quot;&quot;,&quot;non-dropping-particle&quot;:&quot;&quot;},{&quot;family&quot;:&quot;Sariman&quot;,&quot;given&quot;:&quot;Farid&quot;,&quot;parse-names&quot;:false,&quot;dropping-particle&quot;:&quot;&quot;,&quot;non-dropping-particle&quot;:&quot;&quot;},{&quot;family&quot;:&quot;Rahangmetan&quot;,&quot;given&quot;:&quot;Klemens A&quot;,&quot;parse-names&quot;:false,&quot;dropping-particle&quot;:&quot;&quot;,&quot;non-dropping-particle&quot;:&quot;&quot;},{&quot;family&quot;:&quot;Akbar&quot;,&quot;given&quot;:&quot;Muh.&quot;,&quot;parse-names&quot;:false,&quot;dropping-particle&quot;:&quot;&quot;,&quot;non-dropping-particle&quot;:&quot;&quot;},{&quot;family&quot;:&quot;Kakerissa&quot;,&quot;given&quot;:&quot;Yance&quot;,&quot;parse-names&quot;:false,&quot;dropping-particle&quot;:&quot;&quot;,&quot;non-dropping-particle&quot;:&quot;&quot;}],&quot;container-title&quot;:&quot;Musamus Journal of Research Information and Communication Technology&quot;,&quot;accessed&quot;:{&quot;date-parts&quot;:[[2025,5,14]]},&quot;URL&quot;:&quot;https://ejournal.unmus.ac.id/index.php/mjrict/article/view/4598&quot;,&quot;issued&quot;:{&quot;date-parts&quot;:[[2022]]},&quot;abstract&quot;:&quot;Pengenalan ekspresi wajah sangat penting sebelum pengguna melakukan konsultasi kesehatan\nmental. Pengenalan wajah didasarkan pada identifikasi dan pengenalan citra manusia pada gambar\nterlepas dari posisi, ukuran dan kondisi. Pengenalan wajah menjadi faktor penting dalam\npembuatan rancang bangun aplikasi pendeteksi wajah terhadap kesehatan mental pada remaja.\nMenjaga kesehatan mental remaja menjadi hal yang perlu diperhatikan, karna gangguan mental\ndapat memepengaruhi seseorang dalam beraktivitas dan dapat menurunkan kondisi fisik.\nPenelitian yang berjudul â€œPerancangan Aplikasi Pendeteksi Wajah Terhadap Kesehatan Mental\nPada Remajaâ€ nantinya akan dibuat sebuah aplikasi dengan menggunakan metode Viola-Jones.\nMetode ini akan medeteksi pengguna dimana nanti akan diinput kedalam suatu aplikasi yang\nakan membaca ekspresi wajah dan mendiagnosa gangguan kejiwaan dari pengguna aplikasi ini.&quot;,&quot;issue&quot;:&quot;2&quot;,&quot;volume&quot;:&quot;4&quot;,&quot;container-title-short&quot;:&quot;&quot;},&quot;isTemporary&quot;:false},{&quot;id&quot;:&quot;6d5d2480-13ba-3504-ba5c-96c53d77612b&quot;,&quot;itemData&quot;:{&quot;type&quot;:&quot;article-journal&quot;,&quot;id&quot;:&quot;6d5d2480-13ba-3504-ba5c-96c53d77612b&quot;,&quot;title&quot;:&quot;Android-based Application for Depression, Anxiety, and Stress Screening&quot;,&quot;groupId&quot;:&quot;5d3d1151-c3fb-3f7b-bcf0-db626a6f9f8b&quot;,&quot;author&quot;:[{&quot;family&quot;:&quot;Endriyani&quot;,&quot;given&quot;:&quot;Sri&quot;,&quot;parse-names&quot;:false,&quot;dropping-particle&quot;:&quot;&quot;,&quot;non-dropping-particle&quot;:&quot;&quot;},{&quot;family&quot;:&quot;Susanti&quot;,&quot;given&quot;:&quot;Eva&quot;,&quot;parse-names&quot;:false,&quot;dropping-particle&quot;:&quot;&quot;,&quot;non-dropping-particle&quot;:&quot;&quot;}],&quot;container-title&quot;:&quot;Poltekita: Jurnal Ilmu Kesehatan&quot;,&quot;accessed&quot;:{&quot;date-parts&quot;:[[2025,5,14]]},&quot;URL&quot;:&quot;https://jurnal.poltekkespalu.ac.id/index.php/JIK/article/view/3169&quot;,&quot;issued&quot;:{&quot;date-parts&quot;:[[2024,2]]},&quot;page&quot;:&quot;1486-1492&quot;,&quot;abstract&quot;:&quot;The escalating issue of emotional and mental disorders, such as stress, anxiety, and depression, necessitates proactive measures to anticipate adverse effects on individuals experiencing them. One of the ways is by implementing a screening method. An android-based screening application can offer immediate feedback about an individual’s mental health condition. This study employs a research and development approach encompassing the preliminary study, model development, and model validation. The outcome of this study was an initial design for an Android-based screening application, DeAs Care, which aims to measure the levels of depression, anxiety, and stress in individuals. The DeAs Care application underwent evaluation by a group of 15 adolescent participants, all between the ages of 18 and 20. The assessment employed a Likert scale with a range of 1 to 5. The results indicated an overall satisfaction rate of 85%, corresponding to a ‘Very Good’ rating. The application was utilized on 216 adolescent participants to evaluate their levels of depression, anxiety, and stress. The assessment results indicate that the subsequent proportions of participants received a diagnosis of depression: 21% of the participants reported experiencing mild depression, while 20% showed moderate depression. Additionally, 8% had severe depression, and 6% had extremely severe depression. The other 45% of participants indicated they were in normal conditions. As for the participants' anxiety levels, the results of the assessments showed that 15% of them had mild anxiety, 31% had moderate anxiety, 23% had severe anxiety, 16% had extremely severe anxiety, and 15% of them were in a normal state. Furthermore, concerning stress levels, the study found that 20% of individuals had mild stress, 24% experienced moderate stress, 6% experienced severe stress, and 1% experienced extremely high stress levels. In comparison, the remaining 50% reported normal stress levels. The findings indicate that utilizing the DeAs Care Android application for screening adolescent mental health is an effective method for preventing issues related to mental and emotional disorders through self-assessment.&quot;,&quot;issue&quot;:&quot;4&quot;,&quot;volume&quot;:&quot;17&quot;,&quot;container-title-short&quot;:&quot;&quot;},&quot;isTemporary&quot;:false},{&quot;id&quot;:&quot;58a5a550-d3d5-3c63-8893-418695784bff&quot;,&quot;itemData&quot;:{&quot;type&quot;:&quot;article-journal&quot;,&quot;id&quot;:&quot;58a5a550-d3d5-3c63-8893-418695784bff&quot;,&quot;title&quot;:&quot;Kombinasi Metode Certainty Factor dan Forward Chaining Dalam Sistem Pakar Diagnosis Mandiri Mental Illness&quot;,&quot;groupId&quot;:&quot;5d3d1151-c3fb-3f7b-bcf0-db626a6f9f8b&quot;,&quot;author&quot;:[{&quot;family&quot;:&quot;Diana&quot;,&quot;given&quot;:&quot;Dwi Rahmadani Ivan&quot;,&quot;parse-names&quot;:false,&quot;dropping-particle&quot;:&quot;&quot;,&quot;non-dropping-particle&quot;:&quot;&quot;},{&quot;family&quot;:&quot;Samsudin&quot;,&quot;given&quot;:&quot;&quot;,&quot;parse-names&quot;:false,&quot;dropping-particle&quot;:&quot;&quot;,&quot;non-dropping-particle&quot;:&quot;&quot;},{&quot;family&quot;:&quot;Irawan&quot;,&quot;given&quot;:&quot;Muhammad Dedi&quot;,&quot;parse-names&quot;:false,&quot;dropping-particle&quot;:&quot;&quot;,&quot;non-dropping-particle&quot;:&quot;&quot;}],&quot;container-title&quot;:&quot;Jurnal Ilmiah Teknik Informatika dan Sistem Informasi&quot;,&quot;accessed&quot;:{&quot;date-parts&quot;:[[2025,5,14]]},&quot;URL&quot;:&quot;https://ojs.stmik-banjarbaru.ac.id/index.php/jutisi/article/view/1380/891&quot;,&quot;issued&quot;:{&quot;date-parts&quot;:[[2023]]},&quot;page&quot;:&quot;1427-1438&quot;,&quot;abstract&quot;:&quot;Penyakit mental atau gangguan kejiwaan adalah sindrom yang mengganggu pola pikir atau\npsikologi seseorang, menyebabkan disfungsi aktivitas sehari-hari. Data yang dikumpulkan\ndalam profil kesehatan Indonesia menunjukkan tingginya prevalensi gangguan jiwa yang tidak\ndiobati. Ini sangat kontras dengan jumlah psikolog dan psikiater yang tersedia di negara ini.\nStigma masyarakat terhadap gangguan jiwa menyebabkan banyak yang menganggapnya\nsebagai hal mistis dan enggan memeriksakan diri. Penelitian ini menggunakan metode certainty\nfactor dan forward chaining untuk mengatasi ketidakpastian dalam menganalisis informasi dari\npakar. Aplikasi yang dibangun berbasis android yang akan memudahkan pasien dalam\nmengakses dan mendiagnosa penyakit yang diderita. Dengan penghitungan diagnosa mental\nillness yang melibatkan 62 gejala dan 10 penyakit, kombinasi metode certainty factor dan\nforward chaining menghasilkan nilai akurasi sistem dan pakar yang sama. Hal ini menunjukkan\nkeefektifan kedua pendekatan tersebut jika digabungkan.&quot;,&quot;issue&quot;:&quot;3&quot;,&quot;volume&quot;:&quot;12&quot;,&quot;container-title-short&quot;:&quot;&quot;},&quot;isTemporary&quot;:false},{&quot;id&quot;:&quot;be1e9dd6-4df6-38fd-9787-cd73e298f0c7&quot;,&quot;itemData&quot;:{&quot;type&quot;:&quot;article-journal&quot;,&quot;id&quot;:&quot;be1e9dd6-4df6-38fd-9787-cd73e298f0c7&quot;,&quot;title&quot;:&quot;SISTEM PAKAR GANGGUAN DEPRESI PADA ANAK&quot;,&quot;groupId&quot;:&quot;5d3d1151-c3fb-3f7b-bcf0-db626a6f9f8b&quot;,&quot;author&quot;:[{&quot;family&quot;:&quot;Maharani&quot;,&quot;given&quot;:&quot;Aldila&quot;,&quot;parse-names&quot;:false,&quot;dropping-particle&quot;:&quot;&quot;,&quot;non-dropping-particle&quot;:&quot;&quot;},{&quot;family&quot;:&quot;Nilma&quot;,&quot;given&quot;:&quot;Nilma&quot;,&quot;parse-names&quot;:false,&quot;dropping-particle&quot;:&quot;&quot;,&quot;non-dropping-particle&quot;:&quot;&quot;},{&quot;family&quot;:&quot;Irawan&quot;,&quot;given&quot;:&quot;Ari&quot;,&quot;parse-names&quot;:false,&quot;dropping-particle&quot;:&quot;&quot;,&quot;non-dropping-particle&quot;:&quot;&quot;}],&quot;container-title&quot;:&quot;NUANSA INFORMATIKA&quot;,&quot;accessed&quot;:{&quot;date-parts&quot;:[[2025,5,14]]},&quot;DOI&quot;:&quot;10.25134/nuansa.v15i1.3418&quot;,&quot;ISSN&quot;:&quot;2614-5405&quot;,&quot;URL&quot;:&quot;https://journal.uniku.ac.id/index.php/ilkom/article/view/3418&quot;,&quot;issued&quot;:{&quot;date-parts&quot;:[[2021,1,18]]},&quot;page&quot;:&quot;1&quot;,&quot;abstract&quot;:&quot;&lt;p&gt;Sistem pakar merupakan salah satu aplikasi dari kecerdasan buatan (Artificial Intelegence). Tujuan dari sistem pakar bukan untuk menggantikan posisi seorang pakar tetapi lebih menginformasikan dan memasyaraktkan pengetahuan dari seorang pakar. Gangguan psikologi pada anak banyak yang kurang disadari oleh orang tua dan pengajar yang menyebabkan terlambatnya penanganan pada anak. Tujuan dari penelitian dan dibuatnya aplikasi ini untuk membantu pengguna mendapatkan informasi mengenai gejala-gejala awal pada gangguan psikologis dan membantu mendiagnosa gangguan psikologi anak lebih awal. Aplikasi sistem pakar ini menggunakan Java sebagai Bahasa pemrograman dan menggunakan metode forward chaining. Sistem pakar ini mampu membantu dan mempermudah pengguna dalam memperoleh informasi gangguan psikologi pada anak khususnya mengenai depresi (depresi mayor, depresi persisten, gangguan bipolar dan depresi psikotis).&lt;/p&gt;&quot;,&quot;issue&quot;:&quot;1&quot;,&quot;volume&quot;:&quot;15&quot;,&quot;container-title-short&quot;:&quot;&quot;},&quot;isTemporary&quot;:false}]},{&quot;citationID&quot;:&quot;MENDELEY_CITATION_06083ad9-e7e2-4e97-a414-e08df94d089b&quot;,&quot;properties&quot;:{&quot;noteIndex&quot;:0},&quot;isEdited&quot;:false,&quot;manualOverride&quot;:{&quot;isManuallyOverridden&quot;:false,&quot;citeprocText&quot;:&quot;[93]&quot;,&quot;manualOverrideText&quot;:&quot;&quot;},&quot;citationTag&quot;:&quot;MENDELEY_CITATION_v3_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&quot;,&quot;citationItems&quot;:[{&quot;id&quot;:&quot;0858dd0c-a32e-3907-a4db-8fc6bfebdc93&quot;,&quot;itemData&quot;:{&quot;type&quot;:&quot;article-journal&quot;,&quot;id&quot;:&quot;0858dd0c-a32e-3907-a4db-8fc6bfebdc93&quot;,&quot;title&quot;:&quot;Mental health literacy measures evaluating knowledge, attitudes and help-seeking: a scoping review&quot;,&quot;author&quot;:[{&quot;family&quot;:&quot;Wei&quot;,&quot;given&quot;:&quot;Yifeng&quot;,&quot;parse-names&quot;:false,&quot;dropping-particle&quot;:&quot;&quot;,&quot;non-dropping-particle&quot;:&quot;&quot;},{&quot;family&quot;:&quot;McGrath&quot;,&quot;given&quot;:&quot;Patrick J.&quot;,&quot;parse-names&quot;:false,&quot;dropping-particle&quot;:&quot;&quot;,&quot;non-dropping-particle&quot;:&quot;&quot;},{&quot;family&quot;:&quot;Hayden&quot;,&quot;given&quot;:&quot;Jill&quot;,&quot;parse-names&quot;:false,&quot;dropping-particle&quot;:&quot;&quot;,&quot;non-dropping-particle&quot;:&quot;&quot;},{&quot;family&quot;:&quot;Kutcher&quot;,&quot;given&quot;:&quot;Stan&quot;,&quot;parse-names&quot;:false,&quot;dropping-particle&quot;:&quot;&quot;,&quot;non-dropping-particle&quot;:&quot;&quot;}],&quot;container-title&quot;:&quot;BMC Psychiatry&quot;,&quot;container-title-short&quot;:&quot;BMC Psychiatry&quot;,&quot;DOI&quot;:&quot;10.1186/s12888-015-0681-9&quot;,&quot;ISSN&quot;:&quot;1471-244X&quot;,&quot;issued&quot;:{&quot;date-parts&quot;:[[2015,12,17]]},&quot;page&quot;:&quot;291&quot;,&quot;issue&quot;:&quot;1&quot;,&quot;volume&quot;:&quot;15&quot;},&quot;isTemporary&quot;:false,&quot;suppress-author&quot;:false,&quot;composite&quot;:false,&quot;author-only&quot;:false}]},{&quot;citationID&quot;:&quot;MENDELEY_CITATION_3158d268-5d52-4b22-a447-d23714518d4f&quot;,&quot;properties&quot;:{&quot;noteIndex&quot;:0},&quot;isEdited&quot;:false,&quot;manualOverride&quot;:{&quot;isManuallyOverridden&quot;:false,&quot;citeprocText&quot;:&quot;[93]&quot;,&quot;manualOverrideText&quot;:&quot;&quot;},&quot;citationTag&quot;:&quot;MENDELEY_CITATION_v3_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&quot;,&quot;citationItems&quot;:[{&quot;id&quot;:&quot;0858dd0c-a32e-3907-a4db-8fc6bfebdc93&quot;,&quot;itemData&quot;:{&quot;type&quot;:&quot;article-journal&quot;,&quot;id&quot;:&quot;0858dd0c-a32e-3907-a4db-8fc6bfebdc93&quot;,&quot;title&quot;:&quot;Mental health literacy measures evaluating knowledge, attitudes and help-seeking: a scoping review&quot;,&quot;author&quot;:[{&quot;family&quot;:&quot;Wei&quot;,&quot;given&quot;:&quot;Yifeng&quot;,&quot;parse-names&quot;:false,&quot;dropping-particle&quot;:&quot;&quot;,&quot;non-dropping-particle&quot;:&quot;&quot;},{&quot;family&quot;:&quot;McGrath&quot;,&quot;given&quot;:&quot;Patrick J.&quot;,&quot;parse-names&quot;:false,&quot;dropping-particle&quot;:&quot;&quot;,&quot;non-dropping-particle&quot;:&quot;&quot;},{&quot;family&quot;:&quot;Hayden&quot;,&quot;given&quot;:&quot;Jill&quot;,&quot;parse-names&quot;:false,&quot;dropping-particle&quot;:&quot;&quot;,&quot;non-dropping-particle&quot;:&quot;&quot;},{&quot;family&quot;:&quot;Kutcher&quot;,&quot;given&quot;:&quot;Stan&quot;,&quot;parse-names&quot;:false,&quot;dropping-particle&quot;:&quot;&quot;,&quot;non-dropping-particle&quot;:&quot;&quot;}],&quot;container-title&quot;:&quot;BMC Psychiatry&quot;,&quot;container-title-short&quot;:&quot;BMC Psychiatry&quot;,&quot;DOI&quot;:&quot;10.1186/s12888-015-0681-9&quot;,&quot;ISSN&quot;:&quot;1471-244X&quot;,&quot;issued&quot;:{&quot;date-parts&quot;:[[2015,12,17]]},&quot;page&quot;:&quot;291&quot;,&quot;issue&quot;:&quot;1&quot;,&quot;volume&quot;:&quot;15&quot;},&quot;isTemporary&quot;:false,&quot;suppress-author&quot;:false,&quot;composite&quot;:false,&quot;author-only&quot;:false}]},{&quot;citationID&quot;:&quot;MENDELEY_CITATION_4eafc0f6-5f6d-4583-85c7-14ff0d4b657e&quot;,&quot;properties&quot;:{&quot;noteIndex&quot;:0},&quot;isEdited&quot;:false,&quot;manualOverride&quot;:{&quot;isManuallyOverridden&quot;:false,&quot;citeprocText&quot;:&quot;[93]&quot;,&quot;manualOverrideText&quot;:&quot;&quot;},&quot;citationTag&quot;:&quot;MENDELEY_CITATION_v3_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&quot;,&quot;citationItems&quot;:[{&quot;id&quot;:&quot;0858dd0c-a32e-3907-a4db-8fc6bfebdc93&quot;,&quot;itemData&quot;:{&quot;type&quot;:&quot;article-journal&quot;,&quot;id&quot;:&quot;0858dd0c-a32e-3907-a4db-8fc6bfebdc93&quot;,&quot;title&quot;:&quot;Mental health literacy measures evaluating knowledge, attitudes and help-seeking: a scoping review&quot;,&quot;author&quot;:[{&quot;family&quot;:&quot;Wei&quot;,&quot;given&quot;:&quot;Yifeng&quot;,&quot;parse-names&quot;:false,&quot;dropping-particle&quot;:&quot;&quot;,&quot;non-dropping-particle&quot;:&quot;&quot;},{&quot;family&quot;:&quot;McGrath&quot;,&quot;given&quot;:&quot;Patrick J.&quot;,&quot;parse-names&quot;:false,&quot;dropping-particle&quot;:&quot;&quot;,&quot;non-dropping-particle&quot;:&quot;&quot;},{&quot;family&quot;:&quot;Hayden&quot;,&quot;given&quot;:&quot;Jill&quot;,&quot;parse-names&quot;:false,&quot;dropping-particle&quot;:&quot;&quot;,&quot;non-dropping-particle&quot;:&quot;&quot;},{&quot;family&quot;:&quot;Kutcher&quot;,&quot;given&quot;:&quot;Stan&quot;,&quot;parse-names&quot;:false,&quot;dropping-particle&quot;:&quot;&quot;,&quot;non-dropping-particle&quot;:&quot;&quot;}],&quot;container-title&quot;:&quot;BMC Psychiatry&quot;,&quot;container-title-short&quot;:&quot;BMC Psychiatry&quot;,&quot;DOI&quot;:&quot;10.1186/s12888-015-0681-9&quot;,&quot;ISSN&quot;:&quot;1471-244X&quot;,&quot;issued&quot;:{&quot;date-parts&quot;:[[2015,12,17]]},&quot;page&quot;:&quot;291&quot;,&quot;issue&quot;:&quot;1&quot;,&quot;volume&quot;:&quot;15&quot;},&quot;isTemporary&quot;:false,&quot;suppress-author&quot;:false,&quot;composite&quot;:false,&quot;author-only&quot;:false}]},{&quot;citationID&quot;:&quot;MENDELEY_CITATION_c5fc5d25-d883-432b-bc86-9a1b544e6651&quot;,&quot;properties&quot;:{&quot;noteIndex&quot;:0},&quot;isEdited&quot;:false,&quot;manualOverride&quot;:{&quot;isManuallyOverridden&quot;:false,&quot;citeprocText&quot;:&quot;[93]&quot;,&quot;manualOverrideText&quot;:&quot;&quot;},&quot;citationTag&quot;:&quot;MENDELEY_CITATION_v3_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&quot;,&quot;citationItems&quot;:[{&quot;id&quot;:&quot;0858dd0c-a32e-3907-a4db-8fc6bfebdc93&quot;,&quot;itemData&quot;:{&quot;type&quot;:&quot;article-journal&quot;,&quot;id&quot;:&quot;0858dd0c-a32e-3907-a4db-8fc6bfebdc93&quot;,&quot;title&quot;:&quot;Mental health literacy measures evaluating knowledge, attitudes and help-seeking: a scoping review&quot;,&quot;author&quot;:[{&quot;family&quot;:&quot;Wei&quot;,&quot;given&quot;:&quot;Yifeng&quot;,&quot;parse-names&quot;:false,&quot;dropping-particle&quot;:&quot;&quot;,&quot;non-dropping-particle&quot;:&quot;&quot;},{&quot;family&quot;:&quot;McGrath&quot;,&quot;given&quot;:&quot;Patrick J.&quot;,&quot;parse-names&quot;:false,&quot;dropping-particle&quot;:&quot;&quot;,&quot;non-dropping-particle&quot;:&quot;&quot;},{&quot;family&quot;:&quot;Hayden&quot;,&quot;given&quot;:&quot;Jill&quot;,&quot;parse-names&quot;:false,&quot;dropping-particle&quot;:&quot;&quot;,&quot;non-dropping-particle&quot;:&quot;&quot;},{&quot;family&quot;:&quot;Kutcher&quot;,&quot;given&quot;:&quot;Stan&quot;,&quot;parse-names&quot;:false,&quot;dropping-particle&quot;:&quot;&quot;,&quot;non-dropping-particle&quot;:&quot;&quot;}],&quot;container-title&quot;:&quot;BMC Psychiatry&quot;,&quot;container-title-short&quot;:&quot;BMC Psychiatry&quot;,&quot;DOI&quot;:&quot;10.1186/s12888-015-0681-9&quot;,&quot;ISSN&quot;:&quot;1471-244X&quot;,&quot;issued&quot;:{&quot;date-parts&quot;:[[2015,12,17]]},&quot;page&quot;:&quot;291&quot;,&quot;issue&quot;:&quot;1&quot;,&quot;volume&quot;:&quot;15&quot;},&quot;isTemporary&quot;:false,&quot;suppress-author&quot;:false,&quot;composite&quot;:false,&quot;author-only&quot;:false}]},{&quot;citationID&quot;:&quot;MENDELEY_CITATION_4dc94e2a-9180-4d96-a17a-6517b7015b99&quot;,&quot;properties&quot;:{&quot;noteIndex&quot;:0},&quot;isEdited&quot;:false,&quot;manualOverride&quot;:{&quot;isManuallyOverridden&quot;:false,&quot;citeprocText&quot;:&quot;[93]&quot;,&quot;manualOverrideText&quot;:&quot;&quot;},&quot;citationTag&quot;:&quot;MENDELEY_CITATION_v3_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&quot;,&quot;citationItems&quot;:[{&quot;id&quot;:&quot;0858dd0c-a32e-3907-a4db-8fc6bfebdc93&quot;,&quot;itemData&quot;:{&quot;type&quot;:&quot;article-journal&quot;,&quot;id&quot;:&quot;0858dd0c-a32e-3907-a4db-8fc6bfebdc93&quot;,&quot;title&quot;:&quot;Mental health literacy measures evaluating knowledge, attitudes and help-seeking: a scoping review&quot;,&quot;author&quot;:[{&quot;family&quot;:&quot;Wei&quot;,&quot;given&quot;:&quot;Yifeng&quot;,&quot;parse-names&quot;:false,&quot;dropping-particle&quot;:&quot;&quot;,&quot;non-dropping-particle&quot;:&quot;&quot;},{&quot;family&quot;:&quot;McGrath&quot;,&quot;given&quot;:&quot;Patrick J.&quot;,&quot;parse-names&quot;:false,&quot;dropping-particle&quot;:&quot;&quot;,&quot;non-dropping-particle&quot;:&quot;&quot;},{&quot;family&quot;:&quot;Hayden&quot;,&quot;given&quot;:&quot;Jill&quot;,&quot;parse-names&quot;:false,&quot;dropping-particle&quot;:&quot;&quot;,&quot;non-dropping-particle&quot;:&quot;&quot;},{&quot;family&quot;:&quot;Kutcher&quot;,&quot;given&quot;:&quot;Stan&quot;,&quot;parse-names&quot;:false,&quot;dropping-particle&quot;:&quot;&quot;,&quot;non-dropping-particle&quot;:&quot;&quot;}],&quot;container-title&quot;:&quot;BMC Psychiatry&quot;,&quot;container-title-short&quot;:&quot;BMC Psychiatry&quot;,&quot;DOI&quot;:&quot;10.1186/s12888-015-0681-9&quot;,&quot;ISSN&quot;:&quot;1471-244X&quot;,&quot;issued&quot;:{&quot;date-parts&quot;:[[2015,12,17]]},&quot;page&quot;:&quot;291&quot;,&quot;issue&quot;:&quot;1&quot;,&quot;volume&quot;:&quot;15&quot;},&quot;isTemporary&quot;:false,&quot;suppress-author&quot;:false,&quot;composite&quot;:false,&quot;author-only&quot;:false}]},{&quot;citationID&quot;:&quot;MENDELEY_CITATION_8d451afa-26f0-4abb-bf8c-269b39ed7dc7&quot;,&quot;properties&quot;:{&quot;noteIndex&quot;:0},&quot;isEdited&quot;:false,&quot;manualOverride&quot;:{&quot;isManuallyOverridden&quot;:false,&quot;citeprocText&quot;:&quot;[94]&quot;,&quot;manualOverrideText&quot;:&quot;&quot;},&quot;citationTag&quot;:&quot;MENDELEY_CITATION_v3_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&quot;,&quot;citationItems&quot;:[{&quot;id&quot;:&quot;60e31fe7-6168-3e41-b961-1a82b3bd9219&quot;,&quot;itemData&quot;:{&quot;type&quot;:&quot;article-journal&quot;,&quot;id&quot;:&quot;60e31fe7-6168-3e41-b961-1a82b3bd9219&quot;,&quot;title&quot;:&quot;The Importance of User Segmentation for Designing Digital Therapy for Adolescent Mental Health: Findings From Scoping Processes&quot;,&quot;author&quot;:[{&quot;family&quot;:&quot;Fleming&quot;,&quot;given&quot;:&quot;Theresa&quot;,&quot;parse-names&quot;:false,&quot;dropping-particle&quot;:&quot;&quot;,&quot;non-dropping-particle&quot;:&quot;&quot;},{&quot;family&quot;:&quot;Merry&quot;,&quot;given&quot;:&quot;Sally&quot;,&quot;parse-names&quot;:false,&quot;dropping-particle&quot;:&quot;&quot;,&quot;non-dropping-particle&quot;:&quot;&quot;},{&quot;family&quot;:&quot;Stasiak&quot;,&quot;given&quot;:&quot;Karolina&quot;,&quot;parse-names&quot;:false,&quot;dropping-particle&quot;:&quot;&quot;,&quot;non-dropping-particle&quot;:&quot;&quot;},{&quot;family&quot;:&quot;Hopkins&quot;,&quot;given&quot;:&quot;Sarah&quot;,&quot;parse-names&quot;:false,&quot;dropping-particle&quot;:&quot;&quot;,&quot;non-dropping-particle&quot;:&quot;&quot;},{&quot;family&quot;:&quot;Patolo&quot;,&quot;given&quot;:&quot;Tony&quot;,&quot;parse-names&quot;:false,&quot;dropping-particle&quot;:&quot;&quot;,&quot;non-dropping-particle&quot;:&quot;&quot;},{&quot;family&quot;:&quot;Ruru&quot;,&quot;given&quot;:&quot;Stacey&quot;,&quot;parse-names&quot;:false,&quot;dropping-particle&quot;:&quot;&quot;,&quot;non-dropping-particle&quot;:&quot;&quot;},{&quot;family&quot;:&quot;Latu&quot;,&quot;given&quot;:&quot;Manusiu&quot;,&quot;parse-names&quot;:false,&quot;dropping-particle&quot;:&quot;&quot;,&quot;non-dropping-particle&quot;:&quot;&quot;},{&quot;family&quot;:&quot;Shepherd&quot;,&quot;given&quot;:&quot;Matthew&quot;,&quot;parse-names&quot;:false,&quot;dropping-particle&quot;:&quot;&quot;,&quot;non-dropping-particle&quot;:&quot;&quot;},{&quot;family&quot;:&quot;Christie&quot;,&quot;given&quot;:&quot;Grant&quot;,&quot;parse-names&quot;:false,&quot;dropping-particle&quot;:&quot;&quot;,&quot;non-dropping-particle&quot;:&quot;&quot;},{&quot;family&quot;:&quot;Goodyear-Smith&quot;,&quot;given&quot;:&quot;Felicity&quot;,&quot;parse-names&quot;:false,&quot;dropping-particle&quot;:&quot;&quot;,&quot;non-dropping-particle&quot;:&quot;&quot;}],&quot;container-title&quot;:&quot;JMIR Mental Health&quot;,&quot;container-title-short&quot;:&quot;JMIR Ment Health&quot;,&quot;DOI&quot;:&quot;10.2196/12656&quot;,&quot;ISSN&quot;:&quot;2368-7959&quot;,&quot;issued&quot;:{&quot;date-parts&quot;:[[2019,5,8]]},&quot;page&quot;:&quot;e12656&quot;,&quot;issue&quot;:&quot;5&quot;,&quot;volume&quot;:&quot;6&quot;},&quot;isTemporary&quot;:false,&quot;suppress-author&quot;:false,&quot;composite&quot;:false,&quot;author-only&quot;:false}]},{&quot;citationID&quot;:&quot;MENDELEY_CITATION_189e0222-fb33-42f8-8439-54710b1d3293&quot;,&quot;properties&quot;:{&quot;noteIndex&quot;:0},&quot;isEdited&quot;:false,&quot;manualOverride&quot;:{&quot;isManuallyOverridden&quot;:false,&quot;citeprocText&quot;:&quot;[95]&quot;,&quot;manualOverrideText&quot;:&quot;&quot;},&quot;citationTag&quot;:&quot;MENDELEY_CITATION_v3_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&quot;,&quot;citationItems&quot;:[{&quot;id&quot;:&quot;1aeb44eb-a7fb-3e4a-b318-98822e1f8ec3&quot;,&quot;itemData&quot;:{&quot;type&quot;:&quot;article-journal&quot;,&quot;id&quot;:&quot;1aeb44eb-a7fb-3e4a-b318-98822e1f8ec3&quot;,&quot;title&quot;:&quot;The Effect of Digital Mental Health Literacy Interventions on Mental Health: Systematic Review and Meta-Analysis&quot;,&quot;author&quot;:[{&quot;family&quot;:&quot;Yeo&quot;,&quot;given&quot;:&quot;GeckHong&quot;,&quot;parse-names&quot;:false,&quot;dropping-particle&quot;:&quot;&quot;,&quot;non-dropping-particle&quot;:&quot;&quot;},{&quot;family&quot;:&quot;Reich&quot;,&quot;given&quot;:&quot;Stephanie M&quot;,&quot;parse-names&quot;:false,&quot;dropping-particle&quot;:&quot;&quot;,&quot;non-dropping-particle&quot;:&quot;&quot;},{&quot;family&quot;:&quot;Liaw&quot;,&quot;given&quot;:&quot;Nicole A&quot;,&quot;parse-names&quot;:false,&quot;dropping-particle&quot;:&quot;&quot;,&quot;non-dropping-particle&quot;:&quot;&quot;},{&quot;family&quot;:&quot;Chia&quot;,&quot;given&quot;:&quot;Elizabeth Yee Min&quot;,&quot;parse-names&quot;:false,&quot;dropping-particle&quot;:&quot;&quot;,&quot;non-dropping-particle&quot;:&quot;&quot;}],&quot;container-title&quot;:&quot;Journal of Medical Internet Research&quot;,&quot;container-title-short&quot;:&quot;J Med Internet Res&quot;,&quot;DOI&quot;:&quot;10.2196/51268&quot;,&quot;ISSN&quot;:&quot;1438-8871&quot;,&quot;issued&quot;:{&quot;date-parts&quot;:[[2024,2,29]]},&quot;page&quot;:&quot;e51268&quot;,&quot;volume&quot;:&quot;26&quot;},&quot;isTemporary&quot;:false,&quot;suppress-author&quot;:false,&quot;composite&quot;:false,&quot;author-only&quot;:false}]},{&quot;citationID&quot;:&quot;MENDELEY_CITATION_dfb1bbe3-6f9a-4374-9cb0-3254163c396f&quot;,&quot;properties&quot;:{&quot;noteIndex&quot;:0},&quot;isEdited&quot;:false,&quot;manualOverride&quot;:{&quot;isManuallyOverridden&quot;:false,&quot;citeprocText&quot;:&quot;[96]&quot;,&quot;manualOverrideText&quot;:&quot;&quot;},&quot;citationTag&quot;:&quot;MENDELEY_CITATION_v3_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&quot;,&quot;citationItems&quot;:[{&quot;id&quot;:&quot;803046a0-e625-31b1-84ff-d8ad57b1a977&quot;,&quot;itemData&quot;:{&quot;type&quot;:&quot;article-journal&quot;,&quot;id&quot;:&quot;803046a0-e625-31b1-84ff-d8ad57b1a977&quot;,&quot;title&quot;:&quot;Technology-Based Interventions for Mental Health in Tertiary Students: Systematic Review&quot;,&quot;author&quot;:[{&quot;family&quot;:&quot;Farrer&quot;,&quot;given&quot;:&quot;Louise&quot;,&quot;parse-names&quot;:false,&quot;dropping-particle&quot;:&quot;&quot;,&quot;non-dropping-particle&quot;:&quot;&quot;},{&quot;family&quot;:&quot;Gulliver&quot;,&quot;given&quot;:&quot;Amelia&quot;,&quot;parse-names&quot;:false,&quot;dropping-particle&quot;:&quot;&quot;,&quot;non-dropping-particle&quot;:&quot;&quot;},{&quot;family&quot;:&quot;Chan&quot;,&quot;given&quot;:&quot;Jade KY&quot;,&quot;parse-names&quot;:false,&quot;dropping-particle&quot;:&quot;&quot;,&quot;non-dropping-particle&quot;:&quot;&quot;},{&quot;family&quot;:&quot;Batterham&quot;,&quot;given&quot;:&quot;Philip J&quot;,&quot;parse-names&quot;:false,&quot;dropping-particle&quot;:&quot;&quot;,&quot;non-dropping-particle&quot;:&quot;&quot;},{&quot;family&quot;:&quot;Reynolds&quot;,&quot;given&quot;:&quot;Julia&quot;,&quot;parse-names&quot;:false,&quot;dropping-particle&quot;:&quot;&quot;,&quot;non-dropping-particle&quot;:&quot;&quot;},{&quot;family&quot;:&quot;Calear&quot;,&quot;given&quot;:&quot;Alison&quot;,&quot;parse-names&quot;:false,&quot;dropping-particle&quot;:&quot;&quot;,&quot;non-dropping-particle&quot;:&quot;&quot;},{&quot;family&quot;:&quot;Tait&quot;,&quot;given&quot;:&quot;Robert&quot;,&quot;parse-names&quot;:false,&quot;dropping-particle&quot;:&quot;&quot;,&quot;non-dropping-particle&quot;:&quot;&quot;},{&quot;family&quot;:&quot;Bennett&quot;,&quot;given&quot;:&quot;Kylie&quot;,&quot;parse-names&quot;:false,&quot;dropping-particle&quot;:&quot;&quot;,&quot;non-dropping-particle&quot;:&quot;&quot;},{&quot;family&quot;:&quot;Griffiths&quot;,&quot;given&quot;:&quot;Kathleen M&quot;,&quot;parse-names&quot;:false,&quot;dropping-particle&quot;:&quot;&quot;,&quot;non-dropping-particle&quot;:&quot;&quot;}],&quot;container-title&quot;:&quot;Journal of Medical Internet Research&quot;,&quot;container-title-short&quot;:&quot;J Med Internet Res&quot;,&quot;DOI&quot;:&quot;10.2196/jmir.2639&quot;,&quot;ISSN&quot;:&quot;14388871&quot;,&quot;issued&quot;:{&quot;date-parts&quot;:[[2013,5,27]]},&quot;page&quot;:&quot;e101&quot;,&quot;issue&quot;:&quot;5&quot;,&quot;volume&quot;:&quot;15&quot;},&quot;isTemporary&quot;:false,&quot;suppress-author&quot;:false,&quot;composite&quot;:false,&quot;author-only&quot;:false}]},{&quot;citationID&quot;:&quot;MENDELEY_CITATION_a5e270eb-5177-40c3-ab8f-681a6a4851cc&quot;,&quot;properties&quot;:{&quot;noteIndex&quot;:0},&quot;isEdited&quot;:false,&quot;manualOverride&quot;:{&quot;isManuallyOverridden&quot;:false,&quot;citeprocText&quot;:&quot;[1]&quot;,&quot;manualOverrideText&quot;:&quot;&quot;},&quot;citationTag&quot;:&quot;MENDELEY_CITATION_v3_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&quot;,&quot;citationItems&quot;:[{&quot;id&quot;:&quot;0127be9b-6f64-3583-bedc-1584e6f25756&quot;,&quot;itemData&quot;:{&quot;type&quot;:&quot;webpage&quot;,&quot;id&quot;:&quot;0127be9b-6f64-3583-bedc-1584e6f25756&quot;,&quot;title&quot;:&quot;Depressive disorder (depression)&quot;,&quot;author&quot;:[{&quot;family&quot;:&quot;World Health Organization&quot;,&quot;given&quot;:&quot;&quot;,&quot;parse-names&quot;:false,&quot;dropping-particle&quot;:&quot;&quot;,&quot;non-dropping-particle&quot;:&quot;&quot;}],&quot;container-title&quot;:&quot;World Health Organization&quot;,&quot;accessed&quot;:{&quot;date-parts&quot;:[[2025,5,13]]},&quot;URL&quot;:&quot;https://www.who.int/news-room/fact-sheets/detail/depression&quot;,&quot;issued&quot;:{&quot;date-parts&quot;:[[2023,3,31]]},&quot;container-title-short&quot;:&quot;&quot;},&quot;isTemporary&quot;:false,&quot;suppress-author&quot;:false,&quot;composite&quot;:false,&quot;author-only&quot;:false}]},{&quot;citationID&quot;:&quot;MENDELEY_CITATION_d96bc7e0-89a3-4a44-a5f1-ce2324fd0a20&quot;,&quot;properties&quot;:{&quot;noteIndex&quot;:0},&quot;isEdited&quot;:false,&quot;manualOverride&quot;:{&quot;isManuallyOverridden&quot;:false,&quot;citeprocText&quot;:&quot;[1]&quot;,&quot;manualOverrideText&quot;:&quot;&quot;},&quot;citationTag&quot;:&quot;MENDELEY_CITATION_v3_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&quot;,&quot;citationItems&quot;:[{&quot;id&quot;:&quot;0127be9b-6f64-3583-bedc-1584e6f25756&quot;,&quot;itemData&quot;:{&quot;type&quot;:&quot;webpage&quot;,&quot;id&quot;:&quot;0127be9b-6f64-3583-bedc-1584e6f25756&quot;,&quot;title&quot;:&quot;Depressive disorder (depression)&quot;,&quot;author&quot;:[{&quot;family&quot;:&quot;World Health Organization&quot;,&quot;given&quot;:&quot;&quot;,&quot;parse-names&quot;:false,&quot;dropping-particle&quot;:&quot;&quot;,&quot;non-dropping-particle&quot;:&quot;&quot;}],&quot;container-title&quot;:&quot;World Health Organization&quot;,&quot;accessed&quot;:{&quot;date-parts&quot;:[[2025,5,13]]},&quot;URL&quot;:&quot;https://www.who.int/news-room/fact-sheets/detail/depression&quot;,&quot;issued&quot;:{&quot;date-parts&quot;:[[2023,3,31]]},&quot;container-title-short&quot;:&quot;&quot;},&quot;isTemporary&quot;:false,&quot;suppress-author&quot;:false,&quot;composite&quot;:false,&quot;author-only&quot;:false}]},{&quot;citationID&quot;:&quot;MENDELEY_CITATION_0095d0f0-f505-453b-9db7-69cfef6c9359&quot;,&quot;properties&quot;:{&quot;noteIndex&quot;:0},&quot;isEdited&quot;:false,&quot;manualOverride&quot;:{&quot;isManuallyOverridden&quot;:false,&quot;citeprocText&quot;:&quot;[97]&quot;,&quot;manualOverrideText&quot;:&quot;&quot;},&quot;citationTag&quot;:&quot;MENDELEY_CITATION_v3_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&quot;,&quot;citationItems&quot;:[{&quot;id&quot;:&quot;4e69a7ba-0c98-3728-9d57-b13c1b6711e0&quot;,&quot;itemData&quot;:{&quot;type&quot;:&quot;article-journal&quot;,&quot;id&quot;:&quot;4e69a7ba-0c98-3728-9d57-b13c1b6711e0&quot;,&quot;title&quot;:&quot;Effectiveness and Minimum Effective Dose of App-Based Mobile Health Interventions for Anxiety and Depression Symptom Reduction: Systematic Review and Meta-Analysis&quot;,&quot;author&quot;:[{&quot;family&quot;:&quot;Lu&quot;,&quot;given&quot;:&quot;Sheng-Chieh&quot;,&quot;parse-names&quot;:false,&quot;dropping-particle&quot;:&quot;&quot;,&quot;non-dropping-particle&quot;:&quot;&quot;},{&quot;family&quot;:&quot;Xu&quot;,&quot;given&quot;:&quot;Mindy&quot;,&quot;parse-names&quot;:false,&quot;dropping-particle&quot;:&quot;&quot;,&quot;non-dropping-particle&quot;:&quot;&quot;},{&quot;family&quot;:&quot;Wang&quot;,&quot;given&quot;:&quot;Mei&quot;,&quot;parse-names&quot;:false,&quot;dropping-particle&quot;:&quot;&quot;,&quot;non-dropping-particle&quot;:&quot;&quot;},{&quot;family&quot;:&quot;Hardi&quot;,&quot;given&quot;:&quot;Angela&quot;,&quot;parse-names&quot;:false,&quot;dropping-particle&quot;:&quot;&quot;,&quot;non-dropping-particle&quot;:&quot;&quot;},{&quot;family&quot;:&quot;Cheng&quot;,&quot;given&quot;:&quot;Abby L&quot;,&quot;parse-names&quot;:false,&quot;dropping-particle&quot;:&quot;&quot;,&quot;non-dropping-particle&quot;:&quot;&quot;},{&quot;family&quot;:&quot;Chang&quot;,&quot;given&quot;:&quot;Su-Hsin&quot;,&quot;parse-names&quot;:false,&quot;dropping-particle&quot;:&quot;&quot;,&quot;non-dropping-particle&quot;:&quot;&quot;},{&quot;family&quot;:&quot;Yen&quot;,&quot;given&quot;:&quot;Po-Yin&quot;,&quot;parse-names&quot;:false,&quot;dropping-particle&quot;:&quot;&quot;,&quot;non-dropping-particle&quot;:&quot;&quot;}],&quot;container-title&quot;:&quot;JMIR Mental Health&quot;,&quot;container-title-short&quot;:&quot;JMIR Ment Health&quot;,&quot;DOI&quot;:&quot;10.2196/39454&quot;,&quot;ISSN&quot;:&quot;2368-7959&quot;,&quot;issued&quot;:{&quot;date-parts&quot;:[[2022,9,7]]},&quot;page&quot;:&quot;e39454&quot;,&quot;issue&quot;:&quot;9&quot;,&quot;volume&quot;:&quot;9&quot;},&quot;isTemporary&quot;:false,&quot;suppress-author&quot;:false,&quot;composite&quot;:false,&quot;author-only&quot;:false}]},{&quot;citationID&quot;:&quot;MENDELEY_CITATION_3d9696cd-fd37-4bac-b452-b0fc099c2248&quot;,&quot;properties&quot;:{&quot;noteIndex&quot;:0},&quot;isEdited&quot;:false,&quot;manualOverride&quot;:{&quot;isManuallyOverridden&quot;:false,&quot;citeprocText&quot;:&quot;[98]&quot;,&quot;manualOverrideText&quot;:&quot;&quot;},&quot;citationTag&quot;:&quot;MENDELEY_CITATION_v3_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&quot;,&quot;citationItems&quot;:[{&quot;id&quot;:&quot;46086210-ab09-33a0-9709-224a3871a4d1&quot;,&quot;itemData&quot;:{&quot;type&quot;:&quot;article-journal&quot;,&quot;id&quot;:&quot;46086210-ab09-33a0-9709-224a3871a4d1&quot;,&quot;title&quot;:&quot;The Effectiveness of Serious Games for Alleviating Depression: Systematic Review and Meta-analysis&quot;,&quot;author&quot;:[{&quot;family&quot;:&quot;Abd-Alrazaq&quot;,&quot;given&quot;:&quot;Alaa&quot;,&quot;parse-names&quot;:false,&quot;dropping-particle&quot;:&quot;&quot;,&quot;non-dropping-particle&quot;:&quot;&quot;},{&quot;family&quot;:&quot;Al-Jafar&quot;,&quot;given&quot;:&quot;Eiman&quot;,&quot;parse-names&quot;:false,&quot;dropping-particle&quot;:&quot;&quot;,&quot;non-dropping-particle&quot;:&quot;&quot;},{&quot;family&quot;:&quot;Alajlani&quot;,&quot;given&quot;:&quot;Mohannad&quot;,&quot;parse-names&quot;:false,&quot;dropping-particle&quot;:&quot;&quot;,&quot;non-dropping-particle&quot;:&quot;&quot;},{&quot;family&quot;:&quot;Toro&quot;,&quot;given&quot;:&quot;Carla&quot;,&quot;parse-names&quot;:false,&quot;dropping-particle&quot;:&quot;&quot;,&quot;non-dropping-particle&quot;:&quot;&quot;},{&quot;family&quot;:&quot;Alhuwail&quot;,&quot;given&quot;:&quot;Dari&quot;,&quot;parse-names&quot;:false,&quot;dropping-particle&quot;:&quot;&quot;,&quot;non-dropping-particle&quot;:&quot;&quot;},{&quot;family&quot;:&quot;Ahmed&quot;,&quot;given&quot;:&quot;Arfan&quot;,&quot;parse-names&quot;:false,&quot;dropping-particle&quot;:&quot;&quot;,&quot;non-dropping-particle&quot;:&quot;&quot;},{&quot;family&quot;:&quot;Reagu&quot;,&quot;given&quot;:&quot;Shuja Mohd&quot;,&quot;parse-names&quot;:false,&quot;dropping-particle&quot;:&quot;&quot;,&quot;non-dropping-particle&quot;:&quot;&quot;},{&quot;family&quot;:&quot;Al-Shorbaji&quot;,&quot;given&quot;:&quot;Najeeb&quot;,&quot;parse-names&quot;:false,&quot;dropping-particle&quot;:&quot;&quot;,&quot;non-dropping-particle&quot;:&quot;&quot;},{&quot;family&quot;:&quot;Househ&quot;,&quot;given&quot;:&quot;Mowafa&quot;,&quot;parse-names&quot;:false,&quot;dropping-particle&quot;:&quot;&quot;,&quot;non-dropping-particle&quot;:&quot;&quot;}],&quot;container-title&quot;:&quot;JMIR Serious Games&quot;,&quot;container-title-short&quot;:&quot;JMIR Serious Games&quot;,&quot;DOI&quot;:&quot;10.2196/32331&quot;,&quot;ISSN&quot;:&quot;2291-9279&quot;,&quot;issued&quot;:{&quot;date-parts&quot;:[[2022,1,14]]},&quot;page&quot;:&quot;e32331&quot;,&quot;issue&quot;:&quot;1&quot;,&quot;volume&quot;:&quot;10&quot;},&quot;isTemporary&quot;:false,&quot;suppress-author&quot;:false,&quot;composite&quot;:false,&quot;author-only&quot;:false}]},{&quot;citationID&quot;:&quot;MENDELEY_CITATION_fd513b23-8403-4d16-a97c-2e4a2059334d&quot;,&quot;properties&quot;:{&quot;noteIndex&quot;:0},&quot;isEdited&quot;:false,&quot;manualOverride&quot;:{&quot;isManuallyOverridden&quot;:false,&quot;citeprocText&quot;:&quot;[99]&quot;,&quot;manualOverrideText&quot;:&quot;&quot;},&quot;citationTag&quot;:&quot;MENDELEY_CITATION_v3_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&quot;,&quot;citationItems&quot;:[{&quot;id&quot;:&quot;8372c6a9-7310-3ae1-beaf-de1c824f5951&quot;,&quot;itemData&quot;:{&quot;type&quot;:&quot;article-journal&quot;,&quot;id&quot;:&quot;8372c6a9-7310-3ae1-beaf-de1c824f5951&quot;,&quot;title&quot;:&quot;A systematic review and meta analysis on digital mental health interventions in inpatient settings&quot;,&quot;author&quot;:[{&quot;family&quot;:&quot;Diel&quot;,&quot;given&quot;:&quot;Alexander&quot;,&quot;parse-names&quot;:false,&quot;dropping-particle&quot;:&quot;&quot;,&quot;non-dropping-particle&quot;:&quot;&quot;},{&quot;family&quot;:&quot;Schröter&quot;,&quot;given&quot;:&quot;Isabel Carolin&quot;,&quot;parse-names&quot;:false,&quot;dropping-particle&quot;:&quot;&quot;,&quot;non-dropping-particle&quot;:&quot;&quot;},{&quot;family&quot;:&quot;Frewer&quot;,&quot;given&quot;:&quot;Anna-Lena&quot;,&quot;parse-names&quot;:false,&quot;dropping-particle&quot;:&quot;&quot;,&quot;non-dropping-particle&quot;:&quot;&quot;},{&quot;family&quot;:&quot;Jansen&quot;,&quot;given&quot;:&quot;Christoph&quot;,&quot;parse-names&quot;:false,&quot;dropping-particle&quot;:&quot;&quot;,&quot;non-dropping-particle&quot;:&quot;&quot;},{&quot;family&quot;:&quot;Robitzsch&quot;,&quot;given&quot;:&quot;Anita&quot;,&quot;parse-names&quot;:false,&quot;dropping-particle&quot;:&quot;&quot;,&quot;non-dropping-particle&quot;:&quot;&quot;},{&quot;family&quot;:&quot;Gradl-Dietsch&quot;,&quot;given&quot;:&quot;Gertraud&quot;,&quot;parse-names&quot;:false,&quot;dropping-particle&quot;:&quot;&quot;,&quot;non-dropping-particle&quot;:&quot;&quot;},{&quot;family&quot;:&quot;Teufel&quot;,&quot;given&quot;:&quot;Martin&quot;,&quot;parse-names&quot;:false,&quot;dropping-particle&quot;:&quot;&quot;,&quot;non-dropping-particle&quot;:&quot;&quot;},{&quot;family&quot;:&quot;Bäuerle&quot;,&quot;given&quot;:&quot;Alexander&quot;,&quot;parse-names&quot;:false,&quot;dropping-particle&quot;:&quot;&quot;,&quot;non-dropping-particle&quot;:&quot;&quot;}],&quot;container-title&quot;:&quot;npj Digital Medicine&quot;,&quot;container-title-short&quot;:&quot;NPJ Digit Med&quot;,&quot;DOI&quot;:&quot;10.1038/s41746-024-01252-z&quot;,&quot;ISSN&quot;:&quot;2398-6352&quot;,&quot;issued&quot;:{&quot;date-parts&quot;:[[2024,9,17]]},&quot;page&quot;:&quot;253&quot;,&quot;abstract&quot;:&quot;&lt;p&gt; E-mental health (EMH) interventions gain increasing importance in the treatment of mental health disorders. Their outpatient efficacy is well-established. However, research on EMH in inpatient settings remains sparse and lacks a meta-analytic synthesis. This paper presents a meta-analysis on the efficacy of EMH in inpatient settings. Searching multiple databases (PubMed, ScienceGov, PsycInfo, CENTRAL, references), 26 randomized controlled trial (RCT) EMH inpatient studies ( &lt;italic&gt;n&lt;/italic&gt;  = 6112) with low or medium assessed risk of bias were included. A small significant total effect of EMH treatment was found ( &lt;italic&gt;g&lt;/italic&gt;  = 0.3). The effect was significant both for blended interventions ( &lt;italic&gt;g&lt;/italic&gt;  = 0.42) and post-treatment EMH-based aftercare ( &lt;italic&gt;g&lt;/italic&gt;  = 0.29). EMH treatment yielded significant effects across different patient groups and types of therapy, and the effects remained stable post-treatment. The results show the efficacy of EMH treatment in inpatient settings. The meta-analysis is limited by the small number of included studies. &lt;/p&gt;&quot;,&quot;issue&quot;:&quot;1&quot;,&quot;volume&quot;:&quot;7&quot;},&quot;isTemporary&quot;:false,&quot;suppress-author&quot;:false,&quot;composite&quot;:false,&quot;author-only&quot;:false}]},{&quot;citationID&quot;:&quot;MENDELEY_CITATION_0d6f7461-5a51-4f8d-8f8f-d3eb62fcf1c3&quot;,&quot;properties&quot;:{&quot;noteIndex&quot;:0},&quot;isEdited&quot;:false,&quot;manualOverride&quot;:{&quot;isManuallyOverridden&quot;:false,&quot;citeprocText&quot;:&quot;[100]&quot;,&quot;manualOverrideText&quot;:&quot;&quot;},&quot;citationTag&quot;:&quot;MENDELEY_CITATION_v3_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&quot;,&quot;citationItems&quot;:[{&quot;id&quot;:&quot;01d84fcd-2511-3bc3-a8ad-8400e9492060&quot;,&quot;itemData&quot;:{&quot;type&quot;:&quot;article-journal&quot;,&quot;id&quot;:&quot;01d84fcd-2511-3bc3-a8ad-8400e9492060&quot;,&quot;title&quot;:&quot;Social Media Use and Depression in Adolescents: A Scoping Review&quot;,&quot;author&quot;:[{&quot;family&quot;:&quot;Azem&quot;,&quot;given&quot;:&quot;Layan&quot;,&quot;parse-names&quot;:false,&quot;dropping-particle&quot;:&quot;&quot;,&quot;non-dropping-particle&quot;:&quot;&quot;},{&quot;family&quot;:&quot;Alwani&quot;,&quot;given&quot;:&quot;Rafaa&quot;,&quot;parse-names&quot;:false,&quot;dropping-particle&quot;:&quot;&quot;,&quot;non-dropping-particle&quot;:&quot;Al&quot;},{&quot;family&quot;:&quot;Lucas&quot;,&quot;given&quot;:&quot;Augusto&quot;,&quot;parse-names&quot;:false,&quot;dropping-particle&quot;:&quot;&quot;,&quot;non-dropping-particle&quot;:&quot;&quot;},{&quot;family&quot;:&quot;Alsaadi&quot;,&quot;given&quot;:&quot;Balqes&quot;,&quot;parse-names&quot;:false,&quot;dropping-particle&quot;:&quot;&quot;,&quot;non-dropping-particle&quot;:&quot;&quot;},{&quot;family&quot;:&quot;Njihia&quot;,&quot;given&quot;:&quot;Gilbert&quot;,&quot;parse-names&quot;:false,&quot;dropping-particle&quot;:&quot;&quot;,&quot;non-dropping-particle&quot;:&quot;&quot;},{&quot;family&quot;:&quot;Bibi&quot;,&quot;given&quot;:&quot;Bushra&quot;,&quot;parse-names&quot;:false,&quot;dropping-particle&quot;:&quot;&quot;,&quot;non-dropping-particle&quot;:&quot;&quot;},{&quot;family&quot;:&quot;Alzubaidi&quot;,&quot;given&quot;:&quot;Mahmood&quot;,&quot;parse-names&quot;:false,&quot;dropping-particle&quot;:&quot;&quot;,&quot;non-dropping-particle&quot;:&quot;&quot;},{&quot;family&quot;:&quot;Househ&quot;,&quot;given&quot;:&quot;Mowafa&quot;,&quot;parse-names&quot;:false,&quot;dropping-particle&quot;:&quot;&quot;,&quot;non-dropping-particle&quot;:&quot;&quot;}],&quot;container-title&quot;:&quot;Behavioral Sciences&quot;,&quot;DOI&quot;:&quot;10.3390/bs13060475&quot;,&quot;ISSN&quot;:&quot;2076-328X&quot;,&quot;issued&quot;:{&quot;date-parts&quot;:[[2023,6,6]]},&quot;page&quot;:&quot;475&quot;,&quot;abstract&quot;:&quot;&lt;p&gt;This scoping review aimed to investigate the association between depression and social media use among adolescents. The study analyzed 43 papers using five databases to identify articles published from 2012 to August 2022. The results revealed a connection between social media use and depression, as well as other negative outcomes such as anxiety, poor sleep, low self-esteem, and social and appearance anxiety. Surveys were the most used study strategy, with multiple common scales applied to assess depression, social media use, and other factors such as self-esteem and sleep quality. Among the studies, eight reported that females who use social media showed higher depression symptoms than males. This scoping review provides an overview of the current literature on the relationship between social media use and depression among adolescents. The findings emphasize the importance of monitoring social media use and providing support for individuals struggling with depression. However, more research is needed to better understand the factors contributing to this relationship and to develop more standardized assessment methods.&lt;/p&gt;&quot;,&quot;issue&quot;:&quot;6&quot;,&quot;volume&quot;:&quot;13&quot;,&quot;container-title-short&quot;:&quot;&quot;},&quot;isTemporary&quot;:false,&quot;suppress-author&quot;:false,&quot;composite&quot;:false,&quot;author-only&quot;:false}]}]"/>
     <we:property name="MENDELEY_CITATIONS_STYLE" value="{&quot;id&quot;:&quot;https://www.zotero.org/styles/ieee&quot;,&quot;title&quot;:&quot;IEEE&quot;,&quot;format&quot;:&quot;numeric&quot;,&quot;defaultLocale&quot;:null,&quot;isLocaleCodeValid&quot;:true}"/>
   </we:properties>
   <we:bindings/>

</xml_diff>

<commit_message>
docs(discussion): menyelesaikan bagian diskusi
</commit_message>
<xml_diff>
--- a/Kajian Pustaka Draft 2025 Rafli.docx
+++ b/Kajian Pustaka Draft 2025 Rafli.docx
@@ -740,7 +740,7 @@
             <w:sz w:val="20"/>
             <w:szCs w:val="20"/>
           </w:rPr>
-          <w:tag w:val="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"/>
+          <w:tag w:val="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"/>
           <w:id w:val="-1187907721"/>
           <w:placeholder>
             <w:docPart w:val="C94D7A5153164D62AC0BA8D3C3B26F7D"/>
@@ -4641,7 +4641,1504 @@
       <w:pPr>
         <w:rPr>
           <w:rFonts w:ascii="Times New Roman" w:eastAsia="Times New Roman" w:hAnsi="Times New Roman" w:cs="Times New Roman"/>
-          <w:b/>
+          <w:bCs/>
+          <w:sz w:val="20"/>
+          <w:szCs w:val="20"/>
+        </w:rPr>
+      </w:pPr>
+      <w:r>
+        <w:rPr>
+          <w:rFonts w:ascii="Times New Roman" w:eastAsia="Times New Roman" w:hAnsi="Times New Roman" w:cs="Times New Roman"/>
+          <w:bCs/>
+          <w:sz w:val="20"/>
+          <w:szCs w:val="20"/>
+        </w:rPr>
+        <w:t xml:space="preserve">Pada tahun 2020, dua studi menyoroti pendekatan intervensi digital dalam mendukung kesehatan mental, khususnya terkait depresi dan kecemasan. Studi pertama, yang dipublikasikan di BMJ Open, mengusulkan protokol studi kelayakan untuk sebuah video game berbasis Acceptance and Commitment Therapy (ACT) yang ditujukan bagi dewasa muda. Game ini dirancang untuk mengintegrasikan pembelajaran ACT secara implisit melalui mekanisme permainan, dengan tujuan mendukung kesehatan mental pengguna. Studi ini menekankan pentingnya mengevaluasi kelayakan dan penerimaan intervensi digital semacam ini sebelum implementasi yang lebih luas </w:t>
+      </w:r>
+      <w:sdt>
+        <w:sdtPr>
+          <w:rPr>
+            <w:rFonts w:ascii="Times New Roman" w:eastAsia="Times New Roman" w:hAnsi="Times New Roman" w:cs="Times New Roman"/>
+            <w:bCs/>
+            <w:color w:val="000000"/>
+            <w:sz w:val="20"/>
+            <w:szCs w:val="20"/>
+          </w:rPr>
+          <w:tag w:val="MENDELEY_CITATION_v3_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"/>
+          <w:id w:val="-1273317292"/>
+          <w:placeholder>
+            <w:docPart w:val="DefaultPlaceholder_-1854013440"/>
+          </w:placeholder>
+        </w:sdtPr>
+        <w:sdtContent>
+          <w:r>
+            <w:rPr>
+              <w:rFonts w:ascii="Times New Roman" w:eastAsia="Times New Roman" w:hAnsi="Times New Roman" w:cs="Times New Roman"/>
+              <w:bCs/>
+              <w:color w:val="000000"/>
+              <w:sz w:val="20"/>
+              <w:szCs w:val="20"/>
+            </w:rPr>
+            <w:t>[101]</w:t>
+          </w:r>
+        </w:sdtContent>
+      </w:sdt>
+      <w:r>
+        <w:rPr>
+          <w:rFonts w:ascii="Times New Roman" w:eastAsia="Times New Roman" w:hAnsi="Times New Roman" w:cs="Times New Roman"/>
+          <w:bCs/>
+          <w:sz w:val="20"/>
+          <w:szCs w:val="20"/>
+        </w:rPr>
+        <w:t xml:space="preserve">. Sementara itu, studi kedua mengembangkan game edukasi berbasis Android dan desktop menggunakan metode Digital Game-Based Learning Instructional Design (DGBL-ID) untuk meningkatkan </w:t>
+      </w:r>
+      <w:r>
+        <w:rPr>
+          <w:rFonts w:ascii="Times New Roman" w:eastAsia="Times New Roman" w:hAnsi="Times New Roman" w:cs="Times New Roman"/>
+          <w:bCs/>
+          <w:sz w:val="20"/>
+          <w:szCs w:val="20"/>
+        </w:rPr>
+        <w:lastRenderedPageBreak/>
+        <w:t xml:space="preserve">literasi kesehatan mental di kalangan remaja. Game ini bertujuan untuk memperkenalkan berbagai gangguan psikologis yang umum dialami remaja, seperti depresi dan kecemasan, dengan pendekatan edukatif. Target pengguna utama adalah remaja, namun game ini juga dapat diakses oleh masyarakat umum tanpa batasan usia tertentu </w:t>
+      </w:r>
+      <w:sdt>
+        <w:sdtPr>
+          <w:rPr>
+            <w:rFonts w:ascii="Times New Roman" w:eastAsia="Times New Roman" w:hAnsi="Times New Roman" w:cs="Times New Roman"/>
+            <w:bCs/>
+            <w:color w:val="000000"/>
+            <w:sz w:val="20"/>
+            <w:szCs w:val="20"/>
+          </w:rPr>
+          <w:tag w:val="MENDELEY_CITATION_v3_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"/>
+          <w:id w:val="1377885926"/>
+          <w:placeholder>
+            <w:docPart w:val="DefaultPlaceholder_-1854013440"/>
+          </w:placeholder>
+        </w:sdtPr>
+        <w:sdtContent>
+          <w:r>
+            <w:rPr>
+              <w:rFonts w:ascii="Times New Roman" w:eastAsia="Times New Roman" w:hAnsi="Times New Roman" w:cs="Times New Roman"/>
+              <w:bCs/>
+              <w:color w:val="000000"/>
+              <w:sz w:val="20"/>
+              <w:szCs w:val="20"/>
+            </w:rPr>
+            <w:t>[102]</w:t>
+          </w:r>
+        </w:sdtContent>
+      </w:sdt>
+      <w:r>
+        <w:rPr>
+          <w:rFonts w:ascii="Times New Roman" w:eastAsia="Times New Roman" w:hAnsi="Times New Roman" w:cs="Times New Roman"/>
+          <w:bCs/>
+          <w:color w:val="000000"/>
+          <w:sz w:val="20"/>
+          <w:szCs w:val="20"/>
+        </w:rPr>
+        <w:t xml:space="preserve"> </w:t>
+      </w:r>
+      <w:r>
+        <w:rPr>
+          <w:rFonts w:ascii="Times New Roman" w:eastAsia="Times New Roman" w:hAnsi="Times New Roman" w:cs="Times New Roman"/>
+          <w:bCs/>
+          <w:sz w:val="20"/>
+          <w:szCs w:val="20"/>
+        </w:rPr>
+        <w:t>. Kedua studi ini menekankan pentingnya pemanfaatan dataset gangguan psikologis, pemilihan teknologi berbasis web, aplikasi mobile, dan game, serta penentuan tujuan penelitian yang jelas, baik sebagai terapi maupun edukasi, dengan target pengguna utama yakni remaja dan dewasa muda. Dengan pendekatan yang berfokus pada pengguna dan berbasis bukti, intervensi digital memiliki potensi besar dalam meningkatkan aksesibilitas dan efektivitas penanganan masalah kesehatan mental.</w:t>
+      </w:r>
+    </w:p>
+    <w:p>
+      <w:pPr>
+        <w:rPr>
+          <w:rFonts w:ascii="Times New Roman" w:eastAsia="Times New Roman" w:hAnsi="Times New Roman" w:cs="Times New Roman"/>
+          <w:bCs/>
+          <w:sz w:val="20"/>
+          <w:szCs w:val="20"/>
+        </w:rPr>
+      </w:pPr>
+      <w:r>
+        <w:rPr>
+          <w:rFonts w:ascii="Times New Roman" w:eastAsia="Times New Roman" w:hAnsi="Times New Roman" w:cs="Times New Roman"/>
+          <w:bCs/>
+          <w:sz w:val="20"/>
+          <w:szCs w:val="20"/>
+        </w:rPr>
+        <w:tab/>
+      </w:r>
+      <w:r>
+        <w:rPr>
+          <w:rFonts w:ascii="Times New Roman" w:eastAsia="Times New Roman" w:hAnsi="Times New Roman" w:cs="Times New Roman"/>
+          <w:bCs/>
+          <w:sz w:val="20"/>
+          <w:szCs w:val="20"/>
+        </w:rPr>
+        <w:t>Pada tahun 2021, berbagai penelitian di Indonesia mengkaji intervensi digital untuk menangani gangguan mental seperti depresi dan kecemasan, dengan pendekatan teknologi yang beragam serta sasaran pengguna yang spesifik. Beberapa studi mengembangkan aplikasi mobile berbasis Android untuk terapi dan edukasi kesehatan mental, seperti aplikasi NAFS yang mengintegrasikan pendekatan psikospiritual Islam menggunakan metode PDCA</w:t>
+      </w:r>
+      <w:r>
+        <w:rPr>
+          <w:rFonts w:ascii="Times New Roman" w:eastAsia="Times New Roman" w:hAnsi="Times New Roman" w:cs="Times New Roman"/>
+          <w:bCs/>
+          <w:sz w:val="20"/>
+          <w:szCs w:val="20"/>
+        </w:rPr>
+        <w:t xml:space="preserve"> </w:t>
+      </w:r>
+      <w:sdt>
+        <w:sdtPr>
+          <w:rPr>
+            <w:rFonts w:ascii="Times New Roman" w:eastAsia="Times New Roman" w:hAnsi="Times New Roman" w:cs="Times New Roman"/>
+            <w:bCs/>
+            <w:color w:val="000000"/>
+            <w:sz w:val="20"/>
+            <w:szCs w:val="20"/>
+          </w:rPr>
+          <w:tag w:val="MENDELEY_CITATION_v3_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"/>
+          <w:id w:val="877511726"/>
+          <w:placeholder>
+            <w:docPart w:val="DefaultPlaceholder_-1854013440"/>
+          </w:placeholder>
+        </w:sdtPr>
+        <w:sdtContent>
+          <w:r>
+            <w:rPr>
+              <w:rFonts w:ascii="Times New Roman" w:eastAsia="Times New Roman" w:hAnsi="Times New Roman" w:cs="Times New Roman"/>
+              <w:bCs/>
+              <w:color w:val="000000"/>
+              <w:sz w:val="20"/>
+              <w:szCs w:val="20"/>
+            </w:rPr>
+            <w:t>[103]</w:t>
+          </w:r>
+        </w:sdtContent>
+      </w:sdt>
+      <w:r>
+        <w:rPr>
+          <w:rFonts w:ascii="Times New Roman" w:eastAsia="Times New Roman" w:hAnsi="Times New Roman" w:cs="Times New Roman"/>
+          <w:bCs/>
+          <w:sz w:val="20"/>
+          <w:szCs w:val="20"/>
+        </w:rPr>
+        <w:t xml:space="preserve"> , serta aplikasi konsultasi online untuk Pusat Inovasi Psikologi Universitas Padjadjaran yang ditujukan bagi remaja dan dewasa muda</w:t>
+      </w:r>
+      <w:r>
+        <w:rPr>
+          <w:rFonts w:ascii="Times New Roman" w:eastAsia="Times New Roman" w:hAnsi="Times New Roman" w:cs="Times New Roman"/>
+          <w:bCs/>
+          <w:sz w:val="20"/>
+          <w:szCs w:val="20"/>
+        </w:rPr>
+        <w:t xml:space="preserve"> </w:t>
+      </w:r>
+      <w:sdt>
+        <w:sdtPr>
+          <w:rPr>
+            <w:rFonts w:ascii="Times New Roman" w:eastAsia="Times New Roman" w:hAnsi="Times New Roman" w:cs="Times New Roman"/>
+            <w:bCs/>
+            <w:color w:val="000000"/>
+            <w:sz w:val="20"/>
+            <w:szCs w:val="20"/>
+          </w:rPr>
+          <w:tag w:val="MENDELEY_CITATION_v3_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"/>
+          <w:id w:val="1587807767"/>
+          <w:placeholder>
+            <w:docPart w:val="DefaultPlaceholder_-1854013440"/>
+          </w:placeholder>
+        </w:sdtPr>
+        <w:sdtContent>
+          <w:r>
+            <w:rPr>
+              <w:rFonts w:ascii="Times New Roman" w:eastAsia="Times New Roman" w:hAnsi="Times New Roman" w:cs="Times New Roman"/>
+              <w:bCs/>
+              <w:color w:val="000000"/>
+              <w:sz w:val="20"/>
+              <w:szCs w:val="20"/>
+            </w:rPr>
+            <w:t>[58]</w:t>
+          </w:r>
+        </w:sdtContent>
+      </w:sdt>
+      <w:r>
+        <w:rPr>
+          <w:rFonts w:ascii="Times New Roman" w:eastAsia="Times New Roman" w:hAnsi="Times New Roman" w:cs="Times New Roman"/>
+          <w:bCs/>
+          <w:sz w:val="20"/>
+          <w:szCs w:val="20"/>
+        </w:rPr>
+        <w:t xml:space="preserve"> . Selain itu, sistem pakar berbasis web menggunakan metode Case-Based Reasoning dan Certainty Factor dikembangkan untuk deteksi dini gangguan mental, termasuk depresi pada anak-anak dan remaja</w:t>
+      </w:r>
+      <w:r>
+        <w:rPr>
+          <w:rFonts w:ascii="Times New Roman" w:eastAsia="Times New Roman" w:hAnsi="Times New Roman" w:cs="Times New Roman"/>
+          <w:bCs/>
+          <w:sz w:val="20"/>
+          <w:szCs w:val="20"/>
+        </w:rPr>
+        <w:t xml:space="preserve"> </w:t>
+      </w:r>
+      <w:sdt>
+        <w:sdtPr>
+          <w:rPr>
+            <w:rFonts w:ascii="Times New Roman" w:eastAsia="Times New Roman" w:hAnsi="Times New Roman" w:cs="Times New Roman"/>
+            <w:bCs/>
+            <w:color w:val="000000"/>
+            <w:sz w:val="20"/>
+            <w:szCs w:val="20"/>
+          </w:rPr>
+          <w:tag w:val="MENDELEY_CITATION_v3_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"/>
+          <w:id w:val="-916331082"/>
+          <w:placeholder>
+            <w:docPart w:val="DefaultPlaceholder_-1854013440"/>
+          </w:placeholder>
+        </w:sdtPr>
+        <w:sdtContent>
+          <w:r>
+            <w:rPr>
+              <w:rFonts w:ascii="Times New Roman" w:eastAsia="Times New Roman" w:hAnsi="Times New Roman" w:cs="Times New Roman"/>
+              <w:bCs/>
+              <w:color w:val="000000"/>
+              <w:sz w:val="20"/>
+              <w:szCs w:val="20"/>
+            </w:rPr>
+            <w:t>[62]</w:t>
+          </w:r>
+        </w:sdtContent>
+      </w:sdt>
+      <w:r>
+        <w:rPr>
+          <w:rFonts w:ascii="Times New Roman" w:eastAsia="Times New Roman" w:hAnsi="Times New Roman" w:cs="Times New Roman"/>
+          <w:bCs/>
+          <w:sz w:val="20"/>
+          <w:szCs w:val="20"/>
+        </w:rPr>
+        <w:t xml:space="preserve"> </w:t>
+      </w:r>
+      <w:sdt>
+        <w:sdtPr>
+          <w:rPr>
+            <w:rFonts w:ascii="Times New Roman" w:eastAsia="Times New Roman" w:hAnsi="Times New Roman" w:cs="Times New Roman"/>
+            <w:bCs/>
+            <w:color w:val="000000"/>
+            <w:sz w:val="20"/>
+            <w:szCs w:val="20"/>
+          </w:rPr>
+          <w:tag w:val="MENDELEY_CITATION_v3_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"/>
+          <w:id w:val="1615169177"/>
+          <w:placeholder>
+            <w:docPart w:val="DefaultPlaceholder_-1854013440"/>
+          </w:placeholder>
+        </w:sdtPr>
+        <w:sdtContent>
+          <w:r>
+            <w:rPr>
+              <w:rFonts w:ascii="Times New Roman" w:eastAsia="Times New Roman" w:hAnsi="Times New Roman" w:cs="Times New Roman"/>
+              <w:bCs/>
+              <w:color w:val="000000"/>
+              <w:sz w:val="20"/>
+              <w:szCs w:val="20"/>
+            </w:rPr>
+            <w:t>[92]</w:t>
+          </w:r>
+        </w:sdtContent>
+      </w:sdt>
+      <w:r>
+        <w:rPr>
+          <w:rFonts w:ascii="Times New Roman" w:eastAsia="Times New Roman" w:hAnsi="Times New Roman" w:cs="Times New Roman"/>
+          <w:bCs/>
+          <w:sz w:val="20"/>
+          <w:szCs w:val="20"/>
+        </w:rPr>
+        <w:t>. Pendekatan lain menggunakan machine learning, seperti implementasi metode Naïve Bayes untuk mendeteksi unsur depresi pada unggahan Twitter, yang menunjukkan akurasi sekitar 74%</w:t>
+      </w:r>
+      <w:r>
+        <w:rPr>
+          <w:rFonts w:ascii="Times New Roman" w:eastAsia="Times New Roman" w:hAnsi="Times New Roman" w:cs="Times New Roman"/>
+          <w:bCs/>
+          <w:sz w:val="20"/>
+          <w:szCs w:val="20"/>
+        </w:rPr>
+        <w:t xml:space="preserve"> </w:t>
+      </w:r>
+      <w:sdt>
+        <w:sdtPr>
+          <w:rPr>
+            <w:rFonts w:ascii="Times New Roman" w:eastAsia="Times New Roman" w:hAnsi="Times New Roman" w:cs="Times New Roman"/>
+            <w:bCs/>
+            <w:color w:val="000000"/>
+            <w:sz w:val="20"/>
+            <w:szCs w:val="20"/>
+          </w:rPr>
+          <w:tag w:val="MENDELEY_CITATION_v3_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"/>
+          <w:id w:val="-2060853531"/>
+          <w:placeholder>
+            <w:docPart w:val="DefaultPlaceholder_-1854013440"/>
+          </w:placeholder>
+        </w:sdtPr>
+        <w:sdtContent>
+          <w:r>
+            <w:rPr>
+              <w:rFonts w:ascii="Times New Roman" w:eastAsia="Times New Roman" w:hAnsi="Times New Roman" w:cs="Times New Roman"/>
+              <w:bCs/>
+              <w:color w:val="000000"/>
+              <w:sz w:val="20"/>
+              <w:szCs w:val="20"/>
+            </w:rPr>
+            <w:t>[79]</w:t>
+          </w:r>
+        </w:sdtContent>
+      </w:sdt>
+      <w:r>
+        <w:rPr>
+          <w:rFonts w:ascii="Times New Roman" w:eastAsia="Times New Roman" w:hAnsi="Times New Roman" w:cs="Times New Roman"/>
+          <w:bCs/>
+          <w:sz w:val="20"/>
+          <w:szCs w:val="20"/>
+        </w:rPr>
+        <w:t xml:space="preserve"> </w:t>
+      </w:r>
+      <w:r>
+        <w:rPr>
+          <w:rFonts w:ascii="Times New Roman" w:eastAsia="Times New Roman" w:hAnsi="Times New Roman" w:cs="Times New Roman"/>
+          <w:bCs/>
+          <w:sz w:val="20"/>
+          <w:szCs w:val="20"/>
+        </w:rPr>
+        <w:t>. Target pengguna dari intervensi ini bervariasi, mencakup remaja, orang dewasa muda, hingga anak-anak, dengan tujuan utama untuk terapi, edukasi, dan deteksi dini gangguan mental.</w:t>
+      </w:r>
+    </w:p>
+    <w:p>
+      <w:pPr>
+        <w:rPr>
+          <w:rFonts w:ascii="Times New Roman" w:eastAsia="Times New Roman" w:hAnsi="Times New Roman" w:cs="Times New Roman"/>
+          <w:bCs/>
+          <w:sz w:val="20"/>
+          <w:szCs w:val="20"/>
+        </w:rPr>
+      </w:pPr>
+      <w:r>
+        <w:rPr>
+          <w:rFonts w:ascii="Times New Roman" w:eastAsia="Times New Roman" w:hAnsi="Times New Roman" w:cs="Times New Roman"/>
+          <w:bCs/>
+          <w:sz w:val="20"/>
+          <w:szCs w:val="20"/>
+        </w:rPr>
+        <w:tab/>
+      </w:r>
+      <w:r>
+        <w:rPr>
+          <w:rFonts w:ascii="Times New Roman" w:eastAsia="Times New Roman" w:hAnsi="Times New Roman" w:cs="Times New Roman"/>
+          <w:bCs/>
+          <w:sz w:val="20"/>
+          <w:szCs w:val="20"/>
+        </w:rPr>
+        <w:t>Pada tahun 2022, berbagai studi di Indonesia mengembangkan intervensi digital untuk menangani gangguan mental seperti depresi dan kecemasan, menggunakan pendekatan teknologi yang beragam dan target pengguna yang spesifik. Beberapa penelitian berfokus pada remaja, seperti aplikasi mobile berbasis Human-Centered Design untuk terapi online bagi remaja yang mengalami depresi</w:t>
+      </w:r>
+      <w:r>
+        <w:rPr>
+          <w:rFonts w:ascii="Times New Roman" w:eastAsia="Times New Roman" w:hAnsi="Times New Roman" w:cs="Times New Roman"/>
+          <w:bCs/>
+          <w:sz w:val="20"/>
+          <w:szCs w:val="20"/>
+        </w:rPr>
+        <w:t xml:space="preserve"> </w:t>
+      </w:r>
+      <w:sdt>
+        <w:sdtPr>
+          <w:rPr>
+            <w:rFonts w:ascii="Times New Roman" w:eastAsia="Times New Roman" w:hAnsi="Times New Roman" w:cs="Times New Roman"/>
+            <w:bCs/>
+            <w:color w:val="000000"/>
+            <w:sz w:val="20"/>
+            <w:szCs w:val="20"/>
+          </w:rPr>
+          <w:tag w:val="MENDELEY_CITATION_v3_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"/>
+          <w:id w:val="-1588761556"/>
+          <w:placeholder>
+            <w:docPart w:val="DefaultPlaceholder_-1854013440"/>
+          </w:placeholder>
+        </w:sdtPr>
+        <w:sdtContent>
+          <w:r>
+            <w:rPr>
+              <w:rFonts w:ascii="Times New Roman" w:eastAsia="Times New Roman" w:hAnsi="Times New Roman" w:cs="Times New Roman"/>
+              <w:bCs/>
+              <w:color w:val="000000"/>
+              <w:sz w:val="20"/>
+              <w:szCs w:val="20"/>
+            </w:rPr>
+            <w:t>[48]</w:t>
+          </w:r>
+        </w:sdtContent>
+      </w:sdt>
+      <w:r>
+        <w:rPr>
+          <w:rFonts w:ascii="Times New Roman" w:eastAsia="Times New Roman" w:hAnsi="Times New Roman" w:cs="Times New Roman"/>
+          <w:bCs/>
+          <w:sz w:val="20"/>
+          <w:szCs w:val="20"/>
+        </w:rPr>
+        <w:t xml:space="preserve"> </w:t>
+      </w:r>
+      <w:r>
+        <w:rPr>
+          <w:rFonts w:ascii="Times New Roman" w:eastAsia="Times New Roman" w:hAnsi="Times New Roman" w:cs="Times New Roman"/>
+          <w:bCs/>
+          <w:sz w:val="20"/>
+          <w:szCs w:val="20"/>
+        </w:rPr>
+        <w:t>, aplikasi SDASI berbasis Android untuk psikoedukasi yang efektif dalam menurunkan tingkat depresi, kecemasan, dan stres pada remaja korban bullying</w:t>
+      </w:r>
+      <w:r>
+        <w:rPr>
+          <w:rFonts w:ascii="Times New Roman" w:eastAsia="Times New Roman" w:hAnsi="Times New Roman" w:cs="Times New Roman"/>
+          <w:bCs/>
+          <w:sz w:val="20"/>
+          <w:szCs w:val="20"/>
+        </w:rPr>
+        <w:t xml:space="preserve"> </w:t>
+      </w:r>
+      <w:sdt>
+        <w:sdtPr>
+          <w:rPr>
+            <w:rFonts w:ascii="Times New Roman" w:eastAsia="Times New Roman" w:hAnsi="Times New Roman" w:cs="Times New Roman"/>
+            <w:bCs/>
+            <w:color w:val="000000"/>
+            <w:sz w:val="20"/>
+            <w:szCs w:val="20"/>
+          </w:rPr>
+          <w:tag w:val="MENDELEY_CITATION_v3_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"/>
+          <w:id w:val="479281633"/>
+          <w:placeholder>
+            <w:docPart w:val="DefaultPlaceholder_-1854013440"/>
+          </w:placeholder>
+        </w:sdtPr>
+        <w:sdtContent>
+          <w:r>
+            <w:rPr>
+              <w:rFonts w:ascii="Times New Roman" w:eastAsia="Times New Roman" w:hAnsi="Times New Roman" w:cs="Times New Roman"/>
+              <w:bCs/>
+              <w:color w:val="000000"/>
+              <w:sz w:val="20"/>
+              <w:szCs w:val="20"/>
+            </w:rPr>
+            <w:t>[84]</w:t>
+          </w:r>
+        </w:sdtContent>
+      </w:sdt>
+      <w:r>
+        <w:rPr>
+          <w:rFonts w:ascii="Times New Roman" w:eastAsia="Times New Roman" w:hAnsi="Times New Roman" w:cs="Times New Roman"/>
+          <w:bCs/>
+          <w:color w:val="000000"/>
+          <w:sz w:val="20"/>
+          <w:szCs w:val="20"/>
+        </w:rPr>
+        <w:t xml:space="preserve"> </w:t>
+      </w:r>
+      <w:r>
+        <w:rPr>
+          <w:rFonts w:ascii="Times New Roman" w:eastAsia="Times New Roman" w:hAnsi="Times New Roman" w:cs="Times New Roman"/>
+          <w:bCs/>
+          <w:sz w:val="20"/>
+          <w:szCs w:val="20"/>
+        </w:rPr>
+        <w:t xml:space="preserve">, serta aplikasi Yurelax yang membantu remaja menjaga kesehatan mental melalui meditasi, yoga, musik relaksasi, dan pelacakan suasana hati </w:t>
+      </w:r>
+      <w:sdt>
+        <w:sdtPr>
+          <w:rPr>
+            <w:rFonts w:ascii="Times New Roman" w:eastAsia="Times New Roman" w:hAnsi="Times New Roman" w:cs="Times New Roman"/>
+            <w:bCs/>
+            <w:color w:val="000000"/>
+            <w:sz w:val="20"/>
+            <w:szCs w:val="20"/>
+          </w:rPr>
+          <w:tag w:val="MENDELEY_CITATION_v3_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"/>
+          <w:id w:val="2125728120"/>
+          <w:placeholder>
+            <w:docPart w:val="DefaultPlaceholder_-1854013440"/>
+          </w:placeholder>
+        </w:sdtPr>
+        <w:sdtContent>
+          <w:r>
+            <w:rPr>
+              <w:rFonts w:ascii="Times New Roman" w:eastAsia="Times New Roman" w:hAnsi="Times New Roman" w:cs="Times New Roman"/>
+              <w:bCs/>
+              <w:color w:val="000000"/>
+              <w:sz w:val="20"/>
+              <w:szCs w:val="20"/>
+            </w:rPr>
+            <w:t>[86]</w:t>
+          </w:r>
+        </w:sdtContent>
+      </w:sdt>
+      <w:r>
+        <w:rPr>
+          <w:rFonts w:ascii="Times New Roman" w:eastAsia="Times New Roman" w:hAnsi="Times New Roman" w:cs="Times New Roman"/>
+          <w:bCs/>
+          <w:sz w:val="20"/>
+          <w:szCs w:val="20"/>
+        </w:rPr>
+        <w:t>. Selain itu, game sebagai media terapi dikembangkan untuk memberikan alternatif dalam proses terapi bagi penderita depresi</w:t>
+      </w:r>
+      <w:r>
+        <w:rPr>
+          <w:rFonts w:ascii="Times New Roman" w:eastAsia="Times New Roman" w:hAnsi="Times New Roman" w:cs="Times New Roman"/>
+          <w:bCs/>
+          <w:sz w:val="20"/>
+          <w:szCs w:val="20"/>
+        </w:rPr>
+        <w:t xml:space="preserve"> </w:t>
+      </w:r>
+      <w:sdt>
+        <w:sdtPr>
+          <w:rPr>
+            <w:rFonts w:ascii="Times New Roman" w:eastAsia="Times New Roman" w:hAnsi="Times New Roman" w:cs="Times New Roman"/>
+            <w:bCs/>
+            <w:color w:val="000000"/>
+            <w:sz w:val="20"/>
+            <w:szCs w:val="20"/>
+          </w:rPr>
+          <w:tag w:val="MENDELEY_CITATION_v3_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"/>
+          <w:id w:val="-457729378"/>
+          <w:placeholder>
+            <w:docPart w:val="DefaultPlaceholder_-1854013440"/>
+          </w:placeholder>
+        </w:sdtPr>
+        <w:sdtContent>
+          <w:r>
+            <w:rPr>
+              <w:rFonts w:ascii="Times New Roman" w:eastAsia="Times New Roman" w:hAnsi="Times New Roman" w:cs="Times New Roman"/>
+              <w:bCs/>
+              <w:color w:val="000000"/>
+              <w:sz w:val="20"/>
+              <w:szCs w:val="20"/>
+            </w:rPr>
+            <w:t>[59]</w:t>
+          </w:r>
+        </w:sdtContent>
+      </w:sdt>
+      <w:r>
+        <w:rPr>
+          <w:rFonts w:ascii="Times New Roman" w:eastAsia="Times New Roman" w:hAnsi="Times New Roman" w:cs="Times New Roman"/>
+          <w:bCs/>
+          <w:sz w:val="20"/>
+          <w:szCs w:val="20"/>
+        </w:rPr>
+        <w:t xml:space="preserve"> , termasuk video game berbasis cerita untuk membantu penderita depresi melalui pengalaman bermain yang mendalam</w:t>
+      </w:r>
+      <w:r>
+        <w:rPr>
+          <w:rFonts w:ascii="Times New Roman" w:eastAsia="Times New Roman" w:hAnsi="Times New Roman" w:cs="Times New Roman"/>
+          <w:bCs/>
+          <w:sz w:val="20"/>
+          <w:szCs w:val="20"/>
+        </w:rPr>
+        <w:t xml:space="preserve"> </w:t>
+      </w:r>
+      <w:sdt>
+        <w:sdtPr>
+          <w:rPr>
+            <w:rFonts w:ascii="Times New Roman" w:eastAsia="Times New Roman" w:hAnsi="Times New Roman" w:cs="Times New Roman"/>
+            <w:bCs/>
+            <w:color w:val="000000"/>
+            <w:sz w:val="20"/>
+            <w:szCs w:val="20"/>
+          </w:rPr>
+          <w:tag w:val="MENDELEY_CITATION_v3_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"/>
+          <w:id w:val="-859959695"/>
+          <w:placeholder>
+            <w:docPart w:val="DefaultPlaceholder_-1854013440"/>
+          </w:placeholder>
+        </w:sdtPr>
+        <w:sdtContent>
+          <w:r>
+            <w:rPr>
+              <w:rFonts w:ascii="Times New Roman" w:eastAsia="Times New Roman" w:hAnsi="Times New Roman" w:cs="Times New Roman"/>
+              <w:bCs/>
+              <w:color w:val="000000"/>
+              <w:sz w:val="20"/>
+              <w:szCs w:val="20"/>
+            </w:rPr>
+            <w:t>[76]</w:t>
+          </w:r>
+        </w:sdtContent>
+      </w:sdt>
+      <w:r>
+        <w:rPr>
+          <w:rFonts w:ascii="Times New Roman" w:eastAsia="Times New Roman" w:hAnsi="Times New Roman" w:cs="Times New Roman"/>
+          <w:bCs/>
+          <w:sz w:val="20"/>
+          <w:szCs w:val="20"/>
+        </w:rPr>
+        <w:t xml:space="preserve"> </w:t>
+      </w:r>
+      <w:r>
+        <w:rPr>
+          <w:rFonts w:ascii="Times New Roman" w:eastAsia="Times New Roman" w:hAnsi="Times New Roman" w:cs="Times New Roman"/>
+          <w:bCs/>
+          <w:sz w:val="20"/>
+          <w:szCs w:val="20"/>
+        </w:rPr>
+        <w:t>. Pendekatan lain menggunakan sistem pakar berbasis web dengan metode Certainty Factor untuk mendiagnosis gangguan depresi</w:t>
+      </w:r>
+      <w:r>
+        <w:rPr>
+          <w:rFonts w:ascii="Times New Roman" w:eastAsia="Times New Roman" w:hAnsi="Times New Roman" w:cs="Times New Roman"/>
+          <w:bCs/>
+          <w:sz w:val="20"/>
+          <w:szCs w:val="20"/>
+        </w:rPr>
+        <w:t xml:space="preserve"> </w:t>
+      </w:r>
+      <w:sdt>
+        <w:sdtPr>
+          <w:rPr>
+            <w:rFonts w:ascii="Times New Roman" w:eastAsia="Times New Roman" w:hAnsi="Times New Roman" w:cs="Times New Roman"/>
+            <w:bCs/>
+            <w:color w:val="000000"/>
+            <w:sz w:val="20"/>
+            <w:szCs w:val="20"/>
+          </w:rPr>
+          <w:tag w:val="MENDELEY_CITATION_v3_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"/>
+          <w:id w:val="-1580359435"/>
+          <w:placeholder>
+            <w:docPart w:val="DefaultPlaceholder_-1854013440"/>
+          </w:placeholder>
+        </w:sdtPr>
+        <w:sdtContent>
+          <w:r>
+            <w:rPr>
+              <w:rFonts w:ascii="Times New Roman" w:eastAsia="Times New Roman" w:hAnsi="Times New Roman" w:cs="Times New Roman"/>
+              <w:bCs/>
+              <w:color w:val="000000"/>
+              <w:sz w:val="20"/>
+              <w:szCs w:val="20"/>
+            </w:rPr>
+            <w:t>[75]</w:t>
+          </w:r>
+        </w:sdtContent>
+      </w:sdt>
+      <w:r>
+        <w:rPr>
+          <w:rFonts w:ascii="Times New Roman" w:eastAsia="Times New Roman" w:hAnsi="Times New Roman" w:cs="Times New Roman"/>
+          <w:bCs/>
+          <w:sz w:val="20"/>
+          <w:szCs w:val="20"/>
+        </w:rPr>
+        <w:t xml:space="preserve"> dan aplikasi pendeteksi wajah berbasis metode Viola-Jones untuk mengenali ekspresi wajah yang berkaitan dengan kesehatan mental pada remaja</w:t>
+      </w:r>
+      <w:r>
+        <w:rPr>
+          <w:rFonts w:ascii="Times New Roman" w:eastAsia="Times New Roman" w:hAnsi="Times New Roman" w:cs="Times New Roman"/>
+          <w:bCs/>
+          <w:sz w:val="20"/>
+          <w:szCs w:val="20"/>
+        </w:rPr>
+        <w:t xml:space="preserve"> </w:t>
+      </w:r>
+      <w:sdt>
+        <w:sdtPr>
+          <w:rPr>
+            <w:rFonts w:ascii="Times New Roman" w:eastAsia="Times New Roman" w:hAnsi="Times New Roman" w:cs="Times New Roman"/>
+            <w:bCs/>
+            <w:color w:val="000000"/>
+            <w:sz w:val="20"/>
+            <w:szCs w:val="20"/>
+          </w:rPr>
+          <w:tag w:val="MENDELEY_CITATION_v3_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"/>
+          <w:id w:val="-1201316345"/>
+          <w:placeholder>
+            <w:docPart w:val="DefaultPlaceholder_-1854013440"/>
+          </w:placeholder>
+        </w:sdtPr>
+        <w:sdtContent>
+          <w:r>
+            <w:rPr>
+              <w:rFonts w:ascii="Times New Roman" w:eastAsia="Times New Roman" w:hAnsi="Times New Roman" w:cs="Times New Roman"/>
+              <w:bCs/>
+              <w:color w:val="000000"/>
+              <w:sz w:val="20"/>
+              <w:szCs w:val="20"/>
+            </w:rPr>
+            <w:t>[89]</w:t>
+          </w:r>
+        </w:sdtContent>
+      </w:sdt>
+      <w:r>
+        <w:rPr>
+          <w:rFonts w:ascii="Times New Roman" w:eastAsia="Times New Roman" w:hAnsi="Times New Roman" w:cs="Times New Roman"/>
+          <w:bCs/>
+          <w:sz w:val="20"/>
+          <w:szCs w:val="20"/>
+        </w:rPr>
+        <w:t xml:space="preserve"> . Tujuan penelitian ini beragam, mulai dari terapi, edukasi, hingga deteksi dini gangguan mental, seperti penerapan metode Dempster Shafer dalam sistem pakar untuk mendeteksi tingkat depresi dini pada mahasiswa tingkat akhir </w:t>
+      </w:r>
+      <w:sdt>
+        <w:sdtPr>
+          <w:rPr>
+            <w:rFonts w:ascii="Times New Roman" w:eastAsia="Times New Roman" w:hAnsi="Times New Roman" w:cs="Times New Roman"/>
+            <w:bCs/>
+            <w:color w:val="000000"/>
+            <w:sz w:val="20"/>
+            <w:szCs w:val="20"/>
+          </w:rPr>
+          <w:tag w:val="MENDELEY_CITATION_v3_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"/>
+          <w:id w:val="-1170871436"/>
+          <w:placeholder>
+            <w:docPart w:val="DefaultPlaceholder_-1854013440"/>
+          </w:placeholder>
+        </w:sdtPr>
+        <w:sdtContent>
+          <w:r>
+            <w:rPr>
+              <w:rFonts w:ascii="Times New Roman" w:eastAsia="Times New Roman" w:hAnsi="Times New Roman" w:cs="Times New Roman"/>
+              <w:bCs/>
+              <w:color w:val="000000"/>
+              <w:sz w:val="20"/>
+              <w:szCs w:val="20"/>
+            </w:rPr>
+            <w:t>[61]</w:t>
+          </w:r>
+        </w:sdtContent>
+      </w:sdt>
+      <w:r>
+        <w:rPr>
+          <w:rFonts w:ascii="Times New Roman" w:eastAsia="Times New Roman" w:hAnsi="Times New Roman" w:cs="Times New Roman"/>
+          <w:bCs/>
+          <w:sz w:val="20"/>
+          <w:szCs w:val="20"/>
+        </w:rPr>
+        <w:t xml:space="preserve"> </w:t>
+      </w:r>
+      <w:r>
+        <w:rPr>
+          <w:rFonts w:ascii="Times New Roman" w:eastAsia="Times New Roman" w:hAnsi="Times New Roman" w:cs="Times New Roman"/>
+          <w:bCs/>
+          <w:sz w:val="20"/>
+          <w:szCs w:val="20"/>
+        </w:rPr>
+        <w:t>dan metode K-Means Clustering untuk visualisasi informasi dari aplikasi deteksi dini depresi</w:t>
+      </w:r>
+      <w:r>
+        <w:rPr>
+          <w:rFonts w:ascii="Times New Roman" w:eastAsia="Times New Roman" w:hAnsi="Times New Roman" w:cs="Times New Roman"/>
+          <w:bCs/>
+          <w:sz w:val="20"/>
+          <w:szCs w:val="20"/>
+        </w:rPr>
+        <w:t xml:space="preserve"> </w:t>
+      </w:r>
+      <w:sdt>
+        <w:sdtPr>
+          <w:rPr>
+            <w:rFonts w:ascii="Times New Roman" w:eastAsia="Times New Roman" w:hAnsi="Times New Roman" w:cs="Times New Roman"/>
+            <w:bCs/>
+            <w:color w:val="000000"/>
+            <w:sz w:val="20"/>
+            <w:szCs w:val="20"/>
+          </w:rPr>
+          <w:tag w:val="MENDELEY_CITATION_v3_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"/>
+          <w:id w:val="-1586528472"/>
+          <w:placeholder>
+            <w:docPart w:val="DefaultPlaceholder_-1854013440"/>
+          </w:placeholder>
+        </w:sdtPr>
+        <w:sdtContent>
+          <w:r>
+            <w:rPr>
+              <w:rFonts w:ascii="Times New Roman" w:eastAsia="Times New Roman" w:hAnsi="Times New Roman" w:cs="Times New Roman"/>
+              <w:bCs/>
+              <w:color w:val="000000"/>
+              <w:sz w:val="20"/>
+              <w:szCs w:val="20"/>
+            </w:rPr>
+            <w:t>[74]</w:t>
+          </w:r>
+        </w:sdtContent>
+      </w:sdt>
+      <w:r>
+        <w:rPr>
+          <w:rFonts w:ascii="Times New Roman" w:eastAsia="Times New Roman" w:hAnsi="Times New Roman" w:cs="Times New Roman"/>
+          <w:bCs/>
+          <w:sz w:val="20"/>
+          <w:szCs w:val="20"/>
+        </w:rPr>
+        <w:t xml:space="preserve"> </w:t>
+      </w:r>
+      <w:r>
+        <w:rPr>
+          <w:rFonts w:ascii="Times New Roman" w:eastAsia="Times New Roman" w:hAnsi="Times New Roman" w:cs="Times New Roman"/>
+          <w:bCs/>
+          <w:sz w:val="20"/>
+          <w:szCs w:val="20"/>
+        </w:rPr>
+        <w:t>.</w:t>
+      </w:r>
+    </w:p>
+    <w:p>
+      <w:pPr>
+        <w:rPr>
+          <w:rFonts w:ascii="Times New Roman" w:eastAsia="Times New Roman" w:hAnsi="Times New Roman" w:cs="Times New Roman"/>
+          <w:bCs/>
+          <w:sz w:val="20"/>
+          <w:szCs w:val="20"/>
+        </w:rPr>
+      </w:pPr>
+      <w:r>
+        <w:rPr>
+          <w:rFonts w:ascii="Times New Roman" w:eastAsia="Times New Roman" w:hAnsi="Times New Roman" w:cs="Times New Roman"/>
+          <w:bCs/>
+          <w:sz w:val="20"/>
+          <w:szCs w:val="20"/>
+        </w:rPr>
+        <w:tab/>
+      </w:r>
+      <w:r>
+        <w:rPr>
+          <w:rFonts w:ascii="Times New Roman" w:eastAsia="Times New Roman" w:hAnsi="Times New Roman" w:cs="Times New Roman"/>
+          <w:bCs/>
+          <w:sz w:val="20"/>
+          <w:szCs w:val="20"/>
+        </w:rPr>
+        <w:t>Pada tahun 2023, berbagai studi di Indonesia menunjukkan bahwa intervensi digital menjadi pendekatan yang menjanjikan dalam menangani gangguan mental seperti depresi dan kecemasan, khususnya di kalangan remaja dan mahasiswa. Beberapa penelitian mengembangkan sistem pakar berbasis web untuk mendiagnosa tingkat depresi pada remaja menggunakan metode forward chaining</w:t>
+      </w:r>
+      <w:r>
+        <w:rPr>
+          <w:rFonts w:ascii="Times New Roman" w:eastAsia="Times New Roman" w:hAnsi="Times New Roman" w:cs="Times New Roman"/>
+          <w:bCs/>
+          <w:sz w:val="20"/>
+          <w:szCs w:val="20"/>
+        </w:rPr>
+        <w:t xml:space="preserve"> </w:t>
+      </w:r>
+      <w:sdt>
+        <w:sdtPr>
+          <w:rPr>
+            <w:rFonts w:ascii="Times New Roman" w:eastAsia="Times New Roman" w:hAnsi="Times New Roman" w:cs="Times New Roman"/>
+            <w:bCs/>
+            <w:color w:val="000000"/>
+            <w:sz w:val="20"/>
+            <w:szCs w:val="20"/>
+          </w:rPr>
+          <w:tag w:val="MENDELEY_CITATION_v3_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"/>
+          <w:id w:val="-497044465"/>
+          <w:placeholder>
+            <w:docPart w:val="DefaultPlaceholder_-1854013440"/>
+          </w:placeholder>
+        </w:sdtPr>
+        <w:sdtContent>
+          <w:r>
+            <w:rPr>
+              <w:rFonts w:ascii="Times New Roman" w:eastAsia="Times New Roman" w:hAnsi="Times New Roman" w:cs="Times New Roman"/>
+              <w:bCs/>
+              <w:color w:val="000000"/>
+              <w:sz w:val="20"/>
+              <w:szCs w:val="20"/>
+            </w:rPr>
+            <w:t>[53]</w:t>
+          </w:r>
+        </w:sdtContent>
+      </w:sdt>
+      <w:r>
+        <w:rPr>
+          <w:rFonts w:ascii="Times New Roman" w:eastAsia="Times New Roman" w:hAnsi="Times New Roman" w:cs="Times New Roman"/>
+          <w:bCs/>
+          <w:sz w:val="20"/>
+          <w:szCs w:val="20"/>
+        </w:rPr>
+        <w:t xml:space="preserve"> dan metode certainty factor untuk mahasiswa</w:t>
+      </w:r>
+      <w:r>
+        <w:rPr>
+          <w:rFonts w:ascii="Times New Roman" w:eastAsia="Times New Roman" w:hAnsi="Times New Roman" w:cs="Times New Roman"/>
+          <w:bCs/>
+          <w:sz w:val="20"/>
+          <w:szCs w:val="20"/>
+        </w:rPr>
+        <w:t xml:space="preserve"> </w:t>
+      </w:r>
+      <w:sdt>
+        <w:sdtPr>
+          <w:rPr>
+            <w:rFonts w:ascii="Times New Roman" w:eastAsia="Times New Roman" w:hAnsi="Times New Roman" w:cs="Times New Roman"/>
+            <w:bCs/>
+            <w:color w:val="000000"/>
+            <w:sz w:val="20"/>
+            <w:szCs w:val="20"/>
+          </w:rPr>
+          <w:tag w:val="MENDELEY_CITATION_v3_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"/>
+          <w:id w:val="-1987462446"/>
+          <w:placeholder>
+            <w:docPart w:val="DefaultPlaceholder_-1854013440"/>
+          </w:placeholder>
+        </w:sdtPr>
+        <w:sdtContent>
+          <w:r>
+            <w:rPr>
+              <w:rFonts w:ascii="Times New Roman" w:eastAsia="Times New Roman" w:hAnsi="Times New Roman" w:cs="Times New Roman"/>
+              <w:bCs/>
+              <w:color w:val="000000"/>
+              <w:sz w:val="20"/>
+              <w:szCs w:val="20"/>
+            </w:rPr>
+            <w:t>[51]</w:t>
+          </w:r>
+        </w:sdtContent>
+      </w:sdt>
+      <w:r>
+        <w:rPr>
+          <w:rFonts w:ascii="Times New Roman" w:eastAsia="Times New Roman" w:hAnsi="Times New Roman" w:cs="Times New Roman"/>
+          <w:bCs/>
+          <w:sz w:val="20"/>
+          <w:szCs w:val="20"/>
+        </w:rPr>
+        <w:t xml:space="preserve"> </w:t>
+      </w:r>
+      <w:r>
+        <w:rPr>
+          <w:rFonts w:ascii="Times New Roman" w:eastAsia="Times New Roman" w:hAnsi="Times New Roman" w:cs="Times New Roman"/>
+          <w:bCs/>
+          <w:sz w:val="20"/>
+          <w:szCs w:val="20"/>
+        </w:rPr>
+        <w:t>. Selain itu, aplikasi berbasis web dengan pendekatan user-centered design juga dirancang untuk mendukung kesehatan mental individu</w:t>
+      </w:r>
+      <w:r>
+        <w:rPr>
+          <w:rFonts w:ascii="Times New Roman" w:eastAsia="Times New Roman" w:hAnsi="Times New Roman" w:cs="Times New Roman"/>
+          <w:bCs/>
+          <w:sz w:val="20"/>
+          <w:szCs w:val="20"/>
+        </w:rPr>
+        <w:t xml:space="preserve"> </w:t>
+      </w:r>
+      <w:sdt>
+        <w:sdtPr>
+          <w:rPr>
+            <w:rFonts w:ascii="Times New Roman" w:eastAsia="Times New Roman" w:hAnsi="Times New Roman" w:cs="Times New Roman"/>
+            <w:bCs/>
+            <w:color w:val="000000"/>
+            <w:sz w:val="20"/>
+            <w:szCs w:val="20"/>
+          </w:rPr>
+          <w:tag w:val="MENDELEY_CITATION_v3_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"/>
+          <w:id w:val="1181707426"/>
+          <w:placeholder>
+            <w:docPart w:val="DefaultPlaceholder_-1854013440"/>
+          </w:placeholder>
+        </w:sdtPr>
+        <w:sdtContent>
+          <w:r>
+            <w:rPr>
+              <w:rFonts w:ascii="Times New Roman" w:eastAsia="Times New Roman" w:hAnsi="Times New Roman" w:cs="Times New Roman"/>
+              <w:bCs/>
+              <w:color w:val="000000"/>
+              <w:sz w:val="20"/>
+              <w:szCs w:val="20"/>
+            </w:rPr>
+            <w:t>[65]</w:t>
+          </w:r>
+        </w:sdtContent>
+      </w:sdt>
+      <w:r>
+        <w:rPr>
+          <w:rFonts w:ascii="Times New Roman" w:eastAsia="Times New Roman" w:hAnsi="Times New Roman" w:cs="Times New Roman"/>
+          <w:bCs/>
+          <w:sz w:val="20"/>
+          <w:szCs w:val="20"/>
+        </w:rPr>
+        <w:t xml:space="preserve"> . Dalam upaya edukasi, sebuah game interaktif adventure dirancang untuk anak usia 16–18 tahun sebagai upaya menjaga kesehatan mental</w:t>
+      </w:r>
+      <w:r>
+        <w:rPr>
+          <w:rFonts w:ascii="Times New Roman" w:eastAsia="Times New Roman" w:hAnsi="Times New Roman" w:cs="Times New Roman"/>
+          <w:bCs/>
+          <w:sz w:val="20"/>
+          <w:szCs w:val="20"/>
+        </w:rPr>
+        <w:t xml:space="preserve"> </w:t>
+      </w:r>
+      <w:sdt>
+        <w:sdtPr>
+          <w:rPr>
+            <w:rFonts w:ascii="Times New Roman" w:eastAsia="Times New Roman" w:hAnsi="Times New Roman" w:cs="Times New Roman"/>
+            <w:bCs/>
+            <w:color w:val="000000"/>
+            <w:sz w:val="20"/>
+            <w:szCs w:val="20"/>
+          </w:rPr>
+          <w:tag w:val="MENDELEY_CITATION_v3_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"/>
+          <w:id w:val="827714069"/>
+          <w:placeholder>
+            <w:docPart w:val="DefaultPlaceholder_-1854013440"/>
+          </w:placeholder>
+        </w:sdtPr>
+        <w:sdtContent>
+          <w:r>
+            <w:rPr>
+              <w:rFonts w:ascii="Times New Roman" w:eastAsia="Times New Roman" w:hAnsi="Times New Roman" w:cs="Times New Roman"/>
+              <w:bCs/>
+              <w:color w:val="000000"/>
+              <w:sz w:val="20"/>
+              <w:szCs w:val="20"/>
+            </w:rPr>
+            <w:t>[49]</w:t>
+          </w:r>
+        </w:sdtContent>
+      </w:sdt>
+      <w:r>
+        <w:rPr>
+          <w:rFonts w:ascii="Times New Roman" w:eastAsia="Times New Roman" w:hAnsi="Times New Roman" w:cs="Times New Roman"/>
+          <w:bCs/>
+          <w:sz w:val="20"/>
+          <w:szCs w:val="20"/>
+        </w:rPr>
+        <w:t xml:space="preserve"> </w:t>
+      </w:r>
+      <w:r>
+        <w:rPr>
+          <w:rFonts w:ascii="Times New Roman" w:eastAsia="Times New Roman" w:hAnsi="Times New Roman" w:cs="Times New Roman"/>
+          <w:bCs/>
+          <w:sz w:val="20"/>
+          <w:szCs w:val="20"/>
+        </w:rPr>
+        <w:t>. Platform seperti Mentality.id dikembangkan sebagai wadah edukasi pentingnya kesehatan mental dan mengatasi mental illness melalui sistem pakar berbasis website</w:t>
+      </w:r>
+      <w:r>
+        <w:rPr>
+          <w:rFonts w:ascii="Times New Roman" w:eastAsia="Times New Roman" w:hAnsi="Times New Roman" w:cs="Times New Roman"/>
+          <w:bCs/>
+          <w:sz w:val="20"/>
+          <w:szCs w:val="20"/>
+        </w:rPr>
+        <w:t xml:space="preserve"> </w:t>
+      </w:r>
+      <w:sdt>
+        <w:sdtPr>
+          <w:rPr>
+            <w:rFonts w:ascii="Times New Roman" w:eastAsia="Times New Roman" w:hAnsi="Times New Roman" w:cs="Times New Roman"/>
+            <w:bCs/>
+            <w:color w:val="000000"/>
+            <w:sz w:val="20"/>
+            <w:szCs w:val="20"/>
+          </w:rPr>
+          <w:tag w:val="MENDELEY_CITATION_v3_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"/>
+          <w:id w:val="-1318033404"/>
+          <w:placeholder>
+            <w:docPart w:val="DefaultPlaceholder_-1854013440"/>
+          </w:placeholder>
+        </w:sdtPr>
+        <w:sdtContent>
+          <w:r>
+            <w:rPr>
+              <w:rFonts w:ascii="Times New Roman" w:eastAsia="Times New Roman" w:hAnsi="Times New Roman" w:cs="Times New Roman"/>
+              <w:bCs/>
+              <w:color w:val="000000"/>
+              <w:sz w:val="20"/>
+              <w:szCs w:val="20"/>
+            </w:rPr>
+            <w:t>[60]</w:t>
+          </w:r>
+        </w:sdtContent>
+      </w:sdt>
+      <w:r>
+        <w:rPr>
+          <w:rFonts w:ascii="Times New Roman" w:eastAsia="Times New Roman" w:hAnsi="Times New Roman" w:cs="Times New Roman"/>
+          <w:bCs/>
+          <w:sz w:val="20"/>
+          <w:szCs w:val="20"/>
+        </w:rPr>
+        <w:t xml:space="preserve"> </w:t>
+      </w:r>
+      <w:r>
+        <w:rPr>
+          <w:rFonts w:ascii="Times New Roman" w:eastAsia="Times New Roman" w:hAnsi="Times New Roman" w:cs="Times New Roman"/>
+          <w:bCs/>
+          <w:sz w:val="20"/>
+          <w:szCs w:val="20"/>
+        </w:rPr>
+        <w:t>. Untuk remaja korban kekerasan, panduan konseling berbasis website dengan teknik imagery and visualitation serta teknik desensitisasi sistematis dikembangkan untuk mengatasi depresi dan stres</w:t>
+      </w:r>
+      <w:r>
+        <w:rPr>
+          <w:rFonts w:ascii="Times New Roman" w:eastAsia="Times New Roman" w:hAnsi="Times New Roman" w:cs="Times New Roman"/>
+          <w:bCs/>
+          <w:sz w:val="20"/>
+          <w:szCs w:val="20"/>
+        </w:rPr>
+        <w:t xml:space="preserve"> </w:t>
+      </w:r>
+      <w:sdt>
+        <w:sdtPr>
+          <w:rPr>
+            <w:rFonts w:ascii="Times New Roman" w:eastAsia="Times New Roman" w:hAnsi="Times New Roman" w:cs="Times New Roman"/>
+            <w:bCs/>
+            <w:color w:val="000000"/>
+            <w:sz w:val="20"/>
+            <w:szCs w:val="20"/>
+          </w:rPr>
+          <w:tag w:val="MENDELEY_CITATION_v3_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"/>
+          <w:id w:val="-1206870558"/>
+          <w:placeholder>
+            <w:docPart w:val="DefaultPlaceholder_-1854013440"/>
+          </w:placeholder>
+        </w:sdtPr>
+        <w:sdtContent>
+          <w:r>
+            <w:rPr>
+              <w:rFonts w:ascii="Times New Roman" w:eastAsia="Times New Roman" w:hAnsi="Times New Roman" w:cs="Times New Roman"/>
+              <w:bCs/>
+              <w:color w:val="000000"/>
+              <w:sz w:val="20"/>
+              <w:szCs w:val="20"/>
+            </w:rPr>
+            <w:t>[66]</w:t>
+          </w:r>
+        </w:sdtContent>
+      </w:sdt>
+      <w:r>
+        <w:rPr>
+          <w:rFonts w:ascii="Times New Roman" w:eastAsia="Times New Roman" w:hAnsi="Times New Roman" w:cs="Times New Roman"/>
+          <w:bCs/>
+          <w:sz w:val="20"/>
+          <w:szCs w:val="20"/>
+        </w:rPr>
+        <w:t xml:space="preserve"> </w:t>
+      </w:r>
+      <w:sdt>
+        <w:sdtPr>
+          <w:rPr>
+            <w:rFonts w:ascii="Times New Roman" w:eastAsia="Times New Roman" w:hAnsi="Times New Roman" w:cs="Times New Roman"/>
+            <w:bCs/>
+            <w:color w:val="000000"/>
+            <w:sz w:val="20"/>
+            <w:szCs w:val="20"/>
+          </w:rPr>
+          <w:tag w:val="MENDELEY_CITATION_v3_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"/>
+          <w:id w:val="976650321"/>
+          <w:placeholder>
+            <w:docPart w:val="DefaultPlaceholder_-1854013440"/>
+          </w:placeholder>
+        </w:sdtPr>
+        <w:sdtContent>
+          <w:r>
+            <w:rPr>
+              <w:rFonts w:ascii="Times New Roman" w:eastAsia="Times New Roman" w:hAnsi="Times New Roman" w:cs="Times New Roman"/>
+              <w:bCs/>
+              <w:color w:val="000000"/>
+              <w:sz w:val="20"/>
+              <w:szCs w:val="20"/>
+            </w:rPr>
+            <w:t>[73]</w:t>
+          </w:r>
+        </w:sdtContent>
+      </w:sdt>
+      <w:r>
+        <w:rPr>
+          <w:rFonts w:ascii="Times New Roman" w:eastAsia="Times New Roman" w:hAnsi="Times New Roman" w:cs="Times New Roman"/>
+          <w:bCs/>
+          <w:sz w:val="20"/>
+          <w:szCs w:val="20"/>
+        </w:rPr>
+        <w:t>. Secara keseluruhan, intervensi digital ini bertujuan untuk terapi, edukasi, dan pencegahan, dengan target pengguna utama adalah remaja dan mahasiswa.</w:t>
+      </w:r>
+    </w:p>
+    <w:p>
+      <w:pPr>
+        <w:rPr>
+          <w:rFonts w:ascii="Times New Roman" w:eastAsia="Times New Roman" w:hAnsi="Times New Roman" w:cs="Times New Roman"/>
+          <w:bCs/>
+          <w:sz w:val="20"/>
+          <w:szCs w:val="20"/>
+        </w:rPr>
+      </w:pPr>
+      <w:r>
+        <w:rPr>
+          <w:rFonts w:ascii="Times New Roman" w:eastAsia="Times New Roman" w:hAnsi="Times New Roman" w:cs="Times New Roman"/>
+          <w:bCs/>
+          <w:sz w:val="20"/>
+          <w:szCs w:val="20"/>
+        </w:rPr>
+        <w:tab/>
+      </w:r>
+      <w:r>
+        <w:rPr>
+          <w:rFonts w:ascii="Times New Roman" w:eastAsia="Times New Roman" w:hAnsi="Times New Roman" w:cs="Times New Roman"/>
+          <w:bCs/>
+          <w:sz w:val="20"/>
+          <w:szCs w:val="20"/>
+        </w:rPr>
+        <w:t>Pada tahun 2024, berbagai studi di Indonesia menunjukkan peningkatan signifikan dalam pengembangan intervensi digital untuk menangani gangguan mental seperti depresi dan kecemasan, dengan fokus pada penggunaan teknologi seperti aplikasi mobile, website, dan sistem pakar. Beberapa penelitian menyoroti pentingnya edukasi kesehatan mental melalui aplikasi berbasis Progressive Web App yang dirancang untuk remaja dan mahasiswa, yang terbukti meningkatkan pengetahuan pengguna tentang kesehatan mental</w:t>
+      </w:r>
+      <w:r>
+        <w:rPr>
+          <w:rFonts w:ascii="Times New Roman" w:eastAsia="Times New Roman" w:hAnsi="Times New Roman" w:cs="Times New Roman"/>
+          <w:bCs/>
+          <w:sz w:val="20"/>
+          <w:szCs w:val="20"/>
+        </w:rPr>
+        <w:t xml:space="preserve"> </w:t>
+      </w:r>
+      <w:sdt>
+        <w:sdtPr>
+          <w:rPr>
+            <w:rFonts w:ascii="Times New Roman" w:eastAsia="Times New Roman" w:hAnsi="Times New Roman" w:cs="Times New Roman"/>
+            <w:bCs/>
+            <w:color w:val="000000"/>
+            <w:sz w:val="20"/>
+            <w:szCs w:val="20"/>
+          </w:rPr>
+          <w:tag w:val="MENDELEY_CITATION_v3_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"/>
+          <w:id w:val="-1087532456"/>
+          <w:placeholder>
+            <w:docPart w:val="DefaultPlaceholder_-1854013440"/>
+          </w:placeholder>
+        </w:sdtPr>
+        <w:sdtContent>
+          <w:r>
+            <w:rPr>
+              <w:rFonts w:ascii="Times New Roman" w:eastAsia="Times New Roman" w:hAnsi="Times New Roman" w:cs="Times New Roman"/>
+              <w:bCs/>
+              <w:color w:val="000000"/>
+              <w:sz w:val="20"/>
+              <w:szCs w:val="20"/>
+            </w:rPr>
+            <w:t>[46]</w:t>
+          </w:r>
+        </w:sdtContent>
+      </w:sdt>
+      <w:r>
+        <w:rPr>
+          <w:rFonts w:ascii="Times New Roman" w:eastAsia="Times New Roman" w:hAnsi="Times New Roman" w:cs="Times New Roman"/>
+          <w:bCs/>
+          <w:sz w:val="20"/>
+          <w:szCs w:val="20"/>
+        </w:rPr>
+        <w:t xml:space="preserve"> </w:t>
+      </w:r>
+      <w:r>
+        <w:rPr>
+          <w:rFonts w:ascii="Times New Roman" w:eastAsia="Times New Roman" w:hAnsi="Times New Roman" w:cs="Times New Roman"/>
+          <w:bCs/>
+          <w:sz w:val="20"/>
+          <w:szCs w:val="20"/>
+        </w:rPr>
+        <w:lastRenderedPageBreak/>
+        <w:t xml:space="preserve">. Selain itu, pengembangan aplikasi skrining awal depresi berbasis Android dengan metode prototyping menunjukkan efektivitas tinggi dalam mendeteksi gejala awal depresi pada mahasiswa </w:t>
+      </w:r>
+      <w:sdt>
+        <w:sdtPr>
+          <w:rPr>
+            <w:rFonts w:ascii="Times New Roman" w:eastAsia="Times New Roman" w:hAnsi="Times New Roman" w:cs="Times New Roman"/>
+            <w:bCs/>
+            <w:color w:val="000000"/>
+            <w:sz w:val="20"/>
+            <w:szCs w:val="20"/>
+          </w:rPr>
+          <w:tag w:val="MENDELEY_CITATION_v3_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"/>
+          <w:id w:val="2112081990"/>
+          <w:placeholder>
+            <w:docPart w:val="DefaultPlaceholder_-1854013440"/>
+          </w:placeholder>
+        </w:sdtPr>
+        <w:sdtContent>
+          <w:r>
+            <w:rPr>
+              <w:rFonts w:ascii="Times New Roman" w:eastAsia="Times New Roman" w:hAnsi="Times New Roman" w:cs="Times New Roman"/>
+              <w:bCs/>
+              <w:color w:val="000000"/>
+              <w:sz w:val="20"/>
+              <w:szCs w:val="20"/>
+            </w:rPr>
+            <w:t>[54]</w:t>
+          </w:r>
+        </w:sdtContent>
+      </w:sdt>
+      <w:r>
+        <w:rPr>
+          <w:rFonts w:ascii="Times New Roman" w:eastAsia="Times New Roman" w:hAnsi="Times New Roman" w:cs="Times New Roman"/>
+          <w:bCs/>
+          <w:sz w:val="20"/>
+          <w:szCs w:val="20"/>
+        </w:rPr>
+        <w:t xml:space="preserve"> </w:t>
+      </w:r>
+      <w:r>
+        <w:rPr>
+          <w:rFonts w:ascii="Times New Roman" w:eastAsia="Times New Roman" w:hAnsi="Times New Roman" w:cs="Times New Roman"/>
+          <w:bCs/>
+          <w:sz w:val="20"/>
+          <w:szCs w:val="20"/>
+        </w:rPr>
+        <w:t>. Penggunaan algoritma machine learning seperti random forest dalam aplikasi web 'MentalWell' juga telah diterapkan untuk mengklasifikasikan kondisi kesehatan mental remaja dan memberikan rekomendasi intervensi yang sesuai</w:t>
+      </w:r>
+      <w:r>
+        <w:rPr>
+          <w:rFonts w:ascii="Times New Roman" w:eastAsia="Times New Roman" w:hAnsi="Times New Roman" w:cs="Times New Roman"/>
+          <w:bCs/>
+          <w:sz w:val="20"/>
+          <w:szCs w:val="20"/>
+        </w:rPr>
+        <w:t xml:space="preserve"> </w:t>
+      </w:r>
+      <w:sdt>
+        <w:sdtPr>
+          <w:rPr>
+            <w:rFonts w:ascii="Times New Roman" w:eastAsia="Times New Roman" w:hAnsi="Times New Roman" w:cs="Times New Roman"/>
+            <w:bCs/>
+            <w:color w:val="000000"/>
+            <w:sz w:val="20"/>
+            <w:szCs w:val="20"/>
+          </w:rPr>
+          <w:tag w:val="MENDELEY_CITATION_v3_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"/>
+          <w:id w:val="-1095932873"/>
+          <w:placeholder>
+            <w:docPart w:val="DefaultPlaceholder_-1854013440"/>
+          </w:placeholder>
+        </w:sdtPr>
+        <w:sdtContent>
+          <w:r>
+            <w:rPr>
+              <w:rFonts w:ascii="Times New Roman" w:eastAsia="Times New Roman" w:hAnsi="Times New Roman" w:cs="Times New Roman"/>
+              <w:bCs/>
+              <w:color w:val="000000"/>
+              <w:sz w:val="20"/>
+              <w:szCs w:val="20"/>
+            </w:rPr>
+            <w:t>[56]</w:t>
+          </w:r>
+        </w:sdtContent>
+      </w:sdt>
+      <w:r>
+        <w:rPr>
+          <w:rFonts w:ascii="Times New Roman" w:eastAsia="Times New Roman" w:hAnsi="Times New Roman" w:cs="Times New Roman"/>
+          <w:bCs/>
+          <w:sz w:val="20"/>
+          <w:szCs w:val="20"/>
+        </w:rPr>
+        <w:t xml:space="preserve">. Sistem pakar yang menggabungkan metode forward chaining dan certainty factor telah dikembangkan untuk mendiagnosis gangguan mental pada remaja, dengan tingkat akurasi yang sangat tinggi </w:t>
+      </w:r>
+      <w:sdt>
+        <w:sdtPr>
+          <w:rPr>
+            <w:rFonts w:ascii="Times New Roman" w:eastAsia="Times New Roman" w:hAnsi="Times New Roman" w:cs="Times New Roman"/>
+            <w:bCs/>
+            <w:color w:val="000000"/>
+            <w:sz w:val="20"/>
+            <w:szCs w:val="20"/>
+          </w:rPr>
+          <w:tag w:val="MENDELEY_CITATION_v3_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"/>
+          <w:id w:val="1848670151"/>
+          <w:placeholder>
+            <w:docPart w:val="DefaultPlaceholder_-1854013440"/>
+          </w:placeholder>
+        </w:sdtPr>
+        <w:sdtContent>
+          <w:r>
+            <w:rPr>
+              <w:rFonts w:ascii="Times New Roman" w:eastAsia="Times New Roman" w:hAnsi="Times New Roman" w:cs="Times New Roman"/>
+              <w:bCs/>
+              <w:color w:val="000000"/>
+              <w:sz w:val="20"/>
+              <w:szCs w:val="20"/>
+            </w:rPr>
+            <w:t>[68]</w:t>
+          </w:r>
+        </w:sdtContent>
+      </w:sdt>
+      <w:r>
+        <w:rPr>
+          <w:rFonts w:ascii="Times New Roman" w:eastAsia="Times New Roman" w:hAnsi="Times New Roman" w:cs="Times New Roman"/>
+          <w:bCs/>
+          <w:sz w:val="20"/>
+          <w:szCs w:val="20"/>
+        </w:rPr>
+        <w:t xml:space="preserve">. Selain itu, platform konsultasi mental online berbasis website dengan implementasi frontend menggunakan ReactJS telah dirancang untuk memfasilitasi akses mudah ke layanan konsultasi bagi mahasiswa dan masyarakat umum </w:t>
+      </w:r>
+      <w:sdt>
+        <w:sdtPr>
+          <w:rPr>
+            <w:rFonts w:ascii="Times New Roman" w:eastAsia="Times New Roman" w:hAnsi="Times New Roman" w:cs="Times New Roman"/>
+            <w:bCs/>
+            <w:color w:val="000000"/>
+            <w:sz w:val="20"/>
+            <w:szCs w:val="20"/>
+          </w:rPr>
+          <w:tag w:val="MENDELEY_CITATION_v3_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"/>
+          <w:id w:val="486370752"/>
+          <w:placeholder>
+            <w:docPart w:val="DefaultPlaceholder_-1854013440"/>
+          </w:placeholder>
+        </w:sdtPr>
+        <w:sdtContent>
+          <w:r>
+            <w:rPr>
+              <w:rFonts w:ascii="Times New Roman" w:eastAsia="Times New Roman" w:hAnsi="Times New Roman" w:cs="Times New Roman"/>
+              <w:bCs/>
+              <w:color w:val="000000"/>
+              <w:sz w:val="20"/>
+              <w:szCs w:val="20"/>
+            </w:rPr>
+            <w:t>[77]</w:t>
+          </w:r>
+        </w:sdtContent>
+      </w:sdt>
+      <w:r>
+        <w:rPr>
+          <w:rFonts w:ascii="Times New Roman" w:eastAsia="Times New Roman" w:hAnsi="Times New Roman" w:cs="Times New Roman"/>
+          <w:bCs/>
+          <w:color w:val="000000"/>
+          <w:sz w:val="20"/>
+          <w:szCs w:val="20"/>
+        </w:rPr>
+        <w:t xml:space="preserve"> </w:t>
+      </w:r>
+      <w:r>
+        <w:rPr>
+          <w:rFonts w:ascii="Times New Roman" w:eastAsia="Times New Roman" w:hAnsi="Times New Roman" w:cs="Times New Roman"/>
+          <w:bCs/>
+          <w:sz w:val="20"/>
+          <w:szCs w:val="20"/>
+        </w:rPr>
+        <w:t>. Secara keseluruhan, intervensi digital ini bertujuan untuk terapi, edukasi, dan deteksi dini gangguan mental, dengan target pengguna utama adalah remaja, mahasiswa, dan masyarakat umum yang rentan terhadap masalah kesehatan mental.</w:t>
+      </w:r>
+    </w:p>
+    <w:p>
+      <w:pPr>
+        <w:rPr>
+          <w:rFonts w:ascii="Times New Roman" w:eastAsia="Times New Roman" w:hAnsi="Times New Roman" w:cs="Times New Roman"/>
+          <w:bCs/>
+          <w:sz w:val="20"/>
+          <w:szCs w:val="20"/>
+        </w:rPr>
+      </w:pPr>
+      <w:r>
+        <w:rPr>
+          <w:rFonts w:ascii="Times New Roman" w:eastAsia="Times New Roman" w:hAnsi="Times New Roman" w:cs="Times New Roman"/>
+          <w:bCs/>
+          <w:sz w:val="20"/>
+          <w:szCs w:val="20"/>
+        </w:rPr>
+        <w:tab/>
+      </w:r>
+      <w:r>
+        <w:rPr>
+          <w:rFonts w:ascii="Times New Roman" w:eastAsia="Times New Roman" w:hAnsi="Times New Roman" w:cs="Times New Roman"/>
+          <w:bCs/>
+          <w:sz w:val="20"/>
+          <w:szCs w:val="20"/>
+        </w:rPr>
+        <w:t>Dari tahun 2020 hingga 2024, tren intervensi digital untuk kesehatan mental di Indonesia menunjukkan perkembangan pesat dan beragam. Pada awalnya, pendekatan berfokus pada pengembangan game edukatif dan aplikasi berbasis Acceptance and Commitment Therapy (ACT) untuk meningkatkan literasi dan dukungan psikologis bagi remaja dan dewasa muda. Seiring waktu, inovasi meluas dengan integrasi metode psikospiritual Islam, sistem pakar berbasis web, serta penerapan machine learning untuk deteksi dini gangguan mental melalui analisis media sosial. Pendekatan Human-Centered Design juga mulai diterapkan dalam aplikasi terapi online, sementara fitur seperti meditasi, yoga, dan pelacakan suasana hati diintegrasikan untuk mendukung kesejahteraan mental remaja. Pada tahun-tahun berikutnya, teknologi seperti Progressive Web App, algoritma random forest, dan deep learning digunakan dalam aplikasi untuk klasifikasi kondisi mental dan pemberian rekomendasi intervensi. Platform konsultasi online berbasis ReactJS juga dikembangkan untuk meningkatkan akses layanan. Secara keseluruhan, intervensi digital ini bertujuan untuk terapi, edukasi, dan deteksi dini gangguan mental, dengan fokus utama pada remaja, mahasiswa, dan masyarakat umum yang rentan terhadap masalah kesehatan mental.</w:t>
+      </w:r>
+    </w:p>
+    <w:p>
+      <w:pPr>
+        <w:rPr>
+          <w:rFonts w:ascii="Times New Roman" w:eastAsia="Times New Roman" w:hAnsi="Times New Roman" w:cs="Times New Roman"/>
+          <w:bCs/>
           <w:sz w:val="20"/>
           <w:szCs w:val="20"/>
         </w:rPr>
@@ -4651,26 +6148,7 @@
       <w:pPr>
         <w:rPr>
           <w:rFonts w:ascii="Times New Roman" w:eastAsia="Times New Roman" w:hAnsi="Times New Roman" w:cs="Times New Roman"/>
-          <w:b/>
-          <w:sz w:val="20"/>
-          <w:szCs w:val="20"/>
-        </w:rPr>
-      </w:pPr>
-      <w:r>
-        <w:rPr>
-          <w:rFonts w:ascii="Times New Roman" w:eastAsia="Times New Roman" w:hAnsi="Times New Roman" w:cs="Times New Roman"/>
-          <w:b/>
-          <w:sz w:val="20"/>
-          <w:szCs w:val="20"/>
-        </w:rPr>
-        <w:t>Gabungan dari dua bingkai analisis</w:t>
-      </w:r>
-    </w:p>
-    <w:p>
-      <w:pPr>
-        <w:rPr>
-          <w:rFonts w:ascii="Times New Roman" w:eastAsia="Times New Roman" w:hAnsi="Times New Roman" w:cs="Times New Roman"/>
-          <w:b/>
+          <w:bCs/>
           <w:sz w:val="20"/>
           <w:szCs w:val="20"/>
         </w:rPr>
@@ -4680,6 +6158,7 @@
       <w:pPr>
         <w:rPr>
           <w:rFonts w:ascii="Times New Roman" w:eastAsia="Times New Roman" w:hAnsi="Times New Roman" w:cs="Times New Roman"/>
+          <w:bCs/>
           <w:sz w:val="20"/>
           <w:szCs w:val="20"/>
         </w:rPr>
@@ -4687,43 +6166,18 @@
       <w:r>
         <w:rPr>
           <w:rFonts w:ascii="Times New Roman" w:eastAsia="Times New Roman" w:hAnsi="Times New Roman" w:cs="Times New Roman"/>
-          <w:sz w:val="20"/>
-          <w:szCs w:val="20"/>
-        </w:rPr>
-        <w:t xml:space="preserve">Pengembangan game edukasi tentang depresi didasari oleh tingginya prevalensi gangguan depresi di kalangan remaja, yang menurut </w:t>
-      </w:r>
-      <w:r>
-        <w:rPr>
-          <w:rFonts w:ascii="Times New Roman" w:eastAsia="Times New Roman" w:hAnsi="Times New Roman" w:cs="Times New Roman"/>
-          <w:i/>
-          <w:sz w:val="20"/>
-          <w:szCs w:val="20"/>
-        </w:rPr>
-        <w:t>World Health Organization</w:t>
-      </w:r>
-      <w:r>
-        <w:rPr>
-          <w:rFonts w:ascii="Times New Roman" w:eastAsia="Times New Roman" w:hAnsi="Times New Roman" w:cs="Times New Roman"/>
-          <w:sz w:val="20"/>
-          <w:szCs w:val="20"/>
-        </w:rPr>
-        <w:t xml:space="preserve"> mencapai jutaan kasus tiap tahunnya [1]. Data Kementerian Kesehatan Republik Indonesia juga menunjukkan bahwa gangguan kesehatan mental, termasuk depresi, semakin mengemuka sebagai masalah publik dengan kebutuhan penanganan yang mendesak [2]. Dengan menggunakan media interaktif seperti game, diharapkan pesan-pesan edukatif tentang gejala, penyebab, dan </w:t>
-      </w:r>
-      <w:r>
-        <w:rPr>
-          <w:rFonts w:ascii="Times New Roman" w:eastAsia="Times New Roman" w:hAnsi="Times New Roman" w:cs="Times New Roman"/>
-          <w:sz w:val="20"/>
-          <w:szCs w:val="20"/>
-        </w:rPr>
-        <w:lastRenderedPageBreak/>
-        <w:t>strategi coping depresi dapat tersampaikan secara lebih menarik dan mudah diingat oleh audiens muda [3]. Game dengan alur cerita yang desainnya menggambarkan perjalanan tokoh menghadapi gejala depresi memungkinkan pemain merasakan pengalaman empatik, sekaligus memperoleh pengetahuan praktis tentang cara mengenali tanda-tanda awal depresi. Selain itu, format digital game memfasilitasi penyebaran yang lebih luas, karena remaja cenderung menggunakan smartphone dan perangkat digital secara aktif dalam kehidupan sehari-hari.</w:t>
+          <w:bCs/>
+          <w:sz w:val="20"/>
+          <w:szCs w:val="20"/>
+        </w:rPr>
+        <w:tab/>
       </w:r>
     </w:p>
     <w:p>
       <w:pPr>
-        <w:ind w:firstLine="720"/>
-        <w:rPr>
-          <w:rFonts w:ascii="Times New Roman" w:eastAsia="Times New Roman" w:hAnsi="Times New Roman" w:cs="Times New Roman"/>
+        <w:rPr>
+          <w:rFonts w:ascii="Times New Roman" w:eastAsia="Times New Roman" w:hAnsi="Times New Roman" w:cs="Times New Roman"/>
+          <w:bCs/>
           <w:sz w:val="20"/>
           <w:szCs w:val="20"/>
         </w:rPr>
@@ -4731,166 +6185,22 @@
       <w:r>
         <w:rPr>
           <w:rFonts w:ascii="Times New Roman" w:eastAsia="Times New Roman" w:hAnsi="Times New Roman" w:cs="Times New Roman"/>
-          <w:sz w:val="20"/>
-          <w:szCs w:val="20"/>
-        </w:rPr>
-        <w:t>Metode ADDIE dipilih sebagai kerangka kerja pengembangan game ini karena menyediakan langkah terstruktur—</w:t>
-      </w:r>
-      <w:r>
-        <w:rPr>
-          <w:rFonts w:ascii="Times New Roman" w:eastAsia="Times New Roman" w:hAnsi="Times New Roman" w:cs="Times New Roman"/>
-          <w:i/>
-          <w:sz w:val="20"/>
-          <w:szCs w:val="20"/>
-        </w:rPr>
-        <w:t>Analysis, Design, Development, Implementation</w:t>
-      </w:r>
-      <w:r>
-        <w:rPr>
-          <w:rFonts w:ascii="Times New Roman" w:eastAsia="Times New Roman" w:hAnsi="Times New Roman" w:cs="Times New Roman"/>
-          <w:sz w:val="20"/>
-          <w:szCs w:val="20"/>
-        </w:rPr>
-        <w:t xml:space="preserve">, dan </w:t>
-      </w:r>
-      <w:r>
-        <w:rPr>
-          <w:rFonts w:ascii="Times New Roman" w:eastAsia="Times New Roman" w:hAnsi="Times New Roman" w:cs="Times New Roman"/>
-          <w:i/>
-          <w:sz w:val="20"/>
-          <w:szCs w:val="20"/>
-        </w:rPr>
-        <w:t>Evaluation</w:t>
-      </w:r>
-      <w:r>
-        <w:rPr>
-          <w:rFonts w:ascii="Times New Roman" w:eastAsia="Times New Roman" w:hAnsi="Times New Roman" w:cs="Times New Roman"/>
-          <w:sz w:val="20"/>
-          <w:szCs w:val="20"/>
-        </w:rPr>
-        <w:t xml:space="preserve">—yang sangat cocok untuk memastikan setiap fase pembuatan konten edukasi berjalan sistematis [4]. Pada tahap </w:t>
-      </w:r>
-      <w:r>
-        <w:rPr>
-          <w:rFonts w:ascii="Times New Roman" w:eastAsia="Times New Roman" w:hAnsi="Times New Roman" w:cs="Times New Roman"/>
-          <w:i/>
-          <w:sz w:val="20"/>
-          <w:szCs w:val="20"/>
-        </w:rPr>
-        <w:t>Analysis</w:t>
-      </w:r>
-      <w:r>
-        <w:rPr>
-          <w:rFonts w:ascii="Times New Roman" w:eastAsia="Times New Roman" w:hAnsi="Times New Roman" w:cs="Times New Roman"/>
-          <w:sz w:val="20"/>
-          <w:szCs w:val="20"/>
-        </w:rPr>
-        <w:t xml:space="preserve">, dilakukan identifikasi kebutuhan remaja terkait pemahaman depresi, sedangkan di fase </w:t>
-      </w:r>
-      <w:r>
-        <w:rPr>
-          <w:rFonts w:ascii="Times New Roman" w:eastAsia="Times New Roman" w:hAnsi="Times New Roman" w:cs="Times New Roman"/>
-          <w:i/>
-          <w:sz w:val="20"/>
-          <w:szCs w:val="20"/>
-        </w:rPr>
-        <w:t>Design</w:t>
-      </w:r>
-      <w:r>
-        <w:rPr>
-          <w:rFonts w:ascii="Times New Roman" w:eastAsia="Times New Roman" w:hAnsi="Times New Roman" w:cs="Times New Roman"/>
-          <w:sz w:val="20"/>
-          <w:szCs w:val="20"/>
-        </w:rPr>
-        <w:t xml:space="preserve">, materi edukasi diintegrasikan dalam mekanika permainan dan jalan cerita sedemikian rupa agar tetap menarik. Fase </w:t>
-      </w:r>
-      <w:r>
-        <w:rPr>
-          <w:rFonts w:ascii="Times New Roman" w:eastAsia="Times New Roman" w:hAnsi="Times New Roman" w:cs="Times New Roman"/>
-          <w:i/>
-          <w:sz w:val="20"/>
-          <w:szCs w:val="20"/>
-        </w:rPr>
-        <w:t>Development</w:t>
-      </w:r>
-      <w:r>
-        <w:rPr>
-          <w:rFonts w:ascii="Times New Roman" w:eastAsia="Times New Roman" w:hAnsi="Times New Roman" w:cs="Times New Roman"/>
-          <w:sz w:val="20"/>
-          <w:szCs w:val="20"/>
-        </w:rPr>
-        <w:t xml:space="preserve"> ditekankan pada pembuatan aset visual dan pemrograman interaktif, sementara </w:t>
-      </w:r>
-      <w:r>
-        <w:rPr>
-          <w:rFonts w:ascii="Times New Roman" w:eastAsia="Times New Roman" w:hAnsi="Times New Roman" w:cs="Times New Roman"/>
-          <w:i/>
-          <w:sz w:val="20"/>
-          <w:szCs w:val="20"/>
-        </w:rPr>
-        <w:t>Implementation</w:t>
-      </w:r>
-      <w:r>
-        <w:rPr>
-          <w:rFonts w:ascii="Times New Roman" w:eastAsia="Times New Roman" w:hAnsi="Times New Roman" w:cs="Times New Roman"/>
-          <w:sz w:val="20"/>
-          <w:szCs w:val="20"/>
-        </w:rPr>
-        <w:t xml:space="preserve"> melibatkan uji coba langsung dengan kelompok sasaran untuk mendapatkan umpan balik. Tahap </w:t>
-      </w:r>
-      <w:r>
-        <w:rPr>
-          <w:rFonts w:ascii="Times New Roman" w:eastAsia="Times New Roman" w:hAnsi="Times New Roman" w:cs="Times New Roman"/>
-          <w:i/>
-          <w:sz w:val="20"/>
-          <w:szCs w:val="20"/>
-        </w:rPr>
-        <w:t>Evaluation</w:t>
-      </w:r>
-      <w:r>
-        <w:rPr>
-          <w:rFonts w:ascii="Times New Roman" w:eastAsia="Times New Roman" w:hAnsi="Times New Roman" w:cs="Times New Roman"/>
-          <w:sz w:val="20"/>
-          <w:szCs w:val="20"/>
-        </w:rPr>
-        <w:t xml:space="preserve"> kemudian menilai efektivitas game dalam meningkatkan pengetahuan dan sikap proaktif pemain terhadap depresi. Pendekatan ADDIE ini memungkinkan revisi berkelanjutan hingga game benar-benar optimal sebagai media edukasi.</w:t>
+          <w:bCs/>
+          <w:sz w:val="20"/>
+          <w:szCs w:val="20"/>
+        </w:rPr>
+        <w:tab/>
       </w:r>
     </w:p>
     <w:p>
       <w:pPr>
-        <w:ind w:firstLine="720"/>
-        <w:rPr>
-          <w:rFonts w:ascii="Times New Roman" w:eastAsia="Times New Roman" w:hAnsi="Times New Roman" w:cs="Times New Roman"/>
+        <w:rPr>
+          <w:rFonts w:ascii="Times New Roman" w:eastAsia="Times New Roman" w:hAnsi="Times New Roman" w:cs="Times New Roman"/>
+          <w:bCs/>
           <w:sz w:val="20"/>
           <w:szCs w:val="20"/>
         </w:rPr>
       </w:pPr>
-      <w:r>
-        <w:rPr>
-          <w:rFonts w:ascii="Times New Roman" w:eastAsia="Times New Roman" w:hAnsi="Times New Roman" w:cs="Times New Roman"/>
-          <w:sz w:val="20"/>
-          <w:szCs w:val="20"/>
-        </w:rPr>
-        <w:t>Target pengguna remaja dipilih karena kelompok usia ini rentan mengalami perubahan emosi dan tekanan sosial yang intens, namun seringkali belum memahami gejala depresi secara mendalam [1]. Penelitian terdahulu menunjukkan bahwa game edukasi yang dirancang khusus untuk remaja mampu meningkatkan retensi informasi dan memotivasi perilaku positif, termasuk keinginan mencari bantuan profesional jika gejala depresi muncul [3]. Alur cerita game yang menampilkan karakter sebaya menghadapi dilema emosional membantu remaja merasa terhubung dan termotivasi untuk mempelajari materi lebih lanjut. Dengan memasukkan kuis reflektif dan skenario simulasi, game ini tidak hanya menyampaikan fakta, tetapi juga mendorong pemain untuk menginternalisasi pengetahuan melalui pengalaman bercerita interaktif. Hasil akhir diharapkan adalah peningkatan literasi kesehatan mental serta pengurangan stigma terkait depresi di kalangan remaja.</w:t>
-      </w:r>
-    </w:p>
-    <w:p>
-      <w:pPr>
-        <w:ind w:firstLine="720"/>
-        <w:rPr>
-          <w:rFonts w:ascii="Times New Roman" w:eastAsia="Times New Roman" w:hAnsi="Times New Roman" w:cs="Times New Roman"/>
-          <w:sz w:val="20"/>
-          <w:szCs w:val="20"/>
-        </w:rPr>
-      </w:pPr>
-      <w:r>
-        <w:rPr>
-          <w:rFonts w:ascii="Times New Roman" w:eastAsia="Times New Roman" w:hAnsi="Times New Roman" w:cs="Times New Roman"/>
-          <w:sz w:val="20"/>
-          <w:szCs w:val="20"/>
-        </w:rPr>
-        <w:t>Dalam konteks edukasi digital, penerapan cerita interaktif dalam game memegang peranan penting untuk menciptakan pengalaman belajar yang mendalam dan personal. Game ini akan memandu pemain melalui narasi yang mengilustrasikan perjalanan emosional seorang tokoh yang berjuang melawan depresi, memperlihatkan bagaimana gejala muncul, faktor pemicu, serta strategi coping yang terbukti efektif [3]. Dengan demikian, pemain tidak hanya memperoleh informasi teoritis, tetapi juga melihat aplikasi nyata dari penanganan depresi dalam kehidupan sehari-hari. Integrasi metode ADDIE memastikan bahwa konten cerita dan mekanika game selalu relevan dengan kebutuhan dan karakteristik remaja sebagai pengguna utama. Keberhasilan prototipe awal diharapkan dapat menjadi dasar bagi pengembangan lebih lanjut dan adaptasi platform lain di masa mendatang.</w:t>
-      </w:r>
     </w:p>
     <w:p>
       <w:pPr>
@@ -5158,7 +6468,7 @@
             <w:autoSpaceDE w:val="0"/>
             <w:autoSpaceDN w:val="0"/>
             <w:ind w:hanging="640"/>
-            <w:divId w:val="1734892743"/>
+            <w:divId w:val="308563256"/>
             <w:rPr>
               <w:rFonts w:eastAsia="Times New Roman"/>
               <w:sz w:val="24"/>
@@ -5184,7 +6494,7 @@
             <w:autoSpaceDE w:val="0"/>
             <w:autoSpaceDN w:val="0"/>
             <w:ind w:hanging="640"/>
-            <w:divId w:val="1828594500"/>
+            <w:divId w:val="1990985671"/>
             <w:rPr>
               <w:rFonts w:eastAsia="Times New Roman"/>
             </w:rPr>
@@ -5208,7 +6518,7 @@
             <w:autoSpaceDE w:val="0"/>
             <w:autoSpaceDN w:val="0"/>
             <w:ind w:hanging="640"/>
-            <w:divId w:val="258368828"/>
+            <w:divId w:val="871650951"/>
             <w:rPr>
               <w:rFonts w:eastAsia="Times New Roman"/>
             </w:rPr>
@@ -5246,7 +6556,7 @@
             <w:autoSpaceDE w:val="0"/>
             <w:autoSpaceDN w:val="0"/>
             <w:ind w:hanging="640"/>
-            <w:divId w:val="1224214319"/>
+            <w:divId w:val="932591779"/>
             <w:rPr>
               <w:rFonts w:eastAsia="Times New Roman"/>
             </w:rPr>
@@ -5284,7 +6594,7 @@
             <w:autoSpaceDE w:val="0"/>
             <w:autoSpaceDN w:val="0"/>
             <w:ind w:hanging="640"/>
-            <w:divId w:val="1743747037"/>
+            <w:divId w:val="524640241"/>
             <w:rPr>
               <w:rFonts w:eastAsia="Times New Roman"/>
             </w:rPr>
@@ -5322,7 +6632,7 @@
             <w:autoSpaceDE w:val="0"/>
             <w:autoSpaceDN w:val="0"/>
             <w:ind w:hanging="640"/>
-            <w:divId w:val="168568206"/>
+            <w:divId w:val="245656749"/>
             <w:rPr>
               <w:rFonts w:eastAsia="Times New Roman"/>
             </w:rPr>
@@ -5360,7 +6670,7 @@
             <w:autoSpaceDE w:val="0"/>
             <w:autoSpaceDN w:val="0"/>
             <w:ind w:hanging="640"/>
-            <w:divId w:val="1179393070"/>
+            <w:divId w:val="1195582616"/>
             <w:rPr>
               <w:rFonts w:eastAsia="Times New Roman"/>
             </w:rPr>
@@ -5398,7 +6708,7 @@
             <w:autoSpaceDE w:val="0"/>
             <w:autoSpaceDN w:val="0"/>
             <w:ind w:hanging="640"/>
-            <w:divId w:val="1324043843"/>
+            <w:divId w:val="2094861160"/>
             <w:rPr>
               <w:rFonts w:eastAsia="Times New Roman"/>
             </w:rPr>
@@ -5436,7 +6746,7 @@
             <w:autoSpaceDE w:val="0"/>
             <w:autoSpaceDN w:val="0"/>
             <w:ind w:hanging="640"/>
-            <w:divId w:val="1876238232"/>
+            <w:divId w:val="1494182638"/>
             <w:rPr>
               <w:rFonts w:eastAsia="Times New Roman"/>
             </w:rPr>
@@ -5474,7 +6784,7 @@
             <w:autoSpaceDE w:val="0"/>
             <w:autoSpaceDN w:val="0"/>
             <w:ind w:hanging="640"/>
-            <w:divId w:val="1619141593"/>
+            <w:divId w:val="1717045987"/>
             <w:rPr>
               <w:rFonts w:eastAsia="Times New Roman"/>
             </w:rPr>
@@ -5512,7 +6822,7 @@
             <w:autoSpaceDE w:val="0"/>
             <w:autoSpaceDN w:val="0"/>
             <w:ind w:hanging="640"/>
-            <w:divId w:val="1782531871"/>
+            <w:divId w:val="1224870289"/>
             <w:rPr>
               <w:rFonts w:eastAsia="Times New Roman"/>
             </w:rPr>
@@ -5550,7 +6860,7 @@
             <w:autoSpaceDE w:val="0"/>
             <w:autoSpaceDN w:val="0"/>
             <w:ind w:hanging="640"/>
-            <w:divId w:val="1011221001"/>
+            <w:divId w:val="1462648035"/>
             <w:rPr>
               <w:rFonts w:eastAsia="Times New Roman"/>
             </w:rPr>
@@ -5559,7 +6869,6 @@
             <w:rPr>
               <w:rFonts w:eastAsia="Times New Roman"/>
             </w:rPr>
-            <w:lastRenderedPageBreak/>
             <w:t>[12]</w:t>
           </w:r>
           <w:r>
@@ -5589,7 +6898,7 @@
             <w:autoSpaceDE w:val="0"/>
             <w:autoSpaceDN w:val="0"/>
             <w:ind w:hanging="640"/>
-            <w:divId w:val="1446583391"/>
+            <w:divId w:val="2132284691"/>
             <w:rPr>
               <w:rFonts w:eastAsia="Times New Roman"/>
             </w:rPr>
@@ -5598,6 +6907,7 @@
             <w:rPr>
               <w:rFonts w:eastAsia="Times New Roman"/>
             </w:rPr>
+            <w:lastRenderedPageBreak/>
             <w:t>[13]</w:t>
           </w:r>
           <w:r>
@@ -5627,7 +6937,7 @@
             <w:autoSpaceDE w:val="0"/>
             <w:autoSpaceDN w:val="0"/>
             <w:ind w:hanging="640"/>
-            <w:divId w:val="1309088071"/>
+            <w:divId w:val="824930157"/>
             <w:rPr>
               <w:rFonts w:eastAsia="Times New Roman"/>
             </w:rPr>
@@ -5665,7 +6975,7 @@
             <w:autoSpaceDE w:val="0"/>
             <w:autoSpaceDN w:val="0"/>
             <w:ind w:hanging="640"/>
-            <w:divId w:val="1300768045"/>
+            <w:divId w:val="1620991591"/>
             <w:rPr>
               <w:rFonts w:eastAsia="Times New Roman"/>
             </w:rPr>
@@ -5703,7 +7013,7 @@
             <w:autoSpaceDE w:val="0"/>
             <w:autoSpaceDN w:val="0"/>
             <w:ind w:hanging="640"/>
-            <w:divId w:val="324089361"/>
+            <w:divId w:val="884223467"/>
             <w:rPr>
               <w:rFonts w:eastAsia="Times New Roman"/>
             </w:rPr>
@@ -5741,7 +7051,7 @@
             <w:autoSpaceDE w:val="0"/>
             <w:autoSpaceDN w:val="0"/>
             <w:ind w:hanging="640"/>
-            <w:divId w:val="254678375"/>
+            <w:divId w:val="2130279872"/>
             <w:rPr>
               <w:rFonts w:eastAsia="Times New Roman"/>
             </w:rPr>
@@ -5779,7 +7089,7 @@
             <w:autoSpaceDE w:val="0"/>
             <w:autoSpaceDN w:val="0"/>
             <w:ind w:hanging="640"/>
-            <w:divId w:val="579867908"/>
+            <w:divId w:val="746223"/>
             <w:rPr>
               <w:rFonts w:eastAsia="Times New Roman"/>
             </w:rPr>
@@ -5817,7 +7127,7 @@
             <w:autoSpaceDE w:val="0"/>
             <w:autoSpaceDN w:val="0"/>
             <w:ind w:hanging="640"/>
-            <w:divId w:val="658849826"/>
+            <w:divId w:val="21444714"/>
             <w:rPr>
               <w:rFonts w:eastAsia="Times New Roman"/>
             </w:rPr>
@@ -5855,7 +7165,7 @@
             <w:autoSpaceDE w:val="0"/>
             <w:autoSpaceDN w:val="0"/>
             <w:ind w:hanging="640"/>
-            <w:divId w:val="1238907447"/>
+            <w:divId w:val="846866444"/>
             <w:rPr>
               <w:rFonts w:eastAsia="Times New Roman"/>
             </w:rPr>
@@ -5893,7 +7203,7 @@
             <w:autoSpaceDE w:val="0"/>
             <w:autoSpaceDN w:val="0"/>
             <w:ind w:hanging="640"/>
-            <w:divId w:val="1174030735"/>
+            <w:divId w:val="2051764316"/>
             <w:rPr>
               <w:rFonts w:eastAsia="Times New Roman"/>
             </w:rPr>
@@ -5931,7 +7241,7 @@
             <w:autoSpaceDE w:val="0"/>
             <w:autoSpaceDN w:val="0"/>
             <w:ind w:hanging="640"/>
-            <w:divId w:val="1218472216"/>
+            <w:divId w:val="975374586"/>
             <w:rPr>
               <w:rFonts w:eastAsia="Times New Roman"/>
             </w:rPr>
@@ -5969,7 +7279,7 @@
             <w:autoSpaceDE w:val="0"/>
             <w:autoSpaceDN w:val="0"/>
             <w:ind w:hanging="640"/>
-            <w:divId w:val="588463868"/>
+            <w:divId w:val="75825621"/>
             <w:rPr>
               <w:rFonts w:eastAsia="Times New Roman"/>
             </w:rPr>
@@ -6007,7 +7317,7 @@
             <w:autoSpaceDE w:val="0"/>
             <w:autoSpaceDN w:val="0"/>
             <w:ind w:hanging="640"/>
-            <w:divId w:val="1163159314"/>
+            <w:divId w:val="1021080359"/>
             <w:rPr>
               <w:rFonts w:eastAsia="Times New Roman"/>
             </w:rPr>
@@ -6045,7 +7355,7 @@
             <w:autoSpaceDE w:val="0"/>
             <w:autoSpaceDN w:val="0"/>
             <w:ind w:hanging="640"/>
-            <w:divId w:val="1394424550"/>
+            <w:divId w:val="642931932"/>
             <w:rPr>
               <w:rFonts w:eastAsia="Times New Roman"/>
             </w:rPr>
@@ -6054,7 +7364,6 @@
             <w:rPr>
               <w:rFonts w:eastAsia="Times New Roman"/>
             </w:rPr>
-            <w:lastRenderedPageBreak/>
             <w:t>[25]</w:t>
           </w:r>
           <w:r>
@@ -6084,7 +7393,7 @@
             <w:autoSpaceDE w:val="0"/>
             <w:autoSpaceDN w:val="0"/>
             <w:ind w:hanging="640"/>
-            <w:divId w:val="266011655"/>
+            <w:divId w:val="1478837706"/>
             <w:rPr>
               <w:rFonts w:eastAsia="Times New Roman"/>
             </w:rPr>
@@ -6108,7 +7417,7 @@
             <w:autoSpaceDE w:val="0"/>
             <w:autoSpaceDN w:val="0"/>
             <w:ind w:hanging="640"/>
-            <w:divId w:val="1767727363"/>
+            <w:divId w:val="450587618"/>
             <w:rPr>
               <w:rFonts w:eastAsia="Times New Roman"/>
             </w:rPr>
@@ -6117,6 +7426,7 @@
             <w:rPr>
               <w:rFonts w:eastAsia="Times New Roman"/>
             </w:rPr>
+            <w:lastRenderedPageBreak/>
             <w:t>[27]</w:t>
           </w:r>
           <w:r>
@@ -6146,7 +7456,7 @@
             <w:autoSpaceDE w:val="0"/>
             <w:autoSpaceDN w:val="0"/>
             <w:ind w:hanging="640"/>
-            <w:divId w:val="270557581"/>
+            <w:divId w:val="106891671"/>
             <w:rPr>
               <w:rFonts w:eastAsia="Times New Roman"/>
             </w:rPr>
@@ -6170,7 +7480,7 @@
             <w:autoSpaceDE w:val="0"/>
             <w:autoSpaceDN w:val="0"/>
             <w:ind w:hanging="640"/>
-            <w:divId w:val="1679385936"/>
+            <w:divId w:val="350448546"/>
             <w:rPr>
               <w:rFonts w:eastAsia="Times New Roman"/>
             </w:rPr>
@@ -6194,7 +7504,7 @@
             <w:autoSpaceDE w:val="0"/>
             <w:autoSpaceDN w:val="0"/>
             <w:ind w:hanging="640"/>
-            <w:divId w:val="986978615"/>
+            <w:divId w:val="556017184"/>
             <w:rPr>
               <w:rFonts w:eastAsia="Times New Roman"/>
             </w:rPr>
@@ -6232,7 +7542,7 @@
             <w:autoSpaceDE w:val="0"/>
             <w:autoSpaceDN w:val="0"/>
             <w:ind w:hanging="640"/>
-            <w:divId w:val="763455148"/>
+            <w:divId w:val="2014214259"/>
             <w:rPr>
               <w:rFonts w:eastAsia="Times New Roman"/>
             </w:rPr>
@@ -6256,7 +7566,7 @@
             <w:autoSpaceDE w:val="0"/>
             <w:autoSpaceDN w:val="0"/>
             <w:ind w:hanging="640"/>
-            <w:divId w:val="1369329277"/>
+            <w:divId w:val="295113038"/>
             <w:rPr>
               <w:rFonts w:eastAsia="Times New Roman"/>
             </w:rPr>
@@ -6294,7 +7604,7 @@
             <w:autoSpaceDE w:val="0"/>
             <w:autoSpaceDN w:val="0"/>
             <w:ind w:hanging="640"/>
-            <w:divId w:val="11884343"/>
+            <w:divId w:val="1233151790"/>
             <w:rPr>
               <w:rFonts w:eastAsia="Times New Roman"/>
             </w:rPr>
@@ -6332,7 +7642,7 @@
             <w:autoSpaceDE w:val="0"/>
             <w:autoSpaceDN w:val="0"/>
             <w:ind w:hanging="640"/>
-            <w:divId w:val="444663492"/>
+            <w:divId w:val="1457748887"/>
             <w:rPr>
               <w:rFonts w:eastAsia="Times New Roman"/>
             </w:rPr>
@@ -6370,7 +7680,7 @@
             <w:autoSpaceDE w:val="0"/>
             <w:autoSpaceDN w:val="0"/>
             <w:ind w:hanging="640"/>
-            <w:divId w:val="1061635943"/>
+            <w:divId w:val="1440296770"/>
             <w:rPr>
               <w:rFonts w:eastAsia="Times New Roman"/>
             </w:rPr>
@@ -6394,7 +7704,7 @@
             <w:autoSpaceDE w:val="0"/>
             <w:autoSpaceDN w:val="0"/>
             <w:ind w:hanging="640"/>
-            <w:divId w:val="995570485"/>
+            <w:divId w:val="70004764"/>
             <w:rPr>
               <w:rFonts w:eastAsia="Times New Roman"/>
             </w:rPr>
@@ -6432,7 +7742,7 @@
             <w:autoSpaceDE w:val="0"/>
             <w:autoSpaceDN w:val="0"/>
             <w:ind w:hanging="640"/>
-            <w:divId w:val="554202287"/>
+            <w:divId w:val="467355250"/>
             <w:rPr>
               <w:rFonts w:eastAsia="Times New Roman"/>
             </w:rPr>
@@ -6470,7 +7780,7 @@
             <w:autoSpaceDE w:val="0"/>
             <w:autoSpaceDN w:val="0"/>
             <w:ind w:hanging="640"/>
-            <w:divId w:val="398480593"/>
+            <w:divId w:val="1990204411"/>
             <w:rPr>
               <w:rFonts w:eastAsia="Times New Roman"/>
             </w:rPr>
@@ -6522,7 +7832,7 @@
             <w:autoSpaceDE w:val="0"/>
             <w:autoSpaceDN w:val="0"/>
             <w:ind w:hanging="640"/>
-            <w:divId w:val="705255521"/>
+            <w:divId w:val="1205753571"/>
             <w:rPr>
               <w:rFonts w:eastAsia="Times New Roman"/>
             </w:rPr>
@@ -6546,7 +7856,7 @@
             <w:autoSpaceDE w:val="0"/>
             <w:autoSpaceDN w:val="0"/>
             <w:ind w:hanging="640"/>
-            <w:divId w:val="389695401"/>
+            <w:divId w:val="812254264"/>
             <w:rPr>
               <w:rFonts w:eastAsia="Times New Roman"/>
             </w:rPr>
@@ -6570,7 +7880,7 @@
             <w:autoSpaceDE w:val="0"/>
             <w:autoSpaceDN w:val="0"/>
             <w:ind w:hanging="640"/>
-            <w:divId w:val="1561791150"/>
+            <w:divId w:val="814492221"/>
             <w:rPr>
               <w:rFonts w:eastAsia="Times New Roman"/>
             </w:rPr>
@@ -6579,7 +7889,6 @@
             <w:rPr>
               <w:rFonts w:eastAsia="Times New Roman"/>
             </w:rPr>
-            <w:lastRenderedPageBreak/>
             <w:t>[41]</w:t>
           </w:r>
           <w:r>
@@ -6595,7 +7904,7 @@
             <w:autoSpaceDE w:val="0"/>
             <w:autoSpaceDN w:val="0"/>
             <w:ind w:hanging="640"/>
-            <w:divId w:val="1070537084"/>
+            <w:divId w:val="1026981587"/>
             <w:rPr>
               <w:rFonts w:eastAsia="Times New Roman"/>
             </w:rPr>
@@ -6619,7 +7928,7 @@
             <w:autoSpaceDE w:val="0"/>
             <w:autoSpaceDN w:val="0"/>
             <w:ind w:hanging="640"/>
-            <w:divId w:val="1704868498"/>
+            <w:divId w:val="1891500835"/>
             <w:rPr>
               <w:rFonts w:eastAsia="Times New Roman"/>
             </w:rPr>
@@ -6628,6 +7937,7 @@
             <w:rPr>
               <w:rFonts w:eastAsia="Times New Roman"/>
             </w:rPr>
+            <w:lastRenderedPageBreak/>
             <w:t>[43]</w:t>
           </w:r>
           <w:r>
@@ -6657,7 +7967,7 @@
             <w:autoSpaceDE w:val="0"/>
             <w:autoSpaceDN w:val="0"/>
             <w:ind w:hanging="640"/>
-            <w:divId w:val="2128113848"/>
+            <w:divId w:val="505288044"/>
             <w:rPr>
               <w:rFonts w:eastAsia="Times New Roman"/>
             </w:rPr>
@@ -6681,7 +7991,7 @@
             <w:autoSpaceDE w:val="0"/>
             <w:autoSpaceDN w:val="0"/>
             <w:ind w:hanging="640"/>
-            <w:divId w:val="603541784"/>
+            <w:divId w:val="1277447265"/>
             <w:rPr>
               <w:rFonts w:eastAsia="Times New Roman"/>
             </w:rPr>
@@ -6705,7 +8015,7 @@
             <w:autoSpaceDE w:val="0"/>
             <w:autoSpaceDN w:val="0"/>
             <w:ind w:hanging="640"/>
-            <w:divId w:val="1452017493"/>
+            <w:divId w:val="167911922"/>
             <w:rPr>
               <w:rFonts w:eastAsia="Times New Roman"/>
             </w:rPr>
@@ -6729,7 +8039,7 @@
             <w:autoSpaceDE w:val="0"/>
             <w:autoSpaceDN w:val="0"/>
             <w:ind w:hanging="640"/>
-            <w:divId w:val="1197156934"/>
+            <w:divId w:val="5180037"/>
             <w:rPr>
               <w:rFonts w:eastAsia="Times New Roman"/>
             </w:rPr>
@@ -6753,7 +8063,7 @@
             <w:autoSpaceDE w:val="0"/>
             <w:autoSpaceDN w:val="0"/>
             <w:ind w:hanging="640"/>
-            <w:divId w:val="729499821"/>
+            <w:divId w:val="287393054"/>
             <w:rPr>
               <w:rFonts w:eastAsia="Times New Roman"/>
             </w:rPr>
@@ -6777,7 +8087,7 @@
             <w:autoSpaceDE w:val="0"/>
             <w:autoSpaceDN w:val="0"/>
             <w:ind w:hanging="640"/>
-            <w:divId w:val="186137134"/>
+            <w:divId w:val="1823958452"/>
             <w:rPr>
               <w:rFonts w:eastAsia="Times New Roman"/>
             </w:rPr>
@@ -6801,7 +8111,7 @@
             <w:autoSpaceDE w:val="0"/>
             <w:autoSpaceDN w:val="0"/>
             <w:ind w:hanging="640"/>
-            <w:divId w:val="1903366617"/>
+            <w:divId w:val="1992371763"/>
             <w:rPr>
               <w:rFonts w:eastAsia="Times New Roman"/>
             </w:rPr>
@@ -6839,7 +8149,7 @@
             <w:autoSpaceDE w:val="0"/>
             <w:autoSpaceDN w:val="0"/>
             <w:ind w:hanging="640"/>
-            <w:divId w:val="1505394680"/>
+            <w:divId w:val="779449040"/>
             <w:rPr>
               <w:rFonts w:eastAsia="Times New Roman"/>
             </w:rPr>
@@ -6877,7 +8187,7 @@
             <w:autoSpaceDE w:val="0"/>
             <w:autoSpaceDN w:val="0"/>
             <w:ind w:hanging="640"/>
-            <w:divId w:val="1928689008"/>
+            <w:divId w:val="235670904"/>
             <w:rPr>
               <w:rFonts w:eastAsia="Times New Roman"/>
             </w:rPr>
@@ -6901,7 +8211,7 @@
             <w:autoSpaceDE w:val="0"/>
             <w:autoSpaceDN w:val="0"/>
             <w:ind w:hanging="640"/>
-            <w:divId w:val="1415470003"/>
+            <w:divId w:val="1795249152"/>
             <w:rPr>
               <w:rFonts w:eastAsia="Times New Roman"/>
             </w:rPr>
@@ -6939,7 +8249,7 @@
             <w:autoSpaceDE w:val="0"/>
             <w:autoSpaceDN w:val="0"/>
             <w:ind w:hanging="640"/>
-            <w:divId w:val="1111439570"/>
+            <w:divId w:val="846362138"/>
             <w:rPr>
               <w:rFonts w:eastAsia="Times New Roman"/>
             </w:rPr>
@@ -6977,7 +8287,7 @@
             <w:autoSpaceDE w:val="0"/>
             <w:autoSpaceDN w:val="0"/>
             <w:ind w:hanging="640"/>
-            <w:divId w:val="1597056009"/>
+            <w:divId w:val="1025714903"/>
             <w:rPr>
               <w:rFonts w:eastAsia="Times New Roman"/>
             </w:rPr>
@@ -7001,16 +8311,7 @@
               <w:i/>
               <w:iCs/>
             </w:rPr>
-            <w:t xml:space="preserve">“Optimalisasi Digital Marketing </w:t>
-          </w:r>
-          <w:r>
-            <w:rPr>
-              <w:rFonts w:eastAsia="Times New Roman"/>
-              <w:i/>
-              <w:iCs/>
-            </w:rPr>
-            <w:lastRenderedPageBreak/>
-            <w:t>Menyongsong Marketing 5.0:Technology For Humanity,”</w:t>
+            <w:t>“Optimalisasi Digital Marketing Menyongsong Marketing 5.0:Technology For Humanity,”</w:t>
           </w:r>
           <w:r>
             <w:rPr>
@@ -7024,7 +8325,7 @@
             <w:autoSpaceDE w:val="0"/>
             <w:autoSpaceDN w:val="0"/>
             <w:ind w:hanging="640"/>
-            <w:divId w:val="416363754"/>
+            <w:divId w:val="404764362"/>
             <w:rPr>
               <w:rFonts w:eastAsia="Times New Roman"/>
             </w:rPr>
@@ -7040,7 +8341,14 @@
               <w:rFonts w:eastAsia="Times New Roman"/>
             </w:rPr>
             <w:tab/>
-            <w:t xml:space="preserve">M. Masbahah, A. K. R. Putri, D. Lathifa, D. M. Nawang, F. I. Anshori, and B. A. Kusnadi, “Penggunaan Algoritma random forest dan Agile scrum dalam Pengembangan Aplikasi Kesehatan mental Berbasis Web ‘MentalWell,’” </w:t>
+            <w:t xml:space="preserve">M. Masbahah, A. K. R. Putri, D. Lathifa, D. M. Nawang, F. I. Anshori, and B. A. Kusnadi, “Penggunaan Algoritma random forest dan Agile scrum dalam </w:t>
+          </w:r>
+          <w:r>
+            <w:rPr>
+              <w:rFonts w:eastAsia="Times New Roman"/>
+            </w:rPr>
+            <w:lastRenderedPageBreak/>
+            <w:t xml:space="preserve">Pengembangan Aplikasi Kesehatan mental Berbasis Web ‘MentalWell,’” </w:t>
           </w:r>
           <w:r>
             <w:rPr>
@@ -7062,7 +8370,7 @@
             <w:autoSpaceDE w:val="0"/>
             <w:autoSpaceDN w:val="0"/>
             <w:ind w:hanging="640"/>
-            <w:divId w:val="696857520"/>
+            <w:divId w:val="1193038458"/>
             <w:rPr>
               <w:rFonts w:eastAsia="Times New Roman"/>
             </w:rPr>
@@ -7086,7 +8394,7 @@
             <w:autoSpaceDE w:val="0"/>
             <w:autoSpaceDN w:val="0"/>
             <w:ind w:hanging="640"/>
-            <w:divId w:val="888107528"/>
+            <w:divId w:val="765466095"/>
             <w:rPr>
               <w:rFonts w:eastAsia="Times New Roman"/>
             </w:rPr>
@@ -7110,7 +8418,7 @@
             <w:autoSpaceDE w:val="0"/>
             <w:autoSpaceDN w:val="0"/>
             <w:ind w:hanging="640"/>
-            <w:divId w:val="831986653"/>
+            <w:divId w:val="1815876341"/>
             <w:rPr>
               <w:rFonts w:eastAsia="Times New Roman"/>
             </w:rPr>
@@ -7134,7 +8442,7 @@
             <w:autoSpaceDE w:val="0"/>
             <w:autoSpaceDN w:val="0"/>
             <w:ind w:hanging="640"/>
-            <w:divId w:val="1616713169"/>
+            <w:divId w:val="2095517472"/>
             <w:rPr>
               <w:rFonts w:eastAsia="Times New Roman"/>
             </w:rPr>
@@ -7172,7 +8480,7 @@
             <w:autoSpaceDE w:val="0"/>
             <w:autoSpaceDN w:val="0"/>
             <w:ind w:hanging="640"/>
-            <w:divId w:val="143593423"/>
+            <w:divId w:val="179705561"/>
             <w:rPr>
               <w:rFonts w:eastAsia="Times New Roman"/>
             </w:rPr>
@@ -7196,7 +8504,7 @@
             <w:autoSpaceDE w:val="0"/>
             <w:autoSpaceDN w:val="0"/>
             <w:ind w:hanging="640"/>
-            <w:divId w:val="913467694"/>
+            <w:divId w:val="1999848043"/>
             <w:rPr>
               <w:rFonts w:eastAsia="Times New Roman"/>
             </w:rPr>
@@ -7220,7 +8528,7 @@
             <w:autoSpaceDE w:val="0"/>
             <w:autoSpaceDN w:val="0"/>
             <w:ind w:hanging="640"/>
-            <w:divId w:val="1318731668"/>
+            <w:divId w:val="1892959798"/>
             <w:rPr>
               <w:rFonts w:eastAsia="Times New Roman"/>
             </w:rPr>
@@ -7258,7 +8566,7 @@
             <w:autoSpaceDE w:val="0"/>
             <w:autoSpaceDN w:val="0"/>
             <w:ind w:hanging="640"/>
-            <w:divId w:val="1867595810"/>
+            <w:divId w:val="1049451738"/>
             <w:rPr>
               <w:rFonts w:eastAsia="Times New Roman"/>
             </w:rPr>
@@ -7296,7 +8604,7 @@
             <w:autoSpaceDE w:val="0"/>
             <w:autoSpaceDN w:val="0"/>
             <w:ind w:hanging="640"/>
-            <w:divId w:val="329063667"/>
+            <w:divId w:val="1111242409"/>
             <w:rPr>
               <w:rFonts w:eastAsia="Times New Roman"/>
             </w:rPr>
@@ -7320,7 +8628,7 @@
             <w:autoSpaceDE w:val="0"/>
             <w:autoSpaceDN w:val="0"/>
             <w:ind w:hanging="640"/>
-            <w:divId w:val="412901451"/>
+            <w:divId w:val="465709842"/>
             <w:rPr>
               <w:rFonts w:eastAsia="Times New Roman"/>
             </w:rPr>
@@ -7336,14 +8644,7 @@
               <w:rFonts w:eastAsia="Times New Roman"/>
             </w:rPr>
             <w:tab/>
-            <w:t xml:space="preserve">I. R. Fitri, “Pengembangan Panduan Model Konseling Solution Focused Brief Counseling Teknik Imagery and Visualitation Berbasis Website SI-Konseling Untuk Mengatasi Depresi Pada Remaja Korban Kekerasan,” Universitas Pendidikan </w:t>
-          </w:r>
-          <w:r>
-            <w:rPr>
-              <w:rFonts w:eastAsia="Times New Roman"/>
-            </w:rPr>
-            <w:lastRenderedPageBreak/>
-            <w:t>Ganesha, 2023. Accessed: May 14, 2025. [Online]. Available: https://repo.undiksha.ac.id/16400/</w:t>
+            <w:t>I. R. Fitri, “Pengembangan Panduan Model Konseling Solution Focused Brief Counseling Teknik Imagery and Visualitation Berbasis Website SI-Konseling Untuk Mengatasi Depresi Pada Remaja Korban Kekerasan,” Universitas Pendidikan Ganesha, 2023. Accessed: May 14, 2025. [Online]. Available: https://repo.undiksha.ac.id/16400/</w:t>
           </w:r>
         </w:p>
         <w:p>
@@ -7351,7 +8652,7 @@
             <w:autoSpaceDE w:val="0"/>
             <w:autoSpaceDN w:val="0"/>
             <w:ind w:hanging="640"/>
-            <w:divId w:val="804667245"/>
+            <w:divId w:val="2138255082"/>
             <w:rPr>
               <w:rFonts w:eastAsia="Times New Roman"/>
             </w:rPr>
@@ -7381,7 +8682,14 @@
             <w:rPr>
               <w:rFonts w:eastAsia="Times New Roman"/>
             </w:rPr>
-            <w:t>, vol. 5, no. 1, 2021, Accessed: May 14, 2025. [Online]. Available: https://garuda.kemdikbud.go.id/documents/detail/2915834</w:t>
+            <w:t xml:space="preserve">, vol. 5, no. 1, </w:t>
+          </w:r>
+          <w:r>
+            <w:rPr>
+              <w:rFonts w:eastAsia="Times New Roman"/>
+            </w:rPr>
+            <w:lastRenderedPageBreak/>
+            <w:t>2021, Accessed: May 14, 2025. [Online]. Available: https://garuda.kemdikbud.go.id/documents/detail/2915834</w:t>
           </w:r>
         </w:p>
         <w:p>
@@ -7389,7 +8697,7 @@
             <w:autoSpaceDE w:val="0"/>
             <w:autoSpaceDN w:val="0"/>
             <w:ind w:hanging="640"/>
-            <w:divId w:val="146827685"/>
+            <w:divId w:val="2080978247"/>
             <w:rPr>
               <w:rFonts w:eastAsia="Times New Roman"/>
             </w:rPr>
@@ -7427,7 +8735,7 @@
             <w:autoSpaceDE w:val="0"/>
             <w:autoSpaceDN w:val="0"/>
             <w:ind w:hanging="640"/>
-            <w:divId w:val="1182934744"/>
+            <w:divId w:val="1850220951"/>
             <w:rPr>
               <w:rFonts w:eastAsia="Times New Roman"/>
             </w:rPr>
@@ -7465,7 +8773,7 @@
             <w:autoSpaceDE w:val="0"/>
             <w:autoSpaceDN w:val="0"/>
             <w:ind w:hanging="640"/>
-            <w:divId w:val="1706177101"/>
+            <w:divId w:val="904730036"/>
             <w:rPr>
               <w:rFonts w:eastAsia="Times New Roman"/>
             </w:rPr>
@@ -7503,7 +8811,7 @@
             <w:autoSpaceDE w:val="0"/>
             <w:autoSpaceDN w:val="0"/>
             <w:ind w:hanging="640"/>
-            <w:divId w:val="417333825"/>
+            <w:divId w:val="1671446857"/>
             <w:rPr>
               <w:rFonts w:eastAsia="Times New Roman"/>
             </w:rPr>
@@ -7527,7 +8835,7 @@
             <w:autoSpaceDE w:val="0"/>
             <w:autoSpaceDN w:val="0"/>
             <w:ind w:hanging="640"/>
-            <w:divId w:val="314070379"/>
+            <w:divId w:val="1409381022"/>
             <w:rPr>
               <w:rFonts w:eastAsia="Times New Roman"/>
             </w:rPr>
@@ -7565,7 +8873,7 @@
             <w:autoSpaceDE w:val="0"/>
             <w:autoSpaceDN w:val="0"/>
             <w:ind w:hanging="640"/>
-            <w:divId w:val="554852437"/>
+            <w:divId w:val="1686859124"/>
             <w:rPr>
               <w:rFonts w:eastAsia="Times New Roman"/>
             </w:rPr>
@@ -7589,7 +8897,7 @@
             <w:autoSpaceDE w:val="0"/>
             <w:autoSpaceDN w:val="0"/>
             <w:ind w:hanging="640"/>
-            <w:divId w:val="1251112964"/>
+            <w:divId w:val="56785352"/>
             <w:rPr>
               <w:rFonts w:eastAsia="Times New Roman"/>
             </w:rPr>
@@ -7627,7 +8935,7 @@
             <w:autoSpaceDE w:val="0"/>
             <w:autoSpaceDN w:val="0"/>
             <w:ind w:hanging="640"/>
-            <w:divId w:val="824737097"/>
+            <w:divId w:val="1558660594"/>
             <w:rPr>
               <w:rFonts w:eastAsia="Times New Roman"/>
             </w:rPr>
@@ -7665,7 +8973,7 @@
             <w:autoSpaceDE w:val="0"/>
             <w:autoSpaceDN w:val="0"/>
             <w:ind w:hanging="640"/>
-            <w:divId w:val="1017150135"/>
+            <w:divId w:val="1994486366"/>
             <w:rPr>
               <w:rFonts w:eastAsia="Times New Roman"/>
             </w:rPr>
@@ -7703,7 +9011,7 @@
             <w:autoSpaceDE w:val="0"/>
             <w:autoSpaceDN w:val="0"/>
             <w:ind w:hanging="640"/>
-            <w:divId w:val="1287001420"/>
+            <w:divId w:val="731857032"/>
             <w:rPr>
               <w:rFonts w:eastAsia="Times New Roman"/>
             </w:rPr>
@@ -7727,7 +9035,7 @@
             <w:autoSpaceDE w:val="0"/>
             <w:autoSpaceDN w:val="0"/>
             <w:ind w:hanging="640"/>
-            <w:divId w:val="403917033"/>
+            <w:divId w:val="1223834126"/>
             <w:rPr>
               <w:rFonts w:eastAsia="Times New Roman"/>
             </w:rPr>
@@ -7751,7 +9059,6 @@
               <w:i/>
               <w:iCs/>
             </w:rPr>
-            <w:lastRenderedPageBreak/>
             <w:t>Kohesi: Jurnal Sains dan Teknologi</w:t>
           </w:r>
           <w:r>
@@ -7766,7 +9073,7 @@
             <w:autoSpaceDE w:val="0"/>
             <w:autoSpaceDN w:val="0"/>
             <w:ind w:hanging="640"/>
-            <w:divId w:val="1856111334"/>
+            <w:divId w:val="242881834"/>
             <w:rPr>
               <w:rFonts w:eastAsia="Times New Roman"/>
             </w:rPr>
@@ -7782,7 +9089,14 @@
               <w:rFonts w:eastAsia="Times New Roman"/>
             </w:rPr>
             <w:tab/>
-            <w:t>M. M. Nurrochman, A. L. Prasasti, and R. A. Nugrahaeni, “Implementasi Machine Learning Untuk Mendeteksi Unsur Depresi Pada Tweet Menggunakan Metode NaÏve Bayes,” Universitas Telkom, 2021. Accessed: May 14, 2025. [Online]. Available: https://openlibrarypublications.telkomuniversity.ac.id/index.php/engineering/article/view/16310</w:t>
+            <w:t xml:space="preserve">M. M. Nurrochman, A. L. Prasasti, and R. A. Nugrahaeni, “Implementasi Machine Learning Untuk Mendeteksi Unsur Depresi Pada Tweet Menggunakan Metode NaÏve </w:t>
+          </w:r>
+          <w:r>
+            <w:rPr>
+              <w:rFonts w:eastAsia="Times New Roman"/>
+            </w:rPr>
+            <w:lastRenderedPageBreak/>
+            <w:t>Bayes,” Universitas Telkom, 2021. Accessed: May 14, 2025. [Online]. Available: https://openlibrarypublications.telkomuniversity.ac.id/index.php/engineering/article/view/16310</w:t>
           </w:r>
         </w:p>
         <w:p>
@@ -7790,7 +9104,7 @@
             <w:autoSpaceDE w:val="0"/>
             <w:autoSpaceDN w:val="0"/>
             <w:ind w:hanging="640"/>
-            <w:divId w:val="936792235"/>
+            <w:divId w:val="977228632"/>
             <w:rPr>
               <w:rFonts w:eastAsia="Times New Roman"/>
             </w:rPr>
@@ -7828,7 +9142,7 @@
             <w:autoSpaceDE w:val="0"/>
             <w:autoSpaceDN w:val="0"/>
             <w:ind w:hanging="640"/>
-            <w:divId w:val="1047952002"/>
+            <w:divId w:val="1039163327"/>
             <w:rPr>
               <w:rFonts w:eastAsia="Times New Roman"/>
             </w:rPr>
@@ -7866,7 +9180,7 @@
             <w:autoSpaceDE w:val="0"/>
             <w:autoSpaceDN w:val="0"/>
             <w:ind w:hanging="640"/>
-            <w:divId w:val="1943413423"/>
+            <w:divId w:val="1894460000"/>
             <w:rPr>
               <w:rFonts w:eastAsia="Times New Roman"/>
             </w:rPr>
@@ -7890,7 +9204,7 @@
             <w:autoSpaceDE w:val="0"/>
             <w:autoSpaceDN w:val="0"/>
             <w:ind w:hanging="640"/>
-            <w:divId w:val="7755105"/>
+            <w:divId w:val="1250234583"/>
             <w:rPr>
               <w:rFonts w:eastAsia="Times New Roman"/>
             </w:rPr>
@@ -7914,7 +9228,7 @@
             <w:autoSpaceDE w:val="0"/>
             <w:autoSpaceDN w:val="0"/>
             <w:ind w:hanging="640"/>
-            <w:divId w:val="2042169149"/>
+            <w:divId w:val="209192260"/>
             <w:rPr>
               <w:rFonts w:eastAsia="Times New Roman"/>
             </w:rPr>
@@ -7952,7 +9266,7 @@
             <w:autoSpaceDE w:val="0"/>
             <w:autoSpaceDN w:val="0"/>
             <w:ind w:hanging="640"/>
-            <w:divId w:val="2140760746"/>
+            <w:divId w:val="90440439"/>
             <w:rPr>
               <w:rFonts w:eastAsia="Times New Roman"/>
             </w:rPr>
@@ -7990,7 +9304,7 @@
             <w:autoSpaceDE w:val="0"/>
             <w:autoSpaceDN w:val="0"/>
             <w:ind w:hanging="640"/>
-            <w:divId w:val="996768894"/>
+            <w:divId w:val="569998930"/>
             <w:rPr>
               <w:rFonts w:eastAsia="Times New Roman"/>
             </w:rPr>
@@ -8014,7 +9328,7 @@
             <w:autoSpaceDE w:val="0"/>
             <w:autoSpaceDN w:val="0"/>
             <w:ind w:hanging="640"/>
-            <w:divId w:val="509297140"/>
+            <w:divId w:val="1374115632"/>
             <w:rPr>
               <w:rFonts w:eastAsia="Times New Roman"/>
             </w:rPr>
@@ -8052,7 +9366,7 @@
             <w:autoSpaceDE w:val="0"/>
             <w:autoSpaceDN w:val="0"/>
             <w:ind w:hanging="640"/>
-            <w:divId w:val="1976063888"/>
+            <w:divId w:val="1019045766"/>
             <w:rPr>
               <w:rFonts w:eastAsia="Times New Roman"/>
             </w:rPr>
@@ -8090,7 +9404,7 @@
             <w:autoSpaceDE w:val="0"/>
             <w:autoSpaceDN w:val="0"/>
             <w:ind w:hanging="640"/>
-            <w:divId w:val="828134673"/>
+            <w:divId w:val="1577132111"/>
             <w:rPr>
               <w:rFonts w:eastAsia="Times New Roman"/>
             </w:rPr>
@@ -8128,7 +9442,7 @@
             <w:autoSpaceDE w:val="0"/>
             <w:autoSpaceDN w:val="0"/>
             <w:ind w:hanging="640"/>
-            <w:divId w:val="1061824620"/>
+            <w:divId w:val="131673856"/>
             <w:rPr>
               <w:rFonts w:eastAsia="Times New Roman"/>
             </w:rPr>
@@ -8137,7 +9451,6 @@
             <w:rPr>
               <w:rFonts w:eastAsia="Times New Roman"/>
             </w:rPr>
-            <w:lastRenderedPageBreak/>
             <w:t>[90]</w:t>
           </w:r>
           <w:r>
@@ -8167,7 +9480,7 @@
             <w:autoSpaceDE w:val="0"/>
             <w:autoSpaceDN w:val="0"/>
             <w:ind w:hanging="640"/>
-            <w:divId w:val="899245330"/>
+            <w:divId w:val="1618677374"/>
             <w:rPr>
               <w:rFonts w:eastAsia="Times New Roman"/>
             </w:rPr>
@@ -8176,6 +9489,7 @@
             <w:rPr>
               <w:rFonts w:eastAsia="Times New Roman"/>
             </w:rPr>
+            <w:lastRenderedPageBreak/>
             <w:t>[91]</w:t>
           </w:r>
           <w:r>
@@ -8205,7 +9519,7 @@
             <w:autoSpaceDE w:val="0"/>
             <w:autoSpaceDN w:val="0"/>
             <w:ind w:hanging="640"/>
-            <w:divId w:val="1861431926"/>
+            <w:divId w:val="661353921"/>
             <w:rPr>
               <w:rFonts w:eastAsia="Times New Roman"/>
             </w:rPr>
@@ -8243,7 +9557,7 @@
             <w:autoSpaceDE w:val="0"/>
             <w:autoSpaceDN w:val="0"/>
             <w:ind w:hanging="640"/>
-            <w:divId w:val="48849463"/>
+            <w:divId w:val="1469468132"/>
             <w:rPr>
               <w:rFonts w:eastAsia="Times New Roman"/>
             </w:rPr>
@@ -8281,7 +9595,7 @@
             <w:autoSpaceDE w:val="0"/>
             <w:autoSpaceDN w:val="0"/>
             <w:ind w:hanging="640"/>
-            <w:divId w:val="283853120"/>
+            <w:divId w:val="478570769"/>
             <w:rPr>
               <w:rFonts w:eastAsia="Times New Roman"/>
             </w:rPr>
@@ -8333,7 +9647,7 @@
             <w:autoSpaceDE w:val="0"/>
             <w:autoSpaceDN w:val="0"/>
             <w:ind w:hanging="640"/>
-            <w:divId w:val="1826122697"/>
+            <w:divId w:val="1174762200"/>
             <w:rPr>
               <w:rFonts w:eastAsia="Times New Roman"/>
             </w:rPr>
@@ -8371,7 +9685,7 @@
             <w:autoSpaceDE w:val="0"/>
             <w:autoSpaceDN w:val="0"/>
             <w:ind w:hanging="640"/>
-            <w:divId w:val="698437394"/>
+            <w:divId w:val="1845894244"/>
             <w:rPr>
               <w:rFonts w:eastAsia="Times New Roman"/>
             </w:rPr>
@@ -8423,7 +9737,7 @@
             <w:autoSpaceDE w:val="0"/>
             <w:autoSpaceDN w:val="0"/>
             <w:ind w:hanging="640"/>
-            <w:divId w:val="170025640"/>
+            <w:divId w:val="1458990424"/>
             <w:rPr>
               <w:rFonts w:eastAsia="Times New Roman"/>
             </w:rPr>
@@ -8475,7 +9789,7 @@
             <w:autoSpaceDE w:val="0"/>
             <w:autoSpaceDN w:val="0"/>
             <w:ind w:hanging="640"/>
-            <w:divId w:val="207769671"/>
+            <w:divId w:val="1468619708"/>
             <w:rPr>
               <w:rFonts w:eastAsia="Times New Roman"/>
             </w:rPr>
@@ -8527,7 +9841,7 @@
             <w:autoSpaceDE w:val="0"/>
             <w:autoSpaceDN w:val="0"/>
             <w:ind w:hanging="640"/>
-            <w:divId w:val="875193017"/>
+            <w:divId w:val="652754179"/>
             <w:rPr>
               <w:rFonts w:eastAsia="Times New Roman"/>
             </w:rPr>
@@ -8579,7 +9893,7 @@
             <w:autoSpaceDE w:val="0"/>
             <w:autoSpaceDN w:val="0"/>
             <w:ind w:hanging="640"/>
-            <w:divId w:val="190270694"/>
+            <w:divId w:val="47606864"/>
             <w:rPr>
               <w:rFonts w:eastAsia="Times New Roman"/>
             </w:rPr>
@@ -8624,6 +9938,120 @@
               <w:rFonts w:eastAsia="Times New Roman"/>
             </w:rPr>
             <w:t>, vol. 13, no. 6, p. 475, Jun. 2023, doi: 10.3390/bs13060475.</w:t>
+          </w:r>
+        </w:p>
+        <w:p>
+          <w:pPr>
+            <w:autoSpaceDE w:val="0"/>
+            <w:autoSpaceDN w:val="0"/>
+            <w:ind w:hanging="640"/>
+            <w:divId w:val="736170246"/>
+            <w:rPr>
+              <w:rFonts w:eastAsia="Times New Roman"/>
+            </w:rPr>
+          </w:pPr>
+          <w:r>
+            <w:rPr>
+              <w:rFonts w:eastAsia="Times New Roman"/>
+            </w:rPr>
+            <w:t>[101]</w:t>
+          </w:r>
+          <w:r>
+            <w:rPr>
+              <w:rFonts w:eastAsia="Times New Roman"/>
+            </w:rPr>
+            <w:tab/>
+            <w:t xml:space="preserve">D. J. Edwards and A. H. Kemp, “A novel ACT-based video game to support mental health through embedded learning: a mixed-methods feasibility study protocol,” </w:t>
+          </w:r>
+          <w:r>
+            <w:rPr>
+              <w:rFonts w:eastAsia="Times New Roman"/>
+              <w:i/>
+              <w:iCs/>
+            </w:rPr>
+            <w:t>BMJ Open</w:t>
+          </w:r>
+          <w:r>
+            <w:rPr>
+              <w:rFonts w:eastAsia="Times New Roman"/>
+            </w:rPr>
+            <w:t>, vol. 10, no. 11, p. e041667, Nov. 2020, doi: 10.1136/bmjopen-2020-041667.</w:t>
+          </w:r>
+        </w:p>
+        <w:p>
+          <w:pPr>
+            <w:autoSpaceDE w:val="0"/>
+            <w:autoSpaceDN w:val="0"/>
+            <w:ind w:hanging="640"/>
+            <w:divId w:val="697314807"/>
+            <w:rPr>
+              <w:rFonts w:eastAsia="Times New Roman"/>
+            </w:rPr>
+          </w:pPr>
+          <w:r>
+            <w:rPr>
+              <w:rFonts w:eastAsia="Times New Roman"/>
+            </w:rPr>
+            <w:t>[102]</w:t>
+          </w:r>
+          <w:r>
+            <w:rPr>
+              <w:rFonts w:eastAsia="Times New Roman"/>
+            </w:rPr>
+            <w:tab/>
+            <w:t xml:space="preserve">T. F. Prasetyo, A. Bastian, and T. Sifana, “Game Edukasi Pengenalan Gangguan Psikologis Remaja Menggunakan Metode DGBL-ID,” </w:t>
+          </w:r>
+          <w:r>
+            <w:rPr>
+              <w:rFonts w:eastAsia="Times New Roman"/>
+              <w:i/>
+              <w:iCs/>
+            </w:rPr>
+            <w:t>Jurnal Nasional Komputasi dan Teknologi Informasi (JNKTI)</w:t>
+          </w:r>
+          <w:r>
+            <w:rPr>
+              <w:rFonts w:eastAsia="Times New Roman"/>
+            </w:rPr>
+            <w:t>, vol. 3, no. 2, pp. 121–131, Oct. 2020, doi: 10.32672/jnkti.v3i2.2030.</w:t>
+          </w:r>
+        </w:p>
+        <w:p>
+          <w:pPr>
+            <w:autoSpaceDE w:val="0"/>
+            <w:autoSpaceDN w:val="0"/>
+            <w:ind w:hanging="640"/>
+            <w:divId w:val="1557886790"/>
+            <w:rPr>
+              <w:rFonts w:eastAsia="Times New Roman"/>
+            </w:rPr>
+          </w:pPr>
+          <w:r>
+            <w:rPr>
+              <w:rFonts w:eastAsia="Times New Roman"/>
+            </w:rPr>
+            <w:t>[103]</w:t>
+          </w:r>
+          <w:r>
+            <w:rPr>
+              <w:rFonts w:eastAsia="Times New Roman"/>
+            </w:rPr>
+            <w:tab/>
+            <w:t xml:space="preserve">H. O. Ross, A. S. Arrohmah, M. Hasanah, N. Yusran, and N. Wijareni, “Perancangan Aplikasi Kesehatan Mental ‘NAFS’ (Islamic Psycho Spiritual Therapy) Berbasis Android Menggunakan Metode PDCA (Plan-Do -CheckAction),” </w:t>
+          </w:r>
+          <w:r>
+            <w:rPr>
+              <w:rFonts w:eastAsia="Times New Roman"/>
+              <w:i/>
+              <w:iCs/>
+            </w:rPr>
+            <w:t xml:space="preserve">Jurnal Informatika Universitas Pamulang </w:t>
+          </w:r>
+          <w:r>
+            <w:rPr>
+              <w:rFonts w:eastAsia="Times New Roman"/>
+            </w:rPr>
+            <w:t>, vol. 6, no. 4, pp. 849–856, Dec. 2021.</w:t>
           </w:r>
         </w:p>
         <w:p>
@@ -9532,20 +10960,22 @@
   <w:rsids>
     <w:rsidRoot w:val="002821C7"/>
     <w:rsid w:val="000106B7"/>
-    <w:rsid w:val="000432E5"/>
     <w:rsid w:val="001F761D"/>
     <w:rsid w:val="00215627"/>
     <w:rsid w:val="002821C7"/>
     <w:rsid w:val="002F3C99"/>
     <w:rsid w:val="003731D8"/>
     <w:rsid w:val="0048772F"/>
+    <w:rsid w:val="00503F04"/>
     <w:rsid w:val="005509CE"/>
     <w:rsid w:val="006E217B"/>
+    <w:rsid w:val="007E1DB4"/>
     <w:rsid w:val="00831ABC"/>
     <w:rsid w:val="008E28DA"/>
     <w:rsid w:val="00974949"/>
     <w:rsid w:val="00A12F21"/>
     <w:rsid w:val="00A27C20"/>
+    <w:rsid w:val="00C42E1D"/>
     <w:rsid w:val="00CC0467"/>
     <w:rsid w:val="00CD17DB"/>
     <w:rsid w:val="00D16F26"/>
@@ -10360,7 +11790,7 @@
     <we:reference id="WA104382081" version="1.55.1.0" store="" storeType="OMEX"/>
   </we:alternateReferences>
   <we:properties>
-    <we:property name="MENDELEY_CITATIONS" value="[{&quot;citationID&quot;:&quot;MENDELEY_CITATION_a63b4e43-6d21-47c4-923b-eb265e8fcc55&quot;,&quot;properties&quot;:{&quot;noteIndex&quot;:0},&quot;isEdited&quot;:false,&quot;manualOverride&quot;:{&quot;isManuallyOverridden&quot;:false,&quot;citeprocText&quot;:&quot;[1]&quot;,&quot;manualOverrideText&quot;:&quot;&quot;},&quot;citationTag&quot;:&quot;MENDELEY_CITATION_v3_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&quot;,&quot;citationItems&quot;:[{&quot;id&quot;:&quot;0127be9b-6f64-3583-bedc-1584e6f25756&quot;,&quot;itemData&quot;:{&quot;type&quot;:&quot;webpage&quot;,&quot;id&quot;:&quot;0127be9b-6f64-3583-bedc-1584e6f25756&quot;,&quot;title&quot;:&quot;Depressive disorder (depression)&quot;,&quot;author&quot;:[{&quot;family&quot;:&quot;World Health Organization&quot;,&quot;given&quot;:&quot;&quot;,&quot;parse-names&quot;:false,&quot;dropping-particle&quot;:&quot;&quot;,&quot;non-dropping-particle&quot;:&quot;&quot;}],&quot;container-title&quot;:&quot;World Health Organization&quot;,&quot;accessed&quot;:{&quot;date-parts&quot;:[[2025,5,13]]},&quot;URL&quot;:&quot;https://www.who.int/news-room/fact-sheets/detail/depression&quot;,&quot;issued&quot;:{&quot;date-parts&quot;:[[2023,3,31]]},&quot;container-title-short&quot;:&quot;&quot;},&quot;isTemporary&quot;:false,&quot;suppress-author&quot;:false,&quot;composite&quot;:false,&quot;author-only&quot;:false}]},{&quot;citationID&quot;:&quot;MENDELEY_CITATION_31d87ed0-72b0-4cc6-b958-281c24e21ac0&quot;,&quot;properties&quot;:{&quot;noteIndex&quot;:0},&quot;isEdited&quot;:false,&quot;manualOverride&quot;:{&quot;isManuallyOverridden&quot;:false,&quot;citeprocText&quot;:&quot;[2]&quot;,&quot;manualOverrideText&quot;:&quot;&quot;},&quot;citationTag&quot;:&quot;MENDELEY_CITATION_v3_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&quot;,&quot;citationItems&quot;:[{&quot;id&quot;:&quot;9ea95bea-4350-36b7-974c-4a2b72259b46&quot;,&quot;itemData&quot;:{&quot;type&quot;:&quot;webpage&quot;,&quot;id&quot;:&quot;9ea95bea-4350-36b7-974c-4a2b72259b46&quot;,&quot;title&quot;:&quot;Factsheet Kesehatan Jiwa (Keswa)&quot;,&quot;author&quot;:[{&quot;family&quot;:&quot;Kementerian Kesehatan Republik Indonesia&quot;,&quot;given&quot;:&quot;&quot;,&quot;parse-names&quot;:false,&quot;dropping-particle&quot;:&quot;&quot;,&quot;non-dropping-particle&quot;:&quot;&quot;}],&quot;container-title&quot;:&quot;Kementerian Kesehatan RI&quot;,&quot;accessed&quot;:{&quot;date-parts&quot;:[[2025,5,13]]},&quot;URL&quot;:&quot;https://repository.badankebijakan.kemkes.go.id/id/eprint/5532/1/03%20factsheet%20Keswa_bahasa.pdf&quot;,&quot;issued&quot;:{&quot;date-parts&quot;:[[2023,7,15]]},&quot;container-title-short&quot;:&quot;&quot;},&quot;isTemporary&quot;:false,&quot;suppress-author&quot;:false,&quot;composite&quot;:false,&quot;author-only&quot;:false}]},{&quot;citationID&quot;:&quot;MENDELEY_CITATION_bbd8ea5e-2fcd-451f-ad0d-7a991a35b3cf&quot;,&quot;properties&quot;:{&quot;noteIndex&quot;:0},&quot;isEdited&quot;:false,&quot;manualOverride&quot;:{&quot;isManuallyOverridden&quot;:false,&quot;citeprocText&quot;:&quot;[2]&quot;,&quot;manualOverrideText&quot;:&quot;&quot;},&quot;citationTag&quot;:&quot;MENDELEY_CITATION_v3_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&quot;,&quot;citationItems&quot;:[{&quot;id&quot;:&quot;9ea95bea-4350-36b7-974c-4a2b72259b46&quot;,&quot;itemData&quot;:{&quot;type&quot;:&quot;webpage&quot;,&quot;id&quot;:&quot;9ea95bea-4350-36b7-974c-4a2b72259b46&quot;,&quot;title&quot;:&quot;Factsheet Kesehatan Jiwa (Keswa)&quot;,&quot;author&quot;:[{&quot;family&quot;:&quot;Kementerian Kesehatan Republik Indonesia&quot;,&quot;given&quot;:&quot;&quot;,&quot;parse-names&quot;:false,&quot;dropping-particle&quot;:&quot;&quot;,&quot;non-dropping-particle&quot;:&quot;&quot;}],&quot;container-title&quot;:&quot;Kementerian Kesehatan RI&quot;,&quot;accessed&quot;:{&quot;date-parts&quot;:[[2025,5,13]]},&quot;URL&quot;:&quot;https://repository.badankebijakan.kemkes.go.id/id/eprint/5532/1/03%20factsheet%20Keswa_bahasa.pdf&quot;,&quot;issued&quot;:{&quot;date-parts&quot;:[[2023,7,15]]},&quot;container-title-short&quot;:&quot;&quot;},&quot;isTemporary&quot;:false,&quot;suppress-author&quot;:false,&quot;composite&quot;:false,&quot;author-only&quot;:false}]},{&quot;citationID&quot;:&quot;MENDELEY_CITATION_795448d4-496e-489a-ba94-04d2850ee384&quot;,&quot;properties&quot;:{&quot;noteIndex&quot;:0},&quot;isEdited&quot;:false,&quot;manualOverride&quot;:{&quot;isManuallyOverridden&quot;:false,&quot;citeprocText&quot;:&quot;[3], [4], [5], [6], [7], [8], [9], [10], [11], [12], [13], [14], [15], [16], [17], [18], [19], [20], [21], [22], [23], [24], [25], [26], [27], [28], [29], [30], [31], [32], [33], [34], [35], [36], [37], [38], [39], [40], [41], [42], [43], [44], [45], [46], [47], [48], [49], [50], [51], [52], [53], [54], [55], [56], [57], [58], [59], [60], [61], [62], [63], [64], [65], [66], [67], [68], [69], [70], [71], [72], [73], [74], [75], [76], [77], [78], [79], [80], [81], [82], [83], [84], [85], [86], [87], [88], [89], [90], [91], [92]&quot;,&quot;manualOverrideText&quot;:&quot;&quot;},&quot;citationTag&quot;:&quot;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